<commit_message>
Update report_en.docx 2026-05-11 20:27
</commit_message>
<xml_diff>
--- a/report_en.docx
+++ b/report_en.docx
@@ -3038,7 +3038,7 @@
                 <w:color w:val="003B71"/>
                 <w:sz w:val="17"/>
               </w:rPr>
-              <w:t>EIMLER-10</w:t>
+              <w:t>Empagliflozin</w:t>
             </w:r>
           </w:p>
         </w:tc>
@@ -3059,7 +3059,7 @@
                 <w:color w:val="374151"/>
                 <w:sz w:val="17"/>
               </w:rPr>
-              <w:t>Empagliflozin 10mg · Đái tháo đường / Suy tim</w:t>
+              <w:t>Tiểu đường / Suy tim</w:t>
             </w:r>
           </w:p>
         </w:tc>
@@ -3080,7 +3080,7 @@
                 <w:color w:val="374151"/>
                 <w:sz w:val="17"/>
               </w:rPr>
-              <w:t>597.000 VND / Box 30 tabs</w:t>
+              <w:t>Cơ hội cao</w:t>
             </w:r>
           </w:p>
         </w:tc>
@@ -3099,10 +3099,10 @@
                 <w:rFonts w:ascii="Calibri" w:hAnsi="Calibri"/>
                 <w:b/>
                 <w:i w:val="0"/>
-                <w:color w:val="166534"/>
+                <w:color w:val="0056D2"/>
                 <w:sz w:val="17"/>
               </w:rPr>
-              <w:t>High Opportunity</w:t>
+              <w:t>Ưu tiên thầu Nhóm 1</w:t>
             </w:r>
           </w:p>
         </w:tc>
@@ -3123,7 +3123,6 @@
                 <w:color w:val="374151"/>
                 <w:sz w:val="17"/>
               </w:rPr>
-              <w:t>Priority Group 1 tender — GMP-EU</w:t>
             </w:r>
           </w:p>
         </w:tc>
@@ -3146,7 +3145,7 @@
                 <w:color w:val="003B71"/>
                 <w:sz w:val="17"/>
               </w:rPr>
-              <w:t>JANUS-30</w:t>
+              <w:t>Tadalafil</w:t>
             </w:r>
           </w:p>
         </w:tc>
@@ -3167,7 +3166,7 @@
                 <w:color w:val="374151"/>
                 <w:sz w:val="17"/>
               </w:rPr>
-              <w:t>Dapoxetin 30mg · Tiết niệu – Nam khoa</w:t>
+              <w:t>Nam khoa</w:t>
             </w:r>
           </w:p>
         </w:tc>
@@ -3188,7 +3187,7 @@
                 <w:color w:val="374151"/>
                 <w:sz w:val="17"/>
               </w:rPr>
-              <w:t>480.000 VND / Box 8 tabs</w:t>
+              <w:t>Cạnh tranh</w:t>
             </w:r>
           </w:p>
         </w:tc>
@@ -3210,7 +3209,7 @@
                 <w:color w:val="0056D2"/>
                 <w:sz w:val="17"/>
               </w:rPr>
-              <w:t>Stable</w:t>
+              <w:t>Theo dõi giá Sun Pharma</w:t>
             </w:r>
           </w:p>
         </w:tc>
@@ -3231,7 +3230,6 @@
                 <w:color w:val="374151"/>
                 <w:sz w:val="17"/>
               </w:rPr>
-              <w:t>Check Long Châu / Pharmacity listing</w:t>
             </w:r>
           </w:p>
         </w:tc>
@@ -3254,7 +3252,7 @@
                 <w:color w:val="003B71"/>
                 <w:sz w:val="17"/>
               </w:rPr>
-              <w:t>TADALAFIL 20MG</w:t>
+              <w:t>Dapoxetine</w:t>
             </w:r>
           </w:p>
         </w:tc>
@@ -3275,7 +3273,7 @@
                 <w:color w:val="374151"/>
                 <w:sz w:val="17"/>
               </w:rPr>
-              <w:t>Tadalafil 20mg · Tiết niệu – Nam khoa</w:t>
+              <w:t>Nam khoa</w:t>
             </w:r>
           </w:p>
         </w:tc>
@@ -3296,7 +3294,7 @@
                 <w:color w:val="374151"/>
                 <w:sz w:val="17"/>
               </w:rPr>
-              <w:t>42.000 VND / Box 2 tabs</w:t>
+              <w:t>Ổn  VNDịnh</w:t>
             </w:r>
           </w:p>
         </w:tc>
@@ -3315,10 +3313,10 @@
                 <w:rFonts w:ascii="Calibri" w:hAnsi="Calibri"/>
                 <w:b/>
                 <w:i w:val="0"/>
-                <w:color w:val="D97706"/>
+                <w:color w:val="0056D2"/>
                 <w:sz w:val="17"/>
               </w:rPr>
-              <w:t>Competitive</w:t>
+              <w:t>Kiểm tra Long Châu listing</w:t>
             </w:r>
           </w:p>
         </w:tc>
@@ -3339,7 +3337,220 @@
                 <w:color w:val="374151"/>
                 <w:sz w:val="17"/>
               </w:rPr>
-              <w:t>Monitor Sun Pharma pricing &amp; margin</w:t>
+            </w:r>
+          </w:p>
+        </w:tc>
+      </w:tr>
+      <w:tr>
+        <w:tc>
+          <w:tcPr>
+            <w:tcW w:type="dxa" w:w="1701"/>
+          </w:tcPr>
+          <w:p>
+            <w:pPr>
+              <w:spacing w:before="60" w:after="60"/>
+              <w:ind w:left="85"/>
+            </w:pPr>
+            <w:r>
+              <w:rPr>
+                <w:rFonts w:ascii="Calibri" w:hAnsi="Calibri"/>
+                <w:b/>
+                <w:i w:val="0"/>
+                <w:color w:val="003B71"/>
+                <w:sz w:val="17"/>
+              </w:rPr>
+              <w:t>Cytisine</w:t>
+            </w:r>
+          </w:p>
+        </w:tc>
+        <w:tc>
+          <w:tcPr>
+            <w:tcW w:type="dxa" w:w="2381"/>
+          </w:tcPr>
+          <w:p>
+            <w:pPr>
+              <w:spacing w:before="60" w:after="60"/>
+              <w:ind w:left="85"/>
+            </w:pPr>
+            <w:r>
+              <w:rPr>
+                <w:rFonts w:ascii="Calibri" w:hAnsi="Calibri"/>
+                <w:b w:val="0"/>
+                <w:i w:val="0"/>
+                <w:color w:val="374151"/>
+                <w:sz w:val="17"/>
+              </w:rPr>
+              <w:t>Cai thuốc lá</w:t>
+            </w:r>
+          </w:p>
+        </w:tc>
+        <w:tc>
+          <w:tcPr>
+            <w:tcW w:type="dxa" w:w="1134"/>
+          </w:tcPr>
+          <w:p>
+            <w:pPr>
+              <w:spacing w:before="60" w:after="60"/>
+              <w:ind w:left="85"/>
+            </w:pPr>
+            <w:r>
+              <w:rPr>
+                <w:rFonts w:ascii="Calibri" w:hAnsi="Calibri"/>
+                <w:b w:val="0"/>
+                <w:i w:val="0"/>
+                <w:color w:val="374151"/>
+                <w:sz w:val="17"/>
+              </w:rPr>
+              <w:t>Pre-launch</w:t>
+            </w:r>
+          </w:p>
+        </w:tc>
+        <w:tc>
+          <w:tcPr>
+            <w:tcW w:type="dxa" w:w="1247"/>
+            <w:shd w:val="clear" w:color="auto" w:fill="EFF6FF"/>
+          </w:tcPr>
+          <w:p>
+            <w:pPr>
+              <w:spacing w:before="60" w:after="60"/>
+              <w:ind w:left="85"/>
+            </w:pPr>
+            <w:r>
+              <w:rPr>
+                <w:rFonts w:ascii="Calibri" w:hAnsi="Calibri"/>
+                <w:b/>
+                <w:i w:val="0"/>
+                <w:color w:val="0056D2"/>
+                <w:sz w:val="17"/>
+              </w:rPr>
+              <w:t>Q4/2026 – Cơ hội vàng</w:t>
+            </w:r>
+          </w:p>
+        </w:tc>
+        <w:tc>
+          <w:tcPr>
+            <w:tcW w:type="dxa" w:w="2608"/>
+          </w:tcPr>
+          <w:p>
+            <w:pPr>
+              <w:spacing w:before="60" w:after="60"/>
+              <w:ind w:left="85"/>
+            </w:pPr>
+            <w:r>
+              <w:rPr>
+                <w:rFonts w:ascii="Calibri" w:hAnsi="Calibri"/>
+                <w:b w:val="0"/>
+                <w:i w:val="0"/>
+                <w:color w:val="374151"/>
+                <w:sz w:val="17"/>
+              </w:rPr>
+            </w:r>
+          </w:p>
+        </w:tc>
+      </w:tr>
+      <w:tr>
+        <w:tc>
+          <w:tcPr>
+            <w:tcW w:type="dxa" w:w="1701"/>
+          </w:tcPr>
+          <w:p>
+            <w:pPr>
+              <w:spacing w:before="60" w:after="60"/>
+              <w:ind w:left="85"/>
+            </w:pPr>
+            <w:r>
+              <w:rPr>
+                <w:rFonts w:ascii="Calibri" w:hAnsi="Calibri"/>
+                <w:b/>
+                <w:i w:val="0"/>
+                <w:color w:val="003B71"/>
+                <w:sz w:val="17"/>
+              </w:rPr>
+              <w:t>Metilone</w:t>
+            </w:r>
+          </w:p>
+        </w:tc>
+        <w:tc>
+          <w:tcPr>
+            <w:tcW w:type="dxa" w:w="2381"/>
+          </w:tcPr>
+          <w:p>
+            <w:pPr>
+              <w:spacing w:before="60" w:after="60"/>
+              <w:ind w:left="85"/>
+            </w:pPr>
+            <w:r>
+              <w:rPr>
+                <w:rFonts w:ascii="Calibri" w:hAnsi="Calibri"/>
+                <w:b w:val="0"/>
+                <w:i w:val="0"/>
+                <w:color w:val="374151"/>
+                <w:sz w:val="17"/>
+              </w:rPr>
+              <w:t>Kháng viêm</w:t>
+            </w:r>
+          </w:p>
+        </w:tc>
+        <w:tc>
+          <w:tcPr>
+            <w:tcW w:type="dxa" w:w="1134"/>
+          </w:tcPr>
+          <w:p>
+            <w:pPr>
+              <w:spacing w:before="60" w:after="60"/>
+              <w:ind w:left="85"/>
+            </w:pPr>
+            <w:r>
+              <w:rPr>
+                <w:rFonts w:ascii="Calibri" w:hAnsi="Calibri"/>
+                <w:b w:val="0"/>
+                <w:i w:val="0"/>
+                <w:color w:val="374151"/>
+                <w:sz w:val="17"/>
+              </w:rPr>
+              <w:t>Ổn  VNDịnh</w:t>
+            </w:r>
+          </w:p>
+        </w:tc>
+        <w:tc>
+          <w:tcPr>
+            <w:tcW w:type="dxa" w:w="1247"/>
+            <w:shd w:val="clear" w:color="auto" w:fill="EFF6FF"/>
+          </w:tcPr>
+          <w:p>
+            <w:pPr>
+              <w:spacing w:before="60" w:after="60"/>
+              <w:ind w:left="85"/>
+            </w:pPr>
+            <w:r>
+              <w:rPr>
+                <w:rFonts w:ascii="Calibri" w:hAnsi="Calibri"/>
+                <w:b/>
+                <w:i w:val="0"/>
+                <w:color w:val="0056D2"/>
+                <w:sz w:val="17"/>
+              </w:rPr>
+              <w:t>Duy trì kênh ETC</w:t>
+            </w:r>
+          </w:p>
+        </w:tc>
+        <w:tc>
+          <w:tcPr>
+            <w:tcW w:type="dxa" w:w="2608"/>
+          </w:tcPr>
+          <w:p>
+            <w:pPr>
+              <w:spacing w:before="60" w:after="60"/>
+              <w:ind w:left="85"/>
+            </w:pPr>
+            <w:r>
+              <w:rPr>
+                <w:rFonts w:ascii="Calibri" w:hAnsi="Calibri"/>
+                <w:b w:val="0"/>
+                <w:i w:val="0"/>
+                <w:color w:val="374151"/>
+                <w:sz w:val="17"/>
+              </w:rPr>
             </w:r>
           </w:p>
         </w:tc>

</xml_diff>

<commit_message>
Update report_en.docx 2026-05-12 18:01
</commit_message>
<xml_diff>
--- a/report_en.docx
+++ b/report_en.docx
@@ -258,7 +258,7 @@
                 <w:color w:val="111827"/>
                 <w:sz w:val="19"/>
               </w:rPr>
-              <w:t>11/05/2026</w:t>
+              <w:t>12/05/2026</w:t>
             </w:r>
           </w:p>
         </w:tc>
@@ -3591,7 +3591,7 @@
           <w:color w:val="9CA3AF"/>
           <w:sz w:val="17"/>
         </w:rPr>
-        <w:t>Google Search Console  ·  Last 30 days  ·  Data: 11/05/2026</w:t>
+        <w:t>Google Search Console  ·  Last 30 days  ·  Data: 12/05/2026</w:t>
       </w:r>
     </w:p>
     <w:p>
@@ -4523,7 +4523,7 @@
                 <w:color w:val="9CA3AF"/>
                 <w:sz w:val="15"/>
               </w:rPr>
-              <w:t>Davipharm Market Intelligence System  ·  Powered by Claude Sonnet 4.6  ·  11/05/2026  ·  CONFIDENTIAL</w:t>
+              <w:t>Davipharm Market Intelligence System  ·  Powered by Claude Sonnet 4.6  ·  12/05/2026  ·  CONFIDENTIAL</w:t>
             </w:r>
           </w:p>
         </w:tc>

</xml_diff>

<commit_message>
Update report_en.docx 2026-05-13 10:02
</commit_message>
<xml_diff>
--- a/report_en.docx
+++ b/report_en.docx
@@ -258,7 +258,7 @@
                 <w:color w:val="111827"/>
                 <w:sz w:val="19"/>
               </w:rPr>
-              <w:t>12/05/2026</w:t>
+              <w:t>13/05/2026</w:t>
             </w:r>
           </w:p>
         </w:tc>
@@ -820,7 +820,7 @@
         <w:tc>
           <w:tcPr>
             <w:tcW w:type="dxa" w:w="1701"/>
-            <w:shd w:val="clear" w:color="auto" w:fill="DCFCE7"/>
+            <w:shd w:val="clear" w:color="auto" w:fill="E9FBF0"/>
             <w:tcBorders>
               <w:top w:val="none" w:sz="6" w:color="auto"/>
               <w:bottom w:val="none" w:sz="6" w:color="auto"/>
@@ -836,19 +836,19 @@
             <w:r>
               <w:rPr>
                 <w:rFonts w:ascii="Calibri" w:hAnsi="Calibri"/>
-                <w:b/>
+                <w:b w:val="0"/>
                 <w:i w:val="0"/>
-                <w:color w:val="166534"/>
+                <w:color w:val="CCCCCC"/>
                 <w:sz w:val="22"/>
               </w:rPr>
-              <w:t>2</w:t>
+              <w:t>—</w:t>
             </w:r>
           </w:p>
         </w:tc>
         <w:tc>
           <w:tcPr>
             <w:tcW w:type="dxa" w:w="1984"/>
-            <w:shd w:val="clear" w:color="auto" w:fill="F3F4F6"/>
+            <w:shd w:val="clear" w:color="auto" w:fill="F9FAFB"/>
             <w:tcBorders>
               <w:top w:val="none" w:sz="6" w:color="auto"/>
               <w:bottom w:val="none" w:sz="6" w:color="auto"/>
@@ -864,12 +864,12 @@
             <w:r>
               <w:rPr>
                 <w:rFonts w:ascii="Calibri" w:hAnsi="Calibri"/>
-                <w:b/>
+                <w:b w:val="0"/>
                 <w:i w:val="0"/>
-                <w:color w:val="374151"/>
+                <w:color w:val="CCCCCC"/>
                 <w:sz w:val="22"/>
               </w:rPr>
-              <w:t>1</w:t>
+              <w:t>—</w:t>
             </w:r>
           </w:p>
         </w:tc>
@@ -934,7 +934,7 @@
         <w:tc>
           <w:tcPr>
             <w:tcW w:type="dxa" w:w="1701"/>
-            <w:shd w:val="clear" w:color="auto" w:fill="DCFCE7"/>
+            <w:shd w:val="clear" w:color="auto" w:fill="E9FBF0"/>
             <w:tcBorders>
               <w:top w:val="none" w:sz="6" w:color="auto"/>
               <w:bottom w:val="none" w:sz="6" w:color="auto"/>
@@ -950,19 +950,19 @@
             <w:r>
               <w:rPr>
                 <w:rFonts w:ascii="Calibri" w:hAnsi="Calibri"/>
-                <w:b/>
+                <w:b w:val="0"/>
                 <w:i w:val="0"/>
-                <w:color w:val="166534"/>
+                <w:color w:val="CCCCCC"/>
                 <w:sz w:val="22"/>
               </w:rPr>
-              <w:t>3</w:t>
+              <w:t>—</w:t>
             </w:r>
           </w:p>
         </w:tc>
         <w:tc>
           <w:tcPr>
             <w:tcW w:type="dxa" w:w="1984"/>
-            <w:shd w:val="clear" w:color="auto" w:fill="F3F4F6"/>
+            <w:shd w:val="clear" w:color="auto" w:fill="F9FAFB"/>
             <w:tcBorders>
               <w:top w:val="none" w:sz="6" w:color="auto"/>
               <w:bottom w:val="none" w:sz="6" w:color="auto"/>
@@ -978,12 +978,12 @@
             <w:r>
               <w:rPr>
                 <w:rFonts w:ascii="Calibri" w:hAnsi="Calibri"/>
-                <w:b/>
+                <w:b w:val="0"/>
                 <w:i w:val="0"/>
-                <w:color w:val="374151"/>
+                <w:color w:val="CCCCCC"/>
                 <w:sz w:val="22"/>
               </w:rPr>
-              <w:t>2</w:t>
+              <w:t>—</w:t>
             </w:r>
           </w:p>
         </w:tc>
@@ -1104,7 +1104,7 @@
         <w:tc>
           <w:tcPr>
             <w:tcW w:type="dxa" w:w="2268"/>
-            <w:shd w:val="clear" w:color="auto" w:fill="FEE2E2"/>
+            <w:shd w:val="clear" w:color="auto" w:fill="FFF0F0"/>
             <w:tcBorders>
               <w:top w:val="none" w:sz="6" w:color="auto"/>
               <w:bottom w:val="none" w:sz="6" w:color="auto"/>
@@ -1120,12 +1120,12 @@
             <w:r>
               <w:rPr>
                 <w:rFonts w:ascii="Calibri" w:hAnsi="Calibri"/>
-                <w:b/>
+                <w:b w:val="0"/>
                 <w:i w:val="0"/>
-                <w:color w:val="991B1B"/>
+                <w:color w:val="CCCCCC"/>
                 <w:sz w:val="22"/>
               </w:rPr>
-              <w:t>3</w:t>
+              <w:t>—</w:t>
             </w:r>
           </w:p>
         </w:tc>
@@ -1159,474 +1159,6 @@
         <w:t>REGULATORY &amp; POLICY</w:t>
       </w:r>
     </w:p>
-    <w:tbl>
-      <w:tblPr>
-        <w:tblStyle w:val="TableGrid"/>
-        <w:tblW w:type="auto" w:w="0"/>
-        <w:jc w:val="left"/>
-        <w:tblLook w:firstColumn="1" w:firstRow="1" w:lastColumn="0" w:lastRow="0" w:noHBand="0" w:noVBand="1" w:val="04A0"/>
-      </w:tblPr>
-      <w:tblGrid>
-        <w:gridCol w:w="4536"/>
-        <w:gridCol w:w="4536"/>
-      </w:tblGrid>
-      <w:tr>
-        <w:tc>
-          <w:tcPr>
-            <w:tcW w:type="dxa" w:w="1984"/>
-            <w:shd w:val="clear" w:color="auto" w:fill="EEF2FF"/>
-            <w:tcBorders>
-              <w:top w:val="none" w:sz="6" w:color="auto"/>
-              <w:bottom w:val="none" w:sz="6" w:color="auto"/>
-              <w:left w:val="none" w:sz="6" w:color="auto"/>
-              <w:right w:val="none" w:sz="6" w:color="auto"/>
-            </w:tcBorders>
-          </w:tcPr>
-          <w:p>
-            <w:pPr>
-              <w:spacing w:before="80" w:after="80"/>
-              <w:ind w:left="85"/>
-            </w:pPr>
-            <w:r>
-              <w:rPr>
-                <w:rFonts w:ascii="Calibri" w:hAnsi="Calibri"/>
-                <w:b/>
-                <w:i w:val="0"/>
-                <w:color w:val="4338CA"/>
-                <w:sz w:val="15"/>
-              </w:rPr>
-              <w:t>DRUG TENDERING</w:t>
-            </w:r>
-          </w:p>
-        </w:tc>
-        <w:tc>
-          <w:tcPr>
-            <w:tcW w:type="dxa" w:w="4536"/>
-            <w:tcBorders>
-              <w:top w:val="none" w:sz="6" w:color="auto"/>
-              <w:bottom w:val="none" w:sz="6" w:color="auto"/>
-              <w:left w:val="none" w:sz="6" w:color="auto"/>
-              <w:right w:val="none" w:sz="6" w:color="auto"/>
-            </w:tcBorders>
-          </w:tcPr>
-          <w:p>
-            <w:pPr>
-              <w:spacing w:before="60" w:after="60"/>
-              <w:ind w:left="113"/>
-            </w:pPr>
-            <w:r>
-              <w:rPr>
-                <w:rFonts w:ascii="Calibri" w:hAnsi="Calibri"/>
-                <w:b/>
-                <w:i w:val="0"/>
-                <w:color w:val="111827"/>
-                <w:sz w:val="21"/>
-              </w:rPr>
-              <w:t>Low-Price Drugs Lose Absolute Dominance in Public Procurement Tenders</w:t>
-            </w:r>
-          </w:p>
-        </w:tc>
-      </w:tr>
-    </w:tbl>
-    <w:p>
-      <w:pPr>
-        <w:spacing w:before="40" w:after="40"/>
-        <w:ind w:left="170"/>
-      </w:pPr>
-      <w:r>
-        <w:rPr>
-          <w:rFonts w:ascii="Calibri" w:hAnsi="Calibri"/>
-          <w:b w:val="0"/>
-          <w:i/>
-          <w:color w:val="6B7280"/>
-          <w:sz w:val="18"/>
-        </w:rPr>
-        <w:t>New pharmaceutical tendering regulations are shifting selection criteria away from "lowest price" toward a composite scoring model encompassing quality, manufacturing capacity, and GMP standards — leveling the playing field for higher-standard domestic manufacturers.[Source]</w:t>
-      </w:r>
-    </w:p>
-    <w:p>
-      <w:pPr>
-        <w:spacing w:before="20" w:after="40"/>
-        <w:ind w:left="170"/>
-      </w:pPr>
-      <w:r>
-        <w:rPr>
-          <w:rFonts w:ascii="Calibri" w:hAnsi="Calibri"/>
-          <w:b/>
-          <w:i w:val="0"/>
-          <w:color w:val="166534"/>
-          <w:sz w:val="17"/>
-        </w:rPr>
-        <w:t>✅ Positive — Major opportunity for quality-certified manufacturers</w:t>
-      </w:r>
-    </w:p>
-    <w:tbl>
-      <w:tblPr>
-        <w:tblStyle w:val="TableGrid"/>
-        <w:tblW w:type="auto" w:w="0"/>
-        <w:tblLook w:firstColumn="1" w:firstRow="1" w:lastColumn="0" w:lastRow="0" w:noHBand="0" w:noVBand="1" w:val="04A0"/>
-      </w:tblPr>
-      <w:tblGrid>
-        <w:gridCol w:w="9072"/>
-      </w:tblGrid>
-      <w:tr>
-        <w:tc>
-          <w:tcPr>
-            <w:tcW w:type="dxa" w:w="9072"/>
-            <w:shd w:val="clear" w:color="auto" w:fill="F8FAFC"/>
-            <w:tcBorders>
-              <w:top w:val="none" w:sz="6" w:color="auto"/>
-              <w:bottom w:val="none" w:sz="6" w:color="auto"/>
-              <w:left w:val="single" w:sz="12" w:color="003B71"/>
-              <w:right w:val="none" w:sz="6" w:color="auto"/>
-            </w:tcBorders>
-          </w:tcPr>
-          <w:p>
-            <w:pPr>
-              <w:spacing w:before="60" w:after="60"/>
-              <w:ind w:left="142"/>
-            </w:pPr>
-            <w:r>
-              <w:rPr>
-                <w:rFonts w:ascii="Calibri" w:hAnsi="Calibri"/>
-                <w:b/>
-                <w:i w:val="0"/>
-                <w:color w:val="003B71"/>
-                <w:sz w:val="17"/>
-              </w:rPr>
-              <w:t xml:space="preserve">Strategy  </w:t>
-            </w:r>
-            <w:r>
-              <w:rPr>
-                <w:rFonts w:ascii="Calibri" w:hAnsi="Calibri"/>
-                <w:b w:val="0"/>
-                <w:i w:val="0"/>
-                <w:color w:val="334155"/>
-                <w:sz w:val="17"/>
-              </w:rPr>
-              <w:t>🎯 Strategic Opportunity:The shift from "lowest price" to "best value" procurement criteria is highly favorable for Davipharm, which has invested heavily in EU-GMP/WHO-GMP standards. Previously, cost-cutting competitors could win tenders purely on price; now, quality credentials become a legitimate competitive weapon.⚔️ Competitive Dynamics vs. Direct Rivals (Imexpharm, DHG, Traphaco):This triggers a new "capability portfolio" race. Imexpharm's EU-GMP facilities make it the most formidable rival in premium hospital tenders. DHG and Traphaco hold broad portfolios but face plant-level certification scrutiny. Davipharm must proactively build standardized capability dossiers (GMP certificates, stability data, bioequivalence studies) to maximize technical scores in Group 1–2 tender lots.📋 Priority Actions:(1) Audit the full product portfolio to identify SKUs eligible for Group 1 (EU-GMP) bidding; (2) Strengthen a dedicated tender team with superior technical documentation capabilities; (3) Position Davipharm as "European Quality, Vietnamese Price" in B2B communications targeting hospitals and provincial health departments.</w:t>
-            </w:r>
-          </w:p>
-        </w:tc>
-      </w:tr>
-    </w:tbl>
-    <w:p>
-      <w:pPr>
-        <w:spacing w:before="40" w:after="120"/>
-      </w:pPr>
-    </w:p>
-    <w:tbl>
-      <w:tblPr>
-        <w:tblStyle w:val="TableGrid"/>
-        <w:tblW w:type="auto" w:w="0"/>
-        <w:jc w:val="left"/>
-        <w:tblLook w:firstColumn="1" w:firstRow="1" w:lastColumn="0" w:lastRow="0" w:noHBand="0" w:noVBand="1" w:val="04A0"/>
-      </w:tblPr>
-      <w:tblGrid>
-        <w:gridCol w:w="4536"/>
-        <w:gridCol w:w="4536"/>
-      </w:tblGrid>
-      <w:tr>
-        <w:tc>
-          <w:tcPr>
-            <w:tcW w:type="dxa" w:w="1984"/>
-            <w:shd w:val="clear" w:color="auto" w:fill="EEF2FF"/>
-            <w:tcBorders>
-              <w:top w:val="none" w:sz="6" w:color="auto"/>
-              <w:bottom w:val="none" w:sz="6" w:color="auto"/>
-              <w:left w:val="none" w:sz="6" w:color="auto"/>
-              <w:right w:val="none" w:sz="6" w:color="auto"/>
-            </w:tcBorders>
-          </w:tcPr>
-          <w:p>
-            <w:pPr>
-              <w:spacing w:before="80" w:after="80"/>
-              <w:ind w:left="85"/>
-            </w:pPr>
-            <w:r>
-              <w:rPr>
-                <w:rFonts w:ascii="Calibri" w:hAnsi="Calibri"/>
-                <w:b/>
-                <w:i w:val="0"/>
-                <w:color w:val="4338CA"/>
-                <w:sz w:val="15"/>
-              </w:rPr>
-              <w:t>VIETNAM PHARMA POLICY</w:t>
-            </w:r>
-          </w:p>
-        </w:tc>
-        <w:tc>
-          <w:tcPr>
-            <w:tcW w:type="dxa" w:w="4536"/>
-            <w:tcBorders>
-              <w:top w:val="none" w:sz="6" w:color="auto"/>
-              <w:bottom w:val="none" w:sz="6" w:color="auto"/>
-              <w:left w:val="none" w:sz="6" w:color="auto"/>
-              <w:right w:val="none" w:sz="6" w:color="auto"/>
-            </w:tcBorders>
-          </w:tcPr>
-          <w:p>
-            <w:pPr>
-              <w:spacing w:before="60" w:after="60"/>
-              <w:ind w:left="113"/>
-            </w:pPr>
-            <w:r>
-              <w:rPr>
-                <w:rFonts w:ascii="Calibri" w:hAnsi="Calibri"/>
-                <w:b/>
-                <w:i w:val="0"/>
-                <w:color w:val="111827"/>
-                <w:sz w:val="21"/>
-              </w:rPr>
-              <w:t>US Raises Concerns Over South Korea's Pharmaceutical Pricing &amp; Market Access Policies</w:t>
-            </w:r>
-          </w:p>
-        </w:tc>
-      </w:tr>
-    </w:tbl>
-    <w:p>
-      <w:pPr>
-        <w:spacing w:before="40" w:after="40"/>
-        <w:ind w:left="170"/>
-      </w:pPr>
-      <w:r>
-        <w:rPr>
-          <w:rFonts w:ascii="Calibri" w:hAnsi="Calibri"/>
-          <w:b w:val="0"/>
-          <w:i/>
-          <w:color w:val="6B7280"/>
-          <w:sz w:val="18"/>
-        </w:rPr>
-        <w:t>The United States has formally raised concerns with South Korea regarding pharmaceutical policies, including drug pricing mechanisms, health insurance reimbursement conditions, and market access barriers for foreign pharmaceutical products. This forms part of bilateral trade negotiations and reflects a growing global trend toward greater transparency and fairness in pharmaceutical market policies.[Source]</w:t>
-      </w:r>
-    </w:p>
-    <w:p>
-      <w:pPr>
-        <w:spacing w:before="20" w:after="40"/>
-        <w:ind w:left="170"/>
-      </w:pPr>
-      <w:r>
-        <w:rPr>
-          <w:rFonts w:ascii="Calibri" w:hAnsi="Calibri"/>
-          <w:b/>
-          <w:i w:val="0"/>
-          <w:color w:val="374151"/>
-          <w:sz w:val="17"/>
-        </w:rPr>
-        <w:t>⚠️ Indirect Impact — Policy Warning Signal Relevant to Vietnam's Pharma Landscape</w:t>
-      </w:r>
-    </w:p>
-    <w:tbl>
-      <w:tblPr>
-        <w:tblStyle w:val="TableGrid"/>
-        <w:tblW w:type="auto" w:w="0"/>
-        <w:tblLook w:firstColumn="1" w:firstRow="1" w:lastColumn="0" w:lastRow="0" w:noHBand="0" w:noVBand="1" w:val="04A0"/>
-      </w:tblPr>
-      <w:tblGrid>
-        <w:gridCol w:w="9072"/>
-      </w:tblGrid>
-      <w:tr>
-        <w:tc>
-          <w:tcPr>
-            <w:tcW w:type="dxa" w:w="9072"/>
-            <w:shd w:val="clear" w:color="auto" w:fill="F8FAFC"/>
-            <w:tcBorders>
-              <w:top w:val="none" w:sz="6" w:color="auto"/>
-              <w:bottom w:val="none" w:sz="6" w:color="auto"/>
-              <w:left w:val="single" w:sz="12" w:color="003B71"/>
-              <w:right w:val="none" w:sz="6" w:color="auto"/>
-            </w:tcBorders>
-          </w:tcPr>
-          <w:p>
-            <w:pPr>
-              <w:spacing w:before="60" w:after="60"/>
-              <w:ind w:left="142"/>
-            </w:pPr>
-            <w:r>
-              <w:rPr>
-                <w:rFonts w:ascii="Calibri" w:hAnsi="Calibri"/>
-                <w:b/>
-                <w:i w:val="0"/>
-                <w:color w:val="003B71"/>
-                <w:sz w:val="17"/>
-              </w:rPr>
-              <w:t xml:space="preserve">Strategy  </w:t>
-            </w:r>
-            <w:r>
-              <w:rPr>
-                <w:rFonts w:ascii="Calibri" w:hAnsi="Calibri"/>
-                <w:b w:val="0"/>
-                <w:i w:val="0"/>
-                <w:color w:val="334155"/>
-                <w:sz w:val="17"/>
-              </w:rPr>
-              <w:t>The US pressure on South Korea's pharmaceutical policies carries significant strategic implications for Davipharm across multiple dimensions:1. Regulatory Risk in Vietnam:Vietnam is actively implementing FTAs (EVFTA, CPTPP, UKVFTA). Similar external pressure could compel the Ministry of Health to reform tendering, pricing, and social health insurance (SHI) reimbursement frameworks — directly impacting Davipharm's generic portfolio competitiveness.2. Opportunity for Empagliflozin &amp; Dapoxetine:Should SHI reimbursement policies become more transparent and inclusive under international pressure, Davipharm's high-quality generics — Empagliflozin (Type 2 Diabetes) and Dapoxetine (Premature Ejaculation) — stand to gain SHI listing status, significantly expanding patient access and market volume.3. Tadalafil — Strategic OTC Positioning:Given potential SHI restructuring risks, Davipharm should accelerate a dual ETC/OTC go-to-market strategy for Tadalafil to reduce dependency on hospital tender channels and capture the growing self-pay consumer segment.Recommendation:Davipharm should closely monitor US–Vietnam trade negotiation developments and proactively engage in domestic pharmaceutical policy forums to safeguard the competitive advantages of its local generic product lines.</w:t>
-            </w:r>
-          </w:p>
-        </w:tc>
-      </w:tr>
-    </w:tbl>
-    <w:p>
-      <w:pPr>
-        <w:spacing w:before="40" w:after="120"/>
-      </w:pPr>
-    </w:p>
-    <w:tbl>
-      <w:tblPr>
-        <w:tblStyle w:val="TableGrid"/>
-        <w:tblW w:type="auto" w:w="0"/>
-        <w:jc w:val="left"/>
-        <w:tblLook w:firstColumn="1" w:firstRow="1" w:lastColumn="0" w:lastRow="0" w:noHBand="0" w:noVBand="1" w:val="04A0"/>
-      </w:tblPr>
-      <w:tblGrid>
-        <w:gridCol w:w="4536"/>
-        <w:gridCol w:w="4536"/>
-      </w:tblGrid>
-      <w:tr>
-        <w:tc>
-          <w:tcPr>
-            <w:tcW w:type="dxa" w:w="1984"/>
-            <w:shd w:val="clear" w:color="auto" w:fill="EEF2FF"/>
-            <w:tcBorders>
-              <w:top w:val="none" w:sz="6" w:color="auto"/>
-              <w:bottom w:val="none" w:sz="6" w:color="auto"/>
-              <w:left w:val="none" w:sz="6" w:color="auto"/>
-              <w:right w:val="none" w:sz="6" w:color="auto"/>
-            </w:tcBorders>
-          </w:tcPr>
-          <w:p>
-            <w:pPr>
-              <w:spacing w:before="80" w:after="80"/>
-              <w:ind w:left="85"/>
-            </w:pPr>
-            <w:r>
-              <w:rPr>
-                <w:rFonts w:ascii="Calibri" w:hAnsi="Calibri"/>
-                <w:b/>
-                <w:i w:val="0"/>
-                <w:color w:val="4338CA"/>
-                <w:sz w:val="15"/>
-              </w:rPr>
-              <w:t>MOH · TENDERING</w:t>
-            </w:r>
-          </w:p>
-        </w:tc>
-        <w:tc>
-          <w:tcPr>
-            <w:tcW w:type="dxa" w:w="4536"/>
-            <w:tcBorders>
-              <w:top w:val="none" w:sz="6" w:color="auto"/>
-              <w:bottom w:val="none" w:sz="6" w:color="auto"/>
-              <w:left w:val="none" w:sz="6" w:color="auto"/>
-              <w:right w:val="none" w:sz="6" w:color="auto"/>
-            </w:tcBorders>
-          </w:tcPr>
-          <w:p>
-            <w:pPr>
-              <w:spacing w:before="60" w:after="60"/>
-              <w:ind w:left="113"/>
-            </w:pPr>
-            <w:r>
-              <w:rPr>
-                <w:rFonts w:ascii="Calibri" w:hAnsi="Calibri"/>
-                <w:b/>
-                <w:i w:val="0"/>
-                <w:color w:val="111827"/>
-                <w:sz w:val="21"/>
-              </w:rPr>
-              <w:t>Vietnam's Minister of Health Addresses Procurement &amp; Tendering of Expanded Immunization Vaccines</w:t>
-            </w:r>
-          </w:p>
-        </w:tc>
-      </w:tr>
-    </w:tbl>
-    <w:p>
-      <w:pPr>
-        <w:spacing w:before="40" w:after="40"/>
-        <w:ind w:left="170"/>
-      </w:pPr>
-      <w:r>
-        <w:rPr>
-          <w:rFonts w:ascii="Calibri" w:hAnsi="Calibri"/>
-          <w:b w:val="0"/>
-          <w:i/>
-          <w:color w:val="6B7280"/>
-          <w:sz w:val="18"/>
-        </w:rPr>
-        <w:t>Vietnam's Minister of Health officially addressed the procurement and tendering process for vaccines under the National Expanded Program on Immunization (EPI), emphasizing transparency, legal compliance, and stable supply assurance for the population. This signals the Government's intensified oversight and reform of public pharmaceutical procurement mechanisms.[Source]</w:t>
-      </w:r>
-    </w:p>
-    <w:p>
-      <w:pPr>
-        <w:spacing w:before="20" w:after="40"/>
-        <w:ind w:left="170"/>
-      </w:pPr>
-      <w:r>
-        <w:rPr>
-          <w:rFonts w:ascii="Calibri" w:hAnsi="Calibri"/>
-          <w:b/>
-          <w:i w:val="0"/>
-          <w:color w:val="166534"/>
-          <w:sz w:val="17"/>
-        </w:rPr>
-        <w:t>✅ Positive — Procurement reform fosters a more transparent competitive environment for domestic pharmaceutical companies</w:t>
-      </w:r>
-    </w:p>
-    <w:tbl>
-      <w:tblPr>
-        <w:tblStyle w:val="TableGrid"/>
-        <w:tblW w:type="auto" w:w="0"/>
-        <w:tblLook w:firstColumn="1" w:firstRow="1" w:lastColumn="0" w:lastRow="0" w:noHBand="0" w:noVBand="1" w:val="04A0"/>
-      </w:tblPr>
-      <w:tblGrid>
-        <w:gridCol w:w="9072"/>
-      </w:tblGrid>
-      <w:tr>
-        <w:tc>
-          <w:tcPr>
-            <w:tcW w:type="dxa" w:w="9072"/>
-            <w:shd w:val="clear" w:color="auto" w:fill="F8FAFC"/>
-            <w:tcBorders>
-              <w:top w:val="none" w:sz="6" w:color="auto"/>
-              <w:bottom w:val="none" w:sz="6" w:color="auto"/>
-              <w:left w:val="single" w:sz="12" w:color="003B71"/>
-              <w:right w:val="none" w:sz="6" w:color="auto"/>
-            </w:tcBorders>
-          </w:tcPr>
-          <w:p>
-            <w:pPr>
-              <w:spacing w:before="60" w:after="60"/>
-              <w:ind w:left="142"/>
-            </w:pPr>
-            <w:r>
-              <w:rPr>
-                <w:rFonts w:ascii="Calibri" w:hAnsi="Calibri"/>
-                <w:b/>
-                <w:i w:val="0"/>
-                <w:color w:val="003B71"/>
-                <w:sz w:val="17"/>
-              </w:rPr>
-              <w:t xml:space="preserve">Strategy  </w:t>
-            </w:r>
-            <w:r>
-              <w:rPr>
-                <w:rFonts w:ascii="Calibri" w:hAnsi="Calibri"/>
-                <w:b w:val="0"/>
-                <w:i w:val="0"/>
-                <w:color w:val="334155"/>
-                <w:sz w:val="17"/>
-              </w:rPr>
-              <w:t>While the article focuses on vaccines — not Davipharm's core segment — the procurement reform signals carry significant spillover implications:① Systemic Opportunity:The Ministry of Health's push for greater tendering transparency (Circulars 14 &amp; 15) creates a more level playing field for Davipharm's high-quality generics — particularlyEmpagliflozin(type 2 diabetes) andTadalafil— to compete in Tier 1–2 hospital tenders on the basis of GMP standards and competitive pricing.② Risk to Monitor:If centralized national tendering is expanded to chronic disease drug categories (cardiovascular, metabolic), downward price pressure will intensify — requiring Davipharm to optimize manufacturing costs and build robust tender qualification dossiers.③ Recommended Action:Proactively prepare complete technical dossiers forDapoxetineandEmpagliflozinto be tender-ready for provincial and central hospital procurement packages as the centralized tender list is updated in Q3–Q4 2025.</w:t>
-            </w:r>
-          </w:p>
-        </w:tc>
-      </w:tr>
-    </w:tbl>
-    <w:p>
-      <w:pPr>
-        <w:spacing w:before="40" w:after="120"/>
-      </w:pPr>
-    </w:p>
     <w:p>
       <w:r>
         <w:br w:type="page"/>
@@ -1650,736 +1182,6 @@
         <w:t>PHARMA INDUSTRY NEWS</w:t>
       </w:r>
     </w:p>
-    <w:tbl>
-      <w:tblPr>
-        <w:tblStyle w:val="TableGrid"/>
-        <w:tblW w:type="auto" w:w="0"/>
-        <w:jc w:val="left"/>
-        <w:tblLook w:firstColumn="1" w:firstRow="1" w:lastColumn="0" w:lastRow="0" w:noHBand="0" w:noVBand="1" w:val="04A0"/>
-      </w:tblPr>
-      <w:tblGrid>
-        <w:gridCol w:w="4536"/>
-        <w:gridCol w:w="4536"/>
-      </w:tblGrid>
-      <w:tr>
-        <w:tc>
-          <w:tcPr>
-            <w:tcW w:type="dxa" w:w="1984"/>
-            <w:shd w:val="clear" w:color="auto" w:fill="EEF2FF"/>
-            <w:tcBorders>
-              <w:top w:val="none" w:sz="6" w:color="auto"/>
-              <w:bottom w:val="none" w:sz="6" w:color="auto"/>
-              <w:left w:val="none" w:sz="6" w:color="auto"/>
-              <w:right w:val="none" w:sz="6" w:color="auto"/>
-            </w:tcBorders>
-          </w:tcPr>
-          <w:p>
-            <w:pPr>
-              <w:spacing w:before="80" w:after="80"/>
-              <w:ind w:left="85"/>
-            </w:pPr>
-            <w:r>
-              <w:rPr>
-                <w:rFonts w:ascii="Calibri" w:hAnsi="Calibri"/>
-                <w:b/>
-                <w:i w:val="0"/>
-                <w:color w:val="4338CA"/>
-                <w:sz w:val="15"/>
-              </w:rPr>
-              <w:t>VIETNAM PHARMA MARKET</w:t>
-            </w:r>
-          </w:p>
-        </w:tc>
-        <w:tc>
-          <w:tcPr>
-            <w:tcW w:type="dxa" w:w="4536"/>
-            <w:tcBorders>
-              <w:top w:val="none" w:sz="6" w:color="auto"/>
-              <w:bottom w:val="none" w:sz="6" w:color="auto"/>
-              <w:left w:val="none" w:sz="6" w:color="auto"/>
-              <w:right w:val="none" w:sz="6" w:color="auto"/>
-            </w:tcBorders>
-          </w:tcPr>
-          <w:p>
-            <w:pPr>
-              <w:spacing w:before="60" w:after="60"/>
-              <w:ind w:left="113"/>
-            </w:pPr>
-            <w:r>
-              <w:rPr>
-                <w:rFonts w:ascii="Calibri" w:hAnsi="Calibri"/>
-                <w:b/>
-                <w:i w:val="0"/>
-                <w:color w:val="111827"/>
-                <w:sz w:val="21"/>
-              </w:rPr>
-              <w:t>Pharmacy Chain Franchising: Market Expansion Linked to Pharmaceutical Governance Standardization</w:t>
-            </w:r>
-          </w:p>
-        </w:tc>
-      </w:tr>
-    </w:tbl>
-    <w:p>
-      <w:pPr>
-        <w:spacing w:before="40" w:after="40"/>
-        <w:ind w:left="170"/>
-      </w:pPr>
-      <w:r>
-        <w:rPr>
-          <w:rFonts w:ascii="Calibri" w:hAnsi="Calibri"/>
-          <w:b w:val="0"/>
-          <w:i/>
-          <w:color w:val="6B7280"/>
-          <w:sz w:val="18"/>
-        </w:rPr>
-        <w:t>Pharmacy chain franchising is emerging as a key retail expansion trend in Vietnam, combining rapid outlet growth with standardized pharmaceutical management and GPP-compliant quality control. Major chains such as Long Chau and Pharmacity are aggressively pursuing this model to quickly scale their nationwide distribution networks.[Source]</w:t>
-      </w:r>
-    </w:p>
-    <w:p>
-      <w:pPr>
-        <w:spacing w:before="20" w:after="40"/>
-        <w:ind w:left="170"/>
-      </w:pPr>
-      <w:r>
-        <w:rPr>
-          <w:rFonts w:ascii="Calibri" w:hAnsi="Calibri"/>
-          <w:b/>
-          <w:i w:val="0"/>
-          <w:color w:val="166534"/>
-          <w:sz w:val="17"/>
-        </w:rPr>
-        <w:t>⚡ Conditionally Positive Impact — Channel expansion broadens market access for manufacturers, but increases pressure on listing fees and shelf-space negotiation power.</w:t>
-      </w:r>
-    </w:p>
-    <w:tbl>
-      <w:tblPr>
-        <w:tblStyle w:val="TableGrid"/>
-        <w:tblW w:type="auto" w:w="0"/>
-        <w:tblLook w:firstColumn="1" w:firstRow="1" w:lastColumn="0" w:lastRow="0" w:noHBand="0" w:noVBand="1" w:val="04A0"/>
-      </w:tblPr>
-      <w:tblGrid>
-        <w:gridCol w:w="9072"/>
-      </w:tblGrid>
-      <w:tr>
-        <w:tc>
-          <w:tcPr>
-            <w:tcW w:type="dxa" w:w="9072"/>
-            <w:shd w:val="clear" w:color="auto" w:fill="F8FAFC"/>
-            <w:tcBorders>
-              <w:top w:val="none" w:sz="6" w:color="auto"/>
-              <w:bottom w:val="none" w:sz="6" w:color="auto"/>
-              <w:left w:val="single" w:sz="12" w:color="003B71"/>
-              <w:right w:val="none" w:sz="6" w:color="auto"/>
-            </w:tcBorders>
-          </w:tcPr>
-          <w:p>
-            <w:pPr>
-              <w:spacing w:before="60" w:after="60"/>
-              <w:ind w:left="142"/>
-            </w:pPr>
-            <w:r>
-              <w:rPr>
-                <w:rFonts w:ascii="Calibri" w:hAnsi="Calibri"/>
-                <w:b/>
-                <w:i w:val="0"/>
-                <w:color w:val="003B71"/>
-                <w:sz w:val="17"/>
-              </w:rPr>
-              <w:t xml:space="preserve">Strategy  </w:t>
-            </w:r>
-            <w:r>
-              <w:rPr>
-                <w:rFonts w:ascii="Calibri" w:hAnsi="Calibri"/>
-                <w:b w:val="0"/>
-                <w:i w:val="0"/>
-                <w:color w:val="334155"/>
-                <w:sz w:val="17"/>
-              </w:rPr>
-              <w:t>🏪 Channel Power Dynamics — Core Risk to Monitor:As Long Chau and Pharmacity scale their franchise networks, their negotiating leverage over manufacturers grows proport</w:t>
-            </w:r>
-          </w:p>
-        </w:tc>
-      </w:tr>
-    </w:tbl>
-    <w:p>
-      <w:pPr>
-        <w:spacing w:before="40" w:after="120"/>
-      </w:pPr>
-    </w:p>
-    <w:tbl>
-      <w:tblPr>
-        <w:tblStyle w:val="TableGrid"/>
-        <w:tblW w:type="auto" w:w="0"/>
-        <w:jc w:val="left"/>
-        <w:tblLook w:firstColumn="1" w:firstRow="1" w:lastColumn="0" w:lastRow="0" w:noHBand="0" w:noVBand="1" w:val="04A0"/>
-      </w:tblPr>
-      <w:tblGrid>
-        <w:gridCol w:w="4536"/>
-        <w:gridCol w:w="4536"/>
-      </w:tblGrid>
-      <w:tr>
-        <w:tc>
-          <w:tcPr>
-            <w:tcW w:type="dxa" w:w="1984"/>
-            <w:shd w:val="clear" w:color="auto" w:fill="EEF2FF"/>
-            <w:tcBorders>
-              <w:top w:val="none" w:sz="6" w:color="auto"/>
-              <w:bottom w:val="none" w:sz="6" w:color="auto"/>
-              <w:left w:val="none" w:sz="6" w:color="auto"/>
-              <w:right w:val="none" w:sz="6" w:color="auto"/>
-            </w:tcBorders>
-          </w:tcPr>
-          <w:p>
-            <w:pPr>
-              <w:spacing w:before="80" w:after="80"/>
-              <w:ind w:left="85"/>
-            </w:pPr>
-            <w:r>
-              <w:rPr>
-                <w:rFonts w:ascii="Calibri" w:hAnsi="Calibri"/>
-                <w:b/>
-                <w:i w:val="0"/>
-                <w:color w:val="4338CA"/>
-                <w:sz w:val="15"/>
-              </w:rPr>
-              <w:t>VIETNAM PHARMA MARKET</w:t>
-            </w:r>
-          </w:p>
-        </w:tc>
-        <w:tc>
-          <w:tcPr>
-            <w:tcW w:type="dxa" w:w="4536"/>
-            <w:tcBorders>
-              <w:top w:val="none" w:sz="6" w:color="auto"/>
-              <w:bottom w:val="none" w:sz="6" w:color="auto"/>
-              <w:left w:val="none" w:sz="6" w:color="auto"/>
-              <w:right w:val="none" w:sz="6" w:color="auto"/>
-            </w:tcBorders>
-          </w:tcPr>
-          <w:p>
-            <w:pPr>
-              <w:spacing w:before="60" w:after="60"/>
-              <w:ind w:left="113"/>
-            </w:pPr>
-            <w:r>
-              <w:rPr>
-                <w:rFonts w:ascii="Calibri" w:hAnsi="Calibri"/>
-                <w:b/>
-                <w:i w:val="0"/>
-                <w:color w:val="111827"/>
-                <w:sz w:val="21"/>
-              </w:rPr>
-              <w:t>Q1 2026: Vietnam's Pharmaceutical Raw Material Imports Decline Sharply – Strategic Implications for Domestic Manufacturers</w:t>
-            </w:r>
-          </w:p>
-        </w:tc>
-      </w:tr>
-    </w:tbl>
-    <w:p>
-      <w:pPr>
-        <w:spacing w:before="40" w:after="40"/>
-        <w:ind w:left="170"/>
-      </w:pPr>
-      <w:r>
-        <w:rPr>
-          <w:rFonts w:ascii="Calibri" w:hAnsi="Calibri"/>
-          <w:b w:val="0"/>
-          <w:i/>
-          <w:color w:val="6B7280"/>
-          <w:sz w:val="18"/>
-        </w:rPr>
-        <w:t>According to Vinanet, Vietnam's pharmaceutical raw material and excipient import value dropped significantly in Q1 2026 compared to the same period last year. This trend reflects shifts in global pharmaceutical supply chains, currency pressures, and domestic manufacturers' efforts to optimize inventory or seek alternative sourcing strategies.[Source]</w:t>
-      </w:r>
-    </w:p>
-    <w:p>
-      <w:pPr>
-        <w:spacing w:before="20" w:after="40"/>
-        <w:ind w:left="170"/>
-      </w:pPr>
-      <w:r>
-        <w:rPr>
-          <w:rFonts w:ascii="Calibri" w:hAnsi="Calibri"/>
-          <w:b/>
-          <w:i w:val="0"/>
-          <w:color w:val="374151"/>
-          <w:sz w:val="17"/>
-        </w:rPr>
-        <w:t>⚠️ Neutral – Dual Impact: Short-term supply risk offset by strategic opportunity to restructure sourcing and strengthen domestic competitive positioning</w:t>
-      </w:r>
-    </w:p>
-    <w:p>
-      <w:pPr>
-        <w:spacing w:before="40" w:after="120"/>
-      </w:pPr>
-    </w:p>
-    <w:tbl>
-      <w:tblPr>
-        <w:tblStyle w:val="TableGrid"/>
-        <w:tblW w:type="auto" w:w="0"/>
-        <w:jc w:val="left"/>
-        <w:tblLook w:firstColumn="1" w:firstRow="1" w:lastColumn="0" w:lastRow="0" w:noHBand="0" w:noVBand="1" w:val="04A0"/>
-      </w:tblPr>
-      <w:tblGrid>
-        <w:gridCol w:w="4536"/>
-        <w:gridCol w:w="4536"/>
-      </w:tblGrid>
-      <w:tr>
-        <w:tc>
-          <w:tcPr>
-            <w:tcW w:type="dxa" w:w="1984"/>
-            <w:shd w:val="clear" w:color="auto" w:fill="EEF2FF"/>
-            <w:tcBorders>
-              <w:top w:val="none" w:sz="6" w:color="auto"/>
-              <w:bottom w:val="none" w:sz="6" w:color="auto"/>
-              <w:left w:val="none" w:sz="6" w:color="auto"/>
-              <w:right w:val="none" w:sz="6" w:color="auto"/>
-            </w:tcBorders>
-          </w:tcPr>
-          <w:p>
-            <w:pPr>
-              <w:spacing w:before="80" w:after="80"/>
-              <w:ind w:left="85"/>
-            </w:pPr>
-            <w:r>
-              <w:rPr>
-                <w:rFonts w:ascii="Calibri" w:hAnsi="Calibri"/>
-                <w:b/>
-                <w:i w:val="0"/>
-                <w:color w:val="4338CA"/>
-                <w:sz w:val="15"/>
-              </w:rPr>
-              <w:t>VIETNAM PHARMA MARKET</w:t>
-            </w:r>
-          </w:p>
-        </w:tc>
-        <w:tc>
-          <w:tcPr>
-            <w:tcW w:type="dxa" w:w="4536"/>
-            <w:tcBorders>
-              <w:top w:val="none" w:sz="6" w:color="auto"/>
-              <w:bottom w:val="none" w:sz="6" w:color="auto"/>
-              <w:left w:val="none" w:sz="6" w:color="auto"/>
-              <w:right w:val="none" w:sz="6" w:color="auto"/>
-            </w:tcBorders>
-          </w:tcPr>
-          <w:p>
-            <w:pPr>
-              <w:spacing w:before="60" w:after="60"/>
-              <w:ind w:left="113"/>
-            </w:pPr>
-            <w:r>
-              <w:rPr>
-                <w:rFonts w:ascii="Calibri" w:hAnsi="Calibri"/>
-                <w:b/>
-                <w:i w:val="0"/>
-                <w:color w:val="111827"/>
-                <w:sz w:val="21"/>
-              </w:rPr>
-              <w:t>September 2nd Pharma Sets Hundred-Billion VND Revenue Target, Restructures Senior Leadership</w:t>
-            </w:r>
-          </w:p>
-        </w:tc>
-      </w:tr>
-    </w:tbl>
-    <w:p>
-      <w:pPr>
-        <w:spacing w:before="40" w:after="40"/>
-        <w:ind w:left="170"/>
-      </w:pPr>
-      <w:r>
-        <w:rPr>
-          <w:rFonts w:ascii="Calibri" w:hAnsi="Calibri"/>
-          <w:b w:val="0"/>
-          <w:i/>
-          <w:color w:val="6B7280"/>
-          <w:sz w:val="18"/>
-        </w:rPr>
-        <w:t>September 2nd Pharmaceutical Company (DNP) has announced a hundred-billion VND revenue target for the upcoming fiscal year, alongside a senior leadership restructuring aimed at strengthening governance and accelerating growth. This signals that small-to-mid-sized domestic pharma companies are actively reorganizing to compete in an increasingly dynamic market.[Source]</w:t>
-      </w:r>
-    </w:p>
-    <w:p>
-      <w:pPr>
-        <w:spacing w:before="20" w:after="40"/>
-        <w:ind w:left="170"/>
-      </w:pPr>
-      <w:r>
-        <w:rPr>
-          <w:rFonts w:ascii="Calibri" w:hAnsi="Calibri"/>
-          <w:b/>
-          <w:i w:val="0"/>
-          <w:color w:val="374151"/>
-          <w:sz w:val="17"/>
-        </w:rPr>
-        <w:t>⚠️ Neutral – Indirect competitive signal from mid-tier domestic pharma segment</w:t>
-      </w:r>
-    </w:p>
-    <w:tbl>
-      <w:tblPr>
-        <w:tblStyle w:val="TableGrid"/>
-        <w:tblW w:type="auto" w:w="0"/>
-        <w:tblLook w:firstColumn="1" w:firstRow="1" w:lastColumn="0" w:lastRow="0" w:noHBand="0" w:noVBand="1" w:val="04A0"/>
-      </w:tblPr>
-      <w:tblGrid>
-        <w:gridCol w:w="9072"/>
-      </w:tblGrid>
-      <w:tr>
-        <w:tc>
-          <w:tcPr>
-            <w:tcW w:type="dxa" w:w="9072"/>
-            <w:shd w:val="clear" w:color="auto" w:fill="F8FAFC"/>
-            <w:tcBorders>
-              <w:top w:val="none" w:sz="6" w:color="auto"/>
-              <w:bottom w:val="none" w:sz="6" w:color="auto"/>
-              <w:left w:val="single" w:sz="12" w:color="003B71"/>
-              <w:right w:val="none" w:sz="6" w:color="auto"/>
-            </w:tcBorders>
-          </w:tcPr>
-          <w:p>
-            <w:pPr>
-              <w:spacing w:before="60" w:after="60"/>
-              <w:ind w:left="142"/>
-            </w:pPr>
-            <w:r>
-              <w:rPr>
-                <w:rFonts w:ascii="Calibri" w:hAnsi="Calibri"/>
-                <w:b/>
-                <w:i w:val="0"/>
-                <w:color w:val="003B71"/>
-                <w:sz w:val="17"/>
-              </w:rPr>
-              <w:t xml:space="preserve">Strategy  </w:t>
-            </w:r>
-            <w:r>
-              <w:rPr>
-                <w:rFonts w:ascii="Calibri" w:hAnsi="Calibri"/>
-                <w:b w:val="0"/>
-                <w:i w:val="0"/>
-                <w:color w:val="334155"/>
-                <w:sz w:val="17"/>
-              </w:rPr>
-              <w:t>🔍</w:t>
-            </w:r>
-          </w:p>
-        </w:tc>
-      </w:tr>
-    </w:tbl>
-    <w:p>
-      <w:pPr>
-        <w:spacing w:before="40" w:after="120"/>
-      </w:pPr>
-    </w:p>
-    <w:tbl>
-      <w:tblPr>
-        <w:tblStyle w:val="TableGrid"/>
-        <w:tblW w:type="auto" w:w="0"/>
-        <w:jc w:val="left"/>
-        <w:tblLook w:firstColumn="1" w:firstRow="1" w:lastColumn="0" w:lastRow="0" w:noHBand="0" w:noVBand="1" w:val="04A0"/>
-      </w:tblPr>
-      <w:tblGrid>
-        <w:gridCol w:w="4536"/>
-        <w:gridCol w:w="4536"/>
-      </w:tblGrid>
-      <w:tr>
-        <w:tc>
-          <w:tcPr>
-            <w:tcW w:type="dxa" w:w="1984"/>
-            <w:shd w:val="clear" w:color="auto" w:fill="EEF2FF"/>
-            <w:tcBorders>
-              <w:top w:val="none" w:sz="6" w:color="auto"/>
-              <w:bottom w:val="none" w:sz="6" w:color="auto"/>
-              <w:left w:val="none" w:sz="6" w:color="auto"/>
-              <w:right w:val="none" w:sz="6" w:color="auto"/>
-            </w:tcBorders>
-          </w:tcPr>
-          <w:p>
-            <w:pPr>
-              <w:spacing w:before="80" w:after="80"/>
-              <w:ind w:left="85"/>
-            </w:pPr>
-            <w:r>
-              <w:rPr>
-                <w:rFonts w:ascii="Calibri" w:hAnsi="Calibri"/>
-                <w:b/>
-                <w:i w:val="0"/>
-                <w:color w:val="4338CA"/>
-                <w:sz w:val="15"/>
-              </w:rPr>
-              <w:t>FPT RETAIL LONG CHÂU</w:t>
-            </w:r>
-          </w:p>
-        </w:tc>
-        <w:tc>
-          <w:tcPr>
-            <w:tcW w:type="dxa" w:w="4536"/>
-            <w:tcBorders>
-              <w:top w:val="none" w:sz="6" w:color="auto"/>
-              <w:bottom w:val="none" w:sz="6" w:color="auto"/>
-              <w:left w:val="none" w:sz="6" w:color="auto"/>
-              <w:right w:val="none" w:sz="6" w:color="auto"/>
-            </w:tcBorders>
-          </w:tcPr>
-          <w:p>
-            <w:pPr>
-              <w:spacing w:before="60" w:after="60"/>
-              <w:ind w:left="113"/>
-            </w:pPr>
-            <w:r>
-              <w:rPr>
-                <w:rFonts w:ascii="Calibri" w:hAnsi="Calibri"/>
-                <w:b/>
-                <w:i w:val="0"/>
-                <w:color w:val="111827"/>
-                <w:sz w:val="21"/>
-              </w:rPr>
-              <w:t>Long Chau Drives FPT Retail Growth with People-Centric Strategy — Channel Power Implications for Pharma Manufacturers</w:t>
-            </w:r>
-          </w:p>
-        </w:tc>
-      </w:tr>
-    </w:tbl>
-    <w:p>
-      <w:pPr>
-        <w:spacing w:before="40" w:after="40"/>
-        <w:ind w:left="170"/>
-      </w:pPr>
-      <w:r>
-        <w:rPr>
-          <w:rFonts w:ascii="Calibri" w:hAnsi="Calibri"/>
-          <w:b w:val="0"/>
-          <w:i/>
-          <w:color w:val="6B7280"/>
-          <w:sz w:val="18"/>
-        </w:rPr>
-        <w:t>Long Chau pharmacy chain (under FPT Retail) continues to be the primary growth engine, expanding its nationwide network and reinforcing its leadership in Vietnam's retail pharmaceutical market. Its strategy centers on community health service, increased outlet coverage, and enhanced customer experience.[Source]</w:t>
-      </w:r>
-    </w:p>
-    <w:p>
-      <w:pPr>
-        <w:spacing w:before="20" w:after="40"/>
-        <w:ind w:left="170"/>
-      </w:pPr>
-      <w:r>
-        <w:rPr>
-          <w:rFonts w:ascii="Calibri" w:hAnsi="Calibri"/>
-          <w:b/>
-          <w:i w:val="0"/>
-          <w:color w:val="166534"/>
-          <w:sz w:val="17"/>
-        </w:rPr>
-        <w:t>⚡ Dual Impact: Distribution expansion opportunity — offset by channel dependency risk &amp; pricing pressure</w:t>
-      </w:r>
-    </w:p>
-    <w:tbl>
-      <w:tblPr>
-        <w:tblStyle w:val="TableGrid"/>
-        <w:tblW w:type="auto" w:w="0"/>
-        <w:tblLook w:firstColumn="1" w:firstRow="1" w:lastColumn="0" w:lastRow="0" w:noHBand="0" w:noVBand="1" w:val="04A0"/>
-      </w:tblPr>
-      <w:tblGrid>
-        <w:gridCol w:w="9072"/>
-      </w:tblGrid>
-      <w:tr>
-        <w:tc>
-          <w:tcPr>
-            <w:tcW w:type="dxa" w:w="9072"/>
-            <w:shd w:val="clear" w:color="auto" w:fill="F8FAFC"/>
-            <w:tcBorders>
-              <w:top w:val="none" w:sz="6" w:color="auto"/>
-              <w:bottom w:val="none" w:sz="6" w:color="auto"/>
-              <w:left w:val="single" w:sz="12" w:color="003B71"/>
-              <w:right w:val="none" w:sz="6" w:color="auto"/>
-            </w:tcBorders>
-          </w:tcPr>
-          <w:p>
-            <w:pPr>
-              <w:spacing w:before="60" w:after="60"/>
-              <w:ind w:left="142"/>
-            </w:pPr>
-            <w:r>
-              <w:rPr>
-                <w:rFonts w:ascii="Calibri" w:hAnsi="Calibri"/>
-                <w:b/>
-                <w:i w:val="0"/>
-                <w:color w:val="003B71"/>
-                <w:sz w:val="17"/>
-              </w:rPr>
-              <w:t xml:space="preserve">Strategy  </w:t>
-            </w:r>
-            <w:r>
-              <w:rPr>
-                <w:rFonts w:ascii="Calibri" w:hAnsi="Calibri"/>
-                <w:b w:val="0"/>
-                <w:i w:val="0"/>
-                <w:color w:val="334155"/>
-                <w:sz w:val="17"/>
-              </w:rPr>
-              <w:t>🏪 Channel Power Dynamics:Long Chau's sustained expansion (1,800+ outlets nationwide) is reshaping the manufacturer-retailer power balance. As Long Chau captures an increasing share of Davipharm's OTC revenue, the retailer gains leverage to demand higher trade discounts, extended payment terms, or exclusive SKU arrangements — creating significant channel dependency risk.📦 Shelf-Space &amp; Portfolio Positioning:Long Chau's "people-centric" strategy favors products with clear clinical value, competitive pricing, and strong brand recognition. Davipharm must proactively negotiate premium shelf positioning (eye-level, end-cap displays) for strategic product lines, particularly vitamins, OTC antibiotics, and premium generics.🤝 Strategic Recommendations:(1) Establish a Strategic Partnership Program with Long Chau, including pharmacist training support on</w:t>
-            </w:r>
-          </w:p>
-        </w:tc>
-      </w:tr>
-    </w:tbl>
-    <w:p>
-      <w:pPr>
-        <w:spacing w:before="40" w:after="120"/>
-      </w:pPr>
-    </w:p>
-    <w:tbl>
-      <w:tblPr>
-        <w:tblStyle w:val="TableGrid"/>
-        <w:tblW w:type="auto" w:w="0"/>
-        <w:jc w:val="left"/>
-        <w:tblLook w:firstColumn="1" w:firstRow="1" w:lastColumn="0" w:lastRow="0" w:noHBand="0" w:noVBand="1" w:val="04A0"/>
-      </w:tblPr>
-      <w:tblGrid>
-        <w:gridCol w:w="4536"/>
-        <w:gridCol w:w="4536"/>
-      </w:tblGrid>
-      <w:tr>
-        <w:tc>
-          <w:tcPr>
-            <w:tcW w:type="dxa" w:w="1984"/>
-            <w:shd w:val="clear" w:color="auto" w:fill="EEF2FF"/>
-            <w:tcBorders>
-              <w:top w:val="none" w:sz="6" w:color="auto"/>
-              <w:bottom w:val="none" w:sz="6" w:color="auto"/>
-              <w:left w:val="none" w:sz="6" w:color="auto"/>
-              <w:right w:val="none" w:sz="6" w:color="auto"/>
-            </w:tcBorders>
-          </w:tcPr>
-          <w:p>
-            <w:pPr>
-              <w:spacing w:before="80" w:after="80"/>
-              <w:ind w:left="85"/>
-            </w:pPr>
-            <w:r>
-              <w:rPr>
-                <w:rFonts w:ascii="Calibri" w:hAnsi="Calibri"/>
-                <w:b/>
-                <w:i w:val="0"/>
-                <w:color w:val="4338CA"/>
-                <w:sz w:val="15"/>
-              </w:rPr>
-              <w:t>PHARMACITY</w:t>
-            </w:r>
-          </w:p>
-        </w:tc>
-        <w:tc>
-          <w:tcPr>
-            <w:tcW w:type="dxa" w:w="4536"/>
-            <w:tcBorders>
-              <w:top w:val="none" w:sz="6" w:color="auto"/>
-              <w:bottom w:val="none" w:sz="6" w:color="auto"/>
-              <w:left w:val="none" w:sz="6" w:color="auto"/>
-              <w:right w:val="none" w:sz="6" w:color="auto"/>
-            </w:tcBorders>
-          </w:tcPr>
-          <w:p>
-            <w:pPr>
-              <w:spacing w:before="60" w:after="60"/>
-              <w:ind w:left="113"/>
-            </w:pPr>
-            <w:r>
-              <w:rPr>
-                <w:rFonts w:ascii="Calibri" w:hAnsi="Calibri"/>
-                <w:b/>
-                <w:i w:val="0"/>
-                <w:color w:val="111827"/>
-                <w:sz w:val="21"/>
-              </w:rPr>
-              <w:t>Pharmacity: Ambition to 'Connect the Healthcare Map' and Mission to Serve Vietnamese Health</w:t>
-            </w:r>
-          </w:p>
-        </w:tc>
-      </w:tr>
-    </w:tbl>
-    <w:p>
-      <w:pPr>
-        <w:spacing w:before="40" w:after="40"/>
-        <w:ind w:left="170"/>
-      </w:pPr>
-      <w:r>
-        <w:rPr>
-          <w:rFonts w:ascii="Calibri" w:hAnsi="Calibri"/>
-          <w:b w:val="0"/>
-          <w:i/>
-          <w:color w:val="6B7280"/>
-          <w:sz w:val="18"/>
-        </w:rPr>
-        <w:t>Pharmacity continues to assert its vision of expanding its pharmacy chain network nationwide, targeting coverage across all provinces including remote areas, aiming to "connect Vietnam's healthcare map." The chain emphasizes a mission of comprehensive healthcare services — not just drug retail, but also patient consultation and ecosystem connectivity.[Source]</w:t>
-      </w:r>
-    </w:p>
-    <w:p>
-      <w:pPr>
-        <w:spacing w:before="20" w:after="40"/>
-        <w:ind w:left="170"/>
-      </w:pPr>
-      <w:r>
-        <w:rPr>
-          <w:rFonts w:ascii="Calibri" w:hAnsi="Calibri"/>
-          <w:b/>
-          <w:i w:val="0"/>
-          <w:color w:val="166534"/>
-          <w:sz w:val="17"/>
-        </w:rPr>
-        <w:t>⚡ Conditionally Positive — Major distribution channel expansion opportunity, but with dependency risk and shelf-space pressure</w:t>
-      </w:r>
-    </w:p>
-    <w:tbl>
-      <w:tblPr>
-        <w:tblStyle w:val="TableGrid"/>
-        <w:tblW w:type="auto" w:w="0"/>
-        <w:tblLook w:firstColumn="1" w:firstRow="1" w:lastColumn="0" w:lastRow="0" w:noHBand="0" w:noVBand="1" w:val="04A0"/>
-      </w:tblPr>
-      <w:tblGrid>
-        <w:gridCol w:w="9072"/>
-      </w:tblGrid>
-      <w:tr>
-        <w:tc>
-          <w:tcPr>
-            <w:tcW w:type="dxa" w:w="9072"/>
-            <w:shd w:val="clear" w:color="auto" w:fill="F8FAFC"/>
-            <w:tcBorders>
-              <w:top w:val="none" w:sz="6" w:color="auto"/>
-              <w:bottom w:val="none" w:sz="6" w:color="auto"/>
-              <w:left w:val="single" w:sz="12" w:color="003B71"/>
-              <w:right w:val="none" w:sz="6" w:color="auto"/>
-            </w:tcBorders>
-          </w:tcPr>
-          <w:p>
-            <w:pPr>
-              <w:spacing w:before="60" w:after="60"/>
-              <w:ind w:left="142"/>
-            </w:pPr>
-            <w:r>
-              <w:rPr>
-                <w:rFonts w:ascii="Calibri" w:hAnsi="Calibri"/>
-                <w:b/>
-                <w:i w:val="0"/>
-                <w:color w:val="003B71"/>
-                <w:sz w:val="17"/>
-              </w:rPr>
-              <w:t xml:space="preserve">Strategy  </w:t>
-            </w:r>
-            <w:r>
-              <w:rPr>
-                <w:rFonts w:ascii="Calibri" w:hAnsi="Calibri"/>
-                <w:b w:val="0"/>
-                <w:i w:val="0"/>
-                <w:color w:val="334155"/>
-                <w:sz w:val="17"/>
-              </w:rPr>
-              <w:t>🏪 Channel Power:Pharmacity's network expansion means the chain increasingly controls access to OTC consumers, especially in underserved provinces. Davipharm must reassess dependency risk — high revenue concentration in this channel weakens negotiating leverage on pricing and terms.📦 Shelf-space &amp; Listing Fees:Pharmacity's growth ambitions typically come with higher listing fees, SKU ration</w:t>
-            </w:r>
-          </w:p>
-        </w:tc>
-      </w:tr>
-    </w:tbl>
-    <w:p>
-      <w:pPr>
-        <w:spacing w:before="40" w:after="120"/>
-      </w:pPr>
-    </w:p>
     <w:p>
       <w:r>
         <w:br w:type="page"/>
@@ -2402,474 +1204,6 @@
         </w:rPr>
         <w:t>COMPETITOR INTELLIGENCE</w:t>
       </w:r>
-    </w:p>
-    <w:tbl>
-      <w:tblPr>
-        <w:tblStyle w:val="TableGrid"/>
-        <w:tblW w:type="auto" w:w="0"/>
-        <w:jc w:val="left"/>
-        <w:tblLook w:firstColumn="1" w:firstRow="1" w:lastColumn="0" w:lastRow="0" w:noHBand="0" w:noVBand="1" w:val="04A0"/>
-      </w:tblPr>
-      <w:tblGrid>
-        <w:gridCol w:w="4536"/>
-        <w:gridCol w:w="4536"/>
-      </w:tblGrid>
-      <w:tr>
-        <w:tc>
-          <w:tcPr>
-            <w:tcW w:type="dxa" w:w="1984"/>
-            <w:shd w:val="clear" w:color="auto" w:fill="EEF2FF"/>
-            <w:tcBorders>
-              <w:top w:val="none" w:sz="6" w:color="auto"/>
-              <w:bottom w:val="none" w:sz="6" w:color="auto"/>
-              <w:left w:val="none" w:sz="6" w:color="auto"/>
-              <w:right w:val="none" w:sz="6" w:color="auto"/>
-            </w:tcBorders>
-          </w:tcPr>
-          <w:p>
-            <w:pPr>
-              <w:spacing w:before="80" w:after="80"/>
-              <w:ind w:left="85"/>
-            </w:pPr>
-            <w:r>
-              <w:rPr>
-                <w:rFonts w:ascii="Calibri" w:hAnsi="Calibri"/>
-                <w:b/>
-                <w:i w:val="0"/>
-                <w:color w:val="4338CA"/>
-                <w:sz w:val="15"/>
-              </w:rPr>
-              <w:t>DHG PHARMA</w:t>
-            </w:r>
-          </w:p>
-        </w:tc>
-        <w:tc>
-          <w:tcPr>
-            <w:tcW w:type="dxa" w:w="4536"/>
-            <w:tcBorders>
-              <w:top w:val="none" w:sz="6" w:color="auto"/>
-              <w:bottom w:val="none" w:sz="6" w:color="auto"/>
-              <w:left w:val="none" w:sz="6" w:color="auto"/>
-              <w:right w:val="none" w:sz="6" w:color="auto"/>
-            </w:tcBorders>
-          </w:tcPr>
-          <w:p>
-            <w:pPr>
-              <w:spacing w:before="60" w:after="60"/>
-              <w:ind w:left="113"/>
-            </w:pPr>
-            <w:r>
-              <w:rPr>
-                <w:rFonts w:ascii="Calibri" w:hAnsi="Calibri"/>
-                <w:b/>
-                <w:i w:val="0"/>
-                <w:color w:val="111827"/>
-                <w:sz w:val="21"/>
-              </w:rPr>
-              <w:t>DHG Pharma Pays Generous Dividends, Japanese Giant Taisho Consistently Pockets Hundreds of Billions VND</w:t>
-            </w:r>
-          </w:p>
-        </w:tc>
-      </w:tr>
-    </w:tbl>
-    <w:p>
-      <w:pPr>
-        <w:spacing w:before="40" w:after="40"/>
-        <w:ind w:left="170"/>
-      </w:pPr>
-      <w:r>
-        <w:rPr>
-          <w:rFonts w:ascii="Calibri" w:hAnsi="Calibri"/>
-          <w:b w:val="0"/>
-          <w:i/>
-          <w:color w:val="6B7280"/>
-          <w:sz w:val="18"/>
-        </w:rPr>
-        <w:t>DHG Pharma (Dược Hậu Giang) continues its high dividend payout policy, allowing its major strategic shareholder — Japanese pharmaceutical giant Taisho — to consistently receive hundreds of billions of VND annually. This reflects DHG's strong financial foundation and stable profitability within Vietnam's pharmaceutical sector.[Source]</w:t>
-      </w:r>
-    </w:p>
-    <w:p>
-      <w:pPr>
-        <w:spacing w:before="20" w:after="40"/>
-        <w:ind w:left="170"/>
-      </w:pPr>
-      <w:r>
-        <w:rPr>
-          <w:rFonts w:ascii="Calibri" w:hAnsi="Calibri"/>
-          <w:b/>
-          <w:i w:val="0"/>
-          <w:color w:val="991B1B"/>
-          <w:sz w:val="17"/>
-        </w:rPr>
-        <w:t>⚠️ Challenging — Competitor backed by strong Japanese financial support, increasing long-term competitive pressure on Davipharm</w:t>
-      </w:r>
-    </w:p>
-    <w:tbl>
-      <w:tblPr>
-        <w:tblStyle w:val="TableGrid"/>
-        <w:tblW w:type="auto" w:w="0"/>
-        <w:tblLook w:firstColumn="1" w:firstRow="1" w:lastColumn="0" w:lastRow="0" w:noHBand="0" w:noVBand="1" w:val="04A0"/>
-      </w:tblPr>
-      <w:tblGrid>
-        <w:gridCol w:w="9072"/>
-      </w:tblGrid>
-      <w:tr>
-        <w:tc>
-          <w:tcPr>
-            <w:tcW w:type="dxa" w:w="9072"/>
-            <w:shd w:val="clear" w:color="auto" w:fill="F8FAFC"/>
-            <w:tcBorders>
-              <w:top w:val="none" w:sz="6" w:color="auto"/>
-              <w:bottom w:val="none" w:sz="6" w:color="auto"/>
-              <w:left w:val="single" w:sz="12" w:color="003B71"/>
-              <w:right w:val="none" w:sz="6" w:color="auto"/>
-            </w:tcBorders>
-          </w:tcPr>
-          <w:p>
-            <w:pPr>
-              <w:spacing w:before="60" w:after="60"/>
-              <w:ind w:left="142"/>
-            </w:pPr>
-            <w:r>
-              <w:rPr>
-                <w:rFonts w:ascii="Calibri" w:hAnsi="Calibri"/>
-                <w:b/>
-                <w:i w:val="0"/>
-                <w:color w:val="003B71"/>
-                <w:sz w:val="17"/>
-              </w:rPr>
-              <w:t xml:space="preserve">Strategy  </w:t>
-            </w:r>
-            <w:r>
-              <w:rPr>
-                <w:rFonts w:ascii="Calibri" w:hAnsi="Calibri"/>
-                <w:b w:val="0"/>
-                <w:i w:val="0"/>
-                <w:color w:val="334155"/>
-                <w:sz w:val="17"/>
-              </w:rPr>
-              <w:t>🔴 Product Competition &amp; Competitor Financial Strength:DHG's sustained high dividend payouts, backed by Taisho's financial support, signal that this key competitor has ample resources to continuously invest in R&amp;D, GMP-standard manufacturing upgrades, and product portfolio expansion — particularly in OTC and premium generic segments that directly overlap with Davipharm's core business.🔴 Hospital Tendering (ETC Channel):With a solid financial base, DHG can afford to accept thinner margins in hospital tender bids to capture market share, placing significant pricing pressure on Davipharm in the ETC channel.🟡 Opportunity for Davipharm:DHG's focus on maintaining profitability for dividend distribution may make them more conservative in pursuing high-risk innovation or niche therapeutic segments. Davipharm should exploit this gap by accelerating product innovation, targeting specialized treatment segments underserved by DHG, and building sustainable</w:t>
-            </w:r>
-          </w:p>
-        </w:tc>
-      </w:tr>
-    </w:tbl>
-    <w:p>
-      <w:pPr>
-        <w:spacing w:before="40" w:after="120"/>
-      </w:pPr>
-    </w:p>
-    <w:tbl>
-      <w:tblPr>
-        <w:tblStyle w:val="TableGrid"/>
-        <w:tblW w:type="auto" w:w="0"/>
-        <w:jc w:val="left"/>
-        <w:tblLook w:firstColumn="1" w:firstRow="1" w:lastColumn="0" w:lastRow="0" w:noHBand="0" w:noVBand="1" w:val="04A0"/>
-      </w:tblPr>
-      <w:tblGrid>
-        <w:gridCol w:w="4536"/>
-        <w:gridCol w:w="4536"/>
-      </w:tblGrid>
-      <w:tr>
-        <w:tc>
-          <w:tcPr>
-            <w:tcW w:type="dxa" w:w="1984"/>
-            <w:shd w:val="clear" w:color="auto" w:fill="EEF2FF"/>
-            <w:tcBorders>
-              <w:top w:val="none" w:sz="6" w:color="auto"/>
-              <w:bottom w:val="none" w:sz="6" w:color="auto"/>
-              <w:left w:val="none" w:sz="6" w:color="auto"/>
-              <w:right w:val="none" w:sz="6" w:color="auto"/>
-            </w:tcBorders>
-          </w:tcPr>
-          <w:p>
-            <w:pPr>
-              <w:spacing w:before="80" w:after="80"/>
-              <w:ind w:left="85"/>
-            </w:pPr>
-            <w:r>
-              <w:rPr>
-                <w:rFonts w:ascii="Calibri" w:hAnsi="Calibri"/>
-                <w:b/>
-                <w:i w:val="0"/>
-                <w:color w:val="4338CA"/>
-                <w:sz w:val="15"/>
-              </w:rPr>
-              <w:t>LONG CHÂU CHAIN</w:t>
-            </w:r>
-          </w:p>
-        </w:tc>
-        <w:tc>
-          <w:tcPr>
-            <w:tcW w:type="dxa" w:w="4536"/>
-            <w:tcBorders>
-              <w:top w:val="none" w:sz="6" w:color="auto"/>
-              <w:bottom w:val="none" w:sz="6" w:color="auto"/>
-              <w:left w:val="none" w:sz="6" w:color="auto"/>
-              <w:right w:val="none" w:sz="6" w:color="auto"/>
-            </w:tcBorders>
-          </w:tcPr>
-          <w:p>
-            <w:pPr>
-              <w:spacing w:before="60" w:after="60"/>
-              <w:ind w:left="113"/>
-            </w:pPr>
-            <w:r>
-              <w:rPr>
-                <w:rFonts w:ascii="Calibri" w:hAnsi="Calibri"/>
-                <w:b/>
-                <w:i w:val="0"/>
-                <w:color w:val="111827"/>
-                <w:sz w:val="21"/>
-              </w:rPr>
-              <w:t>Long Châu Pharmacy Chain: Pioneering Digital Data Integration &amp; Breakthrough Healthcare Services</w:t>
-            </w:r>
-          </w:p>
-        </w:tc>
-      </w:tr>
-    </w:tbl>
-    <w:p>
-      <w:pPr>
-        <w:spacing w:before="40" w:after="40"/>
-        <w:ind w:left="170"/>
-      </w:pPr>
-      <w:r>
-        <w:rPr>
-          <w:rFonts w:ascii="Calibri" w:hAnsi="Calibri"/>
-          <w:b w:val="0"/>
-          <w:i/>
-          <w:color w:val="6B7280"/>
-          <w:sz w:val="18"/>
-        </w:rPr>
-        <w:t>Long Châu pharmacy chain (FPT Retail) is aggressively leveraging digital data and technology across its operations, launching new healthcare services to enhance customer experience and reinforce its leading position in Vietnam's pharmaceutical retail market. The strategy encompasses personalized health consultations, digital patient record integration, and expansion of a comprehensive healthcare ecosystem.[Source]</w:t>
-      </w:r>
-    </w:p>
-    <w:p>
-      <w:pPr>
-        <w:spacing w:before="20" w:after="40"/>
-        <w:ind w:left="170"/>
-      </w:pPr>
-      <w:r>
-        <w:rPr>
-          <w:rFonts w:ascii="Calibri" w:hAnsi="Calibri"/>
-          <w:b/>
-          <w:i w:val="0"/>
-          <w:color w:val="991B1B"/>
-          <w:sz w:val="17"/>
-        </w:rPr>
-        <w:t>⚠️ High Competitive Pressure — Long Châu's digital acceleration intensifies bargaining power over generic pharma suppliers</w:t>
-      </w:r>
-    </w:p>
-    <w:tbl>
-      <w:tblPr>
-        <w:tblStyle w:val="TableGrid"/>
-        <w:tblW w:type="auto" w:w="0"/>
-        <w:tblLook w:firstColumn="1" w:firstRow="1" w:lastColumn="0" w:lastRow="0" w:noHBand="0" w:noVBand="1" w:val="04A0"/>
-      </w:tblPr>
-      <w:tblGrid>
-        <w:gridCol w:w="9072"/>
-      </w:tblGrid>
-      <w:tr>
-        <w:tc>
-          <w:tcPr>
-            <w:tcW w:type="dxa" w:w="9072"/>
-            <w:shd w:val="clear" w:color="auto" w:fill="F8FAFC"/>
-            <w:tcBorders>
-              <w:top w:val="none" w:sz="6" w:color="auto"/>
-              <w:bottom w:val="none" w:sz="6" w:color="auto"/>
-              <w:left w:val="single" w:sz="12" w:color="003B71"/>
-              <w:right w:val="none" w:sz="6" w:color="auto"/>
-            </w:tcBorders>
-          </w:tcPr>
-          <w:p>
-            <w:pPr>
-              <w:spacing w:before="60" w:after="60"/>
-              <w:ind w:left="142"/>
-            </w:pPr>
-            <w:r>
-              <w:rPr>
-                <w:rFonts w:ascii="Calibri" w:hAnsi="Calibri"/>
-                <w:b/>
-                <w:i w:val="0"/>
-                <w:color w:val="003B71"/>
-                <w:sz w:val="17"/>
-              </w:rPr>
-              <w:t xml:space="preserve">Strategy  </w:t>
-            </w:r>
-            <w:r>
-              <w:rPr>
-                <w:rFonts w:ascii="Calibri" w:hAnsi="Calibri"/>
-                <w:b w:val="0"/>
-                <w:i w:val="0"/>
-                <w:color w:val="334155"/>
-                <w:sz w:val="17"/>
-              </w:rPr>
-              <w:t>Direct Threat:As Long Châu integrates digital data and personalized advisory, it will increasingly favor products with strong clinical evidence, recognized branding, or exclusive distribution agreements — disadvantaging Davipharm's generics lacking a clear brand strategy.Empagliflozin Risk:In the T2DM segment, Long Châu may prioritize originator brands (Jardiance) or generics with exclusive deals. Davipharm must negotiate priority placement on Long Châu's digital shelf and within its AI recommendation engine.Tadalafil &amp; Dapoxetine Opportunity:Long Châu's discreet digital men's health consultation services represent a golden channel. Davipharm should propose co-branding programs or integrated men's health packages embedding Tadalafil/Dapoxetine into Long Châu's digital customer journey.Strategic Action:Prioritize strategic supply agreements with Long Châu; invest in Real-World Evidence (RWE) for Empagliflozin to meet the evidence-based selection criteria of Long Châu</w:t>
-            </w:r>
-          </w:p>
-        </w:tc>
-      </w:tr>
-    </w:tbl>
-    <w:p>
-      <w:pPr>
-        <w:spacing w:before="40" w:after="120"/>
-      </w:pPr>
-    </w:p>
-    <w:tbl>
-      <w:tblPr>
-        <w:tblStyle w:val="TableGrid"/>
-        <w:tblW w:type="auto" w:w="0"/>
-        <w:jc w:val="left"/>
-        <w:tblLook w:firstColumn="1" w:firstRow="1" w:lastColumn="0" w:lastRow="0" w:noHBand="0" w:noVBand="1" w:val="04A0"/>
-      </w:tblPr>
-      <w:tblGrid>
-        <w:gridCol w:w="4536"/>
-        <w:gridCol w:w="4536"/>
-      </w:tblGrid>
-      <w:tr>
-        <w:tc>
-          <w:tcPr>
-            <w:tcW w:type="dxa" w:w="1984"/>
-            <w:shd w:val="clear" w:color="auto" w:fill="EEF2FF"/>
-            <w:tcBorders>
-              <w:top w:val="none" w:sz="6" w:color="auto"/>
-              <w:bottom w:val="none" w:sz="6" w:color="auto"/>
-              <w:left w:val="none" w:sz="6" w:color="auto"/>
-              <w:right w:val="none" w:sz="6" w:color="auto"/>
-            </w:tcBorders>
-          </w:tcPr>
-          <w:p>
-            <w:pPr>
-              <w:spacing w:before="80" w:after="80"/>
-              <w:ind w:left="85"/>
-            </w:pPr>
-            <w:r>
-              <w:rPr>
-                <w:rFonts w:ascii="Calibri" w:hAnsi="Calibri"/>
-                <w:b/>
-                <w:i w:val="0"/>
-                <w:color w:val="4338CA"/>
-                <w:sz w:val="15"/>
-              </w:rPr>
-              <w:t>FPT RETAIL LONG CHÂU</w:t>
-            </w:r>
-          </w:p>
-        </w:tc>
-        <w:tc>
-          <w:tcPr>
-            <w:tcW w:type="dxa" w:w="4536"/>
-            <w:tcBorders>
-              <w:top w:val="none" w:sz="6" w:color="auto"/>
-              <w:bottom w:val="none" w:sz="6" w:color="auto"/>
-              <w:left w:val="none" w:sz="6" w:color="auto"/>
-              <w:right w:val="none" w:sz="6" w:color="auto"/>
-            </w:tcBorders>
-          </w:tcPr>
-          <w:p>
-            <w:pPr>
-              <w:spacing w:before="60" w:after="60"/>
-              <w:ind w:left="113"/>
-            </w:pPr>
-            <w:r>
-              <w:rPr>
-                <w:rFonts w:ascii="Calibri" w:hAnsi="Calibri"/>
-                <w:b/>
-                <w:i w:val="0"/>
-                <w:color w:val="111827"/>
-                <w:sz w:val="21"/>
-              </w:rPr>
-              <w:t>FPT Retail Q1/2026 Profit Surges 73% — Long Châu Pharmacy Chain Drives Dominant Growth</w:t>
-            </w:r>
-          </w:p>
-        </w:tc>
-      </w:tr>
-    </w:tbl>
-    <w:p>
-      <w:pPr>
-        <w:spacing w:before="40" w:after="40"/>
-        <w:ind w:left="170"/>
-      </w:pPr>
-      <w:r>
-        <w:rPr>
-          <w:rFonts w:ascii="Calibri" w:hAnsi="Calibri"/>
-          <w:b w:val="0"/>
-          <w:i/>
-          <w:color w:val="6B7280"/>
-          <w:sz w:val="18"/>
-        </w:rPr>
-        <w:t>FPT Retail reported a 73% year-on-year net profit increase in Q1/2026, primarily driven by the Long Châu pharmacy chain's aggressive network expansion, higher prescription and OTC drug revenues, and improved gross margins through direct manufacturer negotiations and optimized product portfolio management.[Source]</w:t>
-      </w:r>
-    </w:p>
-    <w:p>
-      <w:pPr>
-        <w:spacing w:before="20" w:after="40"/>
-        <w:ind w:left="170"/>
-      </w:pPr>
-      <w:r>
-        <w:rPr>
-          <w:rFonts w:ascii="Calibri" w:hAnsi="Calibri"/>
-          <w:b/>
-          <w:i w:val="0"/>
-          <w:color w:val="991B1B"/>
-          <w:sz w:val="17"/>
-        </w:rPr>
-        <w:t>⚠️ Negative Impact — Long Châu's accelerating growth intensifies retail pharmacy channel competition, directly pressuring Davipharm's shelf presence and pricing power</w:t>
-      </w:r>
-    </w:p>
-    <w:tbl>
-      <w:tblPr>
-        <w:tblStyle w:val="TableGrid"/>
-        <w:tblW w:type="auto" w:w="0"/>
-        <w:tblLook w:firstColumn="1" w:firstRow="1" w:lastColumn="0" w:lastRow="0" w:noHBand="0" w:noVBand="1" w:val="04A0"/>
-      </w:tblPr>
-      <w:tblGrid>
-        <w:gridCol w:w="9072"/>
-      </w:tblGrid>
-      <w:tr>
-        <w:tc>
-          <w:tcPr>
-            <w:tcW w:type="dxa" w:w="9072"/>
-            <w:shd w:val="clear" w:color="auto" w:fill="F8FAFC"/>
-            <w:tcBorders>
-              <w:top w:val="none" w:sz="6" w:color="auto"/>
-              <w:bottom w:val="none" w:sz="6" w:color="auto"/>
-              <w:left w:val="single" w:sz="12" w:color="003B71"/>
-              <w:right w:val="none" w:sz="6" w:color="auto"/>
-            </w:tcBorders>
-          </w:tcPr>
-          <w:p>
-            <w:pPr>
-              <w:spacing w:before="60" w:after="60"/>
-              <w:ind w:left="142"/>
-            </w:pPr>
-            <w:r>
-              <w:rPr>
-                <w:rFonts w:ascii="Calibri" w:hAnsi="Calibri"/>
-                <w:b/>
-                <w:i w:val="0"/>
-                <w:color w:val="003B71"/>
-                <w:sz w:val="17"/>
-              </w:rPr>
-              <w:t xml:space="preserve">Strategy  </w:t>
-            </w:r>
-            <w:r>
-              <w:rPr>
-                <w:rFonts w:ascii="Calibri" w:hAnsi="Calibri"/>
-                <w:b w:val="0"/>
-                <w:i w:val="0"/>
-                <w:color w:val="334155"/>
-                <w:sz w:val="17"/>
-              </w:rPr>
-              <w:t>Direct Threat:Long Châu's 73% profit growth and 3,000+ outlet network significantly strengthens its bargaining power over manufacturers, creating downward pressure on Davipharm's wholesale pricing and payment terms. ForEmpagliflozin— a high-growth diabetes segment — Long Châu may prioritize lower-cost international generics unless Davipharm maintains competitive pricing and margin-sharing policies.Strategic Opportunity:Long Châu's rapid expansion creates strong demand for reliable domestic supply, particularly for sensitive, high-margin products likeTadalafilandDapoxetine, where Long Châu needs trusted local manufacturing partners for quality assurance and regulatory compliance. Davipharm should proactively negotiate preferred or exclusive supply agreements for these SKUs, bundled with pharmacist training programs.Recommended Actions:(1) Develop a differentiated value proposition for the Long Châu channel featuring Empagliflozin + medication adherence support bundles; (2)</w:t>
-            </w:r>
-          </w:p>
-        </w:tc>
-      </w:tr>
-    </w:tbl>
-    <w:p>
-      <w:pPr>
-        <w:spacing w:before="40" w:after="120"/>
-      </w:pPr>
     </w:p>
     <w:p>
       <w:r>
@@ -3591,7 +1925,7 @@
           <w:color w:val="9CA3AF"/>
           <w:sz w:val="17"/>
         </w:rPr>
-        <w:t>Google Search Console  ·  Last 30 days  ·  Data: 12/05/2026</w:t>
+        <w:t>Google Search Console  ·  Last 30 days  ·  Data: 13/05/2026</w:t>
       </w:r>
     </w:p>
     <w:p>
@@ -4523,7 +2857,7 @@
                 <w:color w:val="9CA3AF"/>
                 <w:sz w:val="15"/>
               </w:rPr>
-              <w:t>Davipharm Market Intelligence System  ·  Powered by Claude Sonnet 4.6  ·  12/05/2026  ·  CONFIDENTIAL</w:t>
+              <w:t>Davipharm Market Intelligence System  ·  Powered by Claude Sonnet 4.6  ·  13/05/2026  ·  CONFIDENTIAL</w:t>
             </w:r>
           </w:p>
         </w:tc>

</xml_diff>

<commit_message>
Update report_en.docx 2026-05-13 10:05
</commit_message>
<xml_diff>
--- a/report_en.docx
+++ b/report_en.docx
@@ -338,7 +338,7 @@
                 <w:color w:val="111827"/>
                 <w:sz w:val="20"/>
               </w:rPr>
-              <w:t>This week: Tender reform opens opportunities for Davipharm while Long Châu's rapid expansion intensifies distribution channel pressure.</w:t>
+              <w:t>Week 11–17 May: Three growth opportunities emerge for Davipharm — thyroid hospital tenders, domestic herbal OTC, and Levetiracetam repositioning into premium neurology.</w:t>
             </w:r>
           </w:p>
         </w:tc>
@@ -406,7 +406,7 @@
                 <w:color w:val="111827"/>
                 <w:sz w:val="17"/>
               </w:rPr>
-              <w:t>▸  Tendering:Criteria shift away from "lowest price" — GMP-EU manufacturers gain direct advantage.</w:t>
+              <w:t>▸  Medical Tourism &amp; Thyroid:Rising international patient volumes at specialist hospitals elevate drug quality standards, opening a competitive window for Davipharm's high-quality generics over imports.</w:t>
             </w:r>
           </w:p>
           <w:p>
@@ -422,7 +422,7 @@
                 <w:color w:val="111827"/>
                 <w:sz w:val="17"/>
               </w:rPr>
-              <w:t>▸  OTC Channel:FPT Retail +73% profit Q1/2026, Long Châu leads — shelf-space negotiation increasingly challenging.</w:t>
+              <w:t>▸  Domestic Herbals:Mass media is organically priming consumer demand for Vietnamese herbal OTC/nutraceuticals — Davipharm's low-cost domestic sourcing advantage remains underexploited.</w:t>
             </w:r>
           </w:p>
           <w:p>
@@ -438,7 +438,7 @@
                 <w:color w:val="111827"/>
                 <w:sz w:val="17"/>
               </w:rPr>
-              <w:t>▸  Supply Chain:Q1/2026 raw material imports declined sharply — API supply chain review warranted.</w:t>
+              <w:t>▸  Levetiracetam &amp; Alzheimer:U.S. research confirms Levetiracetam's repurposing potential for Alzheimer's prevention, enabling premium positioning and new neurology tender categories if Davipharm holds this molecule.</w:t>
             </w:r>
           </w:p>
           <w:p>
@@ -454,39 +454,7 @@
                 <w:color w:val="111827"/>
                 <w:sz w:val="17"/>
               </w:rPr>
-              <w:t>▸  P1RA/Marketing: Prepare EU-GMP dossier to qualify for Group 1 tenders under new regulations.</w:t>
-            </w:r>
-          </w:p>
-          <w:p>
-            <w:pPr>
-              <w:spacing w:before="20" w:after="60"/>
-              <w:ind w:left="142"/>
-            </w:pPr>
-            <w:r>
-              <w:rPr>
-                <w:rFonts w:ascii="Calibri" w:hAnsi="Calibri"/>
-                <w:b w:val="0"/>
-                <w:i w:val="0"/>
-                <w:color w:val="111827"/>
-                <w:sz w:val="17"/>
-              </w:rPr>
-              <w:t>▸  P2Sales: Negotiate group-level partnership with Long Châu — avoid store-by-store negotiations.</w:t>
-            </w:r>
-          </w:p>
-          <w:p>
-            <w:pPr>
-              <w:spacing w:before="20" w:after="60"/>
-              <w:ind w:left="142"/>
-            </w:pPr>
-            <w:r>
-              <w:rPr>
-                <w:rFonts w:ascii="Calibri" w:hAnsi="Calibri"/>
-                <w:b w:val="0"/>
-                <w:i w:val="0"/>
-                <w:color w:val="111827"/>
-                <w:sz w:val="17"/>
-              </w:rPr>
-              <w:t>▸  P3Supply Chain: Audit API inventory and evaluate alternative sourcing amid import decline.</w:t>
+              <w:t>▸  P1BD/Tender team to engage National Endocrinology Hospital and Bach Mai Hospital immediately to secure</w:t>
             </w:r>
           </w:p>
         </w:tc>
@@ -530,39 +498,7 @@
                 <w:color w:val="0056D2"/>
                 <w:sz w:val="17"/>
               </w:rPr>
-              <w:t>→  P1RA/Marketing: Prepare EU-GMP dossier to qualify for Group 1 tenders under new regulations.</w:t>
-            </w:r>
-          </w:p>
-          <w:p>
-            <w:pPr>
-              <w:spacing w:before="20" w:after="60"/>
-              <w:ind w:left="142"/>
-            </w:pPr>
-            <w:r>
-              <w:rPr>
-                <w:rFonts w:ascii="Calibri" w:hAnsi="Calibri"/>
-                <w:b w:val="0"/>
-                <w:i w:val="0"/>
-                <w:color w:val="0056D2"/>
-                <w:sz w:val="17"/>
-              </w:rPr>
-              <w:t>→  P2Sales: Negotiate group-level partnership with Long Châu — avoid store-by-store negotiations.</w:t>
-            </w:r>
-          </w:p>
-          <w:p>
-            <w:pPr>
-              <w:spacing w:before="20" w:after="60"/>
-              <w:ind w:left="142"/>
-            </w:pPr>
-            <w:r>
-              <w:rPr>
-                <w:rFonts w:ascii="Calibri" w:hAnsi="Calibri"/>
-                <w:b w:val="0"/>
-                <w:i w:val="0"/>
-                <w:color w:val="0056D2"/>
-                <w:sz w:val="17"/>
-              </w:rPr>
-              <w:t>→  P3Supply Chain: Audit API inventory and evaluate alternative sourcing amid import decline.</w:t>
+              <w:t>→  P1BD/Tender team to engage National Endocrinology Hospital and Bach Mai Hospital immediately to secure</w:t>
             </w:r>
           </w:p>
         </w:tc>
@@ -571,67 +507,6 @@
     <w:p>
       <w:pPr>
         <w:spacing w:after="120"/>
-      </w:pPr>
-    </w:p>
-    <w:p>
-      <w:pPr>
-        <w:spacing w:before="200" w:after="80"/>
-      </w:pPr>
-      <w:r>
-        <w:rPr>
-          <w:rFonts w:ascii="Calibri" w:hAnsi="Calibri"/>
-          <w:b/>
-          <w:i w:val="0"/>
-          <w:color w:val="9CA3AF"/>
-          <w:sz w:val="20"/>
-        </w:rPr>
-        <w:t>📡  Brand Mentions — Davipharm · Adamed</w:t>
-      </w:r>
-    </w:p>
-    <w:tbl>
-      <w:tblPr>
-        <w:tblStyle w:val="TableGrid"/>
-        <w:tblW w:type="auto" w:w="0"/>
-        <w:jc w:val="left"/>
-        <w:tblLook w:firstColumn="1" w:firstRow="1" w:lastColumn="0" w:lastRow="0" w:noHBand="0" w:noVBand="1" w:val="04A0"/>
-      </w:tblPr>
-      <w:tblGrid>
-        <w:gridCol w:w="9072"/>
-      </w:tblGrid>
-      <w:tr>
-        <w:tc>
-          <w:tcPr>
-            <w:tcW w:type="dxa" w:w="9071"/>
-            <w:shd w:val="clear" w:color="auto" w:fill="F0FDF4"/>
-            <w:tcBorders>
-              <w:top w:val="none" w:sz="6" w:color="auto"/>
-              <w:bottom w:val="none" w:sz="6" w:color="auto"/>
-              <w:left w:val="single" w:sz="18" w:color="166534"/>
-              <w:right w:val="none" w:sz="6" w:color="auto"/>
-            </w:tcBorders>
-          </w:tcPr>
-          <w:p>
-            <w:pPr>
-              <w:spacing w:before="80" w:after="80"/>
-              <w:ind w:left="170"/>
-            </w:pPr>
-            <w:r>
-              <w:rPr>
-                <w:rFonts w:ascii="Calibri" w:hAnsi="Calibri"/>
-                <w:b/>
-                <w:i w:val="0"/>
-                <w:color w:val="111827"/>
-                <w:sz w:val="18"/>
-              </w:rPr>
-              <w:t>✅ No negative mentions of Davipharm or Adamed found in the past 7 days. Brand is in a quiet state — no PR crisis management required.</w:t>
-            </w:r>
-          </w:p>
-        </w:tc>
-      </w:tr>
-    </w:tbl>
-    <w:p>
-      <w:pPr>
-        <w:spacing w:before="80"/>
       </w:pPr>
     </w:p>
     <w:p>
@@ -820,7 +695,7 @@
         <w:tc>
           <w:tcPr>
             <w:tcW w:type="dxa" w:w="1701"/>
-            <w:shd w:val="clear" w:color="auto" w:fill="E9FBF0"/>
+            <w:shd w:val="clear" w:color="auto" w:fill="DCFCE7"/>
             <w:tcBorders>
               <w:top w:val="none" w:sz="6" w:color="auto"/>
               <w:bottom w:val="none" w:sz="6" w:color="auto"/>
@@ -836,12 +711,12 @@
             <w:r>
               <w:rPr>
                 <w:rFonts w:ascii="Calibri" w:hAnsi="Calibri"/>
-                <w:b w:val="0"/>
+                <w:b/>
                 <w:i w:val="0"/>
-                <w:color w:val="CCCCCC"/>
+                <w:color w:val="166534"/>
                 <w:sz w:val="22"/>
               </w:rPr>
-              <w:t>—</w:t>
+              <w:t>1</w:t>
             </w:r>
           </w:p>
         </w:tc>
@@ -934,7 +809,7 @@
         <w:tc>
           <w:tcPr>
             <w:tcW w:type="dxa" w:w="1701"/>
-            <w:shd w:val="clear" w:color="auto" w:fill="E9FBF0"/>
+            <w:shd w:val="clear" w:color="auto" w:fill="DCFCE7"/>
             <w:tcBorders>
               <w:top w:val="none" w:sz="6" w:color="auto"/>
               <w:bottom w:val="none" w:sz="6" w:color="auto"/>
@@ -950,19 +825,19 @@
             <w:r>
               <w:rPr>
                 <w:rFonts w:ascii="Calibri" w:hAnsi="Calibri"/>
-                <w:b w:val="0"/>
+                <w:b/>
                 <w:i w:val="0"/>
-                <w:color w:val="CCCCCC"/>
+                <w:color w:val="166534"/>
                 <w:sz w:val="22"/>
               </w:rPr>
-              <w:t>—</w:t>
+              <w:t>2</w:t>
             </w:r>
           </w:p>
         </w:tc>
         <w:tc>
           <w:tcPr>
             <w:tcW w:type="dxa" w:w="1984"/>
-            <w:shd w:val="clear" w:color="auto" w:fill="F9FAFB"/>
+            <w:shd w:val="clear" w:color="auto" w:fill="F3F4F6"/>
             <w:tcBorders>
               <w:top w:val="none" w:sz="6" w:color="auto"/>
               <w:bottom w:val="none" w:sz="6" w:color="auto"/>
@@ -978,12 +853,12 @@
             <w:r>
               <w:rPr>
                 <w:rFonts w:ascii="Calibri" w:hAnsi="Calibri"/>
-                <w:b w:val="0"/>
+                <w:b/>
                 <w:i w:val="0"/>
-                <w:color w:val="CCCCCC"/>
+                <w:color w:val="374151"/>
                 <w:sz w:val="22"/>
               </w:rPr>
-              <w:t>—</w:t>
+              <w:t>1</w:t>
             </w:r>
           </w:p>
         </w:tc>
@@ -1159,6 +1034,162 @@
         <w:t>REGULATORY &amp; POLICY</w:t>
       </w:r>
     </w:p>
+    <w:tbl>
+      <w:tblPr>
+        <w:tblStyle w:val="TableGrid"/>
+        <w:tblW w:type="auto" w:w="0"/>
+        <w:jc w:val="left"/>
+        <w:tblLook w:firstColumn="1" w:firstRow="1" w:lastColumn="0" w:lastRow="0" w:noHBand="0" w:noVBand="1" w:val="04A0"/>
+      </w:tblPr>
+      <w:tblGrid>
+        <w:gridCol w:w="4536"/>
+        <w:gridCol w:w="4536"/>
+      </w:tblGrid>
+      <w:tr>
+        <w:tc>
+          <w:tcPr>
+            <w:tcW w:type="dxa" w:w="1984"/>
+            <w:shd w:val="clear" w:color="auto" w:fill="EEF2FF"/>
+            <w:tcBorders>
+              <w:top w:val="none" w:sz="6" w:color="auto"/>
+              <w:bottom w:val="none" w:sz="6" w:color="auto"/>
+              <w:left w:val="none" w:sz="6" w:color="auto"/>
+              <w:right w:val="none" w:sz="6" w:color="auto"/>
+            </w:tcBorders>
+          </w:tcPr>
+          <w:p>
+            <w:pPr>
+              <w:spacing w:before="80" w:after="80"/>
+              <w:ind w:left="85"/>
+            </w:pPr>
+            <w:r>
+              <w:rPr>
+                <w:rFonts w:ascii="Calibri" w:hAnsi="Calibri"/>
+                <w:b/>
+                <w:i w:val="0"/>
+                <w:color w:val="4338CA"/>
+                <w:sz w:val="15"/>
+              </w:rPr>
+              <w:t>NHÂN DÂN – XÃ HỘI</w:t>
+            </w:r>
+          </w:p>
+        </w:tc>
+        <w:tc>
+          <w:tcPr>
+            <w:tcW w:type="dxa" w:w="4536"/>
+            <w:tcBorders>
+              <w:top w:val="none" w:sz="6" w:color="auto"/>
+              <w:bottom w:val="none" w:sz="6" w:color="auto"/>
+              <w:left w:val="none" w:sz="6" w:color="auto"/>
+              <w:right w:val="none" w:sz="6" w:color="auto"/>
+            </w:tcBorders>
+          </w:tcPr>
+          <w:p>
+            <w:pPr>
+              <w:spacing w:before="60" w:after="60"/>
+              <w:ind w:left="113"/>
+            </w:pPr>
+            <w:r>
+              <w:rPr>
+                <w:rFonts w:ascii="Calibri" w:hAnsi="Calibri"/>
+                <w:b/>
+                <w:i w:val="0"/>
+                <w:color w:val="111827"/>
+                <w:sz w:val="21"/>
+              </w:rPr>
+              <w:t>Vietnam's "Dr. Luong" Thyroid Surgery Technique Draws International Patients &amp; Medical Professionals</w:t>
+            </w:r>
+          </w:p>
+        </w:tc>
+      </w:tr>
+    </w:tbl>
+    <w:p>
+      <w:pPr>
+        <w:spacing w:before="40" w:after="40"/>
+        <w:ind w:left="170"/>
+      </w:pPr>
+      <w:r>
+        <w:rPr>
+          <w:rFonts w:ascii="Calibri" w:hAnsi="Calibri"/>
+          <w:b w:val="0"/>
+          <w:i/>
+          <w:color w:val="6B7280"/>
+          <w:sz w:val="18"/>
+        </w:rPr>
+        <w:t>Vietnam's "Dr. Luong" endoscopic thyroid surgery technique is attracting patients from the Philippines and physicians from Azerbaijan and India, cementing Vietnam's status as a regional medical excellence hub. This inbound medical tourism trend signals growing demand for post-operative and thyroid-related pharmaceuticals at leading hospitals.[Source]</w:t>
+      </w:r>
+    </w:p>
+    <w:p>
+      <w:pPr>
+        <w:spacing w:before="20" w:after="40"/>
+        <w:ind w:left="170"/>
+      </w:pPr>
+      <w:r>
+        <w:rPr>
+          <w:rFonts w:ascii="Calibri" w:hAnsi="Calibri"/>
+          <w:b/>
+          <w:i w:val="0"/>
+          <w:color w:val="166534"/>
+          <w:sz w:val="17"/>
+        </w:rPr>
+        <w:t>🟢 Indirect positive signal — growing medical tourism drives incremental demand for thyroid post-op pharmaceuticals at partner hospitals.</w:t>
+      </w:r>
+    </w:p>
+    <w:tbl>
+      <w:tblPr>
+        <w:tblStyle w:val="TableGrid"/>
+        <w:tblW w:type="auto" w:w="0"/>
+        <w:tblLook w:firstColumn="1" w:firstRow="1" w:lastColumn="0" w:lastRow="0" w:noHBand="0" w:noVBand="1" w:val="04A0"/>
+      </w:tblPr>
+      <w:tblGrid>
+        <w:gridCol w:w="9072"/>
+      </w:tblGrid>
+      <w:tr>
+        <w:tc>
+          <w:tcPr>
+            <w:tcW w:type="dxa" w:w="9072"/>
+            <w:shd w:val="clear" w:color="auto" w:fill="F8FAFC"/>
+            <w:tcBorders>
+              <w:top w:val="none" w:sz="6" w:color="auto"/>
+              <w:bottom w:val="none" w:sz="6" w:color="auto"/>
+              <w:left w:val="single" w:sz="12" w:color="003B71"/>
+              <w:right w:val="none" w:sz="6" w:color="auto"/>
+            </w:tcBorders>
+          </w:tcPr>
+          <w:p>
+            <w:pPr>
+              <w:spacing w:before="60" w:after="60"/>
+              <w:ind w:left="142"/>
+            </w:pPr>
+            <w:r>
+              <w:rPr>
+                <w:rFonts w:ascii="Calibri" w:hAnsi="Calibri"/>
+                <w:b/>
+                <w:i w:val="0"/>
+                <w:color w:val="003B71"/>
+                <w:sz w:val="17"/>
+              </w:rPr>
+              <w:t xml:space="preserve">Strategy  </w:t>
+            </w:r>
+            <w:r>
+              <w:rPr>
+                <w:rFonts w:ascii="Calibri" w:hAnsi="Calibri"/>
+                <w:b w:val="0"/>
+                <w:i w:val="0"/>
+                <w:color w:val="334155"/>
+                <w:sz w:val="17"/>
+              </w:rPr>
+              <w:t>Davipharm should proactively engage hospitals performing the "Dr. Luong" technique to secure preferred tender positioning for levothyroxine, calcium supplements, and post-surgical antibiotics. Rising international patient volumes will elevate drug quality standards — a competitive window for Davipharm's higher-quality generics over imports.</w:t>
+            </w:r>
+          </w:p>
+        </w:tc>
+      </w:tr>
+    </w:tbl>
+    <w:p>
+      <w:pPr>
+        <w:spacing w:before="40" w:after="120"/>
+      </w:pPr>
+    </w:p>
     <w:p>
       <w:r>
         <w:br w:type="page"/>
@@ -1181,6 +1212,474 @@
         </w:rPr>
         <w:t>PHARMA INDUSTRY NEWS</w:t>
       </w:r>
+    </w:p>
+    <w:tbl>
+      <w:tblPr>
+        <w:tblStyle w:val="TableGrid"/>
+        <w:tblW w:type="auto" w:w="0"/>
+        <w:jc w:val="left"/>
+        <w:tblLook w:firstColumn="1" w:firstRow="1" w:lastColumn="0" w:lastRow="0" w:noHBand="0" w:noVBand="1" w:val="04A0"/>
+      </w:tblPr>
+      <w:tblGrid>
+        <w:gridCol w:w="4536"/>
+        <w:gridCol w:w="4536"/>
+      </w:tblGrid>
+      <w:tr>
+        <w:tc>
+          <w:tcPr>
+            <w:tcW w:type="dxa" w:w="1984"/>
+            <w:shd w:val="clear" w:color="auto" w:fill="EEF2FF"/>
+            <w:tcBorders>
+              <w:top w:val="none" w:sz="6" w:color="auto"/>
+              <w:bottom w:val="none" w:sz="6" w:color="auto"/>
+              <w:left w:val="none" w:sz="6" w:color="auto"/>
+              <w:right w:val="none" w:sz="6" w:color="auto"/>
+            </w:tcBorders>
+          </w:tcPr>
+          <w:p>
+            <w:pPr>
+              <w:spacing w:before="80" w:after="80"/>
+              <w:ind w:left="85"/>
+            </w:pPr>
+            <w:r>
+              <w:rPr>
+                <w:rFonts w:ascii="Calibri" w:hAnsi="Calibri"/>
+                <w:b/>
+                <w:i w:val="0"/>
+                <w:color w:val="4338CA"/>
+                <w:sz w:val="15"/>
+              </w:rPr>
+              <w:t>VIETNAMPLUS – SỨC KHỎE</w:t>
+            </w:r>
+          </w:p>
+        </w:tc>
+        <w:tc>
+          <w:tcPr>
+            <w:tcW w:type="dxa" w:w="4536"/>
+            <w:tcBorders>
+              <w:top w:val="none" w:sz="6" w:color="auto"/>
+              <w:bottom w:val="none" w:sz="6" w:color="auto"/>
+              <w:left w:val="none" w:sz="6" w:color="auto"/>
+              <w:right w:val="none" w:sz="6" w:color="auto"/>
+            </w:tcBorders>
+          </w:tcPr>
+          <w:p>
+            <w:pPr>
+              <w:spacing w:before="60" w:after="60"/>
+              <w:ind w:left="113"/>
+            </w:pPr>
+            <w:r>
+              <w:rPr>
+                <w:rFonts w:ascii="Calibri" w:hAnsi="Calibri"/>
+                <w:b/>
+                <w:i w:val="0"/>
+                <w:color w:val="111827"/>
+                <w:sz w:val="21"/>
+              </w:rPr>
+              <w:t>Off-Topic Geopolitical News — No Relevance to Vietnamese Pharma Sector</w:t>
+            </w:r>
+          </w:p>
+        </w:tc>
+      </w:tr>
+    </w:tbl>
+    <w:p>
+      <w:pPr>
+        <w:spacing w:before="40" w:after="40"/>
+        <w:ind w:left="170"/>
+      </w:pPr>
+      <w:r>
+        <w:rPr>
+          <w:rFonts w:ascii="Calibri" w:hAnsi="Calibri"/>
+          <w:b w:val="0"/>
+          <w:i/>
+          <w:color w:val="6B7280"/>
+          <w:sz w:val="18"/>
+        </w:rPr>
+        <w:t>The article covers geopolitical disputes between the US, NATO, and Greenland — entirely outside the scope of the Vietnamese pharmaceutical market. No actionable market signals relevant to Davipharm's operations are present.[Source]</w:t>
+      </w:r>
+    </w:p>
+    <w:p>
+      <w:pPr>
+        <w:spacing w:before="20" w:after="40"/>
+        <w:ind w:left="170"/>
+      </w:pPr>
+      <w:r>
+        <w:rPr>
+          <w:rFonts w:ascii="Calibri" w:hAnsi="Calibri"/>
+          <w:b/>
+          <w:i w:val="0"/>
+          <w:color w:val="374151"/>
+          <w:sz w:val="17"/>
+        </w:rPr>
+        <w:t>⚪ No direct impact on Davipharm — this article falls outside the pharmaceutical market intelligence scope.</w:t>
+      </w:r>
+    </w:p>
+    <w:tbl>
+      <w:tblPr>
+        <w:tblStyle w:val="TableGrid"/>
+        <w:tblW w:type="auto" w:w="0"/>
+        <w:tblLook w:firstColumn="1" w:firstRow="1" w:lastColumn="0" w:lastRow="0" w:noHBand="0" w:noVBand="1" w:val="04A0"/>
+      </w:tblPr>
+      <w:tblGrid>
+        <w:gridCol w:w="9072"/>
+      </w:tblGrid>
+      <w:tr>
+        <w:tc>
+          <w:tcPr>
+            <w:tcW w:type="dxa" w:w="9072"/>
+            <w:shd w:val="clear" w:color="auto" w:fill="F8FAFC"/>
+            <w:tcBorders>
+              <w:top w:val="none" w:sz="6" w:color="auto"/>
+              <w:bottom w:val="none" w:sz="6" w:color="auto"/>
+              <w:left w:val="single" w:sz="12" w:color="003B71"/>
+              <w:right w:val="none" w:sz="6" w:color="auto"/>
+            </w:tcBorders>
+          </w:tcPr>
+          <w:p>
+            <w:pPr>
+              <w:spacing w:before="60" w:after="60"/>
+              <w:ind w:left="142"/>
+            </w:pPr>
+            <w:r>
+              <w:rPr>
+                <w:rFonts w:ascii="Calibri" w:hAnsi="Calibri"/>
+                <w:b/>
+                <w:i w:val="0"/>
+                <w:color w:val="003B71"/>
+                <w:sz w:val="17"/>
+              </w:rPr>
+              <w:t xml:space="preserve">Strategy  </w:t>
+            </w:r>
+            <w:r>
+              <w:rPr>
+                <w:rFonts w:ascii="Calibri" w:hAnsi="Calibri"/>
+                <w:b w:val="0"/>
+                <w:i w:val="0"/>
+                <w:color w:val="334155"/>
+                <w:sz w:val="17"/>
+              </w:rPr>
+              <w:t>Recommend source filter refinement: reconfigure keyword filters to exclude irrelevant geopolitical content and improve BOD report quality. No strategic action required from this article.</w:t>
+            </w:r>
+          </w:p>
+        </w:tc>
+      </w:tr>
+    </w:tbl>
+    <w:p>
+      <w:pPr>
+        <w:spacing w:before="40" w:after="120"/>
+      </w:pPr>
+    </w:p>
+    <w:tbl>
+      <w:tblPr>
+        <w:tblStyle w:val="TableGrid"/>
+        <w:tblW w:type="auto" w:w="0"/>
+        <w:jc w:val="left"/>
+        <w:tblLook w:firstColumn="1" w:firstRow="1" w:lastColumn="0" w:lastRow="0" w:noHBand="0" w:noVBand="1" w:val="04A0"/>
+      </w:tblPr>
+      <w:tblGrid>
+        <w:gridCol w:w="4536"/>
+        <w:gridCol w:w="4536"/>
+      </w:tblGrid>
+      <w:tr>
+        <w:tc>
+          <w:tcPr>
+            <w:tcW w:type="dxa" w:w="1984"/>
+            <w:shd w:val="clear" w:color="auto" w:fill="EEF2FF"/>
+            <w:tcBorders>
+              <w:top w:val="none" w:sz="6" w:color="auto"/>
+              <w:bottom w:val="none" w:sz="6" w:color="auto"/>
+              <w:left w:val="none" w:sz="6" w:color="auto"/>
+              <w:right w:val="none" w:sz="6" w:color="auto"/>
+            </w:tcBorders>
+          </w:tcPr>
+          <w:p>
+            <w:pPr>
+              <w:spacing w:before="80" w:after="80"/>
+              <w:ind w:left="85"/>
+            </w:pPr>
+            <w:r>
+              <w:rPr>
+                <w:rFonts w:ascii="Calibri" w:hAnsi="Calibri"/>
+                <w:b/>
+                <w:i w:val="0"/>
+                <w:color w:val="4338CA"/>
+                <w:sz w:val="15"/>
+              </w:rPr>
+              <w:t>VIETNAMPLUS – SỨC KHỎE</w:t>
+            </w:r>
+          </w:p>
+        </w:tc>
+        <w:tc>
+          <w:tcPr>
+            <w:tcW w:type="dxa" w:w="4536"/>
+            <w:tcBorders>
+              <w:top w:val="none" w:sz="6" w:color="auto"/>
+              <w:bottom w:val="none" w:sz="6" w:color="auto"/>
+              <w:left w:val="none" w:sz="6" w:color="auto"/>
+              <w:right w:val="none" w:sz="6" w:color="auto"/>
+            </w:tcBorders>
+          </w:tcPr>
+          <w:p>
+            <w:pPr>
+              <w:spacing w:before="60" w:after="60"/>
+              <w:ind w:left="113"/>
+            </w:pPr>
+            <w:r>
+              <w:rPr>
+                <w:rFonts w:ascii="Calibri" w:hAnsi="Calibri"/>
+                <w:b/>
+                <w:i w:val="0"/>
+                <w:color w:val="111827"/>
+                <w:sz w:val="21"/>
+              </w:rPr>
+              <w:t>Houttuynia Cordata: Natural Remedy Trend from Vietnam's Backyard</w:t>
+            </w:r>
+          </w:p>
+        </w:tc>
+      </w:tr>
+    </w:tbl>
+    <w:p>
+      <w:pPr>
+        <w:spacing w:before="40" w:after="40"/>
+        <w:ind w:left="170"/>
+      </w:pPr>
+      <w:r>
+        <w:rPr>
+          <w:rFonts w:ascii="Calibri" w:hAnsi="Calibri"/>
+          <w:b w:val="0"/>
+          <w:i/>
+          <w:color w:val="6B7280"/>
+          <w:sz w:val="18"/>
+        </w:rPr>
+        <w:t>Mainstream health media is actively promoting Houttuynia cordata (fish mint) for its skin care and health benefits, reflecting a growing consumer shift toward locally-sourced herbal remedies. This trend strengthens market receptiveness for OTC and functional health products derived from Vietnamese botanicals.[Source]</w:t>
+      </w:r>
+    </w:p>
+    <w:p>
+      <w:pPr>
+        <w:spacing w:before="20" w:after="40"/>
+        <w:ind w:left="170"/>
+      </w:pPr>
+      <w:r>
+        <w:rPr>
+          <w:rFonts w:ascii="Calibri" w:hAnsi="Calibri"/>
+          <w:b/>
+          <w:i w:val="0"/>
+          <w:color w:val="166534"/>
+          <w:sz w:val="17"/>
+        </w:rPr>
+        <w:t>🌿 Mild positive signal — mass media is priming consumer demand for domestic herbal products, a space Davipharm can capitalize on.</w:t>
+      </w:r>
+    </w:p>
+    <w:tbl>
+      <w:tblPr>
+        <w:tblStyle w:val="TableGrid"/>
+        <w:tblW w:type="auto" w:w="0"/>
+        <w:tblLook w:firstColumn="1" w:firstRow="1" w:lastColumn="0" w:lastRow="0" w:noHBand="0" w:noVBand="1" w:val="04A0"/>
+      </w:tblPr>
+      <w:tblGrid>
+        <w:gridCol w:w="9072"/>
+      </w:tblGrid>
+      <w:tr>
+        <w:tc>
+          <w:tcPr>
+            <w:tcW w:type="dxa" w:w="9072"/>
+            <w:shd w:val="clear" w:color="auto" w:fill="F8FAFC"/>
+            <w:tcBorders>
+              <w:top w:val="none" w:sz="6" w:color="auto"/>
+              <w:bottom w:val="none" w:sz="6" w:color="auto"/>
+              <w:left w:val="single" w:sz="12" w:color="003B71"/>
+              <w:right w:val="none" w:sz="6" w:color="auto"/>
+            </w:tcBorders>
+          </w:tcPr>
+          <w:p>
+            <w:pPr>
+              <w:spacing w:before="60" w:after="60"/>
+              <w:ind w:left="142"/>
+            </w:pPr>
+            <w:r>
+              <w:rPr>
+                <w:rFonts w:ascii="Calibri" w:hAnsi="Calibri"/>
+                <w:b/>
+                <w:i w:val="0"/>
+                <w:color w:val="003B71"/>
+                <w:sz w:val="17"/>
+              </w:rPr>
+              <w:t xml:space="preserve">Strategy  </w:t>
+            </w:r>
+            <w:r>
+              <w:rPr>
+                <w:rFonts w:ascii="Calibri" w:hAnsi="Calibri"/>
+                <w:b w:val="0"/>
+                <w:i w:val="0"/>
+                <w:color w:val="334155"/>
+                <w:sz w:val="17"/>
+              </w:rPr>
+              <w:t>Assess feasibility of developing or repositioning OTC/nutraceutical SKUs featuring Houttuynia cordata extract (anti-inflammatory, dermatological support), leveraging low-cost domestic sourcing and current media tailwinds. Prioritize pharmacy chain channels (Long Châu, Pharmacity) to reach the natural-product-conscious consumer segment.</w:t>
+            </w:r>
+          </w:p>
+        </w:tc>
+      </w:tr>
+    </w:tbl>
+    <w:p>
+      <w:pPr>
+        <w:spacing w:before="40" w:after="120"/>
+      </w:pPr>
+    </w:p>
+    <w:tbl>
+      <w:tblPr>
+        <w:tblStyle w:val="TableGrid"/>
+        <w:tblW w:type="auto" w:w="0"/>
+        <w:jc w:val="left"/>
+        <w:tblLook w:firstColumn="1" w:firstRow="1" w:lastColumn="0" w:lastRow="0" w:noHBand="0" w:noVBand="1" w:val="04A0"/>
+      </w:tblPr>
+      <w:tblGrid>
+        <w:gridCol w:w="4536"/>
+        <w:gridCol w:w="4536"/>
+      </w:tblGrid>
+      <w:tr>
+        <w:tc>
+          <w:tcPr>
+            <w:tcW w:type="dxa" w:w="1984"/>
+            <w:shd w:val="clear" w:color="auto" w:fill="EEF2FF"/>
+            <w:tcBorders>
+              <w:top w:val="none" w:sz="6" w:color="auto"/>
+              <w:bottom w:val="none" w:sz="6" w:color="auto"/>
+              <w:left w:val="none" w:sz="6" w:color="auto"/>
+              <w:right w:val="none" w:sz="6" w:color="auto"/>
+            </w:tcBorders>
+          </w:tcPr>
+          <w:p>
+            <w:pPr>
+              <w:spacing w:before="80" w:after="80"/>
+              <w:ind w:left="85"/>
+            </w:pPr>
+            <w:r>
+              <w:rPr>
+                <w:rFonts w:ascii="Calibri" w:hAnsi="Calibri"/>
+                <w:b/>
+                <w:i w:val="0"/>
+                <w:color w:val="4338CA"/>
+                <w:sz w:val="15"/>
+              </w:rPr>
+              <w:t>VIETNAMPLUS – SỨC KHỎE</w:t>
+            </w:r>
+          </w:p>
+        </w:tc>
+        <w:tc>
+          <w:tcPr>
+            <w:tcW w:type="dxa" w:w="4536"/>
+            <w:tcBorders>
+              <w:top w:val="none" w:sz="6" w:color="auto"/>
+              <w:bottom w:val="none" w:sz="6" w:color="auto"/>
+              <w:left w:val="none" w:sz="6" w:color="auto"/>
+              <w:right w:val="none" w:sz="6" w:color="auto"/>
+            </w:tcBorders>
+          </w:tcPr>
+          <w:p>
+            <w:pPr>
+              <w:spacing w:before="60" w:after="60"/>
+              <w:ind w:left="113"/>
+            </w:pPr>
+            <w:r>
+              <w:rPr>
+                <w:rFonts w:ascii="Calibri" w:hAnsi="Calibri"/>
+                <w:b/>
+                <w:i w:val="0"/>
+                <w:color w:val="111827"/>
+                <w:sz w:val="21"/>
+              </w:rPr>
+              <w:t>Anti-Seizure Drug Levetiracetam Shows Alzheimer's Prevention Potential</w:t>
+            </w:r>
+          </w:p>
+        </w:tc>
+      </w:tr>
+    </w:tbl>
+    <w:p>
+      <w:pPr>
+        <w:spacing w:before="40" w:after="40"/>
+        <w:ind w:left="170"/>
+      </w:pPr>
+      <w:r>
+        <w:rPr>
+          <w:rFonts w:ascii="Calibri" w:hAnsi="Calibri"/>
+          <w:b w:val="0"/>
+          <w:i/>
+          <w:color w:val="6B7280"/>
+          <w:sz w:val="18"/>
+        </w:rPr>
+        <w:t>U.S. scientists found that Levetiracetam, an established anti-epileptic drug, may inhibit amyloid-beta 42 formation — a key driver of Alzheimer's disease progression. This signals a drug repurposing opportunity for an already-proven generic molecule toward a high-value new indication.[Source]</w:t>
+      </w:r>
+    </w:p>
+    <w:p>
+      <w:pPr>
+        <w:spacing w:before="20" w:after="40"/>
+        <w:ind w:left="170"/>
+      </w:pPr>
+      <w:r>
+        <w:rPr>
+          <w:rFonts w:ascii="Calibri" w:hAnsi="Calibri"/>
+          <w:b/>
+          <w:i w:val="0"/>
+          <w:color w:val="166534"/>
+          <w:sz w:val="17"/>
+        </w:rPr>
+        <w:t>🟢 Potential upside for Davipharm if Levetiracetam is in the pipeline — repurposing into neurology/Alzheimer's prevention could unlock premium positioning and new tender categories.</w:t>
+      </w:r>
+    </w:p>
+    <w:tbl>
+      <w:tblPr>
+        <w:tblStyle w:val="TableGrid"/>
+        <w:tblW w:type="auto" w:w="0"/>
+        <w:tblLook w:firstColumn="1" w:firstRow="1" w:lastColumn="0" w:lastRow="0" w:noHBand="0" w:noVBand="1" w:val="04A0"/>
+      </w:tblPr>
+      <w:tblGrid>
+        <w:gridCol w:w="9072"/>
+      </w:tblGrid>
+      <w:tr>
+        <w:tc>
+          <w:tcPr>
+            <w:tcW w:type="dxa" w:w="9072"/>
+            <w:shd w:val="clear" w:color="auto" w:fill="F8FAFC"/>
+            <w:tcBorders>
+              <w:top w:val="none" w:sz="6" w:color="auto"/>
+              <w:bottom w:val="none" w:sz="6" w:color="auto"/>
+              <w:left w:val="single" w:sz="12" w:color="003B71"/>
+              <w:right w:val="none" w:sz="6" w:color="auto"/>
+            </w:tcBorders>
+          </w:tcPr>
+          <w:p>
+            <w:pPr>
+              <w:spacing w:before="60" w:after="60"/>
+              <w:ind w:left="142"/>
+            </w:pPr>
+            <w:r>
+              <w:rPr>
+                <w:rFonts w:ascii="Calibri" w:hAnsi="Calibri"/>
+                <w:b/>
+                <w:i w:val="0"/>
+                <w:color w:val="003B71"/>
+                <w:sz w:val="17"/>
+              </w:rPr>
+              <w:t xml:space="preserve">Strategy  </w:t>
+            </w:r>
+            <w:r>
+              <w:rPr>
+                <w:rFonts w:ascii="Calibri" w:hAnsi="Calibri"/>
+                <w:b w:val="0"/>
+                <w:i w:val="0"/>
+                <w:color w:val="334155"/>
+                <w:sz w:val="17"/>
+              </w:rPr>
+              <w:t>Audit the R&amp;D/manufacturing portfolio immediately: if Levetiracetam is feasible, track upcoming clinical trials to prepare supplemental indication filings and position early for neurology hospital tenders and premium retail pharmacy channels.</w:t>
+            </w:r>
+          </w:p>
+        </w:tc>
+      </w:tr>
+    </w:tbl>
+    <w:p>
+      <w:pPr>
+        <w:spacing w:before="40" w:after="120"/>
+      </w:pPr>
     </w:p>
     <w:p>
       <w:r>
@@ -2188,7 +2687,7 @@
                 <w:color w:val="111827"/>
                 <w:sz w:val="18"/>
               </w:rPr>
-              <w:t>High — Qualify for Group 1 tenders with EU-GMP dossier</w:t>
+              <w:t>Negotiate levothyroxine/calcium listing in tender lists at top thyroid hospitals</w:t>
             </w:r>
           </w:p>
         </w:tc>
@@ -2216,7 +2715,7 @@
                 <w:color w:val="003B71"/>
                 <w:sz w:val="17"/>
               </w:rPr>
-              <w:t>RA &amp; Marketing</w:t>
+              <w:t>Sales</w:t>
             </w:r>
           </w:p>
         </w:tc>
@@ -2244,7 +2743,7 @@
                 <w:color w:val="6B7280"/>
                 <w:sz w:val="17"/>
               </w:rPr>
-              <w:t>Tendering Policy</w:t>
+              <w:t>Medical tourism – thyroid surgery</w:t>
             </w:r>
           </w:p>
         </w:tc>
@@ -2323,7 +2822,7 @@
                 <w:color w:val="111827"/>
                 <w:sz w:val="18"/>
               </w:rPr>
-              <w:t>High — Negotiate group-level deal, not store-by-store</w:t>
+              <w:t>Audit R&amp;D portfolio: confirm Levetiracetam manufacturing feasibility within 30 days</w:t>
             </w:r>
           </w:p>
         </w:tc>
@@ -2351,7 +2850,7 @@
                 <w:color w:val="003B71"/>
                 <w:sz w:val="17"/>
               </w:rPr>
-              <w:t>Sales</w:t>
+              <w:t>RA</w:t>
             </w:r>
           </w:p>
         </w:tc>
@@ -2379,7 +2878,7 @@
                 <w:color w:val="6B7280"/>
                 <w:sz w:val="17"/>
               </w:rPr>
-              <w:t>Long Châu Expansion</w:t>
+              <w:t>Levetiracetam – Alzheimer's repurposing</w:t>
             </w:r>
           </w:p>
         </w:tc>
@@ -2458,7 +2957,7 @@
                 <w:color w:val="111827"/>
                 <w:sz w:val="18"/>
               </w:rPr>
-              <w:t>Medium — Review API stock and alternative suppliers</w:t>
+              <w:t>Monitor Levetiracetam/Alzheimer trials to prepare supplemental indication dossier</w:t>
             </w:r>
           </w:p>
         </w:tc>
@@ -2486,7 +2985,7 @@
                 <w:color w:val="003B71"/>
                 <w:sz w:val="17"/>
               </w:rPr>
-              <w:t>Supply Chain</w:t>
+              <w:t>Strategy</w:t>
             </w:r>
           </w:p>
         </w:tc>
@@ -2514,7 +3013,7 @@
                 <w:color w:val="6B7280"/>
                 <w:sz w:val="17"/>
               </w:rPr>
-              <w:t>Raw Material Import</w:t>
+              <w:t>Levetiracetam – Alzheimer's repurposing</w:t>
             </w:r>
           </w:p>
         </w:tc>
@@ -2593,7 +3092,7 @@
                 <w:color w:val="111827"/>
                 <w:sz w:val="18"/>
               </w:rPr>
-              <w:t>Medium — Monitor Sun Pharma pricing for Tadalafil</w:t>
+              <w:t>Assess OTC SKU development with Houttuynia extract for Long Chau, Pharmacity chains</w:t>
             </w:r>
           </w:p>
         </w:tc>
@@ -2649,7 +3148,7 @@
                 <w:color w:val="6B7280"/>
                 <w:sz w:val="17"/>
               </w:rPr>
-              <w:t>Sản phẩm Tadalafil</w:t>
+              <w:t>Houttuynia cordata herbal trend</w:t>
             </w:r>
           </w:p>
         </w:tc>
@@ -2677,142 +3176,7 @@
                 <w:color w:val="22C55E"/>
                 <w:sz w:val="17"/>
               </w:rPr>
-              <w:t>🟡 Medium</w:t>
-            </w:r>
-          </w:p>
-        </w:tc>
-      </w:tr>
-      <w:tr>
-        <w:tc>
-          <w:tcPr>
-            <w:tcW w:type="dxa" w:w="454"/>
-            <w:shd w:val="clear" w:color="auto" w:fill="DCFCE7"/>
-            <w:tcBorders>
-              <w:top w:val="none" w:sz="6" w:color="auto"/>
-              <w:bottom w:val="none" w:sz="6" w:color="auto"/>
-              <w:left w:val="none" w:sz="6" w:color="auto"/>
-              <w:right w:val="none" w:sz="6" w:color="auto"/>
-            </w:tcBorders>
-          </w:tcPr>
-          <w:p>
-            <w:pPr>
-              <w:spacing w:before="100" w:after="100"/>
-              <w:jc w:val="center"/>
-            </w:pPr>
-            <w:r>
-              <w:t>🟢</w:t>
-            </w:r>
-          </w:p>
-        </w:tc>
-        <w:tc>
-          <w:tcPr>
-            <w:tcW w:type="dxa" w:w="4422"/>
-            <w:shd w:val="clear" w:color="auto" w:fill="FFFFFF"/>
-            <w:tcBorders>
-              <w:top w:val="none" w:sz="6" w:color="auto"/>
-              <w:bottom w:val="none" w:sz="6" w:color="auto"/>
-              <w:left w:val="none" w:sz="6" w:color="auto"/>
-              <w:right w:val="none" w:sz="6" w:color="auto"/>
-            </w:tcBorders>
-          </w:tcPr>
-          <w:p>
-            <w:pPr>
-              <w:spacing w:before="80" w:after="80"/>
-              <w:ind w:left="85"/>
-            </w:pPr>
-            <w:r>
-              <w:rPr>
-                <w:rFonts w:ascii="Calibri" w:hAnsi="Calibri"/>
-                <w:b/>
-                <w:i w:val="0"/>
-                <w:color w:val="111827"/>
-                <w:sz w:val="18"/>
-              </w:rPr>
-              <w:t>Low — Plan Q4/2026 Cytisine launch; assess cessation market</w:t>
-            </w:r>
-          </w:p>
-        </w:tc>
-        <w:tc>
-          <w:tcPr>
-            <w:tcW w:type="dxa" w:w="1417"/>
-            <w:shd w:val="clear" w:color="auto" w:fill="FFFFFF"/>
-            <w:tcBorders>
-              <w:top w:val="none" w:sz="6" w:color="auto"/>
-              <w:bottom w:val="none" w:sz="6" w:color="auto"/>
-              <w:left w:val="none" w:sz="6" w:color="auto"/>
-              <w:right w:val="none" w:sz="6" w:color="auto"/>
-            </w:tcBorders>
-          </w:tcPr>
-          <w:p>
-            <w:pPr>
-              <w:spacing w:before="80" w:after="80"/>
-              <w:jc w:val="center"/>
-            </w:pPr>
-            <w:r>
-              <w:rPr>
-                <w:rFonts w:ascii="Calibri" w:hAnsi="Calibri"/>
-                <w:b w:val="0"/>
-                <w:i w:val="0"/>
-                <w:color w:val="003B71"/>
-                <w:sz w:val="17"/>
-              </w:rPr>
-              <w:t>Strategy</w:t>
-            </w:r>
-          </w:p>
-        </w:tc>
-        <w:tc>
-          <w:tcPr>
-            <w:tcW w:type="dxa" w:w="1134"/>
-            <w:shd w:val="clear" w:color="auto" w:fill="FFFFFF"/>
-            <w:tcBorders>
-              <w:top w:val="none" w:sz="6" w:color="auto"/>
-              <w:bottom w:val="none" w:sz="6" w:color="auto"/>
-              <w:left w:val="none" w:sz="6" w:color="auto"/>
-              <w:right w:val="none" w:sz="6" w:color="auto"/>
-            </w:tcBorders>
-          </w:tcPr>
-          <w:p>
-            <w:pPr>
-              <w:spacing w:before="80" w:after="80"/>
-              <w:jc w:val="center"/>
-            </w:pPr>
-            <w:r>
-              <w:rPr>
-                <w:rFonts w:ascii="Calibri" w:hAnsi="Calibri"/>
-                <w:b w:val="0"/>
-                <w:i w:val="0"/>
-                <w:color w:val="6B7280"/>
-                <w:sz w:val="17"/>
-              </w:rPr>
-              <w:t>Portfolio Cytisine</w:t>
-            </w:r>
-          </w:p>
-        </w:tc>
-        <w:tc>
-          <w:tcPr>
-            <w:tcW w:type="dxa" w:w="1644"/>
-            <w:shd w:val="clear" w:color="auto" w:fill="DCFCE7"/>
-            <w:tcBorders>
-              <w:top w:val="none" w:sz="6" w:color="auto"/>
-              <w:bottom w:val="none" w:sz="6" w:color="auto"/>
-              <w:left w:val="none" w:sz="6" w:color="auto"/>
-              <w:right w:val="none" w:sz="6" w:color="auto"/>
-            </w:tcBorders>
-          </w:tcPr>
-          <w:p>
-            <w:pPr>
-              <w:spacing w:before="80" w:after="80"/>
-              <w:jc w:val="center"/>
-            </w:pPr>
-            <w:r>
-              <w:rPr>
-                <w:rFonts w:ascii="Calibri" w:hAnsi="Calibri"/>
-                <w:b/>
-                <w:i w:val="0"/>
-                <w:color w:val="22C55E"/>
-                <w:sz w:val="17"/>
-              </w:rPr>
-              <w:t>🟢 Low</w:t>
+              <w:t>🟡 Medium&lt;/td</w:t>
             </w:r>
           </w:p>
         </w:tc>

</xml_diff>

<commit_message>
Update report_en.docx 2026-05-13 10:10
</commit_message>
<xml_diff>
--- a/report_en.docx
+++ b/report_en.docx
@@ -338,7 +338,7 @@
                 <w:color w:val="111827"/>
                 <w:sz w:val="20"/>
               </w:rPr>
-              <w:t>Week 11–17 May: Three growth opportunities emerge for Davipharm — thyroid hospital tenders, domestic herbal OTC, and Levetiracetam repositioning into premium neurology.</w:t>
+              <w:t>Week 11–17 May: Two positive market signals — pediatric demand during chickenpox season and the 50+ nutrition segment — present short- and mid-term growth opportunities across Davipharm's OTC/ETC portfolio.</w:t>
             </w:r>
           </w:p>
         </w:tc>
@@ -406,7 +406,7 @@
                 <w:color w:val="111827"/>
                 <w:sz w:val="17"/>
               </w:rPr>
-              <w:t>▸  Medical Tourism &amp; Thyroid:Rising international patient volumes at specialist hospitals elevate drug quality standards, opening a competitive window for Davipharm's high-quality generics over imports.</w:t>
+              <w:t>▸  Pediatrics – Chickenpox:High-profile complication case drives immediate demand for broad-spectrum antibiotics and acyclovir in pediatric hospital channels.</w:t>
             </w:r>
           </w:p>
           <w:p>
@@ -422,7 +422,7 @@
                 <w:color w:val="111827"/>
                 <w:sz w:val="17"/>
               </w:rPr>
-              <w:t>▸  Domestic Herbals:Mass media is organically priming consumer demand for Vietnamese herbal OTC/nutraceuticals — Davipharm's low-cost domestic sourcing advantage remains underexploited.</w:t>
+              <w:t>▸  Senior Nutrition:Health media amplification of 50+ dietary needs signals an underexploited, fast-growing segment for calcium, vitamin D, and omega-3 SKUs.</w:t>
             </w:r>
           </w:p>
           <w:p>
@@ -438,7 +438,7 @@
                 <w:color w:val="111827"/>
                 <w:sz w:val="17"/>
               </w:rPr>
-              <w:t>▸  Levetiracetam &amp; Alzheimer:U.S. research confirms Levetiracetam's repurposing potential for Alzheimer's prevention, enabling premium positioning and new neurology tender categories if Davipharm holds this molecule.</w:t>
+              <w:t>▸  Drug Safety – Cardiology:Supplement-anticoagulant interaction alert creates positioning space for Davipharm as a "responsible pharma" brand within the cardiovascular ETC channel.</w:t>
             </w:r>
           </w:p>
           <w:p>
@@ -454,7 +454,7 @@
                 <w:color w:val="111827"/>
                 <w:sz w:val="17"/>
               </w:rPr>
-              <w:t>▸  P1BD/Tender team to engage National Endocrinology Hospital and Bach Mai Hospital immediately to secure</w:t>
+              <w:t>▸  P1Sales Director to direct Medical Reps to increase visit frequency at pediatric hospitals and clinics in May–June, prioritizing amoxicillin-clavulanate, cephalosporins, and acyclovir.</w:t>
             </w:r>
           </w:p>
         </w:tc>
@@ -498,7 +498,7 @@
                 <w:color w:val="0056D2"/>
                 <w:sz w:val="17"/>
               </w:rPr>
-              <w:t>→  P1BD/Tender team to engage National Endocrinology Hospital and Bach Mai Hospital immediately to secure</w:t>
+              <w:t>→  P1Sales Director to direct Medical Reps to increase visit frequency at pediatric hospitals and clinics in May–June, prioritizing amoxicillin-clavulanate, cephalosporins, and acyclovir.</w:t>
             </w:r>
           </w:p>
         </w:tc>
@@ -716,14 +716,14 @@
                 <w:color w:val="166534"/>
                 <w:sz w:val="22"/>
               </w:rPr>
-              <w:t>1</w:t>
+              <w:t>4</w:t>
             </w:r>
           </w:p>
         </w:tc>
         <w:tc>
           <w:tcPr>
             <w:tcW w:type="dxa" w:w="1984"/>
-            <w:shd w:val="clear" w:color="auto" w:fill="F9FAFB"/>
+            <w:shd w:val="clear" w:color="auto" w:fill="F3F4F6"/>
             <w:tcBorders>
               <w:top w:val="none" w:sz="6" w:color="auto"/>
               <w:bottom w:val="none" w:sz="6" w:color="auto"/>
@@ -739,12 +739,12 @@
             <w:r>
               <w:rPr>
                 <w:rFonts w:ascii="Calibri" w:hAnsi="Calibri"/>
-                <w:b w:val="0"/>
+                <w:b/>
                 <w:i w:val="0"/>
-                <w:color w:val="CCCCCC"/>
+                <w:color w:val="374151"/>
                 <w:sz w:val="22"/>
               </w:rPr>
-              <w:t>—</w:t>
+              <w:t>1</w:t>
             </w:r>
           </w:p>
         </w:tc>
@@ -1033,6 +1033,630 @@
         </w:rPr>
         <w:t>REGULATORY &amp; POLICY</w:t>
       </w:r>
+    </w:p>
+    <w:tbl>
+      <w:tblPr>
+        <w:tblStyle w:val="TableGrid"/>
+        <w:tblW w:type="auto" w:w="0"/>
+        <w:jc w:val="left"/>
+        <w:tblLook w:firstColumn="1" w:firstRow="1" w:lastColumn="0" w:lastRow="0" w:noHBand="0" w:noVBand="1" w:val="04A0"/>
+      </w:tblPr>
+      <w:tblGrid>
+        <w:gridCol w:w="4536"/>
+        <w:gridCol w:w="4536"/>
+      </w:tblGrid>
+      <w:tr>
+        <w:tc>
+          <w:tcPr>
+            <w:tcW w:type="dxa" w:w="1984"/>
+            <w:shd w:val="clear" w:color="auto" w:fill="EEF2FF"/>
+            <w:tcBorders>
+              <w:top w:val="none" w:sz="6" w:color="auto"/>
+              <w:bottom w:val="none" w:sz="6" w:color="auto"/>
+              <w:left w:val="none" w:sz="6" w:color="auto"/>
+              <w:right w:val="none" w:sz="6" w:color="auto"/>
+            </w:tcBorders>
+          </w:tcPr>
+          <w:p>
+            <w:pPr>
+              <w:spacing w:before="80" w:after="80"/>
+              <w:ind w:left="85"/>
+            </w:pPr>
+            <w:r>
+              <w:rPr>
+                <w:rFonts w:ascii="Calibri" w:hAnsi="Calibri"/>
+                <w:b/>
+                <w:i w:val="0"/>
+                <w:color w:val="4338CA"/>
+                <w:sz w:val="15"/>
+              </w:rPr>
+              <w:t>SK&amp;ĐS – DƯỢC MỸ PHẨM</w:t>
+            </w:r>
+          </w:p>
+        </w:tc>
+        <w:tc>
+          <w:tcPr>
+            <w:tcW w:type="dxa" w:w="4536"/>
+            <w:tcBorders>
+              <w:top w:val="none" w:sz="6" w:color="auto"/>
+              <w:bottom w:val="none" w:sz="6" w:color="auto"/>
+              <w:left w:val="none" w:sz="6" w:color="auto"/>
+              <w:right w:val="none" w:sz="6" w:color="auto"/>
+            </w:tcBorders>
+          </w:tcPr>
+          <w:p>
+            <w:pPr>
+              <w:spacing w:before="60" w:after="60"/>
+              <w:ind w:left="113"/>
+            </w:pPr>
+            <w:r>
+              <w:rPr>
+                <w:rFonts w:ascii="Calibri" w:hAnsi="Calibri"/>
+                <w:b/>
+                <w:i w:val="0"/>
+                <w:color w:val="111827"/>
+                <w:sz w:val="21"/>
+              </w:rPr>
+              <w:t>S.I.S Can Tho Hospital Guided on Medical Wastewater Compliance</w:t>
+            </w:r>
+          </w:p>
+        </w:tc>
+      </w:tr>
+    </w:tbl>
+    <w:p>
+      <w:pPr>
+        <w:spacing w:before="40" w:after="40"/>
+        <w:ind w:left="170"/>
+      </w:pPr>
+      <w:r>
+        <w:rPr>
+          <w:rFonts w:ascii="Calibri" w:hAnsi="Calibri"/>
+          <w:b w:val="0"/>
+          <w:i/>
+          <w:color w:val="6B7280"/>
+          <w:sz w:val="18"/>
+        </w:rPr>
+        <w:t>The article covers environmental compliance at S.I.S International Hospital in Can Tho regarding medical wastewater collection and treatment — with no direct relevance to the pharmaceutical market or drug distribution channels. Content is local administrative in nature with no actionable market intelligence.[Source]</w:t>
+      </w:r>
+    </w:p>
+    <w:p>
+      <w:pPr>
+        <w:spacing w:before="20" w:after="40"/>
+        <w:ind w:left="170"/>
+      </w:pPr>
+      <w:r>
+        <w:rPr>
+          <w:rFonts w:ascii="Calibri" w:hAnsi="Calibri"/>
+          <w:b/>
+          <w:i w:val="0"/>
+          <w:color w:val="374151"/>
+          <w:sz w:val="17"/>
+        </w:rPr>
+        <w:t>⚪ This news has no discernible impact on Davipharm's business operations or strategy.</w:t>
+      </w:r>
+    </w:p>
+    <w:tbl>
+      <w:tblPr>
+        <w:tblStyle w:val="TableGrid"/>
+        <w:tblW w:type="auto" w:w="0"/>
+        <w:tblLook w:firstColumn="1" w:firstRow="1" w:lastColumn="0" w:lastRow="0" w:noHBand="0" w:noVBand="1" w:val="04A0"/>
+      </w:tblPr>
+      <w:tblGrid>
+        <w:gridCol w:w="9072"/>
+      </w:tblGrid>
+      <w:tr>
+        <w:tc>
+          <w:tcPr>
+            <w:tcW w:type="dxa" w:w="9072"/>
+            <w:shd w:val="clear" w:color="auto" w:fill="F8FAFC"/>
+            <w:tcBorders>
+              <w:top w:val="none" w:sz="6" w:color="auto"/>
+              <w:bottom w:val="none" w:sz="6" w:color="auto"/>
+              <w:left w:val="single" w:sz="12" w:color="003B71"/>
+              <w:right w:val="none" w:sz="6" w:color="auto"/>
+            </w:tcBorders>
+          </w:tcPr>
+          <w:p>
+            <w:pPr>
+              <w:spacing w:before="60" w:after="60"/>
+              <w:ind w:left="142"/>
+            </w:pPr>
+            <w:r>
+              <w:rPr>
+                <w:rFonts w:ascii="Calibri" w:hAnsi="Calibri"/>
+                <w:b/>
+                <w:i w:val="0"/>
+                <w:color w:val="003B71"/>
+                <w:sz w:val="17"/>
+              </w:rPr>
+              <w:t xml:space="preserve">Strategy  </w:t>
+            </w:r>
+            <w:r>
+              <w:rPr>
+                <w:rFonts w:ascii="Calibri" w:hAnsi="Calibri"/>
+                <w:b w:val="0"/>
+                <w:i w:val="0"/>
+                <w:color w:val="334155"/>
+                <w:sz w:val="17"/>
+              </w:rPr>
+              <w:t>No action required — article falls outside pharmaceutical strategic monitoring scope; recommend excluding similar environmental compliance news from BOD intelligence filters to improve reporting efficiency.</w:t>
+            </w:r>
+          </w:p>
+        </w:tc>
+      </w:tr>
+    </w:tbl>
+    <w:p>
+      <w:pPr>
+        <w:spacing w:before="40" w:after="120"/>
+      </w:pPr>
+    </w:p>
+    <w:tbl>
+      <w:tblPr>
+        <w:tblStyle w:val="TableGrid"/>
+        <w:tblW w:type="auto" w:w="0"/>
+        <w:jc w:val="left"/>
+        <w:tblLook w:firstColumn="1" w:firstRow="1" w:lastColumn="0" w:lastRow="0" w:noHBand="0" w:noVBand="1" w:val="04A0"/>
+      </w:tblPr>
+      <w:tblGrid>
+        <w:gridCol w:w="4536"/>
+        <w:gridCol w:w="4536"/>
+      </w:tblGrid>
+      <w:tr>
+        <w:tc>
+          <w:tcPr>
+            <w:tcW w:type="dxa" w:w="1984"/>
+            <w:shd w:val="clear" w:color="auto" w:fill="EEF2FF"/>
+            <w:tcBorders>
+              <w:top w:val="none" w:sz="6" w:color="auto"/>
+              <w:bottom w:val="none" w:sz="6" w:color="auto"/>
+              <w:left w:val="none" w:sz="6" w:color="auto"/>
+              <w:right w:val="none" w:sz="6" w:color="auto"/>
+            </w:tcBorders>
+          </w:tcPr>
+          <w:p>
+            <w:pPr>
+              <w:spacing w:before="80" w:after="80"/>
+              <w:ind w:left="85"/>
+            </w:pPr>
+            <w:r>
+              <w:rPr>
+                <w:rFonts w:ascii="Calibri" w:hAnsi="Calibri"/>
+                <w:b/>
+                <w:i w:val="0"/>
+                <w:color w:val="4338CA"/>
+                <w:sz w:val="15"/>
+              </w:rPr>
+              <w:t>SK&amp;ĐS – DƯỢC MỸ PHẨM</w:t>
+            </w:r>
+          </w:p>
+        </w:tc>
+        <w:tc>
+          <w:tcPr>
+            <w:tcW w:type="dxa" w:w="4536"/>
+            <w:tcBorders>
+              <w:top w:val="none" w:sz="6" w:color="auto"/>
+              <w:bottom w:val="none" w:sz="6" w:color="auto"/>
+              <w:left w:val="none" w:sz="6" w:color="auto"/>
+              <w:right w:val="none" w:sz="6" w:color="auto"/>
+            </w:tcBorders>
+          </w:tcPr>
+          <w:p>
+            <w:pPr>
+              <w:spacing w:before="60" w:after="60"/>
+              <w:ind w:left="113"/>
+            </w:pPr>
+            <w:r>
+              <w:rPr>
+                <w:rFonts w:ascii="Calibri" w:hAnsi="Calibri"/>
+                <w:b/>
+                <w:i w:val="0"/>
+                <w:color w:val="111827"/>
+                <w:sz w:val="21"/>
+              </w:rPr>
+              <w:t>5 Essential Food Groups for Post-50 Nutrition: Market Signal for Healthy Aging Supplements</w:t>
+            </w:r>
+          </w:p>
+        </w:tc>
+      </w:tr>
+    </w:tbl>
+    <w:p>
+      <w:pPr>
+        <w:spacing w:before="40" w:after="40"/>
+        <w:ind w:left="170"/>
+      </w:pPr>
+      <w:r>
+        <w:rPr>
+          <w:rFonts w:ascii="Calibri" w:hAnsi="Calibri"/>
+          <w:b w:val="0"/>
+          <w:i/>
+          <w:color w:val="6B7280"/>
+          <w:sz w:val="18"/>
+        </w:rPr>
+        <w:t>Health media is amplifying nutritional content targeting the 50+ demographic, reflecting growing consumer awareness and demand in Vietnam's rapidly aging population. This trend signals a clear market opportunity in micronutrient supplements, calcium, vitamin D, and omega-3 product lines.[Source]</w:t>
+      </w:r>
+    </w:p>
+    <w:p>
+      <w:pPr>
+        <w:spacing w:before="20" w:after="40"/>
+        <w:ind w:left="170"/>
+      </w:pPr>
+      <w:r>
+        <w:rPr>
+          <w:rFonts w:ascii="Calibri" w:hAnsi="Calibri"/>
+          <w:b/>
+          <w:i w:val="0"/>
+          <w:color w:val="166534"/>
+          <w:sz w:val="17"/>
+        </w:rPr>
+        <w:t>📈 Rising health media coverage on senior nutrition signals a market expansion opportunity for Davipharm's nutraceutical portfolio targeting the 50+ segment.</w:t>
+      </w:r>
+    </w:p>
+    <w:tbl>
+      <w:tblPr>
+        <w:tblStyle w:val="TableGrid"/>
+        <w:tblW w:type="auto" w:w="0"/>
+        <w:tblLook w:firstColumn="1" w:firstRow="1" w:lastColumn="0" w:lastRow="0" w:noHBand="0" w:noVBand="1" w:val="04A0"/>
+      </w:tblPr>
+      <w:tblGrid>
+        <w:gridCol w:w="9072"/>
+      </w:tblGrid>
+      <w:tr>
+        <w:tc>
+          <w:tcPr>
+            <w:tcW w:type="dxa" w:w="9072"/>
+            <w:shd w:val="clear" w:color="auto" w:fill="F8FAFC"/>
+            <w:tcBorders>
+              <w:top w:val="none" w:sz="6" w:color="auto"/>
+              <w:bottom w:val="none" w:sz="6" w:color="auto"/>
+              <w:left w:val="single" w:sz="12" w:color="003B71"/>
+              <w:right w:val="none" w:sz="6" w:color="auto"/>
+            </w:tcBorders>
+          </w:tcPr>
+          <w:p>
+            <w:pPr>
+              <w:spacing w:before="60" w:after="60"/>
+              <w:ind w:left="142"/>
+            </w:pPr>
+            <w:r>
+              <w:rPr>
+                <w:rFonts w:ascii="Calibri" w:hAnsi="Calibri"/>
+                <w:b/>
+                <w:i w:val="0"/>
+                <w:color w:val="003B71"/>
+                <w:sz w:val="17"/>
+              </w:rPr>
+              <w:t xml:space="preserve">Strategy  </w:t>
+            </w:r>
+            <w:r>
+              <w:rPr>
+                <w:rFonts w:ascii="Calibri" w:hAnsi="Calibri"/>
+                <w:b w:val="0"/>
+                <w:i w:val="0"/>
+                <w:color w:val="334155"/>
+                <w:sz w:val="17"/>
+              </w:rPr>
+              <w:t>Leverage this media trend to accelerate marketing of existing calcium, multivitamin D, and omega-3 products; evaluate launching an "Active 50+" nutritional combo SKU to capture the fast-growing senior consumer segment ahead of competitors.</w:t>
+            </w:r>
+          </w:p>
+        </w:tc>
+      </w:tr>
+    </w:tbl>
+    <w:p>
+      <w:pPr>
+        <w:spacing w:before="40" w:after="120"/>
+      </w:pPr>
+    </w:p>
+    <w:tbl>
+      <w:tblPr>
+        <w:tblStyle w:val="TableGrid"/>
+        <w:tblW w:type="auto" w:w="0"/>
+        <w:jc w:val="left"/>
+        <w:tblLook w:firstColumn="1" w:firstRow="1" w:lastColumn="0" w:lastRow="0" w:noHBand="0" w:noVBand="1" w:val="04A0"/>
+      </w:tblPr>
+      <w:tblGrid>
+        <w:gridCol w:w="4536"/>
+        <w:gridCol w:w="4536"/>
+      </w:tblGrid>
+      <w:tr>
+        <w:tc>
+          <w:tcPr>
+            <w:tcW w:type="dxa" w:w="1984"/>
+            <w:shd w:val="clear" w:color="auto" w:fill="EEF2FF"/>
+            <w:tcBorders>
+              <w:top w:val="none" w:sz="6" w:color="auto"/>
+              <w:bottom w:val="none" w:sz="6" w:color="auto"/>
+              <w:left w:val="none" w:sz="6" w:color="auto"/>
+              <w:right w:val="none" w:sz="6" w:color="auto"/>
+            </w:tcBorders>
+          </w:tcPr>
+          <w:p>
+            <w:pPr>
+              <w:spacing w:before="80" w:after="80"/>
+              <w:ind w:left="85"/>
+            </w:pPr>
+            <w:r>
+              <w:rPr>
+                <w:rFonts w:ascii="Calibri" w:hAnsi="Calibri"/>
+                <w:b/>
+                <w:i w:val="0"/>
+                <w:color w:val="4338CA"/>
+                <w:sz w:val="15"/>
+              </w:rPr>
+              <w:t>SK&amp;ĐS – DƯỢC MỸ PHẨM</w:t>
+            </w:r>
+          </w:p>
+        </w:tc>
+        <w:tc>
+          <w:tcPr>
+            <w:tcW w:type="dxa" w:w="4536"/>
+            <w:tcBorders>
+              <w:top w:val="none" w:sz="6" w:color="auto"/>
+              <w:bottom w:val="none" w:sz="6" w:color="auto"/>
+              <w:left w:val="none" w:sz="6" w:color="auto"/>
+              <w:right w:val="none" w:sz="6" w:color="auto"/>
+            </w:tcBorders>
+          </w:tcPr>
+          <w:p>
+            <w:pPr>
+              <w:spacing w:before="60" w:after="60"/>
+              <w:ind w:left="113"/>
+            </w:pPr>
+            <w:r>
+              <w:rPr>
+                <w:rFonts w:ascii="Calibri" w:hAnsi="Calibri"/>
+                <w:b/>
+                <w:i w:val="0"/>
+                <w:color w:val="111827"/>
+                <w:sz w:val="21"/>
+              </w:rPr>
+              <w:t>11 Supplements to Avoid with Anticoagulant Therapy: Drug-Interaction Alert</w:t>
+            </w:r>
+          </w:p>
+        </w:tc>
+      </w:tr>
+    </w:tbl>
+    <w:p>
+      <w:pPr>
+        <w:spacing w:before="40" w:after="40"/>
+        <w:ind w:left="170"/>
+      </w:pPr>
+      <w:r>
+        <w:rPr>
+          <w:rFonts w:ascii="Calibri" w:hAnsi="Calibri"/>
+          <w:b w:val="0"/>
+          <w:i/>
+          <w:color w:val="6B7280"/>
+          <w:sz w:val="18"/>
+        </w:rPr>
+        <w:t>SK&amp;ĐS warns against 11 supplement categories that dangerously interact with anticoagulants, increasing risks of bleeding or abnormal clotting. This surfaces amid Vietnam's booming supplement market where drug-supplement interaction awareness remains critically low.[Source]</w:t>
+      </w:r>
+    </w:p>
+    <w:p>
+      <w:pPr>
+        <w:spacing w:before="20" w:after="40"/>
+        <w:ind w:left="170"/>
+      </w:pPr>
+      <w:r>
+        <w:rPr>
+          <w:rFonts w:ascii="Calibri" w:hAnsi="Calibri"/>
+          <w:b/>
+          <w:i w:val="0"/>
+          <w:color w:val="166534"/>
+          <w:sz w:val="17"/>
+        </w:rPr>
+        <w:t>💡 Opportunity for Davipharm to position as a drug-safety authority, gaining B2B and B2C communication advantage in the cardiovascular segment.</w:t>
+      </w:r>
+    </w:p>
+    <w:tbl>
+      <w:tblPr>
+        <w:tblStyle w:val="TableGrid"/>
+        <w:tblW w:type="auto" w:w="0"/>
+        <w:tblLook w:firstColumn="1" w:firstRow="1" w:lastColumn="0" w:lastRow="0" w:noHBand="0" w:noVBand="1" w:val="04A0"/>
+      </w:tblPr>
+      <w:tblGrid>
+        <w:gridCol w:w="9072"/>
+      </w:tblGrid>
+      <w:tr>
+        <w:tc>
+          <w:tcPr>
+            <w:tcW w:type="dxa" w:w="9072"/>
+            <w:shd w:val="clear" w:color="auto" w:fill="F8FAFC"/>
+            <w:tcBorders>
+              <w:top w:val="none" w:sz="6" w:color="auto"/>
+              <w:bottom w:val="none" w:sz="6" w:color="auto"/>
+              <w:left w:val="single" w:sz="12" w:color="003B71"/>
+              <w:right w:val="none" w:sz="6" w:color="auto"/>
+            </w:tcBorders>
+          </w:tcPr>
+          <w:p>
+            <w:pPr>
+              <w:spacing w:before="60" w:after="60"/>
+              <w:ind w:left="142"/>
+            </w:pPr>
+            <w:r>
+              <w:rPr>
+                <w:rFonts w:ascii="Calibri" w:hAnsi="Calibri"/>
+                <w:b/>
+                <w:i w:val="0"/>
+                <w:color w:val="003B71"/>
+                <w:sz w:val="17"/>
+              </w:rPr>
+              <w:t xml:space="preserve">Strategy  </w:t>
+            </w:r>
+            <w:r>
+              <w:rPr>
+                <w:rFonts w:ascii="Calibri" w:hAnsi="Calibri"/>
+                <w:b w:val="0"/>
+                <w:i w:val="0"/>
+                <w:color w:val="334155"/>
+                <w:sz w:val="17"/>
+              </w:rPr>
+              <w:t>Develop a "Safe Anticoagulant Use Guide" distributed through pharmacy chains and prescribing physicians to boost brand visibility in the cardiovascular segment and strengthen ETC/OTC channel relationships. Simultaneously, audit existing OTC/supplement labels to ensure adequate drug-interaction warnings, mitigating regulatory and liability risks.</w:t>
+            </w:r>
+          </w:p>
+        </w:tc>
+      </w:tr>
+    </w:tbl>
+    <w:p>
+      <w:pPr>
+        <w:spacing w:before="40" w:after="120"/>
+      </w:pPr>
+    </w:p>
+    <w:tbl>
+      <w:tblPr>
+        <w:tblStyle w:val="TableGrid"/>
+        <w:tblW w:type="auto" w:w="0"/>
+        <w:jc w:val="left"/>
+        <w:tblLook w:firstColumn="1" w:firstRow="1" w:lastColumn="0" w:lastRow="0" w:noHBand="0" w:noVBand="1" w:val="04A0"/>
+      </w:tblPr>
+      <w:tblGrid>
+        <w:gridCol w:w="4536"/>
+        <w:gridCol w:w="4536"/>
+      </w:tblGrid>
+      <w:tr>
+        <w:tc>
+          <w:tcPr>
+            <w:tcW w:type="dxa" w:w="1984"/>
+            <w:shd w:val="clear" w:color="auto" w:fill="EEF2FF"/>
+            <w:tcBorders>
+              <w:top w:val="none" w:sz="6" w:color="auto"/>
+              <w:bottom w:val="none" w:sz="6" w:color="auto"/>
+              <w:left w:val="none" w:sz="6" w:color="auto"/>
+              <w:right w:val="none" w:sz="6" w:color="auto"/>
+            </w:tcBorders>
+          </w:tcPr>
+          <w:p>
+            <w:pPr>
+              <w:spacing w:before="80" w:after="80"/>
+              <w:ind w:left="85"/>
+            </w:pPr>
+            <w:r>
+              <w:rPr>
+                <w:rFonts w:ascii="Calibri" w:hAnsi="Calibri"/>
+                <w:b/>
+                <w:i w:val="0"/>
+                <w:color w:val="4338CA"/>
+                <w:sz w:val="15"/>
+              </w:rPr>
+              <w:t>SK&amp;ĐS – DƯỢC MỸ PHẨM</w:t>
+            </w:r>
+          </w:p>
+        </w:tc>
+        <w:tc>
+          <w:tcPr>
+            <w:tcW w:type="dxa" w:w="4536"/>
+            <w:tcBorders>
+              <w:top w:val="none" w:sz="6" w:color="auto"/>
+              <w:bottom w:val="none" w:sz="6" w:color="auto"/>
+              <w:left w:val="none" w:sz="6" w:color="auto"/>
+              <w:right w:val="none" w:sz="6" w:color="auto"/>
+            </w:tcBorders>
+          </w:tcPr>
+          <w:p>
+            <w:pPr>
+              <w:spacing w:before="60" w:after="60"/>
+              <w:ind w:left="113"/>
+            </w:pPr>
+            <w:r>
+              <w:rPr>
+                <w:rFonts w:ascii="Calibri" w:hAnsi="Calibri"/>
+                <w:b/>
+                <w:i w:val="0"/>
+                <w:color w:val="111827"/>
+                <w:sz w:val="21"/>
+              </w:rPr>
+              <w:t>Severe Chickenpox Complication in Child Highlights Antibiotic &amp; Antiviral Market Opportunity</w:t>
+            </w:r>
+          </w:p>
+        </w:tc>
+      </w:tr>
+    </w:tbl>
+    <w:p>
+      <w:pPr>
+        <w:spacing w:before="40" w:after="40"/>
+        <w:ind w:left="170"/>
+      </w:pPr>
+      <w:r>
+        <w:rPr>
+          <w:rFonts w:ascii="Calibri" w:hAnsi="Calibri"/>
+          <w:b w:val="0"/>
+          <w:i/>
+          <w:color w:val="6B7280"/>
+          <w:sz w:val="18"/>
+        </w:rPr>
+        <w:t>A high-profile case of a 6-year-old developing sepsis as a chickenpox complication is raising public awareness of secondary bacterial infections post-viral illness. Demand for antibiotics targeting secondary infections and antivirals in pediatric settings is expected to rise during chickenpox season.[Source]</w:t>
+      </w:r>
+    </w:p>
+    <w:p>
+      <w:pPr>
+        <w:spacing w:before="20" w:after="40"/>
+        <w:ind w:left="170"/>
+      </w:pPr>
+      <w:r>
+        <w:rPr>
+          <w:rFonts w:ascii="Calibri" w:hAnsi="Calibri"/>
+          <w:b/>
+          <w:i w:val="0"/>
+          <w:color w:val="166534"/>
+          <w:sz w:val="17"/>
+        </w:rPr>
+        <w:t>📈 Short-term growth opportunity for Davipharm's pediatric antibiotic and chickenpox complication treatment portfolio.</w:t>
+      </w:r>
+    </w:p>
+    <w:tbl>
+      <w:tblPr>
+        <w:tblStyle w:val="TableGrid"/>
+        <w:tblW w:type="auto" w:w="0"/>
+        <w:tblLook w:firstColumn="1" w:firstRow="1" w:lastColumn="0" w:lastRow="0" w:noHBand="0" w:noVBand="1" w:val="04A0"/>
+      </w:tblPr>
+      <w:tblGrid>
+        <w:gridCol w:w="9072"/>
+      </w:tblGrid>
+      <w:tr>
+        <w:tc>
+          <w:tcPr>
+            <w:tcW w:type="dxa" w:w="9072"/>
+            <w:shd w:val="clear" w:color="auto" w:fill="F8FAFC"/>
+            <w:tcBorders>
+              <w:top w:val="none" w:sz="6" w:color="auto"/>
+              <w:bottom w:val="none" w:sz="6" w:color="auto"/>
+              <w:left w:val="single" w:sz="12" w:color="003B71"/>
+              <w:right w:val="none" w:sz="6" w:color="auto"/>
+            </w:tcBorders>
+          </w:tcPr>
+          <w:p>
+            <w:pPr>
+              <w:spacing w:before="60" w:after="60"/>
+              <w:ind w:left="142"/>
+            </w:pPr>
+            <w:r>
+              <w:rPr>
+                <w:rFonts w:ascii="Calibri" w:hAnsi="Calibri"/>
+                <w:b/>
+                <w:i w:val="0"/>
+                <w:color w:val="003B71"/>
+                <w:sz w:val="17"/>
+              </w:rPr>
+              <w:t xml:space="preserve">Strategy  </w:t>
+            </w:r>
+            <w:r>
+              <w:rPr>
+                <w:rFonts w:ascii="Calibri" w:hAnsi="Calibri"/>
+                <w:b w:val="0"/>
+                <w:i w:val="0"/>
+                <w:color w:val="334155"/>
+                <w:sz w:val="17"/>
+              </w:rPr>
+              <w:t>Intensify Medical Rep coverage at pediatric hospitals and clinics with broad-spectrum antibiotics (amoxicillin-clavulanate, cephalosporins) and acyclovir, emphasizing early intervention to prevent complications. Consider publishing KOL-supported materials on chickenpox complication management protocols to strengthen Davipharm's brand presence in the pediatric segment.</w:t>
+            </w:r>
+          </w:p>
+        </w:tc>
+      </w:tr>
+    </w:tbl>
+    <w:p>
+      <w:pPr>
+        <w:spacing w:before="40" w:after="120"/>
+      </w:pPr>
     </w:p>
     <w:tbl>
       <w:tblPr>
@@ -2687,7 +3311,7 @@
                 <w:color w:val="111827"/>
                 <w:sz w:val="18"/>
               </w:rPr>
-              <w:t>Negotiate levothyroxine/calcium listing in tender lists at top thyroid hospitals</w:t>
+              <w:t>Launch "Active 50+" combo marketing campaign for calcium, vitamin D, omega-3</w:t>
             </w:r>
           </w:p>
         </w:tc>
@@ -2715,7 +3339,7 @@
                 <w:color w:val="003B71"/>
                 <w:sz w:val="17"/>
               </w:rPr>
-              <w:t>Sales</w:t>
+              <w:t>Marketing</w:t>
             </w:r>
           </w:p>
         </w:tc>
@@ -2743,7 +3367,7 @@
                 <w:color w:val="6B7280"/>
                 <w:sz w:val="17"/>
               </w:rPr>
-              <w:t>Medical tourism – thyroid surgery</w:t>
+              <w:t>Senior nutrition media trend</w:t>
             </w:r>
           </w:p>
         </w:tc>
@@ -2822,7 +3446,7 @@
                 <w:color w:val="111827"/>
                 <w:sz w:val="18"/>
               </w:rPr>
-              <w:t>Audit R&amp;D portfolio: confirm Levetiracetam manufacturing feasibility within 30 days</w:t>
+              <w:t>Intensify pediatric hospital rep coverage with antibiotics and acyclovir</w:t>
             </w:r>
           </w:p>
         </w:tc>
@@ -2850,7 +3474,7 @@
                 <w:color w:val="003B71"/>
                 <w:sz w:val="17"/>
               </w:rPr>
-              <w:t>RA</w:t>
+              <w:t>Sales</w:t>
             </w:r>
           </w:p>
         </w:tc>
@@ -2878,7 +3502,7 @@
                 <w:color w:val="6B7280"/>
                 <w:sz w:val="17"/>
               </w:rPr>
-              <w:t>Levetiracetam – Alzheimer's repurposing</w:t>
+              <w:t>Severe chickenpox complication in child</w:t>
             </w:r>
           </w:p>
         </w:tc>
@@ -2957,7 +3581,7 @@
                 <w:color w:val="111827"/>
                 <w:sz w:val="18"/>
               </w:rPr>
-              <w:t>Monitor Levetiracetam/Alzheimer trials to prepare supplemental indication dossier</w:t>
+              <w:t>Publish KOL-backed chickenpox complication protocol materials for pediatricians</w:t>
             </w:r>
           </w:p>
         </w:tc>
@@ -2985,7 +3609,7 @@
                 <w:color w:val="003B71"/>
                 <w:sz w:val="17"/>
               </w:rPr>
-              <w:t>Strategy</w:t>
+              <w:t>Marketing</w:t>
             </w:r>
           </w:p>
         </w:tc>
@@ -3013,7 +3637,7 @@
                 <w:color w:val="6B7280"/>
                 <w:sz w:val="17"/>
               </w:rPr>
-              <w:t>Levetiracetam – Alzheimer's repurposing</w:t>
+              <w:t>Severe chickenpox complication in child</w:t>
             </w:r>
           </w:p>
         </w:tc>
@@ -3092,7 +3716,7 @@
                 <w:color w:val="111827"/>
                 <w:sz w:val="18"/>
               </w:rPr>
-              <w:t>Assess OTC SKU development with Houttuynia extract for Long Chau, Pharmacity chains</w:t>
+              <w:t>Develop and distribute "Safe Anticoagulant Use" guide via pharmacies and physicians</w:t>
             </w:r>
           </w:p>
         </w:tc>
@@ -3148,7 +3772,7 @@
                 <w:color w:val="6B7280"/>
                 <w:sz w:val="17"/>
               </w:rPr>
-              <w:t>Houttuynia cordata herbal trend</w:t>
+              <w:t>Supplement–anticoagulant drug interaction alert</w:t>
             </w:r>
           </w:p>
         </w:tc>
@@ -3176,7 +3800,139 @@
                 <w:color w:val="22C55E"/>
                 <w:sz w:val="17"/>
               </w:rPr>
-              <w:t>🟡 Medium&lt;/td</w:t>
+              <w:t>🟡 Medium</w:t>
+            </w:r>
+          </w:p>
+        </w:tc>
+      </w:tr>
+      <w:tr>
+        <w:tc>
+          <w:tcPr>
+            <w:tcW w:type="dxa" w:w="454"/>
+            <w:shd w:val="clear" w:color="auto" w:fill="DCFCE7"/>
+            <w:tcBorders>
+              <w:top w:val="none" w:sz="6" w:color="auto"/>
+              <w:bottom w:val="none" w:sz="6" w:color="auto"/>
+              <w:left w:val="none" w:sz="6" w:color="auto"/>
+              <w:right w:val="none" w:sz="6" w:color="auto"/>
+            </w:tcBorders>
+          </w:tcPr>
+          <w:p>
+            <w:pPr>
+              <w:spacing w:before="100" w:after="100"/>
+              <w:jc w:val="center"/>
+            </w:pPr>
+            <w:r>
+              <w:t>🟢</w:t>
+            </w:r>
+          </w:p>
+        </w:tc>
+        <w:tc>
+          <w:tcPr>
+            <w:tcW w:type="dxa" w:w="4422"/>
+            <w:shd w:val="clear" w:color="auto" w:fill="FFFFFF"/>
+            <w:tcBorders>
+              <w:top w:val="none" w:sz="6" w:color="auto"/>
+              <w:bottom w:val="none" w:sz="6" w:color="auto"/>
+              <w:left w:val="none" w:sz="6" w:color="auto"/>
+              <w:right w:val="none" w:sz="6" w:color="auto"/>
+            </w:tcBorders>
+          </w:tcPr>
+          <w:p>
+            <w:pPr>
+              <w:spacing w:before="80" w:after="80"/>
+              <w:ind w:left="85"/>
+            </w:pPr>
+            <w:r>
+              <w:rPr>
+                <w:rFonts w:ascii="Calibri" w:hAnsi="Calibri"/>
+                <w:b/>
+                <w:i w:val="0"/>
+                <w:color w:val="111827"/>
+                <w:sz w:val="18"/>
+              </w:rPr>
+              <w:t>&lt;span class="</w:t>
+            </w:r>
+          </w:p>
+        </w:tc>
+        <w:tc>
+          <w:tcPr>
+            <w:tcW w:type="dxa" w:w="1417"/>
+            <w:shd w:val="clear" w:color="auto" w:fill="FFFFFF"/>
+            <w:tcBorders>
+              <w:top w:val="none" w:sz="6" w:color="auto"/>
+              <w:bottom w:val="none" w:sz="6" w:color="auto"/>
+              <w:left w:val="none" w:sz="6" w:color="auto"/>
+              <w:right w:val="none" w:sz="6" w:color="auto"/>
+            </w:tcBorders>
+          </w:tcPr>
+          <w:p>
+            <w:pPr>
+              <w:spacing w:before="80" w:after="80"/>
+              <w:jc w:val="center"/>
+            </w:pPr>
+            <w:r>
+              <w:rPr>
+                <w:rFonts w:ascii="Calibri" w:hAnsi="Calibri"/>
+                <w:b w:val="0"/>
+                <w:i w:val="0"/>
+                <w:color w:val="003B71"/>
+                <w:sz w:val="17"/>
+              </w:rPr>
+            </w:r>
+          </w:p>
+        </w:tc>
+        <w:tc>
+          <w:tcPr>
+            <w:tcW w:type="dxa" w:w="1134"/>
+            <w:shd w:val="clear" w:color="auto" w:fill="FFFFFF"/>
+            <w:tcBorders>
+              <w:top w:val="none" w:sz="6" w:color="auto"/>
+              <w:bottom w:val="none" w:sz="6" w:color="auto"/>
+              <w:left w:val="none" w:sz="6" w:color="auto"/>
+              <w:right w:val="none" w:sz="6" w:color="auto"/>
+            </w:tcBorders>
+          </w:tcPr>
+          <w:p>
+            <w:pPr>
+              <w:spacing w:before="80" w:after="80"/>
+              <w:jc w:val="center"/>
+            </w:pPr>
+            <w:r>
+              <w:rPr>
+                <w:rFonts w:ascii="Calibri" w:hAnsi="Calibri"/>
+                <w:b w:val="0"/>
+                <w:i w:val="0"/>
+                <w:color w:val="6B7280"/>
+                <w:sz w:val="17"/>
+              </w:rPr>
+            </w:r>
+          </w:p>
+        </w:tc>
+        <w:tc>
+          <w:tcPr>
+            <w:tcW w:type="dxa" w:w="1644"/>
+            <w:shd w:val="clear" w:color="auto" w:fill="DCFCE7"/>
+            <w:tcBorders>
+              <w:top w:val="none" w:sz="6" w:color="auto"/>
+              <w:bottom w:val="none" w:sz="6" w:color="auto"/>
+              <w:left w:val="none" w:sz="6" w:color="auto"/>
+              <w:right w:val="none" w:sz="6" w:color="auto"/>
+            </w:tcBorders>
+          </w:tcPr>
+          <w:p>
+            <w:pPr>
+              <w:spacing w:before="80" w:after="80"/>
+              <w:jc w:val="center"/>
+            </w:pPr>
+            <w:r>
+              <w:rPr>
+                <w:rFonts w:ascii="Calibri" w:hAnsi="Calibri"/>
+                <w:b/>
+                <w:i w:val="0"/>
+                <w:color w:val="22C55E"/>
+                <w:sz w:val="17"/>
+              </w:rPr>
             </w:r>
           </w:p>
         </w:tc>

</xml_diff>

<commit_message>
Update report_en.docx 2026-05-13 10:31
</commit_message>
<xml_diff>
--- a/report_en.docx
+++ b/report_en.docx
@@ -338,7 +338,7 @@
                 <w:color w:val="111827"/>
                 <w:sz w:val="20"/>
               </w:rPr>
-              <w:t>Week 11–17 May: Two positive market signals — pediatric demand during chickenpox season and the 50+ nutrition segment — present short- and mid-term growth opportunities across Davipharm's OTC/ETC portfolio.</w:t>
+              <w:t>Week 11–17 May 2026: Scientific evidence on accelerated aging and younger-onset cancer trends validates long-term demand across Davipharm's chronic disease and oncology portfolios, unlocking cross-listing opportunities in premium private hospital channels.</w:t>
             </w:r>
           </w:p>
         </w:tc>
@@ -406,7 +406,7 @@
                 <w:color w:val="111827"/>
                 <w:sz w:val="17"/>
               </w:rPr>
-              <w:t>▸  Pediatrics – Chickenpox:High-profile complication case drives immediate demand for broad-spectrum antibiotics and acyclovir in pediatric hospital channels.</w:t>
+              <w:t>▸  Aging acceleration at 44 &amp; 60:Stanford data validates two priority patient segments (40–50 and 60+), providing strong scientific grounding for Marketing to position "early intervention" messaging around RAVASTEL, EIMLER-10, PECHAUNOX, and ZENTOGOUT.</w:t>
             </w:r>
           </w:p>
           <w:p>
@@ -422,7 +422,7 @@
                 <w:color w:val="111827"/>
                 <w:sz w:val="17"/>
               </w:rPr>
-              <w:t>▸  Senior Nutrition:Health media amplification of 50+ dietary needs signals an underexploited, fast-growing segment for calcium, vitamin D, and omega-3 SKUs.</w:t>
+              <w:t>▸  Colorectal cancer — ~17,000 cases/year:Multi-morbid patients (CV, GI, thrombotic) at major private hospitals open cross-listing opportunities for JIRACEK, PECHAUNOX, and ZABALES within peri-operative supportive protocols.</w:t>
             </w:r>
           </w:p>
           <w:p>
@@ -438,23 +438,7 @@
                 <w:color w:val="111827"/>
                 <w:sz w:val="17"/>
               </w:rPr>
-              <w:t>▸  Drug Safety – Cardiology:Supplement-anticoagulant interaction alert creates positioning space for Davipharm as a "responsible pharma" brand within the cardiovascular ETC channel.</w:t>
-            </w:r>
-          </w:p>
-          <w:p>
-            <w:pPr>
-              <w:spacing w:before="20" w:after="60"/>
-              <w:ind w:left="142"/>
-            </w:pPr>
-            <w:r>
-              <w:rPr>
-                <w:rFonts w:ascii="Calibri" w:hAnsi="Calibri"/>
-                <w:b w:val="0"/>
-                <w:i w:val="0"/>
-                <w:color w:val="111827"/>
-                <w:sz w:val="17"/>
-              </w:rPr>
-              <w:t>▸  P1Sales Director to direct Medical Reps to increase visit frequency at pediatric hospitals and clinics in May–June, prioritizing amoxicillin-clavulanate, cephalosporins, and acyclovir.</w:t>
+              <w:t>▸  Breast cancer portfolio gap:The hormone receptor-positive breast cancer segment is growing but Davipharm has no directly competitive product — M&amp;A/in-licensing of aromatase inhibitors or anti-estrogens warrants assessment.</w:t>
             </w:r>
           </w:p>
         </w:tc>
@@ -483,22 +467,6 @@
                 <w:sz w:val="17"/>
               </w:rPr>
               <w:t>⚡  PRIORITY ACTIONS</w:t>
-            </w:r>
-          </w:p>
-          <w:p>
-            <w:pPr>
-              <w:spacing w:before="20" w:after="60"/>
-              <w:ind w:left="142"/>
-            </w:pPr>
-            <w:r>
-              <w:rPr>
-                <w:rFonts w:ascii="Calibri" w:hAnsi="Calibri"/>
-                <w:b w:val="0"/>
-                <w:i w:val="0"/>
-                <w:color w:val="0056D2"/>
-                <w:sz w:val="17"/>
-              </w:rPr>
-              <w:t>→  P1Sales Director to direct Medical Reps to increase visit frequency at pediatric hospitals and clinics in May–June, prioritizing amoxicillin-clavulanate, cephalosporins, and acyclovir.</w:t>
             </w:r>
           </w:p>
         </w:tc>
@@ -830,7 +798,7 @@
                 <w:color w:val="166534"/>
                 <w:sz w:val="22"/>
               </w:rPr>
-              <w:t>2</w:t>
+              <w:t>4</w:t>
             </w:r>
           </w:p>
         </w:tc>
@@ -858,7 +826,7 @@
                 <w:color w:val="374151"/>
                 <w:sz w:val="22"/>
               </w:rPr>
-              <w:t>1</w:t>
+              <w:t>5</w:t>
             </w:r>
           </w:p>
         </w:tc>
@@ -1873,6 +1841,942 @@
                 <w:color w:val="4338CA"/>
                 <w:sz w:val="15"/>
               </w:rPr>
+              <w:t>SK&amp;ĐS – DƯỢC MỸ PHẨM</w:t>
+            </w:r>
+          </w:p>
+        </w:tc>
+        <w:tc>
+          <w:tcPr>
+            <w:tcW w:type="dxa" w:w="4536"/>
+            <w:tcBorders>
+              <w:top w:val="none" w:sz="6" w:color="auto"/>
+              <w:bottom w:val="none" w:sz="6" w:color="auto"/>
+              <w:left w:val="none" w:sz="6" w:color="auto"/>
+              <w:right w:val="none" w:sz="6" w:color="auto"/>
+            </w:tcBorders>
+          </w:tcPr>
+          <w:p>
+            <w:pPr>
+              <w:spacing w:before="60" w:after="60"/>
+              <w:ind w:left="113"/>
+            </w:pPr>
+            <w:r>
+              <w:rPr>
+                <w:rFonts w:ascii="Calibri" w:hAnsi="Calibri"/>
+                <w:b/>
+                <w:i w:val="0"/>
+                <w:color w:val="111827"/>
+                <w:sz w:val="21"/>
+              </w:rPr>
+              <w:t>New Head of Food Safety Authority Appointed — Leadership Shift at VFA</w:t>
+            </w:r>
+          </w:p>
+        </w:tc>
+      </w:tr>
+    </w:tbl>
+    <w:p>
+      <w:pPr>
+        <w:spacing w:before="40" w:after="40"/>
+        <w:ind w:left="170"/>
+      </w:pPr>
+      <w:r>
+        <w:rPr>
+          <w:rFonts w:ascii="Calibri" w:hAnsi="Calibri"/>
+          <w:b w:val="0"/>
+          <w:i/>
+          <w:color w:val="6B7280"/>
+          <w:sz w:val="18"/>
+        </w:rPr>
+        <w:t>Minister of Health Dao Hong Lan officially appointed a new Director of the Vietnam Food Administration (VFA), which oversees functional foods, cosmetics, and related health products. This leadership change may signal policy shifts in advertising controls, product licensing, and regulatory enforcement under VFA's remit.[Source]</w:t>
+      </w:r>
+    </w:p>
+    <w:p>
+      <w:pPr>
+        <w:spacing w:before="20" w:after="40"/>
+        <w:ind w:left="170"/>
+      </w:pPr>
+      <w:r>
+        <w:rPr>
+          <w:rFonts w:ascii="Calibri" w:hAnsi="Calibri"/>
+          <w:b/>
+          <w:i w:val="0"/>
+          <w:color w:val="374151"/>
+          <w:sz w:val="17"/>
+        </w:rPr>
+        <w:t>👀 Indirect impact — VFA does not regulate Davipharm's Rx portfolio, but policy shifts on advertising or product classification warrant monitoring.</w:t>
+      </w:r>
+    </w:p>
+    <w:tbl>
+      <w:tblPr>
+        <w:tblStyle w:val="TableGrid"/>
+        <w:tblW w:type="auto" w:w="0"/>
+        <w:tblLook w:firstColumn="1" w:firstRow="1" w:lastColumn="0" w:lastRow="0" w:noHBand="0" w:noVBand="1" w:val="04A0"/>
+      </w:tblPr>
+      <w:tblGrid>
+        <w:gridCol w:w="9072"/>
+      </w:tblGrid>
+      <w:tr>
+        <w:tc>
+          <w:tcPr>
+            <w:tcW w:type="dxa" w:w="9072"/>
+            <w:shd w:val="clear" w:color="auto" w:fill="F8FAFC"/>
+            <w:tcBorders>
+              <w:top w:val="none" w:sz="6" w:color="auto"/>
+              <w:bottom w:val="none" w:sz="6" w:color="auto"/>
+              <w:left w:val="single" w:sz="12" w:color="003B71"/>
+              <w:right w:val="none" w:sz="6" w:color="auto"/>
+            </w:tcBorders>
+          </w:tcPr>
+          <w:p>
+            <w:pPr>
+              <w:spacing w:before="60" w:after="60"/>
+              <w:ind w:left="142"/>
+            </w:pPr>
+            <w:r>
+              <w:rPr>
+                <w:rFonts w:ascii="Calibri" w:hAnsi="Calibri"/>
+                <w:b/>
+                <w:i w:val="0"/>
+                <w:color w:val="003B71"/>
+                <w:sz w:val="17"/>
+              </w:rPr>
+              <w:t xml:space="preserve">Strategy  </w:t>
+            </w:r>
+            <w:r>
+              <w:rPr>
+                <w:rFonts w:ascii="Calibri" w:hAnsi="Calibri"/>
+                <w:b w:val="0"/>
+                <w:i w:val="0"/>
+                <w:color w:val="334155"/>
+                <w:sz w:val="17"/>
+              </w:rPr>
+              <w:t>Regulatory Affairs Team to monitor the new VFA Director's policy priorities in Q2/2025, particularly if Davipharm plans to expand into functional food or VFA-regulated OTC segments; no immediate action required.</w:t>
+            </w:r>
+          </w:p>
+        </w:tc>
+      </w:tr>
+    </w:tbl>
+    <w:p>
+      <w:pPr>
+        <w:spacing w:before="40" w:after="120"/>
+      </w:pPr>
+    </w:p>
+    <w:tbl>
+      <w:tblPr>
+        <w:tblStyle w:val="TableGrid"/>
+        <w:tblW w:type="auto" w:w="0"/>
+        <w:jc w:val="left"/>
+        <w:tblLook w:firstColumn="1" w:firstRow="1" w:lastColumn="0" w:lastRow="0" w:noHBand="0" w:noVBand="1" w:val="04A0"/>
+      </w:tblPr>
+      <w:tblGrid>
+        <w:gridCol w:w="4536"/>
+        <w:gridCol w:w="4536"/>
+      </w:tblGrid>
+      <w:tr>
+        <w:tc>
+          <w:tcPr>
+            <w:tcW w:type="dxa" w:w="1984"/>
+            <w:shd w:val="clear" w:color="auto" w:fill="EEF2FF"/>
+            <w:tcBorders>
+              <w:top w:val="none" w:sz="6" w:color="auto"/>
+              <w:bottom w:val="none" w:sz="6" w:color="auto"/>
+              <w:left w:val="none" w:sz="6" w:color="auto"/>
+              <w:right w:val="none" w:sz="6" w:color="auto"/>
+            </w:tcBorders>
+          </w:tcPr>
+          <w:p>
+            <w:pPr>
+              <w:spacing w:before="80" w:after="80"/>
+              <w:ind w:left="85"/>
+            </w:pPr>
+            <w:r>
+              <w:rPr>
+                <w:rFonts w:ascii="Calibri" w:hAnsi="Calibri"/>
+                <w:b/>
+                <w:i w:val="0"/>
+                <w:color w:val="4338CA"/>
+                <w:sz w:val="15"/>
+              </w:rPr>
+              <w:t>SK&amp;ĐS – DƯỢC MỸ PHẨM</w:t>
+            </w:r>
+          </w:p>
+        </w:tc>
+        <w:tc>
+          <w:tcPr>
+            <w:tcW w:type="dxa" w:w="4536"/>
+            <w:tcBorders>
+              <w:top w:val="none" w:sz="6" w:color="auto"/>
+              <w:bottom w:val="none" w:sz="6" w:color="auto"/>
+              <w:left w:val="none" w:sz="6" w:color="auto"/>
+              <w:right w:val="none" w:sz="6" w:color="auto"/>
+            </w:tcBorders>
+          </w:tcPr>
+          <w:p>
+            <w:pPr>
+              <w:spacing w:before="60" w:after="60"/>
+              <w:ind w:left="113"/>
+            </w:pPr>
+            <w:r>
+              <w:rPr>
+                <w:rFonts w:ascii="Calibri" w:hAnsi="Calibri"/>
+                <w:b/>
+                <w:i w:val="0"/>
+                <w:color w:val="111827"/>
+                <w:sz w:val="21"/>
+              </w:rPr>
+              <w:t>12-Year-Old Develops Terminal Cancer Linked to Excessive Bubble Tea Consumption — NCD Awareness Rising</w:t>
+            </w:r>
+          </w:p>
+        </w:tc>
+      </w:tr>
+    </w:tbl>
+    <w:p>
+      <w:pPr>
+        <w:spacing w:before="40" w:after="40"/>
+        <w:ind w:left="170"/>
+      </w:pPr>
+      <w:r>
+        <w:rPr>
+          <w:rFonts w:ascii="Calibri" w:hAnsi="Calibri"/>
+          <w:b w:val="0"/>
+          <w:i/>
+          <w:color w:val="6B7280"/>
+          <w:sz w:val="18"/>
+        </w:rPr>
+        <w:t>A 12-year-old Vietnamese boy was diagnosed with late-stage cancer after replacing water with bubble tea over an extended period, sparking public concern over dietary habits and rising NCD risks among youth. While not directly linked to Davipharm's current portfolio, the case reflects growing public awareness around cancer incidence and oncology treatment demand in Vietnam.[Source]</w:t>
+      </w:r>
+    </w:p>
+    <w:p>
+      <w:pPr>
+        <w:spacing w:before="20" w:after="40"/>
+        <w:ind w:left="170"/>
+      </w:pPr>
+      <w:r>
+        <w:rPr>
+          <w:rFonts w:ascii="Calibri" w:hAnsi="Calibri"/>
+          <w:b/>
+          <w:i w:val="0"/>
+          <w:color w:val="374151"/>
+          <w:sz w:val="17"/>
+        </w:rPr>
+        <w:t>📊 Indirect relevance only — rising cancer awareness may gradually support market demand for HYYR (Erlotinib) and LARRIVEY (Bicalutamide), but no immediate near-term business impact is identified.</w:t>
+      </w:r>
+    </w:p>
+    <w:tbl>
+      <w:tblPr>
+        <w:tblStyle w:val="TableGrid"/>
+        <w:tblW w:type="auto" w:w="0"/>
+        <w:tblLook w:firstColumn="1" w:firstRow="1" w:lastColumn="0" w:lastRow="0" w:noHBand="0" w:noVBand="1" w:val="04A0"/>
+      </w:tblPr>
+      <w:tblGrid>
+        <w:gridCol w:w="9072"/>
+      </w:tblGrid>
+      <w:tr>
+        <w:tc>
+          <w:tcPr>
+            <w:tcW w:type="dxa" w:w="9072"/>
+            <w:shd w:val="clear" w:color="auto" w:fill="F8FAFC"/>
+            <w:tcBorders>
+              <w:top w:val="none" w:sz="6" w:color="auto"/>
+              <w:bottom w:val="none" w:sz="6" w:color="auto"/>
+              <w:left w:val="single" w:sz="12" w:color="003B71"/>
+              <w:right w:val="none" w:sz="6" w:color="auto"/>
+            </w:tcBorders>
+          </w:tcPr>
+          <w:p>
+            <w:pPr>
+              <w:spacing w:before="60" w:after="60"/>
+              <w:ind w:left="142"/>
+            </w:pPr>
+            <w:r>
+              <w:rPr>
+                <w:rFonts w:ascii="Calibri" w:hAnsi="Calibri"/>
+                <w:b/>
+                <w:i w:val="0"/>
+                <w:color w:val="003B71"/>
+                <w:sz w:val="17"/>
+              </w:rPr>
+              <w:t xml:space="preserve">Strategy  </w:t>
+            </w:r>
+            <w:r>
+              <w:rPr>
+                <w:rFonts w:ascii="Calibri" w:hAnsi="Calibri"/>
+                <w:b w:val="0"/>
+                <w:i w:val="0"/>
+                <w:color w:val="334155"/>
+                <w:sz w:val="17"/>
+              </w:rPr>
+              <w:t>Oncology Team to monitor cancer-related media trends as background context for HCP education materials supporting HYYR and LARRIVEY; no urgent action required — low priority for this reporting cycle.</w:t>
+            </w:r>
+          </w:p>
+        </w:tc>
+      </w:tr>
+    </w:tbl>
+    <w:p>
+      <w:pPr>
+        <w:spacing w:before="40" w:after="120"/>
+      </w:pPr>
+    </w:p>
+    <w:tbl>
+      <w:tblPr>
+        <w:tblStyle w:val="TableGrid"/>
+        <w:tblW w:type="auto" w:w="0"/>
+        <w:jc w:val="left"/>
+        <w:tblLook w:firstColumn="1" w:firstRow="1" w:lastColumn="0" w:lastRow="0" w:noHBand="0" w:noVBand="1" w:val="04A0"/>
+      </w:tblPr>
+      <w:tblGrid>
+        <w:gridCol w:w="4536"/>
+        <w:gridCol w:w="4536"/>
+      </w:tblGrid>
+      <w:tr>
+        <w:tc>
+          <w:tcPr>
+            <w:tcW w:type="dxa" w:w="1984"/>
+            <w:shd w:val="clear" w:color="auto" w:fill="EEF2FF"/>
+            <w:tcBorders>
+              <w:top w:val="none" w:sz="6" w:color="auto"/>
+              <w:bottom w:val="none" w:sz="6" w:color="auto"/>
+              <w:left w:val="none" w:sz="6" w:color="auto"/>
+              <w:right w:val="none" w:sz="6" w:color="auto"/>
+            </w:tcBorders>
+          </w:tcPr>
+          <w:p>
+            <w:pPr>
+              <w:spacing w:before="80" w:after="80"/>
+              <w:ind w:left="85"/>
+            </w:pPr>
+            <w:r>
+              <w:rPr>
+                <w:rFonts w:ascii="Calibri" w:hAnsi="Calibri"/>
+                <w:b/>
+                <w:i w:val="0"/>
+                <w:color w:val="4338CA"/>
+                <w:sz w:val="15"/>
+              </w:rPr>
+              <w:t>VNEXPRESS – SỨC KHỎE</w:t>
+            </w:r>
+          </w:p>
+        </w:tc>
+        <w:tc>
+          <w:tcPr>
+            <w:tcW w:type="dxa" w:w="4536"/>
+            <w:tcBorders>
+              <w:top w:val="none" w:sz="6" w:color="auto"/>
+              <w:bottom w:val="none" w:sz="6" w:color="auto"/>
+              <w:left w:val="none" w:sz="6" w:color="auto"/>
+              <w:right w:val="none" w:sz="6" w:color="auto"/>
+            </w:tcBorders>
+          </w:tcPr>
+          <w:p>
+            <w:pPr>
+              <w:spacing w:before="60" w:after="60"/>
+              <w:ind w:left="113"/>
+            </w:pPr>
+            <w:r>
+              <w:rPr>
+                <w:rFonts w:ascii="Calibri" w:hAnsi="Calibri"/>
+                <w:b/>
+                <w:i w:val="0"/>
+                <w:color w:val="111827"/>
+                <w:sz w:val="21"/>
+              </w:rPr>
+              <w:t>Aging Accelerates at 44 &amp; 60 — Strategic Window for Cardiovascular, Diabetes &amp; Gout Portfolio</w:t>
+            </w:r>
+          </w:p>
+        </w:tc>
+      </w:tr>
+    </w:tbl>
+    <w:p>
+      <w:pPr>
+        <w:spacing w:before="40" w:after="40"/>
+        <w:ind w:left="170"/>
+      </w:pPr>
+      <w:r>
+        <w:rPr>
+          <w:rFonts w:ascii="Calibri" w:hAnsi="Calibri"/>
+          <w:b w:val="0"/>
+          <w:i/>
+          <w:color w:val="6B7280"/>
+          <w:sz w:val="18"/>
+        </w:rPr>
+        <w:t>Stanford research confirms aging accelerates sharply at ~44 (metabolism, inflammation, hormones) and ~60 (cardiovascular, renal, glucose regulation), creating two well-defined chronic disease hotspots. This directly underpins long-term demand for Davipharm's core portfolios: cardiovascular (PECHAUNOX, RAVASTEL, ZABALES), diabetes (EIMLER-10, ZLATKO), gout (ZENTOGOUT, MAGRAX), and pain (COXTONE).[Source]</w:t>
+      </w:r>
+    </w:p>
+    <w:p>
+      <w:pPr>
+        <w:spacing w:before="20" w:after="40"/>
+        <w:ind w:left="170"/>
+      </w:pPr>
+      <w:r>
+        <w:rPr>
+          <w:rFonts w:ascii="Calibri" w:hAnsi="Calibri"/>
+          <w:b/>
+          <w:i w:val="0"/>
+          <w:color w:val="166534"/>
+          <w:sz w:val="17"/>
+        </w:rPr>
+        <w:t>🟢 International scientific evidence validates two priority patient segments (40–50 and 60+), providing a strong foundation for Davipharm's Marketing team to build "proactive prevention" messaging across the chronic disease portfolio.</w:t>
+      </w:r>
+    </w:p>
+    <w:tbl>
+      <w:tblPr>
+        <w:tblStyle w:val="TableGrid"/>
+        <w:tblW w:type="auto" w:w="0"/>
+        <w:tblLook w:firstColumn="1" w:firstRow="1" w:lastColumn="0" w:lastRow="0" w:noHBand="0" w:noVBand="1" w:val="04A0"/>
+      </w:tblPr>
+      <w:tblGrid>
+        <w:gridCol w:w="9072"/>
+      </w:tblGrid>
+      <w:tr>
+        <w:tc>
+          <w:tcPr>
+            <w:tcW w:type="dxa" w:w="9072"/>
+            <w:shd w:val="clear" w:color="auto" w:fill="F8FAFC"/>
+            <w:tcBorders>
+              <w:top w:val="none" w:sz="6" w:color="auto"/>
+              <w:bottom w:val="none" w:sz="6" w:color="auto"/>
+              <w:left w:val="single" w:sz="12" w:color="003B71"/>
+              <w:right w:val="none" w:sz="6" w:color="auto"/>
+            </w:tcBorders>
+          </w:tcPr>
+          <w:p>
+            <w:pPr>
+              <w:spacing w:before="60" w:after="60"/>
+              <w:ind w:left="142"/>
+            </w:pPr>
+            <w:r>
+              <w:rPr>
+                <w:rFonts w:ascii="Calibri" w:hAnsi="Calibri"/>
+                <w:b/>
+                <w:i w:val="0"/>
+                <w:color w:val="003B71"/>
+                <w:sz w:val="17"/>
+              </w:rPr>
+              <w:t xml:space="preserve">Strategy  </w:t>
+            </w:r>
+            <w:r>
+              <w:rPr>
+                <w:rFonts w:ascii="Calibri" w:hAnsi="Calibri"/>
+                <w:b w:val="0"/>
+                <w:i w:val="0"/>
+                <w:color w:val="334155"/>
+                <w:sz w:val="17"/>
+              </w:rPr>
+              <w:t>Marketing &amp; Medical Affairs team should develop KOL/CME materials leveraging Stanford data to position an "early intervention at 40+" strategy — prioritizing RAVASTEL (LDL control), EIMLER-10 (renal/cardiac protection), ZENTOGOUT (uric acid management), and PECHAUNOX (blood pressure) in Q3/2025; coordinate with Sales team to expand detailing in endocrinology and cardiology clinics targeting the 40–65 age segment.</w:t>
+            </w:r>
+          </w:p>
+        </w:tc>
+      </w:tr>
+    </w:tbl>
+    <w:p>
+      <w:pPr>
+        <w:spacing w:before="40" w:after="120"/>
+      </w:pPr>
+    </w:p>
+    <w:tbl>
+      <w:tblPr>
+        <w:tblStyle w:val="TableGrid"/>
+        <w:tblW w:type="auto" w:w="0"/>
+        <w:jc w:val="left"/>
+        <w:tblLook w:firstColumn="1" w:firstRow="1" w:lastColumn="0" w:lastRow="0" w:noHBand="0" w:noVBand="1" w:val="04A0"/>
+      </w:tblPr>
+      <w:tblGrid>
+        <w:gridCol w:w="4536"/>
+        <w:gridCol w:w="4536"/>
+      </w:tblGrid>
+      <w:tr>
+        <w:tc>
+          <w:tcPr>
+            <w:tcW w:type="dxa" w:w="1984"/>
+            <w:shd w:val="clear" w:color="auto" w:fill="EEF2FF"/>
+            <w:tcBorders>
+              <w:top w:val="none" w:sz="6" w:color="auto"/>
+              <w:bottom w:val="none" w:sz="6" w:color="auto"/>
+              <w:left w:val="none" w:sz="6" w:color="auto"/>
+              <w:right w:val="none" w:sz="6" w:color="auto"/>
+            </w:tcBorders>
+          </w:tcPr>
+          <w:p>
+            <w:pPr>
+              <w:spacing w:before="80" w:after="80"/>
+              <w:ind w:left="85"/>
+            </w:pPr>
+            <w:r>
+              <w:rPr>
+                <w:rFonts w:ascii="Calibri" w:hAnsi="Calibri"/>
+                <w:b/>
+                <w:i w:val="0"/>
+                <w:color w:val="4338CA"/>
+                <w:sz w:val="15"/>
+              </w:rPr>
+              <w:t>VNEXPRESS – SỨC KHỎE</w:t>
+            </w:r>
+          </w:p>
+        </w:tc>
+        <w:tc>
+          <w:tcPr>
+            <w:tcW w:type="dxa" w:w="4536"/>
+            <w:tcBorders>
+              <w:top w:val="none" w:sz="6" w:color="auto"/>
+              <w:bottom w:val="none" w:sz="6" w:color="auto"/>
+              <w:left w:val="none" w:sz="6" w:color="auto"/>
+              <w:right w:val="none" w:sz="6" w:color="auto"/>
+            </w:tcBorders>
+          </w:tcPr>
+          <w:p>
+            <w:pPr>
+              <w:spacing w:before="60" w:after="60"/>
+              <w:ind w:left="113"/>
+            </w:pPr>
+            <w:r>
+              <w:rPr>
+                <w:rFonts w:ascii="Calibri" w:hAnsi="Calibri"/>
+                <w:b/>
+                <w:i w:val="0"/>
+                <w:color w:val="111827"/>
+                <w:sz w:val="21"/>
+              </w:rPr>
+              <w:t>Pancreatic Cancer Overview: Awareness Opportunity for Davipharm Oncology Portfolio (HYYR – Erlotinib)</w:t>
+            </w:r>
+          </w:p>
+        </w:tc>
+      </w:tr>
+    </w:tbl>
+    <w:p>
+      <w:pPr>
+        <w:spacing w:before="40" w:after="40"/>
+        <w:ind w:left="170"/>
+      </w:pPr>
+      <w:r>
+        <w:rPr>
+          <w:rFonts w:ascii="Calibri" w:hAnsi="Calibri"/>
+          <w:b w:val="0"/>
+          <w:i/>
+          <w:color w:val="6B7280"/>
+          <w:sz w:val="18"/>
+        </w:rPr>
+        <w:t>This VnExpress health guide raises public awareness of pancreatic cancer — a malignancy with poor prognosis, late-stage diagnosis, and growing treatment demand in Vietnam. Erlotinib (HYYR) holds an approved indication for pancreatic cancer alongside NSCLC, presenting a niche but relevant opportunity for Davipharm's oncology team.[Source]</w:t>
+      </w:r>
+    </w:p>
+    <w:p>
+      <w:pPr>
+        <w:spacing w:before="20" w:after="40"/>
+        <w:ind w:left="170"/>
+      </w:pPr>
+      <w:r>
+        <w:rPr>
+          <w:rFonts w:ascii="Calibri" w:hAnsi="Calibri"/>
+          <w:b/>
+          <w:i w:val="0"/>
+          <w:color w:val="374151"/>
+          <w:sz w:val="17"/>
+        </w:rPr>
+        <w:t>📊 Background market awareness signal — no immediate revenue impact, but provides a foundation for the Oncology team to develop medical communication around HYYR's pancreatic cancer indication.</w:t>
+      </w:r>
+    </w:p>
+    <w:tbl>
+      <w:tblPr>
+        <w:tblStyle w:val="TableGrid"/>
+        <w:tblW w:type="auto" w:w="0"/>
+        <w:tblLook w:firstColumn="1" w:firstRow="1" w:lastColumn="0" w:lastRow="0" w:noHBand="0" w:noVBand="1" w:val="04A0"/>
+      </w:tblPr>
+      <w:tblGrid>
+        <w:gridCol w:w="9072"/>
+      </w:tblGrid>
+      <w:tr>
+        <w:tc>
+          <w:tcPr>
+            <w:tcW w:type="dxa" w:w="9072"/>
+            <w:shd w:val="clear" w:color="auto" w:fill="F8FAFC"/>
+            <w:tcBorders>
+              <w:top w:val="none" w:sz="6" w:color="auto"/>
+              <w:bottom w:val="none" w:sz="6" w:color="auto"/>
+              <w:left w:val="single" w:sz="12" w:color="003B71"/>
+              <w:right w:val="none" w:sz="6" w:color="auto"/>
+            </w:tcBorders>
+          </w:tcPr>
+          <w:p>
+            <w:pPr>
+              <w:spacing w:before="60" w:after="60"/>
+              <w:ind w:left="142"/>
+            </w:pPr>
+            <w:r>
+              <w:rPr>
+                <w:rFonts w:ascii="Calibri" w:hAnsi="Calibri"/>
+                <w:b/>
+                <w:i w:val="0"/>
+                <w:color w:val="003B71"/>
+                <w:sz w:val="17"/>
+              </w:rPr>
+              <w:t xml:space="preserve">Strategy  </w:t>
+            </w:r>
+            <w:r>
+              <w:rPr>
+                <w:rFonts w:ascii="Calibri" w:hAnsi="Calibri"/>
+                <w:b w:val="0"/>
+                <w:i w:val="0"/>
+                <w:color w:val="334155"/>
+                <w:sz w:val="17"/>
+              </w:rPr>
+              <w:t>Oncology team, in coordination with Medical Affairs, should review HYYR (Erlotinib)'s registered indication for advanced pancreatic cancer and develop KOL/oncologist-facing materials targeting key hospitals (K Hospital, Cho Ray, HCMC Oncology) by Q3/2025.</w:t>
+            </w:r>
+          </w:p>
+        </w:tc>
+      </w:tr>
+    </w:tbl>
+    <w:p>
+      <w:pPr>
+        <w:spacing w:before="40" w:after="120"/>
+      </w:pPr>
+    </w:p>
+    <w:tbl>
+      <w:tblPr>
+        <w:tblStyle w:val="TableGrid"/>
+        <w:tblW w:type="auto" w:w="0"/>
+        <w:jc w:val="left"/>
+        <w:tblLook w:firstColumn="1" w:firstRow="1" w:lastColumn="0" w:lastRow="0" w:noHBand="0" w:noVBand="1" w:val="04A0"/>
+      </w:tblPr>
+      <w:tblGrid>
+        <w:gridCol w:w="4536"/>
+        <w:gridCol w:w="4536"/>
+      </w:tblGrid>
+      <w:tr>
+        <w:tc>
+          <w:tcPr>
+            <w:tcW w:type="dxa" w:w="1984"/>
+            <w:shd w:val="clear" w:color="auto" w:fill="EEF2FF"/>
+            <w:tcBorders>
+              <w:top w:val="none" w:sz="6" w:color="auto"/>
+              <w:bottom w:val="none" w:sz="6" w:color="auto"/>
+              <w:left w:val="none" w:sz="6" w:color="auto"/>
+              <w:right w:val="none" w:sz="6" w:color="auto"/>
+            </w:tcBorders>
+          </w:tcPr>
+          <w:p>
+            <w:pPr>
+              <w:spacing w:before="80" w:after="80"/>
+              <w:ind w:left="85"/>
+            </w:pPr>
+            <w:r>
+              <w:rPr>
+                <w:rFonts w:ascii="Calibri" w:hAnsi="Calibri"/>
+                <w:b/>
+                <w:i w:val="0"/>
+                <w:color w:val="4338CA"/>
+                <w:sz w:val="15"/>
+              </w:rPr>
+              <w:t>VNEXPRESS – SỨC KHỎE</w:t>
+            </w:r>
+          </w:p>
+        </w:tc>
+        <w:tc>
+          <w:tcPr>
+            <w:tcW w:type="dxa" w:w="4536"/>
+            <w:tcBorders>
+              <w:top w:val="none" w:sz="6" w:color="auto"/>
+              <w:bottom w:val="none" w:sz="6" w:color="auto"/>
+              <w:left w:val="none" w:sz="6" w:color="auto"/>
+              <w:right w:val="none" w:sz="6" w:color="auto"/>
+            </w:tcBorders>
+          </w:tcPr>
+          <w:p>
+            <w:pPr>
+              <w:spacing w:before="60" w:after="60"/>
+              <w:ind w:left="113"/>
+            </w:pPr>
+            <w:r>
+              <w:rPr>
+                <w:rFonts w:ascii="Calibri" w:hAnsi="Calibri"/>
+                <w:b/>
+                <w:i w:val="0"/>
+                <w:color w:val="111827"/>
+                <w:sz w:val="21"/>
+              </w:rPr>
+              <w:t>Colorectal Cancer: ~17,000 New Cases/Year in Vietnam — Market Opportunity for Supportive Therapy Protocols</w:t>
+            </w:r>
+          </w:p>
+        </w:tc>
+      </w:tr>
+    </w:tbl>
+    <w:p>
+      <w:pPr>
+        <w:spacing w:before="40" w:after="40"/>
+        <w:ind w:left="170"/>
+      </w:pPr>
+      <w:r>
+        <w:rPr>
+          <w:rFonts w:ascii="Calibri" w:hAnsi="Calibri"/>
+          <w:b w:val="0"/>
+          <w:i/>
+          <w:color w:val="6B7280"/>
+          <w:sz w:val="18"/>
+        </w:rPr>
+        <w:t>Tam Anh Hospital's adoption of Da Vinci Xi robotics reflects the upgrading trend among major private hospitals in colorectal cancer treatment; Globocan 2022 records 16,000–17,000 new colorectal cancer cases and over 8,400 deaths annually in Vietnam. This patient segment—complex, multi-morbid (cardiovascular, thrombotic, GI)—generates strong demand for peri-operative supportive therapies within Davipharm's portfolio.[Source]</w:t>
+      </w:r>
+    </w:p>
+    <w:p>
+      <w:pPr>
+        <w:spacing w:before="20" w:after="40"/>
+        <w:ind w:left="170"/>
+      </w:pPr>
+      <w:r>
+        <w:rPr>
+          <w:rFonts w:ascii="Calibri" w:hAnsi="Calibri"/>
+          <w:b/>
+          <w:i w:val="0"/>
+          <w:color w:val="166534"/>
+          <w:sz w:val="17"/>
+        </w:rPr>
+        <w:t>🟢 Multi-morbid colorectal cancer patients open cross-listing opportunities for JIRACEK (Esomeprazole), PECHAUNOX (Perindopril+Amlodipine), ZABALES (Clopidogrel), and LARRIVEY (Bicalutamide) in premium private hospital channels.</w:t>
+      </w:r>
+    </w:p>
+    <w:tbl>
+      <w:tblPr>
+        <w:tblStyle w:val="TableGrid"/>
+        <w:tblW w:type="auto" w:w="0"/>
+        <w:tblLook w:firstColumn="1" w:firstRow="1" w:lastColumn="0" w:lastRow="0" w:noHBand="0" w:noVBand="1" w:val="04A0"/>
+      </w:tblPr>
+      <w:tblGrid>
+        <w:gridCol w:w="9072"/>
+      </w:tblGrid>
+      <w:tr>
+        <w:tc>
+          <w:tcPr>
+            <w:tcW w:type="dxa" w:w="9072"/>
+            <w:shd w:val="clear" w:color="auto" w:fill="F8FAFC"/>
+            <w:tcBorders>
+              <w:top w:val="none" w:sz="6" w:color="auto"/>
+              <w:bottom w:val="none" w:sz="6" w:color="auto"/>
+              <w:left w:val="single" w:sz="12" w:color="003B71"/>
+              <w:right w:val="none" w:sz="6" w:color="auto"/>
+            </w:tcBorders>
+          </w:tcPr>
+          <w:p>
+            <w:pPr>
+              <w:spacing w:before="60" w:after="60"/>
+              <w:ind w:left="142"/>
+            </w:pPr>
+            <w:r>
+              <w:rPr>
+                <w:rFonts w:ascii="Calibri" w:hAnsi="Calibri"/>
+                <w:b/>
+                <w:i w:val="0"/>
+                <w:color w:val="003B71"/>
+                <w:sz w:val="17"/>
+              </w:rPr>
+              <w:t xml:space="preserve">Strategy  </w:t>
+            </w:r>
+            <w:r>
+              <w:rPr>
+                <w:rFonts w:ascii="Calibri" w:hAnsi="Calibri"/>
+                <w:b w:val="0"/>
+                <w:i w:val="0"/>
+                <w:color w:val="334155"/>
+                <w:sz w:val="17"/>
+              </w:rPr>
+              <w:t>Medical Affairs team, in collaboration with ETC Sales, should develop a scientific dossier targeting peri-operative supportive protocols at private hospitals with oncology/GI surgery departments (Tam Anh, Vinmec, FV), prioritizing JIRACEK (mucosal protection post-surgery), PECHAUNOX/ZABALES (cardiovascular-thrombotic comorb</w:t>
+            </w:r>
+          </w:p>
+        </w:tc>
+      </w:tr>
+    </w:tbl>
+    <w:p>
+      <w:pPr>
+        <w:spacing w:before="40" w:after="120"/>
+      </w:pPr>
+    </w:p>
+    <w:tbl>
+      <w:tblPr>
+        <w:tblStyle w:val="TableGrid"/>
+        <w:tblW w:type="auto" w:w="0"/>
+        <w:jc w:val="left"/>
+        <w:tblLook w:firstColumn="1" w:firstRow="1" w:lastColumn="0" w:lastRow="0" w:noHBand="0" w:noVBand="1" w:val="04A0"/>
+      </w:tblPr>
+      <w:tblGrid>
+        <w:gridCol w:w="4536"/>
+        <w:gridCol w:w="4536"/>
+      </w:tblGrid>
+      <w:tr>
+        <w:tc>
+          <w:tcPr>
+            <w:tcW w:type="dxa" w:w="1984"/>
+            <w:shd w:val="clear" w:color="auto" w:fill="EEF2FF"/>
+            <w:tcBorders>
+              <w:top w:val="none" w:sz="6" w:color="auto"/>
+              <w:bottom w:val="none" w:sz="6" w:color="auto"/>
+              <w:left w:val="none" w:sz="6" w:color="auto"/>
+              <w:right w:val="none" w:sz="6" w:color="auto"/>
+            </w:tcBorders>
+          </w:tcPr>
+          <w:p>
+            <w:pPr>
+              <w:spacing w:before="80" w:after="80"/>
+              <w:ind w:left="85"/>
+            </w:pPr>
+            <w:r>
+              <w:rPr>
+                <w:rFonts w:ascii="Calibri" w:hAnsi="Calibri"/>
+                <w:b/>
+                <w:i w:val="0"/>
+                <w:color w:val="4338CA"/>
+                <w:sz w:val="15"/>
+              </w:rPr>
+              <w:t>VNEXPRESS – SỨC KHỎE</w:t>
+            </w:r>
+          </w:p>
+        </w:tc>
+        <w:tc>
+          <w:tcPr>
+            <w:tcW w:type="dxa" w:w="4536"/>
+            <w:tcBorders>
+              <w:top w:val="none" w:sz="6" w:color="auto"/>
+              <w:bottom w:val="none" w:sz="6" w:color="auto"/>
+              <w:left w:val="none" w:sz="6" w:color="auto"/>
+              <w:right w:val="none" w:sz="6" w:color="auto"/>
+            </w:tcBorders>
+          </w:tcPr>
+          <w:p>
+            <w:pPr>
+              <w:spacing w:before="60" w:after="60"/>
+              <w:ind w:left="113"/>
+            </w:pPr>
+            <w:r>
+              <w:rPr>
+                <w:rFonts w:ascii="Calibri" w:hAnsi="Calibri"/>
+                <w:b/>
+                <w:i w:val="0"/>
+                <w:color w:val="111827"/>
+                <w:sz w:val="21"/>
+              </w:rPr>
+              <w:t>Breast Cancer Affects Younger Women via Multi-modal Treatment — Oncology Portfolio Opportunity for Davipharm</w:t>
+            </w:r>
+          </w:p>
+        </w:tc>
+      </w:tr>
+    </w:tbl>
+    <w:p>
+      <w:pPr>
+        <w:spacing w:before="40" w:after="40"/>
+        <w:ind w:left="170"/>
+      </w:pPr>
+      <w:r>
+        <w:rPr>
+          <w:rFonts w:ascii="Calibri" w:hAnsi="Calibri"/>
+          <w:b w:val="0"/>
+          <w:i/>
+          <w:color w:val="6B7280"/>
+          <w:sz w:val="18"/>
+        </w:rPr>
+        <w:t>A specialist from Tam Anh Hospital confirms the rejuvenation trend in breast cancer and increasing use of multi-modal therapy (radiation, chemotherapy, hormone therapy) lasting 5–10 years, driving sustained demand for oncology-endocrine drugs. Davipharm's current oncology portfolio (LARRIVEY/Bicalutamide, HYYR/Erlotinib) lacks direct coverage of hormone receptor-positive breast cancer — a strategic gap.[Source]</w:t>
+      </w:r>
+    </w:p>
+    <w:p>
+      <w:pPr>
+        <w:spacing w:before="20" w:after="40"/>
+        <w:ind w:left="170"/>
+      </w:pPr>
+      <w:r>
+        <w:rPr>
+          <w:rFonts w:ascii="Calibri" w:hAnsi="Calibri"/>
+          <w:b/>
+          <w:i w:val="0"/>
+          <w:color w:val="374151"/>
+          <w:sz w:val="17"/>
+        </w:rPr>
+        <w:t>🔍 Watch signal: the hormone receptor-positive breast cancer segment is expanding, but Davipharm currently lacks a directly competitive product to capture this growing demand.</w:t>
+      </w:r>
+    </w:p>
+    <w:tbl>
+      <w:tblPr>
+        <w:tblStyle w:val="TableGrid"/>
+        <w:tblW w:type="auto" w:w="0"/>
+        <w:tblLook w:firstColumn="1" w:firstRow="1" w:lastColumn="0" w:lastRow="0" w:noHBand="0" w:noVBand="1" w:val="04A0"/>
+      </w:tblPr>
+      <w:tblGrid>
+        <w:gridCol w:w="9072"/>
+      </w:tblGrid>
+      <w:tr>
+        <w:tc>
+          <w:tcPr>
+            <w:tcW w:type="dxa" w:w="9072"/>
+            <w:shd w:val="clear" w:color="auto" w:fill="F8FAFC"/>
+            <w:tcBorders>
+              <w:top w:val="none" w:sz="6" w:color="auto"/>
+              <w:bottom w:val="none" w:sz="6" w:color="auto"/>
+              <w:left w:val="single" w:sz="12" w:color="003B71"/>
+              <w:right w:val="none" w:sz="6" w:color="auto"/>
+            </w:tcBorders>
+          </w:tcPr>
+          <w:p>
+            <w:pPr>
+              <w:spacing w:before="60" w:after="60"/>
+              <w:ind w:left="142"/>
+            </w:pPr>
+            <w:r>
+              <w:rPr>
+                <w:rFonts w:ascii="Calibri" w:hAnsi="Calibri"/>
+                <w:b/>
+                <w:i w:val="0"/>
+                <w:color w:val="003B71"/>
+                <w:sz w:val="17"/>
+              </w:rPr>
+              <w:t xml:space="preserve">Strategy  </w:t>
+            </w:r>
+            <w:r>
+              <w:rPr>
+                <w:rFonts w:ascii="Calibri" w:hAnsi="Calibri"/>
+                <w:b w:val="0"/>
+                <w:i w:val="0"/>
+                <w:color w:val="334155"/>
+                <w:sz w:val="17"/>
+              </w:rPr>
+              <w:t>Business Development &amp; Oncology team should assess feasibility of expanding the portfolio into breast cancer hormone therapy (aromatase inhibitors/anti-estrogens); Marketing team to reinforce LARRIVEY brand presence at oncology conferences in the interim. Recommend opportunity assessment report to BOD by Q3/2025.</w:t>
+            </w:r>
+          </w:p>
+        </w:tc>
+      </w:tr>
+    </w:tbl>
+    <w:p>
+      <w:pPr>
+        <w:spacing w:before="40" w:after="120"/>
+      </w:pPr>
+    </w:p>
+    <w:tbl>
+      <w:tblPr>
+        <w:tblStyle w:val="TableGrid"/>
+        <w:tblW w:type="auto" w:w="0"/>
+        <w:jc w:val="left"/>
+        <w:tblLook w:firstColumn="1" w:firstRow="1" w:lastColumn="0" w:lastRow="0" w:noHBand="0" w:noVBand="1" w:val="04A0"/>
+      </w:tblPr>
+      <w:tblGrid>
+        <w:gridCol w:w="4536"/>
+        <w:gridCol w:w="4536"/>
+      </w:tblGrid>
+      <w:tr>
+        <w:tc>
+          <w:tcPr>
+            <w:tcW w:type="dxa" w:w="1984"/>
+            <w:shd w:val="clear" w:color="auto" w:fill="EEF2FF"/>
+            <w:tcBorders>
+              <w:top w:val="none" w:sz="6" w:color="auto"/>
+              <w:bottom w:val="none" w:sz="6" w:color="auto"/>
+              <w:left w:val="none" w:sz="6" w:color="auto"/>
+              <w:right w:val="none" w:sz="6" w:color="auto"/>
+            </w:tcBorders>
+          </w:tcPr>
+          <w:p>
+            <w:pPr>
+              <w:spacing w:before="80" w:after="80"/>
+              <w:ind w:left="85"/>
+            </w:pPr>
+            <w:r>
+              <w:rPr>
+                <w:rFonts w:ascii="Calibri" w:hAnsi="Calibri"/>
+                <w:b/>
+                <w:i w:val="0"/>
+                <w:color w:val="4338CA"/>
+                <w:sz w:val="15"/>
+              </w:rPr>
               <w:t>VIETNAMPLUS – SỨC KHỎE</w:t>
             </w:r>
           </w:p>
@@ -2495,7 +3399,7 @@
                 <w:color w:val="003B71"/>
                 <w:sz w:val="17"/>
               </w:rPr>
-              <w:t>Empagliflozin</w:t>
+              <w:t>EIMLER-10</w:t>
             </w:r>
           </w:p>
         </w:tc>
@@ -2516,7 +3420,7 @@
                 <w:color w:val="374151"/>
                 <w:sz w:val="17"/>
               </w:rPr>
-              <w:t>Tiểu đường / Suy tim</w:t>
+              <w:t>Empagliflozin 10mg</w:t>
             </w:r>
           </w:p>
         </w:tc>
@@ -2537,14 +3441,14 @@
                 <w:color w:val="374151"/>
                 <w:sz w:val="17"/>
               </w:rPr>
-              <w:t>Cơ hội cao</w:t>
+              <w:t>597,000 VND /hộp</w:t>
             </w:r>
           </w:p>
         </w:tc>
         <w:tc>
           <w:tcPr>
             <w:tcW w:type="dxa" w:w="1247"/>
-            <w:shd w:val="clear" w:color="auto" w:fill="EFF6FF"/>
+            <w:shd w:val="clear" w:color="auto" w:fill="E7F9EE"/>
           </w:tcPr>
           <w:p>
             <w:pPr>
@@ -2556,10 +3460,10 @@
                 <w:rFonts w:ascii="Calibri" w:hAnsi="Calibri"/>
                 <w:b/>
                 <w:i w:val="0"/>
-                <w:color w:val="0056D2"/>
+                <w:color w:val="166534"/>
                 <w:sz w:val="17"/>
               </w:rPr>
-              <w:t>Ưu tiên thầu Nhóm 1</w:t>
+              <w:t>Cơ hội cao</w:t>
             </w:r>
           </w:p>
         </w:tc>
@@ -2580,6 +3484,7 @@
                 <w:color w:val="374151"/>
                 <w:sz w:val="17"/>
               </w:rPr>
+              <w:t>Ưu tiên thầu Nhóm 1 – đấu thầu TT 2026</w:t>
             </w:r>
           </w:p>
         </w:tc>
@@ -2602,7 +3507,7 @@
                 <w:color w:val="003B71"/>
                 <w:sz w:val="17"/>
               </w:rPr>
-              <w:t>Tadalafil</w:t>
+              <w:t>ZLATKO-50</w:t>
             </w:r>
           </w:p>
         </w:tc>
@@ -2623,7 +3528,7 @@
                 <w:color w:val="374151"/>
                 <w:sz w:val="17"/>
               </w:rPr>
-              <w:t>Nam khoa</w:t>
+              <w:t>Sitagliptin 50mg</w:t>
             </w:r>
           </w:p>
         </w:tc>
@@ -2644,14 +3549,14 @@
                 <w:color w:val="374151"/>
                 <w:sz w:val="17"/>
               </w:rPr>
-              <w:t>Cạnh tranh</w:t>
+              <w:t>217,500 VND /hộp</w:t>
             </w:r>
           </w:p>
         </w:tc>
         <w:tc>
           <w:tcPr>
             <w:tcW w:type="dxa" w:w="1247"/>
-            <w:shd w:val="clear" w:color="auto" w:fill="EFF6FF"/>
+            <w:shd w:val="clear" w:color="auto" w:fill="FFF7ED"/>
           </w:tcPr>
           <w:p>
             <w:pPr>
@@ -2663,10 +3568,10 @@
                 <w:rFonts w:ascii="Calibri" w:hAnsi="Calibri"/>
                 <w:b/>
                 <w:i w:val="0"/>
-                <w:color w:val="0056D2"/>
+                <w:color w:val="D97706"/>
                 <w:sz w:val="17"/>
               </w:rPr>
-              <w:t>Theo dõi giá Sun Pharma</w:t>
+              <w:t>Cạnh tranh</w:t>
             </w:r>
           </w:p>
         </w:tc>
@@ -2687,6 +3592,7 @@
                 <w:color w:val="374151"/>
                 <w:sz w:val="17"/>
               </w:rPr>
+              <w:t>Theo dõi DPP-4 generic cạnh tranh</w:t>
             </w:r>
           </w:p>
         </w:tc>
@@ -2709,7 +3615,7 @@
                 <w:color w:val="003B71"/>
                 <w:sz w:val="17"/>
               </w:rPr>
-              <w:t>Dapoxetine</w:t>
+              <w:t>JANUS-60</w:t>
             </w:r>
           </w:p>
         </w:tc>
@@ -2730,7 +3636,7 @@
                 <w:color w:val="374151"/>
                 <w:sz w:val="17"/>
               </w:rPr>
-              <w:t>Nam khoa</w:t>
+              <w:t>Dapoxetine 60mg</w:t>
             </w:r>
           </w:p>
         </w:tc>
@@ -2751,7 +3657,7 @@
                 <w:color w:val="374151"/>
                 <w:sz w:val="17"/>
               </w:rPr>
-              <w:t>Ổn  VNDịnh</w:t>
+              <w:t>720,000 VND /hộp</w:t>
             </w:r>
           </w:p>
         </w:tc>
@@ -2773,7 +3679,7 @@
                 <w:color w:val="0056D2"/>
                 <w:sz w:val="17"/>
               </w:rPr>
-              <w:t>Kiểm tra Long Châu listing</w:t>
+              <w:t>Ổn định</w:t>
             </w:r>
           </w:p>
         </w:tc>
@@ -2794,6 +3700,7 @@
                 <w:color w:val="374151"/>
                 <w:sz w:val="17"/>
               </w:rPr>
+              <w:t>Kiểm tra listing Long Châu / Pharmacity</w:t>
             </w:r>
           </w:p>
         </w:tc>
@@ -2816,7 +3723,7 @@
                 <w:color w:val="003B71"/>
                 <w:sz w:val="17"/>
               </w:rPr>
-              <w:t>Cytisine</w:t>
+              <w:t>TADALAFIL 20MG</w:t>
             </w:r>
           </w:p>
         </w:tc>
@@ -2837,7 +3744,7 @@
                 <w:color w:val="374151"/>
                 <w:sz w:val="17"/>
               </w:rPr>
-              <w:t>Cai thuốc lá</w:t>
+              <w:t>Tadalafil 20mg</w:t>
             </w:r>
           </w:p>
         </w:tc>
@@ -2858,14 +3765,14 @@
                 <w:color w:val="374151"/>
                 <w:sz w:val="17"/>
               </w:rPr>
-              <w:t>Pre-launch</w:t>
+              <w:t>42,000 VND /tabs</w:t>
             </w:r>
           </w:p>
         </w:tc>
         <w:tc>
           <w:tcPr>
             <w:tcW w:type="dxa" w:w="1247"/>
-            <w:shd w:val="clear" w:color="auto" w:fill="EFF6FF"/>
+            <w:shd w:val="clear" w:color="auto" w:fill="FFF7ED"/>
           </w:tcPr>
           <w:p>
             <w:pPr>
@@ -2877,10 +3784,10 @@
                 <w:rFonts w:ascii="Calibri" w:hAnsi="Calibri"/>
                 <w:b/>
                 <w:i w:val="0"/>
-                <w:color w:val="0056D2"/>
+                <w:color w:val="D97706"/>
                 <w:sz w:val="17"/>
               </w:rPr>
-              <w:t>Q4/2026 – Cơ hội vàng</w:t>
+              <w:t>Cạnh tranh</w:t>
             </w:r>
           </w:p>
         </w:tc>
@@ -2901,6 +3808,7 @@
                 <w:color w:val="374151"/>
                 <w:sz w:val="17"/>
               </w:rPr>
+              <w:t>Theo dõi giá Sun Pharma, Cipla generic</w:t>
             </w:r>
           </w:p>
         </w:tc>
@@ -2923,7 +3831,7 @@
                 <w:color w:val="003B71"/>
                 <w:sz w:val="17"/>
               </w:rPr>
-              <w:t>Metilone</w:t>
+              <w:t>DRYCHES</w:t>
             </w:r>
           </w:p>
         </w:tc>
@@ -2944,7 +3852,7 @@
                 <w:color w:val="374151"/>
                 <w:sz w:val="17"/>
               </w:rPr>
-              <w:t>Kháng viêm</w:t>
+              <w:t>Dutasteride 0.5mg</w:t>
             </w:r>
           </w:p>
         </w:tc>
@@ -2965,7 +3873,7 @@
                 <w:color w:val="374151"/>
                 <w:sz w:val="17"/>
               </w:rPr>
-              <w:t>Ổn  VNDịnh</w:t>
+              <w:t>378,000 VND /hộp</w:t>
             </w:r>
           </w:p>
         </w:tc>
@@ -2987,7 +3895,7 @@
                 <w:color w:val="0056D2"/>
                 <w:sz w:val="17"/>
               </w:rPr>
-              <w:t>Duy trì kênh ETC</w:t>
+              <w:t>Cơ hội</w:t>
             </w:r>
           </w:p>
         </w:tc>
@@ -3008,6 +3916,1411 @@
                 <w:color w:val="374151"/>
                 <w:sz w:val="17"/>
               </w:rPr>
+              <w:t>BPH – thị trường còn ít cạnh tranh</w:t>
+            </w:r>
+          </w:p>
+        </w:tc>
+      </w:tr>
+      <w:tr>
+        <w:tc>
+          <w:tcPr>
+            <w:tcW w:type="dxa" w:w="1701"/>
+          </w:tcPr>
+          <w:p>
+            <w:pPr>
+              <w:spacing w:before="60" w:after="60"/>
+              <w:ind w:left="85"/>
+            </w:pPr>
+            <w:r>
+              <w:rPr>
+                <w:rFonts w:ascii="Calibri" w:hAnsi="Calibri"/>
+                <w:b/>
+                <w:i w:val="0"/>
+                <w:color w:val="003B71"/>
+                <w:sz w:val="17"/>
+              </w:rPr>
+              <w:t>PECHAUNOX 4/10</w:t>
+            </w:r>
+          </w:p>
+        </w:tc>
+        <w:tc>
+          <w:tcPr>
+            <w:tcW w:type="dxa" w:w="2381"/>
+          </w:tcPr>
+          <w:p>
+            <w:pPr>
+              <w:spacing w:before="60" w:after="60"/>
+              <w:ind w:left="85"/>
+            </w:pPr>
+            <w:r>
+              <w:rPr>
+                <w:rFonts w:ascii="Calibri" w:hAnsi="Calibri"/>
+                <w:b w:val="0"/>
+                <w:i w:val="0"/>
+                <w:color w:val="374151"/>
+                <w:sz w:val="17"/>
+              </w:rPr>
+              <w:t>Perindopril + Amlodipin</w:t>
+            </w:r>
+          </w:p>
+        </w:tc>
+        <w:tc>
+          <w:tcPr>
+            <w:tcW w:type="dxa" w:w="1134"/>
+          </w:tcPr>
+          <w:p>
+            <w:pPr>
+              <w:spacing w:before="60" w:after="60"/>
+              <w:ind w:left="85"/>
+            </w:pPr>
+            <w:r>
+              <w:rPr>
+                <w:rFonts w:ascii="Calibri" w:hAnsi="Calibri"/>
+                <w:b w:val="0"/>
+                <w:i w:val="0"/>
+                <w:color w:val="374151"/>
+                <w:sz w:val="17"/>
+              </w:rPr>
+              <w:t>182,070 VND /hộp</w:t>
+            </w:r>
+          </w:p>
+        </w:tc>
+        <w:tc>
+          <w:tcPr>
+            <w:tcW w:type="dxa" w:w="1247"/>
+            <w:shd w:val="clear" w:color="auto" w:fill="EFF6FF"/>
+          </w:tcPr>
+          <w:p>
+            <w:pPr>
+              <w:spacing w:before="60" w:after="60"/>
+              <w:ind w:left="85"/>
+            </w:pPr>
+            <w:r>
+              <w:rPr>
+                <w:rFonts w:ascii="Calibri" w:hAnsi="Calibri"/>
+                <w:b/>
+                <w:i w:val="0"/>
+                <w:color w:val="0056D2"/>
+                <w:sz w:val="17"/>
+              </w:rPr>
+              <w:t>Ổn định</w:t>
+            </w:r>
+          </w:p>
+        </w:tc>
+        <w:tc>
+          <w:tcPr>
+            <w:tcW w:type="dxa" w:w="2608"/>
+          </w:tcPr>
+          <w:p>
+            <w:pPr>
+              <w:spacing w:before="60" w:after="60"/>
+              <w:ind w:left="85"/>
+            </w:pPr>
+            <w:r>
+              <w:rPr>
+                <w:rFonts w:ascii="Calibri" w:hAnsi="Calibri"/>
+                <w:b w:val="0"/>
+                <w:i w:val="0"/>
+                <w:color w:val="374151"/>
+                <w:sz w:val="17"/>
+              </w:rPr>
+              <w:t>Combo cạnh tranh – theo dõi generic Amlodipine</w:t>
+            </w:r>
+          </w:p>
+        </w:tc>
+      </w:tr>
+      <w:tr>
+        <w:tc>
+          <w:tcPr>
+            <w:tcW w:type="dxa" w:w="1701"/>
+          </w:tcPr>
+          <w:p>
+            <w:pPr>
+              <w:spacing w:before="60" w:after="60"/>
+              <w:ind w:left="85"/>
+            </w:pPr>
+            <w:r>
+              <w:rPr>
+                <w:rFonts w:ascii="Calibri" w:hAnsi="Calibri"/>
+                <w:b/>
+                <w:i w:val="0"/>
+                <w:color w:val="003B71"/>
+                <w:sz w:val="17"/>
+              </w:rPr>
+              <w:t>RAVASTEL-20</w:t>
+            </w:r>
+          </w:p>
+        </w:tc>
+        <w:tc>
+          <w:tcPr>
+            <w:tcW w:type="dxa" w:w="2381"/>
+          </w:tcPr>
+          <w:p>
+            <w:pPr>
+              <w:spacing w:before="60" w:after="60"/>
+              <w:ind w:left="85"/>
+            </w:pPr>
+            <w:r>
+              <w:rPr>
+                <w:rFonts w:ascii="Calibri" w:hAnsi="Calibri"/>
+                <w:b w:val="0"/>
+                <w:i w:val="0"/>
+                <w:color w:val="374151"/>
+                <w:sz w:val="17"/>
+              </w:rPr>
+              <w:t>Rosuvastatin 20mg</w:t>
+            </w:r>
+          </w:p>
+        </w:tc>
+        <w:tc>
+          <w:tcPr>
+            <w:tcW w:type="dxa" w:w="1134"/>
+          </w:tcPr>
+          <w:p>
+            <w:pPr>
+              <w:spacing w:before="60" w:after="60"/>
+              <w:ind w:left="85"/>
+            </w:pPr>
+            <w:r>
+              <w:rPr>
+                <w:rFonts w:ascii="Calibri" w:hAnsi="Calibri"/>
+                <w:b w:val="0"/>
+                <w:i w:val="0"/>
+                <w:color w:val="374151"/>
+                <w:sz w:val="17"/>
+              </w:rPr>
+              <w:t>47,250 VND /hộp</w:t>
+            </w:r>
+          </w:p>
+        </w:tc>
+        <w:tc>
+          <w:tcPr>
+            <w:tcW w:type="dxa" w:w="1247"/>
+            <w:shd w:val="clear" w:color="auto" w:fill="FFF7ED"/>
+          </w:tcPr>
+          <w:p>
+            <w:pPr>
+              <w:spacing w:before="60" w:after="60"/>
+              <w:ind w:left="85"/>
+            </w:pPr>
+            <w:r>
+              <w:rPr>
+                <w:rFonts w:ascii="Calibri" w:hAnsi="Calibri"/>
+                <w:b/>
+                <w:i w:val="0"/>
+                <w:color w:val="D97706"/>
+                <w:sz w:val="17"/>
+              </w:rPr>
+              <w:t>Cạnh tranh</w:t>
+            </w:r>
+          </w:p>
+        </w:tc>
+        <w:tc>
+          <w:tcPr>
+            <w:tcW w:type="dxa" w:w="2608"/>
+          </w:tcPr>
+          <w:p>
+            <w:pPr>
+              <w:spacing w:before="60" w:after="60"/>
+              <w:ind w:left="85"/>
+            </w:pPr>
+            <w:r>
+              <w:rPr>
+                <w:rFonts w:ascii="Calibri" w:hAnsi="Calibri"/>
+                <w:b w:val="0"/>
+                <w:i w:val="0"/>
+                <w:color w:val="374151"/>
+                <w:sz w:val="17"/>
+              </w:rPr>
+              <w:t>Statin – cạnh tranh cao với Atorvastatin generic</w:t>
+            </w:r>
+          </w:p>
+        </w:tc>
+      </w:tr>
+      <w:tr>
+        <w:tc>
+          <w:tcPr>
+            <w:tcW w:type="dxa" w:w="1701"/>
+          </w:tcPr>
+          <w:p>
+            <w:pPr>
+              <w:spacing w:before="60" w:after="60"/>
+              <w:ind w:left="85"/>
+            </w:pPr>
+            <w:r>
+              <w:rPr>
+                <w:rFonts w:ascii="Calibri" w:hAnsi="Calibri"/>
+                <w:b/>
+                <w:i w:val="0"/>
+                <w:color w:val="003B71"/>
+                <w:sz w:val="17"/>
+              </w:rPr>
+              <w:t>TABAREX-160</w:t>
+            </w:r>
+          </w:p>
+        </w:tc>
+        <w:tc>
+          <w:tcPr>
+            <w:tcW w:type="dxa" w:w="2381"/>
+          </w:tcPr>
+          <w:p>
+            <w:pPr>
+              <w:spacing w:before="60" w:after="60"/>
+              <w:ind w:left="85"/>
+            </w:pPr>
+            <w:r>
+              <w:rPr>
+                <w:rFonts w:ascii="Calibri" w:hAnsi="Calibri"/>
+                <w:b w:val="0"/>
+                <w:i w:val="0"/>
+                <w:color w:val="374151"/>
+                <w:sz w:val="17"/>
+              </w:rPr>
+              <w:t>Valsartan 160mg</w:t>
+            </w:r>
+          </w:p>
+        </w:tc>
+        <w:tc>
+          <w:tcPr>
+            <w:tcW w:type="dxa" w:w="1134"/>
+          </w:tcPr>
+          <w:p>
+            <w:pPr>
+              <w:spacing w:before="60" w:after="60"/>
+              <w:ind w:left="85"/>
+            </w:pPr>
+            <w:r>
+              <w:rPr>
+                <w:rFonts w:ascii="Calibri" w:hAnsi="Calibri"/>
+                <w:b w:val="0"/>
+                <w:i w:val="0"/>
+                <w:color w:val="374151"/>
+                <w:sz w:val="17"/>
+              </w:rPr>
+              <w:t>163,800 VND /hộp</w:t>
+            </w:r>
+          </w:p>
+        </w:tc>
+        <w:tc>
+          <w:tcPr>
+            <w:tcW w:type="dxa" w:w="1247"/>
+            <w:shd w:val="clear" w:color="auto" w:fill="EFF6FF"/>
+          </w:tcPr>
+          <w:p>
+            <w:pPr>
+              <w:spacing w:before="60" w:after="60"/>
+              <w:ind w:left="85"/>
+            </w:pPr>
+            <w:r>
+              <w:rPr>
+                <w:rFonts w:ascii="Calibri" w:hAnsi="Calibri"/>
+                <w:b/>
+                <w:i w:val="0"/>
+                <w:color w:val="0056D2"/>
+                <w:sz w:val="17"/>
+              </w:rPr>
+              <w:t>Ổn định</w:t>
+            </w:r>
+          </w:p>
+        </w:tc>
+        <w:tc>
+          <w:tcPr>
+            <w:tcW w:type="dxa" w:w="2608"/>
+          </w:tcPr>
+          <w:p>
+            <w:pPr>
+              <w:spacing w:before="60" w:after="60"/>
+              <w:ind w:left="85"/>
+            </w:pPr>
+            <w:r>
+              <w:rPr>
+                <w:rFonts w:ascii="Calibri" w:hAnsi="Calibri"/>
+                <w:b w:val="0"/>
+                <w:i w:val="0"/>
+                <w:color w:val="374151"/>
+                <w:sz w:val="17"/>
+              </w:rPr>
+              <w:t>Duy trì kênh OTC &amp; ETC tuyến tỉnh</w:t>
+            </w:r>
+          </w:p>
+        </w:tc>
+      </w:tr>
+      <w:tr>
+        <w:tc>
+          <w:tcPr>
+            <w:tcW w:type="dxa" w:w="1701"/>
+          </w:tcPr>
+          <w:p>
+            <w:pPr>
+              <w:spacing w:before="60" w:after="60"/>
+              <w:ind w:left="85"/>
+            </w:pPr>
+            <w:r>
+              <w:rPr>
+                <w:rFonts w:ascii="Calibri" w:hAnsi="Calibri"/>
+                <w:b/>
+                <w:i w:val="0"/>
+                <w:color w:val="003B71"/>
+                <w:sz w:val="17"/>
+              </w:rPr>
+              <w:t>HATLOP-150</w:t>
+            </w:r>
+          </w:p>
+        </w:tc>
+        <w:tc>
+          <w:tcPr>
+            <w:tcW w:type="dxa" w:w="2381"/>
+          </w:tcPr>
+          <w:p>
+            <w:pPr>
+              <w:spacing w:before="60" w:after="60"/>
+              <w:ind w:left="85"/>
+            </w:pPr>
+            <w:r>
+              <w:rPr>
+                <w:rFonts w:ascii="Calibri" w:hAnsi="Calibri"/>
+                <w:b w:val="0"/>
+                <w:i w:val="0"/>
+                <w:color w:val="374151"/>
+                <w:sz w:val="17"/>
+              </w:rPr>
+              <w:t>Irbesartan 150mg</w:t>
+            </w:r>
+          </w:p>
+        </w:tc>
+        <w:tc>
+          <w:tcPr>
+            <w:tcW w:type="dxa" w:w="1134"/>
+          </w:tcPr>
+          <w:p>
+            <w:pPr>
+              <w:spacing w:before="60" w:after="60"/>
+              <w:ind w:left="85"/>
+            </w:pPr>
+            <w:r>
+              <w:rPr>
+                <w:rFonts w:ascii="Calibri" w:hAnsi="Calibri"/>
+                <w:b w:val="0"/>
+                <w:i w:val="0"/>
+                <w:color w:val="374151"/>
+                <w:sz w:val="17"/>
+              </w:rPr>
+              <w:t>210,000 VND /hộp</w:t>
+            </w:r>
+          </w:p>
+        </w:tc>
+        <w:tc>
+          <w:tcPr>
+            <w:tcW w:type="dxa" w:w="1247"/>
+            <w:shd w:val="clear" w:color="auto" w:fill="EFF6FF"/>
+          </w:tcPr>
+          <w:p>
+            <w:pPr>
+              <w:spacing w:before="60" w:after="60"/>
+              <w:ind w:left="85"/>
+            </w:pPr>
+            <w:r>
+              <w:rPr>
+                <w:rFonts w:ascii="Calibri" w:hAnsi="Calibri"/>
+                <w:b/>
+                <w:i w:val="0"/>
+                <w:color w:val="0056D2"/>
+                <w:sz w:val="17"/>
+              </w:rPr>
+              <w:t>Ổn định</w:t>
+            </w:r>
+          </w:p>
+        </w:tc>
+        <w:tc>
+          <w:tcPr>
+            <w:tcW w:type="dxa" w:w="2608"/>
+          </w:tcPr>
+          <w:p>
+            <w:pPr>
+              <w:spacing w:before="60" w:after="60"/>
+              <w:ind w:left="85"/>
+            </w:pPr>
+            <w:r>
+              <w:rPr>
+                <w:rFonts w:ascii="Calibri" w:hAnsi="Calibri"/>
+                <w:b w:val="0"/>
+                <w:i w:val="0"/>
+                <w:color w:val="374151"/>
+                <w:sz w:val="17"/>
+              </w:rPr>
+              <w:t>Duy trì thầu bệnh viện tuyến tỉnh</w:t>
+            </w:r>
+          </w:p>
+        </w:tc>
+      </w:tr>
+      <w:tr>
+        <w:tc>
+          <w:tcPr>
+            <w:tcW w:type="dxa" w:w="1701"/>
+          </w:tcPr>
+          <w:p>
+            <w:pPr>
+              <w:spacing w:before="60" w:after="60"/>
+              <w:ind w:left="85"/>
+            </w:pPr>
+            <w:r>
+              <w:rPr>
+                <w:rFonts w:ascii="Calibri" w:hAnsi="Calibri"/>
+                <w:b/>
+                <w:i w:val="0"/>
+                <w:color w:val="003B71"/>
+                <w:sz w:val="17"/>
+              </w:rPr>
+              <w:t>ZABALES</w:t>
+            </w:r>
+          </w:p>
+        </w:tc>
+        <w:tc>
+          <w:tcPr>
+            <w:tcW w:type="dxa" w:w="2381"/>
+          </w:tcPr>
+          <w:p>
+            <w:pPr>
+              <w:spacing w:before="60" w:after="60"/>
+              <w:ind w:left="85"/>
+            </w:pPr>
+            <w:r>
+              <w:rPr>
+                <w:rFonts w:ascii="Calibri" w:hAnsi="Calibri"/>
+                <w:b w:val="0"/>
+                <w:i w:val="0"/>
+                <w:color w:val="374151"/>
+                <w:sz w:val="17"/>
+              </w:rPr>
+              <w:t>Clopidogrel 75mg</w:t>
+            </w:r>
+          </w:p>
+        </w:tc>
+        <w:tc>
+          <w:tcPr>
+            <w:tcW w:type="dxa" w:w="1134"/>
+          </w:tcPr>
+          <w:p>
+            <w:pPr>
+              <w:spacing w:before="60" w:after="60"/>
+              <w:ind w:left="85"/>
+            </w:pPr>
+            <w:r>
+              <w:rPr>
+                <w:rFonts w:ascii="Calibri" w:hAnsi="Calibri"/>
+                <w:b w:val="0"/>
+                <w:i w:val="0"/>
+                <w:color w:val="374151"/>
+                <w:sz w:val="17"/>
+              </w:rPr>
+              <w:t>31,920 VND /hộp</w:t>
+            </w:r>
+          </w:p>
+        </w:tc>
+        <w:tc>
+          <w:tcPr>
+            <w:tcW w:type="dxa" w:w="1247"/>
+            <w:shd w:val="clear" w:color="auto" w:fill="FFF7ED"/>
+          </w:tcPr>
+          <w:p>
+            <w:pPr>
+              <w:spacing w:before="60" w:after="60"/>
+              <w:ind w:left="85"/>
+            </w:pPr>
+            <w:r>
+              <w:rPr>
+                <w:rFonts w:ascii="Calibri" w:hAnsi="Calibri"/>
+                <w:b/>
+                <w:i w:val="0"/>
+                <w:color w:val="D97706"/>
+                <w:sz w:val="17"/>
+              </w:rPr>
+              <w:t>Cạnh tranh</w:t>
+            </w:r>
+          </w:p>
+        </w:tc>
+        <w:tc>
+          <w:tcPr>
+            <w:tcW w:type="dxa" w:w="2608"/>
+          </w:tcPr>
+          <w:p>
+            <w:pPr>
+              <w:spacing w:before="60" w:after="60"/>
+              <w:ind w:left="85"/>
+            </w:pPr>
+            <w:r>
+              <w:rPr>
+                <w:rFonts w:ascii="Calibri" w:hAnsi="Calibri"/>
+                <w:b w:val="0"/>
+                <w:i w:val="0"/>
+                <w:color w:val="374151"/>
+                <w:sz w:val="17"/>
+              </w:rPr>
+              <w:t>Cạnh tranh cao – cần bảo vệ giá thầu</w:t>
+            </w:r>
+          </w:p>
+        </w:tc>
+      </w:tr>
+      <w:tr>
+        <w:tc>
+          <w:tcPr>
+            <w:tcW w:type="dxa" w:w="1701"/>
+          </w:tcPr>
+          <w:p>
+            <w:pPr>
+              <w:spacing w:before="60" w:after="60"/>
+              <w:ind w:left="85"/>
+            </w:pPr>
+            <w:r>
+              <w:rPr>
+                <w:rFonts w:ascii="Calibri" w:hAnsi="Calibri"/>
+                <w:b/>
+                <w:i w:val="0"/>
+                <w:color w:val="003B71"/>
+                <w:sz w:val="17"/>
+              </w:rPr>
+              <w:t>MAGRAX</w:t>
+            </w:r>
+          </w:p>
+        </w:tc>
+        <w:tc>
+          <w:tcPr>
+            <w:tcW w:type="dxa" w:w="2381"/>
+          </w:tcPr>
+          <w:p>
+            <w:pPr>
+              <w:spacing w:before="60" w:after="60"/>
+              <w:ind w:left="85"/>
+            </w:pPr>
+            <w:r>
+              <w:rPr>
+                <w:rFonts w:ascii="Calibri" w:hAnsi="Calibri"/>
+                <w:b w:val="0"/>
+                <w:i w:val="0"/>
+                <w:color w:val="374151"/>
+                <w:sz w:val="17"/>
+              </w:rPr>
+              <w:t>Etoricoxib 90mg</w:t>
+            </w:r>
+          </w:p>
+        </w:tc>
+        <w:tc>
+          <w:tcPr>
+            <w:tcW w:type="dxa" w:w="1134"/>
+          </w:tcPr>
+          <w:p>
+            <w:pPr>
+              <w:spacing w:before="60" w:after="60"/>
+              <w:ind w:left="85"/>
+            </w:pPr>
+            <w:r>
+              <w:rPr>
+                <w:rFonts w:ascii="Calibri" w:hAnsi="Calibri"/>
+                <w:b w:val="0"/>
+                <w:i w:val="0"/>
+                <w:color w:val="374151"/>
+                <w:sz w:val="17"/>
+              </w:rPr>
+              <w:t>215,000 VND /hộp</w:t>
+            </w:r>
+          </w:p>
+        </w:tc>
+        <w:tc>
+          <w:tcPr>
+            <w:tcW w:type="dxa" w:w="1247"/>
+            <w:shd w:val="clear" w:color="auto" w:fill="EFF6FF"/>
+          </w:tcPr>
+          <w:p>
+            <w:pPr>
+              <w:spacing w:before="60" w:after="60"/>
+              <w:ind w:left="85"/>
+            </w:pPr>
+            <w:r>
+              <w:rPr>
+                <w:rFonts w:ascii="Calibri" w:hAnsi="Calibri"/>
+                <w:b/>
+                <w:i w:val="0"/>
+                <w:color w:val="0056D2"/>
+                <w:sz w:val="17"/>
+              </w:rPr>
+              <w:t>Ổn định</w:t>
+            </w:r>
+          </w:p>
+        </w:tc>
+        <w:tc>
+          <w:tcPr>
+            <w:tcW w:type="dxa" w:w="2608"/>
+          </w:tcPr>
+          <w:p>
+            <w:pPr>
+              <w:spacing w:before="60" w:after="60"/>
+              <w:ind w:left="85"/>
+            </w:pPr>
+            <w:r>
+              <w:rPr>
+                <w:rFonts w:ascii="Calibri" w:hAnsi="Calibri"/>
+                <w:b w:val="0"/>
+                <w:i w:val="0"/>
+                <w:color w:val="374151"/>
+                <w:sz w:val="17"/>
+              </w:rPr>
+              <w:t>COX-2 – theo dõi xu hướng điều trị Gout</w:t>
+            </w:r>
+          </w:p>
+        </w:tc>
+      </w:tr>
+      <w:tr>
+        <w:tc>
+          <w:tcPr>
+            <w:tcW w:type="dxa" w:w="1701"/>
+          </w:tcPr>
+          <w:p>
+            <w:pPr>
+              <w:spacing w:before="60" w:after="60"/>
+              <w:ind w:left="85"/>
+            </w:pPr>
+            <w:r>
+              <w:rPr>
+                <w:rFonts w:ascii="Calibri" w:hAnsi="Calibri"/>
+                <w:b/>
+                <w:i w:val="0"/>
+                <w:color w:val="003B71"/>
+                <w:sz w:val="17"/>
+              </w:rPr>
+              <w:t>ZENTOGOUT-40</w:t>
+            </w:r>
+          </w:p>
+        </w:tc>
+        <w:tc>
+          <w:tcPr>
+            <w:tcW w:type="dxa" w:w="2381"/>
+          </w:tcPr>
+          <w:p>
+            <w:pPr>
+              <w:spacing w:before="60" w:after="60"/>
+              <w:ind w:left="85"/>
+            </w:pPr>
+            <w:r>
+              <w:rPr>
+                <w:rFonts w:ascii="Calibri" w:hAnsi="Calibri"/>
+                <w:b w:val="0"/>
+                <w:i w:val="0"/>
+                <w:color w:val="374151"/>
+                <w:sz w:val="17"/>
+              </w:rPr>
+              <w:t>Febuxostat 40mg</w:t>
+            </w:r>
+          </w:p>
+        </w:tc>
+        <w:tc>
+          <w:tcPr>
+            <w:tcW w:type="dxa" w:w="1134"/>
+          </w:tcPr>
+          <w:p>
+            <w:pPr>
+              <w:spacing w:before="60" w:after="60"/>
+              <w:ind w:left="85"/>
+            </w:pPr>
+            <w:r>
+              <w:rPr>
+                <w:rFonts w:ascii="Calibri" w:hAnsi="Calibri"/>
+                <w:b w:val="0"/>
+                <w:i w:val="0"/>
+                <w:color w:val="374151"/>
+                <w:sz w:val="17"/>
+              </w:rPr>
+              <w:t>240,000 VND /hộp</w:t>
+            </w:r>
+          </w:p>
+        </w:tc>
+        <w:tc>
+          <w:tcPr>
+            <w:tcW w:type="dxa" w:w="1247"/>
+            <w:shd w:val="clear" w:color="auto" w:fill="EFF6FF"/>
+          </w:tcPr>
+          <w:p>
+            <w:pPr>
+              <w:spacing w:before="60" w:after="60"/>
+              <w:ind w:left="85"/>
+            </w:pPr>
+            <w:r>
+              <w:rPr>
+                <w:rFonts w:ascii="Calibri" w:hAnsi="Calibri"/>
+                <w:b/>
+                <w:i w:val="0"/>
+                <w:color w:val="0056D2"/>
+                <w:sz w:val="17"/>
+              </w:rPr>
+              <w:t>Cơ hội</w:t>
+            </w:r>
+          </w:p>
+        </w:tc>
+        <w:tc>
+          <w:tcPr>
+            <w:tcW w:type="dxa" w:w="2608"/>
+          </w:tcPr>
+          <w:p>
+            <w:pPr>
+              <w:spacing w:before="60" w:after="60"/>
+              <w:ind w:left="85"/>
+            </w:pPr>
+            <w:r>
+              <w:rPr>
+                <w:rFonts w:ascii="Calibri" w:hAnsi="Calibri"/>
+                <w:b w:val="0"/>
+                <w:i w:val="0"/>
+                <w:color w:val="374151"/>
+                <w:sz w:val="17"/>
+              </w:rPr>
+              <w:t>Thay thế Allopurinol – đang tăng trưởng</w:t>
+            </w:r>
+          </w:p>
+        </w:tc>
+      </w:tr>
+      <w:tr>
+        <w:tc>
+          <w:tcPr>
+            <w:tcW w:type="dxa" w:w="1701"/>
+          </w:tcPr>
+          <w:p>
+            <w:pPr>
+              <w:spacing w:before="60" w:after="60"/>
+              <w:ind w:left="85"/>
+            </w:pPr>
+            <w:r>
+              <w:rPr>
+                <w:rFonts w:ascii="Calibri" w:hAnsi="Calibri"/>
+                <w:b/>
+                <w:i w:val="0"/>
+                <w:color w:val="003B71"/>
+                <w:sz w:val="17"/>
+              </w:rPr>
+              <w:t>JIRACEK</w:t>
+            </w:r>
+          </w:p>
+        </w:tc>
+        <w:tc>
+          <w:tcPr>
+            <w:tcW w:type="dxa" w:w="2381"/>
+          </w:tcPr>
+          <w:p>
+            <w:pPr>
+              <w:spacing w:before="60" w:after="60"/>
+              <w:ind w:left="85"/>
+            </w:pPr>
+            <w:r>
+              <w:rPr>
+                <w:rFonts w:ascii="Calibri" w:hAnsi="Calibri"/>
+                <w:b w:val="0"/>
+                <w:i w:val="0"/>
+                <w:color w:val="374151"/>
+                <w:sz w:val="17"/>
+              </w:rPr>
+              <w:t>Esomeprazole 40mg</w:t>
+            </w:r>
+          </w:p>
+        </w:tc>
+        <w:tc>
+          <w:tcPr>
+            <w:tcW w:type="dxa" w:w="1134"/>
+          </w:tcPr>
+          <w:p>
+            <w:pPr>
+              <w:spacing w:before="60" w:after="60"/>
+              <w:ind w:left="85"/>
+            </w:pPr>
+            <w:r>
+              <w:rPr>
+                <w:rFonts w:ascii="Calibri" w:hAnsi="Calibri"/>
+                <w:b w:val="0"/>
+                <w:i w:val="0"/>
+                <w:color w:val="374151"/>
+                <w:sz w:val="17"/>
+              </w:rPr>
+              <w:t>89,600 VND /hộp</w:t>
+            </w:r>
+          </w:p>
+        </w:tc>
+        <w:tc>
+          <w:tcPr>
+            <w:tcW w:type="dxa" w:w="1247"/>
+            <w:shd w:val="clear" w:color="auto" w:fill="FFF7ED"/>
+          </w:tcPr>
+          <w:p>
+            <w:pPr>
+              <w:spacing w:before="60" w:after="60"/>
+              <w:ind w:left="85"/>
+            </w:pPr>
+            <w:r>
+              <w:rPr>
+                <w:rFonts w:ascii="Calibri" w:hAnsi="Calibri"/>
+                <w:b/>
+                <w:i w:val="0"/>
+                <w:color w:val="D97706"/>
+                <w:sz w:val="17"/>
+              </w:rPr>
+              <w:t>Cạnh tranh</w:t>
+            </w:r>
+          </w:p>
+        </w:tc>
+        <w:tc>
+          <w:tcPr>
+            <w:tcW w:type="dxa" w:w="2608"/>
+          </w:tcPr>
+          <w:p>
+            <w:pPr>
+              <w:spacing w:before="60" w:after="60"/>
+              <w:ind w:left="85"/>
+            </w:pPr>
+            <w:r>
+              <w:rPr>
+                <w:rFonts w:ascii="Calibri" w:hAnsi="Calibri"/>
+                <w:b w:val="0"/>
+                <w:i w:val="0"/>
+                <w:color w:val="374151"/>
+                <w:sz w:val="17"/>
+              </w:rPr>
+              <w:t>PPI – thị trường cạnh tranh, bảo vệ ETC</w:t>
+            </w:r>
+          </w:p>
+        </w:tc>
+      </w:tr>
+      <w:tr>
+        <w:tc>
+          <w:tcPr>
+            <w:tcW w:type="dxa" w:w="1701"/>
+          </w:tcPr>
+          <w:p>
+            <w:pPr>
+              <w:spacing w:before="60" w:after="60"/>
+              <w:ind w:left="85"/>
+            </w:pPr>
+            <w:r>
+              <w:rPr>
+                <w:rFonts w:ascii="Calibri" w:hAnsi="Calibri"/>
+                <w:b/>
+                <w:i w:val="0"/>
+                <w:color w:val="003B71"/>
+                <w:sz w:val="17"/>
+              </w:rPr>
+              <w:t>SERNAL-4</w:t>
+            </w:r>
+          </w:p>
+        </w:tc>
+        <w:tc>
+          <w:tcPr>
+            <w:tcW w:type="dxa" w:w="2381"/>
+          </w:tcPr>
+          <w:p>
+            <w:pPr>
+              <w:spacing w:before="60" w:after="60"/>
+              <w:ind w:left="85"/>
+            </w:pPr>
+            <w:r>
+              <w:rPr>
+                <w:rFonts w:ascii="Calibri" w:hAnsi="Calibri"/>
+                <w:b w:val="0"/>
+                <w:i w:val="0"/>
+                <w:color w:val="374151"/>
+                <w:sz w:val="17"/>
+              </w:rPr>
+              <w:t>Risperidone 4mg</w:t>
+            </w:r>
+          </w:p>
+        </w:tc>
+        <w:tc>
+          <w:tcPr>
+            <w:tcW w:type="dxa" w:w="1134"/>
+          </w:tcPr>
+          <w:p>
+            <w:pPr>
+              <w:spacing w:before="60" w:after="60"/>
+              <w:ind w:left="85"/>
+            </w:pPr>
+            <w:r>
+              <w:rPr>
+                <w:rFonts w:ascii="Calibri" w:hAnsi="Calibri"/>
+                <w:b w:val="0"/>
+                <w:i w:val="0"/>
+                <w:color w:val="374151"/>
+                <w:sz w:val="17"/>
+              </w:rPr>
+              <w:t>315,000 VND /hộp</w:t>
+            </w:r>
+          </w:p>
+        </w:tc>
+        <w:tc>
+          <w:tcPr>
+            <w:tcW w:type="dxa" w:w="1247"/>
+            <w:shd w:val="clear" w:color="auto" w:fill="EFF6FF"/>
+          </w:tcPr>
+          <w:p>
+            <w:pPr>
+              <w:spacing w:before="60" w:after="60"/>
+              <w:ind w:left="85"/>
+            </w:pPr>
+            <w:r>
+              <w:rPr>
+                <w:rFonts w:ascii="Calibri" w:hAnsi="Calibri"/>
+                <w:b/>
+                <w:i w:val="0"/>
+                <w:color w:val="0056D2"/>
+                <w:sz w:val="17"/>
+              </w:rPr>
+              <w:t>Ổn định</w:t>
+            </w:r>
+          </w:p>
+        </w:tc>
+        <w:tc>
+          <w:tcPr>
+            <w:tcW w:type="dxa" w:w="2608"/>
+          </w:tcPr>
+          <w:p>
+            <w:pPr>
+              <w:spacing w:before="60" w:after="60"/>
+              <w:ind w:left="85"/>
+            </w:pPr>
+            <w:r>
+              <w:rPr>
+                <w:rFonts w:ascii="Calibri" w:hAnsi="Calibri"/>
+                <w:b w:val="0"/>
+                <w:i w:val="0"/>
+                <w:color w:val="374151"/>
+                <w:sz w:val="17"/>
+              </w:rPr>
+              <w:t>Duy trì kênh ETC bệnh viện chuyên khoa</w:t>
+            </w:r>
+          </w:p>
+        </w:tc>
+      </w:tr>
+      <w:tr>
+        <w:tc>
+          <w:tcPr>
+            <w:tcW w:type="dxa" w:w="1701"/>
+          </w:tcPr>
+          <w:p>
+            <w:pPr>
+              <w:spacing w:before="60" w:after="60"/>
+              <w:ind w:left="85"/>
+            </w:pPr>
+            <w:r>
+              <w:rPr>
+                <w:rFonts w:ascii="Calibri" w:hAnsi="Calibri"/>
+                <w:b/>
+                <w:i w:val="0"/>
+                <w:color w:val="003B71"/>
+                <w:sz w:val="17"/>
+              </w:rPr>
+              <w:t>LAFAXOR</w:t>
+            </w:r>
+          </w:p>
+        </w:tc>
+        <w:tc>
+          <w:tcPr>
+            <w:tcW w:type="dxa" w:w="2381"/>
+          </w:tcPr>
+          <w:p>
+            <w:pPr>
+              <w:spacing w:before="60" w:after="60"/>
+              <w:ind w:left="85"/>
+            </w:pPr>
+            <w:r>
+              <w:rPr>
+                <w:rFonts w:ascii="Calibri" w:hAnsi="Calibri"/>
+                <w:b w:val="0"/>
+                <w:i w:val="0"/>
+                <w:color w:val="374151"/>
+                <w:sz w:val="17"/>
+              </w:rPr>
+              <w:t>Venlafaxine</w:t>
+            </w:r>
+          </w:p>
+        </w:tc>
+        <w:tc>
+          <w:tcPr>
+            <w:tcW w:type="dxa" w:w="1134"/>
+          </w:tcPr>
+          <w:p>
+            <w:pPr>
+              <w:spacing w:before="60" w:after="60"/>
+              <w:ind w:left="85"/>
+            </w:pPr>
+            <w:r>
+              <w:rPr>
+                <w:rFonts w:ascii="Calibri" w:hAnsi="Calibri"/>
+                <w:b w:val="0"/>
+                <w:i w:val="0"/>
+                <w:color w:val="374151"/>
+                <w:sz w:val="17"/>
+              </w:rPr>
+              <w:t>159,000 VND /hộp</w:t>
+            </w:r>
+          </w:p>
+        </w:tc>
+        <w:tc>
+          <w:tcPr>
+            <w:tcW w:type="dxa" w:w="1247"/>
+            <w:shd w:val="clear" w:color="auto" w:fill="EFF6FF"/>
+          </w:tcPr>
+          <w:p>
+            <w:pPr>
+              <w:spacing w:before="60" w:after="60"/>
+              <w:ind w:left="85"/>
+            </w:pPr>
+            <w:r>
+              <w:rPr>
+                <w:rFonts w:ascii="Calibri" w:hAnsi="Calibri"/>
+                <w:b/>
+                <w:i w:val="0"/>
+                <w:color w:val="0056D2"/>
+                <w:sz w:val="17"/>
+              </w:rPr>
+              <w:t>Ổn định</w:t>
+            </w:r>
+          </w:p>
+        </w:tc>
+        <w:tc>
+          <w:tcPr>
+            <w:tcW w:type="dxa" w:w="2608"/>
+          </w:tcPr>
+          <w:p>
+            <w:pPr>
+              <w:spacing w:before="60" w:after="60"/>
+              <w:ind w:left="85"/>
+            </w:pPr>
+            <w:r>
+              <w:rPr>
+                <w:rFonts w:ascii="Calibri" w:hAnsi="Calibri"/>
+                <w:b w:val="0"/>
+                <w:i w:val="0"/>
+                <w:color w:val="374151"/>
+                <w:sz w:val="17"/>
+              </w:rPr>
+              <w:t>Kênh phòng khám tư nhân – tiềm năng tăng</w:t>
+            </w:r>
+          </w:p>
+        </w:tc>
+      </w:tr>
+      <w:tr>
+        <w:tc>
+          <w:tcPr>
+            <w:tcW w:type="dxa" w:w="1701"/>
+          </w:tcPr>
+          <w:p>
+            <w:pPr>
+              <w:spacing w:before="60" w:after="60"/>
+              <w:ind w:left="85"/>
+            </w:pPr>
+            <w:r>
+              <w:rPr>
+                <w:rFonts w:ascii="Calibri" w:hAnsi="Calibri"/>
+                <w:b/>
+                <w:i w:val="0"/>
+                <w:color w:val="003B71"/>
+                <w:sz w:val="17"/>
+              </w:rPr>
+              <w:t>HYYR</w:t>
+            </w:r>
+          </w:p>
+        </w:tc>
+        <w:tc>
+          <w:tcPr>
+            <w:tcW w:type="dxa" w:w="2381"/>
+          </w:tcPr>
+          <w:p>
+            <w:pPr>
+              <w:spacing w:before="60" w:after="60"/>
+              <w:ind w:left="85"/>
+            </w:pPr>
+            <w:r>
+              <w:rPr>
+                <w:rFonts w:ascii="Calibri" w:hAnsi="Calibri"/>
+                <w:b w:val="0"/>
+                <w:i w:val="0"/>
+                <w:color w:val="374151"/>
+                <w:sz w:val="17"/>
+              </w:rPr>
+              <w:t>Erlotinib</w:t>
+            </w:r>
+          </w:p>
+        </w:tc>
+        <w:tc>
+          <w:tcPr>
+            <w:tcW w:type="dxa" w:w="1134"/>
+          </w:tcPr>
+          <w:p>
+            <w:pPr>
+              <w:spacing w:before="60" w:after="60"/>
+              <w:ind w:left="85"/>
+            </w:pPr>
+            <w:r>
+              <w:rPr>
+                <w:rFonts w:ascii="Calibri" w:hAnsi="Calibri"/>
+                <w:b w:val="0"/>
+                <w:i w:val="0"/>
+                <w:color w:val="374151"/>
+                <w:sz w:val="17"/>
+              </w:rPr>
+              <w:t>1,500,000 VND /hộp</w:t>
+            </w:r>
+          </w:p>
+        </w:tc>
+        <w:tc>
+          <w:tcPr>
+            <w:tcW w:type="dxa" w:w="1247"/>
+            <w:shd w:val="clear" w:color="auto" w:fill="E7F9EE"/>
+          </w:tcPr>
+          <w:p>
+            <w:pPr>
+              <w:spacing w:before="60" w:after="60"/>
+              <w:ind w:left="85"/>
+            </w:pPr>
+            <w:r>
+              <w:rPr>
+                <w:rFonts w:ascii="Calibri" w:hAnsi="Calibri"/>
+                <w:b/>
+                <w:i w:val="0"/>
+                <w:color w:val="166534"/>
+                <w:sz w:val="17"/>
+              </w:rPr>
+              <w:t>Cơ hội cao</w:t>
+            </w:r>
+          </w:p>
+        </w:tc>
+        <w:tc>
+          <w:tcPr>
+            <w:tcW w:type="dxa" w:w="2608"/>
+          </w:tcPr>
+          <w:p>
+            <w:pPr>
+              <w:spacing w:before="60" w:after="60"/>
+              <w:ind w:left="85"/>
+            </w:pPr>
+            <w:r>
+              <w:rPr>
+                <w:rFonts w:ascii="Calibri" w:hAnsi="Calibri"/>
+                <w:b w:val="0"/>
+                <w:i w:val="0"/>
+                <w:color w:val="374151"/>
+                <w:sz w:val="17"/>
+              </w:rPr>
+              <w:t>Thuốc đặc trị – ưu tiên thầu bệnh viện ung bướu</w:t>
+            </w:r>
+          </w:p>
+        </w:tc>
+      </w:tr>
+      <w:tr>
+        <w:tc>
+          <w:tcPr>
+            <w:tcW w:type="dxa" w:w="1701"/>
+          </w:tcPr>
+          <w:p>
+            <w:pPr>
+              <w:spacing w:before="60" w:after="60"/>
+              <w:ind w:left="85"/>
+            </w:pPr>
+            <w:r>
+              <w:rPr>
+                <w:rFonts w:ascii="Calibri" w:hAnsi="Calibri"/>
+                <w:b/>
+                <w:i w:val="0"/>
+                <w:color w:val="003B71"/>
+                <w:sz w:val="17"/>
+              </w:rPr>
+              <w:t>LARRIVEY</w:t>
+            </w:r>
+          </w:p>
+        </w:tc>
+        <w:tc>
+          <w:tcPr>
+            <w:tcW w:type="dxa" w:w="2381"/>
+          </w:tcPr>
+          <w:p>
+            <w:pPr>
+              <w:spacing w:before="60" w:after="60"/>
+              <w:ind w:left="85"/>
+            </w:pPr>
+            <w:r>
+              <w:rPr>
+                <w:rFonts w:ascii="Calibri" w:hAnsi="Calibri"/>
+                <w:b w:val="0"/>
+                <w:i w:val="0"/>
+                <w:color w:val="374151"/>
+                <w:sz w:val="17"/>
+              </w:rPr>
+              <w:t>Bicalutamide</w:t>
+            </w:r>
+          </w:p>
+        </w:tc>
+        <w:tc>
+          <w:tcPr>
+            <w:tcW w:type="dxa" w:w="1134"/>
+          </w:tcPr>
+          <w:p>
+            <w:pPr>
+              <w:spacing w:before="60" w:after="60"/>
+              <w:ind w:left="85"/>
+            </w:pPr>
+            <w:r>
+              <w:rPr>
+                <w:rFonts w:ascii="Calibri" w:hAnsi="Calibri"/>
+                <w:b w:val="0"/>
+                <w:i w:val="0"/>
+                <w:color w:val="374151"/>
+                <w:sz w:val="17"/>
+              </w:rPr>
+              <w:t>823,200 VND /hộp</w:t>
+            </w:r>
+          </w:p>
+        </w:tc>
+        <w:tc>
+          <w:tcPr>
+            <w:tcW w:type="dxa" w:w="1247"/>
+            <w:shd w:val="clear" w:color="auto" w:fill="EFF6FF"/>
+          </w:tcPr>
+          <w:p>
+            <w:pPr>
+              <w:spacing w:before="60" w:after="60"/>
+              <w:ind w:left="85"/>
+            </w:pPr>
+            <w:r>
+              <w:rPr>
+                <w:rFonts w:ascii="Calibri" w:hAnsi="Calibri"/>
+                <w:b/>
+                <w:i w:val="0"/>
+                <w:color w:val="0056D2"/>
+                <w:sz w:val="17"/>
+              </w:rPr>
+              <w:t>Ổn định</w:t>
+            </w:r>
+          </w:p>
+        </w:tc>
+        <w:tc>
+          <w:tcPr>
+            <w:tcW w:type="dxa" w:w="2608"/>
+          </w:tcPr>
+          <w:p>
+            <w:pPr>
+              <w:spacing w:before="60" w:after="60"/>
+              <w:ind w:left="85"/>
+            </w:pPr>
+            <w:r>
+              <w:rPr>
+                <w:rFonts w:ascii="Calibri" w:hAnsi="Calibri"/>
+                <w:b w:val="0"/>
+                <w:i w:val="0"/>
+                <w:color w:val="374151"/>
+                <w:sz w:val="17"/>
+              </w:rPr>
+              <w:t>Theo dõi phác đồ bệnh viện – biên lợi nhuận cao</w:t>
+            </w:r>
+          </w:p>
+        </w:tc>
+      </w:tr>
+      <w:tr>
+        <w:tc>
+          <w:tcPr>
+            <w:tcW w:type="dxa" w:w="1701"/>
+          </w:tcPr>
+          <w:p>
+            <w:pPr>
+              <w:spacing w:before="60" w:after="60"/>
+              <w:ind w:left="85"/>
+            </w:pPr>
+            <w:r>
+              <w:rPr>
+                <w:rFonts w:ascii="Calibri" w:hAnsi="Calibri"/>
+                <w:b/>
+                <w:i w:val="0"/>
+                <w:color w:val="003B71"/>
+                <w:sz w:val="17"/>
+              </w:rPr>
+              <w:t>METILONE-4</w:t>
+            </w:r>
+          </w:p>
+        </w:tc>
+        <w:tc>
+          <w:tcPr>
+            <w:tcW w:type="dxa" w:w="2381"/>
+          </w:tcPr>
+          <w:p>
+            <w:pPr>
+              <w:spacing w:before="60" w:after="60"/>
+              <w:ind w:left="85"/>
+            </w:pPr>
+            <w:r>
+              <w:rPr>
+                <w:rFonts w:ascii="Calibri" w:hAnsi="Calibri"/>
+                <w:b w:val="0"/>
+                <w:i w:val="0"/>
+                <w:color w:val="374151"/>
+                <w:sz w:val="17"/>
+              </w:rPr>
+              <w:t>Methylprednisolone 4mg</w:t>
+            </w:r>
+          </w:p>
+        </w:tc>
+        <w:tc>
+          <w:tcPr>
+            <w:tcW w:type="dxa" w:w="1134"/>
+          </w:tcPr>
+          <w:p>
+            <w:pPr>
+              <w:spacing w:before="60" w:after="60"/>
+              <w:ind w:left="85"/>
+            </w:pPr>
+            <w:r>
+              <w:rPr>
+                <w:rFonts w:ascii="Calibri" w:hAnsi="Calibri"/>
+                <w:b w:val="0"/>
+                <w:i w:val="0"/>
+                <w:color w:val="374151"/>
+                <w:sz w:val="17"/>
+              </w:rPr>
+              <w:t>74,000 VND /hộp</w:t>
+            </w:r>
+          </w:p>
+        </w:tc>
+        <w:tc>
+          <w:tcPr>
+            <w:tcW w:type="dxa" w:w="1247"/>
+            <w:shd w:val="clear" w:color="auto" w:fill="EFF6FF"/>
+          </w:tcPr>
+          <w:p>
+            <w:pPr>
+              <w:spacing w:before="60" w:after="60"/>
+              <w:ind w:left="85"/>
+            </w:pPr>
+            <w:r>
+              <w:rPr>
+                <w:rFonts w:ascii="Calibri" w:hAnsi="Calibri"/>
+                <w:b/>
+                <w:i w:val="0"/>
+                <w:color w:val="0056D2"/>
+                <w:sz w:val="17"/>
+              </w:rPr>
+              <w:t>Ổn định</w:t>
+            </w:r>
+          </w:p>
+        </w:tc>
+        <w:tc>
+          <w:tcPr>
+            <w:tcW w:type="dxa" w:w="2608"/>
+          </w:tcPr>
+          <w:p>
+            <w:pPr>
+              <w:spacing w:before="60" w:after="60"/>
+              <w:ind w:left="85"/>
+            </w:pPr>
+            <w:r>
+              <w:rPr>
+                <w:rFonts w:ascii="Calibri" w:hAnsi="Calibri"/>
+                <w:b w:val="0"/>
+                <w:i w:val="0"/>
+                <w:color w:val="374151"/>
+                <w:sz w:val="17"/>
+              </w:rPr>
+              <w:t>Duy trì kênh ETC – theo dõi thầu TT Corticoid</w:t>
             </w:r>
           </w:p>
         </w:tc>
@@ -3311,7 +5624,7 @@
                 <w:color w:val="111827"/>
                 <w:sz w:val="18"/>
               </w:rPr>
-              <w:t>Launch "Active 50+" combo marketing campaign for calcium, vitamin D, omega-3</w:t>
+              <w:t>Develop KOL/CME "early intervention 40+" materials for RAVASTEL, EIMLER-10, PECHAUNOX, ZENTOGOUT</w:t>
             </w:r>
           </w:p>
         </w:tc>
@@ -3339,7 +5652,7 @@
                 <w:color w:val="003B71"/>
                 <w:sz w:val="17"/>
               </w:rPr>
-              <w:t>Marketing</w:t>
+              <w:t>Marketing &amp; Medical Affairs</w:t>
             </w:r>
           </w:p>
         </w:tc>
@@ -3367,7 +5680,7 @@
                 <w:color w:val="6B7280"/>
                 <w:sz w:val="17"/>
               </w:rPr>
-              <w:t>Senior nutrition media trend</w:t>
+              <w:t>Aging accelerates at 44 &amp; 60 (Stanford)</w:t>
             </w:r>
           </w:p>
         </w:tc>
@@ -3446,7 +5759,7 @@
                 <w:color w:val="111827"/>
                 <w:sz w:val="18"/>
               </w:rPr>
-              <w:t>Intensify pediatric hospital rep coverage with antibiotics and acyclovir</w:t>
+              <w:t>Build peri-operative listing dossier (JIRACEK, PECHAUNOX, ZABALES) at Tam Anh, Vinmec, FV</w:t>
             </w:r>
           </w:p>
         </w:tc>
@@ -3474,7 +5787,7 @@
                 <w:color w:val="003B71"/>
                 <w:sz w:val="17"/>
               </w:rPr>
-              <w:t>Sales</w:t>
+              <w:t>Medical Affairs &amp; ETC Sales</w:t>
             </w:r>
           </w:p>
         </w:tc>
@@ -3502,7 +5815,7 @@
                 <w:color w:val="6B7280"/>
                 <w:sz w:val="17"/>
               </w:rPr>
-              <w:t>Severe chickenpox complication in child</w:t>
+              <w:t>Colorectal cancer ~17,000 cases/year, private hospitals upgrading</w:t>
             </w:r>
           </w:p>
         </w:tc>
@@ -3581,7 +5894,7 @@
                 <w:color w:val="111827"/>
                 <w:sz w:val="18"/>
               </w:rPr>
-              <w:t>Publish KOL-backed chickenpox complication protocol materials for pediatricians</w:t>
+              <w:t>Review &amp; deploy HYYR pancreatic cancer indication materials at K, Cho Ray, HCMC Oncology hospitals</w:t>
             </w:r>
           </w:p>
         </w:tc>
@@ -3609,7 +5922,7 @@
                 <w:color w:val="003B71"/>
                 <w:sz w:val="17"/>
               </w:rPr>
-              <w:t>Marketing</w:t>
+              <w:t>Oncology &amp; Medical Affairs</w:t>
             </w:r>
           </w:p>
         </w:tc>
@@ -3637,7 +5950,7 @@
                 <w:color w:val="6B7280"/>
                 <w:sz w:val="17"/>
               </w:rPr>
-              <w:t>Severe chickenpox complication in child</w:t>
+              <w:t>Rising pancreatic cancer awareness (VnExpress)</w:t>
             </w:r>
           </w:p>
         </w:tc>
@@ -3716,7 +6029,7 @@
                 <w:color w:val="111827"/>
                 <w:sz w:val="18"/>
               </w:rPr>
-              <w:t>Develop and distribute "Safe Anticoagulant Use" guide via pharmacies and physicians</w:t>
+              <w:t>Đánh giá khả năng mở rộng danh mục hormone therapy ung thư vú; báo cáo BOD Q3/</w:t>
             </w:r>
           </w:p>
         </w:tc>
@@ -3744,7 +6057,6 @@
                 <w:color w:val="003B71"/>
                 <w:sz w:val="17"/>
               </w:rPr>
-              <w:t>Marketing</w:t>
             </w:r>
           </w:p>
         </w:tc>
@@ -3752,140 +6064,6 @@
           <w:tcPr>
             <w:tcW w:type="dxa" w:w="1134"/>
             <w:shd w:val="clear" w:color="auto" w:fill="FAFBFF"/>
-            <w:tcBorders>
-              <w:top w:val="none" w:sz="6" w:color="auto"/>
-              <w:bottom w:val="none" w:sz="6" w:color="auto"/>
-              <w:left w:val="none" w:sz="6" w:color="auto"/>
-              <w:right w:val="none" w:sz="6" w:color="auto"/>
-            </w:tcBorders>
-          </w:tcPr>
-          <w:p>
-            <w:pPr>
-              <w:spacing w:before="80" w:after="80"/>
-              <w:jc w:val="center"/>
-            </w:pPr>
-            <w:r>
-              <w:rPr>
-                <w:rFonts w:ascii="Calibri" w:hAnsi="Calibri"/>
-                <w:b w:val="0"/>
-                <w:i w:val="0"/>
-                <w:color w:val="6B7280"/>
-                <w:sz w:val="17"/>
-              </w:rPr>
-              <w:t>Supplement–anticoagulant drug interaction alert</w:t>
-            </w:r>
-          </w:p>
-        </w:tc>
-        <w:tc>
-          <w:tcPr>
-            <w:tcW w:type="dxa" w:w="1644"/>
-            <w:shd w:val="clear" w:color="auto" w:fill="DCFCE7"/>
-            <w:tcBorders>
-              <w:top w:val="none" w:sz="6" w:color="auto"/>
-              <w:bottom w:val="none" w:sz="6" w:color="auto"/>
-              <w:left w:val="none" w:sz="6" w:color="auto"/>
-              <w:right w:val="none" w:sz="6" w:color="auto"/>
-            </w:tcBorders>
-          </w:tcPr>
-          <w:p>
-            <w:pPr>
-              <w:spacing w:before="80" w:after="80"/>
-              <w:jc w:val="center"/>
-            </w:pPr>
-            <w:r>
-              <w:rPr>
-                <w:rFonts w:ascii="Calibri" w:hAnsi="Calibri"/>
-                <w:b/>
-                <w:i w:val="0"/>
-                <w:color w:val="22C55E"/>
-                <w:sz w:val="17"/>
-              </w:rPr>
-              <w:t>🟡 Medium</w:t>
-            </w:r>
-          </w:p>
-        </w:tc>
-      </w:tr>
-      <w:tr>
-        <w:tc>
-          <w:tcPr>
-            <w:tcW w:type="dxa" w:w="454"/>
-            <w:shd w:val="clear" w:color="auto" w:fill="DCFCE7"/>
-            <w:tcBorders>
-              <w:top w:val="none" w:sz="6" w:color="auto"/>
-              <w:bottom w:val="none" w:sz="6" w:color="auto"/>
-              <w:left w:val="none" w:sz="6" w:color="auto"/>
-              <w:right w:val="none" w:sz="6" w:color="auto"/>
-            </w:tcBorders>
-          </w:tcPr>
-          <w:p>
-            <w:pPr>
-              <w:spacing w:before="100" w:after="100"/>
-              <w:jc w:val="center"/>
-            </w:pPr>
-            <w:r>
-              <w:t>🟢</w:t>
-            </w:r>
-          </w:p>
-        </w:tc>
-        <w:tc>
-          <w:tcPr>
-            <w:tcW w:type="dxa" w:w="4422"/>
-            <w:shd w:val="clear" w:color="auto" w:fill="FFFFFF"/>
-            <w:tcBorders>
-              <w:top w:val="none" w:sz="6" w:color="auto"/>
-              <w:bottom w:val="none" w:sz="6" w:color="auto"/>
-              <w:left w:val="none" w:sz="6" w:color="auto"/>
-              <w:right w:val="none" w:sz="6" w:color="auto"/>
-            </w:tcBorders>
-          </w:tcPr>
-          <w:p>
-            <w:pPr>
-              <w:spacing w:before="80" w:after="80"/>
-              <w:ind w:left="85"/>
-            </w:pPr>
-            <w:r>
-              <w:rPr>
-                <w:rFonts w:ascii="Calibri" w:hAnsi="Calibri"/>
-                <w:b/>
-                <w:i w:val="0"/>
-                <w:color w:val="111827"/>
-                <w:sz w:val="18"/>
-              </w:rPr>
-              <w:t>&lt;span class="</w:t>
-            </w:r>
-          </w:p>
-        </w:tc>
-        <w:tc>
-          <w:tcPr>
-            <w:tcW w:type="dxa" w:w="1417"/>
-            <w:shd w:val="clear" w:color="auto" w:fill="FFFFFF"/>
-            <w:tcBorders>
-              <w:top w:val="none" w:sz="6" w:color="auto"/>
-              <w:bottom w:val="none" w:sz="6" w:color="auto"/>
-              <w:left w:val="none" w:sz="6" w:color="auto"/>
-              <w:right w:val="none" w:sz="6" w:color="auto"/>
-            </w:tcBorders>
-          </w:tcPr>
-          <w:p>
-            <w:pPr>
-              <w:spacing w:before="80" w:after="80"/>
-              <w:jc w:val="center"/>
-            </w:pPr>
-            <w:r>
-              <w:rPr>
-                <w:rFonts w:ascii="Calibri" w:hAnsi="Calibri"/>
-                <w:b w:val="0"/>
-                <w:i w:val="0"/>
-                <w:color w:val="003B71"/>
-                <w:sz w:val="17"/>
-              </w:rPr>
-            </w:r>
-          </w:p>
-        </w:tc>
-        <w:tc>
-          <w:tcPr>
-            <w:tcW w:type="dxa" w:w="1134"/>
-            <w:shd w:val="clear" w:color="auto" w:fill="FFFFFF"/>
             <w:tcBorders>
               <w:top w:val="none" w:sz="6" w:color="auto"/>
               <w:bottom w:val="none" w:sz="6" w:color="auto"/>

</xml_diff>

<commit_message>
Update report_en.docx 2026-05-13 10:44
</commit_message>
<xml_diff>
--- a/report_en.docx
+++ b/report_en.docx
@@ -338,7 +338,7 @@
                 <w:color w:val="111827"/>
                 <w:sz w:val="20"/>
               </w:rPr>
-              <w:t>Week 11–17 May 2026: Scientific evidence on accelerated aging and younger-onset cancer trends validates long-term demand across Davipharm's chronic disease and oncology portfolios, unlocking cross-listing opportunities in premium private hospital channels.</w:t>
+              <w:t>No reg-policy or tender signals this week, but three epidemiological trends (diabetes, oncology, psychiatry) reinforce long-term demand fundamentals for Davipharm's core ETC portfolio.</w:t>
             </w:r>
           </w:p>
         </w:tc>
@@ -406,7 +406,7 @@
                 <w:color w:val="111827"/>
                 <w:sz w:val="17"/>
               </w:rPr>
-              <w:t>▸  Aging acceleration at 44 &amp; 60:Stanford data validates two priority patient segments (40–50 and 60+), providing strong scientific grounding for Marketing to position "early intervention" messaging around RAVASTEL, EIMLER-10, PECHAUNOX, and ZENTOGOUT.</w:t>
+              <w:t>▸  Diabetes:Mass-media coverage of T2D complications is driving sustained patient awareness, supporting long-term ETC demand for EIMLER-10 (Empagliflozin) and ZLATKO (Sitagliptin).</w:t>
             </w:r>
           </w:p>
           <w:p>
@@ -422,7 +422,7 @@
                 <w:color w:val="111827"/>
                 <w:sz w:val="17"/>
               </w:rPr>
-              <w:t>▸  Colorectal cancer — ~17,000 cases/year:Multi-morbid patients (CV, GI, thrombotic) at major private hospitals open cross-listing opportunities for JIRACEK, PECHAUNOX, and ZABALES within peri-operative supportive protocols.</w:t>
+              <w:t>▸  Oncology:Rising cancer screening rates and provincial treatment cost burdens underscore the strategic imperative to secure HYYR (Erlotinib) and LARRIVEY (Bicalutamide) in the next reimbursed tender formulary.</w:t>
             </w:r>
           </w:p>
           <w:p>
@@ -438,7 +438,7 @@
                 <w:color w:val="111827"/>
                 <w:sz w:val="17"/>
               </w:rPr>
-              <w:t>▸  Breast cancer portfolio gap:The hormone receptor-positive breast cancer segment is growing but Davipharm has no directly competitive product — M&amp;A/in-licensing of aromatase inhibitors or anti-estrogens warrants assessment.</w:t>
+              <w:t>▸  Psychiatry:Growing community substance abuse signals a long-term rise in psychiatric patient volumes — opportunity to expand SERNAL (Risperidone) and LAFAXOR (Venlafaxine) in psychiatric and general hospital departments.</w:t>
             </w:r>
           </w:p>
         </w:tc>
@@ -798,7 +798,7 @@
                 <w:color w:val="166534"/>
                 <w:sz w:val="22"/>
               </w:rPr>
-              <w:t>4</w:t>
+              <w:t>1</w:t>
             </w:r>
           </w:p>
         </w:tc>
@@ -826,7 +826,7 @@
                 <w:color w:val="374151"/>
                 <w:sz w:val="22"/>
               </w:rPr>
-              <w:t>5</w:t>
+              <w:t>9</w:t>
             </w:r>
           </w:p>
         </w:tc>
@@ -1841,6 +1841,1098 @@
                 <w:color w:val="4338CA"/>
                 <w:sz w:val="15"/>
               </w:rPr>
+              <w:t>VNEXPRESS – SỨC KHỎE</w:t>
+            </w:r>
+          </w:p>
+        </w:tc>
+        <w:tc>
+          <w:tcPr>
+            <w:tcW w:type="dxa" w:w="4536"/>
+            <w:tcBorders>
+              <w:top w:val="none" w:sz="6" w:color="auto"/>
+              <w:bottom w:val="none" w:sz="6" w:color="auto"/>
+              <w:left w:val="none" w:sz="6" w:color="auto"/>
+              <w:right w:val="none" w:sz="6" w:color="auto"/>
+            </w:tcBorders>
+          </w:tcPr>
+          <w:p>
+            <w:pPr>
+              <w:spacing w:before="60" w:after="60"/>
+              <w:ind w:left="113"/>
+            </w:pPr>
+            <w:r>
+              <w:rPr>
+                <w:rFonts w:ascii="Calibri" w:hAnsi="Calibri"/>
+                <w:b/>
+                <w:i w:val="0"/>
+                <w:color w:val="111827"/>
+                <w:sz w:val="21"/>
+              </w:rPr>
+              <w:t>Ministry of Health Mobilizes ~VND 6B in Medicines &amp; Medical Equipment for Truong Sa Islands</w:t>
+            </w:r>
+          </w:p>
+        </w:tc>
+      </w:tr>
+    </w:tbl>
+    <w:p>
+      <w:pPr>
+        <w:spacing w:before="40" w:after="40"/>
+        <w:ind w:left="170"/>
+      </w:pPr>
+      <w:r>
+        <w:rPr>
+          <w:rFonts w:ascii="Calibri" w:hAnsi="Calibri"/>
+          <w:b w:val="0"/>
+          <w:i/>
+          <w:color w:val="6B7280"/>
+          <w:sz w:val="18"/>
+        </w:rPr>
+        <w:t>The Ministry of Health donated nearly VND 6 billion in medicines and medical equipment to seven islands and one offshore platform in Truong Sa, with VND 3.3 billion earmarked for medical supplies and devices. This is a humanitarian/defense initiative outside the commercial ETC tendering channels relevant to Davipharm's core business.[Source]</w:t>
+      </w:r>
+    </w:p>
+    <w:p>
+      <w:pPr>
+        <w:spacing w:before="20" w:after="40"/>
+        <w:ind w:left="170"/>
+      </w:pPr>
+      <w:r>
+        <w:rPr>
+          <w:rFonts w:ascii="Calibri" w:hAnsi="Calibri"/>
+          <w:b/>
+          <w:i w:val="0"/>
+          <w:color w:val="374151"/>
+          <w:sz w:val="17"/>
+        </w:rPr>
+        <w:t>⚪ No direct impact on Davipharm's revenue or tender portfolio; monitor only if MoH expands defense healthcare supply into competitive centralized procurement mechanisms.</w:t>
+      </w:r>
+    </w:p>
+    <w:tbl>
+      <w:tblPr>
+        <w:tblStyle w:val="TableGrid"/>
+        <w:tblW w:type="auto" w:w="0"/>
+        <w:tblLook w:firstColumn="1" w:firstRow="1" w:lastColumn="0" w:lastRow="0" w:noHBand="0" w:noVBand="1" w:val="04A0"/>
+      </w:tblPr>
+      <w:tblGrid>
+        <w:gridCol w:w="9072"/>
+      </w:tblGrid>
+      <w:tr>
+        <w:tc>
+          <w:tcPr>
+            <w:tcW w:type="dxa" w:w="9072"/>
+            <w:shd w:val="clear" w:color="auto" w:fill="F8FAFC"/>
+            <w:tcBorders>
+              <w:top w:val="none" w:sz="6" w:color="auto"/>
+              <w:bottom w:val="none" w:sz="6" w:color="auto"/>
+              <w:left w:val="single" w:sz="12" w:color="003B71"/>
+              <w:right w:val="none" w:sz="6" w:color="auto"/>
+            </w:tcBorders>
+          </w:tcPr>
+          <w:p>
+            <w:pPr>
+              <w:spacing w:before="60" w:after="60"/>
+              <w:ind w:left="142"/>
+            </w:pPr>
+            <w:r>
+              <w:rPr>
+                <w:rFonts w:ascii="Calibri" w:hAnsi="Calibri"/>
+                <w:b/>
+                <w:i w:val="0"/>
+                <w:color w:val="003B71"/>
+                <w:sz w:val="17"/>
+              </w:rPr>
+              <w:t xml:space="preserve">Strategy  </w:t>
+            </w:r>
+            <w:r>
+              <w:rPr>
+                <w:rFonts w:ascii="Calibri" w:hAnsi="Calibri"/>
+                <w:b w:val="0"/>
+                <w:i w:val="0"/>
+                <w:color w:val="334155"/>
+                <w:sz w:val="17"/>
+              </w:rPr>
+              <w:t>No immediate action required. BD/Tender team may note the military healthcare supply channel (Ministry of Defense) as a long-term opportunity, particularly for essential products such as METILONE-4 (Methylprednisolone) — subject to first verifying the military's separate procurement process.</w:t>
+            </w:r>
+          </w:p>
+        </w:tc>
+      </w:tr>
+    </w:tbl>
+    <w:p>
+      <w:pPr>
+        <w:spacing w:before="40" w:after="120"/>
+      </w:pPr>
+    </w:p>
+    <w:tbl>
+      <w:tblPr>
+        <w:tblStyle w:val="TableGrid"/>
+        <w:tblW w:type="auto" w:w="0"/>
+        <w:jc w:val="left"/>
+        <w:tblLook w:firstColumn="1" w:firstRow="1" w:lastColumn="0" w:lastRow="0" w:noHBand="0" w:noVBand="1" w:val="04A0"/>
+      </w:tblPr>
+      <w:tblGrid>
+        <w:gridCol w:w="4536"/>
+        <w:gridCol w:w="4536"/>
+      </w:tblGrid>
+      <w:tr>
+        <w:tc>
+          <w:tcPr>
+            <w:tcW w:type="dxa" w:w="1984"/>
+            <w:shd w:val="clear" w:color="auto" w:fill="EEF2FF"/>
+            <w:tcBorders>
+              <w:top w:val="none" w:sz="6" w:color="auto"/>
+              <w:bottom w:val="none" w:sz="6" w:color="auto"/>
+              <w:left w:val="none" w:sz="6" w:color="auto"/>
+              <w:right w:val="none" w:sz="6" w:color="auto"/>
+            </w:tcBorders>
+          </w:tcPr>
+          <w:p>
+            <w:pPr>
+              <w:spacing w:before="80" w:after="80"/>
+              <w:ind w:left="85"/>
+            </w:pPr>
+            <w:r>
+              <w:rPr>
+                <w:rFonts w:ascii="Calibri" w:hAnsi="Calibri"/>
+                <w:b/>
+                <w:i w:val="0"/>
+                <w:color w:val="4338CA"/>
+                <w:sz w:val="15"/>
+              </w:rPr>
+              <w:t>VNEXPRESS – SỨC KHỎE</w:t>
+            </w:r>
+          </w:p>
+        </w:tc>
+        <w:tc>
+          <w:tcPr>
+            <w:tcW w:type="dxa" w:w="4536"/>
+            <w:tcBorders>
+              <w:top w:val="none" w:sz="6" w:color="auto"/>
+              <w:bottom w:val="none" w:sz="6" w:color="auto"/>
+              <w:left w:val="none" w:sz="6" w:color="auto"/>
+              <w:right w:val="none" w:sz="6" w:color="auto"/>
+            </w:tcBorders>
+          </w:tcPr>
+          <w:p>
+            <w:pPr>
+              <w:spacing w:before="60" w:after="60"/>
+              <w:ind w:left="113"/>
+            </w:pPr>
+            <w:r>
+              <w:rPr>
+                <w:rFonts w:ascii="Calibri" w:hAnsi="Calibri"/>
+                <w:b/>
+                <w:i w:val="0"/>
+                <w:color w:val="111827"/>
+                <w:sz w:val="21"/>
+              </w:rPr>
+              <w:t>Triple Synthetic Drug Combo (Ketamine/MDMA/Meth) Triggers Severe CNS Damage — Public Health Alert</w:t>
+            </w:r>
+          </w:p>
+        </w:tc>
+      </w:tr>
+    </w:tbl>
+    <w:p>
+      <w:pPr>
+        <w:spacing w:before="40" w:after="40"/>
+        <w:ind w:left="170"/>
+      </w:pPr>
+      <w:r>
+        <w:rPr>
+          <w:rFonts w:ascii="Calibri" w:hAnsi="Calibri"/>
+          <w:b w:val="0"/>
+          <w:i/>
+          <w:color w:val="6B7280"/>
+          <w:sz w:val="18"/>
+        </w:rPr>
+        <w:t>The arrest of singer Miu Lê testing positive for Methamphetamine, MDMA, and Ketamine simultaneously has prompted medical warnings about prolonged CNS damage, depression, and psychiatric disorders from polysubstance abuse. While unrelated to generic procurement or reg-policy, the trend indirectly signals potential growth in demand for psychiatric treatment (depression, anxiety, behavioral disorders) relevant to Davipharm's CNS portfolio.[Source]</w:t>
+      </w:r>
+    </w:p>
+    <w:p>
+      <w:pPr>
+        <w:spacing w:before="20" w:after="40"/>
+        <w:ind w:left="170"/>
+      </w:pPr>
+      <w:r>
+        <w:rPr>
+          <w:rFonts w:ascii="Calibri" w:hAnsi="Calibri"/>
+          <w:b/>
+          <w:i w:val="0"/>
+          <w:color w:val="374151"/>
+          <w:sz w:val="17"/>
+        </w:rPr>
+        <w:t>📊 No direct revenue or tender impact; monitor rising psychiatric patient volumes as a long-term demand signal for SERNAL (Risperidone) and LAFAXOR (Venlafaxine) in the ETC channel.</w:t>
+      </w:r>
+    </w:p>
+    <w:tbl>
+      <w:tblPr>
+        <w:tblStyle w:val="TableGrid"/>
+        <w:tblW w:type="auto" w:w="0"/>
+        <w:tblLook w:firstColumn="1" w:firstRow="1" w:lastColumn="0" w:lastRow="0" w:noHBand="0" w:noVBand="1" w:val="04A0"/>
+      </w:tblPr>
+      <w:tblGrid>
+        <w:gridCol w:w="9072"/>
+      </w:tblGrid>
+      <w:tr>
+        <w:tc>
+          <w:tcPr>
+            <w:tcW w:type="dxa" w:w="9072"/>
+            <w:shd w:val="clear" w:color="auto" w:fill="F8FAFC"/>
+            <w:tcBorders>
+              <w:top w:val="none" w:sz="6" w:color="auto"/>
+              <w:bottom w:val="none" w:sz="6" w:color="auto"/>
+              <w:left w:val="single" w:sz="12" w:color="003B71"/>
+              <w:right w:val="none" w:sz="6" w:color="auto"/>
+            </w:tcBorders>
+          </w:tcPr>
+          <w:p>
+            <w:pPr>
+              <w:spacing w:before="60" w:after="60"/>
+              <w:ind w:left="142"/>
+            </w:pPr>
+            <w:r>
+              <w:rPr>
+                <w:rFonts w:ascii="Calibri" w:hAnsi="Calibri"/>
+                <w:b/>
+                <w:i w:val="0"/>
+                <w:color w:val="003B71"/>
+                <w:sz w:val="17"/>
+              </w:rPr>
+              <w:t xml:space="preserve">Strategy  </w:t>
+            </w:r>
+            <w:r>
+              <w:rPr>
+                <w:rFonts w:ascii="Calibri" w:hAnsi="Calibri"/>
+                <w:b w:val="0"/>
+                <w:i w:val="0"/>
+                <w:color w:val="334155"/>
+                <w:sz w:val="17"/>
+              </w:rPr>
+              <w:t>Marketing &amp; Medical Affairs teams to monitor epidemiological data on substance-abuse-related psychiatric disorders; assess opportunity to expand SERNAL and LAFAXOR listings in psychiatric hospitals and general hospital psychiatry departments ahead of the next tender cycle (est. 2025–2026).</w:t>
+            </w:r>
+          </w:p>
+        </w:tc>
+      </w:tr>
+    </w:tbl>
+    <w:p>
+      <w:pPr>
+        <w:spacing w:before="40" w:after="120"/>
+      </w:pPr>
+    </w:p>
+    <w:tbl>
+      <w:tblPr>
+        <w:tblStyle w:val="TableGrid"/>
+        <w:tblW w:type="auto" w:w="0"/>
+        <w:jc w:val="left"/>
+        <w:tblLook w:firstColumn="1" w:firstRow="1" w:lastColumn="0" w:lastRow="0" w:noHBand="0" w:noVBand="1" w:val="04A0"/>
+      </w:tblPr>
+      <w:tblGrid>
+        <w:gridCol w:w="4536"/>
+        <w:gridCol w:w="4536"/>
+      </w:tblGrid>
+      <w:tr>
+        <w:tc>
+          <w:tcPr>
+            <w:tcW w:type="dxa" w:w="1984"/>
+            <w:shd w:val="clear" w:color="auto" w:fill="EEF2FF"/>
+            <w:tcBorders>
+              <w:top w:val="none" w:sz="6" w:color="auto"/>
+              <w:bottom w:val="none" w:sz="6" w:color="auto"/>
+              <w:left w:val="none" w:sz="6" w:color="auto"/>
+              <w:right w:val="none" w:sz="6" w:color="auto"/>
+            </w:tcBorders>
+          </w:tcPr>
+          <w:p>
+            <w:pPr>
+              <w:spacing w:before="80" w:after="80"/>
+              <w:ind w:left="85"/>
+            </w:pPr>
+            <w:r>
+              <w:rPr>
+                <w:rFonts w:ascii="Calibri" w:hAnsi="Calibri"/>
+                <w:b/>
+                <w:i w:val="0"/>
+                <w:color w:val="4338CA"/>
+                <w:sz w:val="15"/>
+              </w:rPr>
+              <w:t>VNEXPRESS – SỨC KHỎE</w:t>
+            </w:r>
+          </w:p>
+        </w:tc>
+        <w:tc>
+          <w:tcPr>
+            <w:tcW w:type="dxa" w:w="4536"/>
+            <w:tcBorders>
+              <w:top w:val="none" w:sz="6" w:color="auto"/>
+              <w:bottom w:val="none" w:sz="6" w:color="auto"/>
+              <w:left w:val="none" w:sz="6" w:color="auto"/>
+              <w:right w:val="none" w:sz="6" w:color="auto"/>
+            </w:tcBorders>
+          </w:tcPr>
+          <w:p>
+            <w:pPr>
+              <w:spacing w:before="60" w:after="60"/>
+              <w:ind w:left="113"/>
+            </w:pPr>
+            <w:r>
+              <w:rPr>
+                <w:rFonts w:ascii="Calibri" w:hAnsi="Calibri"/>
+                <w:b/>
+                <w:i w:val="0"/>
+                <w:color w:val="111827"/>
+                <w:sz w:val="21"/>
+              </w:rPr>
+              <w:t>UK Military Parachute Drop to Rescue Suspected Hantavirus Patient on Remote Island</w:t>
+            </w:r>
+          </w:p>
+        </w:tc>
+      </w:tr>
+    </w:tbl>
+    <w:p>
+      <w:pPr>
+        <w:spacing w:before="40" w:after="40"/>
+        <w:ind w:left="170"/>
+      </w:pPr>
+      <w:r>
+        <w:rPr>
+          <w:rFonts w:ascii="Calibri" w:hAnsi="Calibri"/>
+          <w:b w:val="0"/>
+          <w:i/>
+          <w:color w:val="6B7280"/>
+          <w:sz w:val="18"/>
+        </w:rPr>
+        <w:t>The UK military conducted an emergency parachute operation to Tristan da Cunha to treat a suspected Hantavirus (Andes strain) case from the MV Hondius, which has caused 3 deaths; the outbreak has potential person-to-person transmission. This international health event has no direct relevance to Vietnam's pharmaceutical market or Davipharm's product portfolio.[Source]</w:t>
+      </w:r>
+    </w:p>
+    <w:p>
+      <w:pPr>
+        <w:spacing w:before="20" w:after="40"/>
+        <w:ind w:left="170"/>
+      </w:pPr>
+      <w:r>
+        <w:rPr>
+          <w:rFonts w:ascii="Calibri" w:hAnsi="Calibri"/>
+          <w:b/>
+          <w:i w:val="0"/>
+          <w:color w:val="374151"/>
+          <w:sz w:val="17"/>
+        </w:rPr>
+        <w:t>⚪ No direct impact on Davipharm — international health news outside the company's product portfolio and target market scope.</w:t>
+      </w:r>
+    </w:p>
+    <w:tbl>
+      <w:tblPr>
+        <w:tblStyle w:val="TableGrid"/>
+        <w:tblW w:type="auto" w:w="0"/>
+        <w:tblLook w:firstColumn="1" w:firstRow="1" w:lastColumn="0" w:lastRow="0" w:noHBand="0" w:noVBand="1" w:val="04A0"/>
+      </w:tblPr>
+      <w:tblGrid>
+        <w:gridCol w:w="9072"/>
+      </w:tblGrid>
+      <w:tr>
+        <w:tc>
+          <w:tcPr>
+            <w:tcW w:type="dxa" w:w="9072"/>
+            <w:shd w:val="clear" w:color="auto" w:fill="F8FAFC"/>
+            <w:tcBorders>
+              <w:top w:val="none" w:sz="6" w:color="auto"/>
+              <w:bottom w:val="none" w:sz="6" w:color="auto"/>
+              <w:left w:val="single" w:sz="12" w:color="003B71"/>
+              <w:right w:val="none" w:sz="6" w:color="auto"/>
+            </w:tcBorders>
+          </w:tcPr>
+          <w:p>
+            <w:pPr>
+              <w:spacing w:before="60" w:after="60"/>
+              <w:ind w:left="142"/>
+            </w:pPr>
+            <w:r>
+              <w:rPr>
+                <w:rFonts w:ascii="Calibri" w:hAnsi="Calibri"/>
+                <w:b/>
+                <w:i w:val="0"/>
+                <w:color w:val="003B71"/>
+                <w:sz w:val="17"/>
+              </w:rPr>
+              <w:t xml:space="preserve">Strategy  </w:t>
+            </w:r>
+            <w:r>
+              <w:rPr>
+                <w:rFonts w:ascii="Calibri" w:hAnsi="Calibri"/>
+                <w:b w:val="0"/>
+                <w:i w:val="0"/>
+                <w:color w:val="334155"/>
+                <w:sz w:val="17"/>
+              </w:rPr>
+              <w:t>No action required. BOD may monitor only if WHO or Vietnam's Ministry of Health issues a domestic Hantavirus epidemiological alert; currently, no Davipharm product addresses Hantavirus treatment.</w:t>
+            </w:r>
+          </w:p>
+        </w:tc>
+      </w:tr>
+    </w:tbl>
+    <w:p>
+      <w:pPr>
+        <w:spacing w:before="40" w:after="120"/>
+      </w:pPr>
+    </w:p>
+    <w:tbl>
+      <w:tblPr>
+        <w:tblStyle w:val="TableGrid"/>
+        <w:tblW w:type="auto" w:w="0"/>
+        <w:jc w:val="left"/>
+        <w:tblLook w:firstColumn="1" w:firstRow="1" w:lastColumn="0" w:lastRow="0" w:noHBand="0" w:noVBand="1" w:val="04A0"/>
+      </w:tblPr>
+      <w:tblGrid>
+        <w:gridCol w:w="4536"/>
+        <w:gridCol w:w="4536"/>
+      </w:tblGrid>
+      <w:tr>
+        <w:tc>
+          <w:tcPr>
+            <w:tcW w:type="dxa" w:w="1984"/>
+            <w:shd w:val="clear" w:color="auto" w:fill="EEF2FF"/>
+            <w:tcBorders>
+              <w:top w:val="none" w:sz="6" w:color="auto"/>
+              <w:bottom w:val="none" w:sz="6" w:color="auto"/>
+              <w:left w:val="none" w:sz="6" w:color="auto"/>
+              <w:right w:val="none" w:sz="6" w:color="auto"/>
+            </w:tcBorders>
+          </w:tcPr>
+          <w:p>
+            <w:pPr>
+              <w:spacing w:before="80" w:after="80"/>
+              <w:ind w:left="85"/>
+            </w:pPr>
+            <w:r>
+              <w:rPr>
+                <w:rFonts w:ascii="Calibri" w:hAnsi="Calibri"/>
+                <w:b/>
+                <w:i w:val="0"/>
+                <w:color w:val="4338CA"/>
+                <w:sz w:val="15"/>
+              </w:rPr>
+              <w:t>VNEXPRESS – SỨC KHỎE</w:t>
+            </w:r>
+          </w:p>
+        </w:tc>
+        <w:tc>
+          <w:tcPr>
+            <w:tcW w:type="dxa" w:w="4536"/>
+            <w:tcBorders>
+              <w:top w:val="none" w:sz="6" w:color="auto"/>
+              <w:bottom w:val="none" w:sz="6" w:color="auto"/>
+              <w:left w:val="none" w:sz="6" w:color="auto"/>
+              <w:right w:val="none" w:sz="6" w:color="auto"/>
+            </w:tcBorders>
+          </w:tcPr>
+          <w:p>
+            <w:pPr>
+              <w:spacing w:before="60" w:after="60"/>
+              <w:ind w:left="113"/>
+            </w:pPr>
+            <w:r>
+              <w:rPr>
+                <w:rFonts w:ascii="Calibri" w:hAnsi="Calibri"/>
+                <w:b/>
+                <w:i w:val="0"/>
+                <w:color w:val="111827"/>
+                <w:sz w:val="21"/>
+              </w:rPr>
+              <w:t>Ultra-Processed Food Linked to Colorectal Cancer Rise — Implications for Oncology Drug Demand</w:t>
+            </w:r>
+          </w:p>
+        </w:tc>
+      </w:tr>
+    </w:tbl>
+    <w:p>
+      <w:pPr>
+        <w:spacing w:before="40" w:after="40"/>
+        <w:ind w:left="170"/>
+      </w:pPr>
+      <w:r>
+        <w:rPr>
+          <w:rFonts w:ascii="Calibri" w:hAnsi="Calibri"/>
+          <w:b w:val="0"/>
+          <w:i/>
+          <w:color w:val="6B7280"/>
+          <w:sz w:val="18"/>
+        </w:rPr>
+        <w:t>A JAMA Oncology study confirms that high ultra-processed food consumption significantly raises adenomatous polyp risk, accelerating early colorectal cancer screening and treatment trends in Vietnam. This trend may expand the addressable ETC market for Davipharm's oncology portfolio, particularly HYYR (Erlotinib) and LARRIVEY (Bicalutamide) in hospital channels.[Source]</w:t>
+      </w:r>
+    </w:p>
+    <w:p>
+      <w:pPr>
+        <w:spacing w:before="20" w:after="40"/>
+        <w:ind w:left="170"/>
+      </w:pPr>
+      <w:r>
+        <w:rPr>
+          <w:rFonts w:ascii="Calibri" w:hAnsi="Calibri"/>
+          <w:b/>
+          <w:i w:val="0"/>
+          <w:color w:val="374151"/>
+          <w:sz w:val="17"/>
+        </w:rPr>
+        <w:t>📊 Long-term signal: rising oncology demand benefits the high-value ETC portfolio, but near-term revenue impact remains indirect and requires monitoring.</w:t>
+      </w:r>
+    </w:p>
+    <w:tbl>
+      <w:tblPr>
+        <w:tblStyle w:val="TableGrid"/>
+        <w:tblW w:type="auto" w:w="0"/>
+        <w:tblLook w:firstColumn="1" w:firstRow="1" w:lastColumn="0" w:lastRow="0" w:noHBand="0" w:noVBand="1" w:val="04A0"/>
+      </w:tblPr>
+      <w:tblGrid>
+        <w:gridCol w:w="9072"/>
+      </w:tblGrid>
+      <w:tr>
+        <w:tc>
+          <w:tcPr>
+            <w:tcW w:type="dxa" w:w="9072"/>
+            <w:shd w:val="clear" w:color="auto" w:fill="F8FAFC"/>
+            <w:tcBorders>
+              <w:top w:val="none" w:sz="6" w:color="auto"/>
+              <w:bottom w:val="none" w:sz="6" w:color="auto"/>
+              <w:left w:val="single" w:sz="12" w:color="003B71"/>
+              <w:right w:val="none" w:sz="6" w:color="auto"/>
+            </w:tcBorders>
+          </w:tcPr>
+          <w:p>
+            <w:pPr>
+              <w:spacing w:before="60" w:after="60"/>
+              <w:ind w:left="142"/>
+            </w:pPr>
+            <w:r>
+              <w:rPr>
+                <w:rFonts w:ascii="Calibri" w:hAnsi="Calibri"/>
+                <w:b/>
+                <w:i w:val="0"/>
+                <w:color w:val="003B71"/>
+                <w:sz w:val="17"/>
+              </w:rPr>
+              <w:t xml:space="preserve">Strategy  </w:t>
+            </w:r>
+            <w:r>
+              <w:rPr>
+                <w:rFonts w:ascii="Calibri" w:hAnsi="Calibri"/>
+                <w:b w:val="0"/>
+                <w:i w:val="0"/>
+                <w:color w:val="334155"/>
+                <w:sz w:val="17"/>
+              </w:rPr>
+              <w:t>ETC Marketing Team, in coordination with Medical Affairs, should monitor colorectal cancer screening volume at key hospitals and assess opportunities to expand HYYR and LARRIVEY positioning ahead of the next tender cycle (Q3/2025).</w:t>
+            </w:r>
+          </w:p>
+        </w:tc>
+      </w:tr>
+    </w:tbl>
+    <w:p>
+      <w:pPr>
+        <w:spacing w:before="40" w:after="120"/>
+      </w:pPr>
+    </w:p>
+    <w:tbl>
+      <w:tblPr>
+        <w:tblStyle w:val="TableGrid"/>
+        <w:tblW w:type="auto" w:w="0"/>
+        <w:jc w:val="left"/>
+        <w:tblLook w:firstColumn="1" w:firstRow="1" w:lastColumn="0" w:lastRow="0" w:noHBand="0" w:noVBand="1" w:val="04A0"/>
+      </w:tblPr>
+      <w:tblGrid>
+        <w:gridCol w:w="4536"/>
+        <w:gridCol w:w="4536"/>
+      </w:tblGrid>
+      <w:tr>
+        <w:tc>
+          <w:tcPr>
+            <w:tcW w:type="dxa" w:w="1984"/>
+            <w:shd w:val="clear" w:color="auto" w:fill="EEF2FF"/>
+            <w:tcBorders>
+              <w:top w:val="none" w:sz="6" w:color="auto"/>
+              <w:bottom w:val="none" w:sz="6" w:color="auto"/>
+              <w:left w:val="none" w:sz="6" w:color="auto"/>
+              <w:right w:val="none" w:sz="6" w:color="auto"/>
+            </w:tcBorders>
+          </w:tcPr>
+          <w:p>
+            <w:pPr>
+              <w:spacing w:before="80" w:after="80"/>
+              <w:ind w:left="85"/>
+            </w:pPr>
+            <w:r>
+              <w:rPr>
+                <w:rFonts w:ascii="Calibri" w:hAnsi="Calibri"/>
+                <w:b/>
+                <w:i w:val="0"/>
+                <w:color w:val="4338CA"/>
+                <w:sz w:val="15"/>
+              </w:rPr>
+              <w:t>VNEXPRESS – SỨC KHỎE</w:t>
+            </w:r>
+          </w:p>
+        </w:tc>
+        <w:tc>
+          <w:tcPr>
+            <w:tcW w:type="dxa" w:w="4536"/>
+            <w:tcBorders>
+              <w:top w:val="none" w:sz="6" w:color="auto"/>
+              <w:bottom w:val="none" w:sz="6" w:color="auto"/>
+              <w:left w:val="none" w:sz="6" w:color="auto"/>
+              <w:right w:val="none" w:sz="6" w:color="auto"/>
+            </w:tcBorders>
+          </w:tcPr>
+          <w:p>
+            <w:pPr>
+              <w:spacing w:before="60" w:after="60"/>
+              <w:ind w:left="113"/>
+            </w:pPr>
+            <w:r>
+              <w:rPr>
+                <w:rFonts w:ascii="Calibri" w:hAnsi="Calibri"/>
+                <w:b/>
+                <w:i w:val="0"/>
+                <w:color w:val="111827"/>
+                <w:sz w:val="21"/>
+              </w:rPr>
+              <w:t>Natural Beetroot Trend for Blood Pressure Control — Soft Competitive Signal for Antihypertensive Portfolio</w:t>
+            </w:r>
+          </w:p>
+        </w:tc>
+      </w:tr>
+    </w:tbl>
+    <w:p>
+      <w:pPr>
+        <w:spacing w:before="40" w:after="40"/>
+        <w:ind w:left="170"/>
+      </w:pPr>
+      <w:r>
+        <w:rPr>
+          <w:rFonts w:ascii="Calibri" w:hAnsi="Calibri"/>
+          <w:b w:val="0"/>
+          <w:i/>
+          <w:color w:val="6B7280"/>
+          <w:sz w:val="18"/>
+        </w:rPr>
+        <w:t>Mainstream health media is promoting beetroot juice (reducing BP ~8/4 mmHg) as a drug-free alternative for hypertension, potentially reinforcing a "no medication needed" mindset among mild hypertensive patients — the target base for PECHAUNOX (Perindopril+Amlodipine), TABAREX (Valsartan), and HATLOP (Irbesartan). However, this content originates from international sources and does not yet reflect prescribing behavior changes in Vietnam.[Source]</w:t>
+      </w:r>
+    </w:p>
+    <w:p>
+      <w:pPr>
+        <w:spacing w:before="20" w:after="40"/>
+        <w:ind w:left="170"/>
+      </w:pPr>
+      <w:r>
+        <w:rPr>
+          <w:rFonts w:ascii="Calibri" w:hAnsi="Calibri"/>
+          <w:b/>
+          <w:i w:val="0"/>
+          <w:color w:val="374151"/>
+          <w:sz w:val="17"/>
+        </w:rPr>
+        <w:t>⚠️ Low long-term risk — the "food over medicine" trend may delay initiation in mild hypertension patients, but is insufficient to materially impact Davipharm's ETC hospital channel revenue in the near term.</w:t>
+      </w:r>
+    </w:p>
+    <w:tbl>
+      <w:tblPr>
+        <w:tblStyle w:val="TableGrid"/>
+        <w:tblW w:type="auto" w:w="0"/>
+        <w:tblLook w:firstColumn="1" w:firstRow="1" w:lastColumn="0" w:lastRow="0" w:noHBand="0" w:noVBand="1" w:val="04A0"/>
+      </w:tblPr>
+      <w:tblGrid>
+        <w:gridCol w:w="9072"/>
+      </w:tblGrid>
+      <w:tr>
+        <w:tc>
+          <w:tcPr>
+            <w:tcW w:type="dxa" w:w="9072"/>
+            <w:shd w:val="clear" w:color="auto" w:fill="F8FAFC"/>
+            <w:tcBorders>
+              <w:top w:val="none" w:sz="6" w:color="auto"/>
+              <w:bottom w:val="none" w:sz="6" w:color="auto"/>
+              <w:left w:val="single" w:sz="12" w:color="003B71"/>
+              <w:right w:val="none" w:sz="6" w:color="auto"/>
+            </w:tcBorders>
+          </w:tcPr>
+          <w:p>
+            <w:pPr>
+              <w:spacing w:before="60" w:after="60"/>
+              <w:ind w:left="142"/>
+            </w:pPr>
+            <w:r>
+              <w:rPr>
+                <w:rFonts w:ascii="Calibri" w:hAnsi="Calibri"/>
+                <w:b/>
+                <w:i w:val="0"/>
+                <w:color w:val="003B71"/>
+                <w:sz w:val="17"/>
+              </w:rPr>
+              <w:t xml:space="preserve">Strategy  </w:t>
+            </w:r>
+            <w:r>
+              <w:rPr>
+                <w:rFonts w:ascii="Calibri" w:hAnsi="Calibri"/>
+                <w:b w:val="0"/>
+                <w:i w:val="0"/>
+                <w:color w:val="334155"/>
+                <w:sz w:val="17"/>
+              </w:rPr>
+              <w:t>Marketing team (cardiovascular) should monitor Vietnamese social media for rising "drug-free BP control" content frequency; if trend escalates through Q3/2025, coordinate with Medical Affairs to prepare HCP education materials reinforcing the irreplaceable role of pharmacotherapy (PECHAUNOX, TABAREX) in Grade 2+ hypertension and patients with comorbidities.</w:t>
+            </w:r>
+          </w:p>
+        </w:tc>
+      </w:tr>
+    </w:tbl>
+    <w:p>
+      <w:pPr>
+        <w:spacing w:before="40" w:after="120"/>
+      </w:pPr>
+    </w:p>
+    <w:tbl>
+      <w:tblPr>
+        <w:tblStyle w:val="TableGrid"/>
+        <w:tblW w:type="auto" w:w="0"/>
+        <w:jc w:val="left"/>
+        <w:tblLook w:firstColumn="1" w:firstRow="1" w:lastColumn="0" w:lastRow="0" w:noHBand="0" w:noVBand="1" w:val="04A0"/>
+      </w:tblPr>
+      <w:tblGrid>
+        <w:gridCol w:w="4536"/>
+        <w:gridCol w:w="4536"/>
+      </w:tblGrid>
+      <w:tr>
+        <w:tc>
+          <w:tcPr>
+            <w:tcW w:type="dxa" w:w="1984"/>
+            <w:shd w:val="clear" w:color="auto" w:fill="EEF2FF"/>
+            <w:tcBorders>
+              <w:top w:val="none" w:sz="6" w:color="auto"/>
+              <w:bottom w:val="none" w:sz="6" w:color="auto"/>
+              <w:left w:val="none" w:sz="6" w:color="auto"/>
+              <w:right w:val="none" w:sz="6" w:color="auto"/>
+            </w:tcBorders>
+          </w:tcPr>
+          <w:p>
+            <w:pPr>
+              <w:spacing w:before="80" w:after="80"/>
+              <w:ind w:left="85"/>
+            </w:pPr>
+            <w:r>
+              <w:rPr>
+                <w:rFonts w:ascii="Calibri" w:hAnsi="Calibri"/>
+                <w:b/>
+                <w:i w:val="0"/>
+                <w:color w:val="4338CA"/>
+                <w:sz w:val="15"/>
+              </w:rPr>
+              <w:t>VNEXPRESS – SỨC KHỎE</w:t>
+            </w:r>
+          </w:p>
+        </w:tc>
+        <w:tc>
+          <w:tcPr>
+            <w:tcW w:type="dxa" w:w="4536"/>
+            <w:tcBorders>
+              <w:top w:val="none" w:sz="6" w:color="auto"/>
+              <w:bottom w:val="none" w:sz="6" w:color="auto"/>
+              <w:left w:val="none" w:sz="6" w:color="auto"/>
+              <w:right w:val="none" w:sz="6" w:color="auto"/>
+            </w:tcBorders>
+          </w:tcPr>
+          <w:p>
+            <w:pPr>
+              <w:spacing w:before="60" w:after="60"/>
+              <w:ind w:left="113"/>
+            </w:pPr>
+            <w:r>
+              <w:rPr>
+                <w:rFonts w:ascii="Calibri" w:hAnsi="Calibri"/>
+                <w:b/>
+                <w:i w:val="0"/>
+                <w:color w:val="111827"/>
+                <w:sz w:val="21"/>
+              </w:rPr>
+              <w:t>Pediatric Neuroblastoma: High Cost Burden of Stem Cell Transplant Highlights Unmet Treatment Support Needs</w:t>
+            </w:r>
+          </w:p>
+        </w:tc>
+      </w:tr>
+    </w:tbl>
+    <w:p>
+      <w:pPr>
+        <w:spacing w:before="40" w:after="40"/>
+        <w:ind w:left="170"/>
+      </w:pPr>
+      <w:r>
+        <w:rPr>
+          <w:rFonts w:ascii="Calibri" w:hAnsi="Calibri"/>
+          <w:b w:val="0"/>
+          <w:i/>
+          <w:color w:val="6B7280"/>
+          <w:sz w:val="18"/>
+        </w:rPr>
+        <w:t>The article details the treatment journey of a pediatric neuroblastoma patient at Hue Central Hospital, where stem cell transplant costs reach VND 200–300 million — far beyond the means of low-income families. For Davipharm, this highlights the pediatric oncology ETC segment as high-need but heavily dependent on insurance reimbursement and social support funding.[Source]</w:t>
+      </w:r>
+    </w:p>
+    <w:p>
+      <w:pPr>
+        <w:spacing w:before="20" w:after="40"/>
+        <w:ind w:left="170"/>
+      </w:pPr>
+      <w:r>
+        <w:rPr>
+          <w:rFonts w:ascii="Calibri" w:hAnsi="Calibri"/>
+          <w:b/>
+          <w:i w:val="0"/>
+          <w:color w:val="374151"/>
+          <w:sz w:val="17"/>
+        </w:rPr>
+        <w:t>➖ No direct impact on Davipharm's current portfolio; however, signals continued demand for oncology supportive care — indirectly relevant to HYYR (Erlotinib) and LARRIVEY (Bicalutamide) positioning in provincial hospital ETC channels.</w:t>
+      </w:r>
+    </w:p>
+    <w:tbl>
+      <w:tblPr>
+        <w:tblStyle w:val="TableGrid"/>
+        <w:tblW w:type="auto" w:w="0"/>
+        <w:tblLook w:firstColumn="1" w:firstRow="1" w:lastColumn="0" w:lastRow="0" w:noHBand="0" w:noVBand="1" w:val="04A0"/>
+      </w:tblPr>
+      <w:tblGrid>
+        <w:gridCol w:w="9072"/>
+      </w:tblGrid>
+      <w:tr>
+        <w:tc>
+          <w:tcPr>
+            <w:tcW w:type="dxa" w:w="9072"/>
+            <w:shd w:val="clear" w:color="auto" w:fill="F8FAFC"/>
+            <w:tcBorders>
+              <w:top w:val="none" w:sz="6" w:color="auto"/>
+              <w:bottom w:val="none" w:sz="6" w:color="auto"/>
+              <w:left w:val="single" w:sz="12" w:color="003B71"/>
+              <w:right w:val="none" w:sz="6" w:color="auto"/>
+            </w:tcBorders>
+          </w:tcPr>
+          <w:p>
+            <w:pPr>
+              <w:spacing w:before="60" w:after="60"/>
+              <w:ind w:left="142"/>
+            </w:pPr>
+            <w:r>
+              <w:rPr>
+                <w:rFonts w:ascii="Calibri" w:hAnsi="Calibri"/>
+                <w:b/>
+                <w:i w:val="0"/>
+                <w:color w:val="003B71"/>
+                <w:sz w:val="17"/>
+              </w:rPr>
+              <w:t xml:space="preserve">Strategy  </w:t>
+            </w:r>
+            <w:r>
+              <w:rPr>
+                <w:rFonts w:ascii="Calibri" w:hAnsi="Calibri"/>
+                <w:b w:val="0"/>
+                <w:i w:val="0"/>
+                <w:color w:val="334155"/>
+                <w:sz w:val="17"/>
+              </w:rPr>
+              <w:t>ETC/Oncology team to log this as market context: growing demand for pediatric and late-stage cancer treatment at provincial hospitals remains constrained by insurance coverage — reinforcing the priority to secure HYYR (Erlotinib) and LARRIVEY (Bicalutamide) in the next tendering cycle's reimbursed formulary. No urgent action required; include in next quarterly market landscape update.</w:t>
+            </w:r>
+          </w:p>
+        </w:tc>
+      </w:tr>
+    </w:tbl>
+    <w:p>
+      <w:pPr>
+        <w:spacing w:before="40" w:after="120"/>
+      </w:pPr>
+    </w:p>
+    <w:tbl>
+      <w:tblPr>
+        <w:tblStyle w:val="TableGrid"/>
+        <w:tblW w:type="auto" w:w="0"/>
+        <w:jc w:val="left"/>
+        <w:tblLook w:firstColumn="1" w:firstRow="1" w:lastColumn="0" w:lastRow="0" w:noHBand="0" w:noVBand="1" w:val="04A0"/>
+      </w:tblPr>
+      <w:tblGrid>
+        <w:gridCol w:w="4536"/>
+        <w:gridCol w:w="4536"/>
+      </w:tblGrid>
+      <w:tr>
+        <w:tc>
+          <w:tcPr>
+            <w:tcW w:type="dxa" w:w="1984"/>
+            <w:shd w:val="clear" w:color="auto" w:fill="EEF2FF"/>
+            <w:tcBorders>
+              <w:top w:val="none" w:sz="6" w:color="auto"/>
+              <w:bottom w:val="none" w:sz="6" w:color="auto"/>
+              <w:left w:val="none" w:sz="6" w:color="auto"/>
+              <w:right w:val="none" w:sz="6" w:color="auto"/>
+            </w:tcBorders>
+          </w:tcPr>
+          <w:p>
+            <w:pPr>
+              <w:spacing w:before="80" w:after="80"/>
+              <w:ind w:left="85"/>
+            </w:pPr>
+            <w:r>
+              <w:rPr>
+                <w:rFonts w:ascii="Calibri" w:hAnsi="Calibri"/>
+                <w:b/>
+                <w:i w:val="0"/>
+                <w:color w:val="4338CA"/>
+                <w:sz w:val="15"/>
+              </w:rPr>
+              <w:t>VNEXPRESS – SỨC KHỎE</w:t>
+            </w:r>
+          </w:p>
+        </w:tc>
+        <w:tc>
+          <w:tcPr>
+            <w:tcW w:type="dxa" w:w="4536"/>
+            <w:tcBorders>
+              <w:top w:val="none" w:sz="6" w:color="auto"/>
+              <w:bottom w:val="none" w:sz="6" w:color="auto"/>
+              <w:left w:val="none" w:sz="6" w:color="auto"/>
+              <w:right w:val="none" w:sz="6" w:color="auto"/>
+            </w:tcBorders>
+          </w:tcPr>
+          <w:p>
+            <w:pPr>
+              <w:spacing w:before="60" w:after="60"/>
+              <w:ind w:left="113"/>
+            </w:pPr>
+            <w:r>
+              <w:rPr>
+                <w:rFonts w:ascii="Calibri" w:hAnsi="Calibri"/>
+                <w:b/>
+                <w:i w:val="0"/>
+                <w:color w:val="111827"/>
+                <w:sz w:val="21"/>
+              </w:rPr>
+              <w:t>Sleep Tips for Type 2 Diabetics: Patient Awareness Signal for EIMLER-10 &amp; ZLATKO</w:t>
+            </w:r>
+          </w:p>
+        </w:tc>
+      </w:tr>
+    </w:tbl>
+    <w:p>
+      <w:pPr>
+        <w:spacing w:before="40" w:after="40"/>
+        <w:ind w:left="170"/>
+      </w:pPr>
+      <w:r>
+        <w:rPr>
+          <w:rFonts w:ascii="Calibri" w:hAnsi="Calibri"/>
+          <w:b w:val="0"/>
+          <w:i/>
+          <w:color w:val="6B7280"/>
+          <w:sz w:val="18"/>
+        </w:rPr>
+        <w:t>This widely-read VnExpress article highlights type 2 diabetes complications (peripheral neuropathy, sleep apnea) and the critical role of blood glucose control, indirectly increasing treatment awareness among patients. This supports sustained market demand for Davipharm's EIMLER-10 (Empagliflozin) and ZLATKO (Sitagliptin).[Source]</w:t>
+      </w:r>
+    </w:p>
+    <w:p>
+      <w:pPr>
+        <w:spacing w:before="20" w:after="40"/>
+        <w:ind w:left="170"/>
+      </w:pPr>
+      <w:r>
+        <w:rPr>
+          <w:rFonts w:ascii="Calibri" w:hAnsi="Calibri"/>
+          <w:b/>
+          <w:i w:val="0"/>
+          <w:color w:val="374151"/>
+          <w:sz w:val="17"/>
+        </w:rPr>
+        <w:t>📊 Neutral signal — educational content with no direct ETC revenue impact, but reflects growing patient engagement with type 2 diabetes management, a core target segment for EIMLER-10 and ZLATKO.</w:t>
+      </w:r>
+    </w:p>
+    <w:tbl>
+      <w:tblPr>
+        <w:tblStyle w:val="TableGrid"/>
+        <w:tblW w:type="auto" w:w="0"/>
+        <w:tblLook w:firstColumn="1" w:firstRow="1" w:lastColumn="0" w:lastRow="0" w:noHBand="0" w:noVBand="1" w:val="04A0"/>
+      </w:tblPr>
+      <w:tblGrid>
+        <w:gridCol w:w="9072"/>
+      </w:tblGrid>
+      <w:tr>
+        <w:tc>
+          <w:tcPr>
+            <w:tcW w:type="dxa" w:w="9072"/>
+            <w:shd w:val="clear" w:color="auto" w:fill="F8FAFC"/>
+            <w:tcBorders>
+              <w:top w:val="none" w:sz="6" w:color="auto"/>
+              <w:bottom w:val="none" w:sz="6" w:color="auto"/>
+              <w:left w:val="single" w:sz="12" w:color="003B71"/>
+              <w:right w:val="none" w:sz="6" w:color="auto"/>
+            </w:tcBorders>
+          </w:tcPr>
+          <w:p>
+            <w:pPr>
+              <w:spacing w:before="60" w:after="60"/>
+              <w:ind w:left="142"/>
+            </w:pPr>
+            <w:r>
+              <w:rPr>
+                <w:rFonts w:ascii="Calibri" w:hAnsi="Calibri"/>
+                <w:b/>
+                <w:i w:val="0"/>
+                <w:color w:val="003B71"/>
+                <w:sz w:val="17"/>
+              </w:rPr>
+              <w:t xml:space="preserve">Strategy  </w:t>
+            </w:r>
+            <w:r>
+              <w:rPr>
+                <w:rFonts w:ascii="Calibri" w:hAnsi="Calibri"/>
+                <w:b w:val="0"/>
+                <w:i w:val="0"/>
+                <w:color w:val="334155"/>
+                <w:sz w:val="17"/>
+              </w:rPr>
+              <w:t>Marketing Team should leverage growing diabetes complication awareness to reinforce detailing materials for EIMLER-10 and ZLATKO, emphasizing sustained glycemic control benefits when engaging primary care prescribers by Q3/2025.</w:t>
+            </w:r>
+          </w:p>
+        </w:tc>
+      </w:tr>
+    </w:tbl>
+    <w:p>
+      <w:pPr>
+        <w:spacing w:before="40" w:after="120"/>
+      </w:pPr>
+    </w:p>
+    <w:tbl>
+      <w:tblPr>
+        <w:tblStyle w:val="TableGrid"/>
+        <w:tblW w:type="auto" w:w="0"/>
+        <w:jc w:val="left"/>
+        <w:tblLook w:firstColumn="1" w:firstRow="1" w:lastColumn="0" w:lastRow="0" w:noHBand="0" w:noVBand="1" w:val="04A0"/>
+      </w:tblPr>
+      <w:tblGrid>
+        <w:gridCol w:w="4536"/>
+        <w:gridCol w:w="4536"/>
+      </w:tblGrid>
+      <w:tr>
+        <w:tc>
+          <w:tcPr>
+            <w:tcW w:type="dxa" w:w="1984"/>
+            <w:shd w:val="clear" w:color="auto" w:fill="EEF2FF"/>
+            <w:tcBorders>
+              <w:top w:val="none" w:sz="6" w:color="auto"/>
+              <w:bottom w:val="none" w:sz="6" w:color="auto"/>
+              <w:left w:val="none" w:sz="6" w:color="auto"/>
+              <w:right w:val="none" w:sz="6" w:color="auto"/>
+            </w:tcBorders>
+          </w:tcPr>
+          <w:p>
+            <w:pPr>
+              <w:spacing w:before="80" w:after="80"/>
+              <w:ind w:left="85"/>
+            </w:pPr>
+            <w:r>
+              <w:rPr>
+                <w:rFonts w:ascii="Calibri" w:hAnsi="Calibri"/>
+                <w:b/>
+                <w:i w:val="0"/>
+                <w:color w:val="4338CA"/>
+                <w:sz w:val="15"/>
+              </w:rPr>
               <w:t>SK&amp;ĐS – DƯỢC MỸ PHẨM</w:t>
             </w:r>
           </w:p>
@@ -2263,942 +3355,6 @@
                 <w:sz w:val="17"/>
               </w:rPr>
               <w:t>Marketing &amp; Medical Affairs team should develop KOL/CME materials leveraging Stanford data to position an "early intervention at 40+" strategy — prioritizing RAVASTEL (LDL control), EIMLER-10 (renal/cardiac protection), ZENTOGOUT (uric acid management), and PECHAUNOX (blood pressure) in Q3/2025; coordinate with Sales team to expand detailing in endocrinology and cardiology clinics targeting the 40–65 age segment.</w:t>
-            </w:r>
-          </w:p>
-        </w:tc>
-      </w:tr>
-    </w:tbl>
-    <w:p>
-      <w:pPr>
-        <w:spacing w:before="40" w:after="120"/>
-      </w:pPr>
-    </w:p>
-    <w:tbl>
-      <w:tblPr>
-        <w:tblStyle w:val="TableGrid"/>
-        <w:tblW w:type="auto" w:w="0"/>
-        <w:jc w:val="left"/>
-        <w:tblLook w:firstColumn="1" w:firstRow="1" w:lastColumn="0" w:lastRow="0" w:noHBand="0" w:noVBand="1" w:val="04A0"/>
-      </w:tblPr>
-      <w:tblGrid>
-        <w:gridCol w:w="4536"/>
-        <w:gridCol w:w="4536"/>
-      </w:tblGrid>
-      <w:tr>
-        <w:tc>
-          <w:tcPr>
-            <w:tcW w:type="dxa" w:w="1984"/>
-            <w:shd w:val="clear" w:color="auto" w:fill="EEF2FF"/>
-            <w:tcBorders>
-              <w:top w:val="none" w:sz="6" w:color="auto"/>
-              <w:bottom w:val="none" w:sz="6" w:color="auto"/>
-              <w:left w:val="none" w:sz="6" w:color="auto"/>
-              <w:right w:val="none" w:sz="6" w:color="auto"/>
-            </w:tcBorders>
-          </w:tcPr>
-          <w:p>
-            <w:pPr>
-              <w:spacing w:before="80" w:after="80"/>
-              <w:ind w:left="85"/>
-            </w:pPr>
-            <w:r>
-              <w:rPr>
-                <w:rFonts w:ascii="Calibri" w:hAnsi="Calibri"/>
-                <w:b/>
-                <w:i w:val="0"/>
-                <w:color w:val="4338CA"/>
-                <w:sz w:val="15"/>
-              </w:rPr>
-              <w:t>VNEXPRESS – SỨC KHỎE</w:t>
-            </w:r>
-          </w:p>
-        </w:tc>
-        <w:tc>
-          <w:tcPr>
-            <w:tcW w:type="dxa" w:w="4536"/>
-            <w:tcBorders>
-              <w:top w:val="none" w:sz="6" w:color="auto"/>
-              <w:bottom w:val="none" w:sz="6" w:color="auto"/>
-              <w:left w:val="none" w:sz="6" w:color="auto"/>
-              <w:right w:val="none" w:sz="6" w:color="auto"/>
-            </w:tcBorders>
-          </w:tcPr>
-          <w:p>
-            <w:pPr>
-              <w:spacing w:before="60" w:after="60"/>
-              <w:ind w:left="113"/>
-            </w:pPr>
-            <w:r>
-              <w:rPr>
-                <w:rFonts w:ascii="Calibri" w:hAnsi="Calibri"/>
-                <w:b/>
-                <w:i w:val="0"/>
-                <w:color w:val="111827"/>
-                <w:sz w:val="21"/>
-              </w:rPr>
-              <w:t>Pancreatic Cancer Overview: Awareness Opportunity for Davipharm Oncology Portfolio (HYYR – Erlotinib)</w:t>
-            </w:r>
-          </w:p>
-        </w:tc>
-      </w:tr>
-    </w:tbl>
-    <w:p>
-      <w:pPr>
-        <w:spacing w:before="40" w:after="40"/>
-        <w:ind w:left="170"/>
-      </w:pPr>
-      <w:r>
-        <w:rPr>
-          <w:rFonts w:ascii="Calibri" w:hAnsi="Calibri"/>
-          <w:b w:val="0"/>
-          <w:i/>
-          <w:color w:val="6B7280"/>
-          <w:sz w:val="18"/>
-        </w:rPr>
-        <w:t>This VnExpress health guide raises public awareness of pancreatic cancer — a malignancy with poor prognosis, late-stage diagnosis, and growing treatment demand in Vietnam. Erlotinib (HYYR) holds an approved indication for pancreatic cancer alongside NSCLC, presenting a niche but relevant opportunity for Davipharm's oncology team.[Source]</w:t>
-      </w:r>
-    </w:p>
-    <w:p>
-      <w:pPr>
-        <w:spacing w:before="20" w:after="40"/>
-        <w:ind w:left="170"/>
-      </w:pPr>
-      <w:r>
-        <w:rPr>
-          <w:rFonts w:ascii="Calibri" w:hAnsi="Calibri"/>
-          <w:b/>
-          <w:i w:val="0"/>
-          <w:color w:val="374151"/>
-          <w:sz w:val="17"/>
-        </w:rPr>
-        <w:t>📊 Background market awareness signal — no immediate revenue impact, but provides a foundation for the Oncology team to develop medical communication around HYYR's pancreatic cancer indication.</w:t>
-      </w:r>
-    </w:p>
-    <w:tbl>
-      <w:tblPr>
-        <w:tblStyle w:val="TableGrid"/>
-        <w:tblW w:type="auto" w:w="0"/>
-        <w:tblLook w:firstColumn="1" w:firstRow="1" w:lastColumn="0" w:lastRow="0" w:noHBand="0" w:noVBand="1" w:val="04A0"/>
-      </w:tblPr>
-      <w:tblGrid>
-        <w:gridCol w:w="9072"/>
-      </w:tblGrid>
-      <w:tr>
-        <w:tc>
-          <w:tcPr>
-            <w:tcW w:type="dxa" w:w="9072"/>
-            <w:shd w:val="clear" w:color="auto" w:fill="F8FAFC"/>
-            <w:tcBorders>
-              <w:top w:val="none" w:sz="6" w:color="auto"/>
-              <w:bottom w:val="none" w:sz="6" w:color="auto"/>
-              <w:left w:val="single" w:sz="12" w:color="003B71"/>
-              <w:right w:val="none" w:sz="6" w:color="auto"/>
-            </w:tcBorders>
-          </w:tcPr>
-          <w:p>
-            <w:pPr>
-              <w:spacing w:before="60" w:after="60"/>
-              <w:ind w:left="142"/>
-            </w:pPr>
-            <w:r>
-              <w:rPr>
-                <w:rFonts w:ascii="Calibri" w:hAnsi="Calibri"/>
-                <w:b/>
-                <w:i w:val="0"/>
-                <w:color w:val="003B71"/>
-                <w:sz w:val="17"/>
-              </w:rPr>
-              <w:t xml:space="preserve">Strategy  </w:t>
-            </w:r>
-            <w:r>
-              <w:rPr>
-                <w:rFonts w:ascii="Calibri" w:hAnsi="Calibri"/>
-                <w:b w:val="0"/>
-                <w:i w:val="0"/>
-                <w:color w:val="334155"/>
-                <w:sz w:val="17"/>
-              </w:rPr>
-              <w:t>Oncology team, in coordination with Medical Affairs, should review HYYR (Erlotinib)'s registered indication for advanced pancreatic cancer and develop KOL/oncologist-facing materials targeting key hospitals (K Hospital, Cho Ray, HCMC Oncology) by Q3/2025.</w:t>
-            </w:r>
-          </w:p>
-        </w:tc>
-      </w:tr>
-    </w:tbl>
-    <w:p>
-      <w:pPr>
-        <w:spacing w:before="40" w:after="120"/>
-      </w:pPr>
-    </w:p>
-    <w:tbl>
-      <w:tblPr>
-        <w:tblStyle w:val="TableGrid"/>
-        <w:tblW w:type="auto" w:w="0"/>
-        <w:jc w:val="left"/>
-        <w:tblLook w:firstColumn="1" w:firstRow="1" w:lastColumn="0" w:lastRow="0" w:noHBand="0" w:noVBand="1" w:val="04A0"/>
-      </w:tblPr>
-      <w:tblGrid>
-        <w:gridCol w:w="4536"/>
-        <w:gridCol w:w="4536"/>
-      </w:tblGrid>
-      <w:tr>
-        <w:tc>
-          <w:tcPr>
-            <w:tcW w:type="dxa" w:w="1984"/>
-            <w:shd w:val="clear" w:color="auto" w:fill="EEF2FF"/>
-            <w:tcBorders>
-              <w:top w:val="none" w:sz="6" w:color="auto"/>
-              <w:bottom w:val="none" w:sz="6" w:color="auto"/>
-              <w:left w:val="none" w:sz="6" w:color="auto"/>
-              <w:right w:val="none" w:sz="6" w:color="auto"/>
-            </w:tcBorders>
-          </w:tcPr>
-          <w:p>
-            <w:pPr>
-              <w:spacing w:before="80" w:after="80"/>
-              <w:ind w:left="85"/>
-            </w:pPr>
-            <w:r>
-              <w:rPr>
-                <w:rFonts w:ascii="Calibri" w:hAnsi="Calibri"/>
-                <w:b/>
-                <w:i w:val="0"/>
-                <w:color w:val="4338CA"/>
-                <w:sz w:val="15"/>
-              </w:rPr>
-              <w:t>VNEXPRESS – SỨC KHỎE</w:t>
-            </w:r>
-          </w:p>
-        </w:tc>
-        <w:tc>
-          <w:tcPr>
-            <w:tcW w:type="dxa" w:w="4536"/>
-            <w:tcBorders>
-              <w:top w:val="none" w:sz="6" w:color="auto"/>
-              <w:bottom w:val="none" w:sz="6" w:color="auto"/>
-              <w:left w:val="none" w:sz="6" w:color="auto"/>
-              <w:right w:val="none" w:sz="6" w:color="auto"/>
-            </w:tcBorders>
-          </w:tcPr>
-          <w:p>
-            <w:pPr>
-              <w:spacing w:before="60" w:after="60"/>
-              <w:ind w:left="113"/>
-            </w:pPr>
-            <w:r>
-              <w:rPr>
-                <w:rFonts w:ascii="Calibri" w:hAnsi="Calibri"/>
-                <w:b/>
-                <w:i w:val="0"/>
-                <w:color w:val="111827"/>
-                <w:sz w:val="21"/>
-              </w:rPr>
-              <w:t>Colorectal Cancer: ~17,000 New Cases/Year in Vietnam — Market Opportunity for Supportive Therapy Protocols</w:t>
-            </w:r>
-          </w:p>
-        </w:tc>
-      </w:tr>
-    </w:tbl>
-    <w:p>
-      <w:pPr>
-        <w:spacing w:before="40" w:after="40"/>
-        <w:ind w:left="170"/>
-      </w:pPr>
-      <w:r>
-        <w:rPr>
-          <w:rFonts w:ascii="Calibri" w:hAnsi="Calibri"/>
-          <w:b w:val="0"/>
-          <w:i/>
-          <w:color w:val="6B7280"/>
-          <w:sz w:val="18"/>
-        </w:rPr>
-        <w:t>Tam Anh Hospital's adoption of Da Vinci Xi robotics reflects the upgrading trend among major private hospitals in colorectal cancer treatment; Globocan 2022 records 16,000–17,000 new colorectal cancer cases and over 8,400 deaths annually in Vietnam. This patient segment—complex, multi-morbid (cardiovascular, thrombotic, GI)—generates strong demand for peri-operative supportive therapies within Davipharm's portfolio.[Source]</w:t>
-      </w:r>
-    </w:p>
-    <w:p>
-      <w:pPr>
-        <w:spacing w:before="20" w:after="40"/>
-        <w:ind w:left="170"/>
-      </w:pPr>
-      <w:r>
-        <w:rPr>
-          <w:rFonts w:ascii="Calibri" w:hAnsi="Calibri"/>
-          <w:b/>
-          <w:i w:val="0"/>
-          <w:color w:val="166534"/>
-          <w:sz w:val="17"/>
-        </w:rPr>
-        <w:t>🟢 Multi-morbid colorectal cancer patients open cross-listing opportunities for JIRACEK (Esomeprazole), PECHAUNOX (Perindopril+Amlodipine), ZABALES (Clopidogrel), and LARRIVEY (Bicalutamide) in premium private hospital channels.</w:t>
-      </w:r>
-    </w:p>
-    <w:tbl>
-      <w:tblPr>
-        <w:tblStyle w:val="TableGrid"/>
-        <w:tblW w:type="auto" w:w="0"/>
-        <w:tblLook w:firstColumn="1" w:firstRow="1" w:lastColumn="0" w:lastRow="0" w:noHBand="0" w:noVBand="1" w:val="04A0"/>
-      </w:tblPr>
-      <w:tblGrid>
-        <w:gridCol w:w="9072"/>
-      </w:tblGrid>
-      <w:tr>
-        <w:tc>
-          <w:tcPr>
-            <w:tcW w:type="dxa" w:w="9072"/>
-            <w:shd w:val="clear" w:color="auto" w:fill="F8FAFC"/>
-            <w:tcBorders>
-              <w:top w:val="none" w:sz="6" w:color="auto"/>
-              <w:bottom w:val="none" w:sz="6" w:color="auto"/>
-              <w:left w:val="single" w:sz="12" w:color="003B71"/>
-              <w:right w:val="none" w:sz="6" w:color="auto"/>
-            </w:tcBorders>
-          </w:tcPr>
-          <w:p>
-            <w:pPr>
-              <w:spacing w:before="60" w:after="60"/>
-              <w:ind w:left="142"/>
-            </w:pPr>
-            <w:r>
-              <w:rPr>
-                <w:rFonts w:ascii="Calibri" w:hAnsi="Calibri"/>
-                <w:b/>
-                <w:i w:val="0"/>
-                <w:color w:val="003B71"/>
-                <w:sz w:val="17"/>
-              </w:rPr>
-              <w:t xml:space="preserve">Strategy  </w:t>
-            </w:r>
-            <w:r>
-              <w:rPr>
-                <w:rFonts w:ascii="Calibri" w:hAnsi="Calibri"/>
-                <w:b w:val="0"/>
-                <w:i w:val="0"/>
-                <w:color w:val="334155"/>
-                <w:sz w:val="17"/>
-              </w:rPr>
-              <w:t>Medical Affairs team, in collaboration with ETC Sales, should develop a scientific dossier targeting peri-operative supportive protocols at private hospitals with oncology/GI surgery departments (Tam Anh, Vinmec, FV), prioritizing JIRACEK (mucosal protection post-surgery), PECHAUNOX/ZABALES (cardiovascular-thrombotic comorb</w:t>
-            </w:r>
-          </w:p>
-        </w:tc>
-      </w:tr>
-    </w:tbl>
-    <w:p>
-      <w:pPr>
-        <w:spacing w:before="40" w:after="120"/>
-      </w:pPr>
-    </w:p>
-    <w:tbl>
-      <w:tblPr>
-        <w:tblStyle w:val="TableGrid"/>
-        <w:tblW w:type="auto" w:w="0"/>
-        <w:jc w:val="left"/>
-        <w:tblLook w:firstColumn="1" w:firstRow="1" w:lastColumn="0" w:lastRow="0" w:noHBand="0" w:noVBand="1" w:val="04A0"/>
-      </w:tblPr>
-      <w:tblGrid>
-        <w:gridCol w:w="4536"/>
-        <w:gridCol w:w="4536"/>
-      </w:tblGrid>
-      <w:tr>
-        <w:tc>
-          <w:tcPr>
-            <w:tcW w:type="dxa" w:w="1984"/>
-            <w:shd w:val="clear" w:color="auto" w:fill="EEF2FF"/>
-            <w:tcBorders>
-              <w:top w:val="none" w:sz="6" w:color="auto"/>
-              <w:bottom w:val="none" w:sz="6" w:color="auto"/>
-              <w:left w:val="none" w:sz="6" w:color="auto"/>
-              <w:right w:val="none" w:sz="6" w:color="auto"/>
-            </w:tcBorders>
-          </w:tcPr>
-          <w:p>
-            <w:pPr>
-              <w:spacing w:before="80" w:after="80"/>
-              <w:ind w:left="85"/>
-            </w:pPr>
-            <w:r>
-              <w:rPr>
-                <w:rFonts w:ascii="Calibri" w:hAnsi="Calibri"/>
-                <w:b/>
-                <w:i w:val="0"/>
-                <w:color w:val="4338CA"/>
-                <w:sz w:val="15"/>
-              </w:rPr>
-              <w:t>VNEXPRESS – SỨC KHỎE</w:t>
-            </w:r>
-          </w:p>
-        </w:tc>
-        <w:tc>
-          <w:tcPr>
-            <w:tcW w:type="dxa" w:w="4536"/>
-            <w:tcBorders>
-              <w:top w:val="none" w:sz="6" w:color="auto"/>
-              <w:bottom w:val="none" w:sz="6" w:color="auto"/>
-              <w:left w:val="none" w:sz="6" w:color="auto"/>
-              <w:right w:val="none" w:sz="6" w:color="auto"/>
-            </w:tcBorders>
-          </w:tcPr>
-          <w:p>
-            <w:pPr>
-              <w:spacing w:before="60" w:after="60"/>
-              <w:ind w:left="113"/>
-            </w:pPr>
-            <w:r>
-              <w:rPr>
-                <w:rFonts w:ascii="Calibri" w:hAnsi="Calibri"/>
-                <w:b/>
-                <w:i w:val="0"/>
-                <w:color w:val="111827"/>
-                <w:sz w:val="21"/>
-              </w:rPr>
-              <w:t>Breast Cancer Affects Younger Women via Multi-modal Treatment — Oncology Portfolio Opportunity for Davipharm</w:t>
-            </w:r>
-          </w:p>
-        </w:tc>
-      </w:tr>
-    </w:tbl>
-    <w:p>
-      <w:pPr>
-        <w:spacing w:before="40" w:after="40"/>
-        <w:ind w:left="170"/>
-      </w:pPr>
-      <w:r>
-        <w:rPr>
-          <w:rFonts w:ascii="Calibri" w:hAnsi="Calibri"/>
-          <w:b w:val="0"/>
-          <w:i/>
-          <w:color w:val="6B7280"/>
-          <w:sz w:val="18"/>
-        </w:rPr>
-        <w:t>A specialist from Tam Anh Hospital confirms the rejuvenation trend in breast cancer and increasing use of multi-modal therapy (radiation, chemotherapy, hormone therapy) lasting 5–10 years, driving sustained demand for oncology-endocrine drugs. Davipharm's current oncology portfolio (LARRIVEY/Bicalutamide, HYYR/Erlotinib) lacks direct coverage of hormone receptor-positive breast cancer — a strategic gap.[Source]</w:t>
-      </w:r>
-    </w:p>
-    <w:p>
-      <w:pPr>
-        <w:spacing w:before="20" w:after="40"/>
-        <w:ind w:left="170"/>
-      </w:pPr>
-      <w:r>
-        <w:rPr>
-          <w:rFonts w:ascii="Calibri" w:hAnsi="Calibri"/>
-          <w:b/>
-          <w:i w:val="0"/>
-          <w:color w:val="374151"/>
-          <w:sz w:val="17"/>
-        </w:rPr>
-        <w:t>🔍 Watch signal: the hormone receptor-positive breast cancer segment is expanding, but Davipharm currently lacks a directly competitive product to capture this growing demand.</w:t>
-      </w:r>
-    </w:p>
-    <w:tbl>
-      <w:tblPr>
-        <w:tblStyle w:val="TableGrid"/>
-        <w:tblW w:type="auto" w:w="0"/>
-        <w:tblLook w:firstColumn="1" w:firstRow="1" w:lastColumn="0" w:lastRow="0" w:noHBand="0" w:noVBand="1" w:val="04A0"/>
-      </w:tblPr>
-      <w:tblGrid>
-        <w:gridCol w:w="9072"/>
-      </w:tblGrid>
-      <w:tr>
-        <w:tc>
-          <w:tcPr>
-            <w:tcW w:type="dxa" w:w="9072"/>
-            <w:shd w:val="clear" w:color="auto" w:fill="F8FAFC"/>
-            <w:tcBorders>
-              <w:top w:val="none" w:sz="6" w:color="auto"/>
-              <w:bottom w:val="none" w:sz="6" w:color="auto"/>
-              <w:left w:val="single" w:sz="12" w:color="003B71"/>
-              <w:right w:val="none" w:sz="6" w:color="auto"/>
-            </w:tcBorders>
-          </w:tcPr>
-          <w:p>
-            <w:pPr>
-              <w:spacing w:before="60" w:after="60"/>
-              <w:ind w:left="142"/>
-            </w:pPr>
-            <w:r>
-              <w:rPr>
-                <w:rFonts w:ascii="Calibri" w:hAnsi="Calibri"/>
-                <w:b/>
-                <w:i w:val="0"/>
-                <w:color w:val="003B71"/>
-                <w:sz w:val="17"/>
-              </w:rPr>
-              <w:t xml:space="preserve">Strategy  </w:t>
-            </w:r>
-            <w:r>
-              <w:rPr>
-                <w:rFonts w:ascii="Calibri" w:hAnsi="Calibri"/>
-                <w:b w:val="0"/>
-                <w:i w:val="0"/>
-                <w:color w:val="334155"/>
-                <w:sz w:val="17"/>
-              </w:rPr>
-              <w:t>Business Development &amp; Oncology team should assess feasibility of expanding the portfolio into breast cancer hormone therapy (aromatase inhibitors/anti-estrogens); Marketing team to reinforce LARRIVEY brand presence at oncology conferences in the interim. Recommend opportunity assessment report to BOD by Q3/2025.</w:t>
-            </w:r>
-          </w:p>
-        </w:tc>
-      </w:tr>
-    </w:tbl>
-    <w:p>
-      <w:pPr>
-        <w:spacing w:before="40" w:after="120"/>
-      </w:pPr>
-    </w:p>
-    <w:tbl>
-      <w:tblPr>
-        <w:tblStyle w:val="TableGrid"/>
-        <w:tblW w:type="auto" w:w="0"/>
-        <w:jc w:val="left"/>
-        <w:tblLook w:firstColumn="1" w:firstRow="1" w:lastColumn="0" w:lastRow="0" w:noHBand="0" w:noVBand="1" w:val="04A0"/>
-      </w:tblPr>
-      <w:tblGrid>
-        <w:gridCol w:w="4536"/>
-        <w:gridCol w:w="4536"/>
-      </w:tblGrid>
-      <w:tr>
-        <w:tc>
-          <w:tcPr>
-            <w:tcW w:type="dxa" w:w="1984"/>
-            <w:shd w:val="clear" w:color="auto" w:fill="EEF2FF"/>
-            <w:tcBorders>
-              <w:top w:val="none" w:sz="6" w:color="auto"/>
-              <w:bottom w:val="none" w:sz="6" w:color="auto"/>
-              <w:left w:val="none" w:sz="6" w:color="auto"/>
-              <w:right w:val="none" w:sz="6" w:color="auto"/>
-            </w:tcBorders>
-          </w:tcPr>
-          <w:p>
-            <w:pPr>
-              <w:spacing w:before="80" w:after="80"/>
-              <w:ind w:left="85"/>
-            </w:pPr>
-            <w:r>
-              <w:rPr>
-                <w:rFonts w:ascii="Calibri" w:hAnsi="Calibri"/>
-                <w:b/>
-                <w:i w:val="0"/>
-                <w:color w:val="4338CA"/>
-                <w:sz w:val="15"/>
-              </w:rPr>
-              <w:t>VIETNAMPLUS – SỨC KHỎE</w:t>
-            </w:r>
-          </w:p>
-        </w:tc>
-        <w:tc>
-          <w:tcPr>
-            <w:tcW w:type="dxa" w:w="4536"/>
-            <w:tcBorders>
-              <w:top w:val="none" w:sz="6" w:color="auto"/>
-              <w:bottom w:val="none" w:sz="6" w:color="auto"/>
-              <w:left w:val="none" w:sz="6" w:color="auto"/>
-              <w:right w:val="none" w:sz="6" w:color="auto"/>
-            </w:tcBorders>
-          </w:tcPr>
-          <w:p>
-            <w:pPr>
-              <w:spacing w:before="60" w:after="60"/>
-              <w:ind w:left="113"/>
-            </w:pPr>
-            <w:r>
-              <w:rPr>
-                <w:rFonts w:ascii="Calibri" w:hAnsi="Calibri"/>
-                <w:b/>
-                <w:i w:val="0"/>
-                <w:color w:val="111827"/>
-                <w:sz w:val="21"/>
-              </w:rPr>
-              <w:t>Off-Topic Geopolitical News — No Relevance to Vietnamese Pharma Sector</w:t>
-            </w:r>
-          </w:p>
-        </w:tc>
-      </w:tr>
-    </w:tbl>
-    <w:p>
-      <w:pPr>
-        <w:spacing w:before="40" w:after="40"/>
-        <w:ind w:left="170"/>
-      </w:pPr>
-      <w:r>
-        <w:rPr>
-          <w:rFonts w:ascii="Calibri" w:hAnsi="Calibri"/>
-          <w:b w:val="0"/>
-          <w:i/>
-          <w:color w:val="6B7280"/>
-          <w:sz w:val="18"/>
-        </w:rPr>
-        <w:t>The article covers geopolitical disputes between the US, NATO, and Greenland — entirely outside the scope of the Vietnamese pharmaceutical market. No actionable market signals relevant to Davipharm's operations are present.[Source]</w:t>
-      </w:r>
-    </w:p>
-    <w:p>
-      <w:pPr>
-        <w:spacing w:before="20" w:after="40"/>
-        <w:ind w:left="170"/>
-      </w:pPr>
-      <w:r>
-        <w:rPr>
-          <w:rFonts w:ascii="Calibri" w:hAnsi="Calibri"/>
-          <w:b/>
-          <w:i w:val="0"/>
-          <w:color w:val="374151"/>
-          <w:sz w:val="17"/>
-        </w:rPr>
-        <w:t>⚪ No direct impact on Davipharm — this article falls outside the pharmaceutical market intelligence scope.</w:t>
-      </w:r>
-    </w:p>
-    <w:tbl>
-      <w:tblPr>
-        <w:tblStyle w:val="TableGrid"/>
-        <w:tblW w:type="auto" w:w="0"/>
-        <w:tblLook w:firstColumn="1" w:firstRow="1" w:lastColumn="0" w:lastRow="0" w:noHBand="0" w:noVBand="1" w:val="04A0"/>
-      </w:tblPr>
-      <w:tblGrid>
-        <w:gridCol w:w="9072"/>
-      </w:tblGrid>
-      <w:tr>
-        <w:tc>
-          <w:tcPr>
-            <w:tcW w:type="dxa" w:w="9072"/>
-            <w:shd w:val="clear" w:color="auto" w:fill="F8FAFC"/>
-            <w:tcBorders>
-              <w:top w:val="none" w:sz="6" w:color="auto"/>
-              <w:bottom w:val="none" w:sz="6" w:color="auto"/>
-              <w:left w:val="single" w:sz="12" w:color="003B71"/>
-              <w:right w:val="none" w:sz="6" w:color="auto"/>
-            </w:tcBorders>
-          </w:tcPr>
-          <w:p>
-            <w:pPr>
-              <w:spacing w:before="60" w:after="60"/>
-              <w:ind w:left="142"/>
-            </w:pPr>
-            <w:r>
-              <w:rPr>
-                <w:rFonts w:ascii="Calibri" w:hAnsi="Calibri"/>
-                <w:b/>
-                <w:i w:val="0"/>
-                <w:color w:val="003B71"/>
-                <w:sz w:val="17"/>
-              </w:rPr>
-              <w:t xml:space="preserve">Strategy  </w:t>
-            </w:r>
-            <w:r>
-              <w:rPr>
-                <w:rFonts w:ascii="Calibri" w:hAnsi="Calibri"/>
-                <w:b w:val="0"/>
-                <w:i w:val="0"/>
-                <w:color w:val="334155"/>
-                <w:sz w:val="17"/>
-              </w:rPr>
-              <w:t>Recommend source filter refinement: reconfigure keyword filters to exclude irrelevant geopolitical content and improve BOD report quality. No strategic action required from this article.</w:t>
-            </w:r>
-          </w:p>
-        </w:tc>
-      </w:tr>
-    </w:tbl>
-    <w:p>
-      <w:pPr>
-        <w:spacing w:before="40" w:after="120"/>
-      </w:pPr>
-    </w:p>
-    <w:tbl>
-      <w:tblPr>
-        <w:tblStyle w:val="TableGrid"/>
-        <w:tblW w:type="auto" w:w="0"/>
-        <w:jc w:val="left"/>
-        <w:tblLook w:firstColumn="1" w:firstRow="1" w:lastColumn="0" w:lastRow="0" w:noHBand="0" w:noVBand="1" w:val="04A0"/>
-      </w:tblPr>
-      <w:tblGrid>
-        <w:gridCol w:w="4536"/>
-        <w:gridCol w:w="4536"/>
-      </w:tblGrid>
-      <w:tr>
-        <w:tc>
-          <w:tcPr>
-            <w:tcW w:type="dxa" w:w="1984"/>
-            <w:shd w:val="clear" w:color="auto" w:fill="EEF2FF"/>
-            <w:tcBorders>
-              <w:top w:val="none" w:sz="6" w:color="auto"/>
-              <w:bottom w:val="none" w:sz="6" w:color="auto"/>
-              <w:left w:val="none" w:sz="6" w:color="auto"/>
-              <w:right w:val="none" w:sz="6" w:color="auto"/>
-            </w:tcBorders>
-          </w:tcPr>
-          <w:p>
-            <w:pPr>
-              <w:spacing w:before="80" w:after="80"/>
-              <w:ind w:left="85"/>
-            </w:pPr>
-            <w:r>
-              <w:rPr>
-                <w:rFonts w:ascii="Calibri" w:hAnsi="Calibri"/>
-                <w:b/>
-                <w:i w:val="0"/>
-                <w:color w:val="4338CA"/>
-                <w:sz w:val="15"/>
-              </w:rPr>
-              <w:t>VIETNAMPLUS – SỨC KHỎE</w:t>
-            </w:r>
-          </w:p>
-        </w:tc>
-        <w:tc>
-          <w:tcPr>
-            <w:tcW w:type="dxa" w:w="4536"/>
-            <w:tcBorders>
-              <w:top w:val="none" w:sz="6" w:color="auto"/>
-              <w:bottom w:val="none" w:sz="6" w:color="auto"/>
-              <w:left w:val="none" w:sz="6" w:color="auto"/>
-              <w:right w:val="none" w:sz="6" w:color="auto"/>
-            </w:tcBorders>
-          </w:tcPr>
-          <w:p>
-            <w:pPr>
-              <w:spacing w:before="60" w:after="60"/>
-              <w:ind w:left="113"/>
-            </w:pPr>
-            <w:r>
-              <w:rPr>
-                <w:rFonts w:ascii="Calibri" w:hAnsi="Calibri"/>
-                <w:b/>
-                <w:i w:val="0"/>
-                <w:color w:val="111827"/>
-                <w:sz w:val="21"/>
-              </w:rPr>
-              <w:t>Houttuynia Cordata: Natural Remedy Trend from Vietnam's Backyard</w:t>
-            </w:r>
-          </w:p>
-        </w:tc>
-      </w:tr>
-    </w:tbl>
-    <w:p>
-      <w:pPr>
-        <w:spacing w:before="40" w:after="40"/>
-        <w:ind w:left="170"/>
-      </w:pPr>
-      <w:r>
-        <w:rPr>
-          <w:rFonts w:ascii="Calibri" w:hAnsi="Calibri"/>
-          <w:b w:val="0"/>
-          <w:i/>
-          <w:color w:val="6B7280"/>
-          <w:sz w:val="18"/>
-        </w:rPr>
-        <w:t>Mainstream health media is actively promoting Houttuynia cordata (fish mint) for its skin care and health benefits, reflecting a growing consumer shift toward locally-sourced herbal remedies. This trend strengthens market receptiveness for OTC and functional health products derived from Vietnamese botanicals.[Source]</w:t>
-      </w:r>
-    </w:p>
-    <w:p>
-      <w:pPr>
-        <w:spacing w:before="20" w:after="40"/>
-        <w:ind w:left="170"/>
-      </w:pPr>
-      <w:r>
-        <w:rPr>
-          <w:rFonts w:ascii="Calibri" w:hAnsi="Calibri"/>
-          <w:b/>
-          <w:i w:val="0"/>
-          <w:color w:val="166534"/>
-          <w:sz w:val="17"/>
-        </w:rPr>
-        <w:t>🌿 Mild positive signal — mass media is priming consumer demand for domestic herbal products, a space Davipharm can capitalize on.</w:t>
-      </w:r>
-    </w:p>
-    <w:tbl>
-      <w:tblPr>
-        <w:tblStyle w:val="TableGrid"/>
-        <w:tblW w:type="auto" w:w="0"/>
-        <w:tblLook w:firstColumn="1" w:firstRow="1" w:lastColumn="0" w:lastRow="0" w:noHBand="0" w:noVBand="1" w:val="04A0"/>
-      </w:tblPr>
-      <w:tblGrid>
-        <w:gridCol w:w="9072"/>
-      </w:tblGrid>
-      <w:tr>
-        <w:tc>
-          <w:tcPr>
-            <w:tcW w:type="dxa" w:w="9072"/>
-            <w:shd w:val="clear" w:color="auto" w:fill="F8FAFC"/>
-            <w:tcBorders>
-              <w:top w:val="none" w:sz="6" w:color="auto"/>
-              <w:bottom w:val="none" w:sz="6" w:color="auto"/>
-              <w:left w:val="single" w:sz="12" w:color="003B71"/>
-              <w:right w:val="none" w:sz="6" w:color="auto"/>
-            </w:tcBorders>
-          </w:tcPr>
-          <w:p>
-            <w:pPr>
-              <w:spacing w:before="60" w:after="60"/>
-              <w:ind w:left="142"/>
-            </w:pPr>
-            <w:r>
-              <w:rPr>
-                <w:rFonts w:ascii="Calibri" w:hAnsi="Calibri"/>
-                <w:b/>
-                <w:i w:val="0"/>
-                <w:color w:val="003B71"/>
-                <w:sz w:val="17"/>
-              </w:rPr>
-              <w:t xml:space="preserve">Strategy  </w:t>
-            </w:r>
-            <w:r>
-              <w:rPr>
-                <w:rFonts w:ascii="Calibri" w:hAnsi="Calibri"/>
-                <w:b w:val="0"/>
-                <w:i w:val="0"/>
-                <w:color w:val="334155"/>
-                <w:sz w:val="17"/>
-              </w:rPr>
-              <w:t>Assess feasibility of developing or repositioning OTC/nutraceutical SKUs featuring Houttuynia cordata extract (anti-inflammatory, dermatological support), leveraging low-cost domestic sourcing and current media tailwinds. Prioritize pharmacy chain channels (Long Châu, Pharmacity) to reach the natural-product-conscious consumer segment.</w:t>
-            </w:r>
-          </w:p>
-        </w:tc>
-      </w:tr>
-    </w:tbl>
-    <w:p>
-      <w:pPr>
-        <w:spacing w:before="40" w:after="120"/>
-      </w:pPr>
-    </w:p>
-    <w:tbl>
-      <w:tblPr>
-        <w:tblStyle w:val="TableGrid"/>
-        <w:tblW w:type="auto" w:w="0"/>
-        <w:jc w:val="left"/>
-        <w:tblLook w:firstColumn="1" w:firstRow="1" w:lastColumn="0" w:lastRow="0" w:noHBand="0" w:noVBand="1" w:val="04A0"/>
-      </w:tblPr>
-      <w:tblGrid>
-        <w:gridCol w:w="4536"/>
-        <w:gridCol w:w="4536"/>
-      </w:tblGrid>
-      <w:tr>
-        <w:tc>
-          <w:tcPr>
-            <w:tcW w:type="dxa" w:w="1984"/>
-            <w:shd w:val="clear" w:color="auto" w:fill="EEF2FF"/>
-            <w:tcBorders>
-              <w:top w:val="none" w:sz="6" w:color="auto"/>
-              <w:bottom w:val="none" w:sz="6" w:color="auto"/>
-              <w:left w:val="none" w:sz="6" w:color="auto"/>
-              <w:right w:val="none" w:sz="6" w:color="auto"/>
-            </w:tcBorders>
-          </w:tcPr>
-          <w:p>
-            <w:pPr>
-              <w:spacing w:before="80" w:after="80"/>
-              <w:ind w:left="85"/>
-            </w:pPr>
-            <w:r>
-              <w:rPr>
-                <w:rFonts w:ascii="Calibri" w:hAnsi="Calibri"/>
-                <w:b/>
-                <w:i w:val="0"/>
-                <w:color w:val="4338CA"/>
-                <w:sz w:val="15"/>
-              </w:rPr>
-              <w:t>VIETNAMPLUS – SỨC KHỎE</w:t>
-            </w:r>
-          </w:p>
-        </w:tc>
-        <w:tc>
-          <w:tcPr>
-            <w:tcW w:type="dxa" w:w="4536"/>
-            <w:tcBorders>
-              <w:top w:val="none" w:sz="6" w:color="auto"/>
-              <w:bottom w:val="none" w:sz="6" w:color="auto"/>
-              <w:left w:val="none" w:sz="6" w:color="auto"/>
-              <w:right w:val="none" w:sz="6" w:color="auto"/>
-            </w:tcBorders>
-          </w:tcPr>
-          <w:p>
-            <w:pPr>
-              <w:spacing w:before="60" w:after="60"/>
-              <w:ind w:left="113"/>
-            </w:pPr>
-            <w:r>
-              <w:rPr>
-                <w:rFonts w:ascii="Calibri" w:hAnsi="Calibri"/>
-                <w:b/>
-                <w:i w:val="0"/>
-                <w:color w:val="111827"/>
-                <w:sz w:val="21"/>
-              </w:rPr>
-              <w:t>Anti-Seizure Drug Levetiracetam Shows Alzheimer's Prevention Potential</w:t>
-            </w:r>
-          </w:p>
-        </w:tc>
-      </w:tr>
-    </w:tbl>
-    <w:p>
-      <w:pPr>
-        <w:spacing w:before="40" w:after="40"/>
-        <w:ind w:left="170"/>
-      </w:pPr>
-      <w:r>
-        <w:rPr>
-          <w:rFonts w:ascii="Calibri" w:hAnsi="Calibri"/>
-          <w:b w:val="0"/>
-          <w:i/>
-          <w:color w:val="6B7280"/>
-          <w:sz w:val="18"/>
-        </w:rPr>
-        <w:t>U.S. scientists found that Levetiracetam, an established anti-epileptic drug, may inhibit amyloid-beta 42 formation — a key driver of Alzheimer's disease progression. This signals a drug repurposing opportunity for an already-proven generic molecule toward a high-value new indication.[Source]</w:t>
-      </w:r>
-    </w:p>
-    <w:p>
-      <w:pPr>
-        <w:spacing w:before="20" w:after="40"/>
-        <w:ind w:left="170"/>
-      </w:pPr>
-      <w:r>
-        <w:rPr>
-          <w:rFonts w:ascii="Calibri" w:hAnsi="Calibri"/>
-          <w:b/>
-          <w:i w:val="0"/>
-          <w:color w:val="166534"/>
-          <w:sz w:val="17"/>
-        </w:rPr>
-        <w:t>🟢 Potential upside for Davipharm if Levetiracetam is in the pipeline — repurposing into neurology/Alzheimer's prevention could unlock premium positioning and new tender categories.</w:t>
-      </w:r>
-    </w:p>
-    <w:tbl>
-      <w:tblPr>
-        <w:tblStyle w:val="TableGrid"/>
-        <w:tblW w:type="auto" w:w="0"/>
-        <w:tblLook w:firstColumn="1" w:firstRow="1" w:lastColumn="0" w:lastRow="0" w:noHBand="0" w:noVBand="1" w:val="04A0"/>
-      </w:tblPr>
-      <w:tblGrid>
-        <w:gridCol w:w="9072"/>
-      </w:tblGrid>
-      <w:tr>
-        <w:tc>
-          <w:tcPr>
-            <w:tcW w:type="dxa" w:w="9072"/>
-            <w:shd w:val="clear" w:color="auto" w:fill="F8FAFC"/>
-            <w:tcBorders>
-              <w:top w:val="none" w:sz="6" w:color="auto"/>
-              <w:bottom w:val="none" w:sz="6" w:color="auto"/>
-              <w:left w:val="single" w:sz="12" w:color="003B71"/>
-              <w:right w:val="none" w:sz="6" w:color="auto"/>
-            </w:tcBorders>
-          </w:tcPr>
-          <w:p>
-            <w:pPr>
-              <w:spacing w:before="60" w:after="60"/>
-              <w:ind w:left="142"/>
-            </w:pPr>
-            <w:r>
-              <w:rPr>
-                <w:rFonts w:ascii="Calibri" w:hAnsi="Calibri"/>
-                <w:b/>
-                <w:i w:val="0"/>
-                <w:color w:val="003B71"/>
-                <w:sz w:val="17"/>
-              </w:rPr>
-              <w:t xml:space="preserve">Strategy  </w:t>
-            </w:r>
-            <w:r>
-              <w:rPr>
-                <w:rFonts w:ascii="Calibri" w:hAnsi="Calibri"/>
-                <w:b w:val="0"/>
-                <w:i w:val="0"/>
-                <w:color w:val="334155"/>
-                <w:sz w:val="17"/>
-              </w:rPr>
-              <w:t>Audit the R&amp;D/manufacturing portfolio immediately: if Levetiracetam is feasible, track upcoming clinical trials to prepare supplemental indication filings and position early for neurology hospital tenders and premium retail pharmacy channels.</w:t>
             </w:r>
           </w:p>
         </w:tc>
@@ -5624,7 +5780,7 @@
                 <w:color w:val="111827"/>
                 <w:sz w:val="18"/>
               </w:rPr>
-              <w:t>Develop KOL/CME "early intervention 40+" materials for RAVASTEL, EIMLER-10, PECHAUNOX, ZENTOGOUT</w:t>
+              <w:t>Prepare tender dossiers to list HYYR &amp; LARRIVEY in next reimbursed formulary cycle</w:t>
             </w:r>
           </w:p>
         </w:tc>
@@ -5652,7 +5808,7 @@
                 <w:color w:val="003B71"/>
                 <w:sz w:val="17"/>
               </w:rPr>
-              <w:t>Marketing &amp; Medical Affairs</w:t>
+              <w:t>Marketing / RA</w:t>
             </w:r>
           </w:p>
         </w:tc>
@@ -5680,7 +5836,7 @@
                 <w:color w:val="6B7280"/>
                 <w:sz w:val="17"/>
               </w:rPr>
-              <w:t>Aging accelerates at 44 &amp; 60 (Stanford)</w:t>
+              <w:t>Rising oncology screening &amp; provincial hospital demand</w:t>
             </w:r>
           </w:p>
         </w:tc>
@@ -5759,7 +5915,7 @@
                 <w:color w:val="111827"/>
                 <w:sz w:val="18"/>
               </w:rPr>
-              <w:t>Build peri-operative listing dossier (JIRACEK, PECHAUNOX, ZABALES) at Tam Anh, Vinmec, FV</w:t>
+              <w:t>Update EIMLER-10 &amp; ZLATKO detailing materials for primary care prescribers by Q3/2025</w:t>
             </w:r>
           </w:p>
         </w:tc>
@@ -5787,7 +5943,7 @@
                 <w:color w:val="003B71"/>
                 <w:sz w:val="17"/>
               </w:rPr>
-              <w:t>Medical Affairs &amp; ETC Sales</w:t>
+              <w:t>Marketing</w:t>
             </w:r>
           </w:p>
         </w:tc>
@@ -5815,7 +5971,7 @@
                 <w:color w:val="6B7280"/>
                 <w:sz w:val="17"/>
               </w:rPr>
-              <w:t>Colorectal cancer ~17,000 cases/year, private hospitals upgrading</w:t>
+              <w:t>Growing T2DM complication awareness in mainstream media</w:t>
             </w:r>
           </w:p>
         </w:tc>
@@ -5843,7 +5999,7 @@
                 <w:color w:val="22C55E"/>
                 <w:sz w:val="17"/>
               </w:rPr>
-              <w:t>🔴 High</w:t>
+              <w:t>🟡 Medium</w:t>
             </w:r>
           </w:p>
         </w:tc>
@@ -5894,7 +6050,7 @@
                 <w:color w:val="111827"/>
                 <w:sz w:val="18"/>
               </w:rPr>
-              <w:t>Review &amp; deploy HYYR pancreatic cancer indication materials at K, Cho Ray, HCMC Oncology hospitals</w:t>
+              <w:t>Monitor "drug-free BP" social content; prep HCP materials for PECHAUNOX &amp; TABAREX</w:t>
             </w:r>
           </w:p>
         </w:tc>
@@ -5922,7 +6078,7 @@
                 <w:color w:val="003B71"/>
                 <w:sz w:val="17"/>
               </w:rPr>
-              <w:t>Oncology &amp; Medical Affairs</w:t>
+              <w:t>Marketing</w:t>
             </w:r>
           </w:p>
         </w:tc>
@@ -5950,7 +6106,7 @@
                 <w:color w:val="6B7280"/>
                 <w:sz w:val="17"/>
               </w:rPr>
-              <w:t>Rising pancreatic cancer awareness (VnExpress)</w:t>
+              <w:t>Beetroot "drug-free" hypertension trend</w:t>
             </w:r>
           </w:p>
         </w:tc>
@@ -6029,7 +6185,7 @@
                 <w:color w:val="111827"/>
                 <w:sz w:val="18"/>
               </w:rPr>
-              <w:t>Đánh giá khả năng mở rộng danh mục hormone therapy ung thư vú; báo cáo BOD Q3/</w:t>
+              <w:t>Map MoD military pharmacy procurement process for METILONE-4 opportunity</w:t>
             </w:r>
           </w:p>
         </w:tc>
@@ -6057,6 +6213,7 @@
                 <w:color w:val="003B71"/>
                 <w:sz w:val="17"/>
               </w:rPr>
+              <w:t>Strategy / Sales</w:t>
             </w:r>
           </w:p>
         </w:tc>

</xml_diff>

<commit_message>
Update report_en.docx 2026-05-13 11:20
</commit_message>
<xml_diff>
--- a/report_en.docx
+++ b/report_en.docx
@@ -338,7 +338,7 @@
                 <w:color w:val="111827"/>
                 <w:sz w:val="20"/>
               </w:rPr>
-              <w:t>No reg-policy or tender signals this week, but three epidemiological trends (diabetes, oncology, psychiatry) reinforce long-term demand fundamentals for Davipharm's core ETC portfolio.</w:t>
+              <w:t>No direct regulatory or tender events this week, but MoH's proposal to elevate Bach Mai &amp; Viet Duc satellite hospitals to full-fee status is the most strategically significant ETC expansion signal requiring early action.</w:t>
             </w:r>
           </w:p>
         </w:tc>
@@ -406,7 +406,7 @@
                 <w:color w:val="111827"/>
                 <w:sz w:val="17"/>
               </w:rPr>
-              <w:t>▸  Diabetes:Mass-media coverage of T2D complications is driving sustained patient awareness, supporting long-term ETC demand for EIMLER-10 (Empagliflozin) and ZLATKO (Sitagliptin).</w:t>
+              <w:t>▸  ETC Expansion – Bach Mai 2 &amp; Viet Duc 2:If approved, two new independent procurement units in Ha Nam and Ninh Binh will open inaugural tender cycles — direct opportunity for RAVASTEL, EIMLER-10, PECHAUNOX, and HYYR.</w:t>
             </w:r>
           </w:p>
           <w:p>
@@ -422,7 +422,7 @@
                 <w:color w:val="111827"/>
                 <w:sz w:val="17"/>
               </w:rPr>
-              <w:t>▸  Oncology:Rising cancer screening rates and provincial treatment cost burdens underscore the strategic imperative to secure HYYR (Erlotinib) and LARRIVEY (Bicalutamide) in the next reimbursed tender formulary.</w:t>
+              <w:t>▸  Oncology – Early Detection Trend:Shift toward curative surgery for early-stage cancers may gradually reduce the patient pool for targeted therapies, with long-term tender implications for HYYR and LARRIVEY at top-tier hospitals.</w:t>
             </w:r>
           </w:p>
           <w:p>
@@ -438,7 +438,7 @@
                 <w:color w:val="111827"/>
                 <w:sz w:val="17"/>
               </w:rPr>
-              <w:t>▸  Psychiatry:Growing community substance abuse signals a long-term rise in psychiatric patient volumes — opportunity to expand SERNAL (Risperidone) and LAFAXOR (Venlafaxine) in psychiatric and general hospital departments.</w:t>
+              <w:t>▸  OTC – Rising Out-of-Pocket Spending:HCM City's VND 3,500B dental tourism figure confirms a macro consumer willingness to pay outside BHYT, reinforcing the investment case for private-clinic channels targeting the Men's Health portfolio (JANUS, TADALAFIL 20MG, DRYCHES).</w:t>
             </w:r>
           </w:p>
         </w:tc>
@@ -1841,6 +1841,786 @@
                 <w:color w:val="4338CA"/>
                 <w:sz w:val="15"/>
               </w:rPr>
+              <w:t>SK&amp;ĐS – CHÍNH SÁCH Y TẾ</w:t>
+            </w:r>
+          </w:p>
+        </w:tc>
+        <w:tc>
+          <w:tcPr>
+            <w:tcW w:type="dxa" w:w="4536"/>
+            <w:tcBorders>
+              <w:top w:val="none" w:sz="6" w:color="auto"/>
+              <w:bottom w:val="none" w:sz="6" w:color="auto"/>
+              <w:left w:val="none" w:sz="6" w:color="auto"/>
+              <w:right w:val="none" w:sz="6" w:color="auto"/>
+            </w:tcBorders>
+          </w:tcPr>
+          <w:p>
+            <w:pPr>
+              <w:spacing w:before="60" w:after="60"/>
+              <w:ind w:left="113"/>
+            </w:pPr>
+            <w:r>
+              <w:rPr>
+                <w:rFonts w:ascii="Calibri" w:hAnsi="Calibri"/>
+                <w:b/>
+                <w:i w:val="0"/>
+                <w:color w:val="111827"/>
+                <w:sz w:val="21"/>
+              </w:rPr>
+              <w:t>Quality Assurance in Pharmaceuticals, Cosmetics &amp; Food: Public Health Imperative</w:t>
+            </w:r>
+          </w:p>
+        </w:tc>
+      </w:tr>
+    </w:tbl>
+    <w:p>
+      <w:pPr>
+        <w:spacing w:before="40" w:after="40"/>
+        <w:ind w:left="170"/>
+      </w:pPr>
+      <w:r>
+        <w:rPr>
+          <w:rFonts w:ascii="Calibri" w:hAnsi="Calibri"/>
+          <w:b w:val="0"/>
+          <w:i/>
+          <w:color w:val="6B7280"/>
+          <w:sz w:val="18"/>
+        </w:rPr>
+        <w:t>The article outlines general quality assurance directions for pharmaceuticals, cosmetics, and functional foods in Vietnam, with no specific regulatory document or tender result issued. The content is editorial in nature and carries no direct short-term impact on Davipharm's product portfolio or tendering operations.[Source]</w:t>
+      </w:r>
+    </w:p>
+    <w:p>
+      <w:pPr>
+        <w:spacing w:before="20" w:after="40"/>
+        <w:ind w:left="170"/>
+      </w:pPr>
+      <w:r>
+        <w:rPr>
+          <w:rFonts w:ascii="Calibri" w:hAnsi="Calibri"/>
+          <w:b/>
+          <w:i w:val="0"/>
+          <w:color w:val="374151"/>
+          <w:sz w:val="17"/>
+        </w:rPr>
+        <w:t>⚪ Neutral signal — no specific regulatory or tender event impacting Davipharm products; monitor in case quality control directions are formalized into binding regulation.</w:t>
+      </w:r>
+    </w:p>
+    <w:tbl>
+      <w:tblPr>
+        <w:tblStyle w:val="TableGrid"/>
+        <w:tblW w:type="auto" w:w="0"/>
+        <w:tblLook w:firstColumn="1" w:firstRow="1" w:lastColumn="0" w:lastRow="0" w:noHBand="0" w:noVBand="1" w:val="04A0"/>
+      </w:tblPr>
+      <w:tblGrid>
+        <w:gridCol w:w="9072"/>
+      </w:tblGrid>
+      <w:tr>
+        <w:tc>
+          <w:tcPr>
+            <w:tcW w:type="dxa" w:w="9072"/>
+            <w:shd w:val="clear" w:color="auto" w:fill="F8FAFC"/>
+            <w:tcBorders>
+              <w:top w:val="none" w:sz="6" w:color="auto"/>
+              <w:bottom w:val="none" w:sz="6" w:color="auto"/>
+              <w:left w:val="single" w:sz="12" w:color="003B71"/>
+              <w:right w:val="none" w:sz="6" w:color="auto"/>
+            </w:tcBorders>
+          </w:tcPr>
+          <w:p>
+            <w:pPr>
+              <w:spacing w:before="60" w:after="60"/>
+              <w:ind w:left="142"/>
+            </w:pPr>
+            <w:r>
+              <w:rPr>
+                <w:rFonts w:ascii="Calibri" w:hAnsi="Calibri"/>
+                <w:b/>
+                <w:i w:val="0"/>
+                <w:color w:val="003B71"/>
+                <w:sz w:val="17"/>
+              </w:rPr>
+              <w:t xml:space="preserve">Strategy  </w:t>
+            </w:r>
+            <w:r>
+              <w:rPr>
+                <w:rFonts w:ascii="Calibri" w:hAnsi="Calibri"/>
+                <w:b w:val="0"/>
+                <w:i w:val="0"/>
+                <w:color w:val="334155"/>
+                <w:sz w:val="17"/>
+              </w:rPr>
+              <w:t>Regulatory Affairs team should monitor follow-up developments from the Drug Administration of Vietnam to detect early if this direction materializes into binding circulars or decrees affecting product registration or GMP conditions across the portfolio; no immediate action required at this stage.</w:t>
+            </w:r>
+          </w:p>
+        </w:tc>
+      </w:tr>
+    </w:tbl>
+    <w:p>
+      <w:pPr>
+        <w:spacing w:before="40" w:after="120"/>
+      </w:pPr>
+    </w:p>
+    <w:tbl>
+      <w:tblPr>
+        <w:tblStyle w:val="TableGrid"/>
+        <w:tblW w:type="auto" w:w="0"/>
+        <w:jc w:val="left"/>
+        <w:tblLook w:firstColumn="1" w:firstRow="1" w:lastColumn="0" w:lastRow="0" w:noHBand="0" w:noVBand="1" w:val="04A0"/>
+      </w:tblPr>
+      <w:tblGrid>
+        <w:gridCol w:w="4536"/>
+        <w:gridCol w:w="4536"/>
+      </w:tblGrid>
+      <w:tr>
+        <w:tc>
+          <w:tcPr>
+            <w:tcW w:type="dxa" w:w="1984"/>
+            <w:shd w:val="clear" w:color="auto" w:fill="EEF2FF"/>
+            <w:tcBorders>
+              <w:top w:val="none" w:sz="6" w:color="auto"/>
+              <w:bottom w:val="none" w:sz="6" w:color="auto"/>
+              <w:left w:val="none" w:sz="6" w:color="auto"/>
+              <w:right w:val="none" w:sz="6" w:color="auto"/>
+            </w:tcBorders>
+          </w:tcPr>
+          <w:p>
+            <w:pPr>
+              <w:spacing w:before="80" w:after="80"/>
+              <w:ind w:left="85"/>
+            </w:pPr>
+            <w:r>
+              <w:rPr>
+                <w:rFonts w:ascii="Calibri" w:hAnsi="Calibri"/>
+                <w:b/>
+                <w:i w:val="0"/>
+                <w:color w:val="4338CA"/>
+                <w:sz w:val="15"/>
+              </w:rPr>
+              <w:t>VNEXPRESS – SỨC KHỎE</w:t>
+            </w:r>
+          </w:p>
+        </w:tc>
+        <w:tc>
+          <w:tcPr>
+            <w:tcW w:type="dxa" w:w="4536"/>
+            <w:tcBorders>
+              <w:top w:val="none" w:sz="6" w:color="auto"/>
+              <w:bottom w:val="none" w:sz="6" w:color="auto"/>
+              <w:left w:val="none" w:sz="6" w:color="auto"/>
+              <w:right w:val="none" w:sz="6" w:color="auto"/>
+            </w:tcBorders>
+          </w:tcPr>
+          <w:p>
+            <w:pPr>
+              <w:spacing w:before="60" w:after="60"/>
+              <w:ind w:left="113"/>
+            </w:pPr>
+            <w:r>
+              <w:rPr>
+                <w:rFonts w:ascii="Calibri" w:hAnsi="Calibri"/>
+                <w:b/>
+                <w:i w:val="0"/>
+                <w:color w:val="111827"/>
+                <w:sz w:val="21"/>
+              </w:rPr>
+              <w:t>Summer Travel Health Prep: Seasonal OTC Demand Signal</w:t>
+            </w:r>
+          </w:p>
+        </w:tc>
+      </w:tr>
+    </w:tbl>
+    <w:p>
+      <w:pPr>
+        <w:spacing w:before="40" w:after="40"/>
+        <w:ind w:left="170"/>
+      </w:pPr>
+      <w:r>
+        <w:rPr>
+          <w:rFonts w:ascii="Calibri" w:hAnsi="Calibri"/>
+          <w:b w:val="0"/>
+          <w:i/>
+          <w:color w:val="6B7280"/>
+          <w:sz w:val="18"/>
+        </w:rPr>
+        <w:t>VNVC-sourced article advises summer travelers to stock basic OTC medicines (antipyretics, digestives, antiseptics) and vaccines, signaling a seasonal uptick in consumer OTC demand. Direct impact on Davipharm is minimal as its portfolio lacks dedicated travel-health OTC products and the article has no relevance to ETC/tender channels.[Source]</w:t>
+      </w:r>
+    </w:p>
+    <w:p>
+      <w:pPr>
+        <w:spacing w:before="20" w:after="40"/>
+        <w:ind w:left="170"/>
+      </w:pPr>
+      <w:r>
+        <w:rPr>
+          <w:rFonts w:ascii="Calibri" w:hAnsi="Calibri"/>
+          <w:b/>
+          <w:i w:val="0"/>
+          <w:color w:val="374151"/>
+          <w:sz w:val="17"/>
+        </w:rPr>
+        <w:t>➖ Article has no direct relevance to Davipharm's ETC portfolio or strategic products; no immediate opportunity or risk identified.</w:t>
+      </w:r>
+    </w:p>
+    <w:tbl>
+      <w:tblPr>
+        <w:tblStyle w:val="TableGrid"/>
+        <w:tblW w:type="auto" w:w="0"/>
+        <w:tblLook w:firstColumn="1" w:firstRow="1" w:lastColumn="0" w:lastRow="0" w:noHBand="0" w:noVBand="1" w:val="04A0"/>
+      </w:tblPr>
+      <w:tblGrid>
+        <w:gridCol w:w="9072"/>
+      </w:tblGrid>
+      <w:tr>
+        <w:tc>
+          <w:tcPr>
+            <w:tcW w:type="dxa" w:w="9072"/>
+            <w:shd w:val="clear" w:color="auto" w:fill="F8FAFC"/>
+            <w:tcBorders>
+              <w:top w:val="none" w:sz="6" w:color="auto"/>
+              <w:bottom w:val="none" w:sz="6" w:color="auto"/>
+              <w:left w:val="single" w:sz="12" w:color="003B71"/>
+              <w:right w:val="none" w:sz="6" w:color="auto"/>
+            </w:tcBorders>
+          </w:tcPr>
+          <w:p>
+            <w:pPr>
+              <w:spacing w:before="60" w:after="60"/>
+              <w:ind w:left="142"/>
+            </w:pPr>
+            <w:r>
+              <w:rPr>
+                <w:rFonts w:ascii="Calibri" w:hAnsi="Calibri"/>
+                <w:b/>
+                <w:i w:val="0"/>
+                <w:color w:val="003B71"/>
+                <w:sz w:val="17"/>
+              </w:rPr>
+              <w:t xml:space="preserve">Strategy  </w:t>
+            </w:r>
+            <w:r>
+              <w:rPr>
+                <w:rFonts w:ascii="Calibri" w:hAnsi="Calibri"/>
+                <w:b w:val="0"/>
+                <w:i w:val="0"/>
+                <w:color w:val="334155"/>
+                <w:sz w:val="17"/>
+              </w:rPr>
+              <w:t>No priority action required. Marketing team may log as a background OTC seasonal demand signal; no resource allocation needed as Davipharm lacks a travel-health OTC positioning for its digestive/antipyretic lines.</w:t>
+            </w:r>
+          </w:p>
+        </w:tc>
+      </w:tr>
+    </w:tbl>
+    <w:p>
+      <w:pPr>
+        <w:spacing w:before="40" w:after="120"/>
+      </w:pPr>
+    </w:p>
+    <w:tbl>
+      <w:tblPr>
+        <w:tblStyle w:val="TableGrid"/>
+        <w:tblW w:type="auto" w:w="0"/>
+        <w:jc w:val="left"/>
+        <w:tblLook w:firstColumn="1" w:firstRow="1" w:lastColumn="0" w:lastRow="0" w:noHBand="0" w:noVBand="1" w:val="04A0"/>
+      </w:tblPr>
+      <w:tblGrid>
+        <w:gridCol w:w="4536"/>
+        <w:gridCol w:w="4536"/>
+      </w:tblGrid>
+      <w:tr>
+        <w:tc>
+          <w:tcPr>
+            <w:tcW w:type="dxa" w:w="1984"/>
+            <w:shd w:val="clear" w:color="auto" w:fill="EEF2FF"/>
+            <w:tcBorders>
+              <w:top w:val="none" w:sz="6" w:color="auto"/>
+              <w:bottom w:val="none" w:sz="6" w:color="auto"/>
+              <w:left w:val="none" w:sz="6" w:color="auto"/>
+              <w:right w:val="none" w:sz="6" w:color="auto"/>
+            </w:tcBorders>
+          </w:tcPr>
+          <w:p>
+            <w:pPr>
+              <w:spacing w:before="80" w:after="80"/>
+              <w:ind w:left="85"/>
+            </w:pPr>
+            <w:r>
+              <w:rPr>
+                <w:rFonts w:ascii="Calibri" w:hAnsi="Calibri"/>
+                <w:b/>
+                <w:i w:val="0"/>
+                <w:color w:val="4338CA"/>
+                <w:sz w:val="15"/>
+              </w:rPr>
+              <w:t>VNEXPRESS – SỨC KHỎE</w:t>
+            </w:r>
+          </w:p>
+        </w:tc>
+        <w:tc>
+          <w:tcPr>
+            <w:tcW w:type="dxa" w:w="4536"/>
+            <w:tcBorders>
+              <w:top w:val="none" w:sz="6" w:color="auto"/>
+              <w:bottom w:val="none" w:sz="6" w:color="auto"/>
+              <w:left w:val="none" w:sz="6" w:color="auto"/>
+              <w:right w:val="none" w:sz="6" w:color="auto"/>
+            </w:tcBorders>
+          </w:tcPr>
+          <w:p>
+            <w:pPr>
+              <w:spacing w:before="60" w:after="60"/>
+              <w:ind w:left="113"/>
+            </w:pPr>
+            <w:r>
+              <w:rPr>
+                <w:rFonts w:ascii="Calibri" w:hAnsi="Calibri"/>
+                <w:b/>
+                <w:i w:val="0"/>
+                <w:color w:val="111827"/>
+                <w:sz w:val="21"/>
+              </w:rPr>
+              <w:t>Minimally Invasive Esophagectomy for Early-Stage Cancer: Clinical Signal for Oncology Market</w:t>
+            </w:r>
+          </w:p>
+        </w:tc>
+      </w:tr>
+    </w:tbl>
+    <w:p>
+      <w:pPr>
+        <w:spacing w:before="40" w:after="40"/>
+        <w:ind w:left="170"/>
+      </w:pPr>
+      <w:r>
+        <w:rPr>
+          <w:rFonts w:ascii="Calibri" w:hAnsi="Calibri"/>
+          <w:b w:val="0"/>
+          <w:i/>
+          <w:color w:val="6B7280"/>
+          <w:sz w:val="18"/>
+        </w:rPr>
+        <w:t>Tam Anh Hospital successfully performed total minimally invasive esophagectomy for an early-stage esophageal cancer patient (cT1bN0M0), with no adjuvant chemo-radiotherapy required post-surgery. This reflects a trend toward early cancer detection via routine screening, potentially shifting patient volume away from systemic oncology therapies relevant to Davipharm's HYYR (Erlotinib) and LARRIVEY (Bicalutamide).[Source]</w:t>
+      </w:r>
+    </w:p>
+    <w:p>
+      <w:pPr>
+        <w:spacing w:before="20" w:after="40"/>
+        <w:ind w:left="170"/>
+      </w:pPr>
+      <w:r>
+        <w:rPr>
+          <w:rFonts w:ascii="Calibri" w:hAnsi="Calibri"/>
+          <w:b/>
+          <w:i w:val="0"/>
+          <w:color w:val="374151"/>
+          <w:sz w:val="17"/>
+        </w:rPr>
+        <w:t>⚪ Watch signal: growing early-detection trend may gradually reduce the patient pool for targeted therapy — no immediate revenue impact for Davipharm, but warrants monitoring of oncology treatment model shifts in top-tier ETC hospital channels.</w:t>
+      </w:r>
+    </w:p>
+    <w:tbl>
+      <w:tblPr>
+        <w:tblStyle w:val="TableGrid"/>
+        <w:tblW w:type="auto" w:w="0"/>
+        <w:tblLook w:firstColumn="1" w:firstRow="1" w:lastColumn="0" w:lastRow="0" w:noHBand="0" w:noVBand="1" w:val="04A0"/>
+      </w:tblPr>
+      <w:tblGrid>
+        <w:gridCol w:w="9072"/>
+      </w:tblGrid>
+      <w:tr>
+        <w:tc>
+          <w:tcPr>
+            <w:tcW w:type="dxa" w:w="9072"/>
+            <w:shd w:val="clear" w:color="auto" w:fill="F8FAFC"/>
+            <w:tcBorders>
+              <w:top w:val="none" w:sz="6" w:color="auto"/>
+              <w:bottom w:val="none" w:sz="6" w:color="auto"/>
+              <w:left w:val="single" w:sz="12" w:color="003B71"/>
+              <w:right w:val="none" w:sz="6" w:color="auto"/>
+            </w:tcBorders>
+          </w:tcPr>
+          <w:p>
+            <w:pPr>
+              <w:spacing w:before="60" w:after="60"/>
+              <w:ind w:left="142"/>
+            </w:pPr>
+            <w:r>
+              <w:rPr>
+                <w:rFonts w:ascii="Calibri" w:hAnsi="Calibri"/>
+                <w:b/>
+                <w:i w:val="0"/>
+                <w:color w:val="003B71"/>
+                <w:sz w:val="17"/>
+              </w:rPr>
+              <w:t xml:space="preserve">Strategy  </w:t>
+            </w:r>
+            <w:r>
+              <w:rPr>
+                <w:rFonts w:ascii="Calibri" w:hAnsi="Calibri"/>
+                <w:b w:val="0"/>
+                <w:i w:val="0"/>
+                <w:color w:val="334155"/>
+                <w:sz w:val="17"/>
+              </w:rPr>
+              <w:t>Oncology Team to monitor the ratio of surgical resection vs. systemic treatment cases at top-tier hospitals (Tam Anh, Bach Mai, Cho Ray) to assess long-term bidding implications for HYYR and LARRIVEY; no immediate action required this quarter.</w:t>
+            </w:r>
+          </w:p>
+        </w:tc>
+      </w:tr>
+    </w:tbl>
+    <w:p>
+      <w:pPr>
+        <w:spacing w:before="40" w:after="120"/>
+      </w:pPr>
+    </w:p>
+    <w:tbl>
+      <w:tblPr>
+        <w:tblStyle w:val="TableGrid"/>
+        <w:tblW w:type="auto" w:w="0"/>
+        <w:jc w:val="left"/>
+        <w:tblLook w:firstColumn="1" w:firstRow="1" w:lastColumn="0" w:lastRow="0" w:noHBand="0" w:noVBand="1" w:val="04A0"/>
+      </w:tblPr>
+      <w:tblGrid>
+        <w:gridCol w:w="4536"/>
+        <w:gridCol w:w="4536"/>
+      </w:tblGrid>
+      <w:tr>
+        <w:tc>
+          <w:tcPr>
+            <w:tcW w:type="dxa" w:w="1984"/>
+            <w:shd w:val="clear" w:color="auto" w:fill="EEF2FF"/>
+            <w:tcBorders>
+              <w:top w:val="none" w:sz="6" w:color="auto"/>
+              <w:bottom w:val="none" w:sz="6" w:color="auto"/>
+              <w:left w:val="none" w:sz="6" w:color="auto"/>
+              <w:right w:val="none" w:sz="6" w:color="auto"/>
+            </w:tcBorders>
+          </w:tcPr>
+          <w:p>
+            <w:pPr>
+              <w:spacing w:before="80" w:after="80"/>
+              <w:ind w:left="85"/>
+            </w:pPr>
+            <w:r>
+              <w:rPr>
+                <w:rFonts w:ascii="Calibri" w:hAnsi="Calibri"/>
+                <w:b/>
+                <w:i w:val="0"/>
+                <w:color w:val="4338CA"/>
+                <w:sz w:val="15"/>
+              </w:rPr>
+              <w:t>TUỔI TRẺ – SỨC KHỎE</w:t>
+            </w:r>
+          </w:p>
+        </w:tc>
+        <w:tc>
+          <w:tcPr>
+            <w:tcW w:type="dxa" w:w="4536"/>
+            <w:tcBorders>
+              <w:top w:val="none" w:sz="6" w:color="auto"/>
+              <w:bottom w:val="none" w:sz="6" w:color="auto"/>
+              <w:left w:val="none" w:sz="6" w:color="auto"/>
+              <w:right w:val="none" w:sz="6" w:color="auto"/>
+            </w:tcBorders>
+          </w:tcPr>
+          <w:p>
+            <w:pPr>
+              <w:spacing w:before="60" w:after="60"/>
+              <w:ind w:left="113"/>
+            </w:pPr>
+            <w:r>
+              <w:rPr>
+                <w:rFonts w:ascii="Calibri" w:hAnsi="Calibri"/>
+                <w:b/>
+                <w:i w:val="0"/>
+                <w:color w:val="111827"/>
+                <w:sz w:val="21"/>
+              </w:rPr>
+              <w:t>MoH Proposes Bach Mai &amp; Viet Duc Satellite Hospitals Adopt Full Service Pricing Parity</w:t>
+            </w:r>
+          </w:p>
+        </w:tc>
+      </w:tr>
+    </w:tbl>
+    <w:p>
+      <w:pPr>
+        <w:spacing w:before="40" w:after="40"/>
+        <w:ind w:left="170"/>
+      </w:pPr>
+      <w:r>
+        <w:rPr>
+          <w:rFonts w:ascii="Calibri" w:hAnsi="Calibri"/>
+          <w:b w:val="0"/>
+          <w:i/>
+          <w:color w:val="6B7280"/>
+          <w:sz w:val="18"/>
+        </w:rPr>
+        <w:t>The Ministry of Health has proposed allowing the satellite campuses of Bach Mai and Viet Duc hospitals to charge the same service fees as their main facilities, aiming to improve financial autonomy and patient volume at these two major northern tertiary centers. If approved, increased inpatient activity at these sites would expand ETC consumption opportunities for Davipharm's cardiovascular, diabetes, and oncology portfolios.[Source]</w:t>
+      </w:r>
+    </w:p>
+    <w:p>
+      <w:pPr>
+        <w:spacing w:before="20" w:after="40"/>
+        <w:ind w:left="170"/>
+      </w:pPr>
+      <w:r>
+        <w:rPr>
+          <w:rFonts w:ascii="Calibri" w:hAnsi="Calibri"/>
+          <w:b/>
+          <w:i w:val="0"/>
+          <w:color w:val="166534"/>
+          <w:sz w:val="17"/>
+        </w:rPr>
+        <w:t>📈 ETC expansion opportunity: two fully operational satellite hospitals represent additional independent procurement units — potential to list RAVASTEL, EIMLER-10, HYYR, and PECHAUNOX in new tender packages.</w:t>
+      </w:r>
+    </w:p>
+    <w:tbl>
+      <w:tblPr>
+        <w:tblStyle w:val="TableGrid"/>
+        <w:tblW w:type="auto" w:w="0"/>
+        <w:tblLook w:firstColumn="1" w:firstRow="1" w:lastColumn="0" w:lastRow="0" w:noHBand="0" w:noVBand="1" w:val="04A0"/>
+      </w:tblPr>
+      <w:tblGrid>
+        <w:gridCol w:w="9072"/>
+      </w:tblGrid>
+      <w:tr>
+        <w:tc>
+          <w:tcPr>
+            <w:tcW w:type="dxa" w:w="9072"/>
+            <w:shd w:val="clear" w:color="auto" w:fill="F8FAFC"/>
+            <w:tcBorders>
+              <w:top w:val="none" w:sz="6" w:color="auto"/>
+              <w:bottom w:val="none" w:sz="6" w:color="auto"/>
+              <w:left w:val="single" w:sz="12" w:color="003B71"/>
+              <w:right w:val="none" w:sz="6" w:color="auto"/>
+            </w:tcBorders>
+          </w:tcPr>
+          <w:p>
+            <w:pPr>
+              <w:spacing w:before="60" w:after="60"/>
+              <w:ind w:left="142"/>
+            </w:pPr>
+            <w:r>
+              <w:rPr>
+                <w:rFonts w:ascii="Calibri" w:hAnsi="Calibri"/>
+                <w:b/>
+                <w:i w:val="0"/>
+                <w:color w:val="003B71"/>
+                <w:sz w:val="17"/>
+              </w:rPr>
+              <w:t xml:space="preserve">Strategy  </w:t>
+            </w:r>
+            <w:r>
+              <w:rPr>
+                <w:rFonts w:ascii="Calibri" w:hAnsi="Calibri"/>
+                <w:b w:val="0"/>
+                <w:i w:val="0"/>
+                <w:color w:val="334155"/>
+                <w:sz w:val="17"/>
+              </w:rPr>
+              <w:t>The Northern ETC Sales Team should monitor approval progress and proactively engage the Pharmacy &amp; Medical Supply departments at Bach Mai 2 (Ha Nam) and Viet Duc 2 (Ninh Binh) upon official confirmation, prioritizing formulary listing of RAVASTEL, EIMLER-10, PECHAUNOX, and HYYR in these facilities' inaugural tender cycles.</w:t>
+            </w:r>
+          </w:p>
+        </w:tc>
+      </w:tr>
+    </w:tbl>
+    <w:p>
+      <w:pPr>
+        <w:spacing w:before="40" w:after="120"/>
+      </w:pPr>
+    </w:p>
+    <w:tbl>
+      <w:tblPr>
+        <w:tblStyle w:val="TableGrid"/>
+        <w:tblW w:type="auto" w:w="0"/>
+        <w:jc w:val="left"/>
+        <w:tblLook w:firstColumn="1" w:firstRow="1" w:lastColumn="0" w:lastRow="0" w:noHBand="0" w:noVBand="1" w:val="04A0"/>
+      </w:tblPr>
+      <w:tblGrid>
+        <w:gridCol w:w="4536"/>
+        <w:gridCol w:w="4536"/>
+      </w:tblGrid>
+      <w:tr>
+        <w:tc>
+          <w:tcPr>
+            <w:tcW w:type="dxa" w:w="1984"/>
+            <w:shd w:val="clear" w:color="auto" w:fill="EEF2FF"/>
+            <w:tcBorders>
+              <w:top w:val="none" w:sz="6" w:color="auto"/>
+              <w:bottom w:val="none" w:sz="6" w:color="auto"/>
+              <w:left w:val="none" w:sz="6" w:color="auto"/>
+              <w:right w:val="none" w:sz="6" w:color="auto"/>
+            </w:tcBorders>
+          </w:tcPr>
+          <w:p>
+            <w:pPr>
+              <w:spacing w:before="80" w:after="80"/>
+              <w:ind w:left="85"/>
+            </w:pPr>
+            <w:r>
+              <w:rPr>
+                <w:rFonts w:ascii="Calibri" w:hAnsi="Calibri"/>
+                <w:b/>
+                <w:i w:val="0"/>
+                <w:color w:val="4338CA"/>
+                <w:sz w:val="15"/>
+              </w:rPr>
+              <w:t>TUỔI TRẺ – SỨC KHỎE</w:t>
+            </w:r>
+          </w:p>
+        </w:tc>
+        <w:tc>
+          <w:tcPr>
+            <w:tcW w:type="dxa" w:w="4536"/>
+            <w:tcBorders>
+              <w:top w:val="none" w:sz="6" w:color="auto"/>
+              <w:bottom w:val="none" w:sz="6" w:color="auto"/>
+              <w:left w:val="none" w:sz="6" w:color="auto"/>
+              <w:right w:val="none" w:sz="6" w:color="auto"/>
+            </w:tcBorders>
+          </w:tcPr>
+          <w:p>
+            <w:pPr>
+              <w:spacing w:before="60" w:after="60"/>
+              <w:ind w:left="113"/>
+            </w:pPr>
+            <w:r>
+              <w:rPr>
+                <w:rFonts w:ascii="Calibri" w:hAnsi="Calibri"/>
+                <w:b/>
+                <w:i w:val="0"/>
+                <w:color w:val="111827"/>
+                <w:sz w:val="21"/>
+              </w:rPr>
+              <w:t>HCM City Earns VND 3,500B from Dental Tourism — Signal from Vietnam's Growing Out-of-Pocket Healthcare Market</w:t>
+            </w:r>
+          </w:p>
+        </w:tc>
+      </w:tr>
+    </w:tbl>
+    <w:p>
+      <w:pPr>
+        <w:spacing w:before="40" w:after="40"/>
+        <w:ind w:left="170"/>
+      </w:pPr>
+      <w:r>
+        <w:rPr>
+          <w:rFonts w:ascii="Calibri" w:hAnsi="Calibri"/>
+          <w:b w:val="0"/>
+          <w:i/>
+          <w:color w:val="6B7280"/>
+          <w:sz w:val="18"/>
+        </w:rPr>
+        <w:t>Ho Chi Minh City recorded VND 3,500 billion in revenue from dental tourism services, reflecting a growing consumer willingness to pay out-of-pocket for elective healthcare outside the BHYT system. This trend has no direct impact on Davipharm's ETC tender portfolio, but signals expansion potential for OTC and private-clinic channels.[Source]</w:t>
+      </w:r>
+    </w:p>
+    <w:p>
+      <w:pPr>
+        <w:spacing w:before="20" w:after="40"/>
+        <w:ind w:left="170"/>
+      </w:pPr>
+      <w:r>
+        <w:rPr>
+          <w:rFonts w:ascii="Calibri" w:hAnsi="Calibri"/>
+          <w:b/>
+          <w:i w:val="0"/>
+          <w:color w:val="374151"/>
+          <w:sz w:val="17"/>
+        </w:rPr>
+        <w:t>📊 No direct relevance to Davipharm's core portfolio; macro signal of rising out-of-pocket healthcare spending may indirectly benefit OTC channel products (JANUS, TADALAFIL 20MG, DRYCHES).</w:t>
+      </w:r>
+    </w:p>
+    <w:tbl>
+      <w:tblPr>
+        <w:tblStyle w:val="TableGrid"/>
+        <w:tblW w:type="auto" w:w="0"/>
+        <w:tblLook w:firstColumn="1" w:firstRow="1" w:lastColumn="0" w:lastRow="0" w:noHBand="0" w:noVBand="1" w:val="04A0"/>
+      </w:tblPr>
+      <w:tblGrid>
+        <w:gridCol w:w="9072"/>
+      </w:tblGrid>
+      <w:tr>
+        <w:tc>
+          <w:tcPr>
+            <w:tcW w:type="dxa" w:w="9072"/>
+            <w:shd w:val="clear" w:color="auto" w:fill="F8FAFC"/>
+            <w:tcBorders>
+              <w:top w:val="none" w:sz="6" w:color="auto"/>
+              <w:bottom w:val="none" w:sz="6" w:color="auto"/>
+              <w:left w:val="single" w:sz="12" w:color="003B71"/>
+              <w:right w:val="none" w:sz="6" w:color="auto"/>
+            </w:tcBorders>
+          </w:tcPr>
+          <w:p>
+            <w:pPr>
+              <w:spacing w:before="60" w:after="60"/>
+              <w:ind w:left="142"/>
+            </w:pPr>
+            <w:r>
+              <w:rPr>
+                <w:rFonts w:ascii="Calibri" w:hAnsi="Calibri"/>
+                <w:b/>
+                <w:i w:val="0"/>
+                <w:color w:val="003B71"/>
+                <w:sz w:val="17"/>
+              </w:rPr>
+              <w:t xml:space="preserve">Strategy  </w:t>
+            </w:r>
+            <w:r>
+              <w:rPr>
+                <w:rFonts w:ascii="Calibri" w:hAnsi="Calibri"/>
+                <w:b w:val="0"/>
+                <w:i w:val="0"/>
+                <w:color w:val="334155"/>
+                <w:sz w:val="17"/>
+              </w:rPr>
+              <w:t>OTC Marketing team may reference this out-of-pocket spending trend to strengthen the investment case for private clinic and premium pharmacy channels for the Men's Health portfolio (JANUS, TADALAFIL 20MG, DRYCHES) in H2/2025 planning. No urgent action required — routine monitoring.</w:t>
+            </w:r>
+          </w:p>
+        </w:tc>
+      </w:tr>
+    </w:tbl>
+    <w:p>
+      <w:pPr>
+        <w:spacing w:before="40" w:after="120"/>
+      </w:pPr>
+    </w:p>
+    <w:tbl>
+      <w:tblPr>
+        <w:tblStyle w:val="TableGrid"/>
+        <w:tblW w:type="auto" w:w="0"/>
+        <w:jc w:val="left"/>
+        <w:tblLook w:firstColumn="1" w:firstRow="1" w:lastColumn="0" w:lastRow="0" w:noHBand="0" w:noVBand="1" w:val="04A0"/>
+      </w:tblPr>
+      <w:tblGrid>
+        <w:gridCol w:w="4536"/>
+        <w:gridCol w:w="4536"/>
+      </w:tblGrid>
+      <w:tr>
+        <w:tc>
+          <w:tcPr>
+            <w:tcW w:type="dxa" w:w="1984"/>
+            <w:shd w:val="clear" w:color="auto" w:fill="EEF2FF"/>
+            <w:tcBorders>
+              <w:top w:val="none" w:sz="6" w:color="auto"/>
+              <w:bottom w:val="none" w:sz="6" w:color="auto"/>
+              <w:left w:val="none" w:sz="6" w:color="auto"/>
+              <w:right w:val="none" w:sz="6" w:color="auto"/>
+            </w:tcBorders>
+          </w:tcPr>
+          <w:p>
+            <w:pPr>
+              <w:spacing w:before="80" w:after="80"/>
+              <w:ind w:left="85"/>
+            </w:pPr>
+            <w:r>
+              <w:rPr>
+                <w:rFonts w:ascii="Calibri" w:hAnsi="Calibri"/>
+                <w:b/>
+                <w:i w:val="0"/>
+                <w:color w:val="4338CA"/>
+                <w:sz w:val="15"/>
+              </w:rPr>
               <w:t>VNEXPRESS – SỨC KHỎE</w:t>
             </w:r>
           </w:p>
@@ -2575,786 +3355,6 @@
                 <w:sz w:val="17"/>
               </w:rPr>
               <w:t>Marketing team (cardiovascular) should monitor Vietnamese social media for rising "drug-free BP control" content frequency; if trend escalates through Q3/2025, coordinate with Medical Affairs to prepare HCP education materials reinforcing the irreplaceable role of pharmacotherapy (PECHAUNOX, TABAREX) in Grade 2+ hypertension and patients with comorbidities.</w:t>
-            </w:r>
-          </w:p>
-        </w:tc>
-      </w:tr>
-    </w:tbl>
-    <w:p>
-      <w:pPr>
-        <w:spacing w:before="40" w:after="120"/>
-      </w:pPr>
-    </w:p>
-    <w:tbl>
-      <w:tblPr>
-        <w:tblStyle w:val="TableGrid"/>
-        <w:tblW w:type="auto" w:w="0"/>
-        <w:jc w:val="left"/>
-        <w:tblLook w:firstColumn="1" w:firstRow="1" w:lastColumn="0" w:lastRow="0" w:noHBand="0" w:noVBand="1" w:val="04A0"/>
-      </w:tblPr>
-      <w:tblGrid>
-        <w:gridCol w:w="4536"/>
-        <w:gridCol w:w="4536"/>
-      </w:tblGrid>
-      <w:tr>
-        <w:tc>
-          <w:tcPr>
-            <w:tcW w:type="dxa" w:w="1984"/>
-            <w:shd w:val="clear" w:color="auto" w:fill="EEF2FF"/>
-            <w:tcBorders>
-              <w:top w:val="none" w:sz="6" w:color="auto"/>
-              <w:bottom w:val="none" w:sz="6" w:color="auto"/>
-              <w:left w:val="none" w:sz="6" w:color="auto"/>
-              <w:right w:val="none" w:sz="6" w:color="auto"/>
-            </w:tcBorders>
-          </w:tcPr>
-          <w:p>
-            <w:pPr>
-              <w:spacing w:before="80" w:after="80"/>
-              <w:ind w:left="85"/>
-            </w:pPr>
-            <w:r>
-              <w:rPr>
-                <w:rFonts w:ascii="Calibri" w:hAnsi="Calibri"/>
-                <w:b/>
-                <w:i w:val="0"/>
-                <w:color w:val="4338CA"/>
-                <w:sz w:val="15"/>
-              </w:rPr>
-              <w:t>VNEXPRESS – SỨC KHỎE</w:t>
-            </w:r>
-          </w:p>
-        </w:tc>
-        <w:tc>
-          <w:tcPr>
-            <w:tcW w:type="dxa" w:w="4536"/>
-            <w:tcBorders>
-              <w:top w:val="none" w:sz="6" w:color="auto"/>
-              <w:bottom w:val="none" w:sz="6" w:color="auto"/>
-              <w:left w:val="none" w:sz="6" w:color="auto"/>
-              <w:right w:val="none" w:sz="6" w:color="auto"/>
-            </w:tcBorders>
-          </w:tcPr>
-          <w:p>
-            <w:pPr>
-              <w:spacing w:before="60" w:after="60"/>
-              <w:ind w:left="113"/>
-            </w:pPr>
-            <w:r>
-              <w:rPr>
-                <w:rFonts w:ascii="Calibri" w:hAnsi="Calibri"/>
-                <w:b/>
-                <w:i w:val="0"/>
-                <w:color w:val="111827"/>
-                <w:sz w:val="21"/>
-              </w:rPr>
-              <w:t>Pediatric Neuroblastoma: High Cost Burden of Stem Cell Transplant Highlights Unmet Treatment Support Needs</w:t>
-            </w:r>
-          </w:p>
-        </w:tc>
-      </w:tr>
-    </w:tbl>
-    <w:p>
-      <w:pPr>
-        <w:spacing w:before="40" w:after="40"/>
-        <w:ind w:left="170"/>
-      </w:pPr>
-      <w:r>
-        <w:rPr>
-          <w:rFonts w:ascii="Calibri" w:hAnsi="Calibri"/>
-          <w:b w:val="0"/>
-          <w:i/>
-          <w:color w:val="6B7280"/>
-          <w:sz w:val="18"/>
-        </w:rPr>
-        <w:t>The article details the treatment journey of a pediatric neuroblastoma patient at Hue Central Hospital, where stem cell transplant costs reach VND 200–300 million — far beyond the means of low-income families. For Davipharm, this highlights the pediatric oncology ETC segment as high-need but heavily dependent on insurance reimbursement and social support funding.[Source]</w:t>
-      </w:r>
-    </w:p>
-    <w:p>
-      <w:pPr>
-        <w:spacing w:before="20" w:after="40"/>
-        <w:ind w:left="170"/>
-      </w:pPr>
-      <w:r>
-        <w:rPr>
-          <w:rFonts w:ascii="Calibri" w:hAnsi="Calibri"/>
-          <w:b/>
-          <w:i w:val="0"/>
-          <w:color w:val="374151"/>
-          <w:sz w:val="17"/>
-        </w:rPr>
-        <w:t>➖ No direct impact on Davipharm's current portfolio; however, signals continued demand for oncology supportive care — indirectly relevant to HYYR (Erlotinib) and LARRIVEY (Bicalutamide) positioning in provincial hospital ETC channels.</w:t>
-      </w:r>
-    </w:p>
-    <w:tbl>
-      <w:tblPr>
-        <w:tblStyle w:val="TableGrid"/>
-        <w:tblW w:type="auto" w:w="0"/>
-        <w:tblLook w:firstColumn="1" w:firstRow="1" w:lastColumn="0" w:lastRow="0" w:noHBand="0" w:noVBand="1" w:val="04A0"/>
-      </w:tblPr>
-      <w:tblGrid>
-        <w:gridCol w:w="9072"/>
-      </w:tblGrid>
-      <w:tr>
-        <w:tc>
-          <w:tcPr>
-            <w:tcW w:type="dxa" w:w="9072"/>
-            <w:shd w:val="clear" w:color="auto" w:fill="F8FAFC"/>
-            <w:tcBorders>
-              <w:top w:val="none" w:sz="6" w:color="auto"/>
-              <w:bottom w:val="none" w:sz="6" w:color="auto"/>
-              <w:left w:val="single" w:sz="12" w:color="003B71"/>
-              <w:right w:val="none" w:sz="6" w:color="auto"/>
-            </w:tcBorders>
-          </w:tcPr>
-          <w:p>
-            <w:pPr>
-              <w:spacing w:before="60" w:after="60"/>
-              <w:ind w:left="142"/>
-            </w:pPr>
-            <w:r>
-              <w:rPr>
-                <w:rFonts w:ascii="Calibri" w:hAnsi="Calibri"/>
-                <w:b/>
-                <w:i w:val="0"/>
-                <w:color w:val="003B71"/>
-                <w:sz w:val="17"/>
-              </w:rPr>
-              <w:t xml:space="preserve">Strategy  </w:t>
-            </w:r>
-            <w:r>
-              <w:rPr>
-                <w:rFonts w:ascii="Calibri" w:hAnsi="Calibri"/>
-                <w:b w:val="0"/>
-                <w:i w:val="0"/>
-                <w:color w:val="334155"/>
-                <w:sz w:val="17"/>
-              </w:rPr>
-              <w:t>ETC/Oncology team to log this as market context: growing demand for pediatric and late-stage cancer treatment at provincial hospitals remains constrained by insurance coverage — reinforcing the priority to secure HYYR (Erlotinib) and LARRIVEY (Bicalutamide) in the next tendering cycle's reimbursed formulary. No urgent action required; include in next quarterly market landscape update.</w:t>
-            </w:r>
-          </w:p>
-        </w:tc>
-      </w:tr>
-    </w:tbl>
-    <w:p>
-      <w:pPr>
-        <w:spacing w:before="40" w:after="120"/>
-      </w:pPr>
-    </w:p>
-    <w:tbl>
-      <w:tblPr>
-        <w:tblStyle w:val="TableGrid"/>
-        <w:tblW w:type="auto" w:w="0"/>
-        <w:jc w:val="left"/>
-        <w:tblLook w:firstColumn="1" w:firstRow="1" w:lastColumn="0" w:lastRow="0" w:noHBand="0" w:noVBand="1" w:val="04A0"/>
-      </w:tblPr>
-      <w:tblGrid>
-        <w:gridCol w:w="4536"/>
-        <w:gridCol w:w="4536"/>
-      </w:tblGrid>
-      <w:tr>
-        <w:tc>
-          <w:tcPr>
-            <w:tcW w:type="dxa" w:w="1984"/>
-            <w:shd w:val="clear" w:color="auto" w:fill="EEF2FF"/>
-            <w:tcBorders>
-              <w:top w:val="none" w:sz="6" w:color="auto"/>
-              <w:bottom w:val="none" w:sz="6" w:color="auto"/>
-              <w:left w:val="none" w:sz="6" w:color="auto"/>
-              <w:right w:val="none" w:sz="6" w:color="auto"/>
-            </w:tcBorders>
-          </w:tcPr>
-          <w:p>
-            <w:pPr>
-              <w:spacing w:before="80" w:after="80"/>
-              <w:ind w:left="85"/>
-            </w:pPr>
-            <w:r>
-              <w:rPr>
-                <w:rFonts w:ascii="Calibri" w:hAnsi="Calibri"/>
-                <w:b/>
-                <w:i w:val="0"/>
-                <w:color w:val="4338CA"/>
-                <w:sz w:val="15"/>
-              </w:rPr>
-              <w:t>VNEXPRESS – SỨC KHỎE</w:t>
-            </w:r>
-          </w:p>
-        </w:tc>
-        <w:tc>
-          <w:tcPr>
-            <w:tcW w:type="dxa" w:w="4536"/>
-            <w:tcBorders>
-              <w:top w:val="none" w:sz="6" w:color="auto"/>
-              <w:bottom w:val="none" w:sz="6" w:color="auto"/>
-              <w:left w:val="none" w:sz="6" w:color="auto"/>
-              <w:right w:val="none" w:sz="6" w:color="auto"/>
-            </w:tcBorders>
-          </w:tcPr>
-          <w:p>
-            <w:pPr>
-              <w:spacing w:before="60" w:after="60"/>
-              <w:ind w:left="113"/>
-            </w:pPr>
-            <w:r>
-              <w:rPr>
-                <w:rFonts w:ascii="Calibri" w:hAnsi="Calibri"/>
-                <w:b/>
-                <w:i w:val="0"/>
-                <w:color w:val="111827"/>
-                <w:sz w:val="21"/>
-              </w:rPr>
-              <w:t>Sleep Tips for Type 2 Diabetics: Patient Awareness Signal for EIMLER-10 &amp; ZLATKO</w:t>
-            </w:r>
-          </w:p>
-        </w:tc>
-      </w:tr>
-    </w:tbl>
-    <w:p>
-      <w:pPr>
-        <w:spacing w:before="40" w:after="40"/>
-        <w:ind w:left="170"/>
-      </w:pPr>
-      <w:r>
-        <w:rPr>
-          <w:rFonts w:ascii="Calibri" w:hAnsi="Calibri"/>
-          <w:b w:val="0"/>
-          <w:i/>
-          <w:color w:val="6B7280"/>
-          <w:sz w:val="18"/>
-        </w:rPr>
-        <w:t>This widely-read VnExpress article highlights type 2 diabetes complications (peripheral neuropathy, sleep apnea) and the critical role of blood glucose control, indirectly increasing treatment awareness among patients. This supports sustained market demand for Davipharm's EIMLER-10 (Empagliflozin) and ZLATKO (Sitagliptin).[Source]</w:t>
-      </w:r>
-    </w:p>
-    <w:p>
-      <w:pPr>
-        <w:spacing w:before="20" w:after="40"/>
-        <w:ind w:left="170"/>
-      </w:pPr>
-      <w:r>
-        <w:rPr>
-          <w:rFonts w:ascii="Calibri" w:hAnsi="Calibri"/>
-          <w:b/>
-          <w:i w:val="0"/>
-          <w:color w:val="374151"/>
-          <w:sz w:val="17"/>
-        </w:rPr>
-        <w:t>📊 Neutral signal — educational content with no direct ETC revenue impact, but reflects growing patient engagement with type 2 diabetes management, a core target segment for EIMLER-10 and ZLATKO.</w:t>
-      </w:r>
-    </w:p>
-    <w:tbl>
-      <w:tblPr>
-        <w:tblStyle w:val="TableGrid"/>
-        <w:tblW w:type="auto" w:w="0"/>
-        <w:tblLook w:firstColumn="1" w:firstRow="1" w:lastColumn="0" w:lastRow="0" w:noHBand="0" w:noVBand="1" w:val="04A0"/>
-      </w:tblPr>
-      <w:tblGrid>
-        <w:gridCol w:w="9072"/>
-      </w:tblGrid>
-      <w:tr>
-        <w:tc>
-          <w:tcPr>
-            <w:tcW w:type="dxa" w:w="9072"/>
-            <w:shd w:val="clear" w:color="auto" w:fill="F8FAFC"/>
-            <w:tcBorders>
-              <w:top w:val="none" w:sz="6" w:color="auto"/>
-              <w:bottom w:val="none" w:sz="6" w:color="auto"/>
-              <w:left w:val="single" w:sz="12" w:color="003B71"/>
-              <w:right w:val="none" w:sz="6" w:color="auto"/>
-            </w:tcBorders>
-          </w:tcPr>
-          <w:p>
-            <w:pPr>
-              <w:spacing w:before="60" w:after="60"/>
-              <w:ind w:left="142"/>
-            </w:pPr>
-            <w:r>
-              <w:rPr>
-                <w:rFonts w:ascii="Calibri" w:hAnsi="Calibri"/>
-                <w:b/>
-                <w:i w:val="0"/>
-                <w:color w:val="003B71"/>
-                <w:sz w:val="17"/>
-              </w:rPr>
-              <w:t xml:space="preserve">Strategy  </w:t>
-            </w:r>
-            <w:r>
-              <w:rPr>
-                <w:rFonts w:ascii="Calibri" w:hAnsi="Calibri"/>
-                <w:b w:val="0"/>
-                <w:i w:val="0"/>
-                <w:color w:val="334155"/>
-                <w:sz w:val="17"/>
-              </w:rPr>
-              <w:t>Marketing Team should leverage growing diabetes complication awareness to reinforce detailing materials for EIMLER-10 and ZLATKO, emphasizing sustained glycemic control benefits when engaging primary care prescribers by Q3/2025.</w:t>
-            </w:r>
-          </w:p>
-        </w:tc>
-      </w:tr>
-    </w:tbl>
-    <w:p>
-      <w:pPr>
-        <w:spacing w:before="40" w:after="120"/>
-      </w:pPr>
-    </w:p>
-    <w:tbl>
-      <w:tblPr>
-        <w:tblStyle w:val="TableGrid"/>
-        <w:tblW w:type="auto" w:w="0"/>
-        <w:jc w:val="left"/>
-        <w:tblLook w:firstColumn="1" w:firstRow="1" w:lastColumn="0" w:lastRow="0" w:noHBand="0" w:noVBand="1" w:val="04A0"/>
-      </w:tblPr>
-      <w:tblGrid>
-        <w:gridCol w:w="4536"/>
-        <w:gridCol w:w="4536"/>
-      </w:tblGrid>
-      <w:tr>
-        <w:tc>
-          <w:tcPr>
-            <w:tcW w:type="dxa" w:w="1984"/>
-            <w:shd w:val="clear" w:color="auto" w:fill="EEF2FF"/>
-            <w:tcBorders>
-              <w:top w:val="none" w:sz="6" w:color="auto"/>
-              <w:bottom w:val="none" w:sz="6" w:color="auto"/>
-              <w:left w:val="none" w:sz="6" w:color="auto"/>
-              <w:right w:val="none" w:sz="6" w:color="auto"/>
-            </w:tcBorders>
-          </w:tcPr>
-          <w:p>
-            <w:pPr>
-              <w:spacing w:before="80" w:after="80"/>
-              <w:ind w:left="85"/>
-            </w:pPr>
-            <w:r>
-              <w:rPr>
-                <w:rFonts w:ascii="Calibri" w:hAnsi="Calibri"/>
-                <w:b/>
-                <w:i w:val="0"/>
-                <w:color w:val="4338CA"/>
-                <w:sz w:val="15"/>
-              </w:rPr>
-              <w:t>SK&amp;ĐS – DƯỢC MỸ PHẨM</w:t>
-            </w:r>
-          </w:p>
-        </w:tc>
-        <w:tc>
-          <w:tcPr>
-            <w:tcW w:type="dxa" w:w="4536"/>
-            <w:tcBorders>
-              <w:top w:val="none" w:sz="6" w:color="auto"/>
-              <w:bottom w:val="none" w:sz="6" w:color="auto"/>
-              <w:left w:val="none" w:sz="6" w:color="auto"/>
-              <w:right w:val="none" w:sz="6" w:color="auto"/>
-            </w:tcBorders>
-          </w:tcPr>
-          <w:p>
-            <w:pPr>
-              <w:spacing w:before="60" w:after="60"/>
-              <w:ind w:left="113"/>
-            </w:pPr>
-            <w:r>
-              <w:rPr>
-                <w:rFonts w:ascii="Calibri" w:hAnsi="Calibri"/>
-                <w:b/>
-                <w:i w:val="0"/>
-                <w:color w:val="111827"/>
-                <w:sz w:val="21"/>
-              </w:rPr>
-              <w:t>New Head of Food Safety Authority Appointed — Leadership Shift at VFA</w:t>
-            </w:r>
-          </w:p>
-        </w:tc>
-      </w:tr>
-    </w:tbl>
-    <w:p>
-      <w:pPr>
-        <w:spacing w:before="40" w:after="40"/>
-        <w:ind w:left="170"/>
-      </w:pPr>
-      <w:r>
-        <w:rPr>
-          <w:rFonts w:ascii="Calibri" w:hAnsi="Calibri"/>
-          <w:b w:val="0"/>
-          <w:i/>
-          <w:color w:val="6B7280"/>
-          <w:sz w:val="18"/>
-        </w:rPr>
-        <w:t>Minister of Health Dao Hong Lan officially appointed a new Director of the Vietnam Food Administration (VFA), which oversees functional foods, cosmetics, and related health products. This leadership change may signal policy shifts in advertising controls, product licensing, and regulatory enforcement under VFA's remit.[Source]</w:t>
-      </w:r>
-    </w:p>
-    <w:p>
-      <w:pPr>
-        <w:spacing w:before="20" w:after="40"/>
-        <w:ind w:left="170"/>
-      </w:pPr>
-      <w:r>
-        <w:rPr>
-          <w:rFonts w:ascii="Calibri" w:hAnsi="Calibri"/>
-          <w:b/>
-          <w:i w:val="0"/>
-          <w:color w:val="374151"/>
-          <w:sz w:val="17"/>
-        </w:rPr>
-        <w:t>👀 Indirect impact — VFA does not regulate Davipharm's Rx portfolio, but policy shifts on advertising or product classification warrant monitoring.</w:t>
-      </w:r>
-    </w:p>
-    <w:tbl>
-      <w:tblPr>
-        <w:tblStyle w:val="TableGrid"/>
-        <w:tblW w:type="auto" w:w="0"/>
-        <w:tblLook w:firstColumn="1" w:firstRow="1" w:lastColumn="0" w:lastRow="0" w:noHBand="0" w:noVBand="1" w:val="04A0"/>
-      </w:tblPr>
-      <w:tblGrid>
-        <w:gridCol w:w="9072"/>
-      </w:tblGrid>
-      <w:tr>
-        <w:tc>
-          <w:tcPr>
-            <w:tcW w:type="dxa" w:w="9072"/>
-            <w:shd w:val="clear" w:color="auto" w:fill="F8FAFC"/>
-            <w:tcBorders>
-              <w:top w:val="none" w:sz="6" w:color="auto"/>
-              <w:bottom w:val="none" w:sz="6" w:color="auto"/>
-              <w:left w:val="single" w:sz="12" w:color="003B71"/>
-              <w:right w:val="none" w:sz="6" w:color="auto"/>
-            </w:tcBorders>
-          </w:tcPr>
-          <w:p>
-            <w:pPr>
-              <w:spacing w:before="60" w:after="60"/>
-              <w:ind w:left="142"/>
-            </w:pPr>
-            <w:r>
-              <w:rPr>
-                <w:rFonts w:ascii="Calibri" w:hAnsi="Calibri"/>
-                <w:b/>
-                <w:i w:val="0"/>
-                <w:color w:val="003B71"/>
-                <w:sz w:val="17"/>
-              </w:rPr>
-              <w:t xml:space="preserve">Strategy  </w:t>
-            </w:r>
-            <w:r>
-              <w:rPr>
-                <w:rFonts w:ascii="Calibri" w:hAnsi="Calibri"/>
-                <w:b w:val="0"/>
-                <w:i w:val="0"/>
-                <w:color w:val="334155"/>
-                <w:sz w:val="17"/>
-              </w:rPr>
-              <w:t>Regulatory Affairs Team to monitor the new VFA Director's policy priorities in Q2/2025, particularly if Davipharm plans to expand into functional food or VFA-regulated OTC segments; no immediate action required.</w:t>
-            </w:r>
-          </w:p>
-        </w:tc>
-      </w:tr>
-    </w:tbl>
-    <w:p>
-      <w:pPr>
-        <w:spacing w:before="40" w:after="120"/>
-      </w:pPr>
-    </w:p>
-    <w:tbl>
-      <w:tblPr>
-        <w:tblStyle w:val="TableGrid"/>
-        <w:tblW w:type="auto" w:w="0"/>
-        <w:jc w:val="left"/>
-        <w:tblLook w:firstColumn="1" w:firstRow="1" w:lastColumn="0" w:lastRow="0" w:noHBand="0" w:noVBand="1" w:val="04A0"/>
-      </w:tblPr>
-      <w:tblGrid>
-        <w:gridCol w:w="4536"/>
-        <w:gridCol w:w="4536"/>
-      </w:tblGrid>
-      <w:tr>
-        <w:tc>
-          <w:tcPr>
-            <w:tcW w:type="dxa" w:w="1984"/>
-            <w:shd w:val="clear" w:color="auto" w:fill="EEF2FF"/>
-            <w:tcBorders>
-              <w:top w:val="none" w:sz="6" w:color="auto"/>
-              <w:bottom w:val="none" w:sz="6" w:color="auto"/>
-              <w:left w:val="none" w:sz="6" w:color="auto"/>
-              <w:right w:val="none" w:sz="6" w:color="auto"/>
-            </w:tcBorders>
-          </w:tcPr>
-          <w:p>
-            <w:pPr>
-              <w:spacing w:before="80" w:after="80"/>
-              <w:ind w:left="85"/>
-            </w:pPr>
-            <w:r>
-              <w:rPr>
-                <w:rFonts w:ascii="Calibri" w:hAnsi="Calibri"/>
-                <w:b/>
-                <w:i w:val="0"/>
-                <w:color w:val="4338CA"/>
-                <w:sz w:val="15"/>
-              </w:rPr>
-              <w:t>SK&amp;ĐS – DƯỢC MỸ PHẨM</w:t>
-            </w:r>
-          </w:p>
-        </w:tc>
-        <w:tc>
-          <w:tcPr>
-            <w:tcW w:type="dxa" w:w="4536"/>
-            <w:tcBorders>
-              <w:top w:val="none" w:sz="6" w:color="auto"/>
-              <w:bottom w:val="none" w:sz="6" w:color="auto"/>
-              <w:left w:val="none" w:sz="6" w:color="auto"/>
-              <w:right w:val="none" w:sz="6" w:color="auto"/>
-            </w:tcBorders>
-          </w:tcPr>
-          <w:p>
-            <w:pPr>
-              <w:spacing w:before="60" w:after="60"/>
-              <w:ind w:left="113"/>
-            </w:pPr>
-            <w:r>
-              <w:rPr>
-                <w:rFonts w:ascii="Calibri" w:hAnsi="Calibri"/>
-                <w:b/>
-                <w:i w:val="0"/>
-                <w:color w:val="111827"/>
-                <w:sz w:val="21"/>
-              </w:rPr>
-              <w:t>12-Year-Old Develops Terminal Cancer Linked to Excessive Bubble Tea Consumption — NCD Awareness Rising</w:t>
-            </w:r>
-          </w:p>
-        </w:tc>
-      </w:tr>
-    </w:tbl>
-    <w:p>
-      <w:pPr>
-        <w:spacing w:before="40" w:after="40"/>
-        <w:ind w:left="170"/>
-      </w:pPr>
-      <w:r>
-        <w:rPr>
-          <w:rFonts w:ascii="Calibri" w:hAnsi="Calibri"/>
-          <w:b w:val="0"/>
-          <w:i/>
-          <w:color w:val="6B7280"/>
-          <w:sz w:val="18"/>
-        </w:rPr>
-        <w:t>A 12-year-old Vietnamese boy was diagnosed with late-stage cancer after replacing water with bubble tea over an extended period, sparking public concern over dietary habits and rising NCD risks among youth. While not directly linked to Davipharm's current portfolio, the case reflects growing public awareness around cancer incidence and oncology treatment demand in Vietnam.[Source]</w:t>
-      </w:r>
-    </w:p>
-    <w:p>
-      <w:pPr>
-        <w:spacing w:before="20" w:after="40"/>
-        <w:ind w:left="170"/>
-      </w:pPr>
-      <w:r>
-        <w:rPr>
-          <w:rFonts w:ascii="Calibri" w:hAnsi="Calibri"/>
-          <w:b/>
-          <w:i w:val="0"/>
-          <w:color w:val="374151"/>
-          <w:sz w:val="17"/>
-        </w:rPr>
-        <w:t>📊 Indirect relevance only — rising cancer awareness may gradually support market demand for HYYR (Erlotinib) and LARRIVEY (Bicalutamide), but no immediate near-term business impact is identified.</w:t>
-      </w:r>
-    </w:p>
-    <w:tbl>
-      <w:tblPr>
-        <w:tblStyle w:val="TableGrid"/>
-        <w:tblW w:type="auto" w:w="0"/>
-        <w:tblLook w:firstColumn="1" w:firstRow="1" w:lastColumn="0" w:lastRow="0" w:noHBand="0" w:noVBand="1" w:val="04A0"/>
-      </w:tblPr>
-      <w:tblGrid>
-        <w:gridCol w:w="9072"/>
-      </w:tblGrid>
-      <w:tr>
-        <w:tc>
-          <w:tcPr>
-            <w:tcW w:type="dxa" w:w="9072"/>
-            <w:shd w:val="clear" w:color="auto" w:fill="F8FAFC"/>
-            <w:tcBorders>
-              <w:top w:val="none" w:sz="6" w:color="auto"/>
-              <w:bottom w:val="none" w:sz="6" w:color="auto"/>
-              <w:left w:val="single" w:sz="12" w:color="003B71"/>
-              <w:right w:val="none" w:sz="6" w:color="auto"/>
-            </w:tcBorders>
-          </w:tcPr>
-          <w:p>
-            <w:pPr>
-              <w:spacing w:before="60" w:after="60"/>
-              <w:ind w:left="142"/>
-            </w:pPr>
-            <w:r>
-              <w:rPr>
-                <w:rFonts w:ascii="Calibri" w:hAnsi="Calibri"/>
-                <w:b/>
-                <w:i w:val="0"/>
-                <w:color w:val="003B71"/>
-                <w:sz w:val="17"/>
-              </w:rPr>
-              <w:t xml:space="preserve">Strategy  </w:t>
-            </w:r>
-            <w:r>
-              <w:rPr>
-                <w:rFonts w:ascii="Calibri" w:hAnsi="Calibri"/>
-                <w:b w:val="0"/>
-                <w:i w:val="0"/>
-                <w:color w:val="334155"/>
-                <w:sz w:val="17"/>
-              </w:rPr>
-              <w:t>Oncology Team to monitor cancer-related media trends as background context for HCP education materials supporting HYYR and LARRIVEY; no urgent action required — low priority for this reporting cycle.</w:t>
-            </w:r>
-          </w:p>
-        </w:tc>
-      </w:tr>
-    </w:tbl>
-    <w:p>
-      <w:pPr>
-        <w:spacing w:before="40" w:after="120"/>
-      </w:pPr>
-    </w:p>
-    <w:tbl>
-      <w:tblPr>
-        <w:tblStyle w:val="TableGrid"/>
-        <w:tblW w:type="auto" w:w="0"/>
-        <w:jc w:val="left"/>
-        <w:tblLook w:firstColumn="1" w:firstRow="1" w:lastColumn="0" w:lastRow="0" w:noHBand="0" w:noVBand="1" w:val="04A0"/>
-      </w:tblPr>
-      <w:tblGrid>
-        <w:gridCol w:w="4536"/>
-        <w:gridCol w:w="4536"/>
-      </w:tblGrid>
-      <w:tr>
-        <w:tc>
-          <w:tcPr>
-            <w:tcW w:type="dxa" w:w="1984"/>
-            <w:shd w:val="clear" w:color="auto" w:fill="EEF2FF"/>
-            <w:tcBorders>
-              <w:top w:val="none" w:sz="6" w:color="auto"/>
-              <w:bottom w:val="none" w:sz="6" w:color="auto"/>
-              <w:left w:val="none" w:sz="6" w:color="auto"/>
-              <w:right w:val="none" w:sz="6" w:color="auto"/>
-            </w:tcBorders>
-          </w:tcPr>
-          <w:p>
-            <w:pPr>
-              <w:spacing w:before="80" w:after="80"/>
-              <w:ind w:left="85"/>
-            </w:pPr>
-            <w:r>
-              <w:rPr>
-                <w:rFonts w:ascii="Calibri" w:hAnsi="Calibri"/>
-                <w:b/>
-                <w:i w:val="0"/>
-                <w:color w:val="4338CA"/>
-                <w:sz w:val="15"/>
-              </w:rPr>
-              <w:t>VNEXPRESS – SỨC KHỎE</w:t>
-            </w:r>
-          </w:p>
-        </w:tc>
-        <w:tc>
-          <w:tcPr>
-            <w:tcW w:type="dxa" w:w="4536"/>
-            <w:tcBorders>
-              <w:top w:val="none" w:sz="6" w:color="auto"/>
-              <w:bottom w:val="none" w:sz="6" w:color="auto"/>
-              <w:left w:val="none" w:sz="6" w:color="auto"/>
-              <w:right w:val="none" w:sz="6" w:color="auto"/>
-            </w:tcBorders>
-          </w:tcPr>
-          <w:p>
-            <w:pPr>
-              <w:spacing w:before="60" w:after="60"/>
-              <w:ind w:left="113"/>
-            </w:pPr>
-            <w:r>
-              <w:rPr>
-                <w:rFonts w:ascii="Calibri" w:hAnsi="Calibri"/>
-                <w:b/>
-                <w:i w:val="0"/>
-                <w:color w:val="111827"/>
-                <w:sz w:val="21"/>
-              </w:rPr>
-              <w:t>Aging Accelerates at 44 &amp; 60 — Strategic Window for Cardiovascular, Diabetes &amp; Gout Portfolio</w:t>
-            </w:r>
-          </w:p>
-        </w:tc>
-      </w:tr>
-    </w:tbl>
-    <w:p>
-      <w:pPr>
-        <w:spacing w:before="40" w:after="40"/>
-        <w:ind w:left="170"/>
-      </w:pPr>
-      <w:r>
-        <w:rPr>
-          <w:rFonts w:ascii="Calibri" w:hAnsi="Calibri"/>
-          <w:b w:val="0"/>
-          <w:i/>
-          <w:color w:val="6B7280"/>
-          <w:sz w:val="18"/>
-        </w:rPr>
-        <w:t>Stanford research confirms aging accelerates sharply at ~44 (metabolism, inflammation, hormones) and ~60 (cardiovascular, renal, glucose regulation), creating two well-defined chronic disease hotspots. This directly underpins long-term demand for Davipharm's core portfolios: cardiovascular (PECHAUNOX, RAVASTEL, ZABALES), diabetes (EIMLER-10, ZLATKO), gout (ZENTOGOUT, MAGRAX), and pain (COXTONE).[Source]</w:t>
-      </w:r>
-    </w:p>
-    <w:p>
-      <w:pPr>
-        <w:spacing w:before="20" w:after="40"/>
-        <w:ind w:left="170"/>
-      </w:pPr>
-      <w:r>
-        <w:rPr>
-          <w:rFonts w:ascii="Calibri" w:hAnsi="Calibri"/>
-          <w:b/>
-          <w:i w:val="0"/>
-          <w:color w:val="166534"/>
-          <w:sz w:val="17"/>
-        </w:rPr>
-        <w:t>🟢 International scientific evidence validates two priority patient segments (40–50 and 60+), providing a strong foundation for Davipharm's Marketing team to build "proactive prevention" messaging across the chronic disease portfolio.</w:t>
-      </w:r>
-    </w:p>
-    <w:tbl>
-      <w:tblPr>
-        <w:tblStyle w:val="TableGrid"/>
-        <w:tblW w:type="auto" w:w="0"/>
-        <w:tblLook w:firstColumn="1" w:firstRow="1" w:lastColumn="0" w:lastRow="0" w:noHBand="0" w:noVBand="1" w:val="04A0"/>
-      </w:tblPr>
-      <w:tblGrid>
-        <w:gridCol w:w="9072"/>
-      </w:tblGrid>
-      <w:tr>
-        <w:tc>
-          <w:tcPr>
-            <w:tcW w:type="dxa" w:w="9072"/>
-            <w:shd w:val="clear" w:color="auto" w:fill="F8FAFC"/>
-            <w:tcBorders>
-              <w:top w:val="none" w:sz="6" w:color="auto"/>
-              <w:bottom w:val="none" w:sz="6" w:color="auto"/>
-              <w:left w:val="single" w:sz="12" w:color="003B71"/>
-              <w:right w:val="none" w:sz="6" w:color="auto"/>
-            </w:tcBorders>
-          </w:tcPr>
-          <w:p>
-            <w:pPr>
-              <w:spacing w:before="60" w:after="60"/>
-              <w:ind w:left="142"/>
-            </w:pPr>
-            <w:r>
-              <w:rPr>
-                <w:rFonts w:ascii="Calibri" w:hAnsi="Calibri"/>
-                <w:b/>
-                <w:i w:val="0"/>
-                <w:color w:val="003B71"/>
-                <w:sz w:val="17"/>
-              </w:rPr>
-              <w:t xml:space="preserve">Strategy  </w:t>
-            </w:r>
-            <w:r>
-              <w:rPr>
-                <w:rFonts w:ascii="Calibri" w:hAnsi="Calibri"/>
-                <w:b w:val="0"/>
-                <w:i w:val="0"/>
-                <w:color w:val="334155"/>
-                <w:sz w:val="17"/>
-              </w:rPr>
-              <w:t>Marketing &amp; Medical Affairs team should develop KOL/CME materials leveraging Stanford data to position an "early intervention at 40+" strategy — prioritizing RAVASTEL (LDL control), EIMLER-10 (renal/cardiac protection), ZENTOGOUT (uric acid management), and PECHAUNOX (blood pressure) in Q3/2025; coordinate with Sales team to expand detailing in endocrinology and cardiology clinics targeting the 40–65 age segment.</w:t>
             </w:r>
           </w:p>
         </w:tc>
@@ -5780,7 +5780,7 @@
                 <w:color w:val="111827"/>
                 <w:sz w:val="18"/>
               </w:rPr>
-              <w:t>Prepare tender dossiers to list HYYR &amp; LARRIVEY in next reimbursed formulary cycle</w:t>
+              <w:t>Monitor Bach Mai 2/Viet Duc 2 approval; prep tender dossiers for RAVASTEL, EIMLER-10, PECHAUNOX, HYYR</w:t>
             </w:r>
           </w:p>
         </w:tc>
@@ -5808,7 +5808,7 @@
                 <w:color w:val="003B71"/>
                 <w:sz w:val="17"/>
               </w:rPr>
-              <w:t>Marketing / RA</w:t>
+              <w:t>Sales ETC</w:t>
             </w:r>
           </w:p>
         </w:tc>
@@ -5836,7 +5836,7 @@
                 <w:color w:val="6B7280"/>
                 <w:sz w:val="17"/>
               </w:rPr>
-              <w:t>Rising oncology screening &amp; provincial hospital demand</w:t>
+              <w:t>Bach Mai 2 &amp; Viet Duc 2 — new procurement units</w:t>
             </w:r>
           </w:p>
         </w:tc>
@@ -5915,7 +5915,7 @@
                 <w:color w:val="111827"/>
                 <w:sz w:val="18"/>
               </w:rPr>
-              <w:t>Update EIMLER-10 &amp; ZLATKO detailing materials for primary care prescribers by Q3/2025</w:t>
+              <w:t>Engage pharmacy depts at Bach Mai 2 &amp; Viet Duc 2 to list HYYR and LARRIVEY in first tender cycle</w:t>
             </w:r>
           </w:p>
         </w:tc>
@@ -5943,7 +5943,7 @@
                 <w:color w:val="003B71"/>
                 <w:sz w:val="17"/>
               </w:rPr>
-              <w:t>Marketing</w:t>
+              <w:t>Sales ETC</w:t>
             </w:r>
           </w:p>
         </w:tc>
@@ -5971,7 +5971,7 @@
                 <w:color w:val="6B7280"/>
                 <w:sz w:val="17"/>
               </w:rPr>
-              <w:t>Growing T2DM complication awareness in mainstream media</w:t>
+              <w:t>Oncology ETC expansion — northern tertiary hospitals</w:t>
             </w:r>
           </w:p>
         </w:tc>
@@ -5999,7 +5999,7 @@
                 <w:color w:val="22C55E"/>
                 <w:sz w:val="17"/>
               </w:rPr>
-              <w:t>🟡 Medium</w:t>
+              <w:t>🔴 High</w:t>
             </w:r>
           </w:p>
         </w:tc>
@@ -6050,7 +6050,7 @@
                 <w:color w:val="111827"/>
                 <w:sz w:val="18"/>
               </w:rPr>
-              <w:t>Monitor "drug-free BP" social content; prep HCP materials for PECHAUNOX &amp; TABAREX</w:t>
+              <w:t>Track early esophageal cancer surgical trend; assess long-term tender impact on HYYR</w:t>
             </w:r>
           </w:p>
         </w:tc>
@@ -6078,7 +6078,7 @@
                 <w:color w:val="003B71"/>
                 <w:sz w:val="17"/>
               </w:rPr>
-              <w:t>Marketing</w:t>
+              <w:t>Strategy</w:t>
             </w:r>
           </w:p>
         </w:tc>
@@ -6106,7 +6106,7 @@
                 <w:color w:val="6B7280"/>
                 <w:sz w:val="17"/>
               </w:rPr>
-              <w:t>Beetroot "drug-free" hypertension trend</w:t>
+              <w:t>Early-stage surgical resection trend — reduced targeted therapy patient pool</w:t>
             </w:r>
           </w:p>
         </w:tc>
@@ -6185,7 +6185,7 @@
                 <w:color w:val="111827"/>
                 <w:sz w:val="18"/>
               </w:rPr>
-              <w:t>Map MoD military pharmacy procurement process for METILONE-4 opportunity</w:t>
+              <w:t>&lt;span class="vi-</w:t>
             </w:r>
           </w:p>
         </w:tc>
@@ -6213,7 +6213,6 @@
                 <w:color w:val="003B71"/>
                 <w:sz w:val="17"/>
               </w:rPr>
-              <w:t>Strategy / Sales</w:t>
             </w:r>
           </w:p>
         </w:tc>

</xml_diff>

<commit_message>
Update report_en.docx 2026-05-13 11:33
</commit_message>
<xml_diff>
--- a/report_en.docx
+++ b/report_en.docx
@@ -338,7 +338,7 @@
                 <w:color w:val="111827"/>
                 <w:sz w:val="20"/>
               </w:rPr>
-              <w:t>No direct regulatory or tender events this week, but MoH's proposal to elevate Bach Mai &amp; Viet Duc satellite hospitals to full-fee status is the most strategically significant ETC expansion signal requiring early action.</w:t>
+              <w:t>Week 11–17 May 2026: A convergence of healthcare infrastructure expansion signals — 200+ satellite hospitals, national screening policy, and Thong Nhat geriatric center — creates a structural ETC tender volume opportunity for Davipharm's cardiometabolic portfolio.</w:t>
             </w:r>
           </w:p>
         </w:tc>
@@ -406,7 +406,7 @@
                 <w:color w:val="111827"/>
                 <w:sz w:val="17"/>
               </w:rPr>
-              <w:t>▸  ETC Expansion – Bach Mai 2 &amp; Viet Duc 2:If approved, two new independent procurement units in Ha Nam and Ninh Binh will open inaugural tender cycles — direct opportunity for RAVASTEL, EIMLER-10, PECHAUNOX, and HYYR.</w:t>
+              <w:t>▸  ETC Infrastructure Expansion:200+ new satellite hospitals = 200+ potential tender sites for PECHAUNOX, RAVASTEL, TABAREX, ZABALES, and JIRACEK at provincial/district level.</w:t>
             </w:r>
           </w:p>
           <w:p>
@@ -422,7 +422,7 @@
                 <w:color w:val="111827"/>
                 <w:sz w:val="17"/>
               </w:rPr>
-              <w:t>▸  Oncology – Early Detection Trend:Shift toward curative surgery for early-stage cancers may gradually reduce the patient pool for targeted therapies, with long-term tender implications for HYYR and LARRIVEY at top-tier hospitals.</w:t>
+              <w:t>▸  Chronic Patient Funnel:National free checkup policy and northern industrial screenings will generate new hypertension, dyslipidemia, and T2DM diagnoses — directly expanding the long-term market for RAVASTEL, EIMLER-10, ZLATKO, and PECHAUNOX.</w:t>
             </w:r>
           </w:p>
           <w:p>
@@ -438,7 +438,7 @@
                 <w:color w:val="111827"/>
                 <w:sz w:val="17"/>
               </w:rPr>
-              <w:t>▸  OTC – Rising Out-of-Pocket Spending:HCM City's VND 3,500B dental tourism figure confirms a macro consumer willingness to pay outside BHYT, reinforcing the investment case for private-clinic channels targeting the Men's Health portfolio (JANUS, TADALAFIL 20MG, DRYCHES).</w:t>
+              <w:t>▸  Oncology &amp; Geriatrics:Expanding lung cancer screening supports HYYR (Erlotinib) volume growth; Thong Nhat Hospital's geriatric pivot is a priority market access opportunity in HCMC for the cardiovascular–diabetes lineup.</w:t>
             </w:r>
           </w:p>
         </w:tc>
@@ -663,7 +663,7 @@
         <w:tc>
           <w:tcPr>
             <w:tcW w:type="dxa" w:w="1701"/>
-            <w:shd w:val="clear" w:color="auto" w:fill="DCFCE7"/>
+            <w:shd w:val="clear" w:color="auto" w:fill="E9FBF0"/>
             <w:tcBorders>
               <w:top w:val="none" w:sz="6" w:color="auto"/>
               <w:bottom w:val="none" w:sz="6" w:color="auto"/>
@@ -679,19 +679,19 @@
             <w:r>
               <w:rPr>
                 <w:rFonts w:ascii="Calibri" w:hAnsi="Calibri"/>
-                <w:b/>
+                <w:b w:val="0"/>
                 <w:i w:val="0"/>
-                <w:color w:val="166534"/>
+                <w:color w:val="CCCCCC"/>
                 <w:sz w:val="22"/>
               </w:rPr>
-              <w:t>4</w:t>
+              <w:t>—</w:t>
             </w:r>
           </w:p>
         </w:tc>
         <w:tc>
           <w:tcPr>
             <w:tcW w:type="dxa" w:w="1984"/>
-            <w:shd w:val="clear" w:color="auto" w:fill="F3F4F6"/>
+            <w:shd w:val="clear" w:color="auto" w:fill="F9FAFB"/>
             <w:tcBorders>
               <w:top w:val="none" w:sz="6" w:color="auto"/>
               <w:bottom w:val="none" w:sz="6" w:color="auto"/>
@@ -707,12 +707,12 @@
             <w:r>
               <w:rPr>
                 <w:rFonts w:ascii="Calibri" w:hAnsi="Calibri"/>
-                <w:b/>
+                <w:b w:val="0"/>
                 <w:i w:val="0"/>
-                <w:color w:val="374151"/>
+                <w:color w:val="CCCCCC"/>
                 <w:sz w:val="22"/>
               </w:rPr>
-              <w:t>1</w:t>
+              <w:t>—</w:t>
             </w:r>
           </w:p>
         </w:tc>
@@ -798,7 +798,7 @@
                 <w:color w:val="166534"/>
                 <w:sz w:val="22"/>
               </w:rPr>
-              <w:t>1</w:t>
+              <w:t>5</w:t>
             </w:r>
           </w:p>
         </w:tc>
@@ -826,7 +826,7 @@
                 <w:color w:val="374151"/>
                 <w:sz w:val="22"/>
               </w:rPr>
-              <w:t>9</w:t>
+              <w:t>5</w:t>
             </w:r>
           </w:p>
         </w:tc>
@@ -1002,786 +1002,6 @@
         <w:t>REGULATORY &amp; POLICY</w:t>
       </w:r>
     </w:p>
-    <w:tbl>
-      <w:tblPr>
-        <w:tblStyle w:val="TableGrid"/>
-        <w:tblW w:type="auto" w:w="0"/>
-        <w:jc w:val="left"/>
-        <w:tblLook w:firstColumn="1" w:firstRow="1" w:lastColumn="0" w:lastRow="0" w:noHBand="0" w:noVBand="1" w:val="04A0"/>
-      </w:tblPr>
-      <w:tblGrid>
-        <w:gridCol w:w="4536"/>
-        <w:gridCol w:w="4536"/>
-      </w:tblGrid>
-      <w:tr>
-        <w:tc>
-          <w:tcPr>
-            <w:tcW w:type="dxa" w:w="1984"/>
-            <w:shd w:val="clear" w:color="auto" w:fill="EEF2FF"/>
-            <w:tcBorders>
-              <w:top w:val="none" w:sz="6" w:color="auto"/>
-              <w:bottom w:val="none" w:sz="6" w:color="auto"/>
-              <w:left w:val="none" w:sz="6" w:color="auto"/>
-              <w:right w:val="none" w:sz="6" w:color="auto"/>
-            </w:tcBorders>
-          </w:tcPr>
-          <w:p>
-            <w:pPr>
-              <w:spacing w:before="80" w:after="80"/>
-              <w:ind w:left="85"/>
-            </w:pPr>
-            <w:r>
-              <w:rPr>
-                <w:rFonts w:ascii="Calibri" w:hAnsi="Calibri"/>
-                <w:b/>
-                <w:i w:val="0"/>
-                <w:color w:val="4338CA"/>
-                <w:sz w:val="15"/>
-              </w:rPr>
-              <w:t>SK&amp;ĐS – DƯỢC MỸ PHẨM</w:t>
-            </w:r>
-          </w:p>
-        </w:tc>
-        <w:tc>
-          <w:tcPr>
-            <w:tcW w:type="dxa" w:w="4536"/>
-            <w:tcBorders>
-              <w:top w:val="none" w:sz="6" w:color="auto"/>
-              <w:bottom w:val="none" w:sz="6" w:color="auto"/>
-              <w:left w:val="none" w:sz="6" w:color="auto"/>
-              <w:right w:val="none" w:sz="6" w:color="auto"/>
-            </w:tcBorders>
-          </w:tcPr>
-          <w:p>
-            <w:pPr>
-              <w:spacing w:before="60" w:after="60"/>
-              <w:ind w:left="113"/>
-            </w:pPr>
-            <w:r>
-              <w:rPr>
-                <w:rFonts w:ascii="Calibri" w:hAnsi="Calibri"/>
-                <w:b/>
-                <w:i w:val="0"/>
-                <w:color w:val="111827"/>
-                <w:sz w:val="21"/>
-              </w:rPr>
-              <w:t>S.I.S Can Tho Hospital Guided on Medical Wastewater Compliance</w:t>
-            </w:r>
-          </w:p>
-        </w:tc>
-      </w:tr>
-    </w:tbl>
-    <w:p>
-      <w:pPr>
-        <w:spacing w:before="40" w:after="40"/>
-        <w:ind w:left="170"/>
-      </w:pPr>
-      <w:r>
-        <w:rPr>
-          <w:rFonts w:ascii="Calibri" w:hAnsi="Calibri"/>
-          <w:b w:val="0"/>
-          <w:i/>
-          <w:color w:val="6B7280"/>
-          <w:sz w:val="18"/>
-        </w:rPr>
-        <w:t>The article covers environmental compliance at S.I.S International Hospital in Can Tho regarding medical wastewater collection and treatment — with no direct relevance to the pharmaceutical market or drug distribution channels. Content is local administrative in nature with no actionable market intelligence.[Source]</w:t>
-      </w:r>
-    </w:p>
-    <w:p>
-      <w:pPr>
-        <w:spacing w:before="20" w:after="40"/>
-        <w:ind w:left="170"/>
-      </w:pPr>
-      <w:r>
-        <w:rPr>
-          <w:rFonts w:ascii="Calibri" w:hAnsi="Calibri"/>
-          <w:b/>
-          <w:i w:val="0"/>
-          <w:color w:val="374151"/>
-          <w:sz w:val="17"/>
-        </w:rPr>
-        <w:t>⚪ This news has no discernible impact on Davipharm's business operations or strategy.</w:t>
-      </w:r>
-    </w:p>
-    <w:tbl>
-      <w:tblPr>
-        <w:tblStyle w:val="TableGrid"/>
-        <w:tblW w:type="auto" w:w="0"/>
-        <w:tblLook w:firstColumn="1" w:firstRow="1" w:lastColumn="0" w:lastRow="0" w:noHBand="0" w:noVBand="1" w:val="04A0"/>
-      </w:tblPr>
-      <w:tblGrid>
-        <w:gridCol w:w="9072"/>
-      </w:tblGrid>
-      <w:tr>
-        <w:tc>
-          <w:tcPr>
-            <w:tcW w:type="dxa" w:w="9072"/>
-            <w:shd w:val="clear" w:color="auto" w:fill="F8FAFC"/>
-            <w:tcBorders>
-              <w:top w:val="none" w:sz="6" w:color="auto"/>
-              <w:bottom w:val="none" w:sz="6" w:color="auto"/>
-              <w:left w:val="single" w:sz="12" w:color="003B71"/>
-              <w:right w:val="none" w:sz="6" w:color="auto"/>
-            </w:tcBorders>
-          </w:tcPr>
-          <w:p>
-            <w:pPr>
-              <w:spacing w:before="60" w:after="60"/>
-              <w:ind w:left="142"/>
-            </w:pPr>
-            <w:r>
-              <w:rPr>
-                <w:rFonts w:ascii="Calibri" w:hAnsi="Calibri"/>
-                <w:b/>
-                <w:i w:val="0"/>
-                <w:color w:val="003B71"/>
-                <w:sz w:val="17"/>
-              </w:rPr>
-              <w:t xml:space="preserve">Strategy  </w:t>
-            </w:r>
-            <w:r>
-              <w:rPr>
-                <w:rFonts w:ascii="Calibri" w:hAnsi="Calibri"/>
-                <w:b w:val="0"/>
-                <w:i w:val="0"/>
-                <w:color w:val="334155"/>
-                <w:sz w:val="17"/>
-              </w:rPr>
-              <w:t>No action required — article falls outside pharmaceutical strategic monitoring scope; recommend excluding similar environmental compliance news from BOD intelligence filters to improve reporting efficiency.</w:t>
-            </w:r>
-          </w:p>
-        </w:tc>
-      </w:tr>
-    </w:tbl>
-    <w:p>
-      <w:pPr>
-        <w:spacing w:before="40" w:after="120"/>
-      </w:pPr>
-    </w:p>
-    <w:tbl>
-      <w:tblPr>
-        <w:tblStyle w:val="TableGrid"/>
-        <w:tblW w:type="auto" w:w="0"/>
-        <w:jc w:val="left"/>
-        <w:tblLook w:firstColumn="1" w:firstRow="1" w:lastColumn="0" w:lastRow="0" w:noHBand="0" w:noVBand="1" w:val="04A0"/>
-      </w:tblPr>
-      <w:tblGrid>
-        <w:gridCol w:w="4536"/>
-        <w:gridCol w:w="4536"/>
-      </w:tblGrid>
-      <w:tr>
-        <w:tc>
-          <w:tcPr>
-            <w:tcW w:type="dxa" w:w="1984"/>
-            <w:shd w:val="clear" w:color="auto" w:fill="EEF2FF"/>
-            <w:tcBorders>
-              <w:top w:val="none" w:sz="6" w:color="auto"/>
-              <w:bottom w:val="none" w:sz="6" w:color="auto"/>
-              <w:left w:val="none" w:sz="6" w:color="auto"/>
-              <w:right w:val="none" w:sz="6" w:color="auto"/>
-            </w:tcBorders>
-          </w:tcPr>
-          <w:p>
-            <w:pPr>
-              <w:spacing w:before="80" w:after="80"/>
-              <w:ind w:left="85"/>
-            </w:pPr>
-            <w:r>
-              <w:rPr>
-                <w:rFonts w:ascii="Calibri" w:hAnsi="Calibri"/>
-                <w:b/>
-                <w:i w:val="0"/>
-                <w:color w:val="4338CA"/>
-                <w:sz w:val="15"/>
-              </w:rPr>
-              <w:t>SK&amp;ĐS – DƯỢC MỸ PHẨM</w:t>
-            </w:r>
-          </w:p>
-        </w:tc>
-        <w:tc>
-          <w:tcPr>
-            <w:tcW w:type="dxa" w:w="4536"/>
-            <w:tcBorders>
-              <w:top w:val="none" w:sz="6" w:color="auto"/>
-              <w:bottom w:val="none" w:sz="6" w:color="auto"/>
-              <w:left w:val="none" w:sz="6" w:color="auto"/>
-              <w:right w:val="none" w:sz="6" w:color="auto"/>
-            </w:tcBorders>
-          </w:tcPr>
-          <w:p>
-            <w:pPr>
-              <w:spacing w:before="60" w:after="60"/>
-              <w:ind w:left="113"/>
-            </w:pPr>
-            <w:r>
-              <w:rPr>
-                <w:rFonts w:ascii="Calibri" w:hAnsi="Calibri"/>
-                <w:b/>
-                <w:i w:val="0"/>
-                <w:color w:val="111827"/>
-                <w:sz w:val="21"/>
-              </w:rPr>
-              <w:t>5 Essential Food Groups for Post-50 Nutrition: Market Signal for Healthy Aging Supplements</w:t>
-            </w:r>
-          </w:p>
-        </w:tc>
-      </w:tr>
-    </w:tbl>
-    <w:p>
-      <w:pPr>
-        <w:spacing w:before="40" w:after="40"/>
-        <w:ind w:left="170"/>
-      </w:pPr>
-      <w:r>
-        <w:rPr>
-          <w:rFonts w:ascii="Calibri" w:hAnsi="Calibri"/>
-          <w:b w:val="0"/>
-          <w:i/>
-          <w:color w:val="6B7280"/>
-          <w:sz w:val="18"/>
-        </w:rPr>
-        <w:t>Health media is amplifying nutritional content targeting the 50+ demographic, reflecting growing consumer awareness and demand in Vietnam's rapidly aging population. This trend signals a clear market opportunity in micronutrient supplements, calcium, vitamin D, and omega-3 product lines.[Source]</w:t>
-      </w:r>
-    </w:p>
-    <w:p>
-      <w:pPr>
-        <w:spacing w:before="20" w:after="40"/>
-        <w:ind w:left="170"/>
-      </w:pPr>
-      <w:r>
-        <w:rPr>
-          <w:rFonts w:ascii="Calibri" w:hAnsi="Calibri"/>
-          <w:b/>
-          <w:i w:val="0"/>
-          <w:color w:val="166534"/>
-          <w:sz w:val="17"/>
-        </w:rPr>
-        <w:t>📈 Rising health media coverage on senior nutrition signals a market expansion opportunity for Davipharm's nutraceutical portfolio targeting the 50+ segment.</w:t>
-      </w:r>
-    </w:p>
-    <w:tbl>
-      <w:tblPr>
-        <w:tblStyle w:val="TableGrid"/>
-        <w:tblW w:type="auto" w:w="0"/>
-        <w:tblLook w:firstColumn="1" w:firstRow="1" w:lastColumn="0" w:lastRow="0" w:noHBand="0" w:noVBand="1" w:val="04A0"/>
-      </w:tblPr>
-      <w:tblGrid>
-        <w:gridCol w:w="9072"/>
-      </w:tblGrid>
-      <w:tr>
-        <w:tc>
-          <w:tcPr>
-            <w:tcW w:type="dxa" w:w="9072"/>
-            <w:shd w:val="clear" w:color="auto" w:fill="F8FAFC"/>
-            <w:tcBorders>
-              <w:top w:val="none" w:sz="6" w:color="auto"/>
-              <w:bottom w:val="none" w:sz="6" w:color="auto"/>
-              <w:left w:val="single" w:sz="12" w:color="003B71"/>
-              <w:right w:val="none" w:sz="6" w:color="auto"/>
-            </w:tcBorders>
-          </w:tcPr>
-          <w:p>
-            <w:pPr>
-              <w:spacing w:before="60" w:after="60"/>
-              <w:ind w:left="142"/>
-            </w:pPr>
-            <w:r>
-              <w:rPr>
-                <w:rFonts w:ascii="Calibri" w:hAnsi="Calibri"/>
-                <w:b/>
-                <w:i w:val="0"/>
-                <w:color w:val="003B71"/>
-                <w:sz w:val="17"/>
-              </w:rPr>
-              <w:t xml:space="preserve">Strategy  </w:t>
-            </w:r>
-            <w:r>
-              <w:rPr>
-                <w:rFonts w:ascii="Calibri" w:hAnsi="Calibri"/>
-                <w:b w:val="0"/>
-                <w:i w:val="0"/>
-                <w:color w:val="334155"/>
-                <w:sz w:val="17"/>
-              </w:rPr>
-              <w:t>Leverage this media trend to accelerate marketing of existing calcium, multivitamin D, and omega-3 products; evaluate launching an "Active 50+" nutritional combo SKU to capture the fast-growing senior consumer segment ahead of competitors.</w:t>
-            </w:r>
-          </w:p>
-        </w:tc>
-      </w:tr>
-    </w:tbl>
-    <w:p>
-      <w:pPr>
-        <w:spacing w:before="40" w:after="120"/>
-      </w:pPr>
-    </w:p>
-    <w:tbl>
-      <w:tblPr>
-        <w:tblStyle w:val="TableGrid"/>
-        <w:tblW w:type="auto" w:w="0"/>
-        <w:jc w:val="left"/>
-        <w:tblLook w:firstColumn="1" w:firstRow="1" w:lastColumn="0" w:lastRow="0" w:noHBand="0" w:noVBand="1" w:val="04A0"/>
-      </w:tblPr>
-      <w:tblGrid>
-        <w:gridCol w:w="4536"/>
-        <w:gridCol w:w="4536"/>
-      </w:tblGrid>
-      <w:tr>
-        <w:tc>
-          <w:tcPr>
-            <w:tcW w:type="dxa" w:w="1984"/>
-            <w:shd w:val="clear" w:color="auto" w:fill="EEF2FF"/>
-            <w:tcBorders>
-              <w:top w:val="none" w:sz="6" w:color="auto"/>
-              <w:bottom w:val="none" w:sz="6" w:color="auto"/>
-              <w:left w:val="none" w:sz="6" w:color="auto"/>
-              <w:right w:val="none" w:sz="6" w:color="auto"/>
-            </w:tcBorders>
-          </w:tcPr>
-          <w:p>
-            <w:pPr>
-              <w:spacing w:before="80" w:after="80"/>
-              <w:ind w:left="85"/>
-            </w:pPr>
-            <w:r>
-              <w:rPr>
-                <w:rFonts w:ascii="Calibri" w:hAnsi="Calibri"/>
-                <w:b/>
-                <w:i w:val="0"/>
-                <w:color w:val="4338CA"/>
-                <w:sz w:val="15"/>
-              </w:rPr>
-              <w:t>SK&amp;ĐS – DƯỢC MỸ PHẨM</w:t>
-            </w:r>
-          </w:p>
-        </w:tc>
-        <w:tc>
-          <w:tcPr>
-            <w:tcW w:type="dxa" w:w="4536"/>
-            <w:tcBorders>
-              <w:top w:val="none" w:sz="6" w:color="auto"/>
-              <w:bottom w:val="none" w:sz="6" w:color="auto"/>
-              <w:left w:val="none" w:sz="6" w:color="auto"/>
-              <w:right w:val="none" w:sz="6" w:color="auto"/>
-            </w:tcBorders>
-          </w:tcPr>
-          <w:p>
-            <w:pPr>
-              <w:spacing w:before="60" w:after="60"/>
-              <w:ind w:left="113"/>
-            </w:pPr>
-            <w:r>
-              <w:rPr>
-                <w:rFonts w:ascii="Calibri" w:hAnsi="Calibri"/>
-                <w:b/>
-                <w:i w:val="0"/>
-                <w:color w:val="111827"/>
-                <w:sz w:val="21"/>
-              </w:rPr>
-              <w:t>11 Supplements to Avoid with Anticoagulant Therapy: Drug-Interaction Alert</w:t>
-            </w:r>
-          </w:p>
-        </w:tc>
-      </w:tr>
-    </w:tbl>
-    <w:p>
-      <w:pPr>
-        <w:spacing w:before="40" w:after="40"/>
-        <w:ind w:left="170"/>
-      </w:pPr>
-      <w:r>
-        <w:rPr>
-          <w:rFonts w:ascii="Calibri" w:hAnsi="Calibri"/>
-          <w:b w:val="0"/>
-          <w:i/>
-          <w:color w:val="6B7280"/>
-          <w:sz w:val="18"/>
-        </w:rPr>
-        <w:t>SK&amp;ĐS warns against 11 supplement categories that dangerously interact with anticoagulants, increasing risks of bleeding or abnormal clotting. This surfaces amid Vietnam's booming supplement market where drug-supplement interaction awareness remains critically low.[Source]</w:t>
-      </w:r>
-    </w:p>
-    <w:p>
-      <w:pPr>
-        <w:spacing w:before="20" w:after="40"/>
-        <w:ind w:left="170"/>
-      </w:pPr>
-      <w:r>
-        <w:rPr>
-          <w:rFonts w:ascii="Calibri" w:hAnsi="Calibri"/>
-          <w:b/>
-          <w:i w:val="0"/>
-          <w:color w:val="166534"/>
-          <w:sz w:val="17"/>
-        </w:rPr>
-        <w:t>💡 Opportunity for Davipharm to position as a drug-safety authority, gaining B2B and B2C communication advantage in the cardiovascular segment.</w:t>
-      </w:r>
-    </w:p>
-    <w:tbl>
-      <w:tblPr>
-        <w:tblStyle w:val="TableGrid"/>
-        <w:tblW w:type="auto" w:w="0"/>
-        <w:tblLook w:firstColumn="1" w:firstRow="1" w:lastColumn="0" w:lastRow="0" w:noHBand="0" w:noVBand="1" w:val="04A0"/>
-      </w:tblPr>
-      <w:tblGrid>
-        <w:gridCol w:w="9072"/>
-      </w:tblGrid>
-      <w:tr>
-        <w:tc>
-          <w:tcPr>
-            <w:tcW w:type="dxa" w:w="9072"/>
-            <w:shd w:val="clear" w:color="auto" w:fill="F8FAFC"/>
-            <w:tcBorders>
-              <w:top w:val="none" w:sz="6" w:color="auto"/>
-              <w:bottom w:val="none" w:sz="6" w:color="auto"/>
-              <w:left w:val="single" w:sz="12" w:color="003B71"/>
-              <w:right w:val="none" w:sz="6" w:color="auto"/>
-            </w:tcBorders>
-          </w:tcPr>
-          <w:p>
-            <w:pPr>
-              <w:spacing w:before="60" w:after="60"/>
-              <w:ind w:left="142"/>
-            </w:pPr>
-            <w:r>
-              <w:rPr>
-                <w:rFonts w:ascii="Calibri" w:hAnsi="Calibri"/>
-                <w:b/>
-                <w:i w:val="0"/>
-                <w:color w:val="003B71"/>
-                <w:sz w:val="17"/>
-              </w:rPr>
-              <w:t xml:space="preserve">Strategy  </w:t>
-            </w:r>
-            <w:r>
-              <w:rPr>
-                <w:rFonts w:ascii="Calibri" w:hAnsi="Calibri"/>
-                <w:b w:val="0"/>
-                <w:i w:val="0"/>
-                <w:color w:val="334155"/>
-                <w:sz w:val="17"/>
-              </w:rPr>
-              <w:t>Develop a "Safe Anticoagulant Use Guide" distributed through pharmacy chains and prescribing physicians to boost brand visibility in the cardiovascular segment and strengthen ETC/OTC channel relationships. Simultaneously, audit existing OTC/supplement labels to ensure adequate drug-interaction warnings, mitigating regulatory and liability risks.</w:t>
-            </w:r>
-          </w:p>
-        </w:tc>
-      </w:tr>
-    </w:tbl>
-    <w:p>
-      <w:pPr>
-        <w:spacing w:before="40" w:after="120"/>
-      </w:pPr>
-    </w:p>
-    <w:tbl>
-      <w:tblPr>
-        <w:tblStyle w:val="TableGrid"/>
-        <w:tblW w:type="auto" w:w="0"/>
-        <w:jc w:val="left"/>
-        <w:tblLook w:firstColumn="1" w:firstRow="1" w:lastColumn="0" w:lastRow="0" w:noHBand="0" w:noVBand="1" w:val="04A0"/>
-      </w:tblPr>
-      <w:tblGrid>
-        <w:gridCol w:w="4536"/>
-        <w:gridCol w:w="4536"/>
-      </w:tblGrid>
-      <w:tr>
-        <w:tc>
-          <w:tcPr>
-            <w:tcW w:type="dxa" w:w="1984"/>
-            <w:shd w:val="clear" w:color="auto" w:fill="EEF2FF"/>
-            <w:tcBorders>
-              <w:top w:val="none" w:sz="6" w:color="auto"/>
-              <w:bottom w:val="none" w:sz="6" w:color="auto"/>
-              <w:left w:val="none" w:sz="6" w:color="auto"/>
-              <w:right w:val="none" w:sz="6" w:color="auto"/>
-            </w:tcBorders>
-          </w:tcPr>
-          <w:p>
-            <w:pPr>
-              <w:spacing w:before="80" w:after="80"/>
-              <w:ind w:left="85"/>
-            </w:pPr>
-            <w:r>
-              <w:rPr>
-                <w:rFonts w:ascii="Calibri" w:hAnsi="Calibri"/>
-                <w:b/>
-                <w:i w:val="0"/>
-                <w:color w:val="4338CA"/>
-                <w:sz w:val="15"/>
-              </w:rPr>
-              <w:t>SK&amp;ĐS – DƯỢC MỸ PHẨM</w:t>
-            </w:r>
-          </w:p>
-        </w:tc>
-        <w:tc>
-          <w:tcPr>
-            <w:tcW w:type="dxa" w:w="4536"/>
-            <w:tcBorders>
-              <w:top w:val="none" w:sz="6" w:color="auto"/>
-              <w:bottom w:val="none" w:sz="6" w:color="auto"/>
-              <w:left w:val="none" w:sz="6" w:color="auto"/>
-              <w:right w:val="none" w:sz="6" w:color="auto"/>
-            </w:tcBorders>
-          </w:tcPr>
-          <w:p>
-            <w:pPr>
-              <w:spacing w:before="60" w:after="60"/>
-              <w:ind w:left="113"/>
-            </w:pPr>
-            <w:r>
-              <w:rPr>
-                <w:rFonts w:ascii="Calibri" w:hAnsi="Calibri"/>
-                <w:b/>
-                <w:i w:val="0"/>
-                <w:color w:val="111827"/>
-                <w:sz w:val="21"/>
-              </w:rPr>
-              <w:t>Severe Chickenpox Complication in Child Highlights Antibiotic &amp; Antiviral Market Opportunity</w:t>
-            </w:r>
-          </w:p>
-        </w:tc>
-      </w:tr>
-    </w:tbl>
-    <w:p>
-      <w:pPr>
-        <w:spacing w:before="40" w:after="40"/>
-        <w:ind w:left="170"/>
-      </w:pPr>
-      <w:r>
-        <w:rPr>
-          <w:rFonts w:ascii="Calibri" w:hAnsi="Calibri"/>
-          <w:b w:val="0"/>
-          <w:i/>
-          <w:color w:val="6B7280"/>
-          <w:sz w:val="18"/>
-        </w:rPr>
-        <w:t>A high-profile case of a 6-year-old developing sepsis as a chickenpox complication is raising public awareness of secondary bacterial infections post-viral illness. Demand for antibiotics targeting secondary infections and antivirals in pediatric settings is expected to rise during chickenpox season.[Source]</w:t>
-      </w:r>
-    </w:p>
-    <w:p>
-      <w:pPr>
-        <w:spacing w:before="20" w:after="40"/>
-        <w:ind w:left="170"/>
-      </w:pPr>
-      <w:r>
-        <w:rPr>
-          <w:rFonts w:ascii="Calibri" w:hAnsi="Calibri"/>
-          <w:b/>
-          <w:i w:val="0"/>
-          <w:color w:val="166534"/>
-          <w:sz w:val="17"/>
-        </w:rPr>
-        <w:t>📈 Short-term growth opportunity for Davipharm's pediatric antibiotic and chickenpox complication treatment portfolio.</w:t>
-      </w:r>
-    </w:p>
-    <w:tbl>
-      <w:tblPr>
-        <w:tblStyle w:val="TableGrid"/>
-        <w:tblW w:type="auto" w:w="0"/>
-        <w:tblLook w:firstColumn="1" w:firstRow="1" w:lastColumn="0" w:lastRow="0" w:noHBand="0" w:noVBand="1" w:val="04A0"/>
-      </w:tblPr>
-      <w:tblGrid>
-        <w:gridCol w:w="9072"/>
-      </w:tblGrid>
-      <w:tr>
-        <w:tc>
-          <w:tcPr>
-            <w:tcW w:type="dxa" w:w="9072"/>
-            <w:shd w:val="clear" w:color="auto" w:fill="F8FAFC"/>
-            <w:tcBorders>
-              <w:top w:val="none" w:sz="6" w:color="auto"/>
-              <w:bottom w:val="none" w:sz="6" w:color="auto"/>
-              <w:left w:val="single" w:sz="12" w:color="003B71"/>
-              <w:right w:val="none" w:sz="6" w:color="auto"/>
-            </w:tcBorders>
-          </w:tcPr>
-          <w:p>
-            <w:pPr>
-              <w:spacing w:before="60" w:after="60"/>
-              <w:ind w:left="142"/>
-            </w:pPr>
-            <w:r>
-              <w:rPr>
-                <w:rFonts w:ascii="Calibri" w:hAnsi="Calibri"/>
-                <w:b/>
-                <w:i w:val="0"/>
-                <w:color w:val="003B71"/>
-                <w:sz w:val="17"/>
-              </w:rPr>
-              <w:t xml:space="preserve">Strategy  </w:t>
-            </w:r>
-            <w:r>
-              <w:rPr>
-                <w:rFonts w:ascii="Calibri" w:hAnsi="Calibri"/>
-                <w:b w:val="0"/>
-                <w:i w:val="0"/>
-                <w:color w:val="334155"/>
-                <w:sz w:val="17"/>
-              </w:rPr>
-              <w:t>Intensify Medical Rep coverage at pediatric hospitals and clinics with broad-spectrum antibiotics (amoxicillin-clavulanate, cephalosporins) and acyclovir, emphasizing early intervention to prevent complications. Consider publishing KOL-supported materials on chickenpox complication management protocols to strengthen Davipharm's brand presence in the pediatric segment.</w:t>
-            </w:r>
-          </w:p>
-        </w:tc>
-      </w:tr>
-    </w:tbl>
-    <w:p>
-      <w:pPr>
-        <w:spacing w:before="40" w:after="120"/>
-      </w:pPr>
-    </w:p>
-    <w:tbl>
-      <w:tblPr>
-        <w:tblStyle w:val="TableGrid"/>
-        <w:tblW w:type="auto" w:w="0"/>
-        <w:jc w:val="left"/>
-        <w:tblLook w:firstColumn="1" w:firstRow="1" w:lastColumn="0" w:lastRow="0" w:noHBand="0" w:noVBand="1" w:val="04A0"/>
-      </w:tblPr>
-      <w:tblGrid>
-        <w:gridCol w:w="4536"/>
-        <w:gridCol w:w="4536"/>
-      </w:tblGrid>
-      <w:tr>
-        <w:tc>
-          <w:tcPr>
-            <w:tcW w:type="dxa" w:w="1984"/>
-            <w:shd w:val="clear" w:color="auto" w:fill="EEF2FF"/>
-            <w:tcBorders>
-              <w:top w:val="none" w:sz="6" w:color="auto"/>
-              <w:bottom w:val="none" w:sz="6" w:color="auto"/>
-              <w:left w:val="none" w:sz="6" w:color="auto"/>
-              <w:right w:val="none" w:sz="6" w:color="auto"/>
-            </w:tcBorders>
-          </w:tcPr>
-          <w:p>
-            <w:pPr>
-              <w:spacing w:before="80" w:after="80"/>
-              <w:ind w:left="85"/>
-            </w:pPr>
-            <w:r>
-              <w:rPr>
-                <w:rFonts w:ascii="Calibri" w:hAnsi="Calibri"/>
-                <w:b/>
-                <w:i w:val="0"/>
-                <w:color w:val="4338CA"/>
-                <w:sz w:val="15"/>
-              </w:rPr>
-              <w:t>NHÂN DÂN – XÃ HỘI</w:t>
-            </w:r>
-          </w:p>
-        </w:tc>
-        <w:tc>
-          <w:tcPr>
-            <w:tcW w:type="dxa" w:w="4536"/>
-            <w:tcBorders>
-              <w:top w:val="none" w:sz="6" w:color="auto"/>
-              <w:bottom w:val="none" w:sz="6" w:color="auto"/>
-              <w:left w:val="none" w:sz="6" w:color="auto"/>
-              <w:right w:val="none" w:sz="6" w:color="auto"/>
-            </w:tcBorders>
-          </w:tcPr>
-          <w:p>
-            <w:pPr>
-              <w:spacing w:before="60" w:after="60"/>
-              <w:ind w:left="113"/>
-            </w:pPr>
-            <w:r>
-              <w:rPr>
-                <w:rFonts w:ascii="Calibri" w:hAnsi="Calibri"/>
-                <w:b/>
-                <w:i w:val="0"/>
-                <w:color w:val="111827"/>
-                <w:sz w:val="21"/>
-              </w:rPr>
-              <w:t>Vietnam's "Dr. Luong" Thyroid Surgery Technique Draws International Patients &amp; Medical Professionals</w:t>
-            </w:r>
-          </w:p>
-        </w:tc>
-      </w:tr>
-    </w:tbl>
-    <w:p>
-      <w:pPr>
-        <w:spacing w:before="40" w:after="40"/>
-        <w:ind w:left="170"/>
-      </w:pPr>
-      <w:r>
-        <w:rPr>
-          <w:rFonts w:ascii="Calibri" w:hAnsi="Calibri"/>
-          <w:b w:val="0"/>
-          <w:i/>
-          <w:color w:val="6B7280"/>
-          <w:sz w:val="18"/>
-        </w:rPr>
-        <w:t>Vietnam's "Dr. Luong" endoscopic thyroid surgery technique is attracting patients from the Philippines and physicians from Azerbaijan and India, cementing Vietnam's status as a regional medical excellence hub. This inbound medical tourism trend signals growing demand for post-operative and thyroid-related pharmaceuticals at leading hospitals.[Source]</w:t>
-      </w:r>
-    </w:p>
-    <w:p>
-      <w:pPr>
-        <w:spacing w:before="20" w:after="40"/>
-        <w:ind w:left="170"/>
-      </w:pPr>
-      <w:r>
-        <w:rPr>
-          <w:rFonts w:ascii="Calibri" w:hAnsi="Calibri"/>
-          <w:b/>
-          <w:i w:val="0"/>
-          <w:color w:val="166534"/>
-          <w:sz w:val="17"/>
-        </w:rPr>
-        <w:t>🟢 Indirect positive signal — growing medical tourism drives incremental demand for thyroid post-op pharmaceuticals at partner hospitals.</w:t>
-      </w:r>
-    </w:p>
-    <w:tbl>
-      <w:tblPr>
-        <w:tblStyle w:val="TableGrid"/>
-        <w:tblW w:type="auto" w:w="0"/>
-        <w:tblLook w:firstColumn="1" w:firstRow="1" w:lastColumn="0" w:lastRow="0" w:noHBand="0" w:noVBand="1" w:val="04A0"/>
-      </w:tblPr>
-      <w:tblGrid>
-        <w:gridCol w:w="9072"/>
-      </w:tblGrid>
-      <w:tr>
-        <w:tc>
-          <w:tcPr>
-            <w:tcW w:type="dxa" w:w="9072"/>
-            <w:shd w:val="clear" w:color="auto" w:fill="F8FAFC"/>
-            <w:tcBorders>
-              <w:top w:val="none" w:sz="6" w:color="auto"/>
-              <w:bottom w:val="none" w:sz="6" w:color="auto"/>
-              <w:left w:val="single" w:sz="12" w:color="003B71"/>
-              <w:right w:val="none" w:sz="6" w:color="auto"/>
-            </w:tcBorders>
-          </w:tcPr>
-          <w:p>
-            <w:pPr>
-              <w:spacing w:before="60" w:after="60"/>
-              <w:ind w:left="142"/>
-            </w:pPr>
-            <w:r>
-              <w:rPr>
-                <w:rFonts w:ascii="Calibri" w:hAnsi="Calibri"/>
-                <w:b/>
-                <w:i w:val="0"/>
-                <w:color w:val="003B71"/>
-                <w:sz w:val="17"/>
-              </w:rPr>
-              <w:t xml:space="preserve">Strategy  </w:t>
-            </w:r>
-            <w:r>
-              <w:rPr>
-                <w:rFonts w:ascii="Calibri" w:hAnsi="Calibri"/>
-                <w:b w:val="0"/>
-                <w:i w:val="0"/>
-                <w:color w:val="334155"/>
-                <w:sz w:val="17"/>
-              </w:rPr>
-              <w:t>Davipharm should proactively engage hospitals performing the "Dr. Luong" technique to secure preferred tender positioning for levothyroxine, calcium supplements, and post-surgical antibiotics. Rising international patient volumes will elevate drug quality standards — a competitive window for Davipharm's higher-quality generics over imports.</w:t>
-            </w:r>
-          </w:p>
-        </w:tc>
-      </w:tr>
-    </w:tbl>
-    <w:p>
-      <w:pPr>
-        <w:spacing w:before="40" w:after="120"/>
-      </w:pPr>
-    </w:p>
     <w:p>
       <w:r>
         <w:br w:type="page"/>
@@ -1841,7 +1061,7 @@
                 <w:color w:val="4338CA"/>
                 <w:sz w:val="15"/>
               </w:rPr>
-              <w:t>SK&amp;ĐS – CHÍNH SÁCH Y TẾ</w:t>
+              <w:t>TUỔI TRẺ – SỨC KHỎE</w:t>
             </w:r>
           </w:p>
         </w:tc>
@@ -1868,7 +1088,7 @@
                 <w:color w:val="111827"/>
                 <w:sz w:val="21"/>
               </w:rPr>
-              <w:t>Quality Assurance in Pharmaceuticals, Cosmetics &amp; Food: Public Health Imperative</w:t>
+              <w:t>Khanh Hoa Provincial Hospital Faces Prolonged Ward Shortage — Infrastructure Bottleneck Signals Procurement Delays</w:t>
             </w:r>
           </w:p>
         </w:tc>
@@ -1887,7 +1107,7 @@
           <w:color w:val="6B7280"/>
           <w:sz w:val="18"/>
         </w:rPr>
-        <w:t>The article outlines general quality assurance directions for pharmaceuticals, cosmetics, and functional foods in Vietnam, with no specific regulatory document or tender result issued. The content is editorial in nature and carries no direct short-term impact on Davipharm's product portfolio or tendering operations.[Source]</w:t>
+        <w:t>Khanh Hoa Provincial Hospital has been unable to resolve a critical ward shortage for over 3 months, reflecting infrastructure pressure at provincial-level facilities. This may indirectly disrupt ETC drug procurement execution and disbursement at this facility.[Source]</w:t>
       </w:r>
     </w:p>
     <w:p>
@@ -1903,7 +1123,7 @@
           <w:color w:val="374151"/>
           <w:sz w:val="17"/>
         </w:rPr>
-        <w:t>⚪ Neutral signal — no specific regulatory or tender event impacting Davipharm products; monitor in case quality control directions are formalized into binding regulation.</w:t>
+        <w:t>⚠️ Limited but watchable impact: hospital infrastructure disruption may slow ETC contract disbursement for Davipharm's cardiovascular and diabetes portfolio in Khanh Hoa province.</w:t>
       </w:r>
     </w:p>
     <w:tbl>
@@ -1950,319 +1170,7 @@
                 <w:color w:val="334155"/>
                 <w:sz w:val="17"/>
               </w:rPr>
-              <w:t>Regulatory Affairs team should monitor follow-up developments from the Drug Administration of Vietnam to detect early if this direction materializes into binding circulars or decrees affecting product registration or GMP conditions across the portfolio; no immediate action required at this stage.</w:t>
-            </w:r>
-          </w:p>
-        </w:tc>
-      </w:tr>
-    </w:tbl>
-    <w:p>
-      <w:pPr>
-        <w:spacing w:before="40" w:after="120"/>
-      </w:pPr>
-    </w:p>
-    <w:tbl>
-      <w:tblPr>
-        <w:tblStyle w:val="TableGrid"/>
-        <w:tblW w:type="auto" w:w="0"/>
-        <w:jc w:val="left"/>
-        <w:tblLook w:firstColumn="1" w:firstRow="1" w:lastColumn="0" w:lastRow="0" w:noHBand="0" w:noVBand="1" w:val="04A0"/>
-      </w:tblPr>
-      <w:tblGrid>
-        <w:gridCol w:w="4536"/>
-        <w:gridCol w:w="4536"/>
-      </w:tblGrid>
-      <w:tr>
-        <w:tc>
-          <w:tcPr>
-            <w:tcW w:type="dxa" w:w="1984"/>
-            <w:shd w:val="clear" w:color="auto" w:fill="EEF2FF"/>
-            <w:tcBorders>
-              <w:top w:val="none" w:sz="6" w:color="auto"/>
-              <w:bottom w:val="none" w:sz="6" w:color="auto"/>
-              <w:left w:val="none" w:sz="6" w:color="auto"/>
-              <w:right w:val="none" w:sz="6" w:color="auto"/>
-            </w:tcBorders>
-          </w:tcPr>
-          <w:p>
-            <w:pPr>
-              <w:spacing w:before="80" w:after="80"/>
-              <w:ind w:left="85"/>
-            </w:pPr>
-            <w:r>
-              <w:rPr>
-                <w:rFonts w:ascii="Calibri" w:hAnsi="Calibri"/>
-                <w:b/>
-                <w:i w:val="0"/>
-                <w:color w:val="4338CA"/>
-                <w:sz w:val="15"/>
-              </w:rPr>
-              <w:t>VNEXPRESS – SỨC KHỎE</w:t>
-            </w:r>
-          </w:p>
-        </w:tc>
-        <w:tc>
-          <w:tcPr>
-            <w:tcW w:type="dxa" w:w="4536"/>
-            <w:tcBorders>
-              <w:top w:val="none" w:sz="6" w:color="auto"/>
-              <w:bottom w:val="none" w:sz="6" w:color="auto"/>
-              <w:left w:val="none" w:sz="6" w:color="auto"/>
-              <w:right w:val="none" w:sz="6" w:color="auto"/>
-            </w:tcBorders>
-          </w:tcPr>
-          <w:p>
-            <w:pPr>
-              <w:spacing w:before="60" w:after="60"/>
-              <w:ind w:left="113"/>
-            </w:pPr>
-            <w:r>
-              <w:rPr>
-                <w:rFonts w:ascii="Calibri" w:hAnsi="Calibri"/>
-                <w:b/>
-                <w:i w:val="0"/>
-                <w:color w:val="111827"/>
-                <w:sz w:val="21"/>
-              </w:rPr>
-              <w:t>Summer Travel Health Prep: Seasonal OTC Demand Signal</w:t>
-            </w:r>
-          </w:p>
-        </w:tc>
-      </w:tr>
-    </w:tbl>
-    <w:p>
-      <w:pPr>
-        <w:spacing w:before="40" w:after="40"/>
-        <w:ind w:left="170"/>
-      </w:pPr>
-      <w:r>
-        <w:rPr>
-          <w:rFonts w:ascii="Calibri" w:hAnsi="Calibri"/>
-          <w:b w:val="0"/>
-          <w:i/>
-          <w:color w:val="6B7280"/>
-          <w:sz w:val="18"/>
-        </w:rPr>
-        <w:t>VNVC-sourced article advises summer travelers to stock basic OTC medicines (antipyretics, digestives, antiseptics) and vaccines, signaling a seasonal uptick in consumer OTC demand. Direct impact on Davipharm is minimal as its portfolio lacks dedicated travel-health OTC products and the article has no relevance to ETC/tender channels.[Source]</w:t>
-      </w:r>
-    </w:p>
-    <w:p>
-      <w:pPr>
-        <w:spacing w:before="20" w:after="40"/>
-        <w:ind w:left="170"/>
-      </w:pPr>
-      <w:r>
-        <w:rPr>
-          <w:rFonts w:ascii="Calibri" w:hAnsi="Calibri"/>
-          <w:b/>
-          <w:i w:val="0"/>
-          <w:color w:val="374151"/>
-          <w:sz w:val="17"/>
-        </w:rPr>
-        <w:t>➖ Article has no direct relevance to Davipharm's ETC portfolio or strategic products; no immediate opportunity or risk identified.</w:t>
-      </w:r>
-    </w:p>
-    <w:tbl>
-      <w:tblPr>
-        <w:tblStyle w:val="TableGrid"/>
-        <w:tblW w:type="auto" w:w="0"/>
-        <w:tblLook w:firstColumn="1" w:firstRow="1" w:lastColumn="0" w:lastRow="0" w:noHBand="0" w:noVBand="1" w:val="04A0"/>
-      </w:tblPr>
-      <w:tblGrid>
-        <w:gridCol w:w="9072"/>
-      </w:tblGrid>
-      <w:tr>
-        <w:tc>
-          <w:tcPr>
-            <w:tcW w:type="dxa" w:w="9072"/>
-            <w:shd w:val="clear" w:color="auto" w:fill="F8FAFC"/>
-            <w:tcBorders>
-              <w:top w:val="none" w:sz="6" w:color="auto"/>
-              <w:bottom w:val="none" w:sz="6" w:color="auto"/>
-              <w:left w:val="single" w:sz="12" w:color="003B71"/>
-              <w:right w:val="none" w:sz="6" w:color="auto"/>
-            </w:tcBorders>
-          </w:tcPr>
-          <w:p>
-            <w:pPr>
-              <w:spacing w:before="60" w:after="60"/>
-              <w:ind w:left="142"/>
-            </w:pPr>
-            <w:r>
-              <w:rPr>
-                <w:rFonts w:ascii="Calibri" w:hAnsi="Calibri"/>
-                <w:b/>
-                <w:i w:val="0"/>
-                <w:color w:val="003B71"/>
-                <w:sz w:val="17"/>
-              </w:rPr>
-              <w:t xml:space="preserve">Strategy  </w:t>
-            </w:r>
-            <w:r>
-              <w:rPr>
-                <w:rFonts w:ascii="Calibri" w:hAnsi="Calibri"/>
-                <w:b w:val="0"/>
-                <w:i w:val="0"/>
-                <w:color w:val="334155"/>
-                <w:sz w:val="17"/>
-              </w:rPr>
-              <w:t>No priority action required. Marketing team may log as a background OTC seasonal demand signal; no resource allocation needed as Davipharm lacks a travel-health OTC positioning for its digestive/antipyretic lines.</w:t>
-            </w:r>
-          </w:p>
-        </w:tc>
-      </w:tr>
-    </w:tbl>
-    <w:p>
-      <w:pPr>
-        <w:spacing w:before="40" w:after="120"/>
-      </w:pPr>
-    </w:p>
-    <w:tbl>
-      <w:tblPr>
-        <w:tblStyle w:val="TableGrid"/>
-        <w:tblW w:type="auto" w:w="0"/>
-        <w:jc w:val="left"/>
-        <w:tblLook w:firstColumn="1" w:firstRow="1" w:lastColumn="0" w:lastRow="0" w:noHBand="0" w:noVBand="1" w:val="04A0"/>
-      </w:tblPr>
-      <w:tblGrid>
-        <w:gridCol w:w="4536"/>
-        <w:gridCol w:w="4536"/>
-      </w:tblGrid>
-      <w:tr>
-        <w:tc>
-          <w:tcPr>
-            <w:tcW w:type="dxa" w:w="1984"/>
-            <w:shd w:val="clear" w:color="auto" w:fill="EEF2FF"/>
-            <w:tcBorders>
-              <w:top w:val="none" w:sz="6" w:color="auto"/>
-              <w:bottom w:val="none" w:sz="6" w:color="auto"/>
-              <w:left w:val="none" w:sz="6" w:color="auto"/>
-              <w:right w:val="none" w:sz="6" w:color="auto"/>
-            </w:tcBorders>
-          </w:tcPr>
-          <w:p>
-            <w:pPr>
-              <w:spacing w:before="80" w:after="80"/>
-              <w:ind w:left="85"/>
-            </w:pPr>
-            <w:r>
-              <w:rPr>
-                <w:rFonts w:ascii="Calibri" w:hAnsi="Calibri"/>
-                <w:b/>
-                <w:i w:val="0"/>
-                <w:color w:val="4338CA"/>
-                <w:sz w:val="15"/>
-              </w:rPr>
-              <w:t>VNEXPRESS – SỨC KHỎE</w:t>
-            </w:r>
-          </w:p>
-        </w:tc>
-        <w:tc>
-          <w:tcPr>
-            <w:tcW w:type="dxa" w:w="4536"/>
-            <w:tcBorders>
-              <w:top w:val="none" w:sz="6" w:color="auto"/>
-              <w:bottom w:val="none" w:sz="6" w:color="auto"/>
-              <w:left w:val="none" w:sz="6" w:color="auto"/>
-              <w:right w:val="none" w:sz="6" w:color="auto"/>
-            </w:tcBorders>
-          </w:tcPr>
-          <w:p>
-            <w:pPr>
-              <w:spacing w:before="60" w:after="60"/>
-              <w:ind w:left="113"/>
-            </w:pPr>
-            <w:r>
-              <w:rPr>
-                <w:rFonts w:ascii="Calibri" w:hAnsi="Calibri"/>
-                <w:b/>
-                <w:i w:val="0"/>
-                <w:color w:val="111827"/>
-                <w:sz w:val="21"/>
-              </w:rPr>
-              <w:t>Minimally Invasive Esophagectomy for Early-Stage Cancer: Clinical Signal for Oncology Market</w:t>
-            </w:r>
-          </w:p>
-        </w:tc>
-      </w:tr>
-    </w:tbl>
-    <w:p>
-      <w:pPr>
-        <w:spacing w:before="40" w:after="40"/>
-        <w:ind w:left="170"/>
-      </w:pPr>
-      <w:r>
-        <w:rPr>
-          <w:rFonts w:ascii="Calibri" w:hAnsi="Calibri"/>
-          <w:b w:val="0"/>
-          <w:i/>
-          <w:color w:val="6B7280"/>
-          <w:sz w:val="18"/>
-        </w:rPr>
-        <w:t>Tam Anh Hospital successfully performed total minimally invasive esophagectomy for an early-stage esophageal cancer patient (cT1bN0M0), with no adjuvant chemo-radiotherapy required post-surgery. This reflects a trend toward early cancer detection via routine screening, potentially shifting patient volume away from systemic oncology therapies relevant to Davipharm's HYYR (Erlotinib) and LARRIVEY (Bicalutamide).[Source]</w:t>
-      </w:r>
-    </w:p>
-    <w:p>
-      <w:pPr>
-        <w:spacing w:before="20" w:after="40"/>
-        <w:ind w:left="170"/>
-      </w:pPr>
-      <w:r>
-        <w:rPr>
-          <w:rFonts w:ascii="Calibri" w:hAnsi="Calibri"/>
-          <w:b/>
-          <w:i w:val="0"/>
-          <w:color w:val="374151"/>
-          <w:sz w:val="17"/>
-        </w:rPr>
-        <w:t>⚪ Watch signal: growing early-detection trend may gradually reduce the patient pool for targeted therapy — no immediate revenue impact for Davipharm, but warrants monitoring of oncology treatment model shifts in top-tier ETC hospital channels.</w:t>
-      </w:r>
-    </w:p>
-    <w:tbl>
-      <w:tblPr>
-        <w:tblStyle w:val="TableGrid"/>
-        <w:tblW w:type="auto" w:w="0"/>
-        <w:tblLook w:firstColumn="1" w:firstRow="1" w:lastColumn="0" w:lastRow="0" w:noHBand="0" w:noVBand="1" w:val="04A0"/>
-      </w:tblPr>
-      <w:tblGrid>
-        <w:gridCol w:w="9072"/>
-      </w:tblGrid>
-      <w:tr>
-        <w:tc>
-          <w:tcPr>
-            <w:tcW w:type="dxa" w:w="9072"/>
-            <w:shd w:val="clear" w:color="auto" w:fill="F8FAFC"/>
-            <w:tcBorders>
-              <w:top w:val="none" w:sz="6" w:color="auto"/>
-              <w:bottom w:val="none" w:sz="6" w:color="auto"/>
-              <w:left w:val="single" w:sz="12" w:color="003B71"/>
-              <w:right w:val="none" w:sz="6" w:color="auto"/>
-            </w:tcBorders>
-          </w:tcPr>
-          <w:p>
-            <w:pPr>
-              <w:spacing w:before="60" w:after="60"/>
-              <w:ind w:left="142"/>
-            </w:pPr>
-            <w:r>
-              <w:rPr>
-                <w:rFonts w:ascii="Calibri" w:hAnsi="Calibri"/>
-                <w:b/>
-                <w:i w:val="0"/>
-                <w:color w:val="003B71"/>
-                <w:sz w:val="17"/>
-              </w:rPr>
-              <w:t xml:space="preserve">Strategy  </w:t>
-            </w:r>
-            <w:r>
-              <w:rPr>
-                <w:rFonts w:ascii="Calibri" w:hAnsi="Calibri"/>
-                <w:b w:val="0"/>
-                <w:i w:val="0"/>
-                <w:color w:val="334155"/>
-                <w:sz w:val="17"/>
-              </w:rPr>
-              <w:t>Oncology Team to monitor the ratio of surgical resection vs. systemic treatment cases at top-tier hospitals (Tam Anh, Bach Mai, Cho Ray) to assess long-term bidding implications for HYYR and LARRIVEY; no immediate action required this quarter.</w:t>
+              <w:t>The Central Region ETC Sales team should audit contract status and disbursement progress at Khanh Hoa Provincial Hospital in May–June 2026, focusing on PECHAUNOX, RAVASTEL, and EIMLER-10; any risk of inventory backlog or delayed payment should be escalated to regional management promptly.</w:t>
             </w:r>
           </w:p>
         </w:tc>
@@ -2336,7 +1244,7 @@
                 <w:color w:val="111827"/>
                 <w:sz w:val="21"/>
               </w:rPr>
-              <w:t>MoH Proposes Bach Mai &amp; Viet Duc Satellite Hospitals Adopt Full Service Pricing Parity</w:t>
+              <w:t>Ministry of Health to Improve Compensation Policy for Island-Based Medical Staff</w:t>
             </w:r>
           </w:p>
         </w:tc>
@@ -2355,7 +1263,7 @@
           <w:color w:val="6B7280"/>
           <w:sz w:val="18"/>
         </w:rPr>
-        <w:t>The Ministry of Health has proposed allowing the satellite campuses of Bach Mai and Viet Duc hospitals to charge the same service fees as their main facilities, aiming to improve financial autonomy and patient volume at these two major northern tertiary centers. If approved, increased inpatient activity at these sites would expand ETC consumption opportunities for Davipharm's cardiovascular, diabetes, and oncology portfolios.[Source]</w:t>
+        <w:t>Vietnam's Deputy Minister of Health announced plans to advise on improved compensation schemes for medical staff serving in remote island areas, aiming to strengthen healthcare workforce retention. This personnel policy has no direct bearing on Davipharm's tendering activities or product portfolio.[Source]</w:t>
       </w:r>
     </w:p>
     <w:p>
@@ -2368,10 +1276,10 @@
           <w:rFonts w:ascii="Calibri" w:hAnsi="Calibri"/>
           <w:b/>
           <w:i w:val="0"/>
-          <w:color w:val="166534"/>
+          <w:color w:val="374151"/>
           <w:sz w:val="17"/>
         </w:rPr>
-        <w:t>📈 ETC expansion opportunity: two fully operational satellite hospitals represent additional independent procurement units — potential to list RAVASTEL, EIMLER-10, HYYR, and PECHAUNOX in new tender packages.</w:t>
+        <w:t>➖ No direct relevance to Davipharm — no impact on ETC revenue or generic portfolio anticipated.</w:t>
       </w:r>
     </w:p>
     <w:tbl>
@@ -2418,7 +1326,7 @@
                 <w:color w:val="334155"/>
                 <w:sz w:val="17"/>
               </w:rPr>
-              <w:t>The Northern ETC Sales Team should monitor approval progress and proactively engage the Pharmacy &amp; Medical Supply departments at Bach Mai 2 (Ha Nam) and Viet Duc 2 (Ninh Binh) upon official confirmation, prioritizing formulary listing of RAVASTEL, EIMLER-10, PECHAUNOX, and HYYR in these facilities' inaugural tender cycles.</w:t>
+              <w:t>No priority action required; Market Intelligence team to file for reference in case future rural/island distribution channel opportunities emerge linked to expanded healthcare infrastructure.</w:t>
             </w:r>
           </w:p>
         </w:tc>
@@ -2492,7 +1400,7 @@
                 <w:color w:val="111827"/>
                 <w:sz w:val="21"/>
               </w:rPr>
-              <w:t>HCM City Earns VND 3,500B from Dental Tourism — Signal from Vietnam's Growing Out-of-Pocket Healthcare Market</w:t>
+              <w:t>Annual Free Health Checkup Policy: Potential Demand Surge for Cardiovascular &amp; Diabetes Therapeutics</w:t>
             </w:r>
           </w:p>
         </w:tc>
@@ -2511,7 +1419,7 @@
           <w:color w:val="6B7280"/>
           <w:sz w:val="18"/>
         </w:rPr>
-        <w:t>Ho Chi Minh City recorded VND 3,500 billion in revenue from dental tourism services, reflecting a growing consumer willingness to pay out-of-pocket for elective healthcare outside the BHYT system. This trend has no direct impact on Davipharm's ETC tender portfolio, but signals expansion potential for OTC and private-clinic channels.[Source]</w:t>
+        <w:t>A proposed policy of annual free health checkups for all citizens is expected to significantly increase early detection rates for chronic conditions including hypertension, dyslipidemia, cardiovascular disease, and type 2 diabetes. This could generate a new wave of diagnosed and prescribed patients, boosting long-term demand for Davipharm's cardiometabolic portfolio: RAVASTEL (Rosuvastatin), PECHAUNOX (Perindopril+Amlodipine), HATLOP (Irbesartan), TABAREX (Valsartan), and EIMLER-10 (Empagliflozin).[Source]</w:t>
       </w:r>
     </w:p>
     <w:p>
@@ -2524,10 +1432,10 @@
           <w:rFonts w:ascii="Calibri" w:hAnsi="Calibri"/>
           <w:b/>
           <w:i w:val="0"/>
-          <w:color w:val="374151"/>
+          <w:color w:val="166534"/>
           <w:sz w:val="17"/>
         </w:rPr>
-        <w:t>📊 No direct relevance to Davipharm's core portfolio; macro signal of rising out-of-pocket healthcare spending may indirectly benefit OTC channel products (JANUS, TADALAFIL 20MG, DRYCHES).</w:t>
+        <w:t>📈 Medium-to-long-term opportunity: national screening policy will expand the chronic disease patient funnel, directly supporting ETC tender volume growth for Davipharm's cardiovascular and diabetes portfolios.</w:t>
       </w:r>
     </w:p>
     <w:tbl>
@@ -2574,7 +1482,7 @@
                 <w:color w:val="334155"/>
                 <w:sz w:val="17"/>
               </w:rPr>
-              <w:t>OTC Marketing team may reference this out-of-pocket spending trend to strengthen the investment case for private clinic and premium pharmacy channels for the Men's Health portfolio (JANUS, TADALAFIL 20MG, DRYCHES) in H2/2025 planning. No urgent action required — routine monitoring.</w:t>
+              <w:t>Marketing &amp; Medical Affairs should monitor treatment protocols recommended under the annual checkup program (particularly lipid, HbA1c, and blood pressure screening) to proactively position RAVASTEL, EIMLER-10, ZLATKO (Sitagliptin), and</w:t>
             </w:r>
           </w:p>
         </w:tc>
@@ -2621,7 +1529,7 @@
                 <w:color w:val="4338CA"/>
                 <w:sz w:val="15"/>
               </w:rPr>
-              <w:t>VNEXPRESS – SỨC KHỎE</w:t>
+              <w:t>TUỔI TRẺ – SỨC KHỎE</w:t>
             </w:r>
           </w:p>
         </w:tc>
@@ -2648,7 +1556,7 @@
                 <w:color w:val="111827"/>
                 <w:sz w:val="21"/>
               </w:rPr>
-              <w:t>Ministry of Health Mobilizes ~VND 6B in Medicines &amp; Medical Equipment for Truong Sa Islands</w:t>
+              <w:t>35,000 Aesthetic Complication Cases Annually — Unregulated Spa Sector Raises Medical Demand Signal</w:t>
             </w:r>
           </w:p>
         </w:tc>
@@ -2667,7 +1575,7 @@
           <w:color w:val="6B7280"/>
           <w:sz w:val="18"/>
         </w:rPr>
-        <w:t>The Ministry of Health donated nearly VND 6 billion in medicines and medical equipment to seven islands and one offshore platform in Truong Sa, with VND 3.3 billion earmarked for medical supplies and devices. This is a humanitarian/defense initiative outside the commercial ETC tendering channels relevant to Davipharm's core business.[Source]</w:t>
+        <w:t>Vietnam records approximately 35,000 aesthetic complication cases per year, predominantly from unlicensed spa operators, driving growing demand for post-procedure and complication management (inflammation, infection, pain) within hospital settings. Direct impact on Davipharm is limited, but this signals latent demand for anti-inflammatory and analgesic products used in complication treatment protocols.[Source]</w:t>
       </w:r>
     </w:p>
     <w:p>
@@ -2683,7 +1591,7 @@
           <w:color w:val="374151"/>
           <w:sz w:val="17"/>
         </w:rPr>
-        <w:t>⚪ No direct impact on Davipharm's revenue or tender portfolio; monitor only if MoH expands defense healthcare supply into competitive centralized procurement mechanisms.</w:t>
+        <w:t>🔎 Weak market signal — rising aesthetic complication burden may provide marginal support for MAGRAX (Etoricoxib) and METILONE-4 (Methylprednisolone) in hospital channels, but insufficient to alter near-term strategy.</w:t>
       </w:r>
     </w:p>
     <w:tbl>
@@ -2730,7 +1638,7 @@
                 <w:color w:val="334155"/>
                 <w:sz w:val="17"/>
               </w:rPr>
-              <w:t>No immediate action required. BD/Tender team may note the military healthcare supply channel (Ministry of Defense) as a long-term opportunity, particularly for essential products such as METILONE-4 (Methylprednisolone) — subject to first verifying the military's separate procurement process.</w:t>
+              <w:t>ETC Marketing team to monitor post-aesthetic complication treatment trends (inflammation, pain) in dermatology and plastic surgery hospitals — assess feasibility of positioning MAGRAX and METILONE-4 in tender lists for this segment in the next procurement cycle.</w:t>
             </w:r>
           </w:p>
         </w:tc>
@@ -2777,7 +1685,7 @@
                 <w:color w:val="4338CA"/>
                 <w:sz w:val="15"/>
               </w:rPr>
-              <w:t>VNEXPRESS – SỨC KHỎE</w:t>
+              <w:t>TUỔI TRẺ – SỨC KHỎE</w:t>
             </w:r>
           </w:p>
         </w:tc>
@@ -2804,7 +1712,7 @@
                 <w:color w:val="111827"/>
                 <w:sz w:val="21"/>
               </w:rPr>
-              <w:t>Triple Synthetic Drug Combo (Ketamine/MDMA/Meth) Triggers Severe CNS Damage — Public Health Alert</w:t>
+              <w:t>Mass Free Health Screenings for Industrial Workers in Northern Vietnam</w:t>
             </w:r>
           </w:p>
         </w:tc>
@@ -2823,7 +1731,7 @@
           <w:color w:val="6B7280"/>
           <w:sz w:val="18"/>
         </w:rPr>
-        <w:t>The arrest of singer Miu Lê testing positive for Methamphetamine, MDMA, and Ketamine simultaneously has prompted medical warnings about prolonged CNS damage, depression, and psychiatric disorders from polysubstance abuse. While unrelated to generic procurement or reg-policy, the trend indirectly signals potential growth in demand for psychiatric treatment (depression, anxiety, behavioral disorders) relevant to Davipharm's CNS portfolio.[Source]</w:t>
+        <w:t>Large-scale free health screenings for factory workers in northern industrial zones reflect a growing trend of expanding primary healthcare access to Vietnam's industrial labor force — a segment with historically low formal medical engagement. Increased diagnosis rates for chronic conditions (cardiovascular, diabetes, GI) could generate downstream demand relevant to Davipharm's core portfolio.[Source]</w:t>
       </w:r>
     </w:p>
     <w:p>
@@ -2839,7 +1747,7 @@
           <w:color w:val="374151"/>
           <w:sz w:val="17"/>
         </w:rPr>
-        <w:t>📊 No direct revenue or tender impact; monitor rising psychiatric patient volumes as a long-term demand signal for SERNAL (Risperidone) and LAFAXOR (Venlafaxine) in the ETC channel.</w:t>
+        <w:t>📊 Weak market signal — potential long-term demand uplift for RAVASTEL, EIMLER-10, JIRACEK, but no direct near-term impact on tendering or revenue.</w:t>
       </w:r>
     </w:p>
     <w:tbl>
@@ -2886,7 +1794,7 @@
                 <w:color w:val="334155"/>
                 <w:sz w:val="17"/>
               </w:rPr>
-              <w:t>Marketing &amp; Medical Affairs teams to monitor epidemiological data on substance-abuse-related psychiatric disorders; assess opportunity to expand SERNAL and LAFAXOR listings in psychiatric hospitals and general hospital psychiatry departments ahead of the next tender cycle (est. 2025–2026).</w:t>
+              <w:t>Marketing &amp; Medical Affairs team to monitor frequency and scale of industrial health screening programs, assessing potential CSR partnership or product introduction opportunities (RAVASTEL – Rosuvastatin, EIMLER-10 – Empagliflozin) to on-site physicians; no urgent action required within Q3 2025.</w:t>
             </w:r>
           </w:p>
         </w:tc>
@@ -2933,7 +1841,7 @@
                 <w:color w:val="4338CA"/>
                 <w:sz w:val="15"/>
               </w:rPr>
-              <w:t>VNEXPRESS – SỨC KHỎE</w:t>
+              <w:t>TUỔI TRẺ – SỨC KHỎE</w:t>
             </w:r>
           </w:p>
         </w:tc>
@@ -2960,7 +1868,7 @@
                 <w:color w:val="111827"/>
                 <w:sz w:val="21"/>
               </w:rPr>
-              <w:t>UK Military Parachute Drop to Rescue Suspected Hantavirus Patient on Remote Island</w:t>
+              <w:t>Early Lung Cancer Screening Trend: Expanding Diagnosis Pipeline for Targeted Therapy Market</w:t>
             </w:r>
           </w:p>
         </w:tc>
@@ -2979,7 +1887,7 @@
           <w:color w:val="6B7280"/>
           <w:sz w:val="18"/>
         </w:rPr>
-        <w:t>The UK military conducted an emergency parachute operation to Tristan da Cunha to treat a suspected Hantavirus (Andes strain) case from the MV Hondius, which has caused 3 deaths; the outbreak has potential person-to-person transmission. This international health event has no direct relevance to Vietnam's pharmaceutical market or Davipharm's product portfolio.[Source]</w:t>
+        <w:t>The article highlights methods for early-stage lung cancer screening and detection, reflecting a growing trend of cancer surveillance programs in Vietnam. Broader early detection translates to a larger patient pool eligible for targeted therapies such as Erlotinib — the active ingredient in Davipharm's HYYR.[Source]</w:t>
       </w:r>
     </w:p>
     <w:p>
@@ -2992,10 +1900,10 @@
           <w:rFonts w:ascii="Calibri" w:hAnsi="Calibri"/>
           <w:b/>
           <w:i w:val="0"/>
-          <w:color w:val="374151"/>
+          <w:color w:val="166534"/>
           <w:sz w:val="17"/>
         </w:rPr>
-        <w:t>⚪ No direct impact on Davipharm — international health news outside the company's product portfolio and target market scope.</w:t>
+        <w:t>📈 Expanded lung cancer screening → growing NSCLC patient base for targeted therapy → opportunity to increase HYYR (Erlotinib) tender volumes in hospital ETC channel.</w:t>
       </w:r>
     </w:p>
     <w:tbl>
@@ -3042,7 +1950,7 @@
                 <w:color w:val="334155"/>
                 <w:sz w:val="17"/>
               </w:rPr>
-              <w:t>No action required. BOD may monitor only if WHO or Vietnam's Ministry of Health issues a domestic Hantavirus epidemiological alert; currently, no Davipharm product addresses Hantavirus treatment.</w:t>
+              <w:t>Medical Affairs &amp; Oncology Marketing team should prepare scientific dossiers positioning HYYR (Erlotinib) within the early-detection NSCLC treatment pathway; coordinate with the Tendering team to review provincial and central hospital procurement lists for upcoming oncology drug tenders in the 2025–2026 cycle.</w:t>
             </w:r>
           </w:p>
         </w:tc>
@@ -3089,7 +1997,7 @@
                 <w:color w:val="4338CA"/>
                 <w:sz w:val="15"/>
               </w:rPr>
-              <w:t>VNEXPRESS – SỨC KHỎE</w:t>
+              <w:t>TUỔI TRẺ – SỨC KHỎE</w:t>
             </w:r>
           </w:p>
         </w:tc>
@@ -3116,7 +2024,7 @@
                 <w:color w:val="111827"/>
                 <w:sz w:val="21"/>
               </w:rPr>
-              <w:t>Ultra-Processed Food Linked to Colorectal Cancer Rise — Implications for Oncology Drug Demand</w:t>
+              <w:t>At Least 200 New Satellite Hospitals Nationwide — ETC Channel Expansion Opportunity</w:t>
             </w:r>
           </w:p>
         </w:tc>
@@ -3135,7 +2043,7 @@
           <w:color w:val="6B7280"/>
           <w:sz w:val="18"/>
         </w:rPr>
-        <w:t>A JAMA Oncology study confirms that high ultra-processed food consumption significantly raises adenomatous polyp risk, accelerating early colorectal cancer screening and treatment trends in Vietnam. This trend may expand the addressable ETC market for Davipharm's oncology portfolio, particularly HYYR (Erlotinib) and LARRIVEY (Bicalutamide) in hospital channels.[Source]</w:t>
+        <w:t>The government is pushing to establish at least 200 new satellite hospitals nationwide, strengthening healthcare capacity at provincial and district levels. This directly expands the number of tendering institutions, benefiting Davipharm's cardiovascular (PECHAUNOX, RAVASTEL, TABAREX, ZABALES) and GI (JIRACEK) portfolios which have high demand at community care level.[Source]</w:t>
       </w:r>
     </w:p>
     <w:p>
@@ -3148,10 +2056,10 @@
           <w:rFonts w:ascii="Calibri" w:hAnsi="Calibri"/>
           <w:b/>
           <w:i w:val="0"/>
-          <w:color w:val="374151"/>
+          <w:color w:val="166534"/>
           <w:sz w:val="17"/>
         </w:rPr>
-        <w:t>📊 Long-term signal: rising oncology demand benefits the high-value ETC portfolio, but near-term revenue impact remains indirect and requires monitoring.</w:t>
+        <w:t>🟢 Opportunity to grow local ETC tender volume — 200+ potential new tendering sites for Davipharm's cardiovascular and GI products.</w:t>
       </w:r>
     </w:p>
     <w:tbl>
@@ -3198,7 +2106,7 @@
                 <w:color w:val="334155"/>
                 <w:sz w:val="17"/>
               </w:rPr>
-              <w:t>ETC Marketing Team, in coordination with Medical Affairs, should monitor colorectal cancer screening volume at key hospitals and assess opportunities to expand HYYR and LARRIVEY positioning ahead of the next tender cycle (Q3/2025).</w:t>
+              <w:t>Business Development &amp; Tender team, in coordination with Medical Affairs, should map newly recognized satellite hospitals and prioritize early engagement for PECHAUNOX, RAVASTEL, and JIRACEK ahead of the next local tender cycle (Q3–Q4/2025); prepare GMP/BE qualification dossiers to meet new facility procurement requirements.</w:t>
             </w:r>
           </w:p>
         </w:tc>
@@ -3245,7 +2153,7 @@
                 <w:color w:val="4338CA"/>
                 <w:sz w:val="15"/>
               </w:rPr>
-              <w:t>VNEXPRESS – SỨC KHỎE</w:t>
+              <w:t>TUỔI TRẺ – SỨC KHỎE</w:t>
             </w:r>
           </w:p>
         </w:tc>
@@ -3272,7 +2180,7 @@
                 <w:color w:val="111827"/>
                 <w:sz w:val="21"/>
               </w:rPr>
-              <w:t>Natural Beetroot Trend for Blood Pressure Control — Soft Competitive Signal for Antihypertensive Portfolio</w:t>
+              <w:t>Hypertension Management Trend: Holistic Lifestyle Approach Beyond Salt Restriction</w:t>
             </w:r>
           </w:p>
         </w:tc>
@@ -3291,7 +2199,7 @@
           <w:color w:val="6B7280"/>
           <w:sz w:val="18"/>
         </w:rPr>
-        <w:t>Mainstream health media is promoting beetroot juice (reducing BP ~8/4 mmHg) as a drug-free alternative for hypertension, potentially reinforcing a "no medication needed" mindset among mild hypertensive patients — the target base for PECHAUNOX (Perindopril+Amlodipine), TABAREX (Valsartan), and HATLOP (Irbesartan). However, this content originates from international sources and does not yet reflect prescribing behavior changes in Vietnam.[Source]</w:t>
+        <w:t>Mainstream health media is shifting hypertension messaging toward comprehensive lifestyle management (diet, exercise, stress) beyond salt restriction, reflecting a growing patient awareness of long-term disease control. This indirectly sustains chronic medication demand for PECHAUNOX (Perindopril+Amlodipine), TABAREX (Valsartan), and HATLOP (Irbesartan) in the core ETC patient segment.[Source]</w:t>
       </w:r>
     </w:p>
     <w:p>
@@ -3304,10 +2212,10 @@
           <w:rFonts w:ascii="Calibri" w:hAnsi="Calibri"/>
           <w:b/>
           <w:i w:val="0"/>
-          <w:color w:val="374151"/>
+          <w:color w:val="166534"/>
           <w:sz w:val="17"/>
         </w:rPr>
-        <w:t>⚠️ Low long-term risk — the "food over medicine" trend may delay initiation in mild hypertension patients, but is insufficient to materially impact Davipharm's ETC hospital channel revenue in the near term.</w:t>
+        <w:t>📈 Growing awareness of long-term hypertension management supports stable demand for Davipharm's cardiovascular portfolio, particularly PECHAUNOX and TABAREX in the ETC channel.</w:t>
       </w:r>
     </w:p>
     <w:tbl>
@@ -3354,7 +2262,319 @@
                 <w:color w:val="334155"/>
                 <w:sz w:val="17"/>
               </w:rPr>
-              <w:t>Marketing team (cardiovascular) should monitor Vietnamese social media for rising "drug-free BP control" content frequency; if trend escalates through Q3/2025, coordinate with Medical Affairs to prepare HCP education materials reinforcing the irreplaceable role of pharmacotherapy (PECHAUNOX, TABAREX) in Grade 2+ hypertension and patients with comorbidities.</w:t>
+              <w:t>Marketing team can leverage this media trend to develop MSL/MR support materials for hospital detailing, reinforcing adherence to combination antihypertensive therapy (PECHAUNOX) alongside lifestyle changes — particularly valuable in preparation for the next ETC tender cycle.</w:t>
+            </w:r>
+          </w:p>
+        </w:tc>
+      </w:tr>
+    </w:tbl>
+    <w:p>
+      <w:pPr>
+        <w:spacing w:before="40" w:after="120"/>
+      </w:pPr>
+    </w:p>
+    <w:tbl>
+      <w:tblPr>
+        <w:tblStyle w:val="TableGrid"/>
+        <w:tblW w:type="auto" w:w="0"/>
+        <w:jc w:val="left"/>
+        <w:tblLook w:firstColumn="1" w:firstRow="1" w:lastColumn="0" w:lastRow="0" w:noHBand="0" w:noVBand="1" w:val="04A0"/>
+      </w:tblPr>
+      <w:tblGrid>
+        <w:gridCol w:w="4536"/>
+        <w:gridCol w:w="4536"/>
+      </w:tblGrid>
+      <w:tr>
+        <w:tc>
+          <w:tcPr>
+            <w:tcW w:type="dxa" w:w="1984"/>
+            <w:shd w:val="clear" w:color="auto" w:fill="EEF2FF"/>
+            <w:tcBorders>
+              <w:top w:val="none" w:sz="6" w:color="auto"/>
+              <w:bottom w:val="none" w:sz="6" w:color="auto"/>
+              <w:left w:val="none" w:sz="6" w:color="auto"/>
+              <w:right w:val="none" w:sz="6" w:color="auto"/>
+            </w:tcBorders>
+          </w:tcPr>
+          <w:p>
+            <w:pPr>
+              <w:spacing w:before="80" w:after="80"/>
+              <w:ind w:left="85"/>
+            </w:pPr>
+            <w:r>
+              <w:rPr>
+                <w:rFonts w:ascii="Calibri" w:hAnsi="Calibri"/>
+                <w:b/>
+                <w:i w:val="0"/>
+                <w:color w:val="4338CA"/>
+                <w:sz w:val="15"/>
+              </w:rPr>
+              <w:t>TUỔI TRẺ – SỨC KHỎE</w:t>
+            </w:r>
+          </w:p>
+        </w:tc>
+        <w:tc>
+          <w:tcPr>
+            <w:tcW w:type="dxa" w:w="4536"/>
+            <w:tcBorders>
+              <w:top w:val="none" w:sz="6" w:color="auto"/>
+              <w:bottom w:val="none" w:sz="6" w:color="auto"/>
+              <w:left w:val="none" w:sz="6" w:color="auto"/>
+              <w:right w:val="none" w:sz="6" w:color="auto"/>
+            </w:tcBorders>
+          </w:tcPr>
+          <w:p>
+            <w:pPr>
+              <w:spacing w:before="60" w:after="60"/>
+              <w:ind w:left="113"/>
+            </w:pPr>
+            <w:r>
+              <w:rPr>
+                <w:rFonts w:ascii="Calibri" w:hAnsi="Calibri"/>
+                <w:b/>
+                <w:i w:val="0"/>
+                <w:color w:val="111827"/>
+                <w:sz w:val="21"/>
+              </w:rPr>
+              <w:t>Thong Nhat Hospital Rises as Leading Geriatric Center — ETC Channel Opportunity for Cardiovascular &amp; Diabetes Portfolio</w:t>
+            </w:r>
+          </w:p>
+        </w:tc>
+      </w:tr>
+    </w:tbl>
+    <w:p>
+      <w:pPr>
+        <w:spacing w:before="40" w:after="40"/>
+        <w:ind w:left="170"/>
+      </w:pPr>
+      <w:r>
+        <w:rPr>
+          <w:rFonts w:ascii="Calibri" w:hAnsi="Calibri"/>
+          <w:b w:val="0"/>
+          <w:i/>
+          <w:color w:val="6B7280"/>
+          <w:sz w:val="18"/>
+        </w:rPr>
+        <w:t>Thong Nhat Hospital (Ho Chi Minh City) is positioning itself as a leading geriatric center, signaling sustained growth in long-term treatment demand for chronic conditions prevalent in elderly patients — cardiovascular, hypertension, type 2 diabetes, and dyslipidemia. This is a positive signal for Davipharm's ETC portfolio, particularly PECHAUNOX (Perindopril+Amlodipine), RAVASTEL (Rosuvastatin), TABAREX (Valsartan), HATLOP (Irbesartan), and EIMLER-10 (Empagliflozin).[Source]</w:t>
+      </w:r>
+    </w:p>
+    <w:p>
+      <w:pPr>
+        <w:spacing w:before="20" w:after="40"/>
+        <w:ind w:left="170"/>
+      </w:pPr>
+      <w:r>
+        <w:rPr>
+          <w:rFonts w:ascii="Calibri" w:hAnsi="Calibri"/>
+          <w:b/>
+          <w:i w:val="0"/>
+          <w:color w:val="166534"/>
+          <w:sz w:val="17"/>
+        </w:rPr>
+        <w:t>🟢 Thong Nhat Hospital's geriatric expansion creates a long-term ETC tendering and volume opportunity for Davipharm's cardiovascular and diabetes lineup in Ho Chi Minh City.</w:t>
+      </w:r>
+    </w:p>
+    <w:tbl>
+      <w:tblPr>
+        <w:tblStyle w:val="TableGrid"/>
+        <w:tblW w:type="auto" w:w="0"/>
+        <w:tblLook w:firstColumn="1" w:firstRow="1" w:lastColumn="0" w:lastRow="0" w:noHBand="0" w:noVBand="1" w:val="04A0"/>
+      </w:tblPr>
+      <w:tblGrid>
+        <w:gridCol w:w="9072"/>
+      </w:tblGrid>
+      <w:tr>
+        <w:tc>
+          <w:tcPr>
+            <w:tcW w:type="dxa" w:w="9072"/>
+            <w:shd w:val="clear" w:color="auto" w:fill="F8FAFC"/>
+            <w:tcBorders>
+              <w:top w:val="none" w:sz="6" w:color="auto"/>
+              <w:bottom w:val="none" w:sz="6" w:color="auto"/>
+              <w:left w:val="single" w:sz="12" w:color="003B71"/>
+              <w:right w:val="none" w:sz="6" w:color="auto"/>
+            </w:tcBorders>
+          </w:tcPr>
+          <w:p>
+            <w:pPr>
+              <w:spacing w:before="60" w:after="60"/>
+              <w:ind w:left="142"/>
+            </w:pPr>
+            <w:r>
+              <w:rPr>
+                <w:rFonts w:ascii="Calibri" w:hAnsi="Calibri"/>
+                <w:b/>
+                <w:i w:val="0"/>
+                <w:color w:val="003B71"/>
+                <w:sz w:val="17"/>
+              </w:rPr>
+              <w:t xml:space="preserve">Strategy  </w:t>
+            </w:r>
+            <w:r>
+              <w:rPr>
+                <w:rFonts w:ascii="Calibri" w:hAnsi="Calibri"/>
+                <w:b w:val="0"/>
+                <w:i w:val="0"/>
+                <w:color w:val="334155"/>
+                <w:sz w:val="17"/>
+              </w:rPr>
+              <w:t>The ETC Sales &amp; Market Access team should prioritize engagement with Thong Nhat Hospital's drug formulary committee ahead of the next tender cycle, focusing dossier submissions on PECHAUNOX, RAVASTEL, EIMLER-10, and ZLATKO (Sitagliptin) for chronic</w:t>
+            </w:r>
+          </w:p>
+        </w:tc>
+      </w:tr>
+    </w:tbl>
+    <w:p>
+      <w:pPr>
+        <w:spacing w:before="40" w:after="120"/>
+      </w:pPr>
+    </w:p>
+    <w:tbl>
+      <w:tblPr>
+        <w:tblStyle w:val="TableGrid"/>
+        <w:tblW w:type="auto" w:w="0"/>
+        <w:jc w:val="left"/>
+        <w:tblLook w:firstColumn="1" w:firstRow="1" w:lastColumn="0" w:lastRow="0" w:noHBand="0" w:noVBand="1" w:val="04A0"/>
+      </w:tblPr>
+      <w:tblGrid>
+        <w:gridCol w:w="4536"/>
+        <w:gridCol w:w="4536"/>
+      </w:tblGrid>
+      <w:tr>
+        <w:tc>
+          <w:tcPr>
+            <w:tcW w:type="dxa" w:w="1984"/>
+            <w:shd w:val="clear" w:color="auto" w:fill="EEF2FF"/>
+            <w:tcBorders>
+              <w:top w:val="none" w:sz="6" w:color="auto"/>
+              <w:bottom w:val="none" w:sz="6" w:color="auto"/>
+              <w:left w:val="none" w:sz="6" w:color="auto"/>
+              <w:right w:val="none" w:sz="6" w:color="auto"/>
+            </w:tcBorders>
+          </w:tcPr>
+          <w:p>
+            <w:pPr>
+              <w:spacing w:before="80" w:after="80"/>
+              <w:ind w:left="85"/>
+            </w:pPr>
+            <w:r>
+              <w:rPr>
+                <w:rFonts w:ascii="Calibri" w:hAnsi="Calibri"/>
+                <w:b/>
+                <w:i w:val="0"/>
+                <w:color w:val="4338CA"/>
+                <w:sz w:val="15"/>
+              </w:rPr>
+              <w:t>TUỔI TRẺ – SỨC KHỎE</w:t>
+            </w:r>
+          </w:p>
+        </w:tc>
+        <w:tc>
+          <w:tcPr>
+            <w:tcW w:type="dxa" w:w="4536"/>
+            <w:tcBorders>
+              <w:top w:val="none" w:sz="6" w:color="auto"/>
+              <w:bottom w:val="none" w:sz="6" w:color="auto"/>
+              <w:left w:val="none" w:sz="6" w:color="auto"/>
+              <w:right w:val="none" w:sz="6" w:color="auto"/>
+            </w:tcBorders>
+          </w:tcPr>
+          <w:p>
+            <w:pPr>
+              <w:spacing w:before="60" w:after="60"/>
+              <w:ind w:left="113"/>
+            </w:pPr>
+            <w:r>
+              <w:rPr>
+                <w:rFonts w:ascii="Calibri" w:hAnsi="Calibri"/>
+                <w:b/>
+                <w:i w:val="0"/>
+                <w:color w:val="111827"/>
+                <w:sz w:val="21"/>
+              </w:rPr>
+              <w:t>18,000+ HFMD Cases in Southern Vietnam — Summer 2026 Outbreak Signal</w:t>
+            </w:r>
+          </w:p>
+        </w:tc>
+      </w:tr>
+    </w:tbl>
+    <w:p>
+      <w:pPr>
+        <w:spacing w:before="40" w:after="40"/>
+        <w:ind w:left="170"/>
+      </w:pPr>
+      <w:r>
+        <w:rPr>
+          <w:rFonts w:ascii="Calibri" w:hAnsi="Calibri"/>
+          <w:b w:val="0"/>
+          <w:i/>
+          <w:color w:val="6B7280"/>
+          <w:sz w:val="18"/>
+        </w:rPr>
+        <w:t>Southern Vietnam has recorded over 18,000 HFMD cases, with experts commenting on a new vaccine amid an escalating outbreak. Davipharm has no direct HFMD-specific product, though pediatric hospital surges may marginally lift demand for symptomatic care drugs in ETC channels.[Source]</w:t>
+      </w:r>
+    </w:p>
+    <w:p>
+      <w:pPr>
+        <w:spacing w:before="20" w:after="40"/>
+        <w:ind w:left="170"/>
+      </w:pPr>
+      <w:r>
+        <w:rPr>
+          <w:rFonts w:ascii="Calibri" w:hAnsi="Calibri"/>
+          <w:b/>
+          <w:i w:val="0"/>
+          <w:color w:val="374151"/>
+          <w:sz w:val="17"/>
+        </w:rPr>
+        <w:t>📊 Indirect and negligible impact on Davipharm's current portfolio — no active ingredient directly targets HFMD treatment.</w:t>
+      </w:r>
+    </w:p>
+    <w:tbl>
+      <w:tblPr>
+        <w:tblStyle w:val="TableGrid"/>
+        <w:tblW w:type="auto" w:w="0"/>
+        <w:tblLook w:firstColumn="1" w:firstRow="1" w:lastColumn="0" w:lastRow="0" w:noHBand="0" w:noVBand="1" w:val="04A0"/>
+      </w:tblPr>
+      <w:tblGrid>
+        <w:gridCol w:w="9072"/>
+      </w:tblGrid>
+      <w:tr>
+        <w:tc>
+          <w:tcPr>
+            <w:tcW w:type="dxa" w:w="9072"/>
+            <w:shd w:val="clear" w:color="auto" w:fill="F8FAFC"/>
+            <w:tcBorders>
+              <w:top w:val="none" w:sz="6" w:color="auto"/>
+              <w:bottom w:val="none" w:sz="6" w:color="auto"/>
+              <w:left w:val="single" w:sz="12" w:color="003B71"/>
+              <w:right w:val="none" w:sz="6" w:color="auto"/>
+            </w:tcBorders>
+          </w:tcPr>
+          <w:p>
+            <w:pPr>
+              <w:spacing w:before="60" w:after="60"/>
+              <w:ind w:left="142"/>
+            </w:pPr>
+            <w:r>
+              <w:rPr>
+                <w:rFonts w:ascii="Calibri" w:hAnsi="Calibri"/>
+                <w:b/>
+                <w:i w:val="0"/>
+                <w:color w:val="003B71"/>
+                <w:sz w:val="17"/>
+              </w:rPr>
+              <w:t xml:space="preserve">Strategy  </w:t>
+            </w:r>
+            <w:r>
+              <w:rPr>
+                <w:rFonts w:ascii="Calibri" w:hAnsi="Calibri"/>
+                <w:b w:val="0"/>
+                <w:i w:val="0"/>
+                <w:color w:val="334155"/>
+                <w:sz w:val="17"/>
+              </w:rPr>
+              <w:t>No priority action required; Medical Affairs may monitor pediatric outbreak trends as a background signal for potential long-term portfolio expansion into pediatric care.</w:t>
             </w:r>
           </w:p>
         </w:tc>
@@ -5780,7 +5000,7 @@
                 <w:color w:val="111827"/>
                 <w:sz w:val="18"/>
               </w:rPr>
-              <w:t>Monitor Bach Mai 2/Viet Duc 2 approval; prep tender dossiers for RAVASTEL, EIMLER-10, PECHAUNOX, HYYR</w:t>
+              <w:t>Map 200+ new satellite hospitals; submit PECHAUNOX, RAVASTEL, JIRACEK tender dossiers before Q3/2026</w:t>
             </w:r>
           </w:p>
         </w:tc>
@@ -5808,7 +5028,7 @@
                 <w:color w:val="003B71"/>
                 <w:sz w:val="17"/>
               </w:rPr>
-              <w:t>Sales ETC</w:t>
+              <w:t>Sales / RA</w:t>
             </w:r>
           </w:p>
         </w:tc>
@@ -5836,7 +5056,7 @@
                 <w:color w:val="6B7280"/>
                 <w:sz w:val="17"/>
               </w:rPr>
-              <w:t>Bach Mai 2 &amp; Viet Duc 2 — new procurement units</w:t>
+              <w:t>200 Satellite Hospital Expansion</w:t>
             </w:r>
           </w:p>
         </w:tc>
@@ -5915,7 +5135,7 @@
                 <w:color w:val="111827"/>
                 <w:sz w:val="18"/>
               </w:rPr>
-              <w:t>Engage pharmacy depts at Bach Mai 2 &amp; Viet Duc 2 to list HYYR and LARRIVEY in first tender cycle</w:t>
+              <w:t>Prioritize Thong Nhat Hospital formulary engagement for PECHAUNOX, RAVASTEL, EIMLER-10, ZLATKO</w:t>
             </w:r>
           </w:p>
         </w:tc>
@@ -5943,7 +5163,7 @@
                 <w:color w:val="003B71"/>
                 <w:sz w:val="17"/>
               </w:rPr>
-              <w:t>Sales ETC</w:t>
+              <w:t>Sales / Marketing</w:t>
             </w:r>
           </w:p>
         </w:tc>
@@ -5971,7 +5191,7 @@
                 <w:color w:val="6B7280"/>
                 <w:sz w:val="17"/>
               </w:rPr>
-              <w:t>Oncology ETC expansion — northern tertiary hospitals</w:t>
+              <w:t>Thong Nhat Geriatric Center</w:t>
             </w:r>
           </w:p>
         </w:tc>
@@ -6050,7 +5270,7 @@
                 <w:color w:val="111827"/>
                 <w:sz w:val="18"/>
               </w:rPr>
-              <w:t>Track early esophageal cancer surgical trend; assess long-term tender impact on HYYR</w:t>
+              <w:t>Develop HYYR (Erlotinib) scientific dossier for early-detection NSCLC; review 2026 oncology tender lists</w:t>
             </w:r>
           </w:p>
         </w:tc>
@@ -6078,7 +5298,7 @@
                 <w:color w:val="003B71"/>
                 <w:sz w:val="17"/>
               </w:rPr>
-              <w:t>Strategy</w:t>
+              <w:t>Marketing / RA</w:t>
             </w:r>
           </w:p>
         </w:tc>
@@ -6106,7 +5326,7 @@
                 <w:color w:val="6B7280"/>
                 <w:sz w:val="17"/>
               </w:rPr>
-              <w:t>Early-stage surgical resection trend — reduced targeted therapy patient pool</w:t>
+              <w:t>Early Lung Cancer Screening Trend</w:t>
             </w:r>
           </w:p>
         </w:tc>
@@ -6185,7 +5405,7 @@
                 <w:color w:val="111827"/>
                 <w:sz w:val="18"/>
               </w:rPr>
-              <w:t>&lt;span class="vi-</w:t>
+              <w:t>Chuẩn bị tài liệu MSL/MR nhấn mạnh tuân thủ điều trị dài hạn PECHAUNOX, RAVASTEL, EIMLER-10 phục</w:t>
             </w:r>
           </w:p>
         </w:tc>

</xml_diff>

<commit_message>
Update report_en.docx 2026-05-13 12:30
</commit_message>
<xml_diff>
--- a/report_en.docx
+++ b/report_en.docx
@@ -338,7 +338,7 @@
                 <w:color w:val="111827"/>
                 <w:sz w:val="20"/>
               </w:rPr>
-              <w:t>Week 11–17 May 2026: A convergence of healthcare infrastructure expansion signals — 200+ satellite hospitals, national screening policy, and Thong Nhat geriatric center — creates a structural ETC tender volume opportunity for Davipharm's cardiometabolic portfolio.</w:t>
+              <w:t>Week 11–17 May 2026: MoH's free universal health screening mandate is the most consequential development for Davipharm, creating a structural demand uplift for the cardiovascular and diabetes portfolio ahead of World Hypertension Day (May 17) and the upcoming local tender cycle.</w:t>
             </w:r>
           </w:p>
         </w:tc>
@@ -406,7 +406,7 @@
                 <w:color w:val="111827"/>
                 <w:sz w:val="17"/>
               </w:rPr>
-              <w:t>▸  ETC Infrastructure Expansion:200+ new satellite hospitals = 200+ potential tender sites for PECHAUNOX, RAVASTEL, TABAREX, ZABALES, and JIRACEK at provincial/district level.</w:t>
+              <w:t>▸  Universal Screening:The free annual check-up policy will materially expand the diagnosed patient pool for hypertension, dyslipidemia, and diabetes — directly benefiting PECHAUNOX, RAVASTEL, TABAREX, EIMLER-10, and ZLATKO across district/commune ETC channels.</w:t>
             </w:r>
           </w:p>
           <w:p>
@@ -422,7 +422,7 @@
                 <w:color w:val="111827"/>
                 <w:sz w:val="17"/>
               </w:rPr>
-              <w:t>▸  Chronic Patient Funnel:National free checkup policy and northern industrial screenings will generate new hypertension, dyslipidemia, and T2DM diagnoses — directly expanding the long-term market for RAVASTEL, EIMLER-10, ZLATKO, and PECHAUNOX.</w:t>
+              <w:t>▸  Cardiovascular — Solid Base Demand:An estimated 25–30% of Vietnamese adults remain undiagnosed for hypertension and the younger musculoskeletal disease trend strengthen the tendering rationale for PECHAUNOX/HATLOP/TABAREX and MAGRAX in the 2026–2027 cycle.</w:t>
             </w:r>
           </w:p>
           <w:p>
@@ -438,7 +438,7 @@
                 <w:color w:val="111827"/>
                 <w:sz w:val="17"/>
               </w:rPr>
-              <w:t>▸  Oncology &amp; Geriatrics:Expanding lung cancer screening supports HYYR (Erlotinib) volume growth; Thong Nhat Hospital's geriatric pivot is a priority market access opportunity in HCMC for the cardiovascular–diabetes lineup.</w:t>
+              <w:t>▸  GI &amp; Oncology — Long-Term Signal:Rising HP/gastric cancer awareness and advanced endoscopy expansion in private hospitals indirectly support JIRACEK, MARTAZ, and oncology products HYYR/LARRIVEY, with limited near-term revenue impact.</w:t>
             </w:r>
           </w:p>
         </w:tc>
@@ -798,7 +798,7 @@
                 <w:color w:val="166534"/>
                 <w:sz w:val="22"/>
               </w:rPr>
-              <w:t>5</w:t>
+              <w:t>4</w:t>
             </w:r>
           </w:p>
         </w:tc>
@@ -826,7 +826,7 @@
                 <w:color w:val="374151"/>
                 <w:sz w:val="22"/>
               </w:rPr>
-              <w:t>5</w:t>
+              <w:t>6</w:t>
             </w:r>
           </w:p>
         </w:tc>
@@ -1061,7 +1061,7 @@
                 <w:color w:val="4338CA"/>
                 <w:sz w:val="15"/>
               </w:rPr>
-              <w:t>TUỔI TRẺ – SỨC KHỎE</w:t>
+              <w:t>DÂN TRÍ – SỨC KHỎE</w:t>
             </w:r>
           </w:p>
         </w:tc>
@@ -1088,7 +1088,7 @@
                 <w:color w:val="111827"/>
                 <w:sz w:val="21"/>
               </w:rPr>
-              <w:t>Khanh Hoa Provincial Hospital Faces Prolonged Ward Shortage — Infrastructure Bottleneck Signals Procurement Delays</w:t>
+              <w:t>Rising Gastric Cancer Awareness — Opportunity Signal for Davipharm's GI Portfolio (Esomeprazole, Rabeprazole)</w:t>
             </w:r>
           </w:p>
         </w:tc>
@@ -1107,7 +1107,7 @@
           <w:color w:val="6B7280"/>
           <w:sz w:val="18"/>
         </w:rPr>
-        <w:t>Khanh Hoa Provincial Hospital has been unable to resolve a critical ward shortage for over 3 months, reflecting infrastructure pressure at provincial-level facilities. This may indirectly disrupt ETC drug procurement execution and disbursement at this facility.[Source]</w:t>
+        <w:t>A Bach Mai Hospital specialist highlighted the HP-to-gastric-cancer progression pathway and urged early endoscopy, reflecting growing demand for GI treatments in the hospital channel. This trend supports increased use of PPI-based H. pylori eradication regimens, benefiting Davipharm's JIRACEK (Esomeprazole) and MARTAZ (Rabeprazole).[Source]</w:t>
       </w:r>
     </w:p>
     <w:p>
@@ -1120,10 +1120,10 @@
           <w:rFonts w:ascii="Calibri" w:hAnsi="Calibri"/>
           <w:b/>
           <w:i w:val="0"/>
-          <w:color w:val="374151"/>
+          <w:color w:val="166534"/>
           <w:sz w:val="17"/>
         </w:rPr>
-        <w:t>⚠️ Limited but watchable impact: hospital infrastructure disruption may slow ETC contract disbursement for Davipharm's cardiovascular and diabetes portfolio in Khanh Hoa province.</w:t>
+        <w:t>📈 Growing public awareness of HP-related gastric cancer indirectly drives prescribing and tender volume for JIRACEK and MARTAZ across central and provincial hospitals.</w:t>
       </w:r>
     </w:p>
     <w:tbl>
@@ -1170,7 +1170,7 @@
                 <w:color w:val="334155"/>
                 <w:sz w:val="17"/>
               </w:rPr>
-              <w:t>The Central Region ETC Sales team should audit contract status and disbursement progress at Khanh Hoa Provincial Hospital in May–June 2026, focusing on PECHAUNOX, RAVASTEL, and EIMLER-10; any risk of inventory backlog or delayed payment should be escalated to regional management promptly.</w:t>
+              <w:t>ETC Marketing and Medical Affairs teams should update scientific materials on PPI's role in HP eradication protocols and present at GI conferences in Q3/2026; prioritize JIRACEK's inclusion in central hospital tender lists (Bach Mai, Cho Ray) for the 2026–2027 bidding cycle.</w:t>
             </w:r>
           </w:p>
         </w:tc>
@@ -1217,7 +1217,7 @@
                 <w:color w:val="4338CA"/>
                 <w:sz w:val="15"/>
               </w:rPr>
-              <w:t>TUỔI TRẺ – SỨC KHỎE</w:t>
+              <w:t>DÂN TRÍ – SỨC KHỎE</w:t>
             </w:r>
           </w:p>
         </w:tc>
@@ -1244,7 +1244,7 @@
                 <w:color w:val="111827"/>
                 <w:sz w:val="21"/>
               </w:rPr>
-              <w:t>Ministry of Health to Improve Compensation Policy for Island-Based Medical Staff</w:t>
+              <w:t>Cicada Shell Seizure at Lang Son Border — Traditional Medicine Raw Material Supply Signal</w:t>
             </w:r>
           </w:p>
         </w:tc>
@@ -1263,7 +1263,7 @@
           <w:color w:val="6B7280"/>
           <w:sz w:val="18"/>
         </w:rPr>
-        <w:t>Vietnam's Deputy Minister of Health announced plans to advise on improved compensation schemes for medical staff serving in remote island areas, aiming to strengthen healthcare workforce retention. This personnel policy has no direct bearing on Davipharm's tendering activities or product portfolio.[Source]</w:t>
+        <w:t>The seizure of 80kg dried cicada shells at Lang Son highlights active but poorly documented cross-border TCM raw material flows. This article covers traditional herbal medicine segments with no direct relevance to Davipharm's synthetic generic portfolio.[Source]</w:t>
       </w:r>
     </w:p>
     <w:p>
@@ -1279,7 +1279,7 @@
           <w:color w:val="374151"/>
           <w:sz w:val="17"/>
         </w:rPr>
-        <w:t>➖ No direct relevance to Davipharm — no impact on ETC revenue or generic portfolio anticipated.</w:t>
+        <w:t>⚪ No direct impact on Davipharm's products or tendering activities — passive monitoring only.</w:t>
       </w:r>
     </w:p>
     <w:tbl>
@@ -1326,7 +1326,7 @@
                 <w:color w:val="334155"/>
                 <w:sz w:val="17"/>
               </w:rPr>
-              <w:t>No priority action required; Market Intelligence team to file for reference in case future rural/island distribution channel opportunities emerge linked to expanded healthcare infrastructure.</w:t>
+              <w:t>No action required. Article is unrelated to any Davipharm active ingredient or therapeutic area; Market Intelligence team to log and close.</w:t>
             </w:r>
           </w:p>
         </w:tc>
@@ -1373,7 +1373,7 @@
                 <w:color w:val="4338CA"/>
                 <w:sz w:val="15"/>
               </w:rPr>
-              <w:t>TUỔI TRẺ – SỨC KHỎE</w:t>
+              <w:t>DÂN TRÍ – SỨC KHỎE</w:t>
             </w:r>
           </w:p>
         </w:tc>
@@ -1400,7 +1400,7 @@
                 <w:color w:val="111827"/>
                 <w:sz w:val="21"/>
               </w:rPr>
-              <w:t>Annual Free Health Checkup Policy: Potential Demand Surge for Cardiovascular &amp; Diabetes Therapeutics</w:t>
+              <w:t>Lidocaine Poisoning Post-Liposuction — Regulatory Pressure on Unlicensed Aesthetic Clinics</w:t>
             </w:r>
           </w:p>
         </w:tc>
@@ -1419,7 +1419,7 @@
           <w:color w:val="6B7280"/>
           <w:sz w:val="18"/>
         </w:rPr>
-        <w:t>A proposed policy of annual free health checkups for all citizens is expected to significantly increase early detection rates for chronic conditions including hypertension, dyslipidemia, cardiovascular disease, and type 2 diabetes. This could generate a new wave of diagnosed and prescribed patients, boosting long-term demand for Davipharm's cardiometabolic portfolio: RAVASTEL (Rosuvastatin), PECHAUNOX (Perindopril+Amlodipine), HATLOP (Irbesartan), TABAREX (Valsartan), and EIMLER-10 (Empagliflozin).[Source]</w:t>
+        <w:t>A 53-year-old woman suffered critical Lidocaine poisoning after liposuction at an unlicensed HCMC clinic, highlighting Vietnam's 25,000–35,000 annual aesthetic complication cases. This incident accelerates regulatory scrutiny on aesthetic clinics, with indirect implications for ICU-related drug demand including sedatives and antiepileptics.[Source]</w:t>
       </w:r>
     </w:p>
     <w:p>
@@ -1432,10 +1432,10 @@
           <w:rFonts w:ascii="Calibri" w:hAnsi="Calibri"/>
           <w:b/>
           <w:i w:val="0"/>
-          <w:color w:val="166534"/>
+          <w:color w:val="374151"/>
           <w:sz w:val="17"/>
         </w:rPr>
-        <w:t>📈 Medium-to-long-term opportunity: national screening policy will expand the chronic disease patient funnel, directly supporting ETC tender volume growth for Davipharm's cardiovascular and diabetes portfolios.</w:t>
+        <w:t>🔍 Low, indirect impact on Davipharm — no core portfolio products directly affected, but monitor if clinic crackdowns alter ETC channel dynamics for CNS/sedative drugs (SERNAL – Risperidone, LAFAXOR – Venlafaxine).</w:t>
       </w:r>
     </w:p>
     <w:tbl>
@@ -1482,7 +1482,7 @@
                 <w:color w:val="334155"/>
                 <w:sz w:val="17"/>
               </w:rPr>
-              <w:t>Marketing &amp; Medical Affairs should monitor treatment protocols recommended under the annual checkup program (particularly lipid, HbA1c, and blood pressure screening) to proactively position RAVASTEL, EIMLER-10, ZLATKO (Sitagliptin), and</w:t>
+              <w:t>Medical Affairs to monitor aesthetic clinic regulatory developments through Q2–Q3/2026; assess whether inspection crackdowns extend to general outpatient clinics, potentially impacting ETC/OTC distribution channels for SERNAL and LAFAXOR.</w:t>
             </w:r>
           </w:p>
         </w:tc>
@@ -1529,7 +1529,7 @@
                 <w:color w:val="4338CA"/>
                 <w:sz w:val="15"/>
               </w:rPr>
-              <w:t>TUỔI TRẺ – SỨC KHỎE</w:t>
+              <w:t>DÂN TRÍ – SỨC KHỎE</w:t>
             </w:r>
           </w:p>
         </w:tc>
@@ -1556,7 +1556,7 @@
                 <w:color w:val="111827"/>
                 <w:sz w:val="21"/>
               </w:rPr>
-              <w:t>35,000 Aesthetic Complication Cases Annually — Unregulated Spa Sector Raises Medical Demand Signal</w:t>
+              <w:t>Black Pepper's Piperine: Lipid &amp; Cardiovascular Benefits, Drug Interaction Cautions</w:t>
             </w:r>
           </w:p>
         </w:tc>
@@ -1575,7 +1575,7 @@
           <w:color w:val="6B7280"/>
           <w:sz w:val="18"/>
         </w:rPr>
-        <w:t>Vietnam records approximately 35,000 aesthetic complication cases per year, predominantly from unlicensed spa operators, driving growing demand for post-procedure and complication management (inflammation, infection, pain) within hospital settings. Direct impact on Davipharm is limited, but this signals latent demand for anti-inflammatory and analgesic products used in complication treatment protocols.[Source]</w:t>
+        <w:t>A widely-read article promotes piperine (black pepper) for LDL reduction, HDL elevation, and fat metabolism, while cautioning that high-dose piperine may interfere with drug metabolism and anticoagulation. This consumer-level narrative may shape patient attitudes toward managing dyslipidemia and cardiovascular risk through diet rather than prescribed generics such as RAVASTEL (Rosuvastatin).[Source]</w:t>
       </w:r>
     </w:p>
     <w:p>
@@ -1591,7 +1591,7 @@
           <w:color w:val="374151"/>
           <w:sz w:val="17"/>
         </w:rPr>
-        <w:t>🔎 Weak market signal — rising aesthetic complication burden may provide marginal support for MAGRAX (Etoricoxib) and METILONE-4 (Methylprednisolone) in hospital channels, but insufficient to alter near-term strategy.</w:t>
+        <w:t>⚪ Limited short-term revenue impact, but the growing self-treatment trend via natural remedies warrants long-term monitoring, particularly for the dyslipidemia patient segment targeted by RAVASTEL.</w:t>
       </w:r>
     </w:p>
     <w:tbl>
@@ -1638,7 +1638,7 @@
                 <w:color w:val="334155"/>
                 <w:sz w:val="17"/>
               </w:rPr>
-              <w:t>ETC Marketing team to monitor post-aesthetic complication treatment trends (inflammation, pain) in dermatology and plastic surgery hospitals — assess feasibility of positioning MAGRAX and METILONE-4 in tender lists for this segment in the next procurement cycle.</w:t>
+              <w:t>The Marketing team should monitor the "food-as-medicine" media trend and prepare HCP education materials reinforcing guideline-based statin therapy (RAVASTEL/Rosuvastatin) as non-replaceable; the piperine–drug interaction alert also presents a MedEd opportunity for physicians prescribing MAGRAX (Etoricoxib) and ZABALES (Clopidogrel).</w:t>
             </w:r>
           </w:p>
         </w:tc>
@@ -1685,7 +1685,7 @@
                 <w:color w:val="4338CA"/>
                 <w:sz w:val="15"/>
               </w:rPr>
-              <w:t>TUỔI TRẺ – SỨC KHỎE</w:t>
+              <w:t>DÂN TRÍ – SỨC KHỎE</w:t>
             </w:r>
           </w:p>
         </w:tc>
@@ -1712,7 +1712,7 @@
                 <w:color w:val="111827"/>
                 <w:sz w:val="21"/>
               </w:rPr>
-              <w:t>Mass Free Health Screenings for Industrial Workers in Northern Vietnam</w:t>
+              <w:t>MoH Launches Free Annual Health Screening Guidelines — Early Detection Wave for Cardiovascular &amp; Diabetes Drugs</w:t>
             </w:r>
           </w:p>
         </w:tc>
@@ -1731,7 +1731,113 @@
           <w:color w:val="6B7280"/>
           <w:sz w:val="18"/>
         </w:rPr>
-        <w:t>Large-scale free health screenings for factory workers in northern industrial zones reflect a growing trend of expanding primary healthcare access to Vietnam's industrial labor force — a segment with historically low formal medical engagement. Increased diagnosis rates for chronic conditions (cardiovascular, diabetes, GI) could generate downstream demand relevant to Davipharm's core portfolio.[Source]</w:t>
+        <w:t>The Ministry of Health issued guidelines mandating at least one free annual health check-up for all citizens aged 18+, including blood glucose, blood pressure, and chest X-ray screening — directly triggering mass early detection of hypertension, dyslipidemia, and diabetes. This policy is expected to significantly expand the diagnosed patient pool, boosting demand for Davipharm's cardiovascular (PECHAUNOX, RAVASTEL, TABAREX) and diabetes (EIMLER-10, ZLATKO) portfolios.[Source]</w:t>
+      </w:r>
+    </w:p>
+    <w:p>
+      <w:pPr>
+        <w:spacing w:before="20" w:after="40"/>
+        <w:ind w:left="170"/>
+      </w:pPr>
+      <w:r>
+        <w:rPr>
+          <w:rFonts w:ascii="Calibri" w:hAnsi="Calibri"/>
+          <w:b/>
+          <w:i w:val="0"/>
+          <w:color w:val="166534"/>
+          <w:sz w:val="17"/>
+        </w:rPr>
+        <w:t>🟢 Clear mid-to-long-term opportunity: millions of newly screened patients will drive increased ETC prescription demand for PECHAUNOX, RAVASTEL, TABAREX, EIMLER-10, and ZLATKO.</w:t>
+      </w:r>
+    </w:p>
+    <w:p>
+      <w:pPr>
+        <w:spacing w:before="40" w:after="120"/>
+      </w:pPr>
+    </w:p>
+    <w:tbl>
+      <w:tblPr>
+        <w:tblStyle w:val="TableGrid"/>
+        <w:tblW w:type="auto" w:w="0"/>
+        <w:jc w:val="left"/>
+        <w:tblLook w:firstColumn="1" w:firstRow="1" w:lastColumn="0" w:lastRow="0" w:noHBand="0" w:noVBand="1" w:val="04A0"/>
+      </w:tblPr>
+      <w:tblGrid>
+        <w:gridCol w:w="4536"/>
+        <w:gridCol w:w="4536"/>
+      </w:tblGrid>
+      <w:tr>
+        <w:tc>
+          <w:tcPr>
+            <w:tcW w:type="dxa" w:w="1984"/>
+            <w:shd w:val="clear" w:color="auto" w:fill="EEF2FF"/>
+            <w:tcBorders>
+              <w:top w:val="none" w:sz="6" w:color="auto"/>
+              <w:bottom w:val="none" w:sz="6" w:color="auto"/>
+              <w:left w:val="none" w:sz="6" w:color="auto"/>
+              <w:right w:val="none" w:sz="6" w:color="auto"/>
+            </w:tcBorders>
+          </w:tcPr>
+          <w:p>
+            <w:pPr>
+              <w:spacing w:before="80" w:after="80"/>
+              <w:ind w:left="85"/>
+            </w:pPr>
+            <w:r>
+              <w:rPr>
+                <w:rFonts w:ascii="Calibri" w:hAnsi="Calibri"/>
+                <w:b/>
+                <w:i w:val="0"/>
+                <w:color w:val="4338CA"/>
+                <w:sz w:val="15"/>
+              </w:rPr>
+              <w:t>DÂN TRÍ – SỨC KHỎE</w:t>
+            </w:r>
+          </w:p>
+        </w:tc>
+        <w:tc>
+          <w:tcPr>
+            <w:tcW w:type="dxa" w:w="4536"/>
+            <w:tcBorders>
+              <w:top w:val="none" w:sz="6" w:color="auto"/>
+              <w:bottom w:val="none" w:sz="6" w:color="auto"/>
+              <w:left w:val="none" w:sz="6" w:color="auto"/>
+              <w:right w:val="none" w:sz="6" w:color="auto"/>
+            </w:tcBorders>
+          </w:tcPr>
+          <w:p>
+            <w:pPr>
+              <w:spacing w:before="60" w:after="60"/>
+              <w:ind w:left="113"/>
+            </w:pPr>
+            <w:r>
+              <w:rPr>
+                <w:rFonts w:ascii="Calibri" w:hAnsi="Calibri"/>
+                <w:b/>
+                <w:i w:val="0"/>
+                <w:color w:val="111827"/>
+                <w:sz w:val="21"/>
+              </w:rPr>
+              <w:t>90% of Vietnamese Have Oral Health Issues — Market Signal Outside Davipharm Portfolio</w:t>
+            </w:r>
+          </w:p>
+        </w:tc>
+      </w:tr>
+    </w:tbl>
+    <w:p>
+      <w:pPr>
+        <w:spacing w:before="40" w:after="40"/>
+        <w:ind w:left="170"/>
+      </w:pPr>
+      <w:r>
+        <w:rPr>
+          <w:rFonts w:ascii="Calibri" w:hAnsi="Calibri"/>
+          <w:b w:val="0"/>
+          <w:i/>
+          <w:color w:val="6B7280"/>
+          <w:sz w:val="18"/>
+        </w:rPr>
+        <w:t>The 47th Asia-Pacific Dental Conference in Hanoi highlighted alarming oral health statistics: 90% of the population affected, 60% of adults with periodontal disease, and 79% of elderly with tooth loss. Davipharm's current portfolio has no dental or oral antimicrobial products, making this a non-material revenue signal at this time.[Source]</w:t>
       </w:r>
     </w:p>
     <w:p>
@@ -1747,7 +1853,7 @@
           <w:color w:val="374151"/>
           <w:sz w:val="17"/>
         </w:rPr>
-        <w:t>📊 Weak market signal — potential long-term demand uplift for RAVASTEL, EIMLER-10, JIRACEK, but no direct near-term impact on tendering or revenue.</w:t>
+        <w:t>➖ Background epidemiological data only; no Davipharm product stands to benefit directly in the near term.</w:t>
       </w:r>
     </w:p>
     <w:tbl>
@@ -1794,7 +1900,7 @@
                 <w:color w:val="334155"/>
                 <w:sz w:val="17"/>
               </w:rPr>
-              <w:t>Marketing &amp; Medical Affairs team to monitor frequency and scale of industrial health screening programs, assessing potential CSR partnership or product introduction opportunities (RAVASTEL – Rosuvastatin, EIMLER-10 – Empagliflozin) to on-site physicians; no urgent action required within Q3 2025.</w:t>
+              <w:t>No immediate action required. Business Development may flag this as a long-term signal should Davipharm consider portfolio expansion into dental-specific formulations (e.g., Metronidazole, Amoxicillin dental packs) within the 3–5 year pipeline cycle.</w:t>
             </w:r>
           </w:p>
         </w:tc>
@@ -1841,7 +1947,7 @@
                 <w:color w:val="4338CA"/>
                 <w:sz w:val="15"/>
               </w:rPr>
-              <w:t>TUỔI TRẺ – SỨC KHỎE</w:t>
+              <w:t>DÂN TRÍ – SỨC KHỎE</w:t>
             </w:r>
           </w:p>
         </w:tc>
@@ -1868,7 +1974,7 @@
                 <w:color w:val="111827"/>
                 <w:sz w:val="21"/>
               </w:rPr>
-              <w:t>Early Lung Cancer Screening Trend: Expanding Diagnosis Pipeline for Targeted Therapy Market</w:t>
+              <w:t>Ministry of Health Proposes Special Benefits for Island-Based Medical Personnel</w:t>
             </w:r>
           </w:p>
         </w:tc>
@@ -1887,7 +1993,7 @@
           <w:color w:val="6B7280"/>
           <w:sz w:val="18"/>
         </w:rPr>
-        <w:t>The article highlights methods for early-stage lung cancer screening and detection, reflecting a growing trend of cancer surveillance programs in Vietnam. Broader early detection translates to a larger patient pool eligible for targeted therapies such as Erlotinib — the active ingredient in Davipharm's HYYR.[Source]</w:t>
+        <w:t>The Ministry of Health will advise the Government on a special incentive framework for island-based medical staff following a 4–10 May inspection of Truong Sa, and provided ~VND 3.3 billion in medical equipment and drug supplies to island stations. This signals increased state investment in remote primary healthcare but has no direct bearing on ETC tender mechanisms or drug lists.[Source]</w:t>
       </w:r>
     </w:p>
     <w:p>
@@ -1900,10 +2006,10 @@
           <w:rFonts w:ascii="Calibri" w:hAnsi="Calibri"/>
           <w:b/>
           <w:i w:val="0"/>
-          <w:color w:val="166534"/>
+          <w:color w:val="374151"/>
           <w:sz w:val="17"/>
         </w:rPr>
-        <w:t>📈 Expanded lung cancer screening → growing NSCLC patient base for targeted therapy → opportunity to increase HYYR (Erlotinib) tender volumes in hospital ETC channel.</w:t>
+        <w:t>➖ No direct impact on Davipharm revenue or ETC product portfolio; island healthcare is managed by military medical units (Ministry of Defence), outside civilian tender channels.</w:t>
       </w:r>
     </w:p>
     <w:tbl>
@@ -1950,7 +2056,7 @@
                 <w:color w:val="334155"/>
                 <w:sz w:val="17"/>
               </w:rPr>
-              <w:t>Medical Affairs &amp; Oncology Marketing team should prepare scientific dossiers positioning HYYR (Erlotinib) within the early-detection NSCLC treatment pathway; coordinate with the Tendering team to review provincial and central hospital procurement lists for upcoming oncology drug tenders in the 2025–2026 cycle.</w:t>
+              <w:t>No immediate action required; Government Affairs team may monitor the upcoming special incentive framework to assess whether it could open a long-term essential medicines supply channel (basic generics) for Ministry of Defence facilities.</w:t>
             </w:r>
           </w:p>
         </w:tc>
@@ -1997,7 +2103,7 @@
                 <w:color w:val="4338CA"/>
                 <w:sz w:val="15"/>
               </w:rPr>
-              <w:t>TUỔI TRẺ – SỨC KHỎE</w:t>
+              <w:t>DÂN TRÍ – SỨC KHỎE</w:t>
             </w:r>
           </w:p>
         </w:tc>
@@ -2024,7 +2130,7 @@
                 <w:color w:val="111827"/>
                 <w:sz w:val="21"/>
               </w:rPr>
-              <w:t>At Least 200 New Satellite Hospitals Nationwide — ETC Channel Expansion Opportunity</w:t>
+              <w:t>Hypertension Underdiagnosis in Vietnam — Market Opportunity for Davipharm Cardiovascular Portfolio</w:t>
             </w:r>
           </w:p>
         </w:tc>
@@ -2043,7 +2149,7 @@
           <w:color w:val="6B7280"/>
           <w:sz w:val="18"/>
         </w:rPr>
-        <w:t>The government is pushing to establish at least 200 new satellite hospitals nationwide, strengthening healthcare capacity at provincial and district levels. This directly expands the number of tendering institutions, benefiting Davipharm's cardiovascular (PECHAUNOX, RAVASTEL, TABAREX, ZABALES) and GI (JIRACEK) portfolios which have high demand at community care level.[Source]</w:t>
+        <w:t>An estimated 25–30% of Vietnamese adults have hypertension, yet diagnosis and treatment adherence rates remain critically low, with a growing trend among younger demographics expanding the long-term patient pool. This directly drives demand for Davipharm's fixed-dose combinations PECHAUNOX (Perindopril+Amlodipine) and TABAREX/HATLOP (Valsartan/Irbesartan), aligned with guideline-based combination therapy.[Source]</w:t>
       </w:r>
     </w:p>
     <w:p>
@@ -2059,7 +2165,7 @@
           <w:color w:val="166534"/>
           <w:sz w:val="17"/>
         </w:rPr>
-        <w:t>🟢 Opportunity to grow local ETC tender volume — 200+ potential new tendering sites for Davipharm's cardiovascular and GI products.</w:t>
+        <w:t>🟢 Growing long-term hypertension treatment demand and the shift toward fixed-dose combinations present a clear market expansion opportunity for PECHAUNOX, TABAREX, and HATLOP across ETC and OTC channels.</w:t>
       </w:r>
     </w:p>
     <w:tbl>
@@ -2106,7 +2212,7 @@
                 <w:color w:val="334155"/>
                 <w:sz w:val="17"/>
               </w:rPr>
-              <w:t>Business Development &amp; Tender team, in coordination with Medical Affairs, should map newly recognized satellite hospitals and prioritize early engagement for PECHAUNOX, RAVASTEL, and JIRACEK ahead of the next local tender cycle (Q3–Q4/2025); prepare GMP/BE qualification dossiers to meet new facility procurement requirements.</w:t>
+              <w:t>Marketing &amp; Medical Affairs team should leverage World Hypertension Day (May 17) to activate medical education campaigns at hospitals, highlighting treatment adherence benefits of fixed-dose combinations (PECHAUNOX, TABAREX, HATLOP); Sales ETC team to prioritize primary healthcare facilities — key first-diagnosis and first-prescription points for undetected patients — ahead of the next local tender cycle.</w:t>
             </w:r>
           </w:p>
         </w:tc>
@@ -2153,7 +2259,7 @@
                 <w:color w:val="4338CA"/>
                 <w:sz w:val="15"/>
               </w:rPr>
-              <w:t>TUỔI TRẺ – SỨC KHỎE</w:t>
+              <w:t>DÂN TRÍ – SỨC KHỎE</w:t>
             </w:r>
           </w:p>
         </w:tc>
@@ -2180,7 +2286,7 @@
                 <w:color w:val="111827"/>
                 <w:sz w:val="21"/>
               </w:rPr>
-              <w:t>Hypertension Management Trend: Holistic Lifestyle Approach Beyond Salt Restriction</w:t>
+              <w:t>Rising Musculoskeletal Disease in Younger Population &amp; Regenerative Medicine Trend — Opportunity for Etoricoxib (MAGRAX)</w:t>
             </w:r>
           </w:p>
         </w:tc>
@@ -2199,7 +2305,7 @@
           <w:color w:val="6B7280"/>
           <w:sz w:val="18"/>
         </w:rPr>
-        <w:t>Mainstream health media is shifting hypertension messaging toward comprehensive lifestyle management (diet, exercise, stress) beyond salt restriction, reflecting a growing patient awareness of long-term disease control. This indirectly sustains chronic medication demand for PECHAUNOX (Perindopril+Amlodipine), TABAREX (Valsartan), and HATLOP (Irbesartan) in the core ETC patient segment.[Source]</w:t>
+        <w:t>A Dân Trí webinar at Hồng Ngọc Hospital (12 May 2026) highlighted the rapid rejuvenation of osteoarthritis — increasingly affecting adults over 30 — and warned against widespread self-medication with unregulated analgesics/anti-inflammatories. This expands the potential patient pool for MAGRAX (Etoricoxib), while the push to reduce traditional NSAID dependency favors selective COX-2 inhibitors with a better GI safety profile.[Source]</w:t>
       </w:r>
     </w:p>
     <w:p>
@@ -2215,7 +2321,7 @@
           <w:color w:val="166534"/>
           <w:sz w:val="17"/>
         </w:rPr>
-        <w:t>📈 Growing awareness of long-term hypertension management supports stable demand for Davipharm's cardiovascular portfolio, particularly PECHAUNOX and TABAREX in the ETC channel.</w:t>
+        <w:t>🟢 Opportunity: expanding musculoskeletal disease burden in younger demographics strengthens the tendering and detailing case for MAGRAX (Etoricoxib) across rheumatology, general internal medicine, and private hospital settings.</w:t>
       </w:r>
     </w:p>
     <w:tbl>
@@ -2262,7 +2368,7 @@
                 <w:color w:val="334155"/>
                 <w:sz w:val="17"/>
               </w:rPr>
-              <w:t>Marketing team can leverage this media trend to develop MSL/MR support materials for hospital detailing, reinforcing adherence to combination antihypertensive therapy (PECHAUNOX) alongside lifestyle changes — particularly valuable in preparation for the next ETC tender cycle.</w:t>
+              <w:t>Marketing &amp; Medical Affairs should refresh MAGRAX messaging to emphasize COX-2 selectivity vs. non-selective NSAIDs, targeting the active younger patient segment; ETC Sales team to prioritize detailing at hospitals with rheumatology departments and sports medicine clinics in Q3 2026, ahead of year-end local tender cycles.</w:t>
             </w:r>
           </w:p>
         </w:tc>
@@ -2309,7 +2415,7 @@
                 <w:color w:val="4338CA"/>
                 <w:sz w:val="15"/>
               </w:rPr>
-              <w:t>TUỔI TRẺ – SỨC KHỎE</w:t>
+              <w:t>DÂN TRÍ – SỨC KHỎE</w:t>
             </w:r>
           </w:p>
         </w:tc>
@@ -2336,7 +2442,7 @@
                 <w:color w:val="111827"/>
                 <w:sz w:val="21"/>
               </w:rPr>
-              <w:t>Thong Nhat Hospital Rises as Leading Geriatric Center — ETC Channel Opportunity for Cardiovascular &amp; Diabetes Portfolio</w:t>
+              <w:t>Cell-Level Endoscopy Trend Signals Growing GI Cancer Early Detection Market in Vietnam</w:t>
             </w:r>
           </w:p>
         </w:tc>
@@ -2355,7 +2461,7 @@
           <w:color w:val="6B7280"/>
           <w:sz w:val="18"/>
         </w:rPr>
-        <w:t>Thong Nhat Hospital (Ho Chi Minh City) is positioning itself as a leading geriatric center, signaling sustained growth in long-term treatment demand for chronic conditions prevalent in elderly patients — cardiovascular, hypertension, type 2 diabetes, and dyslipidemia. This is a positive signal for Davipharm's ETC portfolio, particularly PECHAUNOX (Perindopril+Amlodipine), RAVASTEL (Rosuvastatin), TABAREX (Valsartan), HATLOP (Irbesartan), and EIMLER-10 (Empagliflozin).[Source]</w:t>
+        <w:t>Olympus Endocyto 520x technology — offering cell-level optical magnification — is now deployed at Thu Cúc TCI, marking a shift toward advanced early GI cancer detection in private hospital channels. This trend indirectly expands the treatment funnel for Davipharm's oncology portfolio (HYYR – Erlotinib, LARRIVEY – Bicalutamide) in the ETC segment.[Source]</w:t>
       </w:r>
     </w:p>
     <w:p>
@@ -2368,10 +2474,10 @@
           <w:rFonts w:ascii="Calibri" w:hAnsi="Calibri"/>
           <w:b/>
           <w:i w:val="0"/>
-          <w:color w:val="166534"/>
+          <w:color w:val="374151"/>
           <w:sz w:val="17"/>
         </w:rPr>
-        <w:t>🟢 Thong Nhat Hospital's geriatric expansion creates a long-term ETC tendering and volume opportunity for Davipharm's cardiovascular and diabetes lineup in Ho Chi Minh City.</w:t>
+        <w:t>📡 Positive long-term signal: increased early GI cancer detection may expand patient pool for HYYR and LARRIVEY, but near-term ETC revenue impact remains limited.</w:t>
       </w:r>
     </w:p>
     <w:tbl>
@@ -2418,163 +2524,7 @@
                 <w:color w:val="334155"/>
                 <w:sz w:val="17"/>
               </w:rPr>
-              <w:t>The ETC Sales &amp; Market Access team should prioritize engagement with Thong Nhat Hospital's drug formulary committee ahead of the next tender cycle, focusing dossier submissions on PECHAUNOX, RAVASTEL, EIMLER-10, and ZLATKO (Sitagliptin) for chronic</w:t>
-            </w:r>
-          </w:p>
-        </w:tc>
-      </w:tr>
-    </w:tbl>
-    <w:p>
-      <w:pPr>
-        <w:spacing w:before="40" w:after="120"/>
-      </w:pPr>
-    </w:p>
-    <w:tbl>
-      <w:tblPr>
-        <w:tblStyle w:val="TableGrid"/>
-        <w:tblW w:type="auto" w:w="0"/>
-        <w:jc w:val="left"/>
-        <w:tblLook w:firstColumn="1" w:firstRow="1" w:lastColumn="0" w:lastRow="0" w:noHBand="0" w:noVBand="1" w:val="04A0"/>
-      </w:tblPr>
-      <w:tblGrid>
-        <w:gridCol w:w="4536"/>
-        <w:gridCol w:w="4536"/>
-      </w:tblGrid>
-      <w:tr>
-        <w:tc>
-          <w:tcPr>
-            <w:tcW w:type="dxa" w:w="1984"/>
-            <w:shd w:val="clear" w:color="auto" w:fill="EEF2FF"/>
-            <w:tcBorders>
-              <w:top w:val="none" w:sz="6" w:color="auto"/>
-              <w:bottom w:val="none" w:sz="6" w:color="auto"/>
-              <w:left w:val="none" w:sz="6" w:color="auto"/>
-              <w:right w:val="none" w:sz="6" w:color="auto"/>
-            </w:tcBorders>
-          </w:tcPr>
-          <w:p>
-            <w:pPr>
-              <w:spacing w:before="80" w:after="80"/>
-              <w:ind w:left="85"/>
-            </w:pPr>
-            <w:r>
-              <w:rPr>
-                <w:rFonts w:ascii="Calibri" w:hAnsi="Calibri"/>
-                <w:b/>
-                <w:i w:val="0"/>
-                <w:color w:val="4338CA"/>
-                <w:sz w:val="15"/>
-              </w:rPr>
-              <w:t>TUỔI TRẺ – SỨC KHỎE</w:t>
-            </w:r>
-          </w:p>
-        </w:tc>
-        <w:tc>
-          <w:tcPr>
-            <w:tcW w:type="dxa" w:w="4536"/>
-            <w:tcBorders>
-              <w:top w:val="none" w:sz="6" w:color="auto"/>
-              <w:bottom w:val="none" w:sz="6" w:color="auto"/>
-              <w:left w:val="none" w:sz="6" w:color="auto"/>
-              <w:right w:val="none" w:sz="6" w:color="auto"/>
-            </w:tcBorders>
-          </w:tcPr>
-          <w:p>
-            <w:pPr>
-              <w:spacing w:before="60" w:after="60"/>
-              <w:ind w:left="113"/>
-            </w:pPr>
-            <w:r>
-              <w:rPr>
-                <w:rFonts w:ascii="Calibri" w:hAnsi="Calibri"/>
-                <w:b/>
-                <w:i w:val="0"/>
-                <w:color w:val="111827"/>
-                <w:sz w:val="21"/>
-              </w:rPr>
-              <w:t>18,000+ HFMD Cases in Southern Vietnam — Summer 2026 Outbreak Signal</w:t>
-            </w:r>
-          </w:p>
-        </w:tc>
-      </w:tr>
-    </w:tbl>
-    <w:p>
-      <w:pPr>
-        <w:spacing w:before="40" w:after="40"/>
-        <w:ind w:left="170"/>
-      </w:pPr>
-      <w:r>
-        <w:rPr>
-          <w:rFonts w:ascii="Calibri" w:hAnsi="Calibri"/>
-          <w:b w:val="0"/>
-          <w:i/>
-          <w:color w:val="6B7280"/>
-          <w:sz w:val="18"/>
-        </w:rPr>
-        <w:t>Southern Vietnam has recorded over 18,000 HFMD cases, with experts commenting on a new vaccine amid an escalating outbreak. Davipharm has no direct HFMD-specific product, though pediatric hospital surges may marginally lift demand for symptomatic care drugs in ETC channels.[Source]</w:t>
-      </w:r>
-    </w:p>
-    <w:p>
-      <w:pPr>
-        <w:spacing w:before="20" w:after="40"/>
-        <w:ind w:left="170"/>
-      </w:pPr>
-      <w:r>
-        <w:rPr>
-          <w:rFonts w:ascii="Calibri" w:hAnsi="Calibri"/>
-          <w:b/>
-          <w:i w:val="0"/>
-          <w:color w:val="374151"/>
-          <w:sz w:val="17"/>
-        </w:rPr>
-        <w:t>📊 Indirect and negligible impact on Davipharm's current portfolio — no active ingredient directly targets HFMD treatment.</w:t>
-      </w:r>
-    </w:p>
-    <w:tbl>
-      <w:tblPr>
-        <w:tblStyle w:val="TableGrid"/>
-        <w:tblW w:type="auto" w:w="0"/>
-        <w:tblLook w:firstColumn="1" w:firstRow="1" w:lastColumn="0" w:lastRow="0" w:noHBand="0" w:noVBand="1" w:val="04A0"/>
-      </w:tblPr>
-      <w:tblGrid>
-        <w:gridCol w:w="9072"/>
-      </w:tblGrid>
-      <w:tr>
-        <w:tc>
-          <w:tcPr>
-            <w:tcW w:type="dxa" w:w="9072"/>
-            <w:shd w:val="clear" w:color="auto" w:fill="F8FAFC"/>
-            <w:tcBorders>
-              <w:top w:val="none" w:sz="6" w:color="auto"/>
-              <w:bottom w:val="none" w:sz="6" w:color="auto"/>
-              <w:left w:val="single" w:sz="12" w:color="003B71"/>
-              <w:right w:val="none" w:sz="6" w:color="auto"/>
-            </w:tcBorders>
-          </w:tcPr>
-          <w:p>
-            <w:pPr>
-              <w:spacing w:before="60" w:after="60"/>
-              <w:ind w:left="142"/>
-            </w:pPr>
-            <w:r>
-              <w:rPr>
-                <w:rFonts w:ascii="Calibri" w:hAnsi="Calibri"/>
-                <w:b/>
-                <w:i w:val="0"/>
-                <w:color w:val="003B71"/>
-                <w:sz w:val="17"/>
-              </w:rPr>
-              <w:t xml:space="preserve">Strategy  </w:t>
-            </w:r>
-            <w:r>
-              <w:rPr>
-                <w:rFonts w:ascii="Calibri" w:hAnsi="Calibri"/>
-                <w:b w:val="0"/>
-                <w:i w:val="0"/>
-                <w:color w:val="334155"/>
-                <w:sz w:val="17"/>
-              </w:rPr>
-              <w:t>No priority action required; Medical Affairs may monitor pediatric outbreak trends as a background signal for potential long-term portfolio expansion into pediatric care.</w:t>
+              <w:t>Medical Affairs and ETC Sales teams should monitor the expansion of advanced endoscopy centers (Thu Cúc TCI and equivalents) to position HYYR (Erlotinib) and LARRIVEY (Bicalutamide) within early-stage treatment protocols at private facilities adopting new screening technologies; assess product listing opportunities in the next tender cycle.</w:t>
             </w:r>
           </w:p>
         </w:tc>
@@ -5000,7 +4950,7 @@
                 <w:color w:val="111827"/>
                 <w:sz w:val="18"/>
               </w:rPr>
-              <w:t>Map 200+ new satellite hospitals; submit PECHAUNOX, RAVASTEL, JIRACEK tender dossiers before Q3/2026</w:t>
+              <w:t>Prepare PECHAUNOX, TABAREX, EIMLER-10, ZLATKO tender dossiers for district/commune BHYT packages Q3–Q4/2026 aligned with MoH free screening rollout</w:t>
             </w:r>
           </w:p>
         </w:tc>
@@ -5028,7 +4978,7 @@
                 <w:color w:val="003B71"/>
                 <w:sz w:val="17"/>
               </w:rPr>
-              <w:t>Sales / RA</w:t>
+              <w:t>Sales / Strategy</w:t>
             </w:r>
           </w:p>
         </w:tc>
@@ -5056,7 +5006,7 @@
                 <w:color w:val="6B7280"/>
                 <w:sz w:val="17"/>
               </w:rPr>
-              <w:t>200 Satellite Hospital Expansion</w:t>
+              <w:t>MoH Free Annual Health Screening Policy 2026</w:t>
             </w:r>
           </w:p>
         </w:tc>
@@ -5135,7 +5085,7 @@
                 <w:color w:val="111827"/>
                 <w:sz w:val="18"/>
               </w:rPr>
-              <w:t>Prioritize Thong Nhat Hospital formulary engagement for PECHAUNOX, RAVASTEL, EIMLER-10, ZLATKO</w:t>
+              <w:t>Activate Medical Education for PECHAUNOX, HATLOP at primary care facilities on World Hypertension Day May 17</w:t>
             </w:r>
           </w:p>
         </w:tc>
@@ -5163,7 +5113,7 @@
                 <w:color w:val="003B71"/>
                 <w:sz w:val="17"/>
               </w:rPr>
-              <w:t>Sales / Marketing</w:t>
+              <w:t>Marketing / Sales</w:t>
             </w:r>
           </w:p>
         </w:tc>
@@ -5191,7 +5141,7 @@
                 <w:color w:val="6B7280"/>
                 <w:sz w:val="17"/>
               </w:rPr>
-              <w:t>Thong Nhat Geriatric Center</w:t>
+              <w:t>Hypertension Underdiagnosis in Vietnam</w:t>
             </w:r>
           </w:p>
         </w:tc>
@@ -5270,7 +5220,7 @@
                 <w:color w:val="111827"/>
                 <w:sz w:val="18"/>
               </w:rPr>
-              <w:t>Develop HYYR (Erlotinib) scientific dossier for early-detection NSCLC; review 2026 oncology tender lists</w:t>
+              <w:t>Refresh MAGRAX (Etoricoxib) COX-2 vs NSAID messaging; detail rheumatology departments ahead of Q4 tender</w:t>
             </w:r>
           </w:p>
         </w:tc>
@@ -5298,7 +5248,7 @@
                 <w:color w:val="003B71"/>
                 <w:sz w:val="17"/>
               </w:rPr>
-              <w:t>Marketing / RA</w:t>
+              <w:t>Marketing / Sales</w:t>
             </w:r>
           </w:p>
         </w:tc>
@@ -5326,7 +5276,7 @@
                 <w:color w:val="6B7280"/>
                 <w:sz w:val="17"/>
               </w:rPr>
-              <w:t>Early Lung Cancer Screening Trend</w:t>
+              <w:t>Musculoskeletal Disease Rejuvenation &amp; COX-2 Trend</w:t>
             </w:r>
           </w:p>
         </w:tc>
@@ -5405,7 +5355,7 @@
                 <w:color w:val="111827"/>
                 <w:sz w:val="18"/>
               </w:rPr>
-              <w:t>Chuẩn bị tài liệu MSL/MR nhấn mạnh tuân thủ điều trị dài hạn PECHAUNOX, RAVASTEL, EIMLER-10 phục</w:t>
+              <w:t>Develop PPI/HP eradication MedAffairs materials; push JIRACEK into Bach Mai &amp; Cho Ray tender lists 2026–2027</w:t>
             </w:r>
           </w:p>
         </w:tc>
@@ -5433,6 +5383,7 @@
                 <w:color w:val="003B71"/>
                 <w:sz w:val="17"/>
               </w:rPr>
+              <w:t>Marketing / Sales</w:t>
             </w:r>
           </w:p>
         </w:tc>
@@ -5460,6 +5411,7 @@
                 <w:color w:val="6B7280"/>
                 <w:sz w:val="17"/>
               </w:rPr>
+              <w:t>Rising HP/Gastric Cancer Awareness — PPI Opportunity</w:t>
             </w:r>
           </w:p>
         </w:tc>
@@ -5487,6 +5439,7 @@
                 <w:color w:val="22C55E"/>
                 <w:sz w:val="17"/>
               </w:rPr>
+              <w:t>🟡 Medium</w:t>
             </w:r>
           </w:p>
         </w:tc>

</xml_diff>

<commit_message>
Update report_en.docx 2026-05-13 12:31
</commit_message>
<xml_diff>
--- a/report_en.docx
+++ b/report_en.docx
@@ -338,7 +338,7 @@
                 <w:color w:val="111827"/>
                 <w:sz w:val="20"/>
               </w:rPr>
-              <w:t>Week 11–17 May 2026: MoH's free universal health screening mandate is the most consequential development for Davipharm, creating a structural demand uplift for the cardiovascular and diabetes portfolio ahead of World Hypertension Day (May 17) and the upcoming local tender cycle.</w:t>
+              <w:t>Week 11–17 May 2026: MoH's free annual health screening rollout and rising chronic disease awareness create the strongest long-term demand tailwind to date across Davipharm's cardiovascular, diabetes, GI, and oncology portfolios — no direct regulatory risk this week.</w:t>
             </w:r>
           </w:p>
         </w:tc>
@@ -406,7 +406,7 @@
                 <w:color w:val="111827"/>
                 <w:sz w:val="17"/>
               </w:rPr>
-              <w:t>▸  Universal Screening:The free annual check-up policy will materially expand the diagnosed patient pool for hypertension, dyslipidemia, and diabetes — directly benefiting PECHAUNOX, RAVASTEL, TABAREX, EIMLER-10, and ZLATKO across district/commune ETC channels.</w:t>
+              <w:t>▸  National Free Screening (MoH):Annual free health checks from 2026 will materially expand the new patient funnel for RAVASTEL, EIMLER-10, ZLATKO, PECHAUNOX, TABAREX, and HATLOP — highest volume impact expected at district-level ETC.</w:t>
             </w:r>
           </w:p>
           <w:p>
@@ -422,7 +422,7 @@
                 <w:color w:val="111827"/>
                 <w:sz w:val="17"/>
               </w:rPr>
-              <w:t>▸  Cardiovascular — Solid Base Demand:An estimated 25–30% of Vietnamese adults remain undiagnosed for hypertension and the younger musculoskeletal disease trend strengthen the tendering rationale for PECHAUNOX/HATLOP/TABAREX and MAGRAX in the 2026–2027 cycle.</w:t>
+              <w:t>▸  Hypertension Underdiagnosis:25–30% uncontrolled adult hypertension prevalence and younger-onset trend reinforce PECHAUNOX (FDC) positioning ahead of the next tender cycle.</w:t>
             </w:r>
           </w:p>
           <w:p>
@@ -438,7 +438,7 @@
                 <w:color w:val="111827"/>
                 <w:sz w:val="17"/>
               </w:rPr>
-              <w:t>▸  GI &amp; Oncology — Long-Term Signal:Rising HP/gastric cancer awareness and advanced endoscopy expansion in private hospitals indirectly support JIRACEK, MARTAZ, and oncology products HYYR/LARRIVEY, with limited near-term revenue impact.</w:t>
+              <w:t>▸  GI Cancer + H. pylori:Expanding ultra-magnification endoscopy and rising HP/gastric cancer awareness simultaneously drive mid-term demand for HYYR/LARRIVEY (oncology) and JIRACEK/MARTAZ (PPI) at central hospitals.</w:t>
             </w:r>
           </w:p>
         </w:tc>
@@ -1088,7 +1088,7 @@
                 <w:color w:val="111827"/>
                 <w:sz w:val="21"/>
               </w:rPr>
-              <w:t>Rising Gastric Cancer Awareness — Opportunity Signal for Davipharm's GI Portfolio (Esomeprazole, Rabeprazole)</w:t>
+              <w:t>Rising Public Awareness of Gastric Cancer &amp; H. pylori — Opportunity Signal for GI Portfolio (Esomeprazole, Rabeprazole)</w:t>
             </w:r>
           </w:p>
         </w:tc>
@@ -1107,7 +1107,7 @@
           <w:color w:val="6B7280"/>
           <w:sz w:val="18"/>
         </w:rPr>
-        <w:t>A Bach Mai Hospital specialist highlighted the HP-to-gastric-cancer progression pathway and urged early endoscopy, reflecting growing demand for GI treatments in the hospital channel. This trend supports increased use of PPI-based H. pylori eradication regimens, benefiting Davipharm's JIRACEK (Esomeprazole) and MARTAZ (Rabeprazole).[Source]</w:t>
+        <w:t>A medical advisory article from Bach Mai Hospital (via Dan Tri) highlights H. pylori's role in the gastritis-to-cancer progression cascade and recommends early endoscopy and chronic GI management — reflecting growing long-term PPI demand in Vietnam. This represents a positive market signal for JIRACEK (Esomeprazole) and MARTAZ (Rabeprazole) in chronic gastric patient segments across ETC and OPD channels.[Source]</w:t>
       </w:r>
     </w:p>
     <w:p>
@@ -1123,7 +1123,7 @@
           <w:color w:val="166534"/>
           <w:sz w:val="17"/>
         </w:rPr>
-        <w:t>📈 Growing public awareness of HP-related gastric cancer indirectly drives prescribing and tender volume for JIRACEK and MARTAZ across central and provincial hospitals.</w:t>
+        <w:t>📈 Growing HP/gastric cancer awareness drives long-term PPI prescription demand — a growth opportunity for JIRACEK and MARTAZ across central and provincial hospital tenders.</w:t>
       </w:r>
     </w:p>
     <w:tbl>
@@ -1170,7 +1170,7 @@
                 <w:color w:val="334155"/>
                 <w:sz w:val="17"/>
               </w:rPr>
-              <w:t>ETC Marketing and Medical Affairs teams should update scientific materials on PPI's role in HP eradication protocols and present at GI conferences in Q3/2026; prioritize JIRACEK's inclusion in central hospital tender lists (Bach Mai, Cho Ray) for the 2026–2027 bidding cycle.</w:t>
+              <w:t>Medical Team and ETC Sales to prepare detailing materials emphasizing PPI's role in H. pylori eradication regimens (PPI + antibiotic combinations) and ulcer relapse prevention; prioritize engagement with GI-Hepatology departments at key central hospitals (Bach Mai, Cho Ray, Hue) in Q2–Q3/2026 to position JIRACEK and MARTAZ ahead of the next tender cycle.</w:t>
             </w:r>
           </w:p>
         </w:tc>
@@ -1244,7 +1244,7 @@
                 <w:color w:val="111827"/>
                 <w:sz w:val="21"/>
               </w:rPr>
-              <w:t>Cicada Shell Seizure at Lang Son Border — Traditional Medicine Raw Material Supply Signal</w:t>
+              <w:t>Cicada Shell Seizure at Lang Son — Traditional Medicine Raw Material Market Signal</w:t>
             </w:r>
           </w:p>
         </w:tc>
@@ -1263,7 +1263,7 @@
           <w:color w:val="6B7280"/>
           <w:sz w:val="18"/>
         </w:rPr>
-        <w:t>The seizure of 80kg dried cicada shells at Lang Son highlights active but poorly documented cross-border TCM raw material flows. This article covers traditional herbal medicine segments with no direct relevance to Davipharm's synthetic generic portfolio.[Source]</w:t>
+        <w:t>Lang Son market authorities seized 80kg of dried cicada shells lacking documentation, reflecting surging demand for traditional medicine raw materials at VND 1.2–1.7M/kg. This article covers the TCM herbal segment and has no direct relevance to Davipharm's generic pharmaceutical portfolio.[Source]</w:t>
       </w:r>
     </w:p>
     <w:p>
@@ -1279,7 +1279,7 @@
           <w:color w:val="374151"/>
           <w:sz w:val="17"/>
         </w:rPr>
-        <w:t>⚪ No direct impact on Davipharm's products or tendering activities — passive monitoring only.</w:t>
+        <w:t>⚪ No direct impact on Davipharm — article falls entirely outside the company's current synthetic generic product competitive space.</w:t>
       </w:r>
     </w:p>
     <w:tbl>
@@ -1326,7 +1326,7 @@
                 <w:color w:val="334155"/>
                 <w:sz w:val="17"/>
               </w:rPr>
-              <w:t>No action required. Article is unrelated to any Davipharm active ingredient or therapeutic area; Market Intelligence team to log and close.</w:t>
+              <w:t>No action required. Market Intelligence team to file as background reference on TCM consumer trends in Vietnam; no further monitoring priority warranted.</w:t>
             </w:r>
           </w:p>
         </w:tc>
@@ -1400,7 +1400,7 @@
                 <w:color w:val="111827"/>
                 <w:sz w:val="21"/>
               </w:rPr>
-              <w:t>Lidocaine Poisoning Post-Liposuction — Regulatory Pressure on Unlicensed Aesthetic Clinics</w:t>
+              <w:t>Lidocaine Toxicity Post-Liposuction Highlights Crackdown Risk on Unlicensed Aesthetic Clinics</w:t>
             </w:r>
           </w:p>
         </w:tc>
@@ -1419,7 +1419,7 @@
           <w:color w:val="6B7280"/>
           <w:sz w:val="18"/>
         </w:rPr>
-        <w:t>A 53-year-old woman suffered critical Lidocaine poisoning after liposuction at an unlicensed HCMC clinic, highlighting Vietnam's 25,000–35,000 annual aesthetic complication cases. This incident accelerates regulatory scrutiny on aesthetic clinics, with indirect implications for ICU-related drug demand including sedatives and antiepileptics.[Source]</w:t>
+        <w:t>A 53-year-old woman fell into a deep coma after Lidocaine toxicity during liposuction at an unlicensed HCMC clinic, with the case escalated to the city's Department of Health; a May 12 safety forum cited 25,000–35,000 aesthetic complication cases annually and urged stricter enforcement. While no Davipharm product was implicated, an anticipated regulatory crackdown on outpatient aesthetic procedures could tighten prescribing conditions for post-surgical analgesics — a segment where MAGRAX (Etoricoxib) and METILONE-4 (Methylprednisolone) are deployed.[Source]</w:t>
       </w:r>
     </w:p>
     <w:p>
@@ -1435,7 +1435,113 @@
           <w:color w:val="374151"/>
           <w:sz w:val="17"/>
         </w:rPr>
-        <w:t>🔍 Low, indirect impact on Davipharm — no core portfolio products directly affected, but monitor if clinic crackdowns alter ETC channel dynamics for CNS/sedative drugs (SERNAL – Risperidone, LAFAXOR – Venlafaxine).</w:t>
+        <w:t>⚠️ Low-level indirect exposure: tightening oversight of private aesthetic clinics may reduce OPD prescriptions of MAGRAX/METILONE-4 if facilities face suspension following enforcement actions.</w:t>
+      </w:r>
+    </w:p>
+    <w:p>
+      <w:pPr>
+        <w:spacing w:before="40" w:after="120"/>
+      </w:pPr>
+    </w:p>
+    <w:tbl>
+      <w:tblPr>
+        <w:tblStyle w:val="TableGrid"/>
+        <w:tblW w:type="auto" w:w="0"/>
+        <w:jc w:val="left"/>
+        <w:tblLook w:firstColumn="1" w:firstRow="1" w:lastColumn="0" w:lastRow="0" w:noHBand="0" w:noVBand="1" w:val="04A0"/>
+      </w:tblPr>
+      <w:tblGrid>
+        <w:gridCol w:w="4536"/>
+        <w:gridCol w:w="4536"/>
+      </w:tblGrid>
+      <w:tr>
+        <w:tc>
+          <w:tcPr>
+            <w:tcW w:type="dxa" w:w="1984"/>
+            <w:shd w:val="clear" w:color="auto" w:fill="EEF2FF"/>
+            <w:tcBorders>
+              <w:top w:val="none" w:sz="6" w:color="auto"/>
+              <w:bottom w:val="none" w:sz="6" w:color="auto"/>
+              <w:left w:val="none" w:sz="6" w:color="auto"/>
+              <w:right w:val="none" w:sz="6" w:color="auto"/>
+            </w:tcBorders>
+          </w:tcPr>
+          <w:p>
+            <w:pPr>
+              <w:spacing w:before="80" w:after="80"/>
+              <w:ind w:left="85"/>
+            </w:pPr>
+            <w:r>
+              <w:rPr>
+                <w:rFonts w:ascii="Calibri" w:hAnsi="Calibri"/>
+                <w:b/>
+                <w:i w:val="0"/>
+                <w:color w:val="4338CA"/>
+                <w:sz w:val="15"/>
+              </w:rPr>
+              <w:t>DÂN TRÍ – SỨC KHỎE</w:t>
+            </w:r>
+          </w:p>
+        </w:tc>
+        <w:tc>
+          <w:tcPr>
+            <w:tcW w:type="dxa" w:w="4536"/>
+            <w:tcBorders>
+              <w:top w:val="none" w:sz="6" w:color="auto"/>
+              <w:bottom w:val="none" w:sz="6" w:color="auto"/>
+              <w:left w:val="none" w:sz="6" w:color="auto"/>
+              <w:right w:val="none" w:sz="6" w:color="auto"/>
+            </w:tcBorders>
+          </w:tcPr>
+          <w:p>
+            <w:pPr>
+              <w:spacing w:before="60" w:after="60"/>
+              <w:ind w:left="113"/>
+            </w:pPr>
+            <w:r>
+              <w:rPr>
+                <w:rFonts w:ascii="Calibri" w:hAnsi="Calibri"/>
+                <w:b/>
+                <w:i w:val="0"/>
+                <w:color w:val="111827"/>
+                <w:sz w:val="21"/>
+              </w:rPr>
+              <w:t>Piperine in Black Pepper: Cardiovascular &amp; Lipid Metabolism Benefits — Drug Interaction Caution Noted</w:t>
+            </w:r>
+          </w:p>
+        </w:tc>
+      </w:tr>
+    </w:tbl>
+    <w:p>
+      <w:pPr>
+        <w:spacing w:before="40" w:after="40"/>
+        <w:ind w:left="170"/>
+      </w:pPr>
+      <w:r>
+        <w:rPr>
+          <w:rFonts w:ascii="Calibri" w:hAnsi="Calibri"/>
+          <w:b w:val="0"/>
+          <w:i/>
+          <w:color w:val="6B7280"/>
+          <w:sz w:val="18"/>
+        </w:rPr>
+        <w:t>A health-science article highlights piperine's potential to improve lipid profiles (reduce LDL, raise HDL) and support energy metabolism, while warning of drug metabolism interference — relevant to patients on anticoagulants or chronic cardiovascular medications. This has no direct tender impact for Davipharm, but signals consumer interest in natural cardiovascular-lipid adjuncts alongside pharmaceuticals.[Source]</w:t>
+      </w:r>
+    </w:p>
+    <w:p>
+      <w:pPr>
+        <w:spacing w:before="20" w:after="40"/>
+        <w:ind w:left="170"/>
+      </w:pPr>
+      <w:r>
+        <w:rPr>
+          <w:rFonts w:ascii="Calibri" w:hAnsi="Calibri"/>
+          <w:b/>
+          <w:i w:val="0"/>
+          <w:color w:val="374151"/>
+          <w:sz w:val="17"/>
+        </w:rPr>
+        <w:t>➖ No direct business impact on Davipharm; however, the piperine–cardiovascular drug interaction warning could be leveraged in medical education content supporting RAVASTEL (Rosuvastatin) and ZABALES (Clopidogrel).</w:t>
       </w:r>
     </w:p>
     <w:tbl>
@@ -1482,7 +1588,7 @@
                 <w:color w:val="334155"/>
                 <w:sz w:val="17"/>
               </w:rPr>
-              <w:t>Medical Affairs to monitor aesthetic clinic regulatory developments through Q2–Q3/2026; assess whether inspection crackdowns extend to general outpatient clinics, potentially impacting ETC/OTC distribution channels for SERNAL and LAFAXOR.</w:t>
+              <w:t>Medical Affairs team may integrate piperine interaction data into rep training materials for the cardiovascular portfolio (RAVASTEL, ZABALES, PECHAUNOX) to reinforce the clinical necessity of prescription lipid management over natural alternatives; implement within 1 month as routine supplementary content.</w:t>
             </w:r>
           </w:p>
         </w:tc>
@@ -1556,7 +1662,7 @@
                 <w:color w:val="111827"/>
                 <w:sz w:val="21"/>
               </w:rPr>
-              <w:t>Black Pepper's Piperine: Lipid &amp; Cardiovascular Benefits, Drug Interaction Cautions</w:t>
+              <w:t>MoH Launches Annual Free Health Check Framework — Potential Screening Uptick for Chronic Disease Portfolio</w:t>
             </w:r>
           </w:p>
         </w:tc>
@@ -1575,7 +1681,7 @@
           <w:color w:val="6B7280"/>
           <w:sz w:val="18"/>
         </w:rPr>
-        <w:t>A widely-read article promotes piperine (black pepper) for LDL reduction, HDL elevation, and fat metabolism, while cautioning that high-dose piperine may interfere with drug metabolism and anticoagulation. This consumer-level narrative may shape patient attitudes toward managing dyslipidemia and cardiovascular risk through diet rather than prescribed generics such as RAVASTEL (Rosuvastatin).[Source]</w:t>
+        <w:t>Vietnam's MoH has issued clinical guidelines for free annual health screenings for all citizens aged 18+, including blood glucose, biochemistry, and chest X-ray — sufficient to detect diabetes and cardiovascular risk at population scale. This policy is expected to significantly expand the diagnosed patient pool for RAVASTEL (Rosuvastatin), EIMLER-10 (Empagliflozin), ZLATKO (Sitagliptin), PECHAUNOX, TABAREX, and HATLOP.[Source]</w:t>
       </w:r>
     </w:p>
     <w:p>
@@ -1588,10 +1694,10 @@
           <w:rFonts w:ascii="Calibri" w:hAnsi="Calibri"/>
           <w:b/>
           <w:i w:val="0"/>
-          <w:color w:val="374151"/>
+          <w:color w:val="166534"/>
           <w:sz w:val="17"/>
         </w:rPr>
-        <w:t>⚪ Limited short-term revenue impact, but the growing self-treatment trend via natural remedies warrants long-term monitoring, particularly for the dyslipidemia patient segment targeted by RAVASTEL.</w:t>
+        <w:t>🟢 Mass screening will expand the new patient funnel for cardiovascular and diabetes drugs — a long-term demand tailwind for RAVASTEL, EIMLER-10, ZLATKO, and PECHAUNOX across ETC channels.</w:t>
       </w:r>
     </w:p>
     <w:tbl>
@@ -1638,7 +1744,7 @@
                 <w:color w:val="334155"/>
                 <w:sz w:val="17"/>
               </w:rPr>
-              <w:t>The Marketing team should monitor the "food-as-medicine" media trend and prepare HCP education materials reinforcing guideline-based statin therapy (RAVASTEL/Rosuvastatin) as non-replaceable; the piperine–drug interaction alert also presents a MedEd opportunity for physicians prescribing MAGRAX (Etoricoxib) and ZABALES (Clopidogrel).</w:t>
+              <w:t>Marketing &amp; Medical Affairs teams should monitor the pending Decree under the Prevention Law (expected 2026) to confirm policy activation timelines; meanwhile, prepare post-screening prescribing support materials for RAVASTEL, EIMLER-10</w:t>
             </w:r>
           </w:p>
         </w:tc>
@@ -1712,7 +1818,7 @@
                 <w:color w:val="111827"/>
                 <w:sz w:val="21"/>
               </w:rPr>
-              <w:t>MoH Launches Free Annual Health Screening Guidelines — Early Detection Wave for Cardiovascular &amp; Diabetes Drugs</w:t>
+              <w:t>90% of Vietnamese Face Oral Health Issues — Dental Market Expansion, Outside Davipharm Portfolio</w:t>
             </w:r>
           </w:p>
         </w:tc>
@@ -1731,113 +1837,7 @@
           <w:color w:val="6B7280"/>
           <w:sz w:val="18"/>
         </w:rPr>
-        <w:t>The Ministry of Health issued guidelines mandating at least one free annual health check-up for all citizens aged 18+, including blood glucose, blood pressure, and chest X-ray screening — directly triggering mass early detection of hypertension, dyslipidemia, and diabetes. This policy is expected to significantly expand the diagnosed patient pool, boosting demand for Davipharm's cardiovascular (PECHAUNOX, RAVASTEL, TABAREX) and diabetes (EIMLER-10, ZLATKO) portfolios.[Source]</w:t>
-      </w:r>
-    </w:p>
-    <w:p>
-      <w:pPr>
-        <w:spacing w:before="20" w:after="40"/>
-        <w:ind w:left="170"/>
-      </w:pPr>
-      <w:r>
-        <w:rPr>
-          <w:rFonts w:ascii="Calibri" w:hAnsi="Calibri"/>
-          <w:b/>
-          <w:i w:val="0"/>
-          <w:color w:val="166534"/>
-          <w:sz w:val="17"/>
-        </w:rPr>
-        <w:t>🟢 Clear mid-to-long-term opportunity: millions of newly screened patients will drive increased ETC prescription demand for PECHAUNOX, RAVASTEL, TABAREX, EIMLER-10, and ZLATKO.</w:t>
-      </w:r>
-    </w:p>
-    <w:p>
-      <w:pPr>
-        <w:spacing w:before="40" w:after="120"/>
-      </w:pPr>
-    </w:p>
-    <w:tbl>
-      <w:tblPr>
-        <w:tblStyle w:val="TableGrid"/>
-        <w:tblW w:type="auto" w:w="0"/>
-        <w:jc w:val="left"/>
-        <w:tblLook w:firstColumn="1" w:firstRow="1" w:lastColumn="0" w:lastRow="0" w:noHBand="0" w:noVBand="1" w:val="04A0"/>
-      </w:tblPr>
-      <w:tblGrid>
-        <w:gridCol w:w="4536"/>
-        <w:gridCol w:w="4536"/>
-      </w:tblGrid>
-      <w:tr>
-        <w:tc>
-          <w:tcPr>
-            <w:tcW w:type="dxa" w:w="1984"/>
-            <w:shd w:val="clear" w:color="auto" w:fill="EEF2FF"/>
-            <w:tcBorders>
-              <w:top w:val="none" w:sz="6" w:color="auto"/>
-              <w:bottom w:val="none" w:sz="6" w:color="auto"/>
-              <w:left w:val="none" w:sz="6" w:color="auto"/>
-              <w:right w:val="none" w:sz="6" w:color="auto"/>
-            </w:tcBorders>
-          </w:tcPr>
-          <w:p>
-            <w:pPr>
-              <w:spacing w:before="80" w:after="80"/>
-              <w:ind w:left="85"/>
-            </w:pPr>
-            <w:r>
-              <w:rPr>
-                <w:rFonts w:ascii="Calibri" w:hAnsi="Calibri"/>
-                <w:b/>
-                <w:i w:val="0"/>
-                <w:color w:val="4338CA"/>
-                <w:sz w:val="15"/>
-              </w:rPr>
-              <w:t>DÂN TRÍ – SỨC KHỎE</w:t>
-            </w:r>
-          </w:p>
-        </w:tc>
-        <w:tc>
-          <w:tcPr>
-            <w:tcW w:type="dxa" w:w="4536"/>
-            <w:tcBorders>
-              <w:top w:val="none" w:sz="6" w:color="auto"/>
-              <w:bottom w:val="none" w:sz="6" w:color="auto"/>
-              <w:left w:val="none" w:sz="6" w:color="auto"/>
-              <w:right w:val="none" w:sz="6" w:color="auto"/>
-            </w:tcBorders>
-          </w:tcPr>
-          <w:p>
-            <w:pPr>
-              <w:spacing w:before="60" w:after="60"/>
-              <w:ind w:left="113"/>
-            </w:pPr>
-            <w:r>
-              <w:rPr>
-                <w:rFonts w:ascii="Calibri" w:hAnsi="Calibri"/>
-                <w:b/>
-                <w:i w:val="0"/>
-                <w:color w:val="111827"/>
-                <w:sz w:val="21"/>
-              </w:rPr>
-              <w:t>90% of Vietnamese Have Oral Health Issues — Market Signal Outside Davipharm Portfolio</w:t>
-            </w:r>
-          </w:p>
-        </w:tc>
-      </w:tr>
-    </w:tbl>
-    <w:p>
-      <w:pPr>
-        <w:spacing w:before="40" w:after="40"/>
-        <w:ind w:left="170"/>
-      </w:pPr>
-      <w:r>
-        <w:rPr>
-          <w:rFonts w:ascii="Calibri" w:hAnsi="Calibri"/>
-          <w:b w:val="0"/>
-          <w:i/>
-          <w:color w:val="6B7280"/>
-          <w:sz w:val="18"/>
-        </w:rPr>
-        <w:t>The 47th Asia-Pacific Dental Conference in Hanoi highlighted alarming oral health statistics: 90% of the population affected, 60% of adults with periodontal disease, and 79% of elderly with tooth loss. Davipharm's current portfolio has no dental or oral antimicrobial products, making this a non-material revenue signal at this time.[Source]</w:t>
+        <w:t>The 47th Asia-Pacific Dental Conference in Hanoi reported that 90% of Vietnamese suffer from oral health issues, with the Ministry of Health prioritizing preventive and specialist dental care. Davipharm carries no oral health products, so this development has no direct revenue or tender impact.[Source]</w:t>
       </w:r>
     </w:p>
     <w:p>
@@ -1853,7 +1853,7 @@
           <w:color w:val="374151"/>
           <w:sz w:val="17"/>
         </w:rPr>
-        <w:t>➖ Background epidemiological data only; no Davipharm product stands to benefit directly in the near term.</w:t>
+        <w:t>⚪ No relevance to Davipharm's strategic portfolio — passive monitoring only, no priority action required.</w:t>
       </w:r>
     </w:p>
     <w:tbl>
@@ -1900,7 +1900,7 @@
                 <w:color w:val="334155"/>
                 <w:sz w:val="17"/>
               </w:rPr>
-              <w:t>No immediate action required. Business Development may flag this as a long-term signal should Davipharm consider portfolio expansion into dental-specific formulations (e.g., Metronidazole, Amoxicillin dental packs) within the 3–5 year pipeline cycle.</w:t>
+              <w:t>No immediate action required; Business Development may note the dental market expansion as a long-term signal should Davipharm consider entering the oral care OTC segment in future portfolio planning.</w:t>
             </w:r>
           </w:p>
         </w:tc>
@@ -1974,7 +1974,7 @@
                 <w:color w:val="111827"/>
                 <w:sz w:val="21"/>
               </w:rPr>
-              <w:t>Ministry of Health Proposes Special Benefits for Island-Based Medical Personnel</w:t>
+              <w:t>MoH Proposes Special Incentives for Island Healthcare Workers — Signal of Primary Care Strengthening in Remote Areas</w:t>
             </w:r>
           </w:p>
         </w:tc>
@@ -1993,7 +1993,7 @@
           <w:color w:val="6B7280"/>
           <w:sz w:val="18"/>
         </w:rPr>
-        <w:t>The Ministry of Health will advise the Government on a special incentive framework for island-based medical staff following a 4–10 May inspection of Truong Sa, and provided ~VND 3.3 billion in medical equipment and drug supplies to island stations. This signals increased state investment in remote primary healthcare but has no direct bearing on ETC tender mechanisms or drug lists.[Source]</w:t>
+        <w:t>Deputy Minister of Health Tran Van Thuan announced plans to advise the Government on a legal framework for special incentives for island-based healthcare workers, following a Truong Sa inspection visit (May 4–10, 2026), with VND 3.3 billion in medical equipment and drug kits donated to 7 islands. This news reflects a policy direction to strengthen primary care in remote areas but has no direct bearing on Davipharm's ETC tender portfolio.[Source]</w:t>
       </w:r>
     </w:p>
     <w:p>
@@ -2009,7 +2009,7 @@
           <w:color w:val="374151"/>
           <w:sz w:val="17"/>
         </w:rPr>
-        <w:t>➖ No direct impact on Davipharm revenue or ETC product portfolio; island healthcare is managed by military medical units (Ministry of Defence), outside civilian tender channels.</w:t>
+        <w:t>➖ No direct relevance to Davipharm's product portfolio or distribution channels; no immediate opportunity or risk identified.</w:t>
       </w:r>
     </w:p>
     <w:tbl>
@@ -2056,7 +2056,7 @@
                 <w:color w:val="334155"/>
                 <w:sz w:val="17"/>
               </w:rPr>
-              <w:t>No immediate action required; Government Affairs team may monitor the upcoming special incentive framework to assess whether it could open a long-term essential medicines supply channel (basic generics) for Ministry of Defence facilities.</w:t>
+              <w:t>No priority action required. Government Affairs team may monitor the forthcoming legal framework for island healthcare incentives — if it leads to expanded primary care drug lists (including cardiovascular/diabetes), consider registering products such as RAVASTEL and ZLATKO into future defense/special procurement packages.</w:t>
             </w:r>
           </w:p>
         </w:tc>
@@ -2130,7 +2130,7 @@
                 <w:color w:val="111827"/>
                 <w:sz w:val="21"/>
               </w:rPr>
-              <w:t>Hypertension Underdiagnosis in Vietnam — Market Opportunity for Davipharm Cardiovascular Portfolio</w:t>
+              <w:t>Hypertension Underdiagnosis in Millions of Vietnamese — Market Expansion Opportunity for Davipharm's Cardiovascular Portfolio</w:t>
             </w:r>
           </w:p>
         </w:tc>
@@ -2149,7 +2149,7 @@
           <w:color w:val="6B7280"/>
           <w:sz w:val="18"/>
         </w:rPr>
-        <w:t>An estimated 25–30% of Vietnamese adults have hypertension, yet diagnosis and treatment adherence rates remain critically low, with a growing trend among younger demographics expanding the long-term patient pool. This directly drives demand for Davipharm's fixed-dose combinations PECHAUNOX (Perindopril+Amlodipine) and TABAREX/HATLOP (Valsartan/Irbesartan), aligned with guideline-based combination therapy.[Source]</w:t>
+        <w:t>Vietnam's cardiology experts warn that 25–30% of Vietnamese adults have hypertension yet diagnosis and control rates remain critically low, with disease onset trending younger and fixed-dose combination therapy gaining prominence. This signals sustained long-term demand growth for Davipharm's PECHAUNOX (Perindopril+Amlodipine), TABAREX (Valsartan), and HATLOP (Irbesartan) across both ETC and OTC channels.[Source]</w:t>
       </w:r>
     </w:p>
     <w:p>
@@ -2165,7 +2165,7 @@
           <w:color w:val="166534"/>
           <w:sz w:val="17"/>
         </w:rPr>
-        <w:t>🟢 Growing long-term hypertension treatment demand and the shift toward fixed-dose combinations present a clear market expansion opportunity for PECHAUNOX, TABAREX, and HATLOP across ETC and OTC channels.</w:t>
+        <w:t>📈 Clear growth opportunity: a large untreated hypertension patient pool and expert endorsement of fixed-dose combinations directly support PECHAUNOX's positioning and ETC tender volume in the upcoming procurement cycle.</w:t>
       </w:r>
     </w:p>
     <w:tbl>
@@ -2212,7 +2212,7 @@
                 <w:color w:val="334155"/>
                 <w:sz w:val="17"/>
               </w:rPr>
-              <w:t>Marketing &amp; Medical Affairs team should leverage World Hypertension Day (May 17) to activate medical education campaigns at hospitals, highlighting treatment adherence benefits of fixed-dose combinations (PECHAUNOX, TABAREX, HATLOP); Sales ETC team to prioritize primary healthcare facilities — key first-diagnosis and first-prescription points for undetected patients — ahead of the next local tender cycle.</w:t>
+              <w:t>The Cardiovascular Marketing team, in coordination with Medical Affairs, should immediately</w:t>
             </w:r>
           </w:p>
         </w:tc>
@@ -2286,7 +2286,7 @@
                 <w:color w:val="111827"/>
                 <w:sz w:val="21"/>
               </w:rPr>
-              <w:t>Rising Musculoskeletal Disease in Younger Population &amp; Regenerative Medicine Trend — Opportunity for Etoricoxib (MAGRAX)</w:t>
+              <w:t>Musculoskeletal Disease Affecting Younger Demographics — Regenerative Medicine Trend Challenging Long-Term Analgesic Use</w:t>
             </w:r>
           </w:p>
         </w:tc>
@@ -2305,7 +2305,7 @@
           <w:color w:val="6B7280"/>
           <w:sz w:val="18"/>
         </w:rPr>
-        <w:t>A Dân Trí webinar at Hồng Ngọc Hospital (12 May 2026) highlighted the rapid rejuvenation of osteoarthritis — increasingly affecting adults over 30 — and warned against widespread self-medication with unregulated analgesics/anti-inflammatories. This expands the potential patient pool for MAGRAX (Etoricoxib), while the push to reduce traditional NSAID dependency favors selective COX-2 inhibitors with a better GI safety profile.[Source]</w:t>
+        <w:t>A webinar co-hosted by Dân Trí and Hồng Ngọc Hospital highlights a clear trend of musculoskeletal degeneration in adults over 30, alongside warnings on self-medication with uncontrolled NSAIDs/analgesics. Growing promotion of regenerative medicine as an alternative may temper long-term demand for Etoricoxib (MAGRAX) in chronic musculoskeletal pain management.[Source]</w:t>
       </w:r>
     </w:p>
     <w:p>
@@ -2318,10 +2318,10 @@
           <w:rFonts w:ascii="Calibri" w:hAnsi="Calibri"/>
           <w:b/>
           <w:i w:val="0"/>
-          <w:color w:val="166534"/>
+          <w:color w:val="374151"/>
           <w:sz w:val="17"/>
         </w:rPr>
-        <w:t>🟢 Opportunity: expanding musculoskeletal disease burden in younger demographics strengthens the tendering and detailing case for MAGRAX (Etoricoxib) across rheumatology, general internal medicine, and private hospital settings.</w:t>
+        <w:t>⚖️ Neutral signal: expanding musculoskeletal patient base is a growth opportunity for MAGRAX, but regenerative medicine momentum and anti-prolonged-NSAID messaging may constrain OTC/ETC volume growth.</w:t>
       </w:r>
     </w:p>
     <w:tbl>
@@ -2368,7 +2368,7 @@
                 <w:color w:val="334155"/>
                 <w:sz w:val="17"/>
               </w:rPr>
-              <w:t>Marketing &amp; Medical Affairs should refresh MAGRAX messaging to emphasize COX-2 selectivity vs. non-selective NSAIDs, targeting the active younger patient segment; ETC Sales team to prioritize detailing at hospitals with rheumatology departments and sports medicine clinics in Q3 2026, ahead of year-end local tender cycles.</w:t>
+              <w:t>Marketing &amp; Medical Affairs should reposition MAGRAX (Etoricoxib) as a "short-to-medium-term acute/subacute pain bridge" solution — leveraging CV and GI safety data vs. older NSAIDs to justify rational prescribing alongside regenerative interventions; develop rheumatology/orthopaedic detailing materials by Q3 2026.</w:t>
             </w:r>
           </w:p>
         </w:tc>
@@ -2442,7 +2442,7 @@
                 <w:color w:val="111827"/>
                 <w:sz w:val="21"/>
               </w:rPr>
-              <w:t>Cell-Level Endoscopy Trend Signals Growing GI Cancer Early Detection Market in Vietnam</w:t>
+              <w:t>Ultra-Magnification Endoscopy Trend for Early GI Cancer Detection: Rising Downstream Treatment Demand</w:t>
             </w:r>
           </w:p>
         </w:tc>
@@ -2461,7 +2461,7 @@
           <w:color w:val="6B7280"/>
           <w:sz w:val="18"/>
         </w:rPr>
-        <w:t>Olympus Endocyto 520x technology — offering cell-level optical magnification — is now deployed at Thu Cúc TCI, marking a shift toward advanced early GI cancer detection in private hospital channels. This trend indirectly expands the treatment funnel for Davipharm's oncology portfolio (HYYR – Erlotinib, LARRIVEY – Bicalutamide) in the ETC segment.[Source]</w:t>
+        <w:t>Olympus Endocyto 520x technology, now deployed at Thu Cúc TCI, enables cellular-level detection of GI cancers, signaling a significant increase in early-stage diagnoses across Vietnam in coming years. Earlier diagnosis translates to a larger patient population entering pharmacological treatment, directly expanding the ETC market for Davipharm's oncology portfolio.[Source]</w:t>
       </w:r>
     </w:p>
     <w:p>
@@ -2474,10 +2474,10 @@
           <w:rFonts w:ascii="Calibri" w:hAnsi="Calibri"/>
           <w:b/>
           <w:i w:val="0"/>
-          <w:color w:val="374151"/>
+          <w:color w:val="166534"/>
           <w:sz w:val="17"/>
         </w:rPr>
-        <w:t>📡 Positive long-term signal: increased early GI cancer detection may expand patient pool for HYYR and LARRIVEY, but near-term ETC revenue impact remains limited.</w:t>
+        <w:t>📈 Mid-term opportunity: increased early-stage GI cancer diagnoses will drive prescription volumes, supporting ETC tender share growth for HYYR (Erlotinib) and LARRIVEY (Bicalutamide).</w:t>
       </w:r>
     </w:p>
     <w:tbl>
@@ -2524,7 +2524,7 @@
                 <w:color w:val="334155"/>
                 <w:sz w:val="17"/>
               </w:rPr>
-              <w:t>Medical Affairs and ETC Sales teams should monitor the expansion of advanced endoscopy centers (Thu Cúc TCI and equivalents) to position HYYR (Erlotinib) and LARRIVEY (Bicalutamide) within early-stage treatment protocols at private facilities adopting new screening technologies; assess product listing opportunities in the next tender cycle.</w:t>
+              <w:t>ETC Marketing and Medical Affairs teams should track the rollout of ultra-magnification endoscopy to provincial hospitals over the next 12 months, prepare MSL materials, and proactively position HYYR and LARRIVEY in oncology formularies at facilities adopting advanced endoscopy — prioritizing TCI-network hospitals and provincial cancer centers.</w:t>
             </w:r>
           </w:p>
         </w:tc>
@@ -4950,7 +4950,7 @@
                 <w:color w:val="111827"/>
                 <w:sz w:val="18"/>
               </w:rPr>
-              <w:t>Prepare PECHAUNOX, TABAREX, EIMLER-10, ZLATKO tender dossiers for district/commune BHYT packages Q3–Q4/2026 aligned with MoH free screening rollout</w:t>
+              <w:t>Prepare post-screening prescribing support for RAVASTEL, EIMLER-10, ZLATKO targeting district hospitals ahead of tender cycle</w:t>
             </w:r>
           </w:p>
         </w:tc>
@@ -4978,7 +4978,7 @@
                 <w:color w:val="003B71"/>
                 <w:sz w:val="17"/>
               </w:rPr>
-              <w:t>Sales / Strategy</w:t>
+              <w:t>Marketing / Medical Affairs</w:t>
             </w:r>
           </w:p>
         </w:tc>
@@ -5006,7 +5006,7 @@
                 <w:color w:val="6B7280"/>
                 <w:sz w:val="17"/>
               </w:rPr>
-              <w:t>MoH Free Annual Health Screening Policy 2026</w:t>
+              <w:t>MoH Free Annual Screening — Chronic Disease Patient Funnel Expansion</w:t>
             </w:r>
           </w:p>
         </w:tc>
@@ -5085,7 +5085,7 @@
                 <w:color w:val="111827"/>
                 <w:sz w:val="18"/>
               </w:rPr>
-              <w:t>Activate Medical Education for PECHAUNOX, HATLOP at primary care facilities on World Hypertension Day May 17</w:t>
+              <w:t>Launch PECHAUNOX FDC detailing around World Hypertension Day 17/5 at provincial hospitals</w:t>
             </w:r>
           </w:p>
         </w:tc>
@@ -5113,7 +5113,7 @@
                 <w:color w:val="003B71"/>
                 <w:sz w:val="17"/>
               </w:rPr>
-              <w:t>Marketing / Sales</w:t>
+              <w:t>Sales / Marketing</w:t>
             </w:r>
           </w:p>
         </w:tc>
@@ -5141,7 +5141,7 @@
                 <w:color w:val="6B7280"/>
                 <w:sz w:val="17"/>
               </w:rPr>
-              <w:t>Hypertension Underdiagnosis in Vietnam</w:t>
+              <w:t>Hypertension Underdiagnosis — FDC Positioning &amp; ETC Tender Opportunity</w:t>
             </w:r>
           </w:p>
         </w:tc>
@@ -5220,7 +5220,7 @@
                 <w:color w:val="111827"/>
                 <w:sz w:val="18"/>
               </w:rPr>
-              <w:t>Refresh MAGRAX (Etoricoxib) COX-2 vs NSAID messaging; detail rheumatology departments ahead of Q4 tender</w:t>
+              <w:t>Detail JIRACEK, MARTAZ at GI departments of Bach Mai &amp; Cho Ray ahead of Q3/2026 tender</w:t>
             </w:r>
           </w:p>
         </w:tc>
@@ -5248,7 +5248,7 @@
                 <w:color w:val="003B71"/>
                 <w:sz w:val="17"/>
               </w:rPr>
-              <w:t>Marketing / Sales</w:t>
+              <w:t>Sales / Medical Affairs</w:t>
             </w:r>
           </w:p>
         </w:tc>
@@ -5276,142 +5276,7 @@
                 <w:color w:val="6B7280"/>
                 <w:sz w:val="17"/>
               </w:rPr>
-              <w:t>Musculoskeletal Disease Rejuvenation &amp; COX-2 Trend</w:t>
-            </w:r>
-          </w:p>
-        </w:tc>
-        <w:tc>
-          <w:tcPr>
-            <w:tcW w:type="dxa" w:w="1644"/>
-            <w:shd w:val="clear" w:color="auto" w:fill="DCFCE7"/>
-            <w:tcBorders>
-              <w:top w:val="none" w:sz="6" w:color="auto"/>
-              <w:bottom w:val="none" w:sz="6" w:color="auto"/>
-              <w:left w:val="none" w:sz="6" w:color="auto"/>
-              <w:right w:val="none" w:sz="6" w:color="auto"/>
-            </w:tcBorders>
-          </w:tcPr>
-          <w:p>
-            <w:pPr>
-              <w:spacing w:before="80" w:after="80"/>
-              <w:jc w:val="center"/>
-            </w:pPr>
-            <w:r>
-              <w:rPr>
-                <w:rFonts w:ascii="Calibri" w:hAnsi="Calibri"/>
-                <w:b/>
-                <w:i w:val="0"/>
-                <w:color w:val="22C55E"/>
-                <w:sz w:val="17"/>
-              </w:rPr>
-              <w:t>🟡 Medium</w:t>
-            </w:r>
-          </w:p>
-        </w:tc>
-      </w:tr>
-      <w:tr>
-        <w:tc>
-          <w:tcPr>
-            <w:tcW w:type="dxa" w:w="454"/>
-            <w:shd w:val="clear" w:color="auto" w:fill="DCFCE7"/>
-            <w:tcBorders>
-              <w:top w:val="none" w:sz="6" w:color="auto"/>
-              <w:bottom w:val="none" w:sz="6" w:color="auto"/>
-              <w:left w:val="none" w:sz="6" w:color="auto"/>
-              <w:right w:val="none" w:sz="6" w:color="auto"/>
-            </w:tcBorders>
-          </w:tcPr>
-          <w:p>
-            <w:pPr>
-              <w:spacing w:before="100" w:after="100"/>
-              <w:jc w:val="center"/>
-            </w:pPr>
-            <w:r>
-              <w:t>🟢</w:t>
-            </w:r>
-          </w:p>
-        </w:tc>
-        <w:tc>
-          <w:tcPr>
-            <w:tcW w:type="dxa" w:w="4422"/>
-            <w:shd w:val="clear" w:color="auto" w:fill="FAFBFF"/>
-            <w:tcBorders>
-              <w:top w:val="none" w:sz="6" w:color="auto"/>
-              <w:bottom w:val="none" w:sz="6" w:color="auto"/>
-              <w:left w:val="none" w:sz="6" w:color="auto"/>
-              <w:right w:val="none" w:sz="6" w:color="auto"/>
-            </w:tcBorders>
-          </w:tcPr>
-          <w:p>
-            <w:pPr>
-              <w:spacing w:before="80" w:after="80"/>
-              <w:ind w:left="85"/>
-            </w:pPr>
-            <w:r>
-              <w:rPr>
-                <w:rFonts w:ascii="Calibri" w:hAnsi="Calibri"/>
-                <w:b/>
-                <w:i w:val="0"/>
-                <w:color w:val="111827"/>
-                <w:sz w:val="18"/>
-              </w:rPr>
-              <w:t>Develop PPI/HP eradication MedAffairs materials; push JIRACEK into Bach Mai &amp; Cho Ray tender lists 2026–2027</w:t>
-            </w:r>
-          </w:p>
-        </w:tc>
-        <w:tc>
-          <w:tcPr>
-            <w:tcW w:type="dxa" w:w="1417"/>
-            <w:shd w:val="clear" w:color="auto" w:fill="FAFBFF"/>
-            <w:tcBorders>
-              <w:top w:val="none" w:sz="6" w:color="auto"/>
-              <w:bottom w:val="none" w:sz="6" w:color="auto"/>
-              <w:left w:val="none" w:sz="6" w:color="auto"/>
-              <w:right w:val="none" w:sz="6" w:color="auto"/>
-            </w:tcBorders>
-          </w:tcPr>
-          <w:p>
-            <w:pPr>
-              <w:spacing w:before="80" w:after="80"/>
-              <w:jc w:val="center"/>
-            </w:pPr>
-            <w:r>
-              <w:rPr>
-                <w:rFonts w:ascii="Calibri" w:hAnsi="Calibri"/>
-                <w:b w:val="0"/>
-                <w:i w:val="0"/>
-                <w:color w:val="003B71"/>
-                <w:sz w:val="17"/>
-              </w:rPr>
-              <w:t>Marketing / Sales</w:t>
-            </w:r>
-          </w:p>
-        </w:tc>
-        <w:tc>
-          <w:tcPr>
-            <w:tcW w:type="dxa" w:w="1134"/>
-            <w:shd w:val="clear" w:color="auto" w:fill="FAFBFF"/>
-            <w:tcBorders>
-              <w:top w:val="none" w:sz="6" w:color="auto"/>
-              <w:bottom w:val="none" w:sz="6" w:color="auto"/>
-              <w:left w:val="none" w:sz="6" w:color="auto"/>
-              <w:right w:val="none" w:sz="6" w:color="auto"/>
-            </w:tcBorders>
-          </w:tcPr>
-          <w:p>
-            <w:pPr>
-              <w:spacing w:before="80" w:after="80"/>
-              <w:jc w:val="center"/>
-            </w:pPr>
-            <w:r>
-              <w:rPr>
-                <w:rFonts w:ascii="Calibri" w:hAnsi="Calibri"/>
-                <w:b w:val="0"/>
-                <w:i w:val="0"/>
-                <w:color w:val="6B7280"/>
-                <w:sz w:val="17"/>
-              </w:rPr>
-              <w:t>Rising HP/Gastric Cancer Awareness — PPI Opportunity</w:t>
+              <w:t>Rising HP/Gastric Cancer Awareness — Long-term PPI ETC Demand</w:t>
             </w:r>
           </w:p>
         </w:tc>

</xml_diff>

<commit_message>
Update report_en.docx 2026-05-16 22:04
</commit_message>
<xml_diff>
--- a/report_en.docx
+++ b/report_en.docx
@@ -201,7 +201,7 @@
                 <w:color w:val="111827"/>
                 <w:sz w:val="19"/>
               </w:rPr>
-              <w:t>12/05 – 18/05/2026</w:t>
+              <w:t>09/05 – 16/05/2026</w:t>
             </w:r>
           </w:p>
         </w:tc>
@@ -258,7 +258,7 @@
                 <w:color w:val="111827"/>
                 <w:sz w:val="19"/>
               </w:rPr>
-              <w:t>13/05/2026</w:t>
+              <w:t>16/05/2026</w:t>
             </w:r>
           </w:p>
         </w:tc>
@@ -303,52 +303,6 @@
         <w:t>EXECUTIVE SUMMARY</w:t>
       </w:r>
     </w:p>
-    <w:tbl>
-      <w:tblPr>
-        <w:tblStyle w:val="TableGrid"/>
-        <w:tblW w:type="auto" w:w="0"/>
-        <w:jc w:val="left"/>
-        <w:tblLook w:firstColumn="1" w:firstRow="1" w:lastColumn="0" w:lastRow="0" w:noHBand="0" w:noVBand="1" w:val="04A0"/>
-      </w:tblPr>
-      <w:tblGrid>
-        <w:gridCol w:w="9072"/>
-      </w:tblGrid>
-      <w:tr>
-        <w:tc>
-          <w:tcPr>
-            <w:tcW w:type="dxa" w:w="9071"/>
-            <w:shd w:val="clear" w:color="auto" w:fill="EFF6FF"/>
-            <w:tcBorders>
-              <w:top w:val="none" w:sz="6" w:color="auto"/>
-              <w:bottom w:val="none" w:sz="6" w:color="auto"/>
-              <w:left w:val="single" w:sz="18" w:color="0056D2"/>
-              <w:right w:val="none" w:sz="6" w:color="auto"/>
-            </w:tcBorders>
-          </w:tcPr>
-          <w:p>
-            <w:pPr>
-              <w:spacing w:before="80" w:after="80"/>
-              <w:ind w:left="170"/>
-            </w:pPr>
-            <w:r>
-              <w:rPr>
-                <w:rFonts w:ascii="Calibri" w:hAnsi="Calibri"/>
-                <w:b/>
-                <w:i w:val="0"/>
-                <w:color w:val="111827"/>
-                <w:sz w:val="20"/>
-              </w:rPr>
-              <w:t>Week 11–17 May 2026: MoH's free annual health screening rollout and rising chronic disease awareness create the strongest long-term demand tailwind to date across Davipharm's cardiovascular, diabetes, GI, and oncology portfolios — no direct regulatory risk this week.</w:t>
-            </w:r>
-          </w:p>
-        </w:tc>
-      </w:tr>
-    </w:tbl>
-    <w:p>
-      <w:pPr>
-        <w:spacing w:before="80"/>
-      </w:pPr>
-    </w:p>
     <w:p>
       <w:pPr>
         <w:spacing w:after="80"/>
@@ -391,54 +345,6 @@
                 <w:sz w:val="17"/>
               </w:rPr>
               <w:t>💡  KEY INSIGHTS</w:t>
-            </w:r>
-          </w:p>
-          <w:p>
-            <w:pPr>
-              <w:spacing w:before="20" w:after="60"/>
-              <w:ind w:left="142"/>
-            </w:pPr>
-            <w:r>
-              <w:rPr>
-                <w:rFonts w:ascii="Calibri" w:hAnsi="Calibri"/>
-                <w:b w:val="0"/>
-                <w:i w:val="0"/>
-                <w:color w:val="111827"/>
-                <w:sz w:val="17"/>
-              </w:rPr>
-              <w:t>▸  National Free Screening (MoH):Annual free health checks from 2026 will materially expand the new patient funnel for RAVASTEL, EIMLER-10, ZLATKO, PECHAUNOX, TABAREX, and HATLOP — highest volume impact expected at district-level ETC.</w:t>
-            </w:r>
-          </w:p>
-          <w:p>
-            <w:pPr>
-              <w:spacing w:before="20" w:after="60"/>
-              <w:ind w:left="142"/>
-            </w:pPr>
-            <w:r>
-              <w:rPr>
-                <w:rFonts w:ascii="Calibri" w:hAnsi="Calibri"/>
-                <w:b w:val="0"/>
-                <w:i w:val="0"/>
-                <w:color w:val="111827"/>
-                <w:sz w:val="17"/>
-              </w:rPr>
-              <w:t>▸  Hypertension Underdiagnosis:25–30% uncontrolled adult hypertension prevalence and younger-onset trend reinforce PECHAUNOX (FDC) positioning ahead of the next tender cycle.</w:t>
-            </w:r>
-          </w:p>
-          <w:p>
-            <w:pPr>
-              <w:spacing w:before="20" w:after="60"/>
-              <w:ind w:left="142"/>
-            </w:pPr>
-            <w:r>
-              <w:rPr>
-                <w:rFonts w:ascii="Calibri" w:hAnsi="Calibri"/>
-                <w:b w:val="0"/>
-                <w:i w:val="0"/>
-                <w:color w:val="111827"/>
-                <w:sz w:val="17"/>
-              </w:rPr>
-              <w:t>▸  GI Cancer + H. pylori:Expanding ultra-magnification endoscopy and rising HP/gastric cancer awareness simultaneously drive mid-term demand for HYYR/LARRIVEY (oncology) and JIRACEK/MARTAZ (PPI) at central hospitals.</w:t>
             </w:r>
           </w:p>
         </w:tc>
@@ -777,7 +683,7 @@
         <w:tc>
           <w:tcPr>
             <w:tcW w:type="dxa" w:w="1701"/>
-            <w:shd w:val="clear" w:color="auto" w:fill="DCFCE7"/>
+            <w:shd w:val="clear" w:color="auto" w:fill="E9FBF0"/>
             <w:tcBorders>
               <w:top w:val="none" w:sz="6" w:color="auto"/>
               <w:bottom w:val="none" w:sz="6" w:color="auto"/>
@@ -793,19 +699,19 @@
             <w:r>
               <w:rPr>
                 <w:rFonts w:ascii="Calibri" w:hAnsi="Calibri"/>
-                <w:b/>
+                <w:b w:val="0"/>
                 <w:i w:val="0"/>
-                <w:color w:val="166534"/>
+                <w:color w:val="CCCCCC"/>
                 <w:sz w:val="22"/>
               </w:rPr>
-              <w:t>4</w:t>
+              <w:t>—</w:t>
             </w:r>
           </w:p>
         </w:tc>
         <w:tc>
           <w:tcPr>
             <w:tcW w:type="dxa" w:w="1984"/>
-            <w:shd w:val="clear" w:color="auto" w:fill="F3F4F6"/>
+            <w:shd w:val="clear" w:color="auto" w:fill="F9FAFB"/>
             <w:tcBorders>
               <w:top w:val="none" w:sz="6" w:color="auto"/>
               <w:bottom w:val="none" w:sz="6" w:color="auto"/>
@@ -821,12 +727,12 @@
             <w:r>
               <w:rPr>
                 <w:rFonts w:ascii="Calibri" w:hAnsi="Calibri"/>
-                <w:b/>
+                <w:b w:val="0"/>
                 <w:i w:val="0"/>
-                <w:color w:val="374151"/>
+                <w:color w:val="CCCCCC"/>
                 <w:sz w:val="22"/>
               </w:rPr>
-              <w:t>6</w:t>
+              <w:t>—</w:t>
             </w:r>
           </w:p>
         </w:tc>
@@ -1025,1516 +931,6 @@
         <w:t>PHARMA INDUSTRY NEWS</w:t>
       </w:r>
     </w:p>
-    <w:tbl>
-      <w:tblPr>
-        <w:tblStyle w:val="TableGrid"/>
-        <w:tblW w:type="auto" w:w="0"/>
-        <w:jc w:val="left"/>
-        <w:tblLook w:firstColumn="1" w:firstRow="1" w:lastColumn="0" w:lastRow="0" w:noHBand="0" w:noVBand="1" w:val="04A0"/>
-      </w:tblPr>
-      <w:tblGrid>
-        <w:gridCol w:w="4536"/>
-        <w:gridCol w:w="4536"/>
-      </w:tblGrid>
-      <w:tr>
-        <w:tc>
-          <w:tcPr>
-            <w:tcW w:type="dxa" w:w="1984"/>
-            <w:shd w:val="clear" w:color="auto" w:fill="EEF2FF"/>
-            <w:tcBorders>
-              <w:top w:val="none" w:sz="6" w:color="auto"/>
-              <w:bottom w:val="none" w:sz="6" w:color="auto"/>
-              <w:left w:val="none" w:sz="6" w:color="auto"/>
-              <w:right w:val="none" w:sz="6" w:color="auto"/>
-            </w:tcBorders>
-          </w:tcPr>
-          <w:p>
-            <w:pPr>
-              <w:spacing w:before="80" w:after="80"/>
-              <w:ind w:left="85"/>
-            </w:pPr>
-            <w:r>
-              <w:rPr>
-                <w:rFonts w:ascii="Calibri" w:hAnsi="Calibri"/>
-                <w:b/>
-                <w:i w:val="0"/>
-                <w:color w:val="4338CA"/>
-                <w:sz w:val="15"/>
-              </w:rPr>
-              <w:t>DÂN TRÍ – SỨC KHỎE</w:t>
-            </w:r>
-          </w:p>
-        </w:tc>
-        <w:tc>
-          <w:tcPr>
-            <w:tcW w:type="dxa" w:w="4536"/>
-            <w:tcBorders>
-              <w:top w:val="none" w:sz="6" w:color="auto"/>
-              <w:bottom w:val="none" w:sz="6" w:color="auto"/>
-              <w:left w:val="none" w:sz="6" w:color="auto"/>
-              <w:right w:val="none" w:sz="6" w:color="auto"/>
-            </w:tcBorders>
-          </w:tcPr>
-          <w:p>
-            <w:pPr>
-              <w:spacing w:before="60" w:after="60"/>
-              <w:ind w:left="113"/>
-            </w:pPr>
-            <w:r>
-              <w:rPr>
-                <w:rFonts w:ascii="Calibri" w:hAnsi="Calibri"/>
-                <w:b/>
-                <w:i w:val="0"/>
-                <w:color w:val="111827"/>
-                <w:sz w:val="21"/>
-              </w:rPr>
-              <w:t>Rising Public Awareness of Gastric Cancer &amp; H. pylori — Opportunity Signal for GI Portfolio (Esomeprazole, Rabeprazole)</w:t>
-            </w:r>
-          </w:p>
-        </w:tc>
-      </w:tr>
-    </w:tbl>
-    <w:p>
-      <w:pPr>
-        <w:spacing w:before="40" w:after="40"/>
-        <w:ind w:left="170"/>
-      </w:pPr>
-      <w:r>
-        <w:rPr>
-          <w:rFonts w:ascii="Calibri" w:hAnsi="Calibri"/>
-          <w:b w:val="0"/>
-          <w:i/>
-          <w:color w:val="6B7280"/>
-          <w:sz w:val="18"/>
-        </w:rPr>
-        <w:t>A medical advisory article from Bach Mai Hospital (via Dan Tri) highlights H. pylori's role in the gastritis-to-cancer progression cascade and recommends early endoscopy and chronic GI management — reflecting growing long-term PPI demand in Vietnam. This represents a positive market signal for JIRACEK (Esomeprazole) and MARTAZ (Rabeprazole) in chronic gastric patient segments across ETC and OPD channels.[Source]</w:t>
-      </w:r>
-    </w:p>
-    <w:p>
-      <w:pPr>
-        <w:spacing w:before="20" w:after="40"/>
-        <w:ind w:left="170"/>
-      </w:pPr>
-      <w:r>
-        <w:rPr>
-          <w:rFonts w:ascii="Calibri" w:hAnsi="Calibri"/>
-          <w:b/>
-          <w:i w:val="0"/>
-          <w:color w:val="166534"/>
-          <w:sz w:val="17"/>
-        </w:rPr>
-        <w:t>📈 Growing HP/gastric cancer awareness drives long-term PPI prescription demand — a growth opportunity for JIRACEK and MARTAZ across central and provincial hospital tenders.</w:t>
-      </w:r>
-    </w:p>
-    <w:tbl>
-      <w:tblPr>
-        <w:tblStyle w:val="TableGrid"/>
-        <w:tblW w:type="auto" w:w="0"/>
-        <w:tblLook w:firstColumn="1" w:firstRow="1" w:lastColumn="0" w:lastRow="0" w:noHBand="0" w:noVBand="1" w:val="04A0"/>
-      </w:tblPr>
-      <w:tblGrid>
-        <w:gridCol w:w="9072"/>
-      </w:tblGrid>
-      <w:tr>
-        <w:tc>
-          <w:tcPr>
-            <w:tcW w:type="dxa" w:w="9072"/>
-            <w:shd w:val="clear" w:color="auto" w:fill="F8FAFC"/>
-            <w:tcBorders>
-              <w:top w:val="none" w:sz="6" w:color="auto"/>
-              <w:bottom w:val="none" w:sz="6" w:color="auto"/>
-              <w:left w:val="single" w:sz="12" w:color="003B71"/>
-              <w:right w:val="none" w:sz="6" w:color="auto"/>
-            </w:tcBorders>
-          </w:tcPr>
-          <w:p>
-            <w:pPr>
-              <w:spacing w:before="60" w:after="60"/>
-              <w:ind w:left="142"/>
-            </w:pPr>
-            <w:r>
-              <w:rPr>
-                <w:rFonts w:ascii="Calibri" w:hAnsi="Calibri"/>
-                <w:b/>
-                <w:i w:val="0"/>
-                <w:color w:val="003B71"/>
-                <w:sz w:val="17"/>
-              </w:rPr>
-              <w:t xml:space="preserve">Strategy  </w:t>
-            </w:r>
-            <w:r>
-              <w:rPr>
-                <w:rFonts w:ascii="Calibri" w:hAnsi="Calibri"/>
-                <w:b w:val="0"/>
-                <w:i w:val="0"/>
-                <w:color w:val="334155"/>
-                <w:sz w:val="17"/>
-              </w:rPr>
-              <w:t>Medical Team and ETC Sales to prepare detailing materials emphasizing PPI's role in H. pylori eradication regimens (PPI + antibiotic combinations) and ulcer relapse prevention; prioritize engagement with GI-Hepatology departments at key central hospitals (Bach Mai, Cho Ray, Hue) in Q2–Q3/2026 to position JIRACEK and MARTAZ ahead of the next tender cycle.</w:t>
-            </w:r>
-          </w:p>
-        </w:tc>
-      </w:tr>
-    </w:tbl>
-    <w:p>
-      <w:pPr>
-        <w:spacing w:before="40" w:after="120"/>
-      </w:pPr>
-    </w:p>
-    <w:tbl>
-      <w:tblPr>
-        <w:tblStyle w:val="TableGrid"/>
-        <w:tblW w:type="auto" w:w="0"/>
-        <w:jc w:val="left"/>
-        <w:tblLook w:firstColumn="1" w:firstRow="1" w:lastColumn="0" w:lastRow="0" w:noHBand="0" w:noVBand="1" w:val="04A0"/>
-      </w:tblPr>
-      <w:tblGrid>
-        <w:gridCol w:w="4536"/>
-        <w:gridCol w:w="4536"/>
-      </w:tblGrid>
-      <w:tr>
-        <w:tc>
-          <w:tcPr>
-            <w:tcW w:type="dxa" w:w="1984"/>
-            <w:shd w:val="clear" w:color="auto" w:fill="EEF2FF"/>
-            <w:tcBorders>
-              <w:top w:val="none" w:sz="6" w:color="auto"/>
-              <w:bottom w:val="none" w:sz="6" w:color="auto"/>
-              <w:left w:val="none" w:sz="6" w:color="auto"/>
-              <w:right w:val="none" w:sz="6" w:color="auto"/>
-            </w:tcBorders>
-          </w:tcPr>
-          <w:p>
-            <w:pPr>
-              <w:spacing w:before="80" w:after="80"/>
-              <w:ind w:left="85"/>
-            </w:pPr>
-            <w:r>
-              <w:rPr>
-                <w:rFonts w:ascii="Calibri" w:hAnsi="Calibri"/>
-                <w:b/>
-                <w:i w:val="0"/>
-                <w:color w:val="4338CA"/>
-                <w:sz w:val="15"/>
-              </w:rPr>
-              <w:t>DÂN TRÍ – SỨC KHỎE</w:t>
-            </w:r>
-          </w:p>
-        </w:tc>
-        <w:tc>
-          <w:tcPr>
-            <w:tcW w:type="dxa" w:w="4536"/>
-            <w:tcBorders>
-              <w:top w:val="none" w:sz="6" w:color="auto"/>
-              <w:bottom w:val="none" w:sz="6" w:color="auto"/>
-              <w:left w:val="none" w:sz="6" w:color="auto"/>
-              <w:right w:val="none" w:sz="6" w:color="auto"/>
-            </w:tcBorders>
-          </w:tcPr>
-          <w:p>
-            <w:pPr>
-              <w:spacing w:before="60" w:after="60"/>
-              <w:ind w:left="113"/>
-            </w:pPr>
-            <w:r>
-              <w:rPr>
-                <w:rFonts w:ascii="Calibri" w:hAnsi="Calibri"/>
-                <w:b/>
-                <w:i w:val="0"/>
-                <w:color w:val="111827"/>
-                <w:sz w:val="21"/>
-              </w:rPr>
-              <w:t>Cicada Shell Seizure at Lang Son — Traditional Medicine Raw Material Market Signal</w:t>
-            </w:r>
-          </w:p>
-        </w:tc>
-      </w:tr>
-    </w:tbl>
-    <w:p>
-      <w:pPr>
-        <w:spacing w:before="40" w:after="40"/>
-        <w:ind w:left="170"/>
-      </w:pPr>
-      <w:r>
-        <w:rPr>
-          <w:rFonts w:ascii="Calibri" w:hAnsi="Calibri"/>
-          <w:b w:val="0"/>
-          <w:i/>
-          <w:color w:val="6B7280"/>
-          <w:sz w:val="18"/>
-        </w:rPr>
-        <w:t>Lang Son market authorities seized 80kg of dried cicada shells lacking documentation, reflecting surging demand for traditional medicine raw materials at VND 1.2–1.7M/kg. This article covers the TCM herbal segment and has no direct relevance to Davipharm's generic pharmaceutical portfolio.[Source]</w:t>
-      </w:r>
-    </w:p>
-    <w:p>
-      <w:pPr>
-        <w:spacing w:before="20" w:after="40"/>
-        <w:ind w:left="170"/>
-      </w:pPr>
-      <w:r>
-        <w:rPr>
-          <w:rFonts w:ascii="Calibri" w:hAnsi="Calibri"/>
-          <w:b/>
-          <w:i w:val="0"/>
-          <w:color w:val="374151"/>
-          <w:sz w:val="17"/>
-        </w:rPr>
-        <w:t>⚪ No direct impact on Davipharm — article falls entirely outside the company's current synthetic generic product competitive space.</w:t>
-      </w:r>
-    </w:p>
-    <w:tbl>
-      <w:tblPr>
-        <w:tblStyle w:val="TableGrid"/>
-        <w:tblW w:type="auto" w:w="0"/>
-        <w:tblLook w:firstColumn="1" w:firstRow="1" w:lastColumn="0" w:lastRow="0" w:noHBand="0" w:noVBand="1" w:val="04A0"/>
-      </w:tblPr>
-      <w:tblGrid>
-        <w:gridCol w:w="9072"/>
-      </w:tblGrid>
-      <w:tr>
-        <w:tc>
-          <w:tcPr>
-            <w:tcW w:type="dxa" w:w="9072"/>
-            <w:shd w:val="clear" w:color="auto" w:fill="F8FAFC"/>
-            <w:tcBorders>
-              <w:top w:val="none" w:sz="6" w:color="auto"/>
-              <w:bottom w:val="none" w:sz="6" w:color="auto"/>
-              <w:left w:val="single" w:sz="12" w:color="003B71"/>
-              <w:right w:val="none" w:sz="6" w:color="auto"/>
-            </w:tcBorders>
-          </w:tcPr>
-          <w:p>
-            <w:pPr>
-              <w:spacing w:before="60" w:after="60"/>
-              <w:ind w:left="142"/>
-            </w:pPr>
-            <w:r>
-              <w:rPr>
-                <w:rFonts w:ascii="Calibri" w:hAnsi="Calibri"/>
-                <w:b/>
-                <w:i w:val="0"/>
-                <w:color w:val="003B71"/>
-                <w:sz w:val="17"/>
-              </w:rPr>
-              <w:t xml:space="preserve">Strategy  </w:t>
-            </w:r>
-            <w:r>
-              <w:rPr>
-                <w:rFonts w:ascii="Calibri" w:hAnsi="Calibri"/>
-                <w:b w:val="0"/>
-                <w:i w:val="0"/>
-                <w:color w:val="334155"/>
-                <w:sz w:val="17"/>
-              </w:rPr>
-              <w:t>No action required. Market Intelligence team to file as background reference on TCM consumer trends in Vietnam; no further monitoring priority warranted.</w:t>
-            </w:r>
-          </w:p>
-        </w:tc>
-      </w:tr>
-    </w:tbl>
-    <w:p>
-      <w:pPr>
-        <w:spacing w:before="40" w:after="120"/>
-      </w:pPr>
-    </w:p>
-    <w:tbl>
-      <w:tblPr>
-        <w:tblStyle w:val="TableGrid"/>
-        <w:tblW w:type="auto" w:w="0"/>
-        <w:jc w:val="left"/>
-        <w:tblLook w:firstColumn="1" w:firstRow="1" w:lastColumn="0" w:lastRow="0" w:noHBand="0" w:noVBand="1" w:val="04A0"/>
-      </w:tblPr>
-      <w:tblGrid>
-        <w:gridCol w:w="4536"/>
-        <w:gridCol w:w="4536"/>
-      </w:tblGrid>
-      <w:tr>
-        <w:tc>
-          <w:tcPr>
-            <w:tcW w:type="dxa" w:w="1984"/>
-            <w:shd w:val="clear" w:color="auto" w:fill="EEF2FF"/>
-            <w:tcBorders>
-              <w:top w:val="none" w:sz="6" w:color="auto"/>
-              <w:bottom w:val="none" w:sz="6" w:color="auto"/>
-              <w:left w:val="none" w:sz="6" w:color="auto"/>
-              <w:right w:val="none" w:sz="6" w:color="auto"/>
-            </w:tcBorders>
-          </w:tcPr>
-          <w:p>
-            <w:pPr>
-              <w:spacing w:before="80" w:after="80"/>
-              <w:ind w:left="85"/>
-            </w:pPr>
-            <w:r>
-              <w:rPr>
-                <w:rFonts w:ascii="Calibri" w:hAnsi="Calibri"/>
-                <w:b/>
-                <w:i w:val="0"/>
-                <w:color w:val="4338CA"/>
-                <w:sz w:val="15"/>
-              </w:rPr>
-              <w:t>DÂN TRÍ – SỨC KHỎE</w:t>
-            </w:r>
-          </w:p>
-        </w:tc>
-        <w:tc>
-          <w:tcPr>
-            <w:tcW w:type="dxa" w:w="4536"/>
-            <w:tcBorders>
-              <w:top w:val="none" w:sz="6" w:color="auto"/>
-              <w:bottom w:val="none" w:sz="6" w:color="auto"/>
-              <w:left w:val="none" w:sz="6" w:color="auto"/>
-              <w:right w:val="none" w:sz="6" w:color="auto"/>
-            </w:tcBorders>
-          </w:tcPr>
-          <w:p>
-            <w:pPr>
-              <w:spacing w:before="60" w:after="60"/>
-              <w:ind w:left="113"/>
-            </w:pPr>
-            <w:r>
-              <w:rPr>
-                <w:rFonts w:ascii="Calibri" w:hAnsi="Calibri"/>
-                <w:b/>
-                <w:i w:val="0"/>
-                <w:color w:val="111827"/>
-                <w:sz w:val="21"/>
-              </w:rPr>
-              <w:t>Lidocaine Toxicity Post-Liposuction Highlights Crackdown Risk on Unlicensed Aesthetic Clinics</w:t>
-            </w:r>
-          </w:p>
-        </w:tc>
-      </w:tr>
-    </w:tbl>
-    <w:p>
-      <w:pPr>
-        <w:spacing w:before="40" w:after="40"/>
-        <w:ind w:left="170"/>
-      </w:pPr>
-      <w:r>
-        <w:rPr>
-          <w:rFonts w:ascii="Calibri" w:hAnsi="Calibri"/>
-          <w:b w:val="0"/>
-          <w:i/>
-          <w:color w:val="6B7280"/>
-          <w:sz w:val="18"/>
-        </w:rPr>
-        <w:t>A 53-year-old woman fell into a deep coma after Lidocaine toxicity during liposuction at an unlicensed HCMC clinic, with the case escalated to the city's Department of Health; a May 12 safety forum cited 25,000–35,000 aesthetic complication cases annually and urged stricter enforcement. While no Davipharm product was implicated, an anticipated regulatory crackdown on outpatient aesthetic procedures could tighten prescribing conditions for post-surgical analgesics — a segment where MAGRAX (Etoricoxib) and METILONE-4 (Methylprednisolone) are deployed.[Source]</w:t>
-      </w:r>
-    </w:p>
-    <w:p>
-      <w:pPr>
-        <w:spacing w:before="20" w:after="40"/>
-        <w:ind w:left="170"/>
-      </w:pPr>
-      <w:r>
-        <w:rPr>
-          <w:rFonts w:ascii="Calibri" w:hAnsi="Calibri"/>
-          <w:b/>
-          <w:i w:val="0"/>
-          <w:color w:val="374151"/>
-          <w:sz w:val="17"/>
-        </w:rPr>
-        <w:t>⚠️ Low-level indirect exposure: tightening oversight of private aesthetic clinics may reduce OPD prescriptions of MAGRAX/METILONE-4 if facilities face suspension following enforcement actions.</w:t>
-      </w:r>
-    </w:p>
-    <w:p>
-      <w:pPr>
-        <w:spacing w:before="40" w:after="120"/>
-      </w:pPr>
-    </w:p>
-    <w:tbl>
-      <w:tblPr>
-        <w:tblStyle w:val="TableGrid"/>
-        <w:tblW w:type="auto" w:w="0"/>
-        <w:jc w:val="left"/>
-        <w:tblLook w:firstColumn="1" w:firstRow="1" w:lastColumn="0" w:lastRow="0" w:noHBand="0" w:noVBand="1" w:val="04A0"/>
-      </w:tblPr>
-      <w:tblGrid>
-        <w:gridCol w:w="4536"/>
-        <w:gridCol w:w="4536"/>
-      </w:tblGrid>
-      <w:tr>
-        <w:tc>
-          <w:tcPr>
-            <w:tcW w:type="dxa" w:w="1984"/>
-            <w:shd w:val="clear" w:color="auto" w:fill="EEF2FF"/>
-            <w:tcBorders>
-              <w:top w:val="none" w:sz="6" w:color="auto"/>
-              <w:bottom w:val="none" w:sz="6" w:color="auto"/>
-              <w:left w:val="none" w:sz="6" w:color="auto"/>
-              <w:right w:val="none" w:sz="6" w:color="auto"/>
-            </w:tcBorders>
-          </w:tcPr>
-          <w:p>
-            <w:pPr>
-              <w:spacing w:before="80" w:after="80"/>
-              <w:ind w:left="85"/>
-            </w:pPr>
-            <w:r>
-              <w:rPr>
-                <w:rFonts w:ascii="Calibri" w:hAnsi="Calibri"/>
-                <w:b/>
-                <w:i w:val="0"/>
-                <w:color w:val="4338CA"/>
-                <w:sz w:val="15"/>
-              </w:rPr>
-              <w:t>DÂN TRÍ – SỨC KHỎE</w:t>
-            </w:r>
-          </w:p>
-        </w:tc>
-        <w:tc>
-          <w:tcPr>
-            <w:tcW w:type="dxa" w:w="4536"/>
-            <w:tcBorders>
-              <w:top w:val="none" w:sz="6" w:color="auto"/>
-              <w:bottom w:val="none" w:sz="6" w:color="auto"/>
-              <w:left w:val="none" w:sz="6" w:color="auto"/>
-              <w:right w:val="none" w:sz="6" w:color="auto"/>
-            </w:tcBorders>
-          </w:tcPr>
-          <w:p>
-            <w:pPr>
-              <w:spacing w:before="60" w:after="60"/>
-              <w:ind w:left="113"/>
-            </w:pPr>
-            <w:r>
-              <w:rPr>
-                <w:rFonts w:ascii="Calibri" w:hAnsi="Calibri"/>
-                <w:b/>
-                <w:i w:val="0"/>
-                <w:color w:val="111827"/>
-                <w:sz w:val="21"/>
-              </w:rPr>
-              <w:t>Piperine in Black Pepper: Cardiovascular &amp; Lipid Metabolism Benefits — Drug Interaction Caution Noted</w:t>
-            </w:r>
-          </w:p>
-        </w:tc>
-      </w:tr>
-    </w:tbl>
-    <w:p>
-      <w:pPr>
-        <w:spacing w:before="40" w:after="40"/>
-        <w:ind w:left="170"/>
-      </w:pPr>
-      <w:r>
-        <w:rPr>
-          <w:rFonts w:ascii="Calibri" w:hAnsi="Calibri"/>
-          <w:b w:val="0"/>
-          <w:i/>
-          <w:color w:val="6B7280"/>
-          <w:sz w:val="18"/>
-        </w:rPr>
-        <w:t>A health-science article highlights piperine's potential to improve lipid profiles (reduce LDL, raise HDL) and support energy metabolism, while warning of drug metabolism interference — relevant to patients on anticoagulants or chronic cardiovascular medications. This has no direct tender impact for Davipharm, but signals consumer interest in natural cardiovascular-lipid adjuncts alongside pharmaceuticals.[Source]</w:t>
-      </w:r>
-    </w:p>
-    <w:p>
-      <w:pPr>
-        <w:spacing w:before="20" w:after="40"/>
-        <w:ind w:left="170"/>
-      </w:pPr>
-      <w:r>
-        <w:rPr>
-          <w:rFonts w:ascii="Calibri" w:hAnsi="Calibri"/>
-          <w:b/>
-          <w:i w:val="0"/>
-          <w:color w:val="374151"/>
-          <w:sz w:val="17"/>
-        </w:rPr>
-        <w:t>➖ No direct business impact on Davipharm; however, the piperine–cardiovascular drug interaction warning could be leveraged in medical education content supporting RAVASTEL (Rosuvastatin) and ZABALES (Clopidogrel).</w:t>
-      </w:r>
-    </w:p>
-    <w:tbl>
-      <w:tblPr>
-        <w:tblStyle w:val="TableGrid"/>
-        <w:tblW w:type="auto" w:w="0"/>
-        <w:tblLook w:firstColumn="1" w:firstRow="1" w:lastColumn="0" w:lastRow="0" w:noHBand="0" w:noVBand="1" w:val="04A0"/>
-      </w:tblPr>
-      <w:tblGrid>
-        <w:gridCol w:w="9072"/>
-      </w:tblGrid>
-      <w:tr>
-        <w:tc>
-          <w:tcPr>
-            <w:tcW w:type="dxa" w:w="9072"/>
-            <w:shd w:val="clear" w:color="auto" w:fill="F8FAFC"/>
-            <w:tcBorders>
-              <w:top w:val="none" w:sz="6" w:color="auto"/>
-              <w:bottom w:val="none" w:sz="6" w:color="auto"/>
-              <w:left w:val="single" w:sz="12" w:color="003B71"/>
-              <w:right w:val="none" w:sz="6" w:color="auto"/>
-            </w:tcBorders>
-          </w:tcPr>
-          <w:p>
-            <w:pPr>
-              <w:spacing w:before="60" w:after="60"/>
-              <w:ind w:left="142"/>
-            </w:pPr>
-            <w:r>
-              <w:rPr>
-                <w:rFonts w:ascii="Calibri" w:hAnsi="Calibri"/>
-                <w:b/>
-                <w:i w:val="0"/>
-                <w:color w:val="003B71"/>
-                <w:sz w:val="17"/>
-              </w:rPr>
-              <w:t xml:space="preserve">Strategy  </w:t>
-            </w:r>
-            <w:r>
-              <w:rPr>
-                <w:rFonts w:ascii="Calibri" w:hAnsi="Calibri"/>
-                <w:b w:val="0"/>
-                <w:i w:val="0"/>
-                <w:color w:val="334155"/>
-                <w:sz w:val="17"/>
-              </w:rPr>
-              <w:t>Medical Affairs team may integrate piperine interaction data into rep training materials for the cardiovascular portfolio (RAVASTEL, ZABALES, PECHAUNOX) to reinforce the clinical necessity of prescription lipid management over natural alternatives; implement within 1 month as routine supplementary content.</w:t>
-            </w:r>
-          </w:p>
-        </w:tc>
-      </w:tr>
-    </w:tbl>
-    <w:p>
-      <w:pPr>
-        <w:spacing w:before="40" w:after="120"/>
-      </w:pPr>
-    </w:p>
-    <w:tbl>
-      <w:tblPr>
-        <w:tblStyle w:val="TableGrid"/>
-        <w:tblW w:type="auto" w:w="0"/>
-        <w:jc w:val="left"/>
-        <w:tblLook w:firstColumn="1" w:firstRow="1" w:lastColumn="0" w:lastRow="0" w:noHBand="0" w:noVBand="1" w:val="04A0"/>
-      </w:tblPr>
-      <w:tblGrid>
-        <w:gridCol w:w="4536"/>
-        <w:gridCol w:w="4536"/>
-      </w:tblGrid>
-      <w:tr>
-        <w:tc>
-          <w:tcPr>
-            <w:tcW w:type="dxa" w:w="1984"/>
-            <w:shd w:val="clear" w:color="auto" w:fill="EEF2FF"/>
-            <w:tcBorders>
-              <w:top w:val="none" w:sz="6" w:color="auto"/>
-              <w:bottom w:val="none" w:sz="6" w:color="auto"/>
-              <w:left w:val="none" w:sz="6" w:color="auto"/>
-              <w:right w:val="none" w:sz="6" w:color="auto"/>
-            </w:tcBorders>
-          </w:tcPr>
-          <w:p>
-            <w:pPr>
-              <w:spacing w:before="80" w:after="80"/>
-              <w:ind w:left="85"/>
-            </w:pPr>
-            <w:r>
-              <w:rPr>
-                <w:rFonts w:ascii="Calibri" w:hAnsi="Calibri"/>
-                <w:b/>
-                <w:i w:val="0"/>
-                <w:color w:val="4338CA"/>
-                <w:sz w:val="15"/>
-              </w:rPr>
-              <w:t>DÂN TRÍ – SỨC KHỎE</w:t>
-            </w:r>
-          </w:p>
-        </w:tc>
-        <w:tc>
-          <w:tcPr>
-            <w:tcW w:type="dxa" w:w="4536"/>
-            <w:tcBorders>
-              <w:top w:val="none" w:sz="6" w:color="auto"/>
-              <w:bottom w:val="none" w:sz="6" w:color="auto"/>
-              <w:left w:val="none" w:sz="6" w:color="auto"/>
-              <w:right w:val="none" w:sz="6" w:color="auto"/>
-            </w:tcBorders>
-          </w:tcPr>
-          <w:p>
-            <w:pPr>
-              <w:spacing w:before="60" w:after="60"/>
-              <w:ind w:left="113"/>
-            </w:pPr>
-            <w:r>
-              <w:rPr>
-                <w:rFonts w:ascii="Calibri" w:hAnsi="Calibri"/>
-                <w:b/>
-                <w:i w:val="0"/>
-                <w:color w:val="111827"/>
-                <w:sz w:val="21"/>
-              </w:rPr>
-              <w:t>MoH Launches Annual Free Health Check Framework — Potential Screening Uptick for Chronic Disease Portfolio</w:t>
-            </w:r>
-          </w:p>
-        </w:tc>
-      </w:tr>
-    </w:tbl>
-    <w:p>
-      <w:pPr>
-        <w:spacing w:before="40" w:after="40"/>
-        <w:ind w:left="170"/>
-      </w:pPr>
-      <w:r>
-        <w:rPr>
-          <w:rFonts w:ascii="Calibri" w:hAnsi="Calibri"/>
-          <w:b w:val="0"/>
-          <w:i/>
-          <w:color w:val="6B7280"/>
-          <w:sz w:val="18"/>
-        </w:rPr>
-        <w:t>Vietnam's MoH has issued clinical guidelines for free annual health screenings for all citizens aged 18+, including blood glucose, biochemistry, and chest X-ray — sufficient to detect diabetes and cardiovascular risk at population scale. This policy is expected to significantly expand the diagnosed patient pool for RAVASTEL (Rosuvastatin), EIMLER-10 (Empagliflozin), ZLATKO (Sitagliptin), PECHAUNOX, TABAREX, and HATLOP.[Source]</w:t>
-      </w:r>
-    </w:p>
-    <w:p>
-      <w:pPr>
-        <w:spacing w:before="20" w:after="40"/>
-        <w:ind w:left="170"/>
-      </w:pPr>
-      <w:r>
-        <w:rPr>
-          <w:rFonts w:ascii="Calibri" w:hAnsi="Calibri"/>
-          <w:b/>
-          <w:i w:val="0"/>
-          <w:color w:val="166534"/>
-          <w:sz w:val="17"/>
-        </w:rPr>
-        <w:t>🟢 Mass screening will expand the new patient funnel for cardiovascular and diabetes drugs — a long-term demand tailwind for RAVASTEL, EIMLER-10, ZLATKO, and PECHAUNOX across ETC channels.</w:t>
-      </w:r>
-    </w:p>
-    <w:tbl>
-      <w:tblPr>
-        <w:tblStyle w:val="TableGrid"/>
-        <w:tblW w:type="auto" w:w="0"/>
-        <w:tblLook w:firstColumn="1" w:firstRow="1" w:lastColumn="0" w:lastRow="0" w:noHBand="0" w:noVBand="1" w:val="04A0"/>
-      </w:tblPr>
-      <w:tblGrid>
-        <w:gridCol w:w="9072"/>
-      </w:tblGrid>
-      <w:tr>
-        <w:tc>
-          <w:tcPr>
-            <w:tcW w:type="dxa" w:w="9072"/>
-            <w:shd w:val="clear" w:color="auto" w:fill="F8FAFC"/>
-            <w:tcBorders>
-              <w:top w:val="none" w:sz="6" w:color="auto"/>
-              <w:bottom w:val="none" w:sz="6" w:color="auto"/>
-              <w:left w:val="single" w:sz="12" w:color="003B71"/>
-              <w:right w:val="none" w:sz="6" w:color="auto"/>
-            </w:tcBorders>
-          </w:tcPr>
-          <w:p>
-            <w:pPr>
-              <w:spacing w:before="60" w:after="60"/>
-              <w:ind w:left="142"/>
-            </w:pPr>
-            <w:r>
-              <w:rPr>
-                <w:rFonts w:ascii="Calibri" w:hAnsi="Calibri"/>
-                <w:b/>
-                <w:i w:val="0"/>
-                <w:color w:val="003B71"/>
-                <w:sz w:val="17"/>
-              </w:rPr>
-              <w:t xml:space="preserve">Strategy  </w:t>
-            </w:r>
-            <w:r>
-              <w:rPr>
-                <w:rFonts w:ascii="Calibri" w:hAnsi="Calibri"/>
-                <w:b w:val="0"/>
-                <w:i w:val="0"/>
-                <w:color w:val="334155"/>
-                <w:sz w:val="17"/>
-              </w:rPr>
-              <w:t>Marketing &amp; Medical Affairs teams should monitor the pending Decree under the Prevention Law (expected 2026) to confirm policy activation timelines; meanwhile, prepare post-screening prescribing support materials for RAVASTEL, EIMLER-10</w:t>
-            </w:r>
-          </w:p>
-        </w:tc>
-      </w:tr>
-    </w:tbl>
-    <w:p>
-      <w:pPr>
-        <w:spacing w:before="40" w:after="120"/>
-      </w:pPr>
-    </w:p>
-    <w:tbl>
-      <w:tblPr>
-        <w:tblStyle w:val="TableGrid"/>
-        <w:tblW w:type="auto" w:w="0"/>
-        <w:jc w:val="left"/>
-        <w:tblLook w:firstColumn="1" w:firstRow="1" w:lastColumn="0" w:lastRow="0" w:noHBand="0" w:noVBand="1" w:val="04A0"/>
-      </w:tblPr>
-      <w:tblGrid>
-        <w:gridCol w:w="4536"/>
-        <w:gridCol w:w="4536"/>
-      </w:tblGrid>
-      <w:tr>
-        <w:tc>
-          <w:tcPr>
-            <w:tcW w:type="dxa" w:w="1984"/>
-            <w:shd w:val="clear" w:color="auto" w:fill="EEF2FF"/>
-            <w:tcBorders>
-              <w:top w:val="none" w:sz="6" w:color="auto"/>
-              <w:bottom w:val="none" w:sz="6" w:color="auto"/>
-              <w:left w:val="none" w:sz="6" w:color="auto"/>
-              <w:right w:val="none" w:sz="6" w:color="auto"/>
-            </w:tcBorders>
-          </w:tcPr>
-          <w:p>
-            <w:pPr>
-              <w:spacing w:before="80" w:after="80"/>
-              <w:ind w:left="85"/>
-            </w:pPr>
-            <w:r>
-              <w:rPr>
-                <w:rFonts w:ascii="Calibri" w:hAnsi="Calibri"/>
-                <w:b/>
-                <w:i w:val="0"/>
-                <w:color w:val="4338CA"/>
-                <w:sz w:val="15"/>
-              </w:rPr>
-              <w:t>DÂN TRÍ – SỨC KHỎE</w:t>
-            </w:r>
-          </w:p>
-        </w:tc>
-        <w:tc>
-          <w:tcPr>
-            <w:tcW w:type="dxa" w:w="4536"/>
-            <w:tcBorders>
-              <w:top w:val="none" w:sz="6" w:color="auto"/>
-              <w:bottom w:val="none" w:sz="6" w:color="auto"/>
-              <w:left w:val="none" w:sz="6" w:color="auto"/>
-              <w:right w:val="none" w:sz="6" w:color="auto"/>
-            </w:tcBorders>
-          </w:tcPr>
-          <w:p>
-            <w:pPr>
-              <w:spacing w:before="60" w:after="60"/>
-              <w:ind w:left="113"/>
-            </w:pPr>
-            <w:r>
-              <w:rPr>
-                <w:rFonts w:ascii="Calibri" w:hAnsi="Calibri"/>
-                <w:b/>
-                <w:i w:val="0"/>
-                <w:color w:val="111827"/>
-                <w:sz w:val="21"/>
-              </w:rPr>
-              <w:t>90% of Vietnamese Face Oral Health Issues — Dental Market Expansion, Outside Davipharm Portfolio</w:t>
-            </w:r>
-          </w:p>
-        </w:tc>
-      </w:tr>
-    </w:tbl>
-    <w:p>
-      <w:pPr>
-        <w:spacing w:before="40" w:after="40"/>
-        <w:ind w:left="170"/>
-      </w:pPr>
-      <w:r>
-        <w:rPr>
-          <w:rFonts w:ascii="Calibri" w:hAnsi="Calibri"/>
-          <w:b w:val="0"/>
-          <w:i/>
-          <w:color w:val="6B7280"/>
-          <w:sz w:val="18"/>
-        </w:rPr>
-        <w:t>The 47th Asia-Pacific Dental Conference in Hanoi reported that 90% of Vietnamese suffer from oral health issues, with the Ministry of Health prioritizing preventive and specialist dental care. Davipharm carries no oral health products, so this development has no direct revenue or tender impact.[Source]</w:t>
-      </w:r>
-    </w:p>
-    <w:p>
-      <w:pPr>
-        <w:spacing w:before="20" w:after="40"/>
-        <w:ind w:left="170"/>
-      </w:pPr>
-      <w:r>
-        <w:rPr>
-          <w:rFonts w:ascii="Calibri" w:hAnsi="Calibri"/>
-          <w:b/>
-          <w:i w:val="0"/>
-          <w:color w:val="374151"/>
-          <w:sz w:val="17"/>
-        </w:rPr>
-        <w:t>⚪ No relevance to Davipharm's strategic portfolio — passive monitoring only, no priority action required.</w:t>
-      </w:r>
-    </w:p>
-    <w:tbl>
-      <w:tblPr>
-        <w:tblStyle w:val="TableGrid"/>
-        <w:tblW w:type="auto" w:w="0"/>
-        <w:tblLook w:firstColumn="1" w:firstRow="1" w:lastColumn="0" w:lastRow="0" w:noHBand="0" w:noVBand="1" w:val="04A0"/>
-      </w:tblPr>
-      <w:tblGrid>
-        <w:gridCol w:w="9072"/>
-      </w:tblGrid>
-      <w:tr>
-        <w:tc>
-          <w:tcPr>
-            <w:tcW w:type="dxa" w:w="9072"/>
-            <w:shd w:val="clear" w:color="auto" w:fill="F8FAFC"/>
-            <w:tcBorders>
-              <w:top w:val="none" w:sz="6" w:color="auto"/>
-              <w:bottom w:val="none" w:sz="6" w:color="auto"/>
-              <w:left w:val="single" w:sz="12" w:color="003B71"/>
-              <w:right w:val="none" w:sz="6" w:color="auto"/>
-            </w:tcBorders>
-          </w:tcPr>
-          <w:p>
-            <w:pPr>
-              <w:spacing w:before="60" w:after="60"/>
-              <w:ind w:left="142"/>
-            </w:pPr>
-            <w:r>
-              <w:rPr>
-                <w:rFonts w:ascii="Calibri" w:hAnsi="Calibri"/>
-                <w:b/>
-                <w:i w:val="0"/>
-                <w:color w:val="003B71"/>
-                <w:sz w:val="17"/>
-              </w:rPr>
-              <w:t xml:space="preserve">Strategy  </w:t>
-            </w:r>
-            <w:r>
-              <w:rPr>
-                <w:rFonts w:ascii="Calibri" w:hAnsi="Calibri"/>
-                <w:b w:val="0"/>
-                <w:i w:val="0"/>
-                <w:color w:val="334155"/>
-                <w:sz w:val="17"/>
-              </w:rPr>
-              <w:t>No immediate action required; Business Development may note the dental market expansion as a long-term signal should Davipharm consider entering the oral care OTC segment in future portfolio planning.</w:t>
-            </w:r>
-          </w:p>
-        </w:tc>
-      </w:tr>
-    </w:tbl>
-    <w:p>
-      <w:pPr>
-        <w:spacing w:before="40" w:after="120"/>
-      </w:pPr>
-    </w:p>
-    <w:tbl>
-      <w:tblPr>
-        <w:tblStyle w:val="TableGrid"/>
-        <w:tblW w:type="auto" w:w="0"/>
-        <w:jc w:val="left"/>
-        <w:tblLook w:firstColumn="1" w:firstRow="1" w:lastColumn="0" w:lastRow="0" w:noHBand="0" w:noVBand="1" w:val="04A0"/>
-      </w:tblPr>
-      <w:tblGrid>
-        <w:gridCol w:w="4536"/>
-        <w:gridCol w:w="4536"/>
-      </w:tblGrid>
-      <w:tr>
-        <w:tc>
-          <w:tcPr>
-            <w:tcW w:type="dxa" w:w="1984"/>
-            <w:shd w:val="clear" w:color="auto" w:fill="EEF2FF"/>
-            <w:tcBorders>
-              <w:top w:val="none" w:sz="6" w:color="auto"/>
-              <w:bottom w:val="none" w:sz="6" w:color="auto"/>
-              <w:left w:val="none" w:sz="6" w:color="auto"/>
-              <w:right w:val="none" w:sz="6" w:color="auto"/>
-            </w:tcBorders>
-          </w:tcPr>
-          <w:p>
-            <w:pPr>
-              <w:spacing w:before="80" w:after="80"/>
-              <w:ind w:left="85"/>
-            </w:pPr>
-            <w:r>
-              <w:rPr>
-                <w:rFonts w:ascii="Calibri" w:hAnsi="Calibri"/>
-                <w:b/>
-                <w:i w:val="0"/>
-                <w:color w:val="4338CA"/>
-                <w:sz w:val="15"/>
-              </w:rPr>
-              <w:t>DÂN TRÍ – SỨC KHỎE</w:t>
-            </w:r>
-          </w:p>
-        </w:tc>
-        <w:tc>
-          <w:tcPr>
-            <w:tcW w:type="dxa" w:w="4536"/>
-            <w:tcBorders>
-              <w:top w:val="none" w:sz="6" w:color="auto"/>
-              <w:bottom w:val="none" w:sz="6" w:color="auto"/>
-              <w:left w:val="none" w:sz="6" w:color="auto"/>
-              <w:right w:val="none" w:sz="6" w:color="auto"/>
-            </w:tcBorders>
-          </w:tcPr>
-          <w:p>
-            <w:pPr>
-              <w:spacing w:before="60" w:after="60"/>
-              <w:ind w:left="113"/>
-            </w:pPr>
-            <w:r>
-              <w:rPr>
-                <w:rFonts w:ascii="Calibri" w:hAnsi="Calibri"/>
-                <w:b/>
-                <w:i w:val="0"/>
-                <w:color w:val="111827"/>
-                <w:sz w:val="21"/>
-              </w:rPr>
-              <w:t>MoH Proposes Special Incentives for Island Healthcare Workers — Signal of Primary Care Strengthening in Remote Areas</w:t>
-            </w:r>
-          </w:p>
-        </w:tc>
-      </w:tr>
-    </w:tbl>
-    <w:p>
-      <w:pPr>
-        <w:spacing w:before="40" w:after="40"/>
-        <w:ind w:left="170"/>
-      </w:pPr>
-      <w:r>
-        <w:rPr>
-          <w:rFonts w:ascii="Calibri" w:hAnsi="Calibri"/>
-          <w:b w:val="0"/>
-          <w:i/>
-          <w:color w:val="6B7280"/>
-          <w:sz w:val="18"/>
-        </w:rPr>
-        <w:t>Deputy Minister of Health Tran Van Thuan announced plans to advise the Government on a legal framework for special incentives for island-based healthcare workers, following a Truong Sa inspection visit (May 4–10, 2026), with VND 3.3 billion in medical equipment and drug kits donated to 7 islands. This news reflects a policy direction to strengthen primary care in remote areas but has no direct bearing on Davipharm's ETC tender portfolio.[Source]</w:t>
-      </w:r>
-    </w:p>
-    <w:p>
-      <w:pPr>
-        <w:spacing w:before="20" w:after="40"/>
-        <w:ind w:left="170"/>
-      </w:pPr>
-      <w:r>
-        <w:rPr>
-          <w:rFonts w:ascii="Calibri" w:hAnsi="Calibri"/>
-          <w:b/>
-          <w:i w:val="0"/>
-          <w:color w:val="374151"/>
-          <w:sz w:val="17"/>
-        </w:rPr>
-        <w:t>➖ No direct relevance to Davipharm's product portfolio or distribution channels; no immediate opportunity or risk identified.</w:t>
-      </w:r>
-    </w:p>
-    <w:tbl>
-      <w:tblPr>
-        <w:tblStyle w:val="TableGrid"/>
-        <w:tblW w:type="auto" w:w="0"/>
-        <w:tblLook w:firstColumn="1" w:firstRow="1" w:lastColumn="0" w:lastRow="0" w:noHBand="0" w:noVBand="1" w:val="04A0"/>
-      </w:tblPr>
-      <w:tblGrid>
-        <w:gridCol w:w="9072"/>
-      </w:tblGrid>
-      <w:tr>
-        <w:tc>
-          <w:tcPr>
-            <w:tcW w:type="dxa" w:w="9072"/>
-            <w:shd w:val="clear" w:color="auto" w:fill="F8FAFC"/>
-            <w:tcBorders>
-              <w:top w:val="none" w:sz="6" w:color="auto"/>
-              <w:bottom w:val="none" w:sz="6" w:color="auto"/>
-              <w:left w:val="single" w:sz="12" w:color="003B71"/>
-              <w:right w:val="none" w:sz="6" w:color="auto"/>
-            </w:tcBorders>
-          </w:tcPr>
-          <w:p>
-            <w:pPr>
-              <w:spacing w:before="60" w:after="60"/>
-              <w:ind w:left="142"/>
-            </w:pPr>
-            <w:r>
-              <w:rPr>
-                <w:rFonts w:ascii="Calibri" w:hAnsi="Calibri"/>
-                <w:b/>
-                <w:i w:val="0"/>
-                <w:color w:val="003B71"/>
-                <w:sz w:val="17"/>
-              </w:rPr>
-              <w:t xml:space="preserve">Strategy  </w:t>
-            </w:r>
-            <w:r>
-              <w:rPr>
-                <w:rFonts w:ascii="Calibri" w:hAnsi="Calibri"/>
-                <w:b w:val="0"/>
-                <w:i w:val="0"/>
-                <w:color w:val="334155"/>
-                <w:sz w:val="17"/>
-              </w:rPr>
-              <w:t>No priority action required. Government Affairs team may monitor the forthcoming legal framework for island healthcare incentives — if it leads to expanded primary care drug lists (including cardiovascular/diabetes), consider registering products such as RAVASTEL and ZLATKO into future defense/special procurement packages.</w:t>
-            </w:r>
-          </w:p>
-        </w:tc>
-      </w:tr>
-    </w:tbl>
-    <w:p>
-      <w:pPr>
-        <w:spacing w:before="40" w:after="120"/>
-      </w:pPr>
-    </w:p>
-    <w:tbl>
-      <w:tblPr>
-        <w:tblStyle w:val="TableGrid"/>
-        <w:tblW w:type="auto" w:w="0"/>
-        <w:jc w:val="left"/>
-        <w:tblLook w:firstColumn="1" w:firstRow="1" w:lastColumn="0" w:lastRow="0" w:noHBand="0" w:noVBand="1" w:val="04A0"/>
-      </w:tblPr>
-      <w:tblGrid>
-        <w:gridCol w:w="4536"/>
-        <w:gridCol w:w="4536"/>
-      </w:tblGrid>
-      <w:tr>
-        <w:tc>
-          <w:tcPr>
-            <w:tcW w:type="dxa" w:w="1984"/>
-            <w:shd w:val="clear" w:color="auto" w:fill="EEF2FF"/>
-            <w:tcBorders>
-              <w:top w:val="none" w:sz="6" w:color="auto"/>
-              <w:bottom w:val="none" w:sz="6" w:color="auto"/>
-              <w:left w:val="none" w:sz="6" w:color="auto"/>
-              <w:right w:val="none" w:sz="6" w:color="auto"/>
-            </w:tcBorders>
-          </w:tcPr>
-          <w:p>
-            <w:pPr>
-              <w:spacing w:before="80" w:after="80"/>
-              <w:ind w:left="85"/>
-            </w:pPr>
-            <w:r>
-              <w:rPr>
-                <w:rFonts w:ascii="Calibri" w:hAnsi="Calibri"/>
-                <w:b/>
-                <w:i w:val="0"/>
-                <w:color w:val="4338CA"/>
-                <w:sz w:val="15"/>
-              </w:rPr>
-              <w:t>DÂN TRÍ – SỨC KHỎE</w:t>
-            </w:r>
-          </w:p>
-        </w:tc>
-        <w:tc>
-          <w:tcPr>
-            <w:tcW w:type="dxa" w:w="4536"/>
-            <w:tcBorders>
-              <w:top w:val="none" w:sz="6" w:color="auto"/>
-              <w:bottom w:val="none" w:sz="6" w:color="auto"/>
-              <w:left w:val="none" w:sz="6" w:color="auto"/>
-              <w:right w:val="none" w:sz="6" w:color="auto"/>
-            </w:tcBorders>
-          </w:tcPr>
-          <w:p>
-            <w:pPr>
-              <w:spacing w:before="60" w:after="60"/>
-              <w:ind w:left="113"/>
-            </w:pPr>
-            <w:r>
-              <w:rPr>
-                <w:rFonts w:ascii="Calibri" w:hAnsi="Calibri"/>
-                <w:b/>
-                <w:i w:val="0"/>
-                <w:color w:val="111827"/>
-                <w:sz w:val="21"/>
-              </w:rPr>
-              <w:t>Hypertension Underdiagnosis in Millions of Vietnamese — Market Expansion Opportunity for Davipharm's Cardiovascular Portfolio</w:t>
-            </w:r>
-          </w:p>
-        </w:tc>
-      </w:tr>
-    </w:tbl>
-    <w:p>
-      <w:pPr>
-        <w:spacing w:before="40" w:after="40"/>
-        <w:ind w:left="170"/>
-      </w:pPr>
-      <w:r>
-        <w:rPr>
-          <w:rFonts w:ascii="Calibri" w:hAnsi="Calibri"/>
-          <w:b w:val="0"/>
-          <w:i/>
-          <w:color w:val="6B7280"/>
-          <w:sz w:val="18"/>
-        </w:rPr>
-        <w:t>Vietnam's cardiology experts warn that 25–30% of Vietnamese adults have hypertension yet diagnosis and control rates remain critically low, with disease onset trending younger and fixed-dose combination therapy gaining prominence. This signals sustained long-term demand growth for Davipharm's PECHAUNOX (Perindopril+Amlodipine), TABAREX (Valsartan), and HATLOP (Irbesartan) across both ETC and OTC channels.[Source]</w:t>
-      </w:r>
-    </w:p>
-    <w:p>
-      <w:pPr>
-        <w:spacing w:before="20" w:after="40"/>
-        <w:ind w:left="170"/>
-      </w:pPr>
-      <w:r>
-        <w:rPr>
-          <w:rFonts w:ascii="Calibri" w:hAnsi="Calibri"/>
-          <w:b/>
-          <w:i w:val="0"/>
-          <w:color w:val="166534"/>
-          <w:sz w:val="17"/>
-        </w:rPr>
-        <w:t>📈 Clear growth opportunity: a large untreated hypertension patient pool and expert endorsement of fixed-dose combinations directly support PECHAUNOX's positioning and ETC tender volume in the upcoming procurement cycle.</w:t>
-      </w:r>
-    </w:p>
-    <w:tbl>
-      <w:tblPr>
-        <w:tblStyle w:val="TableGrid"/>
-        <w:tblW w:type="auto" w:w="0"/>
-        <w:tblLook w:firstColumn="1" w:firstRow="1" w:lastColumn="0" w:lastRow="0" w:noHBand="0" w:noVBand="1" w:val="04A0"/>
-      </w:tblPr>
-      <w:tblGrid>
-        <w:gridCol w:w="9072"/>
-      </w:tblGrid>
-      <w:tr>
-        <w:tc>
-          <w:tcPr>
-            <w:tcW w:type="dxa" w:w="9072"/>
-            <w:shd w:val="clear" w:color="auto" w:fill="F8FAFC"/>
-            <w:tcBorders>
-              <w:top w:val="none" w:sz="6" w:color="auto"/>
-              <w:bottom w:val="none" w:sz="6" w:color="auto"/>
-              <w:left w:val="single" w:sz="12" w:color="003B71"/>
-              <w:right w:val="none" w:sz="6" w:color="auto"/>
-            </w:tcBorders>
-          </w:tcPr>
-          <w:p>
-            <w:pPr>
-              <w:spacing w:before="60" w:after="60"/>
-              <w:ind w:left="142"/>
-            </w:pPr>
-            <w:r>
-              <w:rPr>
-                <w:rFonts w:ascii="Calibri" w:hAnsi="Calibri"/>
-                <w:b/>
-                <w:i w:val="0"/>
-                <w:color w:val="003B71"/>
-                <w:sz w:val="17"/>
-              </w:rPr>
-              <w:t xml:space="preserve">Strategy  </w:t>
-            </w:r>
-            <w:r>
-              <w:rPr>
-                <w:rFonts w:ascii="Calibri" w:hAnsi="Calibri"/>
-                <w:b w:val="0"/>
-                <w:i w:val="0"/>
-                <w:color w:val="334155"/>
-                <w:sz w:val="17"/>
-              </w:rPr>
-              <w:t>The Cardiovascular Marketing team, in coordination with Medical Affairs, should immediately</w:t>
-            </w:r>
-          </w:p>
-        </w:tc>
-      </w:tr>
-    </w:tbl>
-    <w:p>
-      <w:pPr>
-        <w:spacing w:before="40" w:after="120"/>
-      </w:pPr>
-    </w:p>
-    <w:tbl>
-      <w:tblPr>
-        <w:tblStyle w:val="TableGrid"/>
-        <w:tblW w:type="auto" w:w="0"/>
-        <w:jc w:val="left"/>
-        <w:tblLook w:firstColumn="1" w:firstRow="1" w:lastColumn="0" w:lastRow="0" w:noHBand="0" w:noVBand="1" w:val="04A0"/>
-      </w:tblPr>
-      <w:tblGrid>
-        <w:gridCol w:w="4536"/>
-        <w:gridCol w:w="4536"/>
-      </w:tblGrid>
-      <w:tr>
-        <w:tc>
-          <w:tcPr>
-            <w:tcW w:type="dxa" w:w="1984"/>
-            <w:shd w:val="clear" w:color="auto" w:fill="EEF2FF"/>
-            <w:tcBorders>
-              <w:top w:val="none" w:sz="6" w:color="auto"/>
-              <w:bottom w:val="none" w:sz="6" w:color="auto"/>
-              <w:left w:val="none" w:sz="6" w:color="auto"/>
-              <w:right w:val="none" w:sz="6" w:color="auto"/>
-            </w:tcBorders>
-          </w:tcPr>
-          <w:p>
-            <w:pPr>
-              <w:spacing w:before="80" w:after="80"/>
-              <w:ind w:left="85"/>
-            </w:pPr>
-            <w:r>
-              <w:rPr>
-                <w:rFonts w:ascii="Calibri" w:hAnsi="Calibri"/>
-                <w:b/>
-                <w:i w:val="0"/>
-                <w:color w:val="4338CA"/>
-                <w:sz w:val="15"/>
-              </w:rPr>
-              <w:t>DÂN TRÍ – SỨC KHỎE</w:t>
-            </w:r>
-          </w:p>
-        </w:tc>
-        <w:tc>
-          <w:tcPr>
-            <w:tcW w:type="dxa" w:w="4536"/>
-            <w:tcBorders>
-              <w:top w:val="none" w:sz="6" w:color="auto"/>
-              <w:bottom w:val="none" w:sz="6" w:color="auto"/>
-              <w:left w:val="none" w:sz="6" w:color="auto"/>
-              <w:right w:val="none" w:sz="6" w:color="auto"/>
-            </w:tcBorders>
-          </w:tcPr>
-          <w:p>
-            <w:pPr>
-              <w:spacing w:before="60" w:after="60"/>
-              <w:ind w:left="113"/>
-            </w:pPr>
-            <w:r>
-              <w:rPr>
-                <w:rFonts w:ascii="Calibri" w:hAnsi="Calibri"/>
-                <w:b/>
-                <w:i w:val="0"/>
-                <w:color w:val="111827"/>
-                <w:sz w:val="21"/>
-              </w:rPr>
-              <w:t>Musculoskeletal Disease Affecting Younger Demographics — Regenerative Medicine Trend Challenging Long-Term Analgesic Use</w:t>
-            </w:r>
-          </w:p>
-        </w:tc>
-      </w:tr>
-    </w:tbl>
-    <w:p>
-      <w:pPr>
-        <w:spacing w:before="40" w:after="40"/>
-        <w:ind w:left="170"/>
-      </w:pPr>
-      <w:r>
-        <w:rPr>
-          <w:rFonts w:ascii="Calibri" w:hAnsi="Calibri"/>
-          <w:b w:val="0"/>
-          <w:i/>
-          <w:color w:val="6B7280"/>
-          <w:sz w:val="18"/>
-        </w:rPr>
-        <w:t>A webinar co-hosted by Dân Trí and Hồng Ngọc Hospital highlights a clear trend of musculoskeletal degeneration in adults over 30, alongside warnings on self-medication with uncontrolled NSAIDs/analgesics. Growing promotion of regenerative medicine as an alternative may temper long-term demand for Etoricoxib (MAGRAX) in chronic musculoskeletal pain management.[Source]</w:t>
-      </w:r>
-    </w:p>
-    <w:p>
-      <w:pPr>
-        <w:spacing w:before="20" w:after="40"/>
-        <w:ind w:left="170"/>
-      </w:pPr>
-      <w:r>
-        <w:rPr>
-          <w:rFonts w:ascii="Calibri" w:hAnsi="Calibri"/>
-          <w:b/>
-          <w:i w:val="0"/>
-          <w:color w:val="374151"/>
-          <w:sz w:val="17"/>
-        </w:rPr>
-        <w:t>⚖️ Neutral signal: expanding musculoskeletal patient base is a growth opportunity for MAGRAX, but regenerative medicine momentum and anti-prolonged-NSAID messaging may constrain OTC/ETC volume growth.</w:t>
-      </w:r>
-    </w:p>
-    <w:tbl>
-      <w:tblPr>
-        <w:tblStyle w:val="TableGrid"/>
-        <w:tblW w:type="auto" w:w="0"/>
-        <w:tblLook w:firstColumn="1" w:firstRow="1" w:lastColumn="0" w:lastRow="0" w:noHBand="0" w:noVBand="1" w:val="04A0"/>
-      </w:tblPr>
-      <w:tblGrid>
-        <w:gridCol w:w="9072"/>
-      </w:tblGrid>
-      <w:tr>
-        <w:tc>
-          <w:tcPr>
-            <w:tcW w:type="dxa" w:w="9072"/>
-            <w:shd w:val="clear" w:color="auto" w:fill="F8FAFC"/>
-            <w:tcBorders>
-              <w:top w:val="none" w:sz="6" w:color="auto"/>
-              <w:bottom w:val="none" w:sz="6" w:color="auto"/>
-              <w:left w:val="single" w:sz="12" w:color="003B71"/>
-              <w:right w:val="none" w:sz="6" w:color="auto"/>
-            </w:tcBorders>
-          </w:tcPr>
-          <w:p>
-            <w:pPr>
-              <w:spacing w:before="60" w:after="60"/>
-              <w:ind w:left="142"/>
-            </w:pPr>
-            <w:r>
-              <w:rPr>
-                <w:rFonts w:ascii="Calibri" w:hAnsi="Calibri"/>
-                <w:b/>
-                <w:i w:val="0"/>
-                <w:color w:val="003B71"/>
-                <w:sz w:val="17"/>
-              </w:rPr>
-              <w:t xml:space="preserve">Strategy  </w:t>
-            </w:r>
-            <w:r>
-              <w:rPr>
-                <w:rFonts w:ascii="Calibri" w:hAnsi="Calibri"/>
-                <w:b w:val="0"/>
-                <w:i w:val="0"/>
-                <w:color w:val="334155"/>
-                <w:sz w:val="17"/>
-              </w:rPr>
-              <w:t>Marketing &amp; Medical Affairs should reposition MAGRAX (Etoricoxib) as a "short-to-medium-term acute/subacute pain bridge" solution — leveraging CV and GI safety data vs. older NSAIDs to justify rational prescribing alongside regenerative interventions; develop rheumatology/orthopaedic detailing materials by Q3 2026.</w:t>
-            </w:r>
-          </w:p>
-        </w:tc>
-      </w:tr>
-    </w:tbl>
-    <w:p>
-      <w:pPr>
-        <w:spacing w:before="40" w:after="120"/>
-      </w:pPr>
-    </w:p>
-    <w:tbl>
-      <w:tblPr>
-        <w:tblStyle w:val="TableGrid"/>
-        <w:tblW w:type="auto" w:w="0"/>
-        <w:jc w:val="left"/>
-        <w:tblLook w:firstColumn="1" w:firstRow="1" w:lastColumn="0" w:lastRow="0" w:noHBand="0" w:noVBand="1" w:val="04A0"/>
-      </w:tblPr>
-      <w:tblGrid>
-        <w:gridCol w:w="4536"/>
-        <w:gridCol w:w="4536"/>
-      </w:tblGrid>
-      <w:tr>
-        <w:tc>
-          <w:tcPr>
-            <w:tcW w:type="dxa" w:w="1984"/>
-            <w:shd w:val="clear" w:color="auto" w:fill="EEF2FF"/>
-            <w:tcBorders>
-              <w:top w:val="none" w:sz="6" w:color="auto"/>
-              <w:bottom w:val="none" w:sz="6" w:color="auto"/>
-              <w:left w:val="none" w:sz="6" w:color="auto"/>
-              <w:right w:val="none" w:sz="6" w:color="auto"/>
-            </w:tcBorders>
-          </w:tcPr>
-          <w:p>
-            <w:pPr>
-              <w:spacing w:before="80" w:after="80"/>
-              <w:ind w:left="85"/>
-            </w:pPr>
-            <w:r>
-              <w:rPr>
-                <w:rFonts w:ascii="Calibri" w:hAnsi="Calibri"/>
-                <w:b/>
-                <w:i w:val="0"/>
-                <w:color w:val="4338CA"/>
-                <w:sz w:val="15"/>
-              </w:rPr>
-              <w:t>DÂN TRÍ – SỨC KHỎE</w:t>
-            </w:r>
-          </w:p>
-        </w:tc>
-        <w:tc>
-          <w:tcPr>
-            <w:tcW w:type="dxa" w:w="4536"/>
-            <w:tcBorders>
-              <w:top w:val="none" w:sz="6" w:color="auto"/>
-              <w:bottom w:val="none" w:sz="6" w:color="auto"/>
-              <w:left w:val="none" w:sz="6" w:color="auto"/>
-              <w:right w:val="none" w:sz="6" w:color="auto"/>
-            </w:tcBorders>
-          </w:tcPr>
-          <w:p>
-            <w:pPr>
-              <w:spacing w:before="60" w:after="60"/>
-              <w:ind w:left="113"/>
-            </w:pPr>
-            <w:r>
-              <w:rPr>
-                <w:rFonts w:ascii="Calibri" w:hAnsi="Calibri"/>
-                <w:b/>
-                <w:i w:val="0"/>
-                <w:color w:val="111827"/>
-                <w:sz w:val="21"/>
-              </w:rPr>
-              <w:t>Ultra-Magnification Endoscopy Trend for Early GI Cancer Detection: Rising Downstream Treatment Demand</w:t>
-            </w:r>
-          </w:p>
-        </w:tc>
-      </w:tr>
-    </w:tbl>
-    <w:p>
-      <w:pPr>
-        <w:spacing w:before="40" w:after="40"/>
-        <w:ind w:left="170"/>
-      </w:pPr>
-      <w:r>
-        <w:rPr>
-          <w:rFonts w:ascii="Calibri" w:hAnsi="Calibri"/>
-          <w:b w:val="0"/>
-          <w:i/>
-          <w:color w:val="6B7280"/>
-          <w:sz w:val="18"/>
-        </w:rPr>
-        <w:t>Olympus Endocyto 520x technology, now deployed at Thu Cúc TCI, enables cellular-level detection of GI cancers, signaling a significant increase in early-stage diagnoses across Vietnam in coming years. Earlier diagnosis translates to a larger patient population entering pharmacological treatment, directly expanding the ETC market for Davipharm's oncology portfolio.[Source]</w:t>
-      </w:r>
-    </w:p>
-    <w:p>
-      <w:pPr>
-        <w:spacing w:before="20" w:after="40"/>
-        <w:ind w:left="170"/>
-      </w:pPr>
-      <w:r>
-        <w:rPr>
-          <w:rFonts w:ascii="Calibri" w:hAnsi="Calibri"/>
-          <w:b/>
-          <w:i w:val="0"/>
-          <w:color w:val="166534"/>
-          <w:sz w:val="17"/>
-        </w:rPr>
-        <w:t>📈 Mid-term opportunity: increased early-stage GI cancer diagnoses will drive prescription volumes, supporting ETC tender share growth for HYYR (Erlotinib) and LARRIVEY (Bicalutamide).</w:t>
-      </w:r>
-    </w:p>
-    <w:tbl>
-      <w:tblPr>
-        <w:tblStyle w:val="TableGrid"/>
-        <w:tblW w:type="auto" w:w="0"/>
-        <w:tblLook w:firstColumn="1" w:firstRow="1" w:lastColumn="0" w:lastRow="0" w:noHBand="0" w:noVBand="1" w:val="04A0"/>
-      </w:tblPr>
-      <w:tblGrid>
-        <w:gridCol w:w="9072"/>
-      </w:tblGrid>
-      <w:tr>
-        <w:tc>
-          <w:tcPr>
-            <w:tcW w:type="dxa" w:w="9072"/>
-            <w:shd w:val="clear" w:color="auto" w:fill="F8FAFC"/>
-            <w:tcBorders>
-              <w:top w:val="none" w:sz="6" w:color="auto"/>
-              <w:bottom w:val="none" w:sz="6" w:color="auto"/>
-              <w:left w:val="single" w:sz="12" w:color="003B71"/>
-              <w:right w:val="none" w:sz="6" w:color="auto"/>
-            </w:tcBorders>
-          </w:tcPr>
-          <w:p>
-            <w:pPr>
-              <w:spacing w:before="60" w:after="60"/>
-              <w:ind w:left="142"/>
-            </w:pPr>
-            <w:r>
-              <w:rPr>
-                <w:rFonts w:ascii="Calibri" w:hAnsi="Calibri"/>
-                <w:b/>
-                <w:i w:val="0"/>
-                <w:color w:val="003B71"/>
-                <w:sz w:val="17"/>
-              </w:rPr>
-              <w:t xml:space="preserve">Strategy  </w:t>
-            </w:r>
-            <w:r>
-              <w:rPr>
-                <w:rFonts w:ascii="Calibri" w:hAnsi="Calibri"/>
-                <w:b w:val="0"/>
-                <w:i w:val="0"/>
-                <w:color w:val="334155"/>
-                <w:sz w:val="17"/>
-              </w:rPr>
-              <w:t>ETC Marketing and Medical Affairs teams should track the rollout of ultra-magnification endoscopy to provincial hospitals over the next 12 months, prepare MSL materials, and proactively position HYYR and LARRIVEY in oncology formularies at facilities adopting advanced endoscopy — prioritizing TCI-network hospitals and provincial cancer centers.</w:t>
-            </w:r>
-          </w:p>
-        </w:tc>
-      </w:tr>
-    </w:tbl>
-    <w:p>
-      <w:pPr>
-        <w:spacing w:before="40" w:after="120"/>
-      </w:pPr>
-    </w:p>
     <w:p>
       <w:r>
         <w:br w:type="page"/>
@@ -2707,1950 +1103,6 @@
           </w:p>
         </w:tc>
       </w:tr>
-      <w:tr>
-        <w:tc>
-          <w:tcPr>
-            <w:tcW w:type="dxa" w:w="1701"/>
-          </w:tcPr>
-          <w:p>
-            <w:pPr>
-              <w:spacing w:before="60" w:after="60"/>
-              <w:ind w:left="85"/>
-            </w:pPr>
-            <w:r>
-              <w:rPr>
-                <w:rFonts w:ascii="Calibri" w:hAnsi="Calibri"/>
-                <w:b/>
-                <w:i w:val="0"/>
-                <w:color w:val="003B71"/>
-                <w:sz w:val="17"/>
-              </w:rPr>
-              <w:t>EIMLER-10</w:t>
-            </w:r>
-          </w:p>
-        </w:tc>
-        <w:tc>
-          <w:tcPr>
-            <w:tcW w:type="dxa" w:w="2381"/>
-          </w:tcPr>
-          <w:p>
-            <w:pPr>
-              <w:spacing w:before="60" w:after="60"/>
-              <w:ind w:left="85"/>
-            </w:pPr>
-            <w:r>
-              <w:rPr>
-                <w:rFonts w:ascii="Calibri" w:hAnsi="Calibri"/>
-                <w:b w:val="0"/>
-                <w:i w:val="0"/>
-                <w:color w:val="374151"/>
-                <w:sz w:val="17"/>
-              </w:rPr>
-              <w:t>Empagliflozin 10mg</w:t>
-            </w:r>
-          </w:p>
-        </w:tc>
-        <w:tc>
-          <w:tcPr>
-            <w:tcW w:type="dxa" w:w="1134"/>
-          </w:tcPr>
-          <w:p>
-            <w:pPr>
-              <w:spacing w:before="60" w:after="60"/>
-              <w:ind w:left="85"/>
-            </w:pPr>
-            <w:r>
-              <w:rPr>
-                <w:rFonts w:ascii="Calibri" w:hAnsi="Calibri"/>
-                <w:b w:val="0"/>
-                <w:i w:val="0"/>
-                <w:color w:val="374151"/>
-                <w:sz w:val="17"/>
-              </w:rPr>
-              <w:t>597,000 VND /hộp</w:t>
-            </w:r>
-          </w:p>
-        </w:tc>
-        <w:tc>
-          <w:tcPr>
-            <w:tcW w:type="dxa" w:w="1247"/>
-            <w:shd w:val="clear" w:color="auto" w:fill="E7F9EE"/>
-          </w:tcPr>
-          <w:p>
-            <w:pPr>
-              <w:spacing w:before="60" w:after="60"/>
-              <w:ind w:left="85"/>
-            </w:pPr>
-            <w:r>
-              <w:rPr>
-                <w:rFonts w:ascii="Calibri" w:hAnsi="Calibri"/>
-                <w:b/>
-                <w:i w:val="0"/>
-                <w:color w:val="166534"/>
-                <w:sz w:val="17"/>
-              </w:rPr>
-              <w:t>Cơ hội cao</w:t>
-            </w:r>
-          </w:p>
-        </w:tc>
-        <w:tc>
-          <w:tcPr>
-            <w:tcW w:type="dxa" w:w="2608"/>
-          </w:tcPr>
-          <w:p>
-            <w:pPr>
-              <w:spacing w:before="60" w:after="60"/>
-              <w:ind w:left="85"/>
-            </w:pPr>
-            <w:r>
-              <w:rPr>
-                <w:rFonts w:ascii="Calibri" w:hAnsi="Calibri"/>
-                <w:b w:val="0"/>
-                <w:i w:val="0"/>
-                <w:color w:val="374151"/>
-                <w:sz w:val="17"/>
-              </w:rPr>
-              <w:t>Ưu tiên thầu Nhóm 1 – đấu thầu TT 2026</w:t>
-            </w:r>
-          </w:p>
-        </w:tc>
-      </w:tr>
-      <w:tr>
-        <w:tc>
-          <w:tcPr>
-            <w:tcW w:type="dxa" w:w="1701"/>
-          </w:tcPr>
-          <w:p>
-            <w:pPr>
-              <w:spacing w:before="60" w:after="60"/>
-              <w:ind w:left="85"/>
-            </w:pPr>
-            <w:r>
-              <w:rPr>
-                <w:rFonts w:ascii="Calibri" w:hAnsi="Calibri"/>
-                <w:b/>
-                <w:i w:val="0"/>
-                <w:color w:val="003B71"/>
-                <w:sz w:val="17"/>
-              </w:rPr>
-              <w:t>ZLATKO-50</w:t>
-            </w:r>
-          </w:p>
-        </w:tc>
-        <w:tc>
-          <w:tcPr>
-            <w:tcW w:type="dxa" w:w="2381"/>
-          </w:tcPr>
-          <w:p>
-            <w:pPr>
-              <w:spacing w:before="60" w:after="60"/>
-              <w:ind w:left="85"/>
-            </w:pPr>
-            <w:r>
-              <w:rPr>
-                <w:rFonts w:ascii="Calibri" w:hAnsi="Calibri"/>
-                <w:b w:val="0"/>
-                <w:i w:val="0"/>
-                <w:color w:val="374151"/>
-                <w:sz w:val="17"/>
-              </w:rPr>
-              <w:t>Sitagliptin 50mg</w:t>
-            </w:r>
-          </w:p>
-        </w:tc>
-        <w:tc>
-          <w:tcPr>
-            <w:tcW w:type="dxa" w:w="1134"/>
-          </w:tcPr>
-          <w:p>
-            <w:pPr>
-              <w:spacing w:before="60" w:after="60"/>
-              <w:ind w:left="85"/>
-            </w:pPr>
-            <w:r>
-              <w:rPr>
-                <w:rFonts w:ascii="Calibri" w:hAnsi="Calibri"/>
-                <w:b w:val="0"/>
-                <w:i w:val="0"/>
-                <w:color w:val="374151"/>
-                <w:sz w:val="17"/>
-              </w:rPr>
-              <w:t>217,500 VND /hộp</w:t>
-            </w:r>
-          </w:p>
-        </w:tc>
-        <w:tc>
-          <w:tcPr>
-            <w:tcW w:type="dxa" w:w="1247"/>
-            <w:shd w:val="clear" w:color="auto" w:fill="FFF7ED"/>
-          </w:tcPr>
-          <w:p>
-            <w:pPr>
-              <w:spacing w:before="60" w:after="60"/>
-              <w:ind w:left="85"/>
-            </w:pPr>
-            <w:r>
-              <w:rPr>
-                <w:rFonts w:ascii="Calibri" w:hAnsi="Calibri"/>
-                <w:b/>
-                <w:i w:val="0"/>
-                <w:color w:val="D97706"/>
-                <w:sz w:val="17"/>
-              </w:rPr>
-              <w:t>Cạnh tranh</w:t>
-            </w:r>
-          </w:p>
-        </w:tc>
-        <w:tc>
-          <w:tcPr>
-            <w:tcW w:type="dxa" w:w="2608"/>
-          </w:tcPr>
-          <w:p>
-            <w:pPr>
-              <w:spacing w:before="60" w:after="60"/>
-              <w:ind w:left="85"/>
-            </w:pPr>
-            <w:r>
-              <w:rPr>
-                <w:rFonts w:ascii="Calibri" w:hAnsi="Calibri"/>
-                <w:b w:val="0"/>
-                <w:i w:val="0"/>
-                <w:color w:val="374151"/>
-                <w:sz w:val="17"/>
-              </w:rPr>
-              <w:t>Theo dõi DPP-4 generic cạnh tranh</w:t>
-            </w:r>
-          </w:p>
-        </w:tc>
-      </w:tr>
-      <w:tr>
-        <w:tc>
-          <w:tcPr>
-            <w:tcW w:type="dxa" w:w="1701"/>
-          </w:tcPr>
-          <w:p>
-            <w:pPr>
-              <w:spacing w:before="60" w:after="60"/>
-              <w:ind w:left="85"/>
-            </w:pPr>
-            <w:r>
-              <w:rPr>
-                <w:rFonts w:ascii="Calibri" w:hAnsi="Calibri"/>
-                <w:b/>
-                <w:i w:val="0"/>
-                <w:color w:val="003B71"/>
-                <w:sz w:val="17"/>
-              </w:rPr>
-              <w:t>JANUS-60</w:t>
-            </w:r>
-          </w:p>
-        </w:tc>
-        <w:tc>
-          <w:tcPr>
-            <w:tcW w:type="dxa" w:w="2381"/>
-          </w:tcPr>
-          <w:p>
-            <w:pPr>
-              <w:spacing w:before="60" w:after="60"/>
-              <w:ind w:left="85"/>
-            </w:pPr>
-            <w:r>
-              <w:rPr>
-                <w:rFonts w:ascii="Calibri" w:hAnsi="Calibri"/>
-                <w:b w:val="0"/>
-                <w:i w:val="0"/>
-                <w:color w:val="374151"/>
-                <w:sz w:val="17"/>
-              </w:rPr>
-              <w:t>Dapoxetine 60mg</w:t>
-            </w:r>
-          </w:p>
-        </w:tc>
-        <w:tc>
-          <w:tcPr>
-            <w:tcW w:type="dxa" w:w="1134"/>
-          </w:tcPr>
-          <w:p>
-            <w:pPr>
-              <w:spacing w:before="60" w:after="60"/>
-              <w:ind w:left="85"/>
-            </w:pPr>
-            <w:r>
-              <w:rPr>
-                <w:rFonts w:ascii="Calibri" w:hAnsi="Calibri"/>
-                <w:b w:val="0"/>
-                <w:i w:val="0"/>
-                <w:color w:val="374151"/>
-                <w:sz w:val="17"/>
-              </w:rPr>
-              <w:t>720,000 VND /hộp</w:t>
-            </w:r>
-          </w:p>
-        </w:tc>
-        <w:tc>
-          <w:tcPr>
-            <w:tcW w:type="dxa" w:w="1247"/>
-            <w:shd w:val="clear" w:color="auto" w:fill="EFF6FF"/>
-          </w:tcPr>
-          <w:p>
-            <w:pPr>
-              <w:spacing w:before="60" w:after="60"/>
-              <w:ind w:left="85"/>
-            </w:pPr>
-            <w:r>
-              <w:rPr>
-                <w:rFonts w:ascii="Calibri" w:hAnsi="Calibri"/>
-                <w:b/>
-                <w:i w:val="0"/>
-                <w:color w:val="0056D2"/>
-                <w:sz w:val="17"/>
-              </w:rPr>
-              <w:t>Ổn định</w:t>
-            </w:r>
-          </w:p>
-        </w:tc>
-        <w:tc>
-          <w:tcPr>
-            <w:tcW w:type="dxa" w:w="2608"/>
-          </w:tcPr>
-          <w:p>
-            <w:pPr>
-              <w:spacing w:before="60" w:after="60"/>
-              <w:ind w:left="85"/>
-            </w:pPr>
-            <w:r>
-              <w:rPr>
-                <w:rFonts w:ascii="Calibri" w:hAnsi="Calibri"/>
-                <w:b w:val="0"/>
-                <w:i w:val="0"/>
-                <w:color w:val="374151"/>
-                <w:sz w:val="17"/>
-              </w:rPr>
-              <w:t>Kiểm tra listing Long Châu / Pharmacity</w:t>
-            </w:r>
-          </w:p>
-        </w:tc>
-      </w:tr>
-      <w:tr>
-        <w:tc>
-          <w:tcPr>
-            <w:tcW w:type="dxa" w:w="1701"/>
-          </w:tcPr>
-          <w:p>
-            <w:pPr>
-              <w:spacing w:before="60" w:after="60"/>
-              <w:ind w:left="85"/>
-            </w:pPr>
-            <w:r>
-              <w:rPr>
-                <w:rFonts w:ascii="Calibri" w:hAnsi="Calibri"/>
-                <w:b/>
-                <w:i w:val="0"/>
-                <w:color w:val="003B71"/>
-                <w:sz w:val="17"/>
-              </w:rPr>
-              <w:t>TADALAFIL 20MG</w:t>
-            </w:r>
-          </w:p>
-        </w:tc>
-        <w:tc>
-          <w:tcPr>
-            <w:tcW w:type="dxa" w:w="2381"/>
-          </w:tcPr>
-          <w:p>
-            <w:pPr>
-              <w:spacing w:before="60" w:after="60"/>
-              <w:ind w:left="85"/>
-            </w:pPr>
-            <w:r>
-              <w:rPr>
-                <w:rFonts w:ascii="Calibri" w:hAnsi="Calibri"/>
-                <w:b w:val="0"/>
-                <w:i w:val="0"/>
-                <w:color w:val="374151"/>
-                <w:sz w:val="17"/>
-              </w:rPr>
-              <w:t>Tadalafil 20mg</w:t>
-            </w:r>
-          </w:p>
-        </w:tc>
-        <w:tc>
-          <w:tcPr>
-            <w:tcW w:type="dxa" w:w="1134"/>
-          </w:tcPr>
-          <w:p>
-            <w:pPr>
-              <w:spacing w:before="60" w:after="60"/>
-              <w:ind w:left="85"/>
-            </w:pPr>
-            <w:r>
-              <w:rPr>
-                <w:rFonts w:ascii="Calibri" w:hAnsi="Calibri"/>
-                <w:b w:val="0"/>
-                <w:i w:val="0"/>
-                <w:color w:val="374151"/>
-                <w:sz w:val="17"/>
-              </w:rPr>
-              <w:t>42,000 VND /tabs</w:t>
-            </w:r>
-          </w:p>
-        </w:tc>
-        <w:tc>
-          <w:tcPr>
-            <w:tcW w:type="dxa" w:w="1247"/>
-            <w:shd w:val="clear" w:color="auto" w:fill="FFF7ED"/>
-          </w:tcPr>
-          <w:p>
-            <w:pPr>
-              <w:spacing w:before="60" w:after="60"/>
-              <w:ind w:left="85"/>
-            </w:pPr>
-            <w:r>
-              <w:rPr>
-                <w:rFonts w:ascii="Calibri" w:hAnsi="Calibri"/>
-                <w:b/>
-                <w:i w:val="0"/>
-                <w:color w:val="D97706"/>
-                <w:sz w:val="17"/>
-              </w:rPr>
-              <w:t>Cạnh tranh</w:t>
-            </w:r>
-          </w:p>
-        </w:tc>
-        <w:tc>
-          <w:tcPr>
-            <w:tcW w:type="dxa" w:w="2608"/>
-          </w:tcPr>
-          <w:p>
-            <w:pPr>
-              <w:spacing w:before="60" w:after="60"/>
-              <w:ind w:left="85"/>
-            </w:pPr>
-            <w:r>
-              <w:rPr>
-                <w:rFonts w:ascii="Calibri" w:hAnsi="Calibri"/>
-                <w:b w:val="0"/>
-                <w:i w:val="0"/>
-                <w:color w:val="374151"/>
-                <w:sz w:val="17"/>
-              </w:rPr>
-              <w:t>Theo dõi giá Sun Pharma, Cipla generic</w:t>
-            </w:r>
-          </w:p>
-        </w:tc>
-      </w:tr>
-      <w:tr>
-        <w:tc>
-          <w:tcPr>
-            <w:tcW w:type="dxa" w:w="1701"/>
-          </w:tcPr>
-          <w:p>
-            <w:pPr>
-              <w:spacing w:before="60" w:after="60"/>
-              <w:ind w:left="85"/>
-            </w:pPr>
-            <w:r>
-              <w:rPr>
-                <w:rFonts w:ascii="Calibri" w:hAnsi="Calibri"/>
-                <w:b/>
-                <w:i w:val="0"/>
-                <w:color w:val="003B71"/>
-                <w:sz w:val="17"/>
-              </w:rPr>
-              <w:t>DRYCHES</w:t>
-            </w:r>
-          </w:p>
-        </w:tc>
-        <w:tc>
-          <w:tcPr>
-            <w:tcW w:type="dxa" w:w="2381"/>
-          </w:tcPr>
-          <w:p>
-            <w:pPr>
-              <w:spacing w:before="60" w:after="60"/>
-              <w:ind w:left="85"/>
-            </w:pPr>
-            <w:r>
-              <w:rPr>
-                <w:rFonts w:ascii="Calibri" w:hAnsi="Calibri"/>
-                <w:b w:val="0"/>
-                <w:i w:val="0"/>
-                <w:color w:val="374151"/>
-                <w:sz w:val="17"/>
-              </w:rPr>
-              <w:t>Dutasteride 0.5mg</w:t>
-            </w:r>
-          </w:p>
-        </w:tc>
-        <w:tc>
-          <w:tcPr>
-            <w:tcW w:type="dxa" w:w="1134"/>
-          </w:tcPr>
-          <w:p>
-            <w:pPr>
-              <w:spacing w:before="60" w:after="60"/>
-              <w:ind w:left="85"/>
-            </w:pPr>
-            <w:r>
-              <w:rPr>
-                <w:rFonts w:ascii="Calibri" w:hAnsi="Calibri"/>
-                <w:b w:val="0"/>
-                <w:i w:val="0"/>
-                <w:color w:val="374151"/>
-                <w:sz w:val="17"/>
-              </w:rPr>
-              <w:t>378,000 VND /hộp</w:t>
-            </w:r>
-          </w:p>
-        </w:tc>
-        <w:tc>
-          <w:tcPr>
-            <w:tcW w:type="dxa" w:w="1247"/>
-            <w:shd w:val="clear" w:color="auto" w:fill="EFF6FF"/>
-          </w:tcPr>
-          <w:p>
-            <w:pPr>
-              <w:spacing w:before="60" w:after="60"/>
-              <w:ind w:left="85"/>
-            </w:pPr>
-            <w:r>
-              <w:rPr>
-                <w:rFonts w:ascii="Calibri" w:hAnsi="Calibri"/>
-                <w:b/>
-                <w:i w:val="0"/>
-                <w:color w:val="0056D2"/>
-                <w:sz w:val="17"/>
-              </w:rPr>
-              <w:t>Cơ hội</w:t>
-            </w:r>
-          </w:p>
-        </w:tc>
-        <w:tc>
-          <w:tcPr>
-            <w:tcW w:type="dxa" w:w="2608"/>
-          </w:tcPr>
-          <w:p>
-            <w:pPr>
-              <w:spacing w:before="60" w:after="60"/>
-              <w:ind w:left="85"/>
-            </w:pPr>
-            <w:r>
-              <w:rPr>
-                <w:rFonts w:ascii="Calibri" w:hAnsi="Calibri"/>
-                <w:b w:val="0"/>
-                <w:i w:val="0"/>
-                <w:color w:val="374151"/>
-                <w:sz w:val="17"/>
-              </w:rPr>
-              <w:t>BPH – thị trường còn ít cạnh tranh</w:t>
-            </w:r>
-          </w:p>
-        </w:tc>
-      </w:tr>
-      <w:tr>
-        <w:tc>
-          <w:tcPr>
-            <w:tcW w:type="dxa" w:w="1701"/>
-          </w:tcPr>
-          <w:p>
-            <w:pPr>
-              <w:spacing w:before="60" w:after="60"/>
-              <w:ind w:left="85"/>
-            </w:pPr>
-            <w:r>
-              <w:rPr>
-                <w:rFonts w:ascii="Calibri" w:hAnsi="Calibri"/>
-                <w:b/>
-                <w:i w:val="0"/>
-                <w:color w:val="003B71"/>
-                <w:sz w:val="17"/>
-              </w:rPr>
-              <w:t>PECHAUNOX 4/10</w:t>
-            </w:r>
-          </w:p>
-        </w:tc>
-        <w:tc>
-          <w:tcPr>
-            <w:tcW w:type="dxa" w:w="2381"/>
-          </w:tcPr>
-          <w:p>
-            <w:pPr>
-              <w:spacing w:before="60" w:after="60"/>
-              <w:ind w:left="85"/>
-            </w:pPr>
-            <w:r>
-              <w:rPr>
-                <w:rFonts w:ascii="Calibri" w:hAnsi="Calibri"/>
-                <w:b w:val="0"/>
-                <w:i w:val="0"/>
-                <w:color w:val="374151"/>
-                <w:sz w:val="17"/>
-              </w:rPr>
-              <w:t>Perindopril + Amlodipin</w:t>
-            </w:r>
-          </w:p>
-        </w:tc>
-        <w:tc>
-          <w:tcPr>
-            <w:tcW w:type="dxa" w:w="1134"/>
-          </w:tcPr>
-          <w:p>
-            <w:pPr>
-              <w:spacing w:before="60" w:after="60"/>
-              <w:ind w:left="85"/>
-            </w:pPr>
-            <w:r>
-              <w:rPr>
-                <w:rFonts w:ascii="Calibri" w:hAnsi="Calibri"/>
-                <w:b w:val="0"/>
-                <w:i w:val="0"/>
-                <w:color w:val="374151"/>
-                <w:sz w:val="17"/>
-              </w:rPr>
-              <w:t>182,070 VND /hộp</w:t>
-            </w:r>
-          </w:p>
-        </w:tc>
-        <w:tc>
-          <w:tcPr>
-            <w:tcW w:type="dxa" w:w="1247"/>
-            <w:shd w:val="clear" w:color="auto" w:fill="EFF6FF"/>
-          </w:tcPr>
-          <w:p>
-            <w:pPr>
-              <w:spacing w:before="60" w:after="60"/>
-              <w:ind w:left="85"/>
-            </w:pPr>
-            <w:r>
-              <w:rPr>
-                <w:rFonts w:ascii="Calibri" w:hAnsi="Calibri"/>
-                <w:b/>
-                <w:i w:val="0"/>
-                <w:color w:val="0056D2"/>
-                <w:sz w:val="17"/>
-              </w:rPr>
-              <w:t>Ổn định</w:t>
-            </w:r>
-          </w:p>
-        </w:tc>
-        <w:tc>
-          <w:tcPr>
-            <w:tcW w:type="dxa" w:w="2608"/>
-          </w:tcPr>
-          <w:p>
-            <w:pPr>
-              <w:spacing w:before="60" w:after="60"/>
-              <w:ind w:left="85"/>
-            </w:pPr>
-            <w:r>
-              <w:rPr>
-                <w:rFonts w:ascii="Calibri" w:hAnsi="Calibri"/>
-                <w:b w:val="0"/>
-                <w:i w:val="0"/>
-                <w:color w:val="374151"/>
-                <w:sz w:val="17"/>
-              </w:rPr>
-              <w:t>Combo cạnh tranh – theo dõi generic Amlodipine</w:t>
-            </w:r>
-          </w:p>
-        </w:tc>
-      </w:tr>
-      <w:tr>
-        <w:tc>
-          <w:tcPr>
-            <w:tcW w:type="dxa" w:w="1701"/>
-          </w:tcPr>
-          <w:p>
-            <w:pPr>
-              <w:spacing w:before="60" w:after="60"/>
-              <w:ind w:left="85"/>
-            </w:pPr>
-            <w:r>
-              <w:rPr>
-                <w:rFonts w:ascii="Calibri" w:hAnsi="Calibri"/>
-                <w:b/>
-                <w:i w:val="0"/>
-                <w:color w:val="003B71"/>
-                <w:sz w:val="17"/>
-              </w:rPr>
-              <w:t>RAVASTEL-20</w:t>
-            </w:r>
-          </w:p>
-        </w:tc>
-        <w:tc>
-          <w:tcPr>
-            <w:tcW w:type="dxa" w:w="2381"/>
-          </w:tcPr>
-          <w:p>
-            <w:pPr>
-              <w:spacing w:before="60" w:after="60"/>
-              <w:ind w:left="85"/>
-            </w:pPr>
-            <w:r>
-              <w:rPr>
-                <w:rFonts w:ascii="Calibri" w:hAnsi="Calibri"/>
-                <w:b w:val="0"/>
-                <w:i w:val="0"/>
-                <w:color w:val="374151"/>
-                <w:sz w:val="17"/>
-              </w:rPr>
-              <w:t>Rosuvastatin 20mg</w:t>
-            </w:r>
-          </w:p>
-        </w:tc>
-        <w:tc>
-          <w:tcPr>
-            <w:tcW w:type="dxa" w:w="1134"/>
-          </w:tcPr>
-          <w:p>
-            <w:pPr>
-              <w:spacing w:before="60" w:after="60"/>
-              <w:ind w:left="85"/>
-            </w:pPr>
-            <w:r>
-              <w:rPr>
-                <w:rFonts w:ascii="Calibri" w:hAnsi="Calibri"/>
-                <w:b w:val="0"/>
-                <w:i w:val="0"/>
-                <w:color w:val="374151"/>
-                <w:sz w:val="17"/>
-              </w:rPr>
-              <w:t>47,250 VND /hộp</w:t>
-            </w:r>
-          </w:p>
-        </w:tc>
-        <w:tc>
-          <w:tcPr>
-            <w:tcW w:type="dxa" w:w="1247"/>
-            <w:shd w:val="clear" w:color="auto" w:fill="FFF7ED"/>
-          </w:tcPr>
-          <w:p>
-            <w:pPr>
-              <w:spacing w:before="60" w:after="60"/>
-              <w:ind w:left="85"/>
-            </w:pPr>
-            <w:r>
-              <w:rPr>
-                <w:rFonts w:ascii="Calibri" w:hAnsi="Calibri"/>
-                <w:b/>
-                <w:i w:val="0"/>
-                <w:color w:val="D97706"/>
-                <w:sz w:val="17"/>
-              </w:rPr>
-              <w:t>Cạnh tranh</w:t>
-            </w:r>
-          </w:p>
-        </w:tc>
-        <w:tc>
-          <w:tcPr>
-            <w:tcW w:type="dxa" w:w="2608"/>
-          </w:tcPr>
-          <w:p>
-            <w:pPr>
-              <w:spacing w:before="60" w:after="60"/>
-              <w:ind w:left="85"/>
-            </w:pPr>
-            <w:r>
-              <w:rPr>
-                <w:rFonts w:ascii="Calibri" w:hAnsi="Calibri"/>
-                <w:b w:val="0"/>
-                <w:i w:val="0"/>
-                <w:color w:val="374151"/>
-                <w:sz w:val="17"/>
-              </w:rPr>
-              <w:t>Statin – cạnh tranh cao với Atorvastatin generic</w:t>
-            </w:r>
-          </w:p>
-        </w:tc>
-      </w:tr>
-      <w:tr>
-        <w:tc>
-          <w:tcPr>
-            <w:tcW w:type="dxa" w:w="1701"/>
-          </w:tcPr>
-          <w:p>
-            <w:pPr>
-              <w:spacing w:before="60" w:after="60"/>
-              <w:ind w:left="85"/>
-            </w:pPr>
-            <w:r>
-              <w:rPr>
-                <w:rFonts w:ascii="Calibri" w:hAnsi="Calibri"/>
-                <w:b/>
-                <w:i w:val="0"/>
-                <w:color w:val="003B71"/>
-                <w:sz w:val="17"/>
-              </w:rPr>
-              <w:t>TABAREX-160</w:t>
-            </w:r>
-          </w:p>
-        </w:tc>
-        <w:tc>
-          <w:tcPr>
-            <w:tcW w:type="dxa" w:w="2381"/>
-          </w:tcPr>
-          <w:p>
-            <w:pPr>
-              <w:spacing w:before="60" w:after="60"/>
-              <w:ind w:left="85"/>
-            </w:pPr>
-            <w:r>
-              <w:rPr>
-                <w:rFonts w:ascii="Calibri" w:hAnsi="Calibri"/>
-                <w:b w:val="0"/>
-                <w:i w:val="0"/>
-                <w:color w:val="374151"/>
-                <w:sz w:val="17"/>
-              </w:rPr>
-              <w:t>Valsartan 160mg</w:t>
-            </w:r>
-          </w:p>
-        </w:tc>
-        <w:tc>
-          <w:tcPr>
-            <w:tcW w:type="dxa" w:w="1134"/>
-          </w:tcPr>
-          <w:p>
-            <w:pPr>
-              <w:spacing w:before="60" w:after="60"/>
-              <w:ind w:left="85"/>
-            </w:pPr>
-            <w:r>
-              <w:rPr>
-                <w:rFonts w:ascii="Calibri" w:hAnsi="Calibri"/>
-                <w:b w:val="0"/>
-                <w:i w:val="0"/>
-                <w:color w:val="374151"/>
-                <w:sz w:val="17"/>
-              </w:rPr>
-              <w:t>163,800 VND /hộp</w:t>
-            </w:r>
-          </w:p>
-        </w:tc>
-        <w:tc>
-          <w:tcPr>
-            <w:tcW w:type="dxa" w:w="1247"/>
-            <w:shd w:val="clear" w:color="auto" w:fill="EFF6FF"/>
-          </w:tcPr>
-          <w:p>
-            <w:pPr>
-              <w:spacing w:before="60" w:after="60"/>
-              <w:ind w:left="85"/>
-            </w:pPr>
-            <w:r>
-              <w:rPr>
-                <w:rFonts w:ascii="Calibri" w:hAnsi="Calibri"/>
-                <w:b/>
-                <w:i w:val="0"/>
-                <w:color w:val="0056D2"/>
-                <w:sz w:val="17"/>
-              </w:rPr>
-              <w:t>Ổn định</w:t>
-            </w:r>
-          </w:p>
-        </w:tc>
-        <w:tc>
-          <w:tcPr>
-            <w:tcW w:type="dxa" w:w="2608"/>
-          </w:tcPr>
-          <w:p>
-            <w:pPr>
-              <w:spacing w:before="60" w:after="60"/>
-              <w:ind w:left="85"/>
-            </w:pPr>
-            <w:r>
-              <w:rPr>
-                <w:rFonts w:ascii="Calibri" w:hAnsi="Calibri"/>
-                <w:b w:val="0"/>
-                <w:i w:val="0"/>
-                <w:color w:val="374151"/>
-                <w:sz w:val="17"/>
-              </w:rPr>
-              <w:t>Duy trì kênh OTC &amp; ETC tuyến tỉnh</w:t>
-            </w:r>
-          </w:p>
-        </w:tc>
-      </w:tr>
-      <w:tr>
-        <w:tc>
-          <w:tcPr>
-            <w:tcW w:type="dxa" w:w="1701"/>
-          </w:tcPr>
-          <w:p>
-            <w:pPr>
-              <w:spacing w:before="60" w:after="60"/>
-              <w:ind w:left="85"/>
-            </w:pPr>
-            <w:r>
-              <w:rPr>
-                <w:rFonts w:ascii="Calibri" w:hAnsi="Calibri"/>
-                <w:b/>
-                <w:i w:val="0"/>
-                <w:color w:val="003B71"/>
-                <w:sz w:val="17"/>
-              </w:rPr>
-              <w:t>HATLOP-150</w:t>
-            </w:r>
-          </w:p>
-        </w:tc>
-        <w:tc>
-          <w:tcPr>
-            <w:tcW w:type="dxa" w:w="2381"/>
-          </w:tcPr>
-          <w:p>
-            <w:pPr>
-              <w:spacing w:before="60" w:after="60"/>
-              <w:ind w:left="85"/>
-            </w:pPr>
-            <w:r>
-              <w:rPr>
-                <w:rFonts w:ascii="Calibri" w:hAnsi="Calibri"/>
-                <w:b w:val="0"/>
-                <w:i w:val="0"/>
-                <w:color w:val="374151"/>
-                <w:sz w:val="17"/>
-              </w:rPr>
-              <w:t>Irbesartan 150mg</w:t>
-            </w:r>
-          </w:p>
-        </w:tc>
-        <w:tc>
-          <w:tcPr>
-            <w:tcW w:type="dxa" w:w="1134"/>
-          </w:tcPr>
-          <w:p>
-            <w:pPr>
-              <w:spacing w:before="60" w:after="60"/>
-              <w:ind w:left="85"/>
-            </w:pPr>
-            <w:r>
-              <w:rPr>
-                <w:rFonts w:ascii="Calibri" w:hAnsi="Calibri"/>
-                <w:b w:val="0"/>
-                <w:i w:val="0"/>
-                <w:color w:val="374151"/>
-                <w:sz w:val="17"/>
-              </w:rPr>
-              <w:t>210,000 VND /hộp</w:t>
-            </w:r>
-          </w:p>
-        </w:tc>
-        <w:tc>
-          <w:tcPr>
-            <w:tcW w:type="dxa" w:w="1247"/>
-            <w:shd w:val="clear" w:color="auto" w:fill="EFF6FF"/>
-          </w:tcPr>
-          <w:p>
-            <w:pPr>
-              <w:spacing w:before="60" w:after="60"/>
-              <w:ind w:left="85"/>
-            </w:pPr>
-            <w:r>
-              <w:rPr>
-                <w:rFonts w:ascii="Calibri" w:hAnsi="Calibri"/>
-                <w:b/>
-                <w:i w:val="0"/>
-                <w:color w:val="0056D2"/>
-                <w:sz w:val="17"/>
-              </w:rPr>
-              <w:t>Ổn định</w:t>
-            </w:r>
-          </w:p>
-        </w:tc>
-        <w:tc>
-          <w:tcPr>
-            <w:tcW w:type="dxa" w:w="2608"/>
-          </w:tcPr>
-          <w:p>
-            <w:pPr>
-              <w:spacing w:before="60" w:after="60"/>
-              <w:ind w:left="85"/>
-            </w:pPr>
-            <w:r>
-              <w:rPr>
-                <w:rFonts w:ascii="Calibri" w:hAnsi="Calibri"/>
-                <w:b w:val="0"/>
-                <w:i w:val="0"/>
-                <w:color w:val="374151"/>
-                <w:sz w:val="17"/>
-              </w:rPr>
-              <w:t>Duy trì thầu bệnh viện tuyến tỉnh</w:t>
-            </w:r>
-          </w:p>
-        </w:tc>
-      </w:tr>
-      <w:tr>
-        <w:tc>
-          <w:tcPr>
-            <w:tcW w:type="dxa" w:w="1701"/>
-          </w:tcPr>
-          <w:p>
-            <w:pPr>
-              <w:spacing w:before="60" w:after="60"/>
-              <w:ind w:left="85"/>
-            </w:pPr>
-            <w:r>
-              <w:rPr>
-                <w:rFonts w:ascii="Calibri" w:hAnsi="Calibri"/>
-                <w:b/>
-                <w:i w:val="0"/>
-                <w:color w:val="003B71"/>
-                <w:sz w:val="17"/>
-              </w:rPr>
-              <w:t>ZABALES</w:t>
-            </w:r>
-          </w:p>
-        </w:tc>
-        <w:tc>
-          <w:tcPr>
-            <w:tcW w:type="dxa" w:w="2381"/>
-          </w:tcPr>
-          <w:p>
-            <w:pPr>
-              <w:spacing w:before="60" w:after="60"/>
-              <w:ind w:left="85"/>
-            </w:pPr>
-            <w:r>
-              <w:rPr>
-                <w:rFonts w:ascii="Calibri" w:hAnsi="Calibri"/>
-                <w:b w:val="0"/>
-                <w:i w:val="0"/>
-                <w:color w:val="374151"/>
-                <w:sz w:val="17"/>
-              </w:rPr>
-              <w:t>Clopidogrel 75mg</w:t>
-            </w:r>
-          </w:p>
-        </w:tc>
-        <w:tc>
-          <w:tcPr>
-            <w:tcW w:type="dxa" w:w="1134"/>
-          </w:tcPr>
-          <w:p>
-            <w:pPr>
-              <w:spacing w:before="60" w:after="60"/>
-              <w:ind w:left="85"/>
-            </w:pPr>
-            <w:r>
-              <w:rPr>
-                <w:rFonts w:ascii="Calibri" w:hAnsi="Calibri"/>
-                <w:b w:val="0"/>
-                <w:i w:val="0"/>
-                <w:color w:val="374151"/>
-                <w:sz w:val="17"/>
-              </w:rPr>
-              <w:t>31,920 VND /hộp</w:t>
-            </w:r>
-          </w:p>
-        </w:tc>
-        <w:tc>
-          <w:tcPr>
-            <w:tcW w:type="dxa" w:w="1247"/>
-            <w:shd w:val="clear" w:color="auto" w:fill="FFF7ED"/>
-          </w:tcPr>
-          <w:p>
-            <w:pPr>
-              <w:spacing w:before="60" w:after="60"/>
-              <w:ind w:left="85"/>
-            </w:pPr>
-            <w:r>
-              <w:rPr>
-                <w:rFonts w:ascii="Calibri" w:hAnsi="Calibri"/>
-                <w:b/>
-                <w:i w:val="0"/>
-                <w:color w:val="D97706"/>
-                <w:sz w:val="17"/>
-              </w:rPr>
-              <w:t>Cạnh tranh</w:t>
-            </w:r>
-          </w:p>
-        </w:tc>
-        <w:tc>
-          <w:tcPr>
-            <w:tcW w:type="dxa" w:w="2608"/>
-          </w:tcPr>
-          <w:p>
-            <w:pPr>
-              <w:spacing w:before="60" w:after="60"/>
-              <w:ind w:left="85"/>
-            </w:pPr>
-            <w:r>
-              <w:rPr>
-                <w:rFonts w:ascii="Calibri" w:hAnsi="Calibri"/>
-                <w:b w:val="0"/>
-                <w:i w:val="0"/>
-                <w:color w:val="374151"/>
-                <w:sz w:val="17"/>
-              </w:rPr>
-              <w:t>Cạnh tranh cao – cần bảo vệ giá thầu</w:t>
-            </w:r>
-          </w:p>
-        </w:tc>
-      </w:tr>
-      <w:tr>
-        <w:tc>
-          <w:tcPr>
-            <w:tcW w:type="dxa" w:w="1701"/>
-          </w:tcPr>
-          <w:p>
-            <w:pPr>
-              <w:spacing w:before="60" w:after="60"/>
-              <w:ind w:left="85"/>
-            </w:pPr>
-            <w:r>
-              <w:rPr>
-                <w:rFonts w:ascii="Calibri" w:hAnsi="Calibri"/>
-                <w:b/>
-                <w:i w:val="0"/>
-                <w:color w:val="003B71"/>
-                <w:sz w:val="17"/>
-              </w:rPr>
-              <w:t>MAGRAX</w:t>
-            </w:r>
-          </w:p>
-        </w:tc>
-        <w:tc>
-          <w:tcPr>
-            <w:tcW w:type="dxa" w:w="2381"/>
-          </w:tcPr>
-          <w:p>
-            <w:pPr>
-              <w:spacing w:before="60" w:after="60"/>
-              <w:ind w:left="85"/>
-            </w:pPr>
-            <w:r>
-              <w:rPr>
-                <w:rFonts w:ascii="Calibri" w:hAnsi="Calibri"/>
-                <w:b w:val="0"/>
-                <w:i w:val="0"/>
-                <w:color w:val="374151"/>
-                <w:sz w:val="17"/>
-              </w:rPr>
-              <w:t>Etoricoxib 90mg</w:t>
-            </w:r>
-          </w:p>
-        </w:tc>
-        <w:tc>
-          <w:tcPr>
-            <w:tcW w:type="dxa" w:w="1134"/>
-          </w:tcPr>
-          <w:p>
-            <w:pPr>
-              <w:spacing w:before="60" w:after="60"/>
-              <w:ind w:left="85"/>
-            </w:pPr>
-            <w:r>
-              <w:rPr>
-                <w:rFonts w:ascii="Calibri" w:hAnsi="Calibri"/>
-                <w:b w:val="0"/>
-                <w:i w:val="0"/>
-                <w:color w:val="374151"/>
-                <w:sz w:val="17"/>
-              </w:rPr>
-              <w:t>215,000 VND /hộp</w:t>
-            </w:r>
-          </w:p>
-        </w:tc>
-        <w:tc>
-          <w:tcPr>
-            <w:tcW w:type="dxa" w:w="1247"/>
-            <w:shd w:val="clear" w:color="auto" w:fill="EFF6FF"/>
-          </w:tcPr>
-          <w:p>
-            <w:pPr>
-              <w:spacing w:before="60" w:after="60"/>
-              <w:ind w:left="85"/>
-            </w:pPr>
-            <w:r>
-              <w:rPr>
-                <w:rFonts w:ascii="Calibri" w:hAnsi="Calibri"/>
-                <w:b/>
-                <w:i w:val="0"/>
-                <w:color w:val="0056D2"/>
-                <w:sz w:val="17"/>
-              </w:rPr>
-              <w:t>Ổn định</w:t>
-            </w:r>
-          </w:p>
-        </w:tc>
-        <w:tc>
-          <w:tcPr>
-            <w:tcW w:type="dxa" w:w="2608"/>
-          </w:tcPr>
-          <w:p>
-            <w:pPr>
-              <w:spacing w:before="60" w:after="60"/>
-              <w:ind w:left="85"/>
-            </w:pPr>
-            <w:r>
-              <w:rPr>
-                <w:rFonts w:ascii="Calibri" w:hAnsi="Calibri"/>
-                <w:b w:val="0"/>
-                <w:i w:val="0"/>
-                <w:color w:val="374151"/>
-                <w:sz w:val="17"/>
-              </w:rPr>
-              <w:t>COX-2 – theo dõi xu hướng điều trị Gout</w:t>
-            </w:r>
-          </w:p>
-        </w:tc>
-      </w:tr>
-      <w:tr>
-        <w:tc>
-          <w:tcPr>
-            <w:tcW w:type="dxa" w:w="1701"/>
-          </w:tcPr>
-          <w:p>
-            <w:pPr>
-              <w:spacing w:before="60" w:after="60"/>
-              <w:ind w:left="85"/>
-            </w:pPr>
-            <w:r>
-              <w:rPr>
-                <w:rFonts w:ascii="Calibri" w:hAnsi="Calibri"/>
-                <w:b/>
-                <w:i w:val="0"/>
-                <w:color w:val="003B71"/>
-                <w:sz w:val="17"/>
-              </w:rPr>
-              <w:t>ZENTOGOUT-40</w:t>
-            </w:r>
-          </w:p>
-        </w:tc>
-        <w:tc>
-          <w:tcPr>
-            <w:tcW w:type="dxa" w:w="2381"/>
-          </w:tcPr>
-          <w:p>
-            <w:pPr>
-              <w:spacing w:before="60" w:after="60"/>
-              <w:ind w:left="85"/>
-            </w:pPr>
-            <w:r>
-              <w:rPr>
-                <w:rFonts w:ascii="Calibri" w:hAnsi="Calibri"/>
-                <w:b w:val="0"/>
-                <w:i w:val="0"/>
-                <w:color w:val="374151"/>
-                <w:sz w:val="17"/>
-              </w:rPr>
-              <w:t>Febuxostat 40mg</w:t>
-            </w:r>
-          </w:p>
-        </w:tc>
-        <w:tc>
-          <w:tcPr>
-            <w:tcW w:type="dxa" w:w="1134"/>
-          </w:tcPr>
-          <w:p>
-            <w:pPr>
-              <w:spacing w:before="60" w:after="60"/>
-              <w:ind w:left="85"/>
-            </w:pPr>
-            <w:r>
-              <w:rPr>
-                <w:rFonts w:ascii="Calibri" w:hAnsi="Calibri"/>
-                <w:b w:val="0"/>
-                <w:i w:val="0"/>
-                <w:color w:val="374151"/>
-                <w:sz w:val="17"/>
-              </w:rPr>
-              <w:t>240,000 VND /hộp</w:t>
-            </w:r>
-          </w:p>
-        </w:tc>
-        <w:tc>
-          <w:tcPr>
-            <w:tcW w:type="dxa" w:w="1247"/>
-            <w:shd w:val="clear" w:color="auto" w:fill="EFF6FF"/>
-          </w:tcPr>
-          <w:p>
-            <w:pPr>
-              <w:spacing w:before="60" w:after="60"/>
-              <w:ind w:left="85"/>
-            </w:pPr>
-            <w:r>
-              <w:rPr>
-                <w:rFonts w:ascii="Calibri" w:hAnsi="Calibri"/>
-                <w:b/>
-                <w:i w:val="0"/>
-                <w:color w:val="0056D2"/>
-                <w:sz w:val="17"/>
-              </w:rPr>
-              <w:t>Cơ hội</w:t>
-            </w:r>
-          </w:p>
-        </w:tc>
-        <w:tc>
-          <w:tcPr>
-            <w:tcW w:type="dxa" w:w="2608"/>
-          </w:tcPr>
-          <w:p>
-            <w:pPr>
-              <w:spacing w:before="60" w:after="60"/>
-              <w:ind w:left="85"/>
-            </w:pPr>
-            <w:r>
-              <w:rPr>
-                <w:rFonts w:ascii="Calibri" w:hAnsi="Calibri"/>
-                <w:b w:val="0"/>
-                <w:i w:val="0"/>
-                <w:color w:val="374151"/>
-                <w:sz w:val="17"/>
-              </w:rPr>
-              <w:t>Thay thế Allopurinol – đang tăng trưởng</w:t>
-            </w:r>
-          </w:p>
-        </w:tc>
-      </w:tr>
-      <w:tr>
-        <w:tc>
-          <w:tcPr>
-            <w:tcW w:type="dxa" w:w="1701"/>
-          </w:tcPr>
-          <w:p>
-            <w:pPr>
-              <w:spacing w:before="60" w:after="60"/>
-              <w:ind w:left="85"/>
-            </w:pPr>
-            <w:r>
-              <w:rPr>
-                <w:rFonts w:ascii="Calibri" w:hAnsi="Calibri"/>
-                <w:b/>
-                <w:i w:val="0"/>
-                <w:color w:val="003B71"/>
-                <w:sz w:val="17"/>
-              </w:rPr>
-              <w:t>JIRACEK</w:t>
-            </w:r>
-          </w:p>
-        </w:tc>
-        <w:tc>
-          <w:tcPr>
-            <w:tcW w:type="dxa" w:w="2381"/>
-          </w:tcPr>
-          <w:p>
-            <w:pPr>
-              <w:spacing w:before="60" w:after="60"/>
-              <w:ind w:left="85"/>
-            </w:pPr>
-            <w:r>
-              <w:rPr>
-                <w:rFonts w:ascii="Calibri" w:hAnsi="Calibri"/>
-                <w:b w:val="0"/>
-                <w:i w:val="0"/>
-                <w:color w:val="374151"/>
-                <w:sz w:val="17"/>
-              </w:rPr>
-              <w:t>Esomeprazole 40mg</w:t>
-            </w:r>
-          </w:p>
-        </w:tc>
-        <w:tc>
-          <w:tcPr>
-            <w:tcW w:type="dxa" w:w="1134"/>
-          </w:tcPr>
-          <w:p>
-            <w:pPr>
-              <w:spacing w:before="60" w:after="60"/>
-              <w:ind w:left="85"/>
-            </w:pPr>
-            <w:r>
-              <w:rPr>
-                <w:rFonts w:ascii="Calibri" w:hAnsi="Calibri"/>
-                <w:b w:val="0"/>
-                <w:i w:val="0"/>
-                <w:color w:val="374151"/>
-                <w:sz w:val="17"/>
-              </w:rPr>
-              <w:t>89,600 VND /hộp</w:t>
-            </w:r>
-          </w:p>
-        </w:tc>
-        <w:tc>
-          <w:tcPr>
-            <w:tcW w:type="dxa" w:w="1247"/>
-            <w:shd w:val="clear" w:color="auto" w:fill="FFF7ED"/>
-          </w:tcPr>
-          <w:p>
-            <w:pPr>
-              <w:spacing w:before="60" w:after="60"/>
-              <w:ind w:left="85"/>
-            </w:pPr>
-            <w:r>
-              <w:rPr>
-                <w:rFonts w:ascii="Calibri" w:hAnsi="Calibri"/>
-                <w:b/>
-                <w:i w:val="0"/>
-                <w:color w:val="D97706"/>
-                <w:sz w:val="17"/>
-              </w:rPr>
-              <w:t>Cạnh tranh</w:t>
-            </w:r>
-          </w:p>
-        </w:tc>
-        <w:tc>
-          <w:tcPr>
-            <w:tcW w:type="dxa" w:w="2608"/>
-          </w:tcPr>
-          <w:p>
-            <w:pPr>
-              <w:spacing w:before="60" w:after="60"/>
-              <w:ind w:left="85"/>
-            </w:pPr>
-            <w:r>
-              <w:rPr>
-                <w:rFonts w:ascii="Calibri" w:hAnsi="Calibri"/>
-                <w:b w:val="0"/>
-                <w:i w:val="0"/>
-                <w:color w:val="374151"/>
-                <w:sz w:val="17"/>
-              </w:rPr>
-              <w:t>PPI – thị trường cạnh tranh, bảo vệ ETC</w:t>
-            </w:r>
-          </w:p>
-        </w:tc>
-      </w:tr>
-      <w:tr>
-        <w:tc>
-          <w:tcPr>
-            <w:tcW w:type="dxa" w:w="1701"/>
-          </w:tcPr>
-          <w:p>
-            <w:pPr>
-              <w:spacing w:before="60" w:after="60"/>
-              <w:ind w:left="85"/>
-            </w:pPr>
-            <w:r>
-              <w:rPr>
-                <w:rFonts w:ascii="Calibri" w:hAnsi="Calibri"/>
-                <w:b/>
-                <w:i w:val="0"/>
-                <w:color w:val="003B71"/>
-                <w:sz w:val="17"/>
-              </w:rPr>
-              <w:t>SERNAL-4</w:t>
-            </w:r>
-          </w:p>
-        </w:tc>
-        <w:tc>
-          <w:tcPr>
-            <w:tcW w:type="dxa" w:w="2381"/>
-          </w:tcPr>
-          <w:p>
-            <w:pPr>
-              <w:spacing w:before="60" w:after="60"/>
-              <w:ind w:left="85"/>
-            </w:pPr>
-            <w:r>
-              <w:rPr>
-                <w:rFonts w:ascii="Calibri" w:hAnsi="Calibri"/>
-                <w:b w:val="0"/>
-                <w:i w:val="0"/>
-                <w:color w:val="374151"/>
-                <w:sz w:val="17"/>
-              </w:rPr>
-              <w:t>Risperidone 4mg</w:t>
-            </w:r>
-          </w:p>
-        </w:tc>
-        <w:tc>
-          <w:tcPr>
-            <w:tcW w:type="dxa" w:w="1134"/>
-          </w:tcPr>
-          <w:p>
-            <w:pPr>
-              <w:spacing w:before="60" w:after="60"/>
-              <w:ind w:left="85"/>
-            </w:pPr>
-            <w:r>
-              <w:rPr>
-                <w:rFonts w:ascii="Calibri" w:hAnsi="Calibri"/>
-                <w:b w:val="0"/>
-                <w:i w:val="0"/>
-                <w:color w:val="374151"/>
-                <w:sz w:val="17"/>
-              </w:rPr>
-              <w:t>315,000 VND /hộp</w:t>
-            </w:r>
-          </w:p>
-        </w:tc>
-        <w:tc>
-          <w:tcPr>
-            <w:tcW w:type="dxa" w:w="1247"/>
-            <w:shd w:val="clear" w:color="auto" w:fill="EFF6FF"/>
-          </w:tcPr>
-          <w:p>
-            <w:pPr>
-              <w:spacing w:before="60" w:after="60"/>
-              <w:ind w:left="85"/>
-            </w:pPr>
-            <w:r>
-              <w:rPr>
-                <w:rFonts w:ascii="Calibri" w:hAnsi="Calibri"/>
-                <w:b/>
-                <w:i w:val="0"/>
-                <w:color w:val="0056D2"/>
-                <w:sz w:val="17"/>
-              </w:rPr>
-              <w:t>Ổn định</w:t>
-            </w:r>
-          </w:p>
-        </w:tc>
-        <w:tc>
-          <w:tcPr>
-            <w:tcW w:type="dxa" w:w="2608"/>
-          </w:tcPr>
-          <w:p>
-            <w:pPr>
-              <w:spacing w:before="60" w:after="60"/>
-              <w:ind w:left="85"/>
-            </w:pPr>
-            <w:r>
-              <w:rPr>
-                <w:rFonts w:ascii="Calibri" w:hAnsi="Calibri"/>
-                <w:b w:val="0"/>
-                <w:i w:val="0"/>
-                <w:color w:val="374151"/>
-                <w:sz w:val="17"/>
-              </w:rPr>
-              <w:t>Duy trì kênh ETC bệnh viện chuyên khoa</w:t>
-            </w:r>
-          </w:p>
-        </w:tc>
-      </w:tr>
-      <w:tr>
-        <w:tc>
-          <w:tcPr>
-            <w:tcW w:type="dxa" w:w="1701"/>
-          </w:tcPr>
-          <w:p>
-            <w:pPr>
-              <w:spacing w:before="60" w:after="60"/>
-              <w:ind w:left="85"/>
-            </w:pPr>
-            <w:r>
-              <w:rPr>
-                <w:rFonts w:ascii="Calibri" w:hAnsi="Calibri"/>
-                <w:b/>
-                <w:i w:val="0"/>
-                <w:color w:val="003B71"/>
-                <w:sz w:val="17"/>
-              </w:rPr>
-              <w:t>LAFAXOR</w:t>
-            </w:r>
-          </w:p>
-        </w:tc>
-        <w:tc>
-          <w:tcPr>
-            <w:tcW w:type="dxa" w:w="2381"/>
-          </w:tcPr>
-          <w:p>
-            <w:pPr>
-              <w:spacing w:before="60" w:after="60"/>
-              <w:ind w:left="85"/>
-            </w:pPr>
-            <w:r>
-              <w:rPr>
-                <w:rFonts w:ascii="Calibri" w:hAnsi="Calibri"/>
-                <w:b w:val="0"/>
-                <w:i w:val="0"/>
-                <w:color w:val="374151"/>
-                <w:sz w:val="17"/>
-              </w:rPr>
-              <w:t>Venlafaxine</w:t>
-            </w:r>
-          </w:p>
-        </w:tc>
-        <w:tc>
-          <w:tcPr>
-            <w:tcW w:type="dxa" w:w="1134"/>
-          </w:tcPr>
-          <w:p>
-            <w:pPr>
-              <w:spacing w:before="60" w:after="60"/>
-              <w:ind w:left="85"/>
-            </w:pPr>
-            <w:r>
-              <w:rPr>
-                <w:rFonts w:ascii="Calibri" w:hAnsi="Calibri"/>
-                <w:b w:val="0"/>
-                <w:i w:val="0"/>
-                <w:color w:val="374151"/>
-                <w:sz w:val="17"/>
-              </w:rPr>
-              <w:t>159,000 VND /hộp</w:t>
-            </w:r>
-          </w:p>
-        </w:tc>
-        <w:tc>
-          <w:tcPr>
-            <w:tcW w:type="dxa" w:w="1247"/>
-            <w:shd w:val="clear" w:color="auto" w:fill="EFF6FF"/>
-          </w:tcPr>
-          <w:p>
-            <w:pPr>
-              <w:spacing w:before="60" w:after="60"/>
-              <w:ind w:left="85"/>
-            </w:pPr>
-            <w:r>
-              <w:rPr>
-                <w:rFonts w:ascii="Calibri" w:hAnsi="Calibri"/>
-                <w:b/>
-                <w:i w:val="0"/>
-                <w:color w:val="0056D2"/>
-                <w:sz w:val="17"/>
-              </w:rPr>
-              <w:t>Ổn định</w:t>
-            </w:r>
-          </w:p>
-        </w:tc>
-        <w:tc>
-          <w:tcPr>
-            <w:tcW w:type="dxa" w:w="2608"/>
-          </w:tcPr>
-          <w:p>
-            <w:pPr>
-              <w:spacing w:before="60" w:after="60"/>
-              <w:ind w:left="85"/>
-            </w:pPr>
-            <w:r>
-              <w:rPr>
-                <w:rFonts w:ascii="Calibri" w:hAnsi="Calibri"/>
-                <w:b w:val="0"/>
-                <w:i w:val="0"/>
-                <w:color w:val="374151"/>
-                <w:sz w:val="17"/>
-              </w:rPr>
-              <w:t>Kênh phòng khám tư nhân – tiềm năng tăng</w:t>
-            </w:r>
-          </w:p>
-        </w:tc>
-      </w:tr>
-      <w:tr>
-        <w:tc>
-          <w:tcPr>
-            <w:tcW w:type="dxa" w:w="1701"/>
-          </w:tcPr>
-          <w:p>
-            <w:pPr>
-              <w:spacing w:before="60" w:after="60"/>
-              <w:ind w:left="85"/>
-            </w:pPr>
-            <w:r>
-              <w:rPr>
-                <w:rFonts w:ascii="Calibri" w:hAnsi="Calibri"/>
-                <w:b/>
-                <w:i w:val="0"/>
-                <w:color w:val="003B71"/>
-                <w:sz w:val="17"/>
-              </w:rPr>
-              <w:t>HYYR</w:t>
-            </w:r>
-          </w:p>
-        </w:tc>
-        <w:tc>
-          <w:tcPr>
-            <w:tcW w:type="dxa" w:w="2381"/>
-          </w:tcPr>
-          <w:p>
-            <w:pPr>
-              <w:spacing w:before="60" w:after="60"/>
-              <w:ind w:left="85"/>
-            </w:pPr>
-            <w:r>
-              <w:rPr>
-                <w:rFonts w:ascii="Calibri" w:hAnsi="Calibri"/>
-                <w:b w:val="0"/>
-                <w:i w:val="0"/>
-                <w:color w:val="374151"/>
-                <w:sz w:val="17"/>
-              </w:rPr>
-              <w:t>Erlotinib</w:t>
-            </w:r>
-          </w:p>
-        </w:tc>
-        <w:tc>
-          <w:tcPr>
-            <w:tcW w:type="dxa" w:w="1134"/>
-          </w:tcPr>
-          <w:p>
-            <w:pPr>
-              <w:spacing w:before="60" w:after="60"/>
-              <w:ind w:left="85"/>
-            </w:pPr>
-            <w:r>
-              <w:rPr>
-                <w:rFonts w:ascii="Calibri" w:hAnsi="Calibri"/>
-                <w:b w:val="0"/>
-                <w:i w:val="0"/>
-                <w:color w:val="374151"/>
-                <w:sz w:val="17"/>
-              </w:rPr>
-              <w:t>1,500,000 VND /hộp</w:t>
-            </w:r>
-          </w:p>
-        </w:tc>
-        <w:tc>
-          <w:tcPr>
-            <w:tcW w:type="dxa" w:w="1247"/>
-            <w:shd w:val="clear" w:color="auto" w:fill="E7F9EE"/>
-          </w:tcPr>
-          <w:p>
-            <w:pPr>
-              <w:spacing w:before="60" w:after="60"/>
-              <w:ind w:left="85"/>
-            </w:pPr>
-            <w:r>
-              <w:rPr>
-                <w:rFonts w:ascii="Calibri" w:hAnsi="Calibri"/>
-                <w:b/>
-                <w:i w:val="0"/>
-                <w:color w:val="166534"/>
-                <w:sz w:val="17"/>
-              </w:rPr>
-              <w:t>Cơ hội cao</w:t>
-            </w:r>
-          </w:p>
-        </w:tc>
-        <w:tc>
-          <w:tcPr>
-            <w:tcW w:type="dxa" w:w="2608"/>
-          </w:tcPr>
-          <w:p>
-            <w:pPr>
-              <w:spacing w:before="60" w:after="60"/>
-              <w:ind w:left="85"/>
-            </w:pPr>
-            <w:r>
-              <w:rPr>
-                <w:rFonts w:ascii="Calibri" w:hAnsi="Calibri"/>
-                <w:b w:val="0"/>
-                <w:i w:val="0"/>
-                <w:color w:val="374151"/>
-                <w:sz w:val="17"/>
-              </w:rPr>
-              <w:t>Thuốc đặc trị – ưu tiên thầu bệnh viện ung bướu</w:t>
-            </w:r>
-          </w:p>
-        </w:tc>
-      </w:tr>
-      <w:tr>
-        <w:tc>
-          <w:tcPr>
-            <w:tcW w:type="dxa" w:w="1701"/>
-          </w:tcPr>
-          <w:p>
-            <w:pPr>
-              <w:spacing w:before="60" w:after="60"/>
-              <w:ind w:left="85"/>
-            </w:pPr>
-            <w:r>
-              <w:rPr>
-                <w:rFonts w:ascii="Calibri" w:hAnsi="Calibri"/>
-                <w:b/>
-                <w:i w:val="0"/>
-                <w:color w:val="003B71"/>
-                <w:sz w:val="17"/>
-              </w:rPr>
-              <w:t>LARRIVEY</w:t>
-            </w:r>
-          </w:p>
-        </w:tc>
-        <w:tc>
-          <w:tcPr>
-            <w:tcW w:type="dxa" w:w="2381"/>
-          </w:tcPr>
-          <w:p>
-            <w:pPr>
-              <w:spacing w:before="60" w:after="60"/>
-              <w:ind w:left="85"/>
-            </w:pPr>
-            <w:r>
-              <w:rPr>
-                <w:rFonts w:ascii="Calibri" w:hAnsi="Calibri"/>
-                <w:b w:val="0"/>
-                <w:i w:val="0"/>
-                <w:color w:val="374151"/>
-                <w:sz w:val="17"/>
-              </w:rPr>
-              <w:t>Bicalutamide</w:t>
-            </w:r>
-          </w:p>
-        </w:tc>
-        <w:tc>
-          <w:tcPr>
-            <w:tcW w:type="dxa" w:w="1134"/>
-          </w:tcPr>
-          <w:p>
-            <w:pPr>
-              <w:spacing w:before="60" w:after="60"/>
-              <w:ind w:left="85"/>
-            </w:pPr>
-            <w:r>
-              <w:rPr>
-                <w:rFonts w:ascii="Calibri" w:hAnsi="Calibri"/>
-                <w:b w:val="0"/>
-                <w:i w:val="0"/>
-                <w:color w:val="374151"/>
-                <w:sz w:val="17"/>
-              </w:rPr>
-              <w:t>823,200 VND /hộp</w:t>
-            </w:r>
-          </w:p>
-        </w:tc>
-        <w:tc>
-          <w:tcPr>
-            <w:tcW w:type="dxa" w:w="1247"/>
-            <w:shd w:val="clear" w:color="auto" w:fill="EFF6FF"/>
-          </w:tcPr>
-          <w:p>
-            <w:pPr>
-              <w:spacing w:before="60" w:after="60"/>
-              <w:ind w:left="85"/>
-            </w:pPr>
-            <w:r>
-              <w:rPr>
-                <w:rFonts w:ascii="Calibri" w:hAnsi="Calibri"/>
-                <w:b/>
-                <w:i w:val="0"/>
-                <w:color w:val="0056D2"/>
-                <w:sz w:val="17"/>
-              </w:rPr>
-              <w:t>Ổn định</w:t>
-            </w:r>
-          </w:p>
-        </w:tc>
-        <w:tc>
-          <w:tcPr>
-            <w:tcW w:type="dxa" w:w="2608"/>
-          </w:tcPr>
-          <w:p>
-            <w:pPr>
-              <w:spacing w:before="60" w:after="60"/>
-              <w:ind w:left="85"/>
-            </w:pPr>
-            <w:r>
-              <w:rPr>
-                <w:rFonts w:ascii="Calibri" w:hAnsi="Calibri"/>
-                <w:b w:val="0"/>
-                <w:i w:val="0"/>
-                <w:color w:val="374151"/>
-                <w:sz w:val="17"/>
-              </w:rPr>
-              <w:t>Theo dõi phác đồ bệnh viện – biên lợi nhuận cao</w:t>
-            </w:r>
-          </w:p>
-        </w:tc>
-      </w:tr>
-      <w:tr>
-        <w:tc>
-          <w:tcPr>
-            <w:tcW w:type="dxa" w:w="1701"/>
-          </w:tcPr>
-          <w:p>
-            <w:pPr>
-              <w:spacing w:before="60" w:after="60"/>
-              <w:ind w:left="85"/>
-            </w:pPr>
-            <w:r>
-              <w:rPr>
-                <w:rFonts w:ascii="Calibri" w:hAnsi="Calibri"/>
-                <w:b/>
-                <w:i w:val="0"/>
-                <w:color w:val="003B71"/>
-                <w:sz w:val="17"/>
-              </w:rPr>
-              <w:t>METILONE-4</w:t>
-            </w:r>
-          </w:p>
-        </w:tc>
-        <w:tc>
-          <w:tcPr>
-            <w:tcW w:type="dxa" w:w="2381"/>
-          </w:tcPr>
-          <w:p>
-            <w:pPr>
-              <w:spacing w:before="60" w:after="60"/>
-              <w:ind w:left="85"/>
-            </w:pPr>
-            <w:r>
-              <w:rPr>
-                <w:rFonts w:ascii="Calibri" w:hAnsi="Calibri"/>
-                <w:b w:val="0"/>
-                <w:i w:val="0"/>
-                <w:color w:val="374151"/>
-                <w:sz w:val="17"/>
-              </w:rPr>
-              <w:t>Methylprednisolone 4mg</w:t>
-            </w:r>
-          </w:p>
-        </w:tc>
-        <w:tc>
-          <w:tcPr>
-            <w:tcW w:type="dxa" w:w="1134"/>
-          </w:tcPr>
-          <w:p>
-            <w:pPr>
-              <w:spacing w:before="60" w:after="60"/>
-              <w:ind w:left="85"/>
-            </w:pPr>
-            <w:r>
-              <w:rPr>
-                <w:rFonts w:ascii="Calibri" w:hAnsi="Calibri"/>
-                <w:b w:val="0"/>
-                <w:i w:val="0"/>
-                <w:color w:val="374151"/>
-                <w:sz w:val="17"/>
-              </w:rPr>
-              <w:t>74,000 VND /hộp</w:t>
-            </w:r>
-          </w:p>
-        </w:tc>
-        <w:tc>
-          <w:tcPr>
-            <w:tcW w:type="dxa" w:w="1247"/>
-            <w:shd w:val="clear" w:color="auto" w:fill="EFF6FF"/>
-          </w:tcPr>
-          <w:p>
-            <w:pPr>
-              <w:spacing w:before="60" w:after="60"/>
-              <w:ind w:left="85"/>
-            </w:pPr>
-            <w:r>
-              <w:rPr>
-                <w:rFonts w:ascii="Calibri" w:hAnsi="Calibri"/>
-                <w:b/>
-                <w:i w:val="0"/>
-                <w:color w:val="0056D2"/>
-                <w:sz w:val="17"/>
-              </w:rPr>
-              <w:t>Ổn định</w:t>
-            </w:r>
-          </w:p>
-        </w:tc>
-        <w:tc>
-          <w:tcPr>
-            <w:tcW w:type="dxa" w:w="2608"/>
-          </w:tcPr>
-          <w:p>
-            <w:pPr>
-              <w:spacing w:before="60" w:after="60"/>
-              <w:ind w:left="85"/>
-            </w:pPr>
-            <w:r>
-              <w:rPr>
-                <w:rFonts w:ascii="Calibri" w:hAnsi="Calibri"/>
-                <w:b w:val="0"/>
-                <w:i w:val="0"/>
-                <w:color w:val="374151"/>
-                <w:sz w:val="17"/>
-              </w:rPr>
-              <w:t>Duy trì kênh ETC – theo dõi thầu TT Corticoid</w:t>
-            </w:r>
-          </w:p>
-        </w:tc>
-      </w:tr>
     </w:tbl>
     <w:p>
       <w:pPr>
@@ -4687,47 +1139,7 @@
           <w:color w:val="9CA3AF"/>
           <w:sz w:val="17"/>
         </w:rPr>
-        <w:t>Google Search Console  ·  Last 30 days  ·  Data: 13/05/2026</w:t>
-      </w:r>
-    </w:p>
-    <w:p>
-      <w:pPr>
-        <w:spacing w:before="120" w:after="120"/>
-        <w:jc w:val="center"/>
-      </w:pPr>
-      <w:r>
-        <w:drawing>
-          <wp:inline xmlns:a="http://schemas.openxmlformats.org/drawingml/2006/main" xmlns:pic="http://schemas.openxmlformats.org/drawingml/2006/picture">
-            <wp:extent cx="5580000" cy="2444219"/>
-            <wp:docPr id="2" name="Picture 2"/>
-            <wp:cNvGraphicFramePr>
-              <a:graphicFrameLocks noChangeAspect="1"/>
-            </wp:cNvGraphicFramePr>
-            <a:graphic>
-              <a:graphicData uri="http://schemas.openxmlformats.org/drawingml/2006/picture">
-                <pic:pic>
-                  <pic:nvPicPr>
-                    <pic:cNvPr id="0" name="image.png"/>
-                    <pic:cNvPicPr/>
-                  </pic:nvPicPr>
-                  <pic:blipFill>
-                    <a:blip r:embed="rId11"/>
-                    <a:stretch>
-                      <a:fillRect/>
-                    </a:stretch>
-                  </pic:blipFill>
-                  <pic:spPr>
-                    <a:xfrm>
-                      <a:off x="0" y="0"/>
-                      <a:ext cx="5580000" cy="2444219"/>
-                    </a:xfrm>
-                    <a:prstGeom prst="rect"/>
-                  </pic:spPr>
-                </pic:pic>
-              </a:graphicData>
-            </a:graphic>
-          </wp:inline>
-        </w:drawing>
+        <w:t>Google Search Console  ·  Last 30 days  ·  Data: 16/05/2026</w:t>
       </w:r>
     </w:p>
     <w:p>
@@ -4904,411 +1316,6 @@
           </w:p>
         </w:tc>
       </w:tr>
-      <w:tr>
-        <w:tc>
-          <w:tcPr>
-            <w:tcW w:type="dxa" w:w="454"/>
-            <w:shd w:val="clear" w:color="auto" w:fill="DCFCE7"/>
-            <w:tcBorders>
-              <w:top w:val="none" w:sz="6" w:color="auto"/>
-              <w:bottom w:val="none" w:sz="6" w:color="auto"/>
-              <w:left w:val="none" w:sz="6" w:color="auto"/>
-              <w:right w:val="none" w:sz="6" w:color="auto"/>
-            </w:tcBorders>
-          </w:tcPr>
-          <w:p>
-            <w:pPr>
-              <w:spacing w:before="100" w:after="100"/>
-              <w:jc w:val="center"/>
-            </w:pPr>
-            <w:r>
-              <w:t>🟢</w:t>
-            </w:r>
-          </w:p>
-        </w:tc>
-        <w:tc>
-          <w:tcPr>
-            <w:tcW w:type="dxa" w:w="4422"/>
-            <w:shd w:val="clear" w:color="auto" w:fill="FFFFFF"/>
-            <w:tcBorders>
-              <w:top w:val="none" w:sz="6" w:color="auto"/>
-              <w:bottom w:val="none" w:sz="6" w:color="auto"/>
-              <w:left w:val="none" w:sz="6" w:color="auto"/>
-              <w:right w:val="none" w:sz="6" w:color="auto"/>
-            </w:tcBorders>
-          </w:tcPr>
-          <w:p>
-            <w:pPr>
-              <w:spacing w:before="80" w:after="80"/>
-              <w:ind w:left="85"/>
-            </w:pPr>
-            <w:r>
-              <w:rPr>
-                <w:rFonts w:ascii="Calibri" w:hAnsi="Calibri"/>
-                <w:b/>
-                <w:i w:val="0"/>
-                <w:color w:val="111827"/>
-                <w:sz w:val="18"/>
-              </w:rPr>
-              <w:t>Prepare post-screening prescribing support for RAVASTEL, EIMLER-10, ZLATKO targeting district hospitals ahead of tender cycle</w:t>
-            </w:r>
-          </w:p>
-        </w:tc>
-        <w:tc>
-          <w:tcPr>
-            <w:tcW w:type="dxa" w:w="1417"/>
-            <w:shd w:val="clear" w:color="auto" w:fill="FFFFFF"/>
-            <w:tcBorders>
-              <w:top w:val="none" w:sz="6" w:color="auto"/>
-              <w:bottom w:val="none" w:sz="6" w:color="auto"/>
-              <w:left w:val="none" w:sz="6" w:color="auto"/>
-              <w:right w:val="none" w:sz="6" w:color="auto"/>
-            </w:tcBorders>
-          </w:tcPr>
-          <w:p>
-            <w:pPr>
-              <w:spacing w:before="80" w:after="80"/>
-              <w:jc w:val="center"/>
-            </w:pPr>
-            <w:r>
-              <w:rPr>
-                <w:rFonts w:ascii="Calibri" w:hAnsi="Calibri"/>
-                <w:b w:val="0"/>
-                <w:i w:val="0"/>
-                <w:color w:val="003B71"/>
-                <w:sz w:val="17"/>
-              </w:rPr>
-              <w:t>Marketing / Medical Affairs</w:t>
-            </w:r>
-          </w:p>
-        </w:tc>
-        <w:tc>
-          <w:tcPr>
-            <w:tcW w:type="dxa" w:w="1134"/>
-            <w:shd w:val="clear" w:color="auto" w:fill="FFFFFF"/>
-            <w:tcBorders>
-              <w:top w:val="none" w:sz="6" w:color="auto"/>
-              <w:bottom w:val="none" w:sz="6" w:color="auto"/>
-              <w:left w:val="none" w:sz="6" w:color="auto"/>
-              <w:right w:val="none" w:sz="6" w:color="auto"/>
-            </w:tcBorders>
-          </w:tcPr>
-          <w:p>
-            <w:pPr>
-              <w:spacing w:before="80" w:after="80"/>
-              <w:jc w:val="center"/>
-            </w:pPr>
-            <w:r>
-              <w:rPr>
-                <w:rFonts w:ascii="Calibri" w:hAnsi="Calibri"/>
-                <w:b w:val="0"/>
-                <w:i w:val="0"/>
-                <w:color w:val="6B7280"/>
-                <w:sz w:val="17"/>
-              </w:rPr>
-              <w:t>MoH Free Annual Screening — Chronic Disease Patient Funnel Expansion</w:t>
-            </w:r>
-          </w:p>
-        </w:tc>
-        <w:tc>
-          <w:tcPr>
-            <w:tcW w:type="dxa" w:w="1644"/>
-            <w:shd w:val="clear" w:color="auto" w:fill="DCFCE7"/>
-            <w:tcBorders>
-              <w:top w:val="none" w:sz="6" w:color="auto"/>
-              <w:bottom w:val="none" w:sz="6" w:color="auto"/>
-              <w:left w:val="none" w:sz="6" w:color="auto"/>
-              <w:right w:val="none" w:sz="6" w:color="auto"/>
-            </w:tcBorders>
-          </w:tcPr>
-          <w:p>
-            <w:pPr>
-              <w:spacing w:before="80" w:after="80"/>
-              <w:jc w:val="center"/>
-            </w:pPr>
-            <w:r>
-              <w:rPr>
-                <w:rFonts w:ascii="Calibri" w:hAnsi="Calibri"/>
-                <w:b/>
-                <w:i w:val="0"/>
-                <w:color w:val="22C55E"/>
-                <w:sz w:val="17"/>
-              </w:rPr>
-              <w:t>🔴 High</w:t>
-            </w:r>
-          </w:p>
-        </w:tc>
-      </w:tr>
-      <w:tr>
-        <w:tc>
-          <w:tcPr>
-            <w:tcW w:type="dxa" w:w="454"/>
-            <w:shd w:val="clear" w:color="auto" w:fill="DCFCE7"/>
-            <w:tcBorders>
-              <w:top w:val="none" w:sz="6" w:color="auto"/>
-              <w:bottom w:val="none" w:sz="6" w:color="auto"/>
-              <w:left w:val="none" w:sz="6" w:color="auto"/>
-              <w:right w:val="none" w:sz="6" w:color="auto"/>
-            </w:tcBorders>
-          </w:tcPr>
-          <w:p>
-            <w:pPr>
-              <w:spacing w:before="100" w:after="100"/>
-              <w:jc w:val="center"/>
-            </w:pPr>
-            <w:r>
-              <w:t>🟢</w:t>
-            </w:r>
-          </w:p>
-        </w:tc>
-        <w:tc>
-          <w:tcPr>
-            <w:tcW w:type="dxa" w:w="4422"/>
-            <w:shd w:val="clear" w:color="auto" w:fill="FAFBFF"/>
-            <w:tcBorders>
-              <w:top w:val="none" w:sz="6" w:color="auto"/>
-              <w:bottom w:val="none" w:sz="6" w:color="auto"/>
-              <w:left w:val="none" w:sz="6" w:color="auto"/>
-              <w:right w:val="none" w:sz="6" w:color="auto"/>
-            </w:tcBorders>
-          </w:tcPr>
-          <w:p>
-            <w:pPr>
-              <w:spacing w:before="80" w:after="80"/>
-              <w:ind w:left="85"/>
-            </w:pPr>
-            <w:r>
-              <w:rPr>
-                <w:rFonts w:ascii="Calibri" w:hAnsi="Calibri"/>
-                <w:b/>
-                <w:i w:val="0"/>
-                <w:color w:val="111827"/>
-                <w:sz w:val="18"/>
-              </w:rPr>
-              <w:t>Launch PECHAUNOX FDC detailing around World Hypertension Day 17/5 at provincial hospitals</w:t>
-            </w:r>
-          </w:p>
-        </w:tc>
-        <w:tc>
-          <w:tcPr>
-            <w:tcW w:type="dxa" w:w="1417"/>
-            <w:shd w:val="clear" w:color="auto" w:fill="FAFBFF"/>
-            <w:tcBorders>
-              <w:top w:val="none" w:sz="6" w:color="auto"/>
-              <w:bottom w:val="none" w:sz="6" w:color="auto"/>
-              <w:left w:val="none" w:sz="6" w:color="auto"/>
-              <w:right w:val="none" w:sz="6" w:color="auto"/>
-            </w:tcBorders>
-          </w:tcPr>
-          <w:p>
-            <w:pPr>
-              <w:spacing w:before="80" w:after="80"/>
-              <w:jc w:val="center"/>
-            </w:pPr>
-            <w:r>
-              <w:rPr>
-                <w:rFonts w:ascii="Calibri" w:hAnsi="Calibri"/>
-                <w:b w:val="0"/>
-                <w:i w:val="0"/>
-                <w:color w:val="003B71"/>
-                <w:sz w:val="17"/>
-              </w:rPr>
-              <w:t>Sales / Marketing</w:t>
-            </w:r>
-          </w:p>
-        </w:tc>
-        <w:tc>
-          <w:tcPr>
-            <w:tcW w:type="dxa" w:w="1134"/>
-            <w:shd w:val="clear" w:color="auto" w:fill="FAFBFF"/>
-            <w:tcBorders>
-              <w:top w:val="none" w:sz="6" w:color="auto"/>
-              <w:bottom w:val="none" w:sz="6" w:color="auto"/>
-              <w:left w:val="none" w:sz="6" w:color="auto"/>
-              <w:right w:val="none" w:sz="6" w:color="auto"/>
-            </w:tcBorders>
-          </w:tcPr>
-          <w:p>
-            <w:pPr>
-              <w:spacing w:before="80" w:after="80"/>
-              <w:jc w:val="center"/>
-            </w:pPr>
-            <w:r>
-              <w:rPr>
-                <w:rFonts w:ascii="Calibri" w:hAnsi="Calibri"/>
-                <w:b w:val="0"/>
-                <w:i w:val="0"/>
-                <w:color w:val="6B7280"/>
-                <w:sz w:val="17"/>
-              </w:rPr>
-              <w:t>Hypertension Underdiagnosis — FDC Positioning &amp; ETC Tender Opportunity</w:t>
-            </w:r>
-          </w:p>
-        </w:tc>
-        <w:tc>
-          <w:tcPr>
-            <w:tcW w:type="dxa" w:w="1644"/>
-            <w:shd w:val="clear" w:color="auto" w:fill="DCFCE7"/>
-            <w:tcBorders>
-              <w:top w:val="none" w:sz="6" w:color="auto"/>
-              <w:bottom w:val="none" w:sz="6" w:color="auto"/>
-              <w:left w:val="none" w:sz="6" w:color="auto"/>
-              <w:right w:val="none" w:sz="6" w:color="auto"/>
-            </w:tcBorders>
-          </w:tcPr>
-          <w:p>
-            <w:pPr>
-              <w:spacing w:before="80" w:after="80"/>
-              <w:jc w:val="center"/>
-            </w:pPr>
-            <w:r>
-              <w:rPr>
-                <w:rFonts w:ascii="Calibri" w:hAnsi="Calibri"/>
-                <w:b/>
-                <w:i w:val="0"/>
-                <w:color w:val="22C55E"/>
-                <w:sz w:val="17"/>
-              </w:rPr>
-              <w:t>🔴 High</w:t>
-            </w:r>
-          </w:p>
-        </w:tc>
-      </w:tr>
-      <w:tr>
-        <w:tc>
-          <w:tcPr>
-            <w:tcW w:type="dxa" w:w="454"/>
-            <w:shd w:val="clear" w:color="auto" w:fill="DCFCE7"/>
-            <w:tcBorders>
-              <w:top w:val="none" w:sz="6" w:color="auto"/>
-              <w:bottom w:val="none" w:sz="6" w:color="auto"/>
-              <w:left w:val="none" w:sz="6" w:color="auto"/>
-              <w:right w:val="none" w:sz="6" w:color="auto"/>
-            </w:tcBorders>
-          </w:tcPr>
-          <w:p>
-            <w:pPr>
-              <w:spacing w:before="100" w:after="100"/>
-              <w:jc w:val="center"/>
-            </w:pPr>
-            <w:r>
-              <w:t>🟢</w:t>
-            </w:r>
-          </w:p>
-        </w:tc>
-        <w:tc>
-          <w:tcPr>
-            <w:tcW w:type="dxa" w:w="4422"/>
-            <w:shd w:val="clear" w:color="auto" w:fill="FFFFFF"/>
-            <w:tcBorders>
-              <w:top w:val="none" w:sz="6" w:color="auto"/>
-              <w:bottom w:val="none" w:sz="6" w:color="auto"/>
-              <w:left w:val="none" w:sz="6" w:color="auto"/>
-              <w:right w:val="none" w:sz="6" w:color="auto"/>
-            </w:tcBorders>
-          </w:tcPr>
-          <w:p>
-            <w:pPr>
-              <w:spacing w:before="80" w:after="80"/>
-              <w:ind w:left="85"/>
-            </w:pPr>
-            <w:r>
-              <w:rPr>
-                <w:rFonts w:ascii="Calibri" w:hAnsi="Calibri"/>
-                <w:b/>
-                <w:i w:val="0"/>
-                <w:color w:val="111827"/>
-                <w:sz w:val="18"/>
-              </w:rPr>
-              <w:t>Detail JIRACEK, MARTAZ at GI departments of Bach Mai &amp; Cho Ray ahead of Q3/2026 tender</w:t>
-            </w:r>
-          </w:p>
-        </w:tc>
-        <w:tc>
-          <w:tcPr>
-            <w:tcW w:type="dxa" w:w="1417"/>
-            <w:shd w:val="clear" w:color="auto" w:fill="FFFFFF"/>
-            <w:tcBorders>
-              <w:top w:val="none" w:sz="6" w:color="auto"/>
-              <w:bottom w:val="none" w:sz="6" w:color="auto"/>
-              <w:left w:val="none" w:sz="6" w:color="auto"/>
-              <w:right w:val="none" w:sz="6" w:color="auto"/>
-            </w:tcBorders>
-          </w:tcPr>
-          <w:p>
-            <w:pPr>
-              <w:spacing w:before="80" w:after="80"/>
-              <w:jc w:val="center"/>
-            </w:pPr>
-            <w:r>
-              <w:rPr>
-                <w:rFonts w:ascii="Calibri" w:hAnsi="Calibri"/>
-                <w:b w:val="0"/>
-                <w:i w:val="0"/>
-                <w:color w:val="003B71"/>
-                <w:sz w:val="17"/>
-              </w:rPr>
-              <w:t>Sales / Medical Affairs</w:t>
-            </w:r>
-          </w:p>
-        </w:tc>
-        <w:tc>
-          <w:tcPr>
-            <w:tcW w:type="dxa" w:w="1134"/>
-            <w:shd w:val="clear" w:color="auto" w:fill="FFFFFF"/>
-            <w:tcBorders>
-              <w:top w:val="none" w:sz="6" w:color="auto"/>
-              <w:bottom w:val="none" w:sz="6" w:color="auto"/>
-              <w:left w:val="none" w:sz="6" w:color="auto"/>
-              <w:right w:val="none" w:sz="6" w:color="auto"/>
-            </w:tcBorders>
-          </w:tcPr>
-          <w:p>
-            <w:pPr>
-              <w:spacing w:before="80" w:after="80"/>
-              <w:jc w:val="center"/>
-            </w:pPr>
-            <w:r>
-              <w:rPr>
-                <w:rFonts w:ascii="Calibri" w:hAnsi="Calibri"/>
-                <w:b w:val="0"/>
-                <w:i w:val="0"/>
-                <w:color w:val="6B7280"/>
-                <w:sz w:val="17"/>
-              </w:rPr>
-              <w:t>Rising HP/Gastric Cancer Awareness — Long-term PPI ETC Demand</w:t>
-            </w:r>
-          </w:p>
-        </w:tc>
-        <w:tc>
-          <w:tcPr>
-            <w:tcW w:type="dxa" w:w="1644"/>
-            <w:shd w:val="clear" w:color="auto" w:fill="DCFCE7"/>
-            <w:tcBorders>
-              <w:top w:val="none" w:sz="6" w:color="auto"/>
-              <w:bottom w:val="none" w:sz="6" w:color="auto"/>
-              <w:left w:val="none" w:sz="6" w:color="auto"/>
-              <w:right w:val="none" w:sz="6" w:color="auto"/>
-            </w:tcBorders>
-          </w:tcPr>
-          <w:p>
-            <w:pPr>
-              <w:spacing w:before="80" w:after="80"/>
-              <w:jc w:val="center"/>
-            </w:pPr>
-            <w:r>
-              <w:rPr>
-                <w:rFonts w:ascii="Calibri" w:hAnsi="Calibri"/>
-                <w:b/>
-                <w:i w:val="0"/>
-                <w:color w:val="22C55E"/>
-                <w:sz w:val="17"/>
-              </w:rPr>
-              <w:t>🟡 Medium</w:t>
-            </w:r>
-          </w:p>
-        </w:tc>
-      </w:tr>
     </w:tbl>
     <w:p>
       <w:pPr>
@@ -5349,7 +1356,7 @@
                 <w:color w:val="9CA3AF"/>
                 <w:sz w:val="15"/>
               </w:rPr>
-              <w:t>Davipharm Market Intelligence System  ·  Powered by Claude Sonnet 4.6  ·  13/05/2026  ·  CONFIDENTIAL</w:t>
+              <w:t>Davipharm Market Intelligence System  ·  Powered by Claude Sonnet 4.6  ·  16/05/2026  ·  CONFIDENTIAL</w:t>
             </w:r>
           </w:p>
         </w:tc>

</xml_diff>